<commit_message>
CRM v0.5 + Client v0.3: Add shared Note/Comment entities (Section 18) and cross-reference in Client PRD (Section 2.9)
</commit_message>
<xml_diff>
--- a/PRDs/CBM-PRD-CRM-Client.docx
+++ b/PRDs/CBM-PRD-CRM-Client.docx
@@ -46,7 +46,7 @@
           <w:sz w:val="22"/>
           <w:szCs w:val="22"/>
         </w:rPr>
-        <w:t xml:space="preserve">Version 0.2  |  In Progress  |  March 15, 2026</w:t>
+        <w:t xml:space="preserve">Version 0.3  |  In Progress  |  March 15, 2026</w:t>
       </w:r>
     </w:p>
     <w:p>
@@ -5651,6 +5651,43 @@
     </w:p>
     <w:p>
       <w:pPr>
+        <w:pStyle w:val="Heading2"/>
+      </w:pPr>
+      <w:r>
+        <w:t xml:space="preserve">2.9 Notes and Comments</w:t>
+      </w:r>
+    </w:p>
+    <w:p>
+      <w:pPr>
+        <w:spacing w:after="120"/>
+      </w:pPr>
+      <w:r>
+        <w:t xml:space="preserve">The CBM CRM platform includes a shared Note and Comment capability available across all entities. Notes support cross-record linking (a single note may be linked to multiple records across multiple entity types), internal-only visibility control, and user-centric views such as “My Notes.” Comments provide a one-level threaded discussion model on each Note.</w:t>
+      </w:r>
+    </w:p>
+    <w:p>
+      <w:pPr>
+        <w:spacing w:after="120"/>
+      </w:pPr>
+      <w:r>
+        <w:t xml:space="preserve">All entities defined in this document — Account, Contact, Engagement, Session, NPS Survey Response, Workshop, and Workshop Attendance — must have a Note relationship panel configured as a standard part of their implementation.</w:t>
+      </w:r>
+    </w:p>
+    <w:p>
+      <w:pPr>
+        <w:spacing w:after="120"/>
+      </w:pPr>
+      <w:r>
+        <w:t xml:space="preserve">Full Note and Comment entity definitions, field specifications, and implementation requirements are documented in CBM-PRD-CRM.docx, Section 18: Shared Platform Entities.</w:t>
+      </w:r>
+    </w:p>
+    <w:p>
+      <w:r>
+        <w:t xml:space="preserve"/>
+      </w:r>
+    </w:p>
+    <w:p>
+      <w:pPr>
         <w:pStyle w:val="Heading1"/>
       </w:pPr>
       <w:r>
@@ -6207,7 +6244,7 @@
                 <w:sz w:val="20"/>
                 <w:szCs w:val="20"/>
               </w:rPr>
-              <w:t xml:space="preserve">0.2</w:t>
+              <w:t xml:space="preserve">0.3</w:t>
             </w:r>
           </w:p>
         </w:tc>

</xml_diff>

<commit_message>
CRM v0.6 + Client v0.4: Add Document entity and Communications (Section 18.4-18.5); Client Relationships section and updated Section 2.9
</commit_message>
<xml_diff>
--- a/PRDs/CBM-PRD-CRM-Client.docx
+++ b/PRDs/CBM-PRD-CRM-Client.docx
@@ -46,7 +46,7 @@
           <w:sz w:val="22"/>
           <w:szCs w:val="22"/>
         </w:rPr>
-        <w:t xml:space="preserve">Version 0.3  |  In Progress  |  March 15, 2026</w:t>
+        <w:t xml:space="preserve">Version 0.4  |  In Progress  |  March 15, 2026</w:t>
       </w:r>
     </w:p>
     <w:p>
@@ -5654,7 +5654,7 @@
         <w:pStyle w:val="Heading2"/>
       </w:pPr>
       <w:r>
-        <w:t xml:space="preserve">2.9 Notes and Comments</w:t>
+        <w:t xml:space="preserve">2.9 Shared Platform Entities</w:t>
       </w:r>
     </w:p>
     <w:p>
@@ -5662,7 +5662,43 @@
         <w:spacing w:after="120"/>
       </w:pPr>
       <w:r>
-        <w:t xml:space="preserve">The CBM CRM platform includes a shared Note and Comment capability available across all entities. Notes support cross-record linking (a single note may be linked to multiple records across multiple entity types), internal-only visibility control, and user-centric views such as “My Notes.” Comments provide a one-level threaded discussion model on each Note.</w:t>
+        <w:t xml:space="preserve">The CBM CRM platform includes shared entities and communication capabilities available across all domains. All entities defined in this document — Account, Contact, Engagement, Session, NPS Survey Response, Workshop, and Workshop Attendance — must have relationship panels configured for each of the following as a standard part of their implementation.</w:t>
+      </w:r>
+    </w:p>
+    <w:p>
+      <w:pPr>
+        <w:numPr>
+          <w:ilvl w:val="0"/>
+          <w:numId w:val="1"/>
+        </w:numPr>
+        <w:spacing w:after="60"/>
+      </w:pPr>
+      <w:r>
+        <w:t xml:space="preserve">Notes and Comments — cross-record linked notes with one-level threaded discussion and internal-only visibility control.</w:t>
+      </w:r>
+    </w:p>
+    <w:p>
+      <w:pPr>
+        <w:numPr>
+          <w:ilvl w:val="0"/>
+          <w:numId w:val="1"/>
+        </w:numPr>
+        <w:spacing w:after="60"/>
+      </w:pPr>
+      <w:r>
+        <w:t xml:space="preserve">Documents — cross-record linked documents supporting both file uploads and external URL references (e.g., Google Drive links), with internal-only visibility control.</w:t>
+      </w:r>
+    </w:p>
+    <w:p>
+      <w:pPr>
+        <w:numPr>
+          <w:ilvl w:val="0"/>
+          <w:numId w:val="1"/>
+        </w:numPr>
+        <w:spacing w:after="60"/>
+      </w:pPr>
+      <w:r>
+        <w:t xml:space="preserve">Email and Calls — EspoCRM native activity panels for communication tracking. Emails sync automatically via Gmail OAuth; calls are logged manually by mentors and must be linked to both the Contact and active Engagement at time of logging.</w:t>
       </w:r>
     </w:p>
     <w:p>
@@ -5670,7 +5706,20 @@
         <w:spacing w:after="120"/>
       </w:pPr>
       <w:r>
-        <w:t xml:space="preserve">All entities defined in this document — Account, Contact, Engagement, Session, NPS Survey Response, Workshop, and Workshop Attendance — must have a Note relationship panel configured as a standard part of their implementation.</w:t>
+        <w:t xml:space="preserve">Full entity definitions, field specifications, and implementation requirements for Notes, Comments, and Documents are documented in CBM-PRD-CRM.docx, Section 18: Shared Platform Entities. Email and call handling requirements are documented in CBM-PRD-CRM.docx, Section 10: Communication Requirements.</w:t>
+      </w:r>
+    </w:p>
+    <w:p>
+      <w:r>
+        <w:t xml:space="preserve"/>
+      </w:r>
+    </w:p>
+    <w:p>
+      <w:pPr>
+        <w:pStyle w:val="Heading1"/>
+      </w:pPr>
+      <w:r>
+        <w:t xml:space="preserve">3. Relationships</w:t>
       </w:r>
     </w:p>
     <w:p>
@@ -5678,7 +5727,7 @@
         <w:spacing w:after="120"/>
       </w:pPr>
       <w:r>
-        <w:t xml:space="preserve">Full Note and Comment entity definitions, field specifications, and implementation requirements are documented in CBM-PRD-CRM.docx, Section 18: Shared Platform Entities.</w:t>
+        <w:t xml:space="preserve">This section defines the entity relationships in the client domain — how records connect to each other, how those relationships are created, and what data is visible from each side. All relationships described here are configured in EspoCRM’s Entity Manager.</w:t>
       </w:r>
     </w:p>
     <w:p>
@@ -5688,18 +5737,10 @@
     </w:p>
     <w:p>
       <w:pPr>
-        <w:pStyle w:val="Heading1"/>
-      </w:pPr>
-      <w:r>
-        <w:t xml:space="preserve">3. Relationships</w:t>
-      </w:r>
-    </w:p>
-    <w:p>
-      <w:pPr>
         <w:pStyle w:val="Heading2"/>
       </w:pPr>
       <w:r>
-        <w:t xml:space="preserve">3.1 Client → Engagement</w:t>
+        <w:t xml:space="preserve">3.1 Account → Contact</w:t>
       </w:r>
     </w:p>
     <w:p>
@@ -5707,12 +5748,7 @@
         <w:spacing w:after="120"/>
       </w:pPr>
       <w:r>
-        <w:rPr>
-          <w:i/>
-          <w:iCs/>
-          <w:color w:val="888888"/>
-        </w:rPr>
-        <w:t xml:space="preserve">[PLACEHOLDER: Define the relationship between client records and engagement records. Include relationship type, how the relationship is created, and what data is visible from each side.]</w:t>
+        <w:t xml:space="preserve">Relationship type: One-to-Many. One Account may have many Contacts; each Contact belongs to one Account.</w:t>
       </w:r>
     </w:p>
     <w:p>
@@ -5722,10 +5758,75 @@
     </w:p>
     <w:p>
       <w:pPr>
+        <w:numPr>
+          <w:ilvl w:val="0"/>
+          <w:numId w:val="1"/>
+        </w:numPr>
+        <w:spacing w:after="60"/>
+      </w:pPr>
+      <w:r>
+        <w:t xml:space="preserve">The first Contact is created automatically when a Mentoring Request form is submitted. The submitting individual becomes the primary Contact linked to the new Account.</w:t>
+      </w:r>
+    </w:p>
+    <w:p>
+      <w:pPr>
+        <w:numPr>
+          <w:ilvl w:val="0"/>
+          <w:numId w:val="1"/>
+        </w:numPr>
+        <w:spacing w:after="60"/>
+      </w:pPr>
+      <w:r>
+        <w:t xml:space="preserve">Additional Contacts may be added to the Account at any time by an admin or the assigned mentor as additional individuals from the business become involved in the engagement.</w:t>
+      </w:r>
+    </w:p>
+    <w:p>
+      <w:pPr>
+        <w:numPr>
+          <w:ilvl w:val="0"/>
+          <w:numId w:val="1"/>
+        </w:numPr>
+        <w:spacing w:after="60"/>
+      </w:pPr>
+      <w:r>
+        <w:t xml:space="preserve">The Primary Contact flag on the Contact record identifies the main point of contact when multiple Contacts exist on an Account.</w:t>
+      </w:r>
+    </w:p>
+    <w:p>
+      <w:pPr>
+        <w:numPr>
+          <w:ilvl w:val="0"/>
+          <w:numId w:val="1"/>
+        </w:numPr>
+        <w:spacing w:after="60"/>
+      </w:pPr>
+      <w:r>
+        <w:t xml:space="preserve">From the Account record, all linked Contacts are visible in a Contact relationship panel.</w:t>
+      </w:r>
+    </w:p>
+    <w:p>
+      <w:pPr>
+        <w:numPr>
+          <w:ilvl w:val="0"/>
+          <w:numId w:val="1"/>
+        </w:numPr>
+        <w:spacing w:after="60"/>
+      </w:pPr>
+      <w:r>
+        <w:t xml:space="preserve">From each Contact record, the linked Account is visible as a lookup field.</w:t>
+      </w:r>
+    </w:p>
+    <w:p>
+      <w:r>
+        <w:t xml:space="preserve"/>
+      </w:r>
+    </w:p>
+    <w:p>
+      <w:pPr>
         <w:pStyle w:val="Heading2"/>
       </w:pPr>
       <w:r>
-        <w:t xml:space="preserve">3.2 Client → Mentor</w:t>
+        <w:t xml:space="preserve">3.2 Account → Engagement</w:t>
       </w:r>
     </w:p>
     <w:p>
@@ -5733,12 +5834,7 @@
         <w:spacing w:after="120"/>
       </w:pPr>
       <w:r>
-        <w:rPr>
-          <w:i/>
-          <w:iCs/>
-          <w:color w:val="888888"/>
-        </w:rPr>
-        <w:t xml:space="preserve">[PLACEHOLDER: Define how clients relate to mentors — through engagement entity. Access scope rules — clients never access CRM directly.]</w:t>
+        <w:t xml:space="preserve">Relationship type: One-to-Many. One Account may have many Engagements over time; each Engagement belongs to one Account.</w:t>
       </w:r>
     </w:p>
     <w:p>
@@ -5748,10 +5844,75 @@
     </w:p>
     <w:p>
       <w:pPr>
+        <w:numPr>
+          <w:ilvl w:val="0"/>
+          <w:numId w:val="1"/>
+        </w:numPr>
+        <w:spacing w:after="60"/>
+      </w:pPr>
+      <w:r>
+        <w:t xml:space="preserve">The first Engagement is created automatically when a Mentoring Request form is submitted, with status set to Submitted.</w:t>
+      </w:r>
+    </w:p>
+    <w:p>
+      <w:pPr>
+        <w:numPr>
+          <w:ilvl w:val="0"/>
+          <w:numId w:val="1"/>
+        </w:numPr>
+        <w:spacing w:after="60"/>
+      </w:pPr>
+      <w:r>
+        <w:t xml:space="preserve">An Account may have more than one Engagement over its lifetime — for example, a client who completes one engagement and returns for a new one later. Each is tracked as a separate Engagement record.</w:t>
+      </w:r>
+    </w:p>
+    <w:p>
+      <w:pPr>
+        <w:numPr>
+          <w:ilvl w:val="0"/>
+          <w:numId w:val="1"/>
+        </w:numPr>
+        <w:spacing w:after="60"/>
+      </w:pPr>
+      <w:r>
+        <w:t xml:space="preserve">Only one Engagement per Account should be in an active status (Submitted, Assigned, Active, or On-Hold) at any given time.</w:t>
+      </w:r>
+    </w:p>
+    <w:p>
+      <w:pPr>
+        <w:numPr>
+          <w:ilvl w:val="0"/>
+          <w:numId w:val="1"/>
+        </w:numPr>
+        <w:spacing w:after="60"/>
+      </w:pPr>
+      <w:r>
+        <w:t xml:space="preserve">From the Account record, all linked Engagements are visible in an Engagement relationship panel, showing current and historical engagements.</w:t>
+      </w:r>
+    </w:p>
+    <w:p>
+      <w:pPr>
+        <w:numPr>
+          <w:ilvl w:val="0"/>
+          <w:numId w:val="1"/>
+        </w:numPr>
+        <w:spacing w:after="60"/>
+      </w:pPr>
+      <w:r>
+        <w:t xml:space="preserve">From each Engagement record, the linked Account is visible as a lookup field.</w:t>
+      </w:r>
+    </w:p>
+    <w:p>
+      <w:r>
+        <w:t xml:space="preserve"/>
+      </w:r>
+    </w:p>
+    <w:p>
+      <w:pPr>
         <w:pStyle w:val="Heading2"/>
       </w:pPr>
       <w:r>
-        <w:t xml:space="preserve">3.3 Client → Sessions</w:t>
+        <w:t xml:space="preserve">3.3 Engagement → Mentor / Co-Mentor / SME</w:t>
       </w:r>
     </w:p>
     <w:p>
@@ -5759,12 +5920,7 @@
         <w:spacing w:after="120"/>
       </w:pPr>
       <w:r>
-        <w:rPr>
-          <w:i/>
-          <w:iCs/>
-          <w:color w:val="888888"/>
-        </w:rPr>
-        <w:t xml:space="preserve">[PLACEHOLDER: Define the relationship between client records and logged session records. What session data is visible and to whom.]</w:t>
+        <w:t xml:space="preserve">Relationship type: Many-to-One for each role. Each Engagement has one Assigned Mentor, optionally one Co-Mentor, and optionally one SME. All three are linked to Contact records in the mentor pool.</w:t>
       </w:r>
     </w:p>
     <w:p>
@@ -5774,10 +5930,63 @@
     </w:p>
     <w:p>
       <w:pPr>
+        <w:numPr>
+          <w:ilvl w:val="0"/>
+          <w:numId w:val="1"/>
+        </w:numPr>
+        <w:spacing w:after="60"/>
+      </w:pPr>
+      <w:r>
+        <w:t xml:space="preserve">The Assigned Mentor link is set by an admin when the Engagement moves from Submitted to Assigned status.</w:t>
+      </w:r>
+    </w:p>
+    <w:p>
+      <w:pPr>
+        <w:numPr>
+          <w:ilvl w:val="0"/>
+          <w:numId w:val="1"/>
+        </w:numPr>
+        <w:spacing w:after="60"/>
+      </w:pPr>
+      <w:r>
+        <w:t xml:space="preserve">The Co-Mentor and SME links are optional and may be set at any time during an active engagement.</w:t>
+      </w:r>
+    </w:p>
+    <w:p>
+      <w:pPr>
+        <w:numPr>
+          <w:ilvl w:val="0"/>
+          <w:numId w:val="1"/>
+        </w:numPr>
+        <w:spacing w:after="60"/>
+      </w:pPr>
+      <w:r>
+        <w:t xml:space="preserve">Mentor, Co-Mentor, and SME links are stored as separate relationship fields on the Engagement record — not as a single multi-value field — to support role-specific access control and capacity management.</w:t>
+      </w:r>
+    </w:p>
+    <w:p>
+      <w:pPr>
+        <w:numPr>
+          <w:ilvl w:val="0"/>
+          <w:numId w:val="1"/>
+        </w:numPr>
+        <w:spacing w:after="60"/>
+      </w:pPr>
+      <w:r>
+        <w:t xml:space="preserve">From a mentor’s Contact record, all Engagements where they are assigned as Mentor, Co-Mentor, or SME are visible via relationship panels on the mentor profile.</w:t>
+      </w:r>
+    </w:p>
+    <w:p>
+      <w:r>
+        <w:t xml:space="preserve"/>
+      </w:r>
+    </w:p>
+    <w:p>
+      <w:pPr>
         <w:pStyle w:val="Heading2"/>
       </w:pPr>
       <w:r>
-        <w:t xml:space="preserve">3.4 Client → NPS Responses</w:t>
+        <w:t xml:space="preserve">3.4 Engagement → Session</w:t>
       </w:r>
     </w:p>
     <w:p>
@@ -5785,12 +5994,7 @@
         <w:spacing w:after="120"/>
       </w:pPr>
       <w:r>
-        <w:rPr>
-          <w:i/>
-          <w:iCs/>
-          <w:color w:val="888888"/>
-        </w:rPr>
-        <w:t xml:space="preserve">[PLACEHOLDER: Define how NPS survey responses are linked to client and engagement records.]</w:t>
+        <w:t xml:space="preserve">Relationship type: One-to-Many. One Engagement may have many Sessions; each Session belongs to one Engagement.</w:t>
       </w:r>
     </w:p>
     <w:p>
@@ -5800,10 +6004,75 @@
     </w:p>
     <w:p>
       <w:pPr>
+        <w:numPr>
+          <w:ilvl w:val="0"/>
+          <w:numId w:val="1"/>
+        </w:numPr>
+        <w:spacing w:after="60"/>
+      </w:pPr>
+      <w:r>
+        <w:t xml:space="preserve">Session records are created manually by the assigned mentor after each meeting.</w:t>
+      </w:r>
+    </w:p>
+    <w:p>
+      <w:pPr>
+        <w:numPr>
+          <w:ilvl w:val="0"/>
+          <w:numId w:val="1"/>
+        </w:numPr>
+        <w:spacing w:after="60"/>
+      </w:pPr>
+      <w:r>
+        <w:t xml:space="preserve">Sessions drive the roll-up analytics fields on the Engagement record — Total Sessions, Total Sessions (Last 30 Days), Last Session Date, and Total Session Hours are all calculated from linked Session records.</w:t>
+      </w:r>
+    </w:p>
+    <w:p>
+      <w:pPr>
+        <w:numPr>
+          <w:ilvl w:val="0"/>
+          <w:numId w:val="1"/>
+        </w:numPr>
+        <w:spacing w:after="60"/>
+      </w:pPr>
+      <w:r>
+        <w:t xml:space="preserve">Sessions also drive NPS survey trigger logic — the system monitors session count per Engagement to determine when to send surveys.</w:t>
+      </w:r>
+    </w:p>
+    <w:p>
+      <w:pPr>
+        <w:numPr>
+          <w:ilvl w:val="0"/>
+          <w:numId w:val="1"/>
+        </w:numPr>
+        <w:spacing w:after="60"/>
+      </w:pPr>
+      <w:r>
+        <w:t xml:space="preserve">From the Engagement record, all linked Sessions are visible in a Session relationship panel sorted by date descending.</w:t>
+      </w:r>
+    </w:p>
+    <w:p>
+      <w:pPr>
+        <w:numPr>
+          <w:ilvl w:val="0"/>
+          <w:numId w:val="1"/>
+        </w:numPr>
+        <w:spacing w:after="60"/>
+      </w:pPr>
+      <w:r>
+        <w:t xml:space="preserve">From each Session record, the linked Engagement (and through it, the Account) is visible as a lookup field.</w:t>
+      </w:r>
+    </w:p>
+    <w:p>
+      <w:r>
+        <w:t xml:space="preserve"/>
+      </w:r>
+    </w:p>
+    <w:p>
+      <w:pPr>
         <w:pStyle w:val="Heading2"/>
       </w:pPr>
       <w:r>
-        <w:t xml:space="preserve">3.5 Client → Workshop Attendance</w:t>
+        <w:t xml:space="preserve">3.5 Engagement → NPS Survey Response</w:t>
       </w:r>
     </w:p>
     <w:p>
@@ -5811,12 +6080,258 @@
         <w:spacing w:after="120"/>
       </w:pPr>
       <w:r>
-        <w:rPr>
-          <w:i/>
-          <w:iCs/>
-          <w:color w:val="888888"/>
-        </w:rPr>
-        <w:t xml:space="preserve">[PLACEHOLDER: Define how workshop and event attendance records relate to the client entity.]</w:t>
+        <w:t xml:space="preserve">Relationship type: One-to-Many. One Engagement may have many NPS Survey Responses over its lifetime; each NPS Survey Response belongs to one Engagement.</w:t>
+      </w:r>
+    </w:p>
+    <w:p>
+      <w:r>
+        <w:t xml:space="preserve"/>
+      </w:r>
+    </w:p>
+    <w:p>
+      <w:pPr>
+        <w:numPr>
+          <w:ilvl w:val="0"/>
+          <w:numId w:val="1"/>
+        </w:numPr>
+        <w:spacing w:after="60"/>
+      </w:pPr>
+      <w:r>
+        <w:t xml:space="preserve">NPS Survey Response records are created automatically by the system when a survey trigger fires (after 2nd session, every 5 sessions thereafter, at engagement close).</w:t>
+      </w:r>
+    </w:p>
+    <w:p>
+      <w:pPr>
+        <w:numPr>
+          <w:ilvl w:val="0"/>
+          <w:numId w:val="1"/>
+        </w:numPr>
+        <w:spacing w:after="60"/>
+      </w:pPr>
+      <w:r>
+        <w:t xml:space="preserve">Each NPS Survey Response is linked to both the Engagement and, where applicable, the Session that triggered it.</w:t>
+      </w:r>
+    </w:p>
+    <w:p>
+      <w:pPr>
+        <w:numPr>
+          <w:ilvl w:val="0"/>
+          <w:numId w:val="1"/>
+        </w:numPr>
+        <w:spacing w:after="60"/>
+      </w:pPr>
+      <w:r>
+        <w:t xml:space="preserve">From the Engagement record, all linked NPS Survey Responses are visible in a relationship panel, allowing mentors and admins to track satisfaction trends over the course of the engagement.</w:t>
+      </w:r>
+    </w:p>
+    <w:p>
+      <w:r>
+        <w:t xml:space="preserve"/>
+      </w:r>
+    </w:p>
+    <w:p>
+      <w:pPr>
+        <w:pStyle w:val="Heading2"/>
+      </w:pPr>
+      <w:r>
+        <w:t xml:space="preserve">3.6 Contact → Workshop Attendance</w:t>
+      </w:r>
+    </w:p>
+    <w:p>
+      <w:pPr>
+        <w:spacing w:after="120"/>
+      </w:pPr>
+      <w:r>
+        <w:t xml:space="preserve">Relationship type: One-to-Many. One Contact may have many Workshop Attendance records; each Workshop Attendance record belongs to one Contact.</w:t>
+      </w:r>
+    </w:p>
+    <w:p>
+      <w:r>
+        <w:t xml:space="preserve"/>
+      </w:r>
+    </w:p>
+    <w:p>
+      <w:pPr>
+        <w:numPr>
+          <w:ilvl w:val="0"/>
+          <w:numId w:val="1"/>
+        </w:numPr>
+        <w:spacing w:after="60"/>
+      </w:pPr>
+      <w:r>
+        <w:t xml:space="preserve">Workshop Attendance records are created when a client registers for or attends a workshop.</w:t>
+      </w:r>
+    </w:p>
+    <w:p>
+      <w:pPr>
+        <w:numPr>
+          <w:ilvl w:val="0"/>
+          <w:numId w:val="1"/>
+        </w:numPr>
+        <w:spacing w:after="60"/>
+      </w:pPr>
+      <w:r>
+        <w:t xml:space="preserve">Each Workshop Attendance record links a Contact to a Workshop and to the active Engagement, providing full traceability of workshop participation within the context of the mentoring relationship.</w:t>
+      </w:r>
+    </w:p>
+    <w:p>
+      <w:pPr>
+        <w:numPr>
+          <w:ilvl w:val="0"/>
+          <w:numId w:val="1"/>
+        </w:numPr>
+        <w:spacing w:after="60"/>
+      </w:pPr>
+      <w:r>
+        <w:t xml:space="preserve">From the Contact record, all workshop attendance history is visible in a Workshop Attendance relationship panel.</w:t>
+      </w:r>
+    </w:p>
+    <w:p>
+      <w:pPr>
+        <w:numPr>
+          <w:ilvl w:val="0"/>
+          <w:numId w:val="1"/>
+        </w:numPr>
+        <w:spacing w:after="60"/>
+      </w:pPr>
+      <w:r>
+        <w:t xml:space="preserve">From the Engagement record, workshop attendance related to that engagement is also visible, giving mentors a complete picture of their client’s learning activities.</w:t>
+      </w:r>
+    </w:p>
+    <w:p>
+      <w:r>
+        <w:t xml:space="preserve"/>
+      </w:r>
+    </w:p>
+    <w:p>
+      <w:pPr>
+        <w:pStyle w:val="Heading2"/>
+      </w:pPr>
+      <w:r>
+        <w:t xml:space="preserve">3.7 Workshop Attendance → Workshop</w:t>
+      </w:r>
+    </w:p>
+    <w:p>
+      <w:pPr>
+        <w:spacing w:after="120"/>
+      </w:pPr>
+      <w:r>
+        <w:t xml:space="preserve">Relationship type: Many-to-One. Many Workshop Attendance records may link to one Workshop; each Workshop Attendance record belongs to one Workshop.</w:t>
+      </w:r>
+    </w:p>
+    <w:p>
+      <w:r>
+        <w:t xml:space="preserve"/>
+      </w:r>
+    </w:p>
+    <w:p>
+      <w:pPr>
+        <w:numPr>
+          <w:ilvl w:val="0"/>
+          <w:numId w:val="1"/>
+        </w:numPr>
+        <w:spacing w:after="60"/>
+      </w:pPr>
+      <w:r>
+        <w:t xml:space="preserve">The Workshop Attendance entity is the linking record between a client Contact and a Workshop. It is not a direct relationship between Contact and Workshop.</w:t>
+      </w:r>
+    </w:p>
+    <w:p>
+      <w:pPr>
+        <w:numPr>
+          <w:ilvl w:val="0"/>
+          <w:numId w:val="1"/>
+        </w:numPr>
+        <w:spacing w:after="60"/>
+      </w:pPr>
+      <w:r>
+        <w:t xml:space="preserve">From the Workshop record, all linked Workshop Attendance records are visible, providing a full attendee list for each event.</w:t>
+      </w:r>
+    </w:p>
+    <w:p>
+      <w:pPr>
+        <w:numPr>
+          <w:ilvl w:val="0"/>
+          <w:numId w:val="1"/>
+        </w:numPr>
+        <w:spacing w:after="60"/>
+      </w:pPr>
+      <w:r>
+        <w:t xml:space="preserve">Workshop attendance data feeds into both mentor visibility (mentors can see which workshops their clients attended) and CBM reporting (aggregate attendance counts by workshop, topic, and client segment).</w:t>
+      </w:r>
+    </w:p>
+    <w:p>
+      <w:r>
+        <w:t xml:space="preserve"/>
+      </w:r>
+    </w:p>
+    <w:p>
+      <w:pPr>
+        <w:pStyle w:val="Heading2"/>
+      </w:pPr>
+      <w:r>
+        <w:t xml:space="preserve">3.8 Shared Platform Entity Relationships</w:t>
+      </w:r>
+    </w:p>
+    <w:p>
+      <w:pPr>
+        <w:spacing w:after="120"/>
+      </w:pPr>
+      <w:r>
+        <w:t xml:space="preserve">The following shared platform entities — Note, Comment, and Document — maintain many-to-many relationships with all client domain entities. These relationships allow a single Note or Document to be linked to multiple records simultaneously across entity types.</w:t>
+      </w:r>
+    </w:p>
+    <w:p>
+      <w:r>
+        <w:t xml:space="preserve"/>
+      </w:r>
+    </w:p>
+    <w:p>
+      <w:pPr>
+        <w:numPr>
+          <w:ilvl w:val="0"/>
+          <w:numId w:val="1"/>
+        </w:numPr>
+        <w:spacing w:after="60"/>
+      </w:pPr>
+      <w:r>
+        <w:t xml:space="preserve">Note → Account, Contact, Engagement, Session, NPS Survey Response, Workshop, Workshop Attendance: Many-to-many. A Note may be linked to any combination of these records simultaneously.</w:t>
+      </w:r>
+    </w:p>
+    <w:p>
+      <w:pPr>
+        <w:numPr>
+          <w:ilvl w:val="0"/>
+          <w:numId w:val="1"/>
+        </w:numPr>
+        <w:spacing w:after="60"/>
+      </w:pPr>
+      <w:r>
+        <w:t xml:space="preserve">Comment → Note: Many-to-One. Comments are always children of a single parent Note.</w:t>
+      </w:r>
+    </w:p>
+    <w:p>
+      <w:pPr>
+        <w:numPr>
+          <w:ilvl w:val="0"/>
+          <w:numId w:val="1"/>
+        </w:numPr>
+        <w:spacing w:after="60"/>
+      </w:pPr>
+      <w:r>
+        <w:t xml:space="preserve">Document → Account, Contact, Engagement, Session, NPS Survey Response, Workshop, Workshop Attendance: Many-to-many. A Document may be linked to any combination of these records simultaneously.</w:t>
+      </w:r>
+    </w:p>
+    <w:p>
+      <w:pPr>
+        <w:numPr>
+          <w:ilvl w:val="0"/>
+          <w:numId w:val="1"/>
+        </w:numPr>
+        <w:spacing w:after="60"/>
+      </w:pPr>
+      <w:r>
+        <w:t xml:space="preserve">Email and Calls → Contact and Engagement: EspoCRM native activity records linked to both the Contact and the active Engagement. See Section 2.9 and CBM-PRD-CRM.docx Section 18.5 for configuration requirements.</w:t>
       </w:r>
     </w:p>
     <w:p>
@@ -6244,7 +6759,7 @@
                 <w:sz w:val="20"/>
                 <w:szCs w:val="20"/>
               </w:rPr>
-              <w:t xml:space="preserve">0.3</w:t>
+              <w:t xml:space="preserve">0.4</w:t>
             </w:r>
           </w:p>
         </w:tc>

</xml_diff>

<commit_message>
Client PRD v0.5: Updated status lifecycle (Pending Acceptance, Dormant), Meeting Cadence field, Section 4 Processes and Workflows complete
</commit_message>
<xml_diff>
--- a/PRDs/CBM-PRD-CRM-Client.docx
+++ b/PRDs/CBM-PRD-CRM-Client.docx
@@ -46,7 +46,7 @@
           <w:sz w:val="22"/>
           <w:szCs w:val="22"/>
         </w:rPr>
-        <w:t xml:space="preserve">Version 0.4  |  In Progress  |  March 15, 2026</w:t>
+        <w:t xml:space="preserve">Version 0.5  |  In Progress  |  March 15, 2026</w:t>
       </w:r>
     </w:p>
     <w:p>
@@ -2480,7 +2480,7 @@
         <w:spacing w:after="60"/>
       </w:pPr>
       <w:r>
-        <w:t xml:space="preserve">Submitted — Mentoring Request received; pending admin review and mentor assignment.</w:t>
+        <w:t xml:space="preserve">Submitted — Mentoring Request received; pending admin review and mentor nomination.</w:t>
       </w:r>
     </w:p>
     <w:p>
@@ -2492,7 +2492,7 @@
         <w:spacing w:after="60"/>
       </w:pPr>
       <w:r>
-        <w:t xml:space="preserve">Assigned — A mentor has been identified and assigned; Phase 2 form has been sent to the client.</w:t>
+        <w:t xml:space="preserve">Pending Acceptance — Admin has nominated a mentor; system has notified the mentor and is awaiting their acceptance or refusal. A configurable acceptance window applies (default: 48 hours). If the mentor refuses, the Engagement reverts to Submitted and the admin is notified to nominate another mentor.</w:t>
       </w:r>
     </w:p>
     <w:p>
@@ -2504,6 +2504,18 @@
         <w:spacing w:after="60"/>
       </w:pPr>
       <w:r>
+        <w:t xml:space="preserve">Assigned — Mentor has accepted the assignment. The mentor is responsible for personally introducing themselves to the client. Phase 2 form deployment is at the mentor’s discretion — it may be included in the introduction or deployed after the first session.</w:t>
+      </w:r>
+    </w:p>
+    <w:p>
+      <w:pPr>
+        <w:numPr>
+          <w:ilvl w:val="0"/>
+          <w:numId w:val="1"/>
+        </w:numPr>
+        <w:spacing w:after="60"/>
+      </w:pPr>
+      <w:r>
         <w:t xml:space="preserve">Active — Mentoring is underway; sessions are being logged.</w:t>
       </w:r>
     </w:p>
@@ -2516,7 +2528,7 @@
         <w:spacing w:after="60"/>
       </w:pPr>
       <w:r>
-        <w:t xml:space="preserve">On-Hold — A deliberate, temporary pause initiated by the client or mentor with intent to resume.</w:t>
+        <w:t xml:space="preserve">On-Hold — A deliberate, temporary pause initiated by the client or mentor with intent to resume. May be set from Active or Dormant status.</w:t>
       </w:r>
     </w:p>
     <w:p>
@@ -2528,7 +2540,7 @@
         <w:spacing w:after="60"/>
       </w:pPr>
       <w:r>
-        <w:t xml:space="preserve">Inactive — Activity has ceased without a formal hold; typically triggered by lack of client response.</w:t>
+        <w:t xml:space="preserve">Dormant — No activity recorded and no future sessions scheduled beyond the cadence-aware threshold (see Section 4.5). System-triggered. Prompts admin follow-up. Reverts to Active when activity resumes.</w:t>
       </w:r>
     </w:p>
     <w:p>
@@ -2540,7 +2552,7 @@
         <w:spacing w:after="60"/>
       </w:pPr>
       <w:r>
-        <w:t xml:space="preserve">Abandoned — Inactive for a configurable period (default: 90 days) with no response. Treated as permanently closed. The Inactive-to-Abandoned threshold is an admin-configurable system setting.</w:t>
+        <w:t xml:space="preserve">Inactive — Dormant for a configurable additional period (default: 60 days) with no response. System-triggered. Indicates the engagement is at serious risk of abandonment.</w:t>
       </w:r>
     </w:p>
     <w:p>
@@ -2552,7 +2564,19 @@
         <w:spacing w:after="60"/>
       </w:pPr>
       <w:r>
-        <w:t xml:space="preserve">Completed — The engagement was formally closed with goals achieved or mutually agreed conclusion.</w:t>
+        <w:t xml:space="preserve">Abandoned — Inactive for a configurable period (default: 90 days) with no response. System-triggered. Treated as permanently closed. All thresholds are admin-configurable system settings.</w:t>
+      </w:r>
+    </w:p>
+    <w:p>
+      <w:pPr>
+        <w:numPr>
+          <w:ilvl w:val="0"/>
+          <w:numId w:val="1"/>
+        </w:numPr>
+        <w:spacing w:after="60"/>
+      </w:pPr>
+      <w:r>
+        <w:t xml:space="preserve">Completed — The engagement was formally closed with goals achieved or by mutual agreement. Admin or mentor initiated.</w:t>
       </w:r>
     </w:p>
     <w:p>
@@ -3347,6 +3371,64 @@
           </w:p>
         </w:tc>
       </w:tr>
+      <w:tr>
+        <w:tc>
+          <w:tcPr>
+            <w:tcW w:type="dxa" w:w="2500"/>
+            <w:tcBorders>
+              <w:top w:val="single" w:color="CCCCCC" w:sz="1"/>
+              <w:left w:val="single" w:color="CCCCCC" w:sz="1"/>
+              <w:bottom w:val="single" w:color="CCCCCC" w:sz="1"/>
+              <w:right w:val="single" w:color="CCCCCC" w:sz="1"/>
+            </w:tcBorders>
+            <w:shd w:fill="F2F2F2" w:val="clear"/>
+            <w:tcMar>
+              <w:top w:type="dxa" w:w="80"/>
+              <w:left w:type="dxa" w:w="120"/>
+              <w:bottom w:type="dxa" w:w="80"/>
+              <w:right w:type="dxa" w:w="120"/>
+            </w:tcMar>
+          </w:tcPr>
+          <w:p>
+            <w:r>
+              <w:rPr>
+                <w:rFonts w:ascii="Arial" w:cs="Arial" w:eastAsia="Arial" w:hAnsi="Arial"/>
+                <w:sz w:val="18"/>
+                <w:szCs w:val="18"/>
+              </w:rPr>
+              <w:t xml:space="preserve">Meeting Cadence</w:t>
+            </w:r>
+          </w:p>
+        </w:tc>
+        <w:tc>
+          <w:tcPr>
+            <w:tcW w:type="dxa" w:w="6860"/>
+            <w:tcBorders>
+              <w:top w:val="single" w:color="CCCCCC" w:sz="1"/>
+              <w:left w:val="single" w:color="CCCCCC" w:sz="1"/>
+              <w:bottom w:val="single" w:color="CCCCCC" w:sz="1"/>
+              <w:right w:val="single" w:color="CCCCCC" w:sz="1"/>
+            </w:tcBorders>
+            <w:shd w:fill="F2F2F2" w:val="clear"/>
+            <w:tcMar>
+              <w:top w:type="dxa" w:w="80"/>
+              <w:left w:type="dxa" w:w="120"/>
+              <w:bottom w:type="dxa" w:w="80"/>
+              <w:right w:type="dxa" w:w="120"/>
+            </w:tcMar>
+          </w:tcPr>
+          <w:p>
+            <w:r>
+              <w:rPr>
+                <w:rFonts w:ascii="Arial" w:cs="Arial" w:eastAsia="Arial" w:hAnsi="Arial"/>
+                <w:sz w:val="18"/>
+                <w:szCs w:val="18"/>
+              </w:rPr>
+              <w:t xml:space="preserve">Expected frequency of mentor-client meetings. Dropdown. Values: Weekly | Bi-Weekly | Monthly | As Needed. Required. Set by admin or mentor at time of assignment. Used by inactivity monitoring to calculate cadence-aware Dormant thresholds: Weekly = 14 days, Bi-Weekly = 21 days, Monthly = 45 days, As Needed = 60 days.</w:t>
+            </w:r>
+          </w:p>
+        </w:tc>
+      </w:tr>
     </w:tbl>
     <w:p>
       <w:r>
@@ -6349,10 +6431,101 @@
     </w:p>
     <w:p>
       <w:pPr>
+        <w:spacing w:after="120"/>
+      </w:pPr>
+      <w:r>
+        <w:t xml:space="preserve">This section defines the step-by-step processes and automated workflows that govern the client lifecycle within EspoCRM. Automated steps are executed by EspoCRM’s workflow engine unless otherwise noted.</w:t>
+      </w:r>
+    </w:p>
+    <w:p>
+      <w:r>
+        <w:t xml:space="preserve"/>
+      </w:r>
+    </w:p>
+    <w:p>
+      <w:pPr>
         <w:pStyle w:val="Heading2"/>
       </w:pPr>
       <w:r>
         <w:t xml:space="preserve">4.1 Client Intake</w:t>
+      </w:r>
+    </w:p>
+    <w:p>
+      <w:pPr>
+        <w:spacing w:after="120"/>
+      </w:pPr>
+      <w:r>
+        <w:t xml:space="preserve">The intake process begins when a prospective client submits the Phase 1 Mentoring Request form on the CBM website. The form is built in WordPress and posts data to EspoCRM via the REST API.</w:t>
+      </w:r>
+    </w:p>
+    <w:p>
+      <w:r>
+        <w:t xml:space="preserve"/>
+      </w:r>
+    </w:p>
+    <w:p>
+      <w:pPr>
+        <w:numPr>
+          <w:ilvl w:val="0"/>
+          <w:numId w:val="2"/>
+        </w:numPr>
+        <w:spacing w:after="60"/>
+      </w:pPr>
+      <w:r>
+        <w:t xml:space="preserve">Client completes and submits the Phase 1 Mentoring Request form on the CBM website.</w:t>
+      </w:r>
+    </w:p>
+    <w:p>
+      <w:pPr>
+        <w:numPr>
+          <w:ilvl w:val="0"/>
+          <w:numId w:val="2"/>
+        </w:numPr>
+        <w:spacing w:after="60"/>
+      </w:pPr>
+      <w:r>
+        <w:t xml:space="preserve">EspoCRM REST API receives the form submission and automatically creates three linked records: Account (the business), Contact (the submitting individual, flagged as Primary Contact), and Engagement (status: Submitted).</w:t>
+      </w:r>
+    </w:p>
+    <w:p>
+      <w:pPr>
+        <w:numPr>
+          <w:ilvl w:val="0"/>
+          <w:numId w:val="2"/>
+        </w:numPr>
+        <w:spacing w:after="60"/>
+      </w:pPr>
+      <w:r>
+        <w:t xml:space="preserve">Admin receives an automatic system notification of the new submission.</w:t>
+      </w:r>
+    </w:p>
+    <w:p>
+      <w:pPr>
+        <w:numPr>
+          <w:ilvl w:val="0"/>
+          <w:numId w:val="2"/>
+        </w:numPr>
+        <w:spacing w:after="60"/>
+      </w:pPr>
+      <w:r>
+        <w:t xml:space="preserve">Admin reviews the submission for completeness and basic eligibility. Admin determines whether the request is suitable for the program.</w:t>
+      </w:r>
+    </w:p>
+    <w:p>
+      <w:pPr>
+        <w:numPr>
+          <w:ilvl w:val="0"/>
+          <w:numId w:val="2"/>
+        </w:numPr>
+        <w:spacing w:after="60"/>
+      </w:pPr>
+      <w:r>
+        <w:t xml:space="preserve">If eligible, admin proceeds to mentor nomination (see Section 4.2). If not eligible, admin updates the Engagement status to Abandoned with Close Reason: Other, and notifies the applicant via email.</w:t>
+      </w:r>
+    </w:p>
+    <w:p>
+      <w:r>
+        <w:t xml:space="preserve"/>
       </w:r>
     </w:p>
     <w:p>
@@ -6365,20 +6538,12 @@
           <w:iCs/>
           <w:color w:val="888888"/>
         </w:rPr>
-        <w:t xml:space="preserve">[PLACEHOLDER: Step-by-step intake process — form submission on website, CRM record creation, admin review, mentor assignment, introduction email trigger.]</w:t>
+        <w:t xml:space="preserve">Note: The detailed screening and eligibility criteria for Step 4 are to be defined by CBM leadership. This PRD assumes a basic review process only. A more structured qualification workflow may be added in a future revision.</w:t>
       </w:r>
     </w:p>
     <w:p>
       <w:r>
         <w:t xml:space="preserve"/>
-      </w:r>
-    </w:p>
-    <w:p>
-      <w:pPr>
-        <w:pStyle w:val="Heading2"/>
-      </w:pPr>
-      <w:r>
-        <w:t xml:space="preserve">4.2 Mentor Assignment</w:t>
       </w:r>
     </w:p>
     <w:p>
@@ -6391,7 +6556,7 @@
           <w:iCs/>
           <w:color w:val="888888"/>
         </w:rPr>
-        <w:t xml:space="preserve">[PLACEHOLDER: Workflow for matching and assigning a mentor to a client — admin review, matching criteria, assignment record creation, notifications.]</w:t>
+        <w:t xml:space="preserve">Future enhancement: Automated or AI-assisted mentor matching is a planned future capability. The data model — NAICS sector/subsector and Mentoring Focus Areas on the Account; skills and expertise tags on the mentor Contact — is designed from day one to support this. No restructuring will be required when this feature is implemented.</w:t>
       </w:r>
     </w:p>
     <w:p>
@@ -6404,7 +6569,662 @@
         <w:pStyle w:val="Heading2"/>
       </w:pPr>
       <w:r>
+        <w:t xml:space="preserve">4.2 Mentor Assignment</w:t>
+      </w:r>
+    </w:p>
+    <w:p>
+      <w:pPr>
+        <w:spacing w:after="120"/>
+      </w:pPr>
+      <w:r>
+        <w:t xml:space="preserve">The mentor assignment process begins after the admin has reviewed and accepted a client intake submission.</w:t>
+      </w:r>
+    </w:p>
+    <w:p>
+      <w:r>
+        <w:t xml:space="preserve"/>
+      </w:r>
+    </w:p>
+    <w:p>
+      <w:pPr>
+        <w:numPr>
+          <w:ilvl w:val="0"/>
+          <w:numId w:val="2"/>
+        </w:numPr>
+        <w:spacing w:after="60"/>
+      </w:pPr>
+      <w:r>
+        <w:t xml:space="preserve">Admin searches the mentor pool in EspoCRM, filtering by NAICS sector/subsector, Mentoring Focus Areas, skills/expertise tags, Active status, accepting clients = Yes, and available capacity.</w:t>
+      </w:r>
+    </w:p>
+    <w:p>
+      <w:pPr>
+        <w:numPr>
+          <w:ilvl w:val="0"/>
+          <w:numId w:val="2"/>
+        </w:numPr>
+        <w:spacing w:after="60"/>
+      </w:pPr>
+      <w:r>
+        <w:t xml:space="preserve">Admin nominates a primary mentor (and optionally a co-mentor). System verifies the mentor is Active, accepting clients, and has capacity before allowing nomination.</w:t>
+      </w:r>
+    </w:p>
+    <w:p>
+      <w:pPr>
+        <w:numPr>
+          <w:ilvl w:val="0"/>
+          <w:numId w:val="2"/>
+        </w:numPr>
+        <w:spacing w:after="60"/>
+      </w:pPr>
+      <w:r>
+        <w:t xml:space="preserve">Engagement status changes to Pending Acceptance.</w:t>
+      </w:r>
+    </w:p>
+    <w:p>
+      <w:pPr>
+        <w:numPr>
+          <w:ilvl w:val="0"/>
+          <w:numId w:val="2"/>
+        </w:numPr>
+        <w:spacing w:after="60"/>
+      </w:pPr>
+      <w:r>
+        <w:t xml:space="preserve">System sends an automatic notification email to the nominated mentor with a summary of the client’s Phase 1 intake data and a link to accept or refuse the assignment. A configurable acceptance window applies (default: 48 hours).</w:t>
+      </w:r>
+    </w:p>
+    <w:p>
+      <w:pPr>
+        <w:numPr>
+          <w:ilvl w:val="0"/>
+          <w:numId w:val="2"/>
+        </w:numPr>
+        <w:spacing w:after="60"/>
+      </w:pPr>
+      <w:r>
+        <w:t xml:space="preserve">If the mentor accepts: Engagement status changes to Assigned. Admin is notified. Proceed to Step 6.</w:t>
+      </w:r>
+    </w:p>
+    <w:p>
+      <w:pPr>
+        <w:numPr>
+          <w:ilvl w:val="0"/>
+          <w:numId w:val="2"/>
+        </w:numPr>
+        <w:spacing w:after="60"/>
+      </w:pPr>
+      <w:r>
+        <w:t xml:space="preserve">If the mentor refuses: Engagement status reverts to Submitted. Admin is notified and returns to Step 1 to nominate a different mentor. No explanation is required from the refusing mentor.</w:t>
+      </w:r>
+    </w:p>
+    <w:p>
+      <w:pPr>
+        <w:numPr>
+          <w:ilvl w:val="0"/>
+          <w:numId w:val="2"/>
+        </w:numPr>
+        <w:spacing w:after="60"/>
+      </w:pPr>
+      <w:r>
+        <w:t xml:space="preserve">If no response within the acceptance window: Admin is alerted to follow up or nominate a different mentor. Engagement remains in Pending Acceptance.</w:t>
+      </w:r>
+    </w:p>
+    <w:p>
+      <w:pPr>
+        <w:numPr>
+          <w:ilvl w:val="0"/>
+          <w:numId w:val="2"/>
+        </w:numPr>
+        <w:spacing w:after="60"/>
+      </w:pPr>
+      <w:r>
+        <w:t xml:space="preserve">Mentor sets the Meeting Cadence field on the Engagement record.</w:t>
+      </w:r>
+    </w:p>
+    <w:p>
+      <w:pPr>
+        <w:numPr>
+          <w:ilvl w:val="0"/>
+          <w:numId w:val="2"/>
+        </w:numPr>
+        <w:spacing w:after="60"/>
+      </w:pPr>
+      <w:r>
+        <w:t xml:space="preserve">Mentor personally introduces themselves to the client via email. EspoCRM email templates are available to mentors as a starting point for personalized introductions. The introduction is sent by the mentor — not auto-generated by the system.</w:t>
+      </w:r>
+    </w:p>
+    <w:p>
+      <w:pPr>
+        <w:numPr>
+          <w:ilvl w:val="0"/>
+          <w:numId w:val="2"/>
+        </w:numPr>
+        <w:spacing w:after="60"/>
+      </w:pPr>
+      <w:r>
+        <w:t xml:space="preserve">Phase 2 form deployment is at the mentor’s discretion. The mentor may include the Phase 2 form link in the introduction email or deploy it after the first session to explain it in person.</w:t>
+      </w:r>
+    </w:p>
+    <w:p>
+      <w:pPr>
+        <w:numPr>
+          <w:ilvl w:val="0"/>
+          <w:numId w:val="2"/>
+        </w:numPr>
+        <w:spacing w:after="60"/>
+      </w:pPr>
+      <w:r>
+        <w:t xml:space="preserve">Once the first session is logged, Engagement status changes to Active.</w:t>
+      </w:r>
+    </w:p>
+    <w:p>
+      <w:r>
+        <w:t xml:space="preserve"/>
+      </w:r>
+    </w:p>
+    <w:p>
+      <w:pPr>
+        <w:pStyle w:val="Heading2"/>
+      </w:pPr>
+      <w:r>
         <w:t xml:space="preserve">4.3 Session Logging</w:t>
+      </w:r>
+    </w:p>
+    <w:p>
+      <w:pPr>
+        <w:spacing w:after="120"/>
+      </w:pPr>
+      <w:r>
+        <w:t xml:space="preserve">Sessions are logged by the assigned mentor, co-mentor, or SME after each meeting with the client. There is no admin review or approval of session records.</w:t>
+      </w:r>
+    </w:p>
+    <w:p>
+      <w:r>
+        <w:t xml:space="preserve"/>
+      </w:r>
+    </w:p>
+    <w:p>
+      <w:pPr>
+        <w:numPr>
+          <w:ilvl w:val="0"/>
+          <w:numId w:val="2"/>
+        </w:numPr>
+        <w:spacing w:after="60"/>
+      </w:pPr>
+      <w:r>
+        <w:t xml:space="preserve">Mentor, co-mentor, or SME navigates to the Engagement record in EspoCRM and creates a new Session record.</w:t>
+      </w:r>
+    </w:p>
+    <w:p>
+      <w:pPr>
+        <w:numPr>
+          <w:ilvl w:val="0"/>
+          <w:numId w:val="2"/>
+        </w:numPr>
+        <w:spacing w:after="60"/>
+      </w:pPr>
+      <w:r>
+        <w:t xml:space="preserve">Session fields completed: Date/Time, Duration, Session Type, Meeting Location Type and Details (if in-person), Topics Covered, Mentor Notes, Next Steps, and New Business Started flag.</w:t>
+      </w:r>
+    </w:p>
+    <w:p>
+      <w:pPr>
+        <w:numPr>
+          <w:ilvl w:val="0"/>
+          <w:numId w:val="2"/>
+        </w:numPr>
+        <w:spacing w:after="60"/>
+      </w:pPr>
+      <w:r>
+        <w:t xml:space="preserve">Session record is saved and linked to the Engagement.</w:t>
+      </w:r>
+    </w:p>
+    <w:p>
+      <w:pPr>
+        <w:numPr>
+          <w:ilvl w:val="0"/>
+          <w:numId w:val="2"/>
+        </w:numPr>
+        <w:spacing w:after="60"/>
+      </w:pPr>
+      <w:r>
+        <w:t xml:space="preserve">Engagement roll-up fields update automatically: Total Sessions, Total Sessions (Last 30 Days), Last Session Date, and Total Session Hours are recalculated.</w:t>
+      </w:r>
+    </w:p>
+    <w:p>
+      <w:pPr>
+        <w:numPr>
+          <w:ilvl w:val="0"/>
+          <w:numId w:val="2"/>
+        </w:numPr>
+        <w:spacing w:after="60"/>
+      </w:pPr>
+      <w:r>
+        <w:t xml:space="preserve">Inactivity monitoring clock resets — the new session date is recognized as the most recent activity event.</w:t>
+      </w:r>
+    </w:p>
+    <w:p>
+      <w:pPr>
+        <w:numPr>
+          <w:ilvl w:val="0"/>
+          <w:numId w:val="2"/>
+        </w:numPr>
+        <w:spacing w:after="60"/>
+      </w:pPr>
+      <w:r>
+        <w:t xml:space="preserve">System checks session count against NPS survey trigger thresholds (see Section 4.4).</w:t>
+      </w:r>
+    </w:p>
+    <w:p>
+      <w:pPr>
+        <w:numPr>
+          <w:ilvl w:val="0"/>
+          <w:numId w:val="2"/>
+        </w:numPr>
+        <w:spacing w:after="60"/>
+      </w:pPr>
+      <w:r>
+        <w:t xml:space="preserve">If this is the first session logged on an Assigned Engagement, Engagement status automatically changes to Active.</w:t>
+      </w:r>
+    </w:p>
+    <w:p>
+      <w:r>
+        <w:t xml:space="preserve"/>
+      </w:r>
+    </w:p>
+    <w:p>
+      <w:pPr>
+        <w:pStyle w:val="Heading2"/>
+      </w:pPr>
+      <w:r>
+        <w:t xml:space="preserve">4.4 NPS Survey Triggers</w:t>
+      </w:r>
+    </w:p>
+    <w:p>
+      <w:pPr>
+        <w:spacing w:after="120"/>
+      </w:pPr>
+      <w:r>
+        <w:t xml:space="preserve">NPS surveys are delivered via LimeSurvey (self-hosted on AWS) and triggered automatically by EspoCRM’s workflow engine based on session count per Engagement. Survey responses are posted back to EspoCRM via the LimeSurvey API and stored as NPS Survey Response records linked to the Engagement.</w:t>
+      </w:r>
+    </w:p>
+    <w:p>
+      <w:r>
+        <w:t xml:space="preserve"/>
+      </w:r>
+    </w:p>
+    <w:p>
+      <w:pPr>
+        <w:spacing w:after="120"/>
+      </w:pPr>
+      <w:r>
+        <w:t xml:space="preserve">Trigger points:</w:t>
+      </w:r>
+    </w:p>
+    <w:p>
+      <w:pPr>
+        <w:numPr>
+          <w:ilvl w:val="0"/>
+          <w:numId w:val="1"/>
+        </w:numPr>
+        <w:spacing w:after="60"/>
+      </w:pPr>
+      <w:r>
+        <w:t xml:space="preserve">After the 2nd session — first NPS survey triggered. Sufficient sessions to form a meaningful impression of the mentoring relationship.</w:t>
+      </w:r>
+    </w:p>
+    <w:p>
+      <w:pPr>
+        <w:numPr>
+          <w:ilvl w:val="0"/>
+          <w:numId w:val="1"/>
+        </w:numPr>
+        <w:spacing w:after="60"/>
+      </w:pPr>
+      <w:r>
+        <w:t xml:space="preserve">Every 5 sessions thereafter — recurring pulse check (sessions 7, 12, 17, etc.).</w:t>
+      </w:r>
+    </w:p>
+    <w:p>
+      <w:pPr>
+        <w:numPr>
+          <w:ilvl w:val="0"/>
+          <w:numId w:val="1"/>
+        </w:numPr>
+        <w:spacing w:after="60"/>
+      </w:pPr>
+      <w:r>
+        <w:t xml:space="preserve">At Engagement Close — final NPS survey triggered regardless of session count.</w:t>
+      </w:r>
+    </w:p>
+    <w:p>
+      <w:r>
+        <w:t xml:space="preserve"/>
+      </w:r>
+    </w:p>
+    <w:p>
+      <w:pPr>
+        <w:spacing w:after="120"/>
+      </w:pPr>
+      <w:r>
+        <w:t xml:space="preserve">Survey delivery and response flow:</w:t>
+      </w:r>
+    </w:p>
+    <w:p>
+      <w:pPr>
+        <w:numPr>
+          <w:ilvl w:val="0"/>
+          <w:numId w:val="2"/>
+        </w:numPr>
+        <w:spacing w:after="60"/>
+      </w:pPr>
+      <w:r>
+        <w:t xml:space="preserve">EspoCRM workflow detects trigger condition (session count threshold or engagement close).</w:t>
+      </w:r>
+    </w:p>
+    <w:p>
+      <w:pPr>
+        <w:numPr>
+          <w:ilvl w:val="0"/>
+          <w:numId w:val="2"/>
+        </w:numPr>
+        <w:spacing w:after="60"/>
+      </w:pPr>
+      <w:r>
+        <w:t xml:space="preserve">EspoCRM calls LimeSurvey API to generate a personalized survey link for the client.</w:t>
+      </w:r>
+    </w:p>
+    <w:p>
+      <w:pPr>
+        <w:numPr>
+          <w:ilvl w:val="0"/>
+          <w:numId w:val="2"/>
+        </w:numPr>
+        <w:spacing w:after="60"/>
+      </w:pPr>
+      <w:r>
+        <w:t xml:space="preserve">LimeSurvey sends the survey email to the client’s primary email address. No client login is required.</w:t>
+      </w:r>
+    </w:p>
+    <w:p>
+      <w:pPr>
+        <w:numPr>
+          <w:ilvl w:val="0"/>
+          <w:numId w:val="2"/>
+        </w:numPr>
+        <w:spacing w:after="60"/>
+      </w:pPr>
+      <w:r>
+        <w:t xml:space="preserve">Client completes the survey: NPS Score (0-10), Did CBM Help You (Yes/No), I Would Return to See This Mentor Again (1-5), Mentor Listened and Understood My Needs (1-5), and optional free-text feedback.</w:t>
+      </w:r>
+    </w:p>
+    <w:p>
+      <w:pPr>
+        <w:numPr>
+          <w:ilvl w:val="0"/>
+          <w:numId w:val="2"/>
+        </w:numPr>
+        <w:spacing w:after="60"/>
+      </w:pPr>
+      <w:r>
+        <w:t xml:space="preserve">LimeSurvey posts completed response to EspoCRM via API.</w:t>
+      </w:r>
+    </w:p>
+    <w:p>
+      <w:pPr>
+        <w:numPr>
+          <w:ilvl w:val="0"/>
+          <w:numId w:val="2"/>
+        </w:numPr>
+        <w:spacing w:after="60"/>
+      </w:pPr>
+      <w:r>
+        <w:t xml:space="preserve">EspoCRM creates an NPS Survey Response record linked to the Engagement and, where applicable, the triggering Session record.</w:t>
+      </w:r>
+    </w:p>
+    <w:p>
+      <w:pPr>
+        <w:numPr>
+          <w:ilvl w:val="0"/>
+          <w:numId w:val="2"/>
+        </w:numPr>
+        <w:spacing w:after="60"/>
+      </w:pPr>
+      <w:r>
+        <w:t xml:space="preserve">NPS Survey Response is visible to the assigned mentor and admin on the Engagement record. No notification is sent to the mentor — they will see the response on next login.</w:t>
+      </w:r>
+    </w:p>
+    <w:p>
+      <w:r>
+        <w:t xml:space="preserve"/>
+      </w:r>
+    </w:p>
+    <w:p>
+      <w:pPr>
+        <w:pStyle w:val="Heading2"/>
+      </w:pPr>
+      <w:r>
+        <w:t xml:space="preserve">4.5 Inactivity Monitoring</w:t>
+      </w:r>
+    </w:p>
+    <w:p>
+      <w:pPr>
+        <w:spacing w:after="120"/>
+      </w:pPr>
+      <w:r>
+        <w:t xml:space="preserve">Inactivity monitoring tracks engagement activity and automatically transitions Engagement status when activity falls below expected thresholds. All thresholds are admin-configurable system settings. The monitoring clock resets on any qualifying activity event.</w:t>
+      </w:r>
+    </w:p>
+    <w:p>
+      <w:r>
+        <w:t xml:space="preserve"/>
+      </w:r>
+    </w:p>
+    <w:p>
+      <w:pPr>
+        <w:spacing w:after="120"/>
+      </w:pPr>
+      <w:r>
+        <w:t xml:space="preserve">Qualifying activity events that reset the inactivity clock:</w:t>
+      </w:r>
+    </w:p>
+    <w:p>
+      <w:pPr>
+        <w:numPr>
+          <w:ilvl w:val="0"/>
+          <w:numId w:val="1"/>
+        </w:numPr>
+        <w:spacing w:after="60"/>
+      </w:pPr>
+      <w:r>
+        <w:t xml:space="preserve">A Session record logged against the Engagement.</w:t>
+      </w:r>
+    </w:p>
+    <w:p>
+      <w:pPr>
+        <w:numPr>
+          <w:ilvl w:val="0"/>
+          <w:numId w:val="1"/>
+        </w:numPr>
+        <w:spacing w:after="60"/>
+      </w:pPr>
+      <w:r>
+        <w:t xml:space="preserve">An email sent or received linked to the Engagement.</w:t>
+      </w:r>
+    </w:p>
+    <w:p>
+      <w:pPr>
+        <w:numPr>
+          <w:ilvl w:val="0"/>
+          <w:numId w:val="1"/>
+        </w:numPr>
+        <w:spacing w:after="60"/>
+      </w:pPr>
+      <w:r>
+        <w:t xml:space="preserve">A call logged against the Engagement.</w:t>
+      </w:r>
+    </w:p>
+    <w:p>
+      <w:pPr>
+        <w:numPr>
+          <w:ilvl w:val="0"/>
+          <w:numId w:val="1"/>
+        </w:numPr>
+        <w:spacing w:after="60"/>
+      </w:pPr>
+      <w:r>
+        <w:t xml:space="preserve">A future Session scheduled in EspoCRM or Cal.com linked to the Engagement. Scheduled future sessions prevent inactivity transitions even if no recent activity has occurred.</w:t>
+      </w:r>
+    </w:p>
+    <w:p>
+      <w:r>
+        <w:t xml:space="preserve"/>
+      </w:r>
+    </w:p>
+    <w:p>
+      <w:pPr>
+        <w:spacing w:after="120"/>
+      </w:pPr>
+      <w:r>
+        <w:t xml:space="preserve">Cadence-aware Dormant thresholds (admin-configurable, defaults shown):</w:t>
+      </w:r>
+    </w:p>
+    <w:p>
+      <w:pPr>
+        <w:numPr>
+          <w:ilvl w:val="0"/>
+          <w:numId w:val="1"/>
+        </w:numPr>
+        <w:spacing w:after="60"/>
+      </w:pPr>
+      <w:r>
+        <w:t xml:space="preserve">Weekly cadence — Dormant after 14 days of no qualifying activity.</w:t>
+      </w:r>
+    </w:p>
+    <w:p>
+      <w:pPr>
+        <w:numPr>
+          <w:ilvl w:val="0"/>
+          <w:numId w:val="1"/>
+        </w:numPr>
+        <w:spacing w:after="60"/>
+      </w:pPr>
+      <w:r>
+        <w:t xml:space="preserve">Bi-Weekly cadence — Dormant after 21 days of no qualifying activity.</w:t>
+      </w:r>
+    </w:p>
+    <w:p>
+      <w:pPr>
+        <w:numPr>
+          <w:ilvl w:val="0"/>
+          <w:numId w:val="1"/>
+        </w:numPr>
+        <w:spacing w:after="60"/>
+      </w:pPr>
+      <w:r>
+        <w:t xml:space="preserve">Monthly cadence — Dormant after 45 days of no qualifying activity.</w:t>
+      </w:r>
+    </w:p>
+    <w:p>
+      <w:pPr>
+        <w:numPr>
+          <w:ilvl w:val="0"/>
+          <w:numId w:val="1"/>
+        </w:numPr>
+        <w:spacing w:after="60"/>
+      </w:pPr>
+      <w:r>
+        <w:t xml:space="preserve">As Needed cadence — Dormant after 60 days of no qualifying activity.</w:t>
+      </w:r>
+    </w:p>
+    <w:p>
+      <w:r>
+        <w:t xml:space="preserve"/>
+      </w:r>
+    </w:p>
+    <w:p>
+      <w:pPr>
+        <w:spacing w:after="120"/>
+      </w:pPr>
+      <w:r>
+        <w:t xml:space="preserve">Status transition flow:</w:t>
+      </w:r>
+    </w:p>
+    <w:p>
+      <w:pPr>
+        <w:numPr>
+          <w:ilvl w:val="0"/>
+          <w:numId w:val="2"/>
+        </w:numPr>
+        <w:spacing w:after="60"/>
+      </w:pPr>
+      <w:r>
+        <w:t xml:space="preserve">System monitors qualifying activity events daily against the cadence-aware threshold.</w:t>
+      </w:r>
+    </w:p>
+    <w:p>
+      <w:pPr>
+        <w:numPr>
+          <w:ilvl w:val="0"/>
+          <w:numId w:val="2"/>
+        </w:numPr>
+        <w:spacing w:after="60"/>
+      </w:pPr>
+      <w:r>
+        <w:t xml:space="preserve">When threshold is exceeded: Engagement status changes from Active to Dormant. Admin receives an alert notification.</w:t>
+      </w:r>
+    </w:p>
+    <w:p>
+      <w:pPr>
+        <w:numPr>
+          <w:ilvl w:val="0"/>
+          <w:numId w:val="2"/>
+        </w:numPr>
+        <w:spacing w:after="60"/>
+      </w:pPr>
+      <w:r>
+        <w:t xml:space="preserve">Admin reviews the Dormant engagement and follows up with the mentor as appropriate.</w:t>
+      </w:r>
+    </w:p>
+    <w:p>
+      <w:pPr>
+        <w:numPr>
+          <w:ilvl w:val="0"/>
+          <w:numId w:val="2"/>
+        </w:numPr>
+        <w:spacing w:after="60"/>
+      </w:pPr>
+      <w:r>
+        <w:t xml:space="preserve">If activity resumes: Engagement status reverts to Active automatically.</w:t>
+      </w:r>
+    </w:p>
+    <w:p>
+      <w:pPr>
+        <w:numPr>
+          <w:ilvl w:val="0"/>
+          <w:numId w:val="2"/>
+        </w:numPr>
+        <w:spacing w:after="60"/>
+      </w:pPr>
+      <w:r>
+        <w:t xml:space="preserve">If no activity for an additional 60 days after becoming Dormant: Engagement status changes to Inactive. Admin receives an alert notification.</w:t>
+      </w:r>
+    </w:p>
+    <w:p>
+      <w:pPr>
+        <w:numPr>
+          <w:ilvl w:val="0"/>
+          <w:numId w:val="2"/>
+        </w:numPr>
+        <w:spacing w:after="60"/>
+      </w:pPr>
+      <w:r>
+        <w:t xml:space="preserve">If no activity for a further 90 days after becoming Inactive: Engagement status changes to Abandoned. Engagement is treated as permanently closed. Admin receives a final notification.</w:t>
+      </w:r>
+    </w:p>
+    <w:p>
+      <w:r>
+        <w:t xml:space="preserve"/>
       </w:r>
     </w:p>
     <w:p>
@@ -6417,7 +7237,7 @@
           <w:iCs/>
           <w:color w:val="888888"/>
         </w:rPr>
-        <w:t xml:space="preserve">[PLACEHOLDER: Process for logging a mentoring session against a client record — fields captured, who logs, how it updates engagement record and KPIs.]</w:t>
+        <w:t xml:space="preserve">Note: On-Hold engagements are excluded from inactivity monitoring. The clock does not run while an Engagement is in On-Hold status.</w:t>
       </w:r>
     </w:p>
     <w:p>
@@ -6430,7 +7250,7 @@
         <w:pStyle w:val="Heading2"/>
       </w:pPr>
       <w:r>
-        <w:t xml:space="preserve">4.4 NPS Survey Triggers</w:t>
+        <w:t xml:space="preserve">4.6 Engagement Close</w:t>
       </w:r>
     </w:p>
     <w:p>
@@ -6438,12 +7258,7 @@
         <w:spacing w:after="120"/>
       </w:pPr>
       <w:r>
-        <w:rPr>
-          <w:i/>
-          <w:iCs/>
-          <w:color w:val="888888"/>
-        </w:rPr>
-        <w:t xml:space="preserve">[PLACEHOLDER: Automated NPS trigger logic — after 2nd session, every 5 sessions thereafter, at engagement close. Survey delivery, response capture, linking to record.]</w:t>
+        <w:t xml:space="preserve">An engagement may be formally closed by an admin or mentor (Completed status) or automatically by the system (Abandoned status). In either case, a final NPS survey is triggered and the Engagement record is preserved for historical reporting.</w:t>
       </w:r>
     </w:p>
     <w:p>
@@ -6453,10 +7268,168 @@
     </w:p>
     <w:p>
       <w:pPr>
+        <w:spacing w:after="120"/>
+      </w:pPr>
+      <w:r>
+        <w:t xml:space="preserve">Mentor or admin-initiated close (Completed):</w:t>
+      </w:r>
+    </w:p>
+    <w:p>
+      <w:pPr>
+        <w:numPr>
+          <w:ilvl w:val="0"/>
+          <w:numId w:val="2"/>
+        </w:numPr>
+        <w:spacing w:after="60"/>
+      </w:pPr>
+      <w:r>
+        <w:t xml:space="preserve">Admin or mentor navigates to the Engagement record and changes status to Completed.</w:t>
+      </w:r>
+    </w:p>
+    <w:p>
+      <w:pPr>
+        <w:numPr>
+          <w:ilvl w:val="0"/>
+          <w:numId w:val="2"/>
+        </w:numPr>
+        <w:spacing w:after="60"/>
+      </w:pPr>
+      <w:r>
+        <w:t xml:space="preserve">Close Reason is recorded: Goals Achieved | Client Withdrew | Other.</w:t>
+      </w:r>
+    </w:p>
+    <w:p>
+      <w:pPr>
+        <w:numPr>
+          <w:ilvl w:val="0"/>
+          <w:numId w:val="2"/>
+        </w:numPr>
+        <w:spacing w:after="60"/>
+      </w:pPr>
+      <w:r>
+        <w:t xml:space="preserve">Close Date is system-populated with the current date.</w:t>
+      </w:r>
+    </w:p>
+    <w:p>
+      <w:pPr>
+        <w:numPr>
+          <w:ilvl w:val="0"/>
+          <w:numId w:val="2"/>
+        </w:numPr>
+        <w:spacing w:after="60"/>
+      </w:pPr>
+      <w:r>
+        <w:t xml:space="preserve">Final NPS survey is triggered automatically via LimeSurvey (see Section 4.4).</w:t>
+      </w:r>
+    </w:p>
+    <w:p>
+      <w:pPr>
+        <w:numPr>
+          <w:ilvl w:val="0"/>
+          <w:numId w:val="2"/>
+        </w:numPr>
+        <w:spacing w:after="60"/>
+      </w:pPr>
+      <w:r>
+        <w:t xml:space="preserve">Engagement record becomes read-only for core fields. Notes, Comments, and Documents may still be added post-close by the mentor or admin.</w:t>
+      </w:r>
+    </w:p>
+    <w:p>
+      <w:r>
+        <w:t xml:space="preserve"/>
+      </w:r>
+    </w:p>
+    <w:p>
+      <w:pPr>
+        <w:spacing w:after="120"/>
+      </w:pPr>
+      <w:r>
+        <w:t xml:space="preserve">System-initiated close (Abandoned):</w:t>
+      </w:r>
+    </w:p>
+    <w:p>
+      <w:pPr>
+        <w:numPr>
+          <w:ilvl w:val="0"/>
+          <w:numId w:val="2"/>
+        </w:numPr>
+        <w:spacing w:after="60"/>
+      </w:pPr>
+      <w:r>
+        <w:t xml:space="preserve">System automatically changes Engagement status to Abandoned after the configured Inactive threshold is exceeded (default: 90 days).</w:t>
+      </w:r>
+    </w:p>
+    <w:p>
+      <w:pPr>
+        <w:numPr>
+          <w:ilvl w:val="0"/>
+          <w:numId w:val="2"/>
+        </w:numPr>
+        <w:spacing w:after="60"/>
+      </w:pPr>
+      <w:r>
+        <w:t xml:space="preserve">Close Reason is set automatically to: Inactive / No Response.</w:t>
+      </w:r>
+    </w:p>
+    <w:p>
+      <w:pPr>
+        <w:numPr>
+          <w:ilvl w:val="0"/>
+          <w:numId w:val="2"/>
+        </w:numPr>
+        <w:spacing w:after="60"/>
+      </w:pPr>
+      <w:r>
+        <w:t xml:space="preserve">Close Date is system-populated.</w:t>
+      </w:r>
+    </w:p>
+    <w:p>
+      <w:pPr>
+        <w:numPr>
+          <w:ilvl w:val="0"/>
+          <w:numId w:val="2"/>
+        </w:numPr>
+        <w:spacing w:after="60"/>
+      </w:pPr>
+      <w:r>
+        <w:t xml:space="preserve">Final NPS survey is triggered automatically via LimeSurvey.</w:t>
+      </w:r>
+    </w:p>
+    <w:p>
+      <w:pPr>
+        <w:numPr>
+          <w:ilvl w:val="0"/>
+          <w:numId w:val="2"/>
+        </w:numPr>
+        <w:spacing w:after="60"/>
+      </w:pPr>
+      <w:r>
+        <w:t xml:space="preserve">Admin receives a notification that the Engagement has been Abandoned.</w:t>
+      </w:r>
+    </w:p>
+    <w:p>
+      <w:pPr>
+        <w:numPr>
+          <w:ilvl w:val="0"/>
+          <w:numId w:val="2"/>
+        </w:numPr>
+        <w:spacing w:after="60"/>
+      </w:pPr>
+      <w:r>
+        <w:t xml:space="preserve">Engagement record becomes read-only for core fields. Notes, Comments, and Documents may still be added post-close by the mentor or admin.</w:t>
+      </w:r>
+    </w:p>
+    <w:p>
+      <w:r>
+        <w:t xml:space="preserve"/>
+      </w:r>
+    </w:p>
+    <w:p>
+      <w:pPr>
         <w:pStyle w:val="Heading2"/>
       </w:pPr>
       <w:r>
-        <w:t xml:space="preserve">4.5 Inactivity Monitoring</w:t>
+        <w:t xml:space="preserve">4.7 Client Offboarding / Record Retention</w:t>
       </w:r>
     </w:p>
     <w:p>
@@ -6464,12 +7437,7 @@
         <w:spacing w:after="120"/>
       </w:pPr>
       <w:r>
-        <w:rPr>
-          <w:i/>
-          <w:iCs/>
-          <w:color w:val="888888"/>
-        </w:rPr>
-        <w:t xml:space="preserve">[PLACEHOLDER: How inactivity is tracked for client engagements — last contact date, threshold, alert workflow, follow-up actions.]</w:t>
+        <w:t xml:space="preserve">CBM retains all client records indefinitely. There is no scheduled deletion or archival process. This policy reflects both the possibility of clients returning for future engagements and the need to support historical funder reporting.</w:t>
       </w:r>
     </w:p>
     <w:p>
@@ -6479,49 +7447,50 @@
     </w:p>
     <w:p>
       <w:pPr>
-        <w:pStyle w:val="Heading2"/>
-      </w:pPr>
-      <w:r>
-        <w:t xml:space="preserve">4.6 Engagement Close</w:t>
-      </w:r>
-    </w:p>
-    <w:p>
-      <w:pPr>
-        <w:spacing w:after="120"/>
-      </w:pPr>
-      <w:r>
-        <w:rPr>
-          <w:i/>
-          <w:iCs/>
-          <w:color w:val="888888"/>
-        </w:rPr>
-        <w:t xml:space="preserve">[PLACEHOLDER: Process for closing a client engagement — outcome recording, milestone capture, final NPS trigger, record status update.]</w:t>
-      </w:r>
-    </w:p>
-    <w:p>
-      <w:r>
-        <w:t xml:space="preserve"/>
-      </w:r>
-    </w:p>
-    <w:p>
-      <w:pPr>
-        <w:pStyle w:val="Heading2"/>
-      </w:pPr>
-      <w:r>
-        <w:t xml:space="preserve">4.7 Client Offboarding / Record Retention</w:t>
-      </w:r>
-    </w:p>
-    <w:p>
-      <w:pPr>
-        <w:spacing w:after="120"/>
-      </w:pPr>
-      <w:r>
-        <w:rPr>
-          <w:i/>
-          <w:iCs/>
-          <w:color w:val="888888"/>
-        </w:rPr>
-        <w:t xml:space="preserve">[PLACEHOLDER: What happens to client records after engagement close — retention schedule, data archival, access restrictions.]</w:t>
+        <w:numPr>
+          <w:ilvl w:val="0"/>
+          <w:numId w:val="1"/>
+        </w:numPr>
+        <w:spacing w:after="60"/>
+      </w:pPr>
+      <w:r>
+        <w:t xml:space="preserve">Account and Contact records are retained permanently and are never deleted, regardless of Engagement status.</w:t>
+      </w:r>
+    </w:p>
+    <w:p>
+      <w:pPr>
+        <w:numPr>
+          <w:ilvl w:val="0"/>
+          <w:numId w:val="1"/>
+        </w:numPr>
+        <w:spacing w:after="60"/>
+      </w:pPr>
+      <w:r>
+        <w:t xml:space="preserve">Closed Engagements (Completed or Abandoned) are retained permanently as historical records and are never deleted or archived.</w:t>
+      </w:r>
+    </w:p>
+    <w:p>
+      <w:pPr>
+        <w:numPr>
+          <w:ilvl w:val="0"/>
+          <w:numId w:val="1"/>
+        </w:numPr>
+        <w:spacing w:after="60"/>
+      </w:pPr>
+      <w:r>
+        <w:t xml:space="preserve">Closed Engagements are never reopened. If a former client returns for mentoring, a new Engagement record is created and linked to their existing Account and Contact records. Historical engagements remain intact.</w:t>
+      </w:r>
+    </w:p>
+    <w:p>
+      <w:pPr>
+        <w:numPr>
+          <w:ilvl w:val="0"/>
+          <w:numId w:val="1"/>
+        </w:numPr>
+        <w:spacing w:after="60"/>
+      </w:pPr>
+      <w:r>
+        <w:t xml:space="preserve">No data purging or anonymization process is required at this time. If CBM becomes subject to data retention or privacy regulations in the future, this policy must be revisited.</w:t>
       </w:r>
     </w:p>
     <w:p>
@@ -6759,7 +7728,7 @@
                 <w:sz w:val="20"/>
                 <w:szCs w:val="20"/>
               </w:rPr>
-              <w:t xml:space="preserve">0.4</w:t>
+              <w:t xml:space="preserve">0.5</w:t>
             </w:r>
           </w:p>
         </w:tc>
@@ -7285,6 +8254,12 @@
   </w:abstractNum>
   <w:num w:numId="1">
     <w:abstractNumId w:val="1"/>
+    <w:lvlOverride w:ilvl="0">
+      <w:startOverride w:val="1"/>
+    </w:lvlOverride>
+  </w:num>
+  <w:num w:numId="2">
+    <w:abstractNumId w:val="4"/>
     <w:lvlOverride w:ilvl="0">
       <w:startOverride w:val="1"/>
     </w:lvlOverride>

</xml_diff>

<commit_message>
Client v0.7 + CRM v0.7: Rename Account entity to Company throughout documentation
</commit_message>
<xml_diff>
--- a/PRDs/CBM-PRD-CRM-Client.docx
+++ b/PRDs/CBM-PRD-CRM-Client.docx
@@ -46,7 +46,7 @@
           <w:sz w:val="22"/>
           <w:szCs w:val="22"/>
         </w:rPr>
-        <w:t xml:space="preserve">Version 0.6  |  In Progress  |  March 15, 2026</w:t>
+        <w:t xml:space="preserve">Version 0.7  |  In Progress  |  March 15, 2026</w:t>
       </w:r>
     </w:p>
     <w:p>
@@ -122,7 +122,7 @@
         <w:spacing w:after="120"/>
       </w:pPr>
       <w:r>
-        <w:t xml:space="preserve">The client domain is built around four primary entities and two supporting entities. When a prospective client submits a Mentoring Request through the CBM website, the system automatically creates three linked records: an Account (the business), a Contact (the individual submitting the form), and an Engagement (the mentoring relationship, initially in Submitted status). All subsequent activity — sessions, NPS surveys, and workshop attendance — is linked to these anchor records.</w:t>
+        <w:t xml:space="preserve">The client domain is built around four primary entities and two supporting entities. When a prospective client submits a Mentoring Request through the CBM website, the system automatically creates three linked records: an Company (the business), a Contact (the individual submitting the form), and an Engagement (the mentoring relationship, initially in Submitted status). All subsequent activity — sessions, NPS surveys, and workshop attendance — is linked to these anchor records.</w:t>
       </w:r>
     </w:p>
     <w:p>
@@ -147,7 +147,7 @@
         <w:spacing w:after="60"/>
       </w:pPr>
       <w:r>
-        <w:t xml:space="preserve">Account — the business being mentored</w:t>
+        <w:t xml:space="preserve">Company — the business being mentored</w:t>
       </w:r>
     </w:p>
     <w:p>
@@ -232,7 +232,7 @@
         <w:pStyle w:val="Heading2"/>
       </w:pPr>
       <w:r>
-        <w:t xml:space="preserve">2.2 Account Entity</w:t>
+        <w:t xml:space="preserve">2.2 Company Entity</w:t>
       </w:r>
     </w:p>
     <w:p>
@@ -240,7 +240,7 @@
         <w:spacing w:after="120"/>
       </w:pPr>
       <w:r>
-        <w:t xml:space="preserve">The Account entity represents the business being mentored. It is the anchor record to which all Contacts, Engagements, and related activity are linked. Account data is collected in two phases: Phase 1 fields are captured on the public Mentoring Request intake form; Phase 2 fields are collected via a second form sent to the client after a mentor has been assigned.</w:t>
+        <w:t xml:space="preserve">The Company entity represents the business being mentored. It is the anchor record to which all Contacts, Engagements, and related activity are linked. Company data is collected in two phases: Phase 1 fields are captured on the public Mentoring Request intake form; Phase 2 fields are collected via a second form sent to the client after a mentor has been assigned.</w:t>
       </w:r>
     </w:p>
     <w:p>
@@ -753,7 +753,7 @@
                 <w:sz w:val="18"/>
                 <w:szCs w:val="18"/>
               </w:rPr>
-              <w:t xml:space="preserve">Second-level industry classification. Dropdown of ~100 NAICS subsectors, filtered by selected Sector on the intake form. Both Sector and Subsector are stored as separate fields on the Account record. Required.</w:t>
+              <w:t xml:space="preserve">Second-level industry classification. Dropdown of ~100 NAICS subsectors, filtered by selected Sector on the intake form. Both Sector and Subsector are stored as separate fields on the Company record. Required.</w:t>
             </w:r>
           </w:p>
         </w:tc>
@@ -1989,7 +1989,7 @@
         <w:spacing w:after="120"/>
       </w:pPr>
       <w:r>
-        <w:t xml:space="preserve">The Contact entity represents an individual person associated with a business being mentored. Multiple contacts may be linked to a single Account. The person who submits the Phase 1 intake form automatically becomes the first Contact linked to the Account. Additional contacts can be added by an admin or mentor as the engagement progresses.</w:t>
+        <w:t xml:space="preserve">The Contact entity represents an individual person associated with a business being mentored. Multiple contacts may be linked to a single Company. The person who submits the Phase 1 intake form automatically becomes the first Contact linked to the Company. Additional contacts can be added by an admin or mentor as the engagement progresses.</w:t>
       </w:r>
     </w:p>
     <w:p>
@@ -2423,7 +2423,7 @@
                 <w:sz w:val="18"/>
                 <w:szCs w:val="18"/>
               </w:rPr>
-              <w:t xml:space="preserve">Identifies the main point of contact for the Account when multiple contacts are present. Yes/No checkbox. Defaults to Yes for the first contact created.</w:t>
+              <w:t xml:space="preserve">Identifies the main point of contact for the Company when multiple contacts are present. Yes/No checkbox. Defaults to Yes for the first contact created.</w:t>
             </w:r>
           </w:p>
         </w:tc>
@@ -2447,7 +2447,7 @@
         <w:spacing w:after="120"/>
       </w:pPr>
       <w:r>
-        <w:t xml:space="preserve">The Engagement entity represents the active mentoring relationship between CBM and a client business. It is linked to an Account and tracks the lifecycle, mentor assignments, and summary analytics for the relationship. Individual sessions, NPS responses, and workshop attendance are all linked to the Engagement.</w:t>
+        <w:t xml:space="preserve">The Engagement entity represents the active mentoring relationship between CBM and a client business. It is linked to a Company and tracks the lifecycle, mentor assignments, and summary analytics for the relationship. Individual sessions, NPS responses, and workshop attendance are all linked to the Engagement.</w:t>
       </w:r>
     </w:p>
     <w:p>
@@ -2700,7 +2700,7 @@
                 <w:sz w:val="18"/>
                 <w:szCs w:val="18"/>
               </w:rPr>
-              <w:t xml:space="preserve">Account</w:t>
+              <w:t xml:space="preserve">Company</w:t>
             </w:r>
           </w:p>
         </w:tc>
@@ -2728,7 +2728,7 @@
                 <w:sz w:val="18"/>
                 <w:szCs w:val="18"/>
               </w:rPr>
-              <w:t xml:space="preserve">Link to the Account (business) record. Required. Relationship field.</w:t>
+              <w:t xml:space="preserve">Link to the Company (business) record. Required. Relationship field.</w:t>
             </w:r>
           </w:p>
         </w:tc>
@@ -5744,7 +5744,7 @@
         <w:spacing w:after="120"/>
       </w:pPr>
       <w:r>
-        <w:t xml:space="preserve">The CBM CRM platform includes shared entities and communication capabilities available across all domains. All entities defined in this document — Account, Contact, Engagement, Session, NPS Survey Response, Workshop, and Workshop Attendance — must have relationship panels configured for each of the following as a standard part of their implementation.</w:t>
+        <w:t xml:space="preserve">The CBM CRM platform includes shared entities and communication capabilities available across all domains. All entities defined in this document — Company, Contact, Engagement, Session, NPS Survey Response, Workshop, and Workshop Attendance — must have relationship panels configured for each of the following as a standard part of their implementation.</w:t>
       </w:r>
     </w:p>
     <w:p>
@@ -5822,7 +5822,7 @@
         <w:pStyle w:val="Heading2"/>
       </w:pPr>
       <w:r>
-        <w:t xml:space="preserve">3.1 Account → Contact</w:t>
+        <w:t xml:space="preserve">3.1 Company → Contact</w:t>
       </w:r>
     </w:p>
     <w:p>
@@ -5830,7 +5830,7 @@
         <w:spacing w:after="120"/>
       </w:pPr>
       <w:r>
-        <w:t xml:space="preserve">Relationship type: One-to-Many. One Account may have many Contacts; each Contact belongs to one Account.</w:t>
+        <w:t xml:space="preserve">Relationship type: One-to-Many. One Company may have many Contacts; each Contact belongs to one Company.</w:t>
       </w:r>
     </w:p>
     <w:p>
@@ -5847,7 +5847,7 @@
         <w:spacing w:after="60"/>
       </w:pPr>
       <w:r>
-        <w:t xml:space="preserve">The first Contact is created automatically when a Mentoring Request form is submitted. The submitting individual becomes the primary Contact linked to the new Account.</w:t>
+        <w:t xml:space="preserve">The first Contact is created automatically when a Mentoring Request form is submitted. The submitting individual becomes the primary Contact linked to the new Company.</w:t>
       </w:r>
     </w:p>
     <w:p>
@@ -5859,7 +5859,7 @@
         <w:spacing w:after="60"/>
       </w:pPr>
       <w:r>
-        <w:t xml:space="preserve">Additional Contacts may be added to the Account at any time by an admin or the assigned mentor as additional individuals from the business become involved in the engagement.</w:t>
+        <w:t xml:space="preserve">Additional Contacts may be added to the Company at any time by an admin or the assigned mentor as additional individuals from the business become involved in the engagement.</w:t>
       </w:r>
     </w:p>
     <w:p>
@@ -5871,7 +5871,7 @@
         <w:spacing w:after="60"/>
       </w:pPr>
       <w:r>
-        <w:t xml:space="preserve">The Primary Contact flag on the Contact record identifies the main point of contact when multiple Contacts exist on an Account.</w:t>
+        <w:t xml:space="preserve">The Primary Contact flag on the Contact record identifies the main point of contact when multiple Contacts exist on a Company.</w:t>
       </w:r>
     </w:p>
     <w:p>
@@ -5883,7 +5883,7 @@
         <w:spacing w:after="60"/>
       </w:pPr>
       <w:r>
-        <w:t xml:space="preserve">From the Account record, all linked Contacts are visible in a Contact relationship panel.</w:t>
+        <w:t xml:space="preserve">From the Company record, all linked Contacts are visible in a Contact relationship panel.</w:t>
       </w:r>
     </w:p>
     <w:p>
@@ -5895,7 +5895,7 @@
         <w:spacing w:after="60"/>
       </w:pPr>
       <w:r>
-        <w:t xml:space="preserve">From each Contact record, the linked Account is visible as a lookup field.</w:t>
+        <w:t xml:space="preserve">From each Contact record, the linked Company is visible as a lookup field.</w:t>
       </w:r>
     </w:p>
     <w:p>
@@ -5908,7 +5908,7 @@
         <w:pStyle w:val="Heading2"/>
       </w:pPr>
       <w:r>
-        <w:t xml:space="preserve">3.2 Account → Engagement</w:t>
+        <w:t xml:space="preserve">3.2 Company → Engagement</w:t>
       </w:r>
     </w:p>
     <w:p>
@@ -5916,7 +5916,7 @@
         <w:spacing w:after="120"/>
       </w:pPr>
       <w:r>
-        <w:t xml:space="preserve">Relationship type: One-to-Many. One Account may have many Engagements over time; each Engagement belongs to one Account.</w:t>
+        <w:t xml:space="preserve">Relationship type: One-to-Many. One Company may have many Engagements over time; each Engagement belongs to one Company.</w:t>
       </w:r>
     </w:p>
     <w:p>
@@ -5945,7 +5945,7 @@
         <w:spacing w:after="60"/>
       </w:pPr>
       <w:r>
-        <w:t xml:space="preserve">An Account may have more than one Engagement over its lifetime — for example, a client who completes one engagement and returns for a new one later. Each is tracked as a separate Engagement record.</w:t>
+        <w:t xml:space="preserve">A Company may have more than one Engagement over its lifetime — for example, a client who completes one engagement and returns for a new one later. Each is tracked as a separate Engagement record.</w:t>
       </w:r>
     </w:p>
     <w:p>
@@ -5957,7 +5957,7 @@
         <w:spacing w:after="60"/>
       </w:pPr>
       <w:r>
-        <w:t xml:space="preserve">Only one Engagement per Account should be in an active status (Submitted, Assigned, Active, or On-Hold) at any given time.</w:t>
+        <w:t xml:space="preserve">Only one Engagement per Company should be in an active status (Submitted, Assigned, Active, or On-Hold) at any given time.</w:t>
       </w:r>
     </w:p>
     <w:p>
@@ -5969,7 +5969,7 @@
         <w:spacing w:after="60"/>
       </w:pPr>
       <w:r>
-        <w:t xml:space="preserve">From the Account record, all linked Engagements are visible in an Engagement relationship panel, showing current and historical engagements.</w:t>
+        <w:t xml:space="preserve">From the Company record, all linked Engagements are visible in an Engagement relationship panel, showing current and historical engagements.</w:t>
       </w:r>
     </w:p>
     <w:p>
@@ -5981,7 +5981,7 @@
         <w:spacing w:after="60"/>
       </w:pPr>
       <w:r>
-        <w:t xml:space="preserve">From each Engagement record, the linked Account is visible as a lookup field.</w:t>
+        <w:t xml:space="preserve">From each Engagement record, the linked Company is visible as a lookup field.</w:t>
       </w:r>
     </w:p>
     <w:p>
@@ -6141,7 +6141,7 @@
         <w:spacing w:after="60"/>
       </w:pPr>
       <w:r>
-        <w:t xml:space="preserve">From each Session record, the linked Engagement (and through it, the Account) is visible as a lookup field.</w:t>
+        <w:t xml:space="preserve">From each Session record, the linked Engagement (and through it, the Company) is visible as a lookup field.</w:t>
       </w:r>
     </w:p>
     <w:p>
@@ -6377,7 +6377,7 @@
         <w:spacing w:after="60"/>
       </w:pPr>
       <w:r>
-        <w:t xml:space="preserve">Note → Account, Contact, Engagement, Session, NPS Survey Response, Workshop, Workshop Attendance: Many-to-many. A Note may be linked to any combination of these records simultaneously.</w:t>
+        <w:t xml:space="preserve">Note → Company, Contact, Engagement, Session, NPS Survey Response, Workshop, Workshop Attendance: Many-to-many. A Note may be linked to any combination of these records simultaneously.</w:t>
       </w:r>
     </w:p>
     <w:p>
@@ -6401,7 +6401,7 @@
         <w:spacing w:after="60"/>
       </w:pPr>
       <w:r>
-        <w:t xml:space="preserve">Document → Account, Contact, Engagement, Session, NPS Survey Response, Workshop, Workshop Attendance: Many-to-many. A Document may be linked to any combination of these records simultaneously.</w:t>
+        <w:t xml:space="preserve">Document → Company, Contact, Engagement, Session, NPS Survey Response, Workshop, Workshop Attendance: Many-to-many. A Document may be linked to any combination of these records simultaneously.</w:t>
       </w:r>
     </w:p>
     <w:p>
@@ -6484,7 +6484,7 @@
         <w:spacing w:after="60"/>
       </w:pPr>
       <w:r>
-        <w:t xml:space="preserve">EspoCRM REST API receives the form submission and automatically creates three linked records: Account (the business), Contact (the submitting individual, flagged as Primary Contact), and Engagement (status: Submitted).</w:t>
+        <w:t xml:space="preserve">EspoCRM REST API receives the form submission and automatically creates three linked records: Company (the business), Contact (the submitting individual, flagged as Primary Contact), and Engagement (status: Submitted).</w:t>
       </w:r>
     </w:p>
     <w:p>
@@ -6556,7 +6556,7 @@
           <w:iCs/>
           <w:color w:val="888888"/>
         </w:rPr>
-        <w:t xml:space="preserve">Future enhancement: Automated or AI-assisted mentor matching is a planned future capability. The data model — NAICS sector/subsector and Mentoring Focus Areas on the Account; skills and expertise tags on the mentor Contact — is designed from day one to support this. No restructuring will be required when this feature is implemented.</w:t>
+        <w:t xml:space="preserve">Future enhancement: Automated or AI-assisted mentor matching is a planned future capability. The data model — NAICS sector/subsector and Mentoring Focus Areas on the Company; skills and expertise tags on the mentor Contact — is designed from day one to support this. No restructuring will be required when this feature is implemented.</w:t>
       </w:r>
     </w:p>
     <w:p>
@@ -7454,7 +7454,7 @@
         <w:spacing w:after="60"/>
       </w:pPr>
       <w:r>
-        <w:t xml:space="preserve">Account and Contact records are retained permanently and are never deleted, regardless of Engagement status.</w:t>
+        <w:t xml:space="preserve">Company and Contact records are retained permanently and are never deleted, regardless of Engagement status.</w:t>
       </w:r>
     </w:p>
     <w:p>
@@ -7478,7 +7478,7 @@
         <w:spacing w:after="60"/>
       </w:pPr>
       <w:r>
-        <w:t xml:space="preserve">Closed Engagements are never reopened. If a former client returns for mentoring, a new Engagement record is created and linked to their existing Account and Contact records. Historical engagements remain intact.</w:t>
+        <w:t xml:space="preserve">Closed Engagements are never reopened. If a former client returns for mentoring, a new Engagement record is created and linked to their existing Company and Contact records. Historical engagements remain intact.</w:t>
       </w:r>
     </w:p>
     <w:p>
@@ -7545,7 +7545,7 @@
         <w:spacing w:after="120"/>
       </w:pPr>
       <w:r>
-        <w:t xml:space="preserve">Account and Contact:</w:t>
+        <w:t xml:space="preserve">Company and Contact:</w:t>
       </w:r>
     </w:p>
     <w:tbl>
@@ -13027,7 +13027,7 @@
         <w:spacing w:after="120"/>
       </w:pPr>
       <w:r>
-        <w:t xml:space="preserve">All other fields across Account, Contact, Engagement, Session, NPS Survey Response, Workshop, and Workshop Attendance entities are accessible to all roles with engagement access, subject to the Create/Read/Update/Delete permissions defined in Section 5.1.</w:t>
+        <w:t xml:space="preserve">All other fields across Company, Contact, Engagement, Session, NPS Survey Response, Workshop, and Workshop Attendance entities are accessible to all roles with engagement access, subject to the Create/Read/Update/Delete permissions defined in Section 5.1.</w:t>
       </w:r>
     </w:p>
     <w:p>
@@ -13077,7 +13077,7 @@
         <w:spacing w:after="60"/>
       </w:pPr>
       <w:r>
-        <w:t xml:space="preserve">Primary Mentor — Sees only Accounts, Contacts, Engagements, Sessions, NPS Survey Responses, Notes, Documents, and Workshop Attendance records where they are the assigned Primary Mentor on the linked Engagement.</w:t>
+        <w:t xml:space="preserve">Primary Mentor — Sees only Companies, Contacts, Engagements, Sessions, NPS Survey Responses, Notes, Documents, and Workshop Attendance records where they are the assigned Primary Mentor on the linked Engagement.</w:t>
       </w:r>
     </w:p>
     <w:p>
@@ -13089,7 +13089,7 @@
         <w:spacing w:after="60"/>
       </w:pPr>
       <w:r>
-        <w:t xml:space="preserve">Co-Mentor — Sees only records associated with Engagements where they are assigned as Co-Mentor. Visibility is scoped to the specific Engagement — not to the Account or Contact as a whole.</w:t>
+        <w:t xml:space="preserve">Co-Mentor — Sees only records associated with Engagements where they are assigned as Co-Mentor. Visibility is scoped to the specific Engagement — not to the Company or Contact as a whole.</w:t>
       </w:r>
     </w:p>
     <w:p>
@@ -13289,7 +13289,7 @@
                 <w:sz w:val="20"/>
                 <w:szCs w:val="20"/>
               </w:rPr>
-              <w:t xml:space="preserve">0.6</w:t>
+              <w:t xml:space="preserve">0.7</w:t>
             </w:r>
           </w:p>
         </w:tc>

</xml_diff>

<commit_message>
Client PRD v0.8: Add Phase 1 contact fields (name, email, phone, zip); Business Name changed to Optional
</commit_message>
<xml_diff>
--- a/PRDs/CBM-PRD-CRM-Client.docx
+++ b/PRDs/CBM-PRD-CRM-Client.docx
@@ -46,7 +46,7 @@
           <w:sz w:val="22"/>
           <w:szCs w:val="22"/>
         </w:rPr>
-        <w:t xml:space="preserve">Version 0.7  |  In Progress  |  March 15, 2026</w:t>
+        <w:t xml:space="preserve">Version 0.8  |  In Progress  |  March 15, 2026</w:t>
       </w:r>
     </w:p>
     <w:p>
@@ -261,7 +261,7 @@
         <w:spacing w:after="120"/>
       </w:pPr>
       <w:r>
-        <w:t xml:space="preserve">These fields are collected on the public Mentoring Request form and must be sufficient to allow an admin to identify and assign an appropriate mentor.</w:t>
+        <w:t xml:space="preserve">These fields are collected on the public Mentoring Request form and must be sufficient to allow an admin to identify and assign an appropriate mentor. Contact information fields (First Name through Zip Code) populate the Contact record; all remaining fields populate the Company record.</w:t>
       </w:r>
     </w:p>
     <w:p>
@@ -377,6 +377,296 @@
                 <w:sz w:val="18"/>
                 <w:szCs w:val="18"/>
               </w:rPr>
+              <w:t xml:space="preserve">First Name</w:t>
+            </w:r>
+          </w:p>
+        </w:tc>
+        <w:tc>
+          <w:tcPr>
+            <w:tcW w:type="dxa" w:w="6860"/>
+            <w:tcBorders>
+              <w:top w:val="single" w:color="CCCCCC" w:sz="1"/>
+              <w:left w:val="single" w:color="CCCCCC" w:sz="1"/>
+              <w:bottom w:val="single" w:color="CCCCCC" w:sz="1"/>
+              <w:right w:val="single" w:color="CCCCCC" w:sz="1"/>
+            </w:tcBorders>
+            <w:shd w:fill="FFFFFF" w:val="clear"/>
+            <w:tcMar>
+              <w:top w:type="dxa" w:w="80"/>
+              <w:left w:type="dxa" w:w="120"/>
+              <w:bottom w:type="dxa" w:w="80"/>
+              <w:right w:type="dxa" w:w="120"/>
+            </w:tcMar>
+          </w:tcPr>
+          <w:p>
+            <w:r>
+              <w:rPr>
+                <w:rFonts w:ascii="Arial" w:cs="Arial" w:eastAsia="Arial" w:hAnsi="Arial"/>
+                <w:sz w:val="18"/>
+                <w:szCs w:val="18"/>
+              </w:rPr>
+              <w:t xml:space="preserve">First name of the person submitting the request. Required. Text field. Populates the Contact record.</w:t>
+            </w:r>
+          </w:p>
+        </w:tc>
+      </w:tr>
+      <w:tr>
+        <w:tc>
+          <w:tcPr>
+            <w:tcW w:type="dxa" w:w="2500"/>
+            <w:tcBorders>
+              <w:top w:val="single" w:color="CCCCCC" w:sz="1"/>
+              <w:left w:val="single" w:color="CCCCCC" w:sz="1"/>
+              <w:bottom w:val="single" w:color="CCCCCC" w:sz="1"/>
+              <w:right w:val="single" w:color="CCCCCC" w:sz="1"/>
+            </w:tcBorders>
+            <w:shd w:fill="F2F2F2" w:val="clear"/>
+            <w:tcMar>
+              <w:top w:type="dxa" w:w="80"/>
+              <w:left w:type="dxa" w:w="120"/>
+              <w:bottom w:type="dxa" w:w="80"/>
+              <w:right w:type="dxa" w:w="120"/>
+            </w:tcMar>
+          </w:tcPr>
+          <w:p>
+            <w:r>
+              <w:rPr>
+                <w:rFonts w:ascii="Arial" w:cs="Arial" w:eastAsia="Arial" w:hAnsi="Arial"/>
+                <w:sz w:val="18"/>
+                <w:szCs w:val="18"/>
+              </w:rPr>
+              <w:t xml:space="preserve">Last Name</w:t>
+            </w:r>
+          </w:p>
+        </w:tc>
+        <w:tc>
+          <w:tcPr>
+            <w:tcW w:type="dxa" w:w="6860"/>
+            <w:tcBorders>
+              <w:top w:val="single" w:color="CCCCCC" w:sz="1"/>
+              <w:left w:val="single" w:color="CCCCCC" w:sz="1"/>
+              <w:bottom w:val="single" w:color="CCCCCC" w:sz="1"/>
+              <w:right w:val="single" w:color="CCCCCC" w:sz="1"/>
+            </w:tcBorders>
+            <w:shd w:fill="F2F2F2" w:val="clear"/>
+            <w:tcMar>
+              <w:top w:type="dxa" w:w="80"/>
+              <w:left w:type="dxa" w:w="120"/>
+              <w:bottom w:type="dxa" w:w="80"/>
+              <w:right w:type="dxa" w:w="120"/>
+            </w:tcMar>
+          </w:tcPr>
+          <w:p>
+            <w:r>
+              <w:rPr>
+                <w:rFonts w:ascii="Arial" w:cs="Arial" w:eastAsia="Arial" w:hAnsi="Arial"/>
+                <w:sz w:val="18"/>
+                <w:szCs w:val="18"/>
+              </w:rPr>
+              <w:t xml:space="preserve">Last name of the person submitting the request. Required. Text field. Populates the Contact record.</w:t>
+            </w:r>
+          </w:p>
+        </w:tc>
+      </w:tr>
+      <w:tr>
+        <w:tc>
+          <w:tcPr>
+            <w:tcW w:type="dxa" w:w="2500"/>
+            <w:tcBorders>
+              <w:top w:val="single" w:color="CCCCCC" w:sz="1"/>
+              <w:left w:val="single" w:color="CCCCCC" w:sz="1"/>
+              <w:bottom w:val="single" w:color="CCCCCC" w:sz="1"/>
+              <w:right w:val="single" w:color="CCCCCC" w:sz="1"/>
+            </w:tcBorders>
+            <w:shd w:fill="FFFFFF" w:val="clear"/>
+            <w:tcMar>
+              <w:top w:type="dxa" w:w="80"/>
+              <w:left w:type="dxa" w:w="120"/>
+              <w:bottom w:type="dxa" w:w="80"/>
+              <w:right w:type="dxa" w:w="120"/>
+            </w:tcMar>
+          </w:tcPr>
+          <w:p>
+            <w:r>
+              <w:rPr>
+                <w:rFonts w:ascii="Arial" w:cs="Arial" w:eastAsia="Arial" w:hAnsi="Arial"/>
+                <w:sz w:val="18"/>
+                <w:szCs w:val="18"/>
+              </w:rPr>
+              <w:t xml:space="preserve">Email Address</w:t>
+            </w:r>
+          </w:p>
+        </w:tc>
+        <w:tc>
+          <w:tcPr>
+            <w:tcW w:type="dxa" w:w="6860"/>
+            <w:tcBorders>
+              <w:top w:val="single" w:color="CCCCCC" w:sz="1"/>
+              <w:left w:val="single" w:color="CCCCCC" w:sz="1"/>
+              <w:bottom w:val="single" w:color="CCCCCC" w:sz="1"/>
+              <w:right w:val="single" w:color="CCCCCC" w:sz="1"/>
+            </w:tcBorders>
+            <w:shd w:fill="FFFFFF" w:val="clear"/>
+            <w:tcMar>
+              <w:top w:type="dxa" w:w="80"/>
+              <w:left w:type="dxa" w:w="120"/>
+              <w:bottom w:type="dxa" w:w="80"/>
+              <w:right w:type="dxa" w:w="120"/>
+            </w:tcMar>
+          </w:tcPr>
+          <w:p>
+            <w:r>
+              <w:rPr>
+                <w:rFonts w:ascii="Arial" w:cs="Arial" w:eastAsia="Arial" w:hAnsi="Arial"/>
+                <w:sz w:val="18"/>
+                <w:szCs w:val="18"/>
+              </w:rPr>
+              <w:t xml:space="preserve">Primary email address of the submitting contact. Required. Email field. Populates the Contact record. Used for all follow-up communication including mentor introduction and Phase 2 form delivery.</w:t>
+            </w:r>
+          </w:p>
+        </w:tc>
+      </w:tr>
+      <w:tr>
+        <w:tc>
+          <w:tcPr>
+            <w:tcW w:type="dxa" w:w="2500"/>
+            <w:tcBorders>
+              <w:top w:val="single" w:color="CCCCCC" w:sz="1"/>
+              <w:left w:val="single" w:color="CCCCCC" w:sz="1"/>
+              <w:bottom w:val="single" w:color="CCCCCC" w:sz="1"/>
+              <w:right w:val="single" w:color="CCCCCC" w:sz="1"/>
+            </w:tcBorders>
+            <w:shd w:fill="F2F2F2" w:val="clear"/>
+            <w:tcMar>
+              <w:top w:type="dxa" w:w="80"/>
+              <w:left w:type="dxa" w:w="120"/>
+              <w:bottom w:type="dxa" w:w="80"/>
+              <w:right w:type="dxa" w:w="120"/>
+            </w:tcMar>
+          </w:tcPr>
+          <w:p>
+            <w:r>
+              <w:rPr>
+                <w:rFonts w:ascii="Arial" w:cs="Arial" w:eastAsia="Arial" w:hAnsi="Arial"/>
+                <w:sz w:val="18"/>
+                <w:szCs w:val="18"/>
+              </w:rPr>
+              <w:t xml:space="preserve">Phone</w:t>
+            </w:r>
+          </w:p>
+        </w:tc>
+        <w:tc>
+          <w:tcPr>
+            <w:tcW w:type="dxa" w:w="6860"/>
+            <w:tcBorders>
+              <w:top w:val="single" w:color="CCCCCC" w:sz="1"/>
+              <w:left w:val="single" w:color="CCCCCC" w:sz="1"/>
+              <w:bottom w:val="single" w:color="CCCCCC" w:sz="1"/>
+              <w:right w:val="single" w:color="CCCCCC" w:sz="1"/>
+            </w:tcBorders>
+            <w:shd w:fill="F2F2F2" w:val="clear"/>
+            <w:tcMar>
+              <w:top w:type="dxa" w:w="80"/>
+              <w:left w:type="dxa" w:w="120"/>
+              <w:bottom w:type="dxa" w:w="80"/>
+              <w:right w:type="dxa" w:w="120"/>
+            </w:tcMar>
+          </w:tcPr>
+          <w:p>
+            <w:r>
+              <w:rPr>
+                <w:rFonts w:ascii="Arial" w:cs="Arial" w:eastAsia="Arial" w:hAnsi="Arial"/>
+                <w:sz w:val="18"/>
+                <w:szCs w:val="18"/>
+              </w:rPr>
+              <w:t xml:space="preserve">Primary phone number of the submitting contact. Required. Phone field. Populates the Contact record.</w:t>
+            </w:r>
+          </w:p>
+        </w:tc>
+      </w:tr>
+      <w:tr>
+        <w:tc>
+          <w:tcPr>
+            <w:tcW w:type="dxa" w:w="2500"/>
+            <w:tcBorders>
+              <w:top w:val="single" w:color="CCCCCC" w:sz="1"/>
+              <w:left w:val="single" w:color="CCCCCC" w:sz="1"/>
+              <w:bottom w:val="single" w:color="CCCCCC" w:sz="1"/>
+              <w:right w:val="single" w:color="CCCCCC" w:sz="1"/>
+            </w:tcBorders>
+            <w:shd w:fill="FFFFFF" w:val="clear"/>
+            <w:tcMar>
+              <w:top w:type="dxa" w:w="80"/>
+              <w:left w:type="dxa" w:w="120"/>
+              <w:bottom w:type="dxa" w:w="80"/>
+              <w:right w:type="dxa" w:w="120"/>
+            </w:tcMar>
+          </w:tcPr>
+          <w:p>
+            <w:r>
+              <w:rPr>
+                <w:rFonts w:ascii="Arial" w:cs="Arial" w:eastAsia="Arial" w:hAnsi="Arial"/>
+                <w:sz w:val="18"/>
+                <w:szCs w:val="18"/>
+              </w:rPr>
+              <w:t xml:space="preserve">Zip Code</w:t>
+            </w:r>
+          </w:p>
+        </w:tc>
+        <w:tc>
+          <w:tcPr>
+            <w:tcW w:type="dxa" w:w="6860"/>
+            <w:tcBorders>
+              <w:top w:val="single" w:color="CCCCCC" w:sz="1"/>
+              <w:left w:val="single" w:color="CCCCCC" w:sz="1"/>
+              <w:bottom w:val="single" w:color="CCCCCC" w:sz="1"/>
+              <w:right w:val="single" w:color="CCCCCC" w:sz="1"/>
+            </w:tcBorders>
+            <w:shd w:fill="FFFFFF" w:val="clear"/>
+            <w:tcMar>
+              <w:top w:type="dxa" w:w="80"/>
+              <w:left w:type="dxa" w:w="120"/>
+              <w:bottom w:type="dxa" w:w="80"/>
+              <w:right w:type="dxa" w:w="120"/>
+            </w:tcMar>
+          </w:tcPr>
+          <w:p>
+            <w:r>
+              <w:rPr>
+                <w:rFonts w:ascii="Arial" w:cs="Arial" w:eastAsia="Arial" w:hAnsi="Arial"/>
+                <w:sz w:val="18"/>
+                <w:szCs w:val="18"/>
+              </w:rPr>
+              <w:t xml:space="preserve">Zip code of the submitting contact. Required. Text field. Populates the Contact record. Used for geographic reporting.</w:t>
+            </w:r>
+          </w:p>
+        </w:tc>
+      </w:tr>
+      <w:tr>
+        <w:tc>
+          <w:tcPr>
+            <w:tcW w:type="dxa" w:w="2500"/>
+            <w:tcBorders>
+              <w:top w:val="single" w:color="CCCCCC" w:sz="1"/>
+              <w:left w:val="single" w:color="CCCCCC" w:sz="1"/>
+              <w:bottom w:val="single" w:color="CCCCCC" w:sz="1"/>
+              <w:right w:val="single" w:color="CCCCCC" w:sz="1"/>
+            </w:tcBorders>
+            <w:shd w:fill="F2F2F2" w:val="clear"/>
+            <w:tcMar>
+              <w:top w:type="dxa" w:w="80"/>
+              <w:left w:type="dxa" w:w="120"/>
+              <w:bottom w:type="dxa" w:w="80"/>
+              <w:right w:type="dxa" w:w="120"/>
+            </w:tcMar>
+          </w:tcPr>
+          <w:p>
+            <w:r>
+              <w:rPr>
+                <w:rFonts w:ascii="Arial" w:cs="Arial" w:eastAsia="Arial" w:hAnsi="Arial"/>
+                <w:sz w:val="18"/>
+                <w:szCs w:val="18"/>
+              </w:rPr>
               <w:t xml:space="preserve">Business Name</w:t>
             </w:r>
           </w:p>
@@ -390,22 +680,22 @@
               <w:bottom w:val="single" w:color="CCCCCC" w:sz="1"/>
               <w:right w:val="single" w:color="CCCCCC" w:sz="1"/>
             </w:tcBorders>
-            <w:shd w:fill="FFFFFF" w:val="clear"/>
-            <w:tcMar>
-              <w:top w:type="dxa" w:w="80"/>
-              <w:left w:type="dxa" w:w="120"/>
-              <w:bottom w:type="dxa" w:w="80"/>
-              <w:right w:type="dxa" w:w="120"/>
-            </w:tcMar>
-          </w:tcPr>
-          <w:p>
-            <w:r>
-              <w:rPr>
-                <w:rFonts w:ascii="Arial" w:cs="Arial" w:eastAsia="Arial" w:hAnsi="Arial"/>
-                <w:sz w:val="18"/>
-                <w:szCs w:val="18"/>
-              </w:rPr>
-              <w:t xml:space="preserve">Full legal or operating name of the business. Required. Text field.</w:t>
+            <w:shd w:fill="F2F2F2" w:val="clear"/>
+            <w:tcMar>
+              <w:top w:type="dxa" w:w="80"/>
+              <w:left w:type="dxa" w:w="120"/>
+              <w:bottom w:type="dxa" w:w="80"/>
+              <w:right w:type="dxa" w:w="120"/>
+            </w:tcMar>
+          </w:tcPr>
+          <w:p>
+            <w:r>
+              <w:rPr>
+                <w:rFonts w:ascii="Arial" w:cs="Arial" w:eastAsia="Arial" w:hAnsi="Arial"/>
+                <w:sz w:val="18"/>
+                <w:szCs w:val="18"/>
+              </w:rPr>
+              <w:t xml:space="preserve">Full legal or operating name of the business. Optional. Text field. May be left blank for pre-startup applicants who have not yet named their business.</w:t>
             </w:r>
           </w:p>
         </w:tc>
@@ -13289,7 +13579,7 @@
                 <w:sz w:val="20"/>
                 <w:szCs w:val="20"/>
               </w:rPr>
-              <w:t xml:space="preserve">0.7</w:t>
+              <w:t xml:space="preserve">0.8</w:t>
             </w:r>
           </w:p>
         </w:tc>

</xml_diff>

<commit_message>
Client PRD v0.9: Clarify Phase 2 form deployment is mentor-discretionary, not auto-triggered
</commit_message>
<xml_diff>
--- a/PRDs/CBM-PRD-CRM-Client.docx
+++ b/PRDs/CBM-PRD-CRM-Client.docx
@@ -46,7 +46,7 @@
           <w:sz w:val="22"/>
           <w:szCs w:val="22"/>
         </w:rPr>
-        <w:t xml:space="preserve">Version 0.8  |  In Progress  |  March 15, 2026</w:t>
+        <w:t xml:space="preserve">Version 0.9  |  In Progress  |  March 15, 2026</w:t>
       </w:r>
     </w:p>
     <w:p>
@@ -1183,7 +1183,7 @@
         <w:spacing w:after="120"/>
       </w:pPr>
       <w:r>
-        <w:t xml:space="preserve">These fields are collected via a second form sent to the client after a mentor has been assigned. The Phase 2 form is triggered by the mentor assignment workflow. All free-text fields in Phase 2 support rich text formatting.</w:t>
+        <w:t xml:space="preserve">These fields are collected via a second form deployed at the mentor’s discretion after they have been assigned. The mentor may send the Phase 2 form link as part of their initial introduction to the client, or after the first session so they can explain it in person. All free-text fields in Phase 2 support rich text formatting.</w:t>
       </w:r>
     </w:p>
     <w:p>
@@ -13579,7 +13579,7 @@
                 <w:sz w:val="20"/>
                 <w:szCs w:val="20"/>
               </w:rPr>
-              <w:t xml:space="preserve">0.8</w:t>
+              <w:t xml:space="preserve">0.9</w:t>
             </w:r>
           </w:p>
         </w:tc>

</xml_diff>

<commit_message>
Client PRD v1.0: Multiple Co-Mentors and SMEs per Engagement — fix Section 2.4, 3.3, and 4.2
</commit_message>
<xml_diff>
--- a/PRDs/CBM-PRD-CRM-Client.docx
+++ b/PRDs/CBM-PRD-CRM-Client.docx
@@ -46,7 +46,7 @@
           <w:sz w:val="22"/>
           <w:szCs w:val="22"/>
         </w:rPr>
-        <w:t xml:space="preserve">Version 0.9  |  In Progress  |  March 15, 2026</w:t>
+        <w:t xml:space="preserve">Version 1.0  |  In Progress  |  March 15, 2026</w:t>
       </w:r>
     </w:p>
     <w:p>
@@ -3308,7 +3308,7 @@
                 <w:sz w:val="18"/>
                 <w:szCs w:val="18"/>
               </w:rPr>
-              <w:t xml:space="preserve">Link to an optional co-mentor Contact record. Optional.</w:t>
+              <w:t xml:space="preserve">Many-to-many relationship panel linking one or more Co-Mentor Contact records to the Engagement. Optional. Multiple Co-Mentors may be assigned simultaneously.</w:t>
             </w:r>
           </w:p>
         </w:tc>
@@ -3366,7 +3366,7 @@
                 <w:sz w:val="18"/>
                 <w:szCs w:val="18"/>
               </w:rPr>
-              <w:t xml:space="preserve">Link to an optional subject matter expert Contact record. Optional.</w:t>
+              <w:t xml:space="preserve">Many-to-many relationship panel linking one or more SME Contact records to the Engagement. Optional. Multiple SMEs may be assigned simultaneously.</w:t>
             </w:r>
           </w:p>
         </w:tc>
@@ -6292,7 +6292,7 @@
         <w:spacing w:after="120"/>
       </w:pPr>
       <w:r>
-        <w:t xml:space="preserve">Relationship type: Many-to-One for each role. Each Engagement has one Assigned Mentor, optionally one Co-Mentor, and optionally one SME. All three are linked to Contact records in the mentor pool.</w:t>
+        <w:t xml:space="preserve">Relationship type: Many-to-Many for Co-Mentor and SME roles. Each Engagement has one Assigned Mentor, but may have multiple Co-Mentors and multiple SMEs. All are linked to Contact records in the mentor pool.</w:t>
       </w:r>
     </w:p>
     <w:p>
@@ -6333,7 +6333,7 @@
         <w:spacing w:after="60"/>
       </w:pPr>
       <w:r>
-        <w:t xml:space="preserve">Mentor, Co-Mentor, and SME links are stored as separate relationship fields on the Engagement record — not as a single multi-value field — to support role-specific access control and capacity management.</w:t>
+        <w:t xml:space="preserve">The Assigned Mentor is stored as a single lookup field on the Engagement record. Co-Mentor and SME assignments are stored as many-to-many relationship panels, allowing multiple Co-Mentors and multiple SMEs to be linked to a single Engagement. This supports role-specific access control and capacity management for each assigned individual.</w:t>
       </w:r>
     </w:p>
     <w:p>
@@ -6896,7 +6896,7 @@
         <w:spacing w:after="60"/>
       </w:pPr>
       <w:r>
-        <w:t xml:space="preserve">Admin nominates a primary mentor (and optionally a co-mentor). System verifies the mentor is Active, accepting clients, and has capacity before allowing nomination.</w:t>
+        <w:t xml:space="preserve">Admin nominates a primary mentor (and optionally one or more co-mentors and/or SMEs). System verifies each nominated mentor is Active, accepting clients, and has capacity before allowing nomination.</w:t>
       </w:r>
     </w:p>
     <w:p>
@@ -13579,7 +13579,7 @@
                 <w:sz w:val="20"/>
                 <w:szCs w:val="20"/>
               </w:rPr>
-              <w:t xml:space="preserve">0.9</w:t>
+              <w:t xml:space="preserve">1.0</w:t>
             </w:r>
           </w:p>
         </w:tc>

</xml_diff>

<commit_message>
Client PRD v1.1: Add Section 6 Implementation Steps (13 subsections, full checklist)
</commit_message>
<xml_diff>
--- a/PRDs/CBM-PRD-CRM-Client.docx
+++ b/PRDs/CBM-PRD-CRM-Client.docx
@@ -46,7 +46,7 @@
           <w:sz w:val="22"/>
           <w:szCs w:val="22"/>
         </w:rPr>
-        <w:t xml:space="preserve">Version 1.0  |  In Progress  |  March 15, 2026</w:t>
+        <w:t xml:space="preserve">Version 1.1  |  In Progress  |  March 15, 2026</w:t>
       </w:r>
     </w:p>
     <w:p>
@@ -13440,7 +13440,1862 @@
         <w:pStyle w:val="Heading1"/>
       </w:pPr>
       <w:r>
-        <w:t xml:space="preserve">6. Document Control</w:t>
+        <w:t xml:space="preserve">6. Implementation Steps</w:t>
+      </w:r>
+    </w:p>
+    <w:p>
+      <w:pPr>
+        <w:spacing w:after="120"/>
+      </w:pPr>
+      <w:r>
+        <w:t xml:space="preserve">This section provides a sequenced implementation checklist for configuring the client domain in EspoCRM. Steps are listed at the operational task level — sufficient to guide a CBM technology administrator familiar with EspoCRM through the full configuration. Detailed button-by-button instructions are not included here; those will be documented separately if needed.</w:t>
+      </w:r>
+    </w:p>
+    <w:p>
+      <w:pPr>
+        <w:spacing w:after="120"/>
+      </w:pPr>
+      <w:r>
+        <w:t xml:space="preserve">Steps must be completed in the order presented, as later steps depend on entities and relationships configured in earlier steps.</w:t>
+      </w:r>
+    </w:p>
+    <w:p>
+      <w:r>
+        <w:t xml:space="preserve"/>
+      </w:r>
+    </w:p>
+    <w:p>
+      <w:pPr>
+        <w:pStyle w:val="Heading2"/>
+      </w:pPr>
+      <w:r>
+        <w:t xml:space="preserve">6.1 Shared Platform Entities</w:t>
+      </w:r>
+    </w:p>
+    <w:p>
+      <w:pPr>
+        <w:spacing w:after="120"/>
+      </w:pPr>
+      <w:r>
+        <w:t xml:space="preserve">These entities are used across all CBM CRM domains and must be configured before any domain-specific entities. Reference CBM-PRD-CRM.docx Section 18 for full field specifications.</w:t>
+      </w:r>
+    </w:p>
+    <w:p>
+      <w:r>
+        <w:t xml:space="preserve"/>
+      </w:r>
+    </w:p>
+    <w:p>
+      <w:pPr>
+        <w:numPr>
+          <w:ilvl w:val="0"/>
+          <w:numId w:val="1"/>
+        </w:numPr>
+        <w:spacing w:after="60"/>
+      </w:pPr>
+      <w:r>
+        <w:t xml:space="preserve">☐ Create the Note entity with all defined fields (Title, Body, Internal Only, Created By, Created Date/Time).</w:t>
+      </w:r>
+    </w:p>
+    <w:p>
+      <w:pPr>
+        <w:numPr>
+          <w:ilvl w:val="0"/>
+          <w:numId w:val="1"/>
+        </w:numPr>
+        <w:spacing w:after="60"/>
+      </w:pPr>
+      <w:r>
+        <w:t xml:space="preserve">☐ Create the Comment entity with all defined fields (Note link, Body, Created By, Created Date/Time).</w:t>
+      </w:r>
+    </w:p>
+    <w:p>
+      <w:pPr>
+        <w:numPr>
+          <w:ilvl w:val="0"/>
+          <w:numId w:val="1"/>
+        </w:numPr>
+        <w:spacing w:after="60"/>
+      </w:pPr>
+      <w:r>
+        <w:t xml:space="preserve">☐ Configure the Comment entity as a child relationship of the Note entity (one Note, many Comments).</w:t>
+      </w:r>
+    </w:p>
+    <w:p>
+      <w:pPr>
+        <w:numPr>
+          <w:ilvl w:val="0"/>
+          <w:numId w:val="1"/>
+        </w:numPr>
+        <w:spacing w:after="60"/>
+      </w:pPr>
+      <w:r>
+        <w:t xml:space="preserve">☐ Create the Document entity with all defined fields (Title, Document Type, Description, File Attachment, External URL, Internal Only, Created By, Created Date/Time).</w:t>
+      </w:r>
+    </w:p>
+    <w:p>
+      <w:pPr>
+        <w:numPr>
+          <w:ilvl w:val="0"/>
+          <w:numId w:val="1"/>
+        </w:numPr>
+        <w:spacing w:after="60"/>
+      </w:pPr>
+      <w:r>
+        <w:t xml:space="preserve">☐ Configure Internal Only field-level access on Note and Document entities to restrict visibility to Admin role only when flagged.</w:t>
+      </w:r>
+    </w:p>
+    <w:p>
+      <w:pPr>
+        <w:numPr>
+          <w:ilvl w:val="0"/>
+          <w:numId w:val="1"/>
+        </w:numPr>
+        <w:spacing w:after="60"/>
+      </w:pPr>
+      <w:r>
+        <w:t xml:space="preserve">☐ Create a “My Notes” global search preset on the Note entity filtered by Created By = current user, sorted by Created Date/Time descending.</w:t>
+      </w:r>
+    </w:p>
+    <w:p>
+      <w:r>
+        <w:t xml:space="preserve"/>
+      </w:r>
+    </w:p>
+    <w:p>
+      <w:pPr>
+        <w:pStyle w:val="Heading2"/>
+      </w:pPr>
+      <w:r>
+        <w:t xml:space="preserve">6.2 Company Entity</w:t>
+      </w:r>
+    </w:p>
+    <w:p>
+      <w:pPr>
+        <w:spacing w:after="120"/>
+      </w:pPr>
+      <w:r>
+        <w:t xml:space="preserve">Configure the Company entity (EspoCRM’s native Account entity, relabeled) with all Phase 1 and Phase 2 fields defined in Section 2.2.</w:t>
+      </w:r>
+    </w:p>
+    <w:p>
+      <w:r>
+        <w:t xml:space="preserve"/>
+      </w:r>
+    </w:p>
+    <w:p>
+      <w:pPr>
+        <w:numPr>
+          <w:ilvl w:val="0"/>
+          <w:numId w:val="1"/>
+        </w:numPr>
+        <w:spacing w:after="60"/>
+      </w:pPr>
+      <w:r>
+        <w:t xml:space="preserve">☐ Relabel the Account entity display name to “Company” throughout the EspoCRM UI via Entity Manager label settings.</w:t>
+      </w:r>
+    </w:p>
+    <w:p>
+      <w:pPr>
+        <w:numPr>
+          <w:ilvl w:val="0"/>
+          <w:numId w:val="1"/>
+        </w:numPr>
+        <w:spacing w:after="60"/>
+      </w:pPr>
+      <w:r>
+        <w:t xml:space="preserve">☐ Add Phase 1 fields to the Company entity: Organization Type (dropdown), Business Stage (dropdown), NAICS Sector (dropdown), NAICS Subsector (dropdown), Mentoring Focus Areas (multi-select), Mentoring Needs Description (rich text).</w:t>
+      </w:r>
+    </w:p>
+    <w:p>
+      <w:pPr>
+        <w:numPr>
+          <w:ilvl w:val="0"/>
+          <w:numId w:val="1"/>
+        </w:numPr>
+        <w:spacing w:after="60"/>
+      </w:pPr>
+      <w:r>
+        <w:t xml:space="preserve">☐ Add Phase 2 fields to the Company entity: Business Description, Time in Operation, Current Team Size, Revenue Range, Funding Situation, Current Challenges, Goals and Objectives, Desired Outcomes, Previous Mentoring/Advisory Experience (all rich text or appropriate field types per Section 2.2).</w:t>
+      </w:r>
+    </w:p>
+    <w:p>
+      <w:pPr>
+        <w:numPr>
+          <w:ilvl w:val="0"/>
+          <w:numId w:val="1"/>
+        </w:numPr>
+        <w:spacing w:after="60"/>
+      </w:pPr>
+      <w:r>
+        <w:t xml:space="preserve">☐ Add Professional Advisors field (multi-select checklist) with all defined values.</w:t>
+      </w:r>
+    </w:p>
+    <w:p>
+      <w:pPr>
+        <w:numPr>
+          <w:ilvl w:val="0"/>
+          <w:numId w:val="1"/>
+        </w:numPr>
+        <w:spacing w:after="60"/>
+      </w:pPr>
+      <w:r>
+        <w:t xml:space="preserve">☐ Add business registration fields: Registered with State, State of Registration, Legal Business Structure, EIN on File, Date of Formation, Registered Agent, EIN Number.</w:t>
+      </w:r>
+    </w:p>
+    <w:p>
+      <w:pPr>
+        <w:numPr>
+          <w:ilvl w:val="0"/>
+          <w:numId w:val="1"/>
+        </w:numPr>
+        <w:spacing w:after="60"/>
+      </w:pPr>
+      <w:r>
+        <w:t xml:space="preserve">☐ Configure Dynamic Logic to show/hide registration fields conditionally based on Registered with State value.</w:t>
+      </w:r>
+    </w:p>
+    <w:p>
+      <w:pPr>
+        <w:numPr>
+          <w:ilvl w:val="0"/>
+          <w:numId w:val="1"/>
+        </w:numPr>
+        <w:spacing w:after="60"/>
+      </w:pPr>
+      <w:r>
+        <w:t xml:space="preserve">☐ Configure field-level access on EIN Number to restrict visibility to Admin and assigned Primary Mentor only.</w:t>
+      </w:r>
+    </w:p>
+    <w:p>
+      <w:pPr>
+        <w:numPr>
+          <w:ilvl w:val="0"/>
+          <w:numId w:val="1"/>
+        </w:numPr>
+        <w:spacing w:after="60"/>
+      </w:pPr>
+      <w:r>
+        <w:t xml:space="preserve">☐ Organize all fields into logical panel groups on the Company detail view: Contact Information, Business Classification, Mentoring Context (Phase 1), Business Detail (Phase 2), Professional Advisors, Business Registration.</w:t>
+      </w:r>
+    </w:p>
+    <w:p>
+      <w:pPr>
+        <w:numPr>
+          <w:ilvl w:val="0"/>
+          <w:numId w:val="1"/>
+        </w:numPr>
+        <w:spacing w:after="60"/>
+      </w:pPr>
+      <w:r>
+        <w:t xml:space="preserve">☐ Configure Phase 2 panel group to be collapsible and clearly labeled as post-assignment information.</w:t>
+      </w:r>
+    </w:p>
+    <w:p>
+      <w:pPr>
+        <w:numPr>
+          <w:ilvl w:val="0"/>
+          <w:numId w:val="1"/>
+        </w:numPr>
+        <w:spacing w:after="60"/>
+      </w:pPr>
+      <w:r>
+        <w:t xml:space="preserve">☐ Add Note, Document, Email, and Calls relationship panels to the Company detail view.</w:t>
+      </w:r>
+    </w:p>
+    <w:p>
+      <w:r>
+        <w:t xml:space="preserve"/>
+      </w:r>
+    </w:p>
+    <w:p>
+      <w:pPr>
+        <w:pStyle w:val="Heading2"/>
+      </w:pPr>
+      <w:r>
+        <w:t xml:space="preserve">6.3 Contact Entity</w:t>
+      </w:r>
+    </w:p>
+    <w:p>
+      <w:pPr>
+        <w:spacing w:after="120"/>
+      </w:pPr>
+      <w:r>
+        <w:t xml:space="preserve">The Contact entity uses EspoCRM’s native Contact entity. Add the fields defined in Section 2.3 that are not already present natively.</w:t>
+      </w:r>
+    </w:p>
+    <w:p>
+      <w:r>
+        <w:t xml:space="preserve"/>
+      </w:r>
+    </w:p>
+    <w:p>
+      <w:pPr>
+        <w:numPr>
+          <w:ilvl w:val="0"/>
+          <w:numId w:val="1"/>
+        </w:numPr>
+        <w:spacing w:after="60"/>
+      </w:pPr>
+      <w:r>
+        <w:t xml:space="preserve">☐ Verify native Contact fields are present: First Name, Last Name, Email, Phone.</w:t>
+      </w:r>
+    </w:p>
+    <w:p>
+      <w:pPr>
+        <w:numPr>
+          <w:ilvl w:val="0"/>
+          <w:numId w:val="1"/>
+        </w:numPr>
+        <w:spacing w:after="60"/>
+      </w:pPr>
+      <w:r>
+        <w:t xml:space="preserve">☐ Add Role at Business field (text field) to the Contact entity.</w:t>
+      </w:r>
+    </w:p>
+    <w:p>
+      <w:pPr>
+        <w:numPr>
+          <w:ilvl w:val="0"/>
+          <w:numId w:val="1"/>
+        </w:numPr>
+        <w:spacing w:after="60"/>
+      </w:pPr>
+      <w:r>
+        <w:t xml:space="preserve">☐ Add Primary Contact field (checkbox/boolean) to the Contact entity.</w:t>
+      </w:r>
+    </w:p>
+    <w:p>
+      <w:pPr>
+        <w:numPr>
+          <w:ilvl w:val="0"/>
+          <w:numId w:val="1"/>
+        </w:numPr>
+        <w:spacing w:after="60"/>
+      </w:pPr>
+      <w:r>
+        <w:t xml:space="preserve">☐ Add Zip Code field to the Contact entity if not already present as part of the native address field set.</w:t>
+      </w:r>
+    </w:p>
+    <w:p>
+      <w:pPr>
+        <w:numPr>
+          <w:ilvl w:val="0"/>
+          <w:numId w:val="1"/>
+        </w:numPr>
+        <w:spacing w:after="60"/>
+      </w:pPr>
+      <w:r>
+        <w:t xml:space="preserve">☐ Organize Contact detail view panels logically: Personal Information, Role at Business.</w:t>
+      </w:r>
+    </w:p>
+    <w:p>
+      <w:pPr>
+        <w:numPr>
+          <w:ilvl w:val="0"/>
+          <w:numId w:val="1"/>
+        </w:numPr>
+        <w:spacing w:after="60"/>
+      </w:pPr>
+      <w:r>
+        <w:t xml:space="preserve">☐ Add Note, Document, Email, and Calls relationship panels to the Contact detail view.</w:t>
+      </w:r>
+    </w:p>
+    <w:p>
+      <w:r>
+        <w:t xml:space="preserve"/>
+      </w:r>
+    </w:p>
+    <w:p>
+      <w:pPr>
+        <w:pStyle w:val="Heading2"/>
+      </w:pPr>
+      <w:r>
+        <w:t xml:space="preserve">6.4 Engagement Entity</w:t>
+      </w:r>
+    </w:p>
+    <w:p>
+      <w:pPr>
+        <w:spacing w:after="120"/>
+      </w:pPr>
+      <w:r>
+        <w:t xml:space="preserve">Create the Engagement entity as a custom entity. This entity does not exist natively in EspoCRM and must be built from scratch via Entity Manager.</w:t>
+      </w:r>
+    </w:p>
+    <w:p>
+      <w:r>
+        <w:t xml:space="preserve"/>
+      </w:r>
+    </w:p>
+    <w:p>
+      <w:pPr>
+        <w:numPr>
+          <w:ilvl w:val="0"/>
+          <w:numId w:val="1"/>
+        </w:numPr>
+        <w:spacing w:after="60"/>
+      </w:pPr>
+      <w:r>
+        <w:t xml:space="preserve">☐ Create the Engagement custom entity.</w:t>
+      </w:r>
+    </w:p>
+    <w:p>
+      <w:pPr>
+        <w:numPr>
+          <w:ilvl w:val="0"/>
+          <w:numId w:val="1"/>
+        </w:numPr>
+        <w:spacing w:after="60"/>
+      </w:pPr>
+      <w:r>
+        <w:t xml:space="preserve">☐ Add Status field (dropdown) with all defined values: Submitted, Pending Acceptance, Assigned, Active, On-Hold, Dormant, Inactive, Abandoned, Completed.</w:t>
+      </w:r>
+    </w:p>
+    <w:p>
+      <w:pPr>
+        <w:numPr>
+          <w:ilvl w:val="0"/>
+          <w:numId w:val="1"/>
+        </w:numPr>
+        <w:spacing w:after="60"/>
+      </w:pPr>
+      <w:r>
+        <w:t xml:space="preserve">☐ Add Start Date field (date).</w:t>
+      </w:r>
+    </w:p>
+    <w:p>
+      <w:pPr>
+        <w:numPr>
+          <w:ilvl w:val="0"/>
+          <w:numId w:val="1"/>
+        </w:numPr>
+        <w:spacing w:after="60"/>
+      </w:pPr>
+      <w:r>
+        <w:t xml:space="preserve">☐ Add Close Date field (date).</w:t>
+      </w:r>
+    </w:p>
+    <w:p>
+      <w:pPr>
+        <w:numPr>
+          <w:ilvl w:val="0"/>
+          <w:numId w:val="1"/>
+        </w:numPr>
+        <w:spacing w:after="60"/>
+      </w:pPr>
+      <w:r>
+        <w:t xml:space="preserve">☐ Add Meeting Cadence field (dropdown) with values: Weekly, Bi-Weekly, Monthly, As Needed.</w:t>
+      </w:r>
+    </w:p>
+    <w:p>
+      <w:pPr>
+        <w:numPr>
+          <w:ilvl w:val="0"/>
+          <w:numId w:val="1"/>
+        </w:numPr>
+        <w:spacing w:after="60"/>
+      </w:pPr>
+      <w:r>
+        <w:t xml:space="preserve">☐ Add Engagement Close Reason field (dropdown) with values: Goals Achieved, Client Withdrew, Inactive / No Response, Other.</w:t>
+      </w:r>
+    </w:p>
+    <w:p>
+      <w:pPr>
+        <w:numPr>
+          <w:ilvl w:val="0"/>
+          <w:numId w:val="1"/>
+        </w:numPr>
+        <w:spacing w:after="60"/>
+      </w:pPr>
+      <w:r>
+        <w:t xml:space="preserve">☐ Add Assigned Mentor field (link to Contact entity).</w:t>
+      </w:r>
+    </w:p>
+    <w:p>
+      <w:pPr>
+        <w:numPr>
+          <w:ilvl w:val="0"/>
+          <w:numId w:val="1"/>
+        </w:numPr>
+        <w:spacing w:after="60"/>
+      </w:pPr>
+      <w:r>
+        <w:t xml:space="preserve">☐ Configure Co-Mentor as a many-to-many relationship panel linking multiple Contact records with Co-Mentor role.</w:t>
+      </w:r>
+    </w:p>
+    <w:p>
+      <w:pPr>
+        <w:numPr>
+          <w:ilvl w:val="0"/>
+          <w:numId w:val="1"/>
+        </w:numPr>
+        <w:spacing w:after="60"/>
+      </w:pPr>
+      <w:r>
+        <w:t xml:space="preserve">☐ Configure SME as a many-to-many relationship panel linking multiple Contact records with SME role.</w:t>
+      </w:r>
+    </w:p>
+    <w:p>
+      <w:pPr>
+        <w:numPr>
+          <w:ilvl w:val="0"/>
+          <w:numId w:val="1"/>
+        </w:numPr>
+        <w:spacing w:after="60"/>
+      </w:pPr>
+      <w:r>
+        <w:t xml:space="preserve">☐ Add formula/roll-up fields: Total Sessions (count of linked Sessions), Total Sessions Last 30 Days (count of Sessions in last 30 days), Last Session Date (date of most recent Session), Total Session Hours (sum of Session Duration).</w:t>
+      </w:r>
+    </w:p>
+    <w:p>
+      <w:pPr>
+        <w:numPr>
+          <w:ilvl w:val="0"/>
+          <w:numId w:val="1"/>
+        </w:numPr>
+        <w:spacing w:after="60"/>
+      </w:pPr>
+      <w:r>
+        <w:t xml:space="preserve">☐ Organize Engagement detail view panels: Engagement Details, Mentor Assignment, Analytics Summary.</w:t>
+      </w:r>
+    </w:p>
+    <w:p>
+      <w:pPr>
+        <w:numPr>
+          <w:ilvl w:val="0"/>
+          <w:numId w:val="1"/>
+        </w:numPr>
+        <w:spacing w:after="60"/>
+      </w:pPr>
+      <w:r>
+        <w:t xml:space="preserve">☐ Add Note, Document, Email, and Calls relationship panels to the Engagement detail view.</w:t>
+      </w:r>
+    </w:p>
+    <w:p>
+      <w:r>
+        <w:t xml:space="preserve"/>
+      </w:r>
+    </w:p>
+    <w:p>
+      <w:pPr>
+        <w:pStyle w:val="Heading2"/>
+      </w:pPr>
+      <w:r>
+        <w:t xml:space="preserve">6.5 Session Entity</w:t>
+      </w:r>
+    </w:p>
+    <w:p>
+      <w:pPr>
+        <w:spacing w:after="120"/>
+      </w:pPr>
+      <w:r>
+        <w:t xml:space="preserve">Create the Session entity as a custom entity.</w:t>
+      </w:r>
+    </w:p>
+    <w:p>
+      <w:r>
+        <w:t xml:space="preserve"/>
+      </w:r>
+    </w:p>
+    <w:p>
+      <w:pPr>
+        <w:numPr>
+          <w:ilvl w:val="0"/>
+          <w:numId w:val="1"/>
+        </w:numPr>
+        <w:spacing w:after="60"/>
+      </w:pPr>
+      <w:r>
+        <w:t xml:space="preserve">☐ Create the Session custom entity.</w:t>
+      </w:r>
+    </w:p>
+    <w:p>
+      <w:pPr>
+        <w:numPr>
+          <w:ilvl w:val="0"/>
+          <w:numId w:val="1"/>
+        </w:numPr>
+        <w:spacing w:after="60"/>
+      </w:pPr>
+      <w:r>
+        <w:t xml:space="preserve">☐ Add Session Date/Time field (date/time).</w:t>
+      </w:r>
+    </w:p>
+    <w:p>
+      <w:pPr>
+        <w:numPr>
+          <w:ilvl w:val="0"/>
+          <w:numId w:val="1"/>
+        </w:numPr>
+        <w:spacing w:after="60"/>
+      </w:pPr>
+      <w:r>
+        <w:t xml:space="preserve">☐ Add Duration field (integer, minutes).</w:t>
+      </w:r>
+    </w:p>
+    <w:p>
+      <w:pPr>
+        <w:numPr>
+          <w:ilvl w:val="0"/>
+          <w:numId w:val="1"/>
+        </w:numPr>
+        <w:spacing w:after="60"/>
+      </w:pPr>
+      <w:r>
+        <w:t xml:space="preserve">☐ Add Session Type field (dropdown) with values: In-Person, Video Call, Phone Call.</w:t>
+      </w:r>
+    </w:p>
+    <w:p>
+      <w:pPr>
+        <w:numPr>
+          <w:ilvl w:val="0"/>
+          <w:numId w:val="1"/>
+        </w:numPr>
+        <w:spacing w:after="60"/>
+      </w:pPr>
+      <w:r>
+        <w:t xml:space="preserve">☐ Add Meeting Location Type field (dropdown) with values: CBM Office, Client’s Place of Business, Other.</w:t>
+      </w:r>
+    </w:p>
+    <w:p>
+      <w:pPr>
+        <w:numPr>
+          <w:ilvl w:val="0"/>
+          <w:numId w:val="1"/>
+        </w:numPr>
+        <w:spacing w:after="60"/>
+      </w:pPr>
+      <w:r>
+        <w:t xml:space="preserve">☐ Add Location Details field (text).</w:t>
+      </w:r>
+    </w:p>
+    <w:p>
+      <w:pPr>
+        <w:numPr>
+          <w:ilvl w:val="0"/>
+          <w:numId w:val="1"/>
+        </w:numPr>
+        <w:spacing w:after="60"/>
+      </w:pPr>
+      <w:r>
+        <w:t xml:space="preserve">☐ Configure Dynamic Logic to show Meeting Location Type only when Session Type = In-Person.</w:t>
+      </w:r>
+    </w:p>
+    <w:p>
+      <w:pPr>
+        <w:numPr>
+          <w:ilvl w:val="0"/>
+          <w:numId w:val="1"/>
+        </w:numPr>
+        <w:spacing w:after="60"/>
+      </w:pPr>
+      <w:r>
+        <w:t xml:space="preserve">☐ Configure Dynamic Logic to show Location Details only when Meeting Location Type = Other.</w:t>
+      </w:r>
+    </w:p>
+    <w:p>
+      <w:pPr>
+        <w:numPr>
+          <w:ilvl w:val="0"/>
+          <w:numId w:val="1"/>
+        </w:numPr>
+        <w:spacing w:after="60"/>
+      </w:pPr>
+      <w:r>
+        <w:t xml:space="preserve">☐ Add Topics Covered field (multi-select dropdown, values TBD).</w:t>
+      </w:r>
+    </w:p>
+    <w:p>
+      <w:pPr>
+        <w:numPr>
+          <w:ilvl w:val="0"/>
+          <w:numId w:val="1"/>
+        </w:numPr>
+        <w:spacing w:after="60"/>
+      </w:pPr>
+      <w:r>
+        <w:t xml:space="preserve">☐ Add Topics Covered Notes field (rich text) for free-text topic detail.</w:t>
+      </w:r>
+    </w:p>
+    <w:p>
+      <w:pPr>
+        <w:numPr>
+          <w:ilvl w:val="0"/>
+          <w:numId w:val="1"/>
+        </w:numPr>
+        <w:spacing w:after="60"/>
+      </w:pPr>
+      <w:r>
+        <w:t xml:space="preserve">☐ Add Mentor Notes field (rich text).</w:t>
+      </w:r>
+    </w:p>
+    <w:p>
+      <w:pPr>
+        <w:numPr>
+          <w:ilvl w:val="0"/>
+          <w:numId w:val="1"/>
+        </w:numPr>
+        <w:spacing w:after="60"/>
+      </w:pPr>
+      <w:r>
+        <w:t xml:space="preserve">☐ Add Next Steps field (rich text).</w:t>
+      </w:r>
+    </w:p>
+    <w:p>
+      <w:pPr>
+        <w:numPr>
+          <w:ilvl w:val="0"/>
+          <w:numId w:val="1"/>
+        </w:numPr>
+        <w:spacing w:after="60"/>
+      </w:pPr>
+      <w:r>
+        <w:t xml:space="preserve">☐ Add New Business Started field (checkbox/boolean).</w:t>
+      </w:r>
+    </w:p>
+    <w:p>
+      <w:pPr>
+        <w:numPr>
+          <w:ilvl w:val="0"/>
+          <w:numId w:val="1"/>
+        </w:numPr>
+        <w:spacing w:after="60"/>
+      </w:pPr>
+      <w:r>
+        <w:t xml:space="preserve">☐ Add Note and Document relationship panels to the Session detail view.</w:t>
+      </w:r>
+    </w:p>
+    <w:p>
+      <w:r>
+        <w:t xml:space="preserve"/>
+      </w:r>
+    </w:p>
+    <w:p>
+      <w:pPr>
+        <w:pStyle w:val="Heading2"/>
+      </w:pPr>
+      <w:r>
+        <w:t xml:space="preserve">6.6 NPS Survey Response Entity</w:t>
+      </w:r>
+    </w:p>
+    <w:p>
+      <w:pPr>
+        <w:spacing w:after="120"/>
+      </w:pPr>
+      <w:r>
+        <w:t xml:space="preserve">Create the NPS Survey Response entity as a custom entity and configure the LimeSurvey integration.</w:t>
+      </w:r>
+    </w:p>
+    <w:p>
+      <w:r>
+        <w:t xml:space="preserve"/>
+      </w:r>
+    </w:p>
+    <w:p>
+      <w:pPr>
+        <w:numPr>
+          <w:ilvl w:val="0"/>
+          <w:numId w:val="1"/>
+        </w:numPr>
+        <w:spacing w:after="60"/>
+      </w:pPr>
+      <w:r>
+        <w:t xml:space="preserve">☐ Create the NPS Survey Response custom entity.</w:t>
+      </w:r>
+    </w:p>
+    <w:p>
+      <w:pPr>
+        <w:numPr>
+          <w:ilvl w:val="0"/>
+          <w:numId w:val="1"/>
+        </w:numPr>
+        <w:spacing w:after="60"/>
+      </w:pPr>
+      <w:r>
+        <w:t xml:space="preserve">☐ Add Survey Trigger field (dropdown, read-only) with values: 2nd Session, Every 5 Sessions, Engagement Close.</w:t>
+      </w:r>
+    </w:p>
+    <w:p>
+      <w:pPr>
+        <w:numPr>
+          <w:ilvl w:val="0"/>
+          <w:numId w:val="1"/>
+        </w:numPr>
+        <w:spacing w:after="60"/>
+      </w:pPr>
+      <w:r>
+        <w:t xml:space="preserve">☐ Add Survey Date/Time field (date/time, system-populated).</w:t>
+      </w:r>
+    </w:p>
+    <w:p>
+      <w:pPr>
+        <w:numPr>
+          <w:ilvl w:val="0"/>
+          <w:numId w:val="1"/>
+        </w:numPr>
+        <w:spacing w:after="60"/>
+      </w:pPr>
+      <w:r>
+        <w:t xml:space="preserve">☐ Add NPS Score field (integer, 0-10).</w:t>
+      </w:r>
+    </w:p>
+    <w:p>
+      <w:pPr>
+        <w:numPr>
+          <w:ilvl w:val="0"/>
+          <w:numId w:val="1"/>
+        </w:numPr>
+        <w:spacing w:after="60"/>
+      </w:pPr>
+      <w:r>
+        <w:t xml:space="preserve">☐ Add Did CBM Help You field (boolean yes/no).</w:t>
+      </w:r>
+    </w:p>
+    <w:p>
+      <w:pPr>
+        <w:numPr>
+          <w:ilvl w:val="0"/>
+          <w:numId w:val="1"/>
+        </w:numPr>
+        <w:spacing w:after="60"/>
+      </w:pPr>
+      <w:r>
+        <w:t xml:space="preserve">☐ Add I Would Return to See This Mentor Again field (integer, 1-5).</w:t>
+      </w:r>
+    </w:p>
+    <w:p>
+      <w:pPr>
+        <w:numPr>
+          <w:ilvl w:val="0"/>
+          <w:numId w:val="1"/>
+        </w:numPr>
+        <w:spacing w:after="60"/>
+      </w:pPr>
+      <w:r>
+        <w:t xml:space="preserve">☐ Add Mentor Listened and Understood My Needs field (integer, 1-5).</w:t>
+      </w:r>
+    </w:p>
+    <w:p>
+      <w:pPr>
+        <w:numPr>
+          <w:ilvl w:val="0"/>
+          <w:numId w:val="1"/>
+        </w:numPr>
+        <w:spacing w:after="60"/>
+      </w:pPr>
+      <w:r>
+        <w:t xml:space="preserve">☐ Add How Could CBM Better Meet Your Needs field (rich text, optional).</w:t>
+      </w:r>
+    </w:p>
+    <w:p>
+      <w:pPr>
+        <w:numPr>
+          <w:ilvl w:val="0"/>
+          <w:numId w:val="1"/>
+        </w:numPr>
+        <w:spacing w:after="60"/>
+      </w:pPr>
+      <w:r>
+        <w:t xml:space="preserve">☐ Install and configure LimeSurvey (self-hosted on AWS).</w:t>
+      </w:r>
+    </w:p>
+    <w:p>
+      <w:pPr>
+        <w:numPr>
+          <w:ilvl w:val="0"/>
+          <w:numId w:val="1"/>
+        </w:numPr>
+        <w:spacing w:after="60"/>
+      </w:pPr>
+      <w:r>
+        <w:t xml:space="preserve">☐ Build the NPS survey in LimeSurvey with all defined questions.</w:t>
+      </w:r>
+    </w:p>
+    <w:p>
+      <w:pPr>
+        <w:numPr>
+          <w:ilvl w:val="0"/>
+          <w:numId w:val="1"/>
+        </w:numPr>
+        <w:spacing w:after="60"/>
+      </w:pPr>
+      <w:r>
+        <w:t xml:space="preserve">☐ Configure LimeSurvey API connection to EspoCRM for response posting.</w:t>
+      </w:r>
+    </w:p>
+    <w:p>
+      <w:pPr>
+        <w:numPr>
+          <w:ilvl w:val="0"/>
+          <w:numId w:val="1"/>
+        </w:numPr>
+        <w:spacing w:after="60"/>
+      </w:pPr>
+      <w:r>
+        <w:t xml:space="preserve">☐ Test end-to-end survey delivery and response capture before go-live.</w:t>
+      </w:r>
+    </w:p>
+    <w:p>
+      <w:r>
+        <w:t xml:space="preserve"/>
+      </w:r>
+    </w:p>
+    <w:p>
+      <w:pPr>
+        <w:pStyle w:val="Heading2"/>
+      </w:pPr>
+      <w:r>
+        <w:t xml:space="preserve">6.7 Workshop Entity</w:t>
+      </w:r>
+    </w:p>
+    <w:p>
+      <w:pPr>
+        <w:spacing w:after="120"/>
+      </w:pPr>
+      <w:r>
+        <w:t xml:space="preserve">Create the Workshop entity as a custom entity.</w:t>
+      </w:r>
+    </w:p>
+    <w:p>
+      <w:r>
+        <w:t xml:space="preserve"/>
+      </w:r>
+    </w:p>
+    <w:p>
+      <w:pPr>
+        <w:numPr>
+          <w:ilvl w:val="0"/>
+          <w:numId w:val="1"/>
+        </w:numPr>
+        <w:spacing w:after="60"/>
+      </w:pPr>
+      <w:r>
+        <w:t xml:space="preserve">☐ Create the Workshop custom entity.</w:t>
+      </w:r>
+    </w:p>
+    <w:p>
+      <w:pPr>
+        <w:numPr>
+          <w:ilvl w:val="0"/>
+          <w:numId w:val="1"/>
+        </w:numPr>
+        <w:spacing w:after="60"/>
+      </w:pPr>
+      <w:r>
+        <w:t xml:space="preserve">☐ Add Title field (text).</w:t>
+      </w:r>
+    </w:p>
+    <w:p>
+      <w:pPr>
+        <w:numPr>
+          <w:ilvl w:val="0"/>
+          <w:numId w:val="1"/>
+        </w:numPr>
+        <w:spacing w:after="60"/>
+      </w:pPr>
+      <w:r>
+        <w:t xml:space="preserve">☐ Add Date/Time field (date/time).</w:t>
+      </w:r>
+    </w:p>
+    <w:p>
+      <w:pPr>
+        <w:numPr>
+          <w:ilvl w:val="0"/>
+          <w:numId w:val="1"/>
+        </w:numPr>
+        <w:spacing w:after="60"/>
+      </w:pPr>
+      <w:r>
+        <w:t xml:space="preserve">☐ Add Topic/Category field (dropdown, aligned with Mentoring Focus Areas values).</w:t>
+      </w:r>
+    </w:p>
+    <w:p>
+      <w:pPr>
+        <w:numPr>
+          <w:ilvl w:val="0"/>
+          <w:numId w:val="1"/>
+        </w:numPr>
+        <w:spacing w:after="60"/>
+      </w:pPr>
+      <w:r>
+        <w:t xml:space="preserve">☐ Add Presenter field (text or link to Contact).</w:t>
+      </w:r>
+    </w:p>
+    <w:p>
+      <w:pPr>
+        <w:numPr>
+          <w:ilvl w:val="0"/>
+          <w:numId w:val="1"/>
+        </w:numPr>
+        <w:spacing w:after="60"/>
+      </w:pPr>
+      <w:r>
+        <w:t xml:space="preserve">☐ Add Location field (text).</w:t>
+      </w:r>
+    </w:p>
+    <w:p>
+      <w:pPr>
+        <w:numPr>
+          <w:ilvl w:val="0"/>
+          <w:numId w:val="1"/>
+        </w:numPr>
+        <w:spacing w:after="60"/>
+      </w:pPr>
+      <w:r>
+        <w:t xml:space="preserve">☐ Add Description field (rich text).</w:t>
+      </w:r>
+    </w:p>
+    <w:p>
+      <w:pPr>
+        <w:numPr>
+          <w:ilvl w:val="0"/>
+          <w:numId w:val="1"/>
+        </w:numPr>
+        <w:spacing w:after="60"/>
+      </w:pPr>
+      <w:r>
+        <w:t xml:space="preserve">☐ Add Maximum Capacity field (integer).</w:t>
+      </w:r>
+    </w:p>
+    <w:p>
+      <w:pPr>
+        <w:numPr>
+          <w:ilvl w:val="0"/>
+          <w:numId w:val="1"/>
+        </w:numPr>
+        <w:spacing w:after="60"/>
+      </w:pPr>
+      <w:r>
+        <w:t xml:space="preserve">☐ Add Status field (dropdown) with values: Scheduled, Completed, Cancelled.</w:t>
+      </w:r>
+    </w:p>
+    <w:p>
+      <w:pPr>
+        <w:numPr>
+          <w:ilvl w:val="0"/>
+          <w:numId w:val="1"/>
+        </w:numPr>
+        <w:spacing w:after="60"/>
+      </w:pPr>
+      <w:r>
+        <w:t xml:space="preserve">☐ Add Note and Document relationship panels to the Workshop detail view.</w:t>
+      </w:r>
+    </w:p>
+    <w:p>
+      <w:r>
+        <w:t xml:space="preserve"/>
+      </w:r>
+    </w:p>
+    <w:p>
+      <w:pPr>
+        <w:pStyle w:val="Heading2"/>
+      </w:pPr>
+      <w:r>
+        <w:t xml:space="preserve">6.8 Workshop Attendance Entity</w:t>
+      </w:r>
+    </w:p>
+    <w:p>
+      <w:pPr>
+        <w:spacing w:after="120"/>
+      </w:pPr>
+      <w:r>
+        <w:t xml:space="preserve">Create the Workshop Attendance entity as a custom entity.</w:t>
+      </w:r>
+    </w:p>
+    <w:p>
+      <w:r>
+        <w:t xml:space="preserve"/>
+      </w:r>
+    </w:p>
+    <w:p>
+      <w:pPr>
+        <w:numPr>
+          <w:ilvl w:val="0"/>
+          <w:numId w:val="1"/>
+        </w:numPr>
+        <w:spacing w:after="60"/>
+      </w:pPr>
+      <w:r>
+        <w:t xml:space="preserve">☐ Create the Workshop Attendance custom entity.</w:t>
+      </w:r>
+    </w:p>
+    <w:p>
+      <w:pPr>
+        <w:numPr>
+          <w:ilvl w:val="0"/>
+          <w:numId w:val="1"/>
+        </w:numPr>
+        <w:spacing w:after="60"/>
+      </w:pPr>
+      <w:r>
+        <w:t xml:space="preserve">☐ Add Workshop link field (link to Workshop entity).</w:t>
+      </w:r>
+    </w:p>
+    <w:p>
+      <w:pPr>
+        <w:numPr>
+          <w:ilvl w:val="0"/>
+          <w:numId w:val="1"/>
+        </w:numPr>
+        <w:spacing w:after="60"/>
+      </w:pPr>
+      <w:r>
+        <w:t xml:space="preserve">☐ Add Contact link field (link to Contact entity).</w:t>
+      </w:r>
+    </w:p>
+    <w:p>
+      <w:pPr>
+        <w:numPr>
+          <w:ilvl w:val="0"/>
+          <w:numId w:val="1"/>
+        </w:numPr>
+        <w:spacing w:after="60"/>
+      </w:pPr>
+      <w:r>
+        <w:t xml:space="preserve">☐ Add Engagement link field (link to Engagement entity).</w:t>
+      </w:r>
+    </w:p>
+    <w:p>
+      <w:pPr>
+        <w:numPr>
+          <w:ilvl w:val="0"/>
+          <w:numId w:val="1"/>
+        </w:numPr>
+        <w:spacing w:after="60"/>
+      </w:pPr>
+      <w:r>
+        <w:t xml:space="preserve">☐ Add Attendance Date field (date, auto-populated from linked Workshop).</w:t>
+      </w:r>
+    </w:p>
+    <w:p>
+      <w:pPr>
+        <w:numPr>
+          <w:ilvl w:val="0"/>
+          <w:numId w:val="1"/>
+        </w:numPr>
+        <w:spacing w:after="60"/>
+      </w:pPr>
+      <w:r>
+        <w:t xml:space="preserve">☐ Add Attended field (boolean yes/no, defaults to Yes).</w:t>
+      </w:r>
+    </w:p>
+    <w:p>
+      <w:r>
+        <w:t xml:space="preserve"/>
+      </w:r>
+    </w:p>
+    <w:p>
+      <w:pPr>
+        <w:pStyle w:val="Heading2"/>
+      </w:pPr>
+      <w:r>
+        <w:t xml:space="preserve">6.9 Relationships</w:t>
+      </w:r>
+    </w:p>
+    <w:p>
+      <w:pPr>
+        <w:spacing w:after="120"/>
+      </w:pPr>
+      <w:r>
+        <w:t xml:space="preserve">Configure all entity relationships and relationship panels as defined in Section 3. Verify each relationship displays correctly from both sides.</w:t>
+      </w:r>
+    </w:p>
+    <w:p>
+      <w:r>
+        <w:t xml:space="preserve"/>
+      </w:r>
+    </w:p>
+    <w:p>
+      <w:pPr>
+        <w:numPr>
+          <w:ilvl w:val="0"/>
+          <w:numId w:val="1"/>
+        </w:numPr>
+        <w:spacing w:after="60"/>
+      </w:pPr>
+      <w:r>
+        <w:t xml:space="preserve">☐ Configure Company → Contact relationship (one-to-many). Add Contact panel to Company detail view. Verify Company link appears on Contact detail view.</w:t>
+      </w:r>
+    </w:p>
+    <w:p>
+      <w:pPr>
+        <w:numPr>
+          <w:ilvl w:val="0"/>
+          <w:numId w:val="1"/>
+        </w:numPr>
+        <w:spacing w:after="60"/>
+      </w:pPr>
+      <w:r>
+        <w:t xml:space="preserve">☐ Configure Company → Engagement relationship (one-to-many). Add Engagement panel to Company detail view. Verify Company link appears on Engagement detail view.</w:t>
+      </w:r>
+    </w:p>
+    <w:p>
+      <w:pPr>
+        <w:numPr>
+          <w:ilvl w:val="0"/>
+          <w:numId w:val="1"/>
+        </w:numPr>
+        <w:spacing w:after="60"/>
+      </w:pPr>
+      <w:r>
+        <w:t xml:space="preserve">☐ Configure Engagement → Session relationship (one-to-many). Add Session panel to Engagement detail view. Verify Engagement link appears on Session detail view.</w:t>
+      </w:r>
+    </w:p>
+    <w:p>
+      <w:pPr>
+        <w:numPr>
+          <w:ilvl w:val="0"/>
+          <w:numId w:val="1"/>
+        </w:numPr>
+        <w:spacing w:after="60"/>
+      </w:pPr>
+      <w:r>
+        <w:t xml:space="preserve">☐ Configure Engagement → NPS Survey Response relationship (one-to-many). Add NPS Survey Response panel to Engagement detail view.</w:t>
+      </w:r>
+    </w:p>
+    <w:p>
+      <w:pPr>
+        <w:numPr>
+          <w:ilvl w:val="0"/>
+          <w:numId w:val="1"/>
+        </w:numPr>
+        <w:spacing w:after="60"/>
+      </w:pPr>
+      <w:r>
+        <w:t xml:space="preserve">☐ Configure Contact → Workshop Attendance relationship (one-to-many). Add Workshop Attendance panel to Contact detail view.</w:t>
+      </w:r>
+    </w:p>
+    <w:p>
+      <w:pPr>
+        <w:numPr>
+          <w:ilvl w:val="0"/>
+          <w:numId w:val="1"/>
+        </w:numPr>
+        <w:spacing w:after="60"/>
+      </w:pPr>
+      <w:r>
+        <w:t xml:space="preserve">☐ Configure Workshop → Workshop Attendance relationship (one-to-many). Add Workshop Attendance panel to Workshop detail view.</w:t>
+      </w:r>
+    </w:p>
+    <w:p>
+      <w:pPr>
+        <w:numPr>
+          <w:ilvl w:val="0"/>
+          <w:numId w:val="1"/>
+        </w:numPr>
+        <w:spacing w:after="60"/>
+      </w:pPr>
+      <w:r>
+        <w:t xml:space="preserve">☐ Configure Note many-to-many relationship panels on all entities: Company, Contact, Engagement, Session, NPS Survey Response, Workshop, Workshop Attendance.</w:t>
+      </w:r>
+    </w:p>
+    <w:p>
+      <w:pPr>
+        <w:numPr>
+          <w:ilvl w:val="0"/>
+          <w:numId w:val="1"/>
+        </w:numPr>
+        <w:spacing w:after="60"/>
+      </w:pPr>
+      <w:r>
+        <w:t xml:space="preserve">☐ Configure Document many-to-many relationship panels on all entities: Company, Contact, Engagement, Session, NPS Survey Response, Workshop, Workshop Attendance.</w:t>
+      </w:r>
+    </w:p>
+    <w:p>
+      <w:pPr>
+        <w:numPr>
+          <w:ilvl w:val="0"/>
+          <w:numId w:val="1"/>
+        </w:numPr>
+        <w:spacing w:after="60"/>
+      </w:pPr>
+      <w:r>
+        <w:t xml:space="preserve">☐ Verify Email and Calls activity panels are present on Company, Contact, and Engagement detail views.</w:t>
+      </w:r>
+    </w:p>
+    <w:p>
+      <w:r>
+        <w:t xml:space="preserve"/>
+      </w:r>
+    </w:p>
+    <w:p>
+      <w:pPr>
+        <w:pStyle w:val="Heading2"/>
+      </w:pPr>
+      <w:r>
+        <w:t xml:space="preserve">6.10 Role-Based Access Control</w:t>
+      </w:r>
+    </w:p>
+    <w:p>
+      <w:pPr>
+        <w:spacing w:after="120"/>
+      </w:pPr>
+      <w:r>
+        <w:t xml:space="preserve">Configure EspoCRM Roles and Teams to enforce the access rules defined in Section 5. Test each role by logging in as a test user with that role assigned.</w:t>
+      </w:r>
+    </w:p>
+    <w:p>
+      <w:r>
+        <w:t xml:space="preserve"/>
+      </w:r>
+    </w:p>
+    <w:p>
+      <w:pPr>
+        <w:numPr>
+          <w:ilvl w:val="0"/>
+          <w:numId w:val="1"/>
+        </w:numPr>
+        <w:spacing w:after="60"/>
+      </w:pPr>
+      <w:r>
+        <w:t xml:space="preserve">☐ Create or verify the Admin role with full Create/Read/Update/Delete access across all client domain entities.</w:t>
+      </w:r>
+    </w:p>
+    <w:p>
+      <w:pPr>
+        <w:numPr>
+          <w:ilvl w:val="0"/>
+          <w:numId w:val="1"/>
+        </w:numPr>
+        <w:spacing w:after="60"/>
+      </w:pPr>
+      <w:r>
+        <w:t xml:space="preserve">☐ Create the Primary Mentor role with Own Read/Update access on Company, Contact, and Engagement; Own Create/Read/Update on Session, Notes, and Documents; Own Read on NPS Survey Responses and Workshops.</w:t>
+      </w:r>
+    </w:p>
+    <w:p>
+      <w:pPr>
+        <w:numPr>
+          <w:ilvl w:val="0"/>
+          <w:numId w:val="1"/>
+        </w:numPr>
+        <w:spacing w:after="60"/>
+      </w:pPr>
+      <w:r>
+        <w:t xml:space="preserve">☐ Create the Co-Mentor role with the same permissions as Primary Mentor, scoped to assigned engagements only.</w:t>
+      </w:r>
+    </w:p>
+    <w:p>
+      <w:pPr>
+        <w:numPr>
+          <w:ilvl w:val="0"/>
+          <w:numId w:val="1"/>
+        </w:numPr>
+        <w:spacing w:after="60"/>
+      </w:pPr>
+      <w:r>
+        <w:t xml:space="preserve">☐ Create the SME role with Own Read access on Company, Contact, and Engagement; Own Create/Read/Update on Session, Notes, and Documents; Own Read on NPS Survey Responses.</w:t>
+      </w:r>
+    </w:p>
+    <w:p>
+      <w:pPr>
+        <w:numPr>
+          <w:ilvl w:val="0"/>
+          <w:numId w:val="1"/>
+        </w:numPr>
+        <w:spacing w:after="60"/>
+      </w:pPr>
+      <w:r>
+        <w:t xml:space="preserve">☐ Create the Board Member role with no access to individual client records. Configure access to aggregate reporting dashboards only.</w:t>
+      </w:r>
+    </w:p>
+    <w:p>
+      <w:pPr>
+        <w:numPr>
+          <w:ilvl w:val="0"/>
+          <w:numId w:val="1"/>
+        </w:numPr>
+        <w:spacing w:after="60"/>
+      </w:pPr>
+      <w:r>
+        <w:t xml:space="preserve">☐ Configure field-level access on EIN Number to restrict visibility to Admin and Primary Mentor roles only.</w:t>
+      </w:r>
+    </w:p>
+    <w:p>
+      <w:pPr>
+        <w:numPr>
+          <w:ilvl w:val="0"/>
+          <w:numId w:val="1"/>
+        </w:numPr>
+        <w:spacing w:after="60"/>
+      </w:pPr>
+      <w:r>
+        <w:t xml:space="preserve">☐ Configure Internal Only flag behavior on Note and Document entities to hide records from all non-Admin roles when flagged.</w:t>
+      </w:r>
+    </w:p>
+    <w:p>
+      <w:pPr>
+        <w:numPr>
+          <w:ilvl w:val="0"/>
+          <w:numId w:val="1"/>
+        </w:numPr>
+        <w:spacing w:after="60"/>
+      </w:pPr>
+      <w:r>
+        <w:t xml:space="preserve">☐ Configure Teams to enforce record-level visibility scoping — mentors see only records linked to their assigned Engagements.</w:t>
+      </w:r>
+    </w:p>
+    <w:p>
+      <w:pPr>
+        <w:numPr>
+          <w:ilvl w:val="0"/>
+          <w:numId w:val="1"/>
+        </w:numPr>
+        <w:spacing w:after="60"/>
+      </w:pPr>
+      <w:r>
+        <w:t xml:space="preserve">☐ Test each role by logging in as a test user and verifying correct visibility and action permissions across all entity types.</w:t>
+      </w:r>
+    </w:p>
+    <w:p>
+      <w:r>
+        <w:t xml:space="preserve"/>
+      </w:r>
+    </w:p>
+    <w:p>
+      <w:pPr>
+        <w:pStyle w:val="Heading2"/>
+      </w:pPr>
+      <w:r>
+        <w:t xml:space="preserve">6.11 Workflows and Automation</w:t>
+      </w:r>
+    </w:p>
+    <w:p>
+      <w:pPr>
+        <w:spacing w:after="120"/>
+      </w:pPr>
+      <w:r>
+        <w:t xml:space="preserve">Configure EspoCRM workflow rules to automate the processes defined in Section 4. Test each workflow in a development environment before enabling in production.</w:t>
+      </w:r>
+    </w:p>
+    <w:p>
+      <w:r>
+        <w:t xml:space="preserve"/>
+      </w:r>
+    </w:p>
+    <w:p>
+      <w:pPr>
+        <w:numPr>
+          <w:ilvl w:val="0"/>
+          <w:numId w:val="1"/>
+        </w:numPr>
+        <w:spacing w:after="60"/>
+      </w:pPr>
+      <w:r>
+        <w:t xml:space="preserve">☐ Configure intake workflow: on new Engagement record creation via REST API, set Status = Submitted and notify admin.</w:t>
+      </w:r>
+    </w:p>
+    <w:p>
+      <w:pPr>
+        <w:numPr>
+          <w:ilvl w:val="0"/>
+          <w:numId w:val="1"/>
+        </w:numPr>
+        <w:spacing w:after="60"/>
+      </w:pPr>
+      <w:r>
+        <w:t xml:space="preserve">☐ Configure mentor nomination workflow: on Engagement Status change to Pending Acceptance, send acceptance/refusal notification email to nominated mentor with configurable acceptance window (default 48 hours).</w:t>
+      </w:r>
+    </w:p>
+    <w:p>
+      <w:pPr>
+        <w:numPr>
+          <w:ilvl w:val="0"/>
+          <w:numId w:val="1"/>
+        </w:numPr>
+        <w:spacing w:after="60"/>
+      </w:pPr>
+      <w:r>
+        <w:t xml:space="preserve">☐ Configure mentor refusal workflow: on mentor refusal action, revert Engagement Status to Submitted and notify admin.</w:t>
+      </w:r>
+    </w:p>
+    <w:p>
+      <w:pPr>
+        <w:numPr>
+          <w:ilvl w:val="0"/>
+          <w:numId w:val="1"/>
+        </w:numPr>
+        <w:spacing w:after="60"/>
+      </w:pPr>
+      <w:r>
+        <w:t xml:space="preserve">☐ Configure acceptance window alert: if no mentor response within configured threshold, notify admin to follow up.</w:t>
+      </w:r>
+    </w:p>
+    <w:p>
+      <w:pPr>
+        <w:numPr>
+          <w:ilvl w:val="0"/>
+          <w:numId w:val="1"/>
+        </w:numPr>
+        <w:spacing w:after="60"/>
+      </w:pPr>
+      <w:r>
+        <w:t xml:space="preserve">☐ Configure first session workflow: on first Session record created against an Assigned Engagement, change Engagement Status to Active.</w:t>
+      </w:r>
+    </w:p>
+    <w:p>
+      <w:pPr>
+        <w:numPr>
+          <w:ilvl w:val="0"/>
+          <w:numId w:val="1"/>
+        </w:numPr>
+        <w:spacing w:after="60"/>
+      </w:pPr>
+      <w:r>
+        <w:t xml:space="preserve">☐ Configure inactivity monitoring workflow: daily check of Last Activity Date against cadence-aware Dormant threshold per Meeting Cadence setting. Change Status to Dormant and notify admin when threshold exceeded.</w:t>
+      </w:r>
+    </w:p>
+    <w:p>
+      <w:pPr>
+        <w:numPr>
+          <w:ilvl w:val="0"/>
+          <w:numId w:val="1"/>
+        </w:numPr>
+        <w:spacing w:after="60"/>
+      </w:pPr>
+      <w:r>
+        <w:t xml:space="preserve">☐ Configure Dormant-to-Inactive workflow: change Status to Inactive after configurable additional period (default 60 days) with no activity.</w:t>
+      </w:r>
+    </w:p>
+    <w:p>
+      <w:pPr>
+        <w:numPr>
+          <w:ilvl w:val="0"/>
+          <w:numId w:val="1"/>
+        </w:numPr>
+        <w:spacing w:after="60"/>
+      </w:pPr>
+      <w:r>
+        <w:t xml:space="preserve">☐ Configure Inactive-to-Abandoned workflow: change Status to Abandoned after configurable period (default 90 days). Trigger final NPS survey. Notify admin.</w:t>
+      </w:r>
+    </w:p>
+    <w:p>
+      <w:pPr>
+        <w:numPr>
+          <w:ilvl w:val="0"/>
+          <w:numId w:val="1"/>
+        </w:numPr>
+        <w:spacing w:after="60"/>
+      </w:pPr>
+      <w:r>
+        <w:t xml:space="preserve">☐ Configure NPS trigger workflow: after 2nd Session, trigger LimeSurvey API call to send survey to client. Repeat every 5 sessions thereafter.</w:t>
+      </w:r>
+    </w:p>
+    <w:p>
+      <w:pPr>
+        <w:numPr>
+          <w:ilvl w:val="0"/>
+          <w:numId w:val="1"/>
+        </w:numPr>
+        <w:spacing w:after="60"/>
+      </w:pPr>
+      <w:r>
+        <w:t xml:space="preserve">☐ Configure Engagement Close NPS trigger: on Status change to Completed or Abandoned, trigger final LimeSurvey API call.</w:t>
+      </w:r>
+    </w:p>
+    <w:p>
+      <w:pPr>
+        <w:numPr>
+          <w:ilvl w:val="0"/>
+          <w:numId w:val="1"/>
+        </w:numPr>
+        <w:spacing w:after="60"/>
+      </w:pPr>
+      <w:r>
+        <w:t xml:space="preserve">☐ Configure email auto-link workflow: automatically link inbound and outbound emails to the active Engagement when linked to a Contact with an active Engagement.</w:t>
+      </w:r>
+    </w:p>
+    <w:p>
+      <w:pPr>
+        <w:numPr>
+          <w:ilvl w:val="0"/>
+          <w:numId w:val="1"/>
+        </w:numPr>
+        <w:spacing w:after="60"/>
+      </w:pPr>
+      <w:r>
+        <w:t xml:space="preserve">☐ Set all configurable thresholds as admin-accessible system settings: acceptance window, Dormant thresholds per cadence, Inactive threshold, Abandoned threshold.</w:t>
+      </w:r>
+    </w:p>
+    <w:p>
+      <w:pPr>
+        <w:numPr>
+          <w:ilvl w:val="0"/>
+          <w:numId w:val="1"/>
+        </w:numPr>
+        <w:spacing w:after="60"/>
+      </w:pPr>
+      <w:r>
+        <w:t xml:space="preserve">☐ Test all workflows end-to-end in a development environment before enabling in production.</w:t>
+      </w:r>
+    </w:p>
+    <w:p>
+      <w:r>
+        <w:t xml:space="preserve"/>
+      </w:r>
+    </w:p>
+    <w:p>
+      <w:pPr>
+        <w:pStyle w:val="Heading2"/>
+      </w:pPr>
+      <w:r>
+        <w:t xml:space="preserve">6.12 Global Search Presets</w:t>
+      </w:r>
+    </w:p>
+    <w:p>
+      <w:pPr>
+        <w:spacing w:after="120"/>
+      </w:pPr>
+      <w:r>
+        <w:t xml:space="preserve">Configure global search presets for admin use across the client domain entities. These should be created as global presets visible to all users.</w:t>
+      </w:r>
+    </w:p>
+    <w:p>
+      <w:r>
+        <w:t xml:space="preserve"/>
+      </w:r>
+    </w:p>
+    <w:p>
+      <w:pPr>
+        <w:numPr>
+          <w:ilvl w:val="0"/>
+          <w:numId w:val="1"/>
+        </w:numPr>
+        <w:spacing w:after="60"/>
+      </w:pPr>
+      <w:r>
+        <w:t xml:space="preserve">☐ Create Engagement presets: Submitted Engagements, Pending Acceptance, Active Engagements, Dormant Engagements, Inactive Engagements, Abandoned Engagements, Completed Engagements.</w:t>
+      </w:r>
+    </w:p>
+    <w:p>
+      <w:pPr>
+        <w:numPr>
+          <w:ilvl w:val="0"/>
+          <w:numId w:val="1"/>
+        </w:numPr>
+        <w:spacing w:after="60"/>
+      </w:pPr>
+      <w:r>
+        <w:t xml:space="preserve">☐ Create Company presets: All Companies, Companies with Active Engagements, Companies with No Active Engagement.</w:t>
+      </w:r>
+    </w:p>
+    <w:p>
+      <w:pPr>
+        <w:numPr>
+          <w:ilvl w:val="0"/>
+          <w:numId w:val="1"/>
+        </w:numPr>
+        <w:spacing w:after="60"/>
+      </w:pPr>
+      <w:r>
+        <w:t xml:space="preserve">☐ Create Session presets: Sessions This Month, Sessions This Quarter.</w:t>
+      </w:r>
+    </w:p>
+    <w:p>
+      <w:pPr>
+        <w:numPr>
+          <w:ilvl w:val="0"/>
+          <w:numId w:val="1"/>
+        </w:numPr>
+        <w:spacing w:after="60"/>
+      </w:pPr>
+      <w:r>
+        <w:t xml:space="preserve">☐ Create NPS Survey Response presets: Recent NPS Responses, Low NPS Scores (0-6).</w:t>
+      </w:r>
+    </w:p>
+    <w:p>
+      <w:pPr>
+        <w:numPr>
+          <w:ilvl w:val="0"/>
+          <w:numId w:val="1"/>
+        </w:numPr>
+        <w:spacing w:after="60"/>
+      </w:pPr>
+      <w:r>
+        <w:t xml:space="preserve">☐ Create Note preset: My Notes (filtered by Created By = current user).</w:t>
+      </w:r>
+    </w:p>
+    <w:p>
+      <w:r>
+        <w:t xml:space="preserve"/>
+      </w:r>
+    </w:p>
+    <w:p>
+      <w:pPr>
+        <w:pStyle w:val="Heading2"/>
+      </w:pPr>
+      <w:r>
+        <w:t xml:space="preserve">6.13 Testing and Validation</w:t>
+      </w:r>
+    </w:p>
+    <w:p>
+      <w:pPr>
+        <w:spacing w:after="120"/>
+      </w:pPr>
+      <w:r>
+        <w:t xml:space="preserve">Complete end-to-end testing of the full client domain before go-live. Each test should be performed with a test user account in the appropriate role.</w:t>
+      </w:r>
+    </w:p>
+    <w:p>
+      <w:r>
+        <w:t xml:space="preserve"/>
+      </w:r>
+    </w:p>
+    <w:p>
+      <w:pPr>
+        <w:numPr>
+          <w:ilvl w:val="0"/>
+          <w:numId w:val="1"/>
+        </w:numPr>
+        <w:spacing w:after="60"/>
+      </w:pPr>
+      <w:r>
+        <w:t xml:space="preserve">☐ Submit a test Mentoring Request via the WordPress intake form and verify Company, Contact, and Engagement records are created correctly in EspoCRM.</w:t>
+      </w:r>
+    </w:p>
+    <w:p>
+      <w:pPr>
+        <w:numPr>
+          <w:ilvl w:val="0"/>
+          <w:numId w:val="1"/>
+        </w:numPr>
+        <w:spacing w:after="60"/>
+      </w:pPr>
+      <w:r>
+        <w:t xml:space="preserve">☐ Test mentor nomination workflow: nominate a mentor, verify notification sent, test acceptance path and refusal path.</w:t>
+      </w:r>
+    </w:p>
+    <w:p>
+      <w:pPr>
+        <w:numPr>
+          <w:ilvl w:val="0"/>
+          <w:numId w:val="1"/>
+        </w:numPr>
+        <w:spacing w:after="60"/>
+      </w:pPr>
+      <w:r>
+        <w:t xml:space="preserve">☐ Test Phase 2 form delivery and verify response data populates correct Company fields.</w:t>
+      </w:r>
+    </w:p>
+    <w:p>
+      <w:pPr>
+        <w:numPr>
+          <w:ilvl w:val="0"/>
+          <w:numId w:val="1"/>
+        </w:numPr>
+        <w:spacing w:after="60"/>
+      </w:pPr>
+      <w:r>
+        <w:t xml:space="preserve">☐ Log a test Session and verify Engagement roll-up fields update correctly (Total Sessions, Last Session Date, Total Session Hours, Total Sessions Last 30 Days).</w:t>
+      </w:r>
+    </w:p>
+    <w:p>
+      <w:pPr>
+        <w:numPr>
+          <w:ilvl w:val="0"/>
+          <w:numId w:val="1"/>
+        </w:numPr>
+        <w:spacing w:after="60"/>
+      </w:pPr>
+      <w:r>
+        <w:t xml:space="preserve">☐ Test NPS survey trigger at 2nd session: verify LimeSurvey sends survey and response posts back to EspoCRM as NPS Survey Response record.</w:t>
+      </w:r>
+    </w:p>
+    <w:p>
+      <w:pPr>
+        <w:numPr>
+          <w:ilvl w:val="0"/>
+          <w:numId w:val="1"/>
+        </w:numPr>
+        <w:spacing w:after="60"/>
+      </w:pPr>
+      <w:r>
+        <w:t xml:space="preserve">☐ Test inactivity monitoring by manually advancing dates and verifying Dormant, Inactive, and Abandoned status transitions fire correctly.</w:t>
+      </w:r>
+    </w:p>
+    <w:p>
+      <w:pPr>
+        <w:numPr>
+          <w:ilvl w:val="0"/>
+          <w:numId w:val="1"/>
+        </w:numPr>
+        <w:spacing w:after="60"/>
+      </w:pPr>
+      <w:r>
+        <w:t xml:space="preserve">☐ Test role-based access by logging in as each role and verifying correct record visibility, field visibility, and action permissions.</w:t>
+      </w:r>
+    </w:p>
+    <w:p>
+      <w:pPr>
+        <w:numPr>
+          <w:ilvl w:val="0"/>
+          <w:numId w:val="1"/>
+        </w:numPr>
+        <w:spacing w:after="60"/>
+      </w:pPr>
+      <w:r>
+        <w:t xml:space="preserve">☐ Test Internal Only Note and Document visibility: create an Internal Only record as Admin, verify it is hidden from Mentor role.</w:t>
+      </w:r>
+    </w:p>
+    <w:p>
+      <w:pPr>
+        <w:numPr>
+          <w:ilvl w:val="0"/>
+          <w:numId w:val="1"/>
+        </w:numPr>
+        <w:spacing w:after="60"/>
+      </w:pPr>
+      <w:r>
+        <w:t xml:space="preserve">☐ Test EIN Number field-level access: verify Co-Mentor and SME roles cannot see the field.</w:t>
+      </w:r>
+    </w:p>
+    <w:p>
+      <w:pPr>
+        <w:numPr>
+          <w:ilvl w:val="0"/>
+          <w:numId w:val="1"/>
+        </w:numPr>
+        <w:spacing w:after="60"/>
+      </w:pPr>
+      <w:r>
+        <w:t xml:space="preserve">☐ Test email auto-link workflow: send an email from mentor Gmail, verify it appears on both the Contact and Engagement activity streams.</w:t>
+      </w:r>
+    </w:p>
+    <w:p>
+      <w:pPr>
+        <w:numPr>
+          <w:ilvl w:val="0"/>
+          <w:numId w:val="1"/>
+        </w:numPr>
+        <w:spacing w:after="60"/>
+      </w:pPr>
+      <w:r>
+        <w:t xml:space="preserve">☐ Test global search presets: verify all presets return expected results.</w:t>
+      </w:r>
+    </w:p>
+    <w:p>
+      <w:pPr>
+        <w:numPr>
+          <w:ilvl w:val="0"/>
+          <w:numId w:val="1"/>
+        </w:numPr>
+        <w:spacing w:after="60"/>
+      </w:pPr>
+      <w:r>
+        <w:t xml:space="preserve">☐ Conduct a full end-to-end walkthrough of the client lifecycle from intake through engagement close with a test admin and test mentor account.</w:t>
+      </w:r>
+    </w:p>
+    <w:p>
+      <w:r>
+        <w:t xml:space="preserve"/>
+      </w:r>
+    </w:p>
+    <w:p>
+      <w:pPr>
+        <w:pStyle w:val="Heading1"/>
+      </w:pPr>
+      <w:r>
+        <w:t xml:space="preserve">7. Document Control</w:t>
       </w:r>
     </w:p>
     <w:tbl>
@@ -13579,7 +15434,7 @@
                 <w:sz w:val="20"/>
                 <w:szCs w:val="20"/>
               </w:rPr>
-              <w:t xml:space="preserve">1.0</w:t>
+              <w:t xml:space="preserve">1.1</w:t>
             </w:r>
           </w:p>
         </w:tc>

</xml_diff>

<commit_message>
Client PRD v1.2: Clarify mentor and admin can modify Phase 1 and Phase 2 fields at any time
</commit_message>
<xml_diff>
--- a/PRDs/CBM-PRD-CRM-Client.docx
+++ b/PRDs/CBM-PRD-CRM-Client.docx
@@ -46,7 +46,7 @@
           <w:sz w:val="22"/>
           <w:szCs w:val="22"/>
         </w:rPr>
-        <w:t xml:space="preserve">Version 1.1  |  In Progress  |  March 15, 2026</w:t>
+        <w:t xml:space="preserve">Version 1.2  |  In Progress  |  March 15, 2026</w:t>
       </w:r>
     </w:p>
     <w:p>
@@ -240,7 +240,7 @@
         <w:spacing w:after="120"/>
       </w:pPr>
       <w:r>
-        <w:t xml:space="preserve">The Company entity represents the business being mentored. It is the anchor record to which all Contacts, Engagements, and related activity are linked. Company data is collected in two phases: Phase 1 fields are captured on the public Mentoring Request intake form; Phase 2 fields are collected via a second form sent to the client after a mentor has been assigned.</w:t>
+        <w:t xml:space="preserve">The Company entity represents the business being mentored. It is the anchor record to which all Contacts, Engagements, and related activity are linked. Company data is collected in two phases: Phase 1 fields are captured on the public Mentoring Request intake form; Phase 2 fields are collected via a second form deployed at the mentor’s discretion. Both Phase 1 and Phase 2 fields may be viewed and modified at any time by the assigned mentor or any administrator directly within EspoCRM, regardless of how the data was originally collected.</w:t>
       </w:r>
     </w:p>
     <w:p>
@@ -15434,7 +15434,7 @@
                 <w:sz w:val="20"/>
                 <w:szCs w:val="20"/>
               </w:rPr>
-              <w:t xml:space="preserve">1.1</w:t>
+              <w:t xml:space="preserve">1.2</w:t>
             </w:r>
           </w:p>
         </w:tc>

</xml_diff>

<commit_message>
Client PRD v1.3: Add Next Session Date, Engagement Contacts panel, Section 4.8 Meeting Request, Section 4.9 Session Summary Email
</commit_message>
<xml_diff>
--- a/PRDs/CBM-PRD-CRM-Client.docx
+++ b/PRDs/CBM-PRD-CRM-Client.docx
@@ -46,7 +46,7 @@
           <w:sz w:val="22"/>
           <w:szCs w:val="22"/>
         </w:rPr>
-        <w:t xml:space="preserve">Version 1.2  |  In Progress  |  March 15, 2026</w:t>
+        <w:t xml:space="preserve">Version 1.3  |  In Progress  |  March 15, 2026</w:t>
       </w:r>
     </w:p>
     <w:p>
@@ -3719,6 +3719,122 @@
           </w:p>
         </w:tc>
       </w:tr>
+      <w:tr>
+        <w:tc>
+          <w:tcPr>
+            <w:tcW w:type="dxa" w:w="2500"/>
+            <w:tcBorders>
+              <w:top w:val="single" w:color="CCCCCC" w:sz="1"/>
+              <w:left w:val="single" w:color="CCCCCC" w:sz="1"/>
+              <w:bottom w:val="single" w:color="CCCCCC" w:sz="1"/>
+              <w:right w:val="single" w:color="CCCCCC" w:sz="1"/>
+            </w:tcBorders>
+            <w:shd w:fill="FFFFFF" w:val="clear"/>
+            <w:tcMar>
+              <w:top w:type="dxa" w:w="80"/>
+              <w:left w:type="dxa" w:w="120"/>
+              <w:bottom w:type="dxa" w:w="80"/>
+              <w:right w:type="dxa" w:w="120"/>
+            </w:tcMar>
+          </w:tcPr>
+          <w:p>
+            <w:r>
+              <w:rPr>
+                <w:rFonts w:ascii="Arial" w:cs="Arial" w:eastAsia="Arial" w:hAnsi="Arial"/>
+                <w:sz w:val="18"/>
+                <w:szCs w:val="18"/>
+              </w:rPr>
+              <w:t xml:space="preserve">Next Session Date/Time</w:t>
+            </w:r>
+          </w:p>
+        </w:tc>
+        <w:tc>
+          <w:tcPr>
+            <w:tcW w:type="dxa" w:w="6860"/>
+            <w:tcBorders>
+              <w:top w:val="single" w:color="CCCCCC" w:sz="1"/>
+              <w:left w:val="single" w:color="CCCCCC" w:sz="1"/>
+              <w:bottom w:val="single" w:color="CCCCCC" w:sz="1"/>
+              <w:right w:val="single" w:color="CCCCCC" w:sz="1"/>
+            </w:tcBorders>
+            <w:shd w:fill="FFFFFF" w:val="clear"/>
+            <w:tcMar>
+              <w:top w:type="dxa" w:w="80"/>
+              <w:left w:type="dxa" w:w="120"/>
+              <w:bottom w:type="dxa" w:w="80"/>
+              <w:right w:type="dxa" w:w="120"/>
+            </w:tcMar>
+          </w:tcPr>
+          <w:p>
+            <w:r>
+              <w:rPr>
+                <w:rFonts w:ascii="Arial" w:cs="Arial" w:eastAsia="Arial" w:hAnsi="Arial"/>
+                <w:sz w:val="18"/>
+                <w:szCs w:val="18"/>
+              </w:rPr>
+              <w:t xml:space="preserve">Scheduled date and time of the next mentor-client meeting. Date/time field. Initially system-populated from the most recently logged Session’s Next Session Date. Editable by the assigned mentor or admin at any time. When saved, automatically triggers a meeting request to all Engagement Contacts and assigned mentors (Primary Mentor, Co-Mentors, SMEs). Updating this field counts as a qualifying activity event that resets the inactivity monitoring clock. Optional.</w:t>
+            </w:r>
+          </w:p>
+        </w:tc>
+      </w:tr>
+      <w:tr>
+        <w:tc>
+          <w:tcPr>
+            <w:tcW w:type="dxa" w:w="2500"/>
+            <w:tcBorders>
+              <w:top w:val="single" w:color="CCCCCC" w:sz="1"/>
+              <w:left w:val="single" w:color="CCCCCC" w:sz="1"/>
+              <w:bottom w:val="single" w:color="CCCCCC" w:sz="1"/>
+              <w:right w:val="single" w:color="CCCCCC" w:sz="1"/>
+            </w:tcBorders>
+            <w:shd w:fill="F2F2F2" w:val="clear"/>
+            <w:tcMar>
+              <w:top w:type="dxa" w:w="80"/>
+              <w:left w:type="dxa" w:w="120"/>
+              <w:bottom w:type="dxa" w:w="80"/>
+              <w:right w:type="dxa" w:w="120"/>
+            </w:tcMar>
+          </w:tcPr>
+          <w:p>
+            <w:r>
+              <w:rPr>
+                <w:rFonts w:ascii="Arial" w:cs="Arial" w:eastAsia="Arial" w:hAnsi="Arial"/>
+                <w:sz w:val="18"/>
+                <w:szCs w:val="18"/>
+              </w:rPr>
+              <w:t xml:space="preserve">Engagement Contacts</w:t>
+            </w:r>
+          </w:p>
+        </w:tc>
+        <w:tc>
+          <w:tcPr>
+            <w:tcW w:type="dxa" w:w="6860"/>
+            <w:tcBorders>
+              <w:top w:val="single" w:color="CCCCCC" w:sz="1"/>
+              <w:left w:val="single" w:color="CCCCCC" w:sz="1"/>
+              <w:bottom w:val="single" w:color="CCCCCC" w:sz="1"/>
+              <w:right w:val="single" w:color="CCCCCC" w:sz="1"/>
+            </w:tcBorders>
+            <w:shd w:fill="F2F2F2" w:val="clear"/>
+            <w:tcMar>
+              <w:top w:type="dxa" w:w="80"/>
+              <w:left w:type="dxa" w:w="120"/>
+              <w:bottom w:type="dxa" w:w="80"/>
+              <w:right w:type="dxa" w:w="120"/>
+            </w:tcMar>
+          </w:tcPr>
+          <w:p>
+            <w:r>
+              <w:rPr>
+                <w:rFonts w:ascii="Arial" w:cs="Arial" w:eastAsia="Arial" w:hAnsi="Arial"/>
+                <w:sz w:val="18"/>
+                <w:szCs w:val="18"/>
+              </w:rPr>
+              <w:t xml:space="preserve">Many-to-many relationship panel listing the specific Contact records actively participating in this engagement. Set by the mentor at engagement setup and updated as needed. Determines who receives automated meeting requests and session summary emails. Optional — if empty, communications are sent to the Primary Contact on the linked Company record.</w:t>
+            </w:r>
+          </w:p>
+        </w:tc>
+      </w:tr>
     </w:tbl>
     <w:p>
       <w:r>
@@ -3738,7 +3854,7 @@
         <w:spacing w:after="120"/>
       </w:pPr>
       <w:r>
-        <w:t xml:space="preserve">The Session entity records each individual meeting between a mentor and client. Sessions are linked to an Engagement and drive both the roll-up analytics on the Engagement record and the NPS survey trigger logic. All note fields support rich text formatting.</w:t>
+        <w:t xml:space="preserve">The Session entity records each individual meeting between a mentor and client. Sessions are linked to an Engagement and drive both the roll-up analytics on the Engagement record and the NPS survey trigger logic. Mentors are encouraged to complete the session form while on the call with the client so that Next Session Date can be set in real time. All note fields support rich text formatting.</w:t>
       </w:r>
     </w:p>
     <w:p>
@@ -4409,6 +4525,64 @@
           </w:p>
         </w:tc>
       </w:tr>
+      <w:tr>
+        <w:tc>
+          <w:tcPr>
+            <w:tcW w:type="dxa" w:w="2500"/>
+            <w:tcBorders>
+              <w:top w:val="single" w:color="CCCCCC" w:sz="1"/>
+              <w:left w:val="single" w:color="CCCCCC" w:sz="1"/>
+              <w:bottom w:val="single" w:color="CCCCCC" w:sz="1"/>
+              <w:right w:val="single" w:color="CCCCCC" w:sz="1"/>
+            </w:tcBorders>
+            <w:shd w:fill="FFFFFF" w:val="clear"/>
+            <w:tcMar>
+              <w:top w:type="dxa" w:w="80"/>
+              <w:left w:type="dxa" w:w="120"/>
+              <w:bottom w:type="dxa" w:w="80"/>
+              <w:right w:type="dxa" w:w="120"/>
+            </w:tcMar>
+          </w:tcPr>
+          <w:p>
+            <w:r>
+              <w:rPr>
+                <w:rFonts w:ascii="Arial" w:cs="Arial" w:eastAsia="Arial" w:hAnsi="Arial"/>
+                <w:sz w:val="18"/>
+                <w:szCs w:val="18"/>
+              </w:rPr>
+              <w:t xml:space="preserve">Next Session Date/Time</w:t>
+            </w:r>
+          </w:p>
+        </w:tc>
+        <w:tc>
+          <w:tcPr>
+            <w:tcW w:type="dxa" w:w="6860"/>
+            <w:tcBorders>
+              <w:top w:val="single" w:color="CCCCCC" w:sz="1"/>
+              <w:left w:val="single" w:color="CCCCCC" w:sz="1"/>
+              <w:bottom w:val="single" w:color="CCCCCC" w:sz="1"/>
+              <w:right w:val="single" w:color="CCCCCC" w:sz="1"/>
+            </w:tcBorders>
+            <w:shd w:fill="FFFFFF" w:val="clear"/>
+            <w:tcMar>
+              <w:top w:type="dxa" w:w="80"/>
+              <w:left w:type="dxa" w:w="120"/>
+              <w:bottom w:type="dxa" w:w="80"/>
+              <w:right w:type="dxa" w:w="120"/>
+            </w:tcMar>
+          </w:tcPr>
+          <w:p>
+            <w:r>
+              <w:rPr>
+                <w:rFonts w:ascii="Arial" w:cs="Arial" w:eastAsia="Arial" w:hAnsi="Arial"/>
+                <w:sz w:val="18"/>
+                <w:szCs w:val="18"/>
+              </w:rPr>
+              <w:t xml:space="preserve">Scheduled date and time of the next meeting, set by the mentor while logging the current session. Date/time field. Optional. When saved, automatically populates the Next Session Date/Time field on the linked Engagement record. Intended to be set during the session while the mentor has the client on the call.</w:t>
+            </w:r>
+          </w:p>
+        </w:tc>
+      </w:tr>
     </w:tbl>
     <w:p>
       <w:r>
@@ -6642,7 +6816,64 @@
         <w:pStyle w:val="Heading2"/>
       </w:pPr>
       <w:r>
-        <w:t xml:space="preserve">3.8 Shared Platform Entity Relationships</w:t>
+        <w:t xml:space="preserve">3.9 Engagement → Engagement Contacts</w:t>
+      </w:r>
+    </w:p>
+    <w:p>
+      <w:pPr>
+        <w:spacing w:after="120"/>
+      </w:pPr>
+      <w:r>
+        <w:t xml:space="preserve">Relationship type: Many-to-Many. An Engagement may have many participating Contacts; a Contact may participate in multiple Engagements.</w:t>
+      </w:r>
+    </w:p>
+    <w:p>
+      <w:pPr>
+        <w:numPr>
+          <w:ilvl w:val="0"/>
+          <w:numId w:val="1"/>
+        </w:numPr>
+        <w:spacing w:after="60"/>
+      </w:pPr>
+      <w:r>
+        <w:t xml:space="preserve">The Engagement Contacts panel lists the specific individuals from the client business who are actively participating in the engagement. It is set by the mentor at the time the engagement is assigned and updated as needed.</w:t>
+      </w:r>
+    </w:p>
+    <w:p>
+      <w:pPr>
+        <w:numPr>
+          <w:ilvl w:val="0"/>
+          <w:numId w:val="1"/>
+        </w:numPr>
+        <w:spacing w:after="60"/>
+      </w:pPr>
+      <w:r>
+        <w:t xml:space="preserve">Engagement Contacts determine who receives automated meeting requests when Next Session Date/Time is saved on the Engagement, and who receives session summary emails drafted by the mentor.</w:t>
+      </w:r>
+    </w:p>
+    <w:p>
+      <w:pPr>
+        <w:numPr>
+          <w:ilvl w:val="0"/>
+          <w:numId w:val="1"/>
+        </w:numPr>
+        <w:spacing w:after="60"/>
+      </w:pPr>
+      <w:r>
+        <w:t xml:space="preserve">If the Engagement Contacts panel is empty, automated communications default to the Primary Contact on the linked Company record.</w:t>
+      </w:r>
+    </w:p>
+    <w:p>
+      <w:r>
+        <w:t xml:space="preserve"/>
+      </w:r>
+    </w:p>
+    <w:p>
+      <w:pPr>
+        <w:pStyle w:val="Heading2"/>
+      </w:pPr>
+      <w:r>
+        <w:t xml:space="preserve">3.9 Shared Platform Entity Relationships</w:t>
       </w:r>
     </w:p>
     <w:p>
@@ -7054,7 +7285,7 @@
         <w:spacing w:after="60"/>
       </w:pPr>
       <w:r>
-        <w:t xml:space="preserve">Session fields completed: Date/Time, Duration, Session Type, Meeting Location Type and Details (if in-person), Topics Covered, Mentor Notes, Next Steps, and New Business Started flag.</w:t>
+        <w:t xml:space="preserve">Session fields completed: Date/Time, Duration, Session Type, Meeting Location Type and Details (if in-person), Topics Covered, Mentor Notes, Next Steps, New Business Started flag, and Next Session Date/Time. Mentors are encouraged to set the Next Session Date/Time while on the call with the client.</w:t>
       </w:r>
     </w:p>
     <w:p>
@@ -7091,6 +7322,18 @@
       </w:pPr>
       <w:r>
         <w:t xml:space="preserve">Inactivity monitoring clock resets — the new session date is recognized as the most recent activity event.</w:t>
+      </w:r>
+    </w:p>
+    <w:p>
+      <w:pPr>
+        <w:numPr>
+          <w:ilvl w:val="0"/>
+          <w:numId w:val="2"/>
+        </w:numPr>
+        <w:spacing w:after="60"/>
+      </w:pPr>
+      <w:r>
+        <w:t xml:space="preserve">If Next Session Date/Time was set on the Session form, the Engagement’s Next Session Date/Time field is automatically updated and a meeting request is sent to all Engagement Contacts and assigned mentors (Primary Mentor, Co-Mentors, SMEs). See Section 4.8 for meeting request workflow details.</w:t>
       </w:r>
     </w:p>
     <w:p>
@@ -7781,6 +8024,156 @@
       </w:pPr>
       <w:r>
         <w:t xml:space="preserve">No data purging or anonymization process is required at this time. If CBM becomes subject to data retention or privacy regulations in the future, this policy must be revisited.</w:t>
+      </w:r>
+    </w:p>
+    <w:p>
+      <w:r>
+        <w:t xml:space="preserve"/>
+      </w:r>
+    </w:p>
+    <w:p>
+      <w:pPr>
+        <w:pStyle w:val="Heading2"/>
+      </w:pPr>
+      <w:r>
+        <w:t xml:space="preserve">4.8 Meeting Request</w:t>
+      </w:r>
+    </w:p>
+    <w:p>
+      <w:pPr>
+        <w:spacing w:after="120"/>
+      </w:pPr>
+      <w:r>
+        <w:t xml:space="preserve">A meeting request is sent automatically whenever the Next Session Date/Time field is saved on the Engagement record — whether set via the Session form or edited directly by the mentor or admin on the Engagement.</w:t>
+      </w:r>
+    </w:p>
+    <w:p>
+      <w:pPr>
+        <w:numPr>
+          <w:ilvl w:val="0"/>
+          <w:numId w:val="2"/>
+        </w:numPr>
+        <w:spacing w:after="60"/>
+      </w:pPr>
+      <w:r>
+        <w:t xml:space="preserve">Mentor or admin saves the Engagement record with a Next Session Date/Time value (new or updated).</w:t>
+      </w:r>
+    </w:p>
+    <w:p>
+      <w:pPr>
+        <w:numPr>
+          <w:ilvl w:val="0"/>
+          <w:numId w:val="2"/>
+        </w:numPr>
+        <w:spacing w:after="60"/>
+      </w:pPr>
+      <w:r>
+        <w:t xml:space="preserve">System generates a calendar meeting request for the scheduled date and time.</w:t>
+      </w:r>
+    </w:p>
+    <w:p>
+      <w:pPr>
+        <w:numPr>
+          <w:ilvl w:val="0"/>
+          <w:numId w:val="2"/>
+        </w:numPr>
+        <w:spacing w:after="60"/>
+      </w:pPr>
+      <w:r>
+        <w:t xml:space="preserve">Meeting request is sent to: all Contacts in the Engagement Contacts panel (or the Primary Contact if the panel is empty), the assigned Primary Mentor, all Co-Mentors, and all SMEs assigned to the Engagement.</w:t>
+      </w:r>
+    </w:p>
+    <w:p>
+      <w:pPr>
+        <w:numPr>
+          <w:ilvl w:val="0"/>
+          <w:numId w:val="2"/>
+        </w:numPr>
+        <w:spacing w:after="60"/>
+      </w:pPr>
+      <w:r>
+        <w:t xml:space="preserve">Saving a new Next Session Date/Time resets the inactivity monitoring clock, treating the scheduled meeting as a qualifying activity event.</w:t>
+      </w:r>
+    </w:p>
+    <w:p>
+      <w:r>
+        <w:t xml:space="preserve"/>
+      </w:r>
+    </w:p>
+    <w:p>
+      <w:pPr>
+        <w:pStyle w:val="Heading2"/>
+      </w:pPr>
+      <w:r>
+        <w:t xml:space="preserve">4.9 Session Summary Email</w:t>
+      </w:r>
+    </w:p>
+    <w:p>
+      <w:pPr>
+        <w:spacing w:after="120"/>
+      </w:pPr>
+      <w:r>
+        <w:t xml:space="preserve">After logging a session, the mentor may send a summary email to the client recapping what was discussed and confirming next steps. The system drafts the email automatically from session data; the mentor reviews and approves before it is sent.</w:t>
+      </w:r>
+    </w:p>
+    <w:p>
+      <w:pPr>
+        <w:numPr>
+          <w:ilvl w:val="0"/>
+          <w:numId w:val="2"/>
+        </w:numPr>
+        <w:spacing w:after="60"/>
+      </w:pPr>
+      <w:r>
+        <w:t xml:space="preserve">Mentor saves the Session record.</w:t>
+      </w:r>
+    </w:p>
+    <w:p>
+      <w:pPr>
+        <w:numPr>
+          <w:ilvl w:val="0"/>
+          <w:numId w:val="2"/>
+        </w:numPr>
+        <w:spacing w:after="60"/>
+      </w:pPr>
+      <w:r>
+        <w:t xml:space="preserve">System generates a draft summary email populated from: Topics Covered, Next Steps, and Next Session Date/Time from the Session record.</w:t>
+      </w:r>
+    </w:p>
+    <w:p>
+      <w:pPr>
+        <w:numPr>
+          <w:ilvl w:val="0"/>
+          <w:numId w:val="2"/>
+        </w:numPr>
+        <w:spacing w:after="60"/>
+      </w:pPr>
+      <w:r>
+        <w:t xml:space="preserve">Draft email is presented to the mentor for review and editing within EspoCRM before sending.</w:t>
+      </w:r>
+    </w:p>
+    <w:p>
+      <w:pPr>
+        <w:numPr>
+          <w:ilvl w:val="0"/>
+          <w:numId w:val="2"/>
+        </w:numPr>
+        <w:spacing w:after="60"/>
+      </w:pPr>
+      <w:r>
+        <w:t xml:space="preserve">Mentor approves and sends the email. Recipients are the Engagement Contacts panel (or Primary Contact if empty).</w:t>
+      </w:r>
+    </w:p>
+    <w:p>
+      <w:pPr>
+        <w:numPr>
+          <w:ilvl w:val="0"/>
+          <w:numId w:val="2"/>
+        </w:numPr>
+        <w:spacing w:after="60"/>
+      </w:pPr>
+      <w:r>
+        <w:t xml:space="preserve">Sent email is automatically linked to the Engagement record and the relevant Contact records in the activity stream.</w:t>
       </w:r>
     </w:p>
     <w:p>
@@ -13956,6 +14349,18 @@
         <w:spacing w:after="60"/>
       </w:pPr>
       <w:r>
+        <w:t xml:space="preserve">☐ Add Next Session Date/Time field (date/time). Configure as editable by mentor and admin. Configure formula to auto-populate from the most recently logged Session’s Next Session Date/Time field.</w:t>
+      </w:r>
+    </w:p>
+    <w:p>
+      <w:pPr>
+        <w:numPr>
+          <w:ilvl w:val="0"/>
+          <w:numId w:val="1"/>
+        </w:numPr>
+        <w:spacing w:after="60"/>
+      </w:pPr>
+      <w:r>
         <w:t xml:space="preserve">☐ Organize Engagement detail view panels: Engagement Details, Mentor Assignment, Analytics Summary.</w:t>
       </w:r>
     </w:p>
@@ -13968,6 +14373,18 @@
         <w:spacing w:after="60"/>
       </w:pPr>
       <w:r>
+        <w:t xml:space="preserve">☐ Configure Engagement Contacts as a many-to-many relationship panel on the Engagement entity, linking to the Contact entity.</w:t>
+      </w:r>
+    </w:p>
+    <w:p>
+      <w:pPr>
+        <w:numPr>
+          <w:ilvl w:val="0"/>
+          <w:numId w:val="1"/>
+        </w:numPr>
+        <w:spacing w:after="60"/>
+      </w:pPr>
+      <w:r>
         <w:t xml:space="preserve">☐ Add Note, Document, Email, and Calls relationship panels to the Engagement detail view.</w:t>
       </w:r>
     </w:p>
@@ -14710,6 +15127,18 @@
         <w:spacing w:after="60"/>
       </w:pPr>
       <w:r>
+        <w:t xml:space="preserve">☐ Configure Engagement → Engagement Contacts many-to-many relationship panel. Add Engagement Contacts panel to Engagement detail view. Verify Contact records show linked Engagements.</w:t>
+      </w:r>
+    </w:p>
+    <w:p>
+      <w:pPr>
+        <w:numPr>
+          <w:ilvl w:val="0"/>
+          <w:numId w:val="1"/>
+        </w:numPr>
+        <w:spacing w:after="60"/>
+      </w:pPr>
+      <w:r>
         <w:t xml:space="preserve">☐ Verify Email and Calls activity panels are present on Company, Contact, and Engagement detail views.</w:t>
       </w:r>
     </w:p>
@@ -15003,6 +15432,30 @@
       </w:pPr>
       <w:r>
         <w:t xml:space="preserve">☐ Configure email auto-link workflow: automatically link inbound and outbound emails to the active Engagement when linked to a Contact with an active Engagement.</w:t>
+      </w:r>
+    </w:p>
+    <w:p>
+      <w:pPr>
+        <w:numPr>
+          <w:ilvl w:val="0"/>
+          <w:numId w:val="1"/>
+        </w:numPr>
+        <w:spacing w:after="60"/>
+      </w:pPr>
+      <w:r>
+        <w:t xml:space="preserve">☐ Configure meeting request workflow: when Next Session Date/Time is saved on the Engagement record (new or updated value), automatically send a calendar meeting request to all Engagement Contacts (or Primary Contact if panel is empty) and all assigned mentors (Primary Mentor, Co-Mentors, SMEs).</w:t>
+      </w:r>
+    </w:p>
+    <w:p>
+      <w:pPr>
+        <w:numPr>
+          <w:ilvl w:val="0"/>
+          <w:numId w:val="1"/>
+        </w:numPr>
+        <w:spacing w:after="60"/>
+      </w:pPr>
+      <w:r>
+        <w:t xml:space="preserve">☐ Configure session summary email draft workflow: when a Session record is saved, auto-generate a draft summary email from Topics Covered, Next Steps, and Next Session Date/Time, presented to the mentor for review and approval before sending. Configure recipients as Engagement Contacts (or Primary Contact if empty).</w:t>
       </w:r>
     </w:p>
     <w:p>
@@ -15434,7 +15887,7 @@
                 <w:sz w:val="20"/>
                 <w:szCs w:val="20"/>
               </w:rPr>
-              <w:t xml:space="preserve">1.2</w:t>
+              <w:t xml:space="preserve">1.3</w:t>
             </w:r>
           </w:p>
         </w:tc>

</xml_diff>

<commit_message>
CBM-PRD-CRM-Client v1.4 - Add Company Role field
</commit_message>
<xml_diff>
--- a/PRDs/CBM-PRD-CRM-Client.docx
+++ b/PRDs/CBM-PRD-CRM-Client.docx
@@ -46,7 +46,7 @@
           <w:sz w:val="22"/>
           <w:szCs w:val="22"/>
         </w:rPr>
-        <w:t xml:space="preserve">Version 1.5  |  In Progress  |  March 15, 2026</w:t>
+        <w:t xml:space="preserve">Version 1.4  |  In Progress  |  March 18, 2026</w:t>
       </w:r>
     </w:p>
     <w:p>
@@ -899,6 +899,64 @@
                 <w:sz w:val="18"/>
                 <w:szCs w:val="18"/>
               </w:rPr>
+              <w:t xml:space="preserve">Company Role</w:t>
+            </w:r>
+          </w:p>
+        </w:tc>
+        <w:tc>
+          <w:tcPr>
+            <w:tcW w:type="dxa" w:w="6860"/>
+            <w:tcBorders>
+              <w:top w:val="single" w:color="CCCCCC" w:sz="1"/>
+              <w:left w:val="single" w:color="CCCCCC" w:sz="1"/>
+              <w:bottom w:val="single" w:color="CCCCCC" w:sz="1"/>
+              <w:right w:val="single" w:color="CCCCCC" w:sz="1"/>
+            </w:tcBorders>
+            <w:shd w:fill="FFFFFF" w:val="clear"/>
+            <w:tcMar>
+              <w:top w:type="dxa" w:w="80"/>
+              <w:left w:type="dxa" w:w="120"/>
+              <w:bottom w:type="dxa" w:w="80"/>
+              <w:right w:type="dxa" w:w="120"/>
+            </w:tcMar>
+          </w:tcPr>
+          <w:p>
+            <w:r>
+              <w:rPr>
+                <w:rFonts w:ascii="Arial" w:cs="Arial" w:eastAsia="Arial" w:hAnsi="Arial"/>
+                <w:sz w:val="18"/>
+                <w:szCs w:val="18"/>
+              </w:rPr>
+              <w:t xml:space="preserve">Dropdown. Values: Client Company | Mentoring Company | Partner Company | Sponsor Company | Vendor Company. Required. Identifies the company’s relationship to CBM. Cleveland Business Mentors is configured as Mentoring Company. Other mentoring organizations partnering with CBM would also use this value.</w:t>
+            </w:r>
+          </w:p>
+        </w:tc>
+      </w:tr>
+      <w:tr>
+        <w:tc>
+          <w:tcPr>
+            <w:tcW w:type="dxa" w:w="2500"/>
+            <w:tcBorders>
+              <w:top w:val="single" w:color="CCCCCC" w:sz="1"/>
+              <w:left w:val="single" w:color="CCCCCC" w:sz="1"/>
+              <w:bottom w:val="single" w:color="CCCCCC" w:sz="1"/>
+              <w:right w:val="single" w:color="CCCCCC" w:sz="1"/>
+            </w:tcBorders>
+            <w:shd w:fill="F2F2F2" w:val="clear"/>
+            <w:tcMar>
+              <w:top w:type="dxa" w:w="80"/>
+              <w:left w:type="dxa" w:w="120"/>
+              <w:bottom w:type="dxa" w:w="80"/>
+              <w:right w:type="dxa" w:w="120"/>
+            </w:tcMar>
+          </w:tcPr>
+          <w:p>
+            <w:r>
+              <w:rPr>
+                <w:rFonts w:ascii="Arial" w:cs="Arial" w:eastAsia="Arial" w:hAnsi="Arial"/>
+                <w:sz w:val="18"/>
+                <w:szCs w:val="18"/>
+              </w:rPr>
               <w:t xml:space="preserve">Business Stage</w:t>
             </w:r>
           </w:p>
@@ -3744,64 +3802,6 @@
                 <w:sz w:val="18"/>
                 <w:szCs w:val="18"/>
               </w:rPr>
-              <w:t xml:space="preserve">Status</w:t>
-            </w:r>
-          </w:p>
-        </w:tc>
-        <w:tc>
-          <w:tcPr>
-            <w:tcW w:type="dxa" w:w="6860"/>
-            <w:tcBorders>
-              <w:top w:val="single" w:color="CCCCCC" w:sz="1"/>
-              <w:left w:val="single" w:color="CCCCCC" w:sz="1"/>
-              <w:bottom w:val="single" w:color="CCCCCC" w:sz="1"/>
-              <w:right w:val="single" w:color="CCCCCC" w:sz="1"/>
-            </w:tcBorders>
-            <w:shd w:fill="F2F2F2" w:val="clear"/>
-            <w:tcMar>
-              <w:top w:type="dxa" w:w="80"/>
-              <w:left w:type="dxa" w:w="120"/>
-              <w:bottom w:type="dxa" w:w="80"/>
-              <w:right w:type="dxa" w:w="120"/>
-            </w:tcMar>
-          </w:tcPr>
-          <w:p>
-            <w:r>
-              <w:rPr>
-                <w:rFonts w:ascii="Arial" w:cs="Arial" w:eastAsia="Arial" w:hAnsi="Arial"/>
-                <w:sz w:val="18"/>
-                <w:szCs w:val="18"/>
-              </w:rPr>
-              <w:t xml:space="preserve">Current state of the session. Dropdown. Values: Scheduled | Completed | Missed | Cancelled. Required. Defaults to Scheduled when a future session is created. Set to Completed by the mentor after a session occurs. Set to Missed or Cancelled manually by the mentor as appropriate. Only Completed sessions count toward Engagement roll-up analytics and NPS trigger logic.</w:t>
-            </w:r>
-          </w:p>
-        </w:tc>
-      </w:tr>
-      <w:tr>
-        <w:tc>
-          <w:tcPr>
-            <w:tcW w:type="dxa" w:w="2500"/>
-            <w:tcBorders>
-              <w:top w:val="single" w:color="CCCCCC" w:sz="1"/>
-              <w:left w:val="single" w:color="CCCCCC" w:sz="1"/>
-              <w:bottom w:val="single" w:color="CCCCCC" w:sz="1"/>
-              <w:right w:val="single" w:color="CCCCCC" w:sz="1"/>
-            </w:tcBorders>
-            <w:shd w:fill="FFFFFF" w:val="clear"/>
-            <w:tcMar>
-              <w:top w:type="dxa" w:w="80"/>
-              <w:left w:type="dxa" w:w="120"/>
-              <w:bottom w:type="dxa" w:w="80"/>
-              <w:right w:type="dxa" w:w="120"/>
-            </w:tcMar>
-          </w:tcPr>
-          <w:p>
-            <w:r>
-              <w:rPr>
-                <w:rFonts w:ascii="Arial" w:cs="Arial" w:eastAsia="Arial" w:hAnsi="Arial"/>
-                <w:sz w:val="18"/>
-                <w:szCs w:val="18"/>
-              </w:rPr>
               <w:t xml:space="preserve">Next Session Date/Time</w:t>
             </w:r>
           </w:p>
@@ -4608,64 +4608,6 @@
                 <w:sz w:val="18"/>
                 <w:szCs w:val="18"/>
               </w:rPr>
-              <w:t xml:space="preserve">Status</w:t>
-            </w:r>
-          </w:p>
-        </w:tc>
-        <w:tc>
-          <w:tcPr>
-            <w:tcW w:type="dxa" w:w="6860"/>
-            <w:tcBorders>
-              <w:top w:val="single" w:color="CCCCCC" w:sz="1"/>
-              <w:left w:val="single" w:color="CCCCCC" w:sz="1"/>
-              <w:bottom w:val="single" w:color="CCCCCC" w:sz="1"/>
-              <w:right w:val="single" w:color="CCCCCC" w:sz="1"/>
-            </w:tcBorders>
-            <w:shd w:fill="F2F2F2" w:val="clear"/>
-            <w:tcMar>
-              <w:top w:type="dxa" w:w="80"/>
-              <w:left w:type="dxa" w:w="120"/>
-              <w:bottom w:type="dxa" w:w="80"/>
-              <w:right w:type="dxa" w:w="120"/>
-            </w:tcMar>
-          </w:tcPr>
-          <w:p>
-            <w:r>
-              <w:rPr>
-                <w:rFonts w:ascii="Arial" w:cs="Arial" w:eastAsia="Arial" w:hAnsi="Arial"/>
-                <w:sz w:val="18"/>
-                <w:szCs w:val="18"/>
-              </w:rPr>
-              <w:t xml:space="preserve">Current state of the session. Dropdown. Values: Scheduled | Completed | Missed | Cancelled. Required. Defaults to Scheduled when a future session is created. Set to Completed by the mentor after a session occurs. Set to Missed or Cancelled manually by the mentor as appropriate. Only Completed sessions count toward Engagement roll-up analytics and NPS trigger logic.</w:t>
-            </w:r>
-          </w:p>
-        </w:tc>
-      </w:tr>
-      <w:tr>
-        <w:tc>
-          <w:tcPr>
-            <w:tcW w:type="dxa" w:w="2500"/>
-            <w:tcBorders>
-              <w:top w:val="single" w:color="CCCCCC" w:sz="1"/>
-              <w:left w:val="single" w:color="CCCCCC" w:sz="1"/>
-              <w:bottom w:val="single" w:color="CCCCCC" w:sz="1"/>
-              <w:right w:val="single" w:color="CCCCCC" w:sz="1"/>
-            </w:tcBorders>
-            <w:shd w:fill="FFFFFF" w:val="clear"/>
-            <w:tcMar>
-              <w:top w:type="dxa" w:w="80"/>
-              <w:left w:type="dxa" w:w="120"/>
-              <w:bottom w:type="dxa" w:w="80"/>
-              <w:right w:type="dxa" w:w="120"/>
-            </w:tcMar>
-          </w:tcPr>
-          <w:p>
-            <w:r>
-              <w:rPr>
-                <w:rFonts w:ascii="Arial" w:cs="Arial" w:eastAsia="Arial" w:hAnsi="Arial"/>
-                <w:sz w:val="18"/>
-                <w:szCs w:val="18"/>
-              </w:rPr>
               <w:t xml:space="preserve">Next Session Date/Time</w:t>
             </w:r>
           </w:p>
@@ -7133,7 +7075,7 @@
         <w:spacing w:after="60"/>
       </w:pPr>
       <w:r>
-        <w:t xml:space="preserve">Admin reviews new submissions by selecting the “New Client Submissions” global search preset on the Engagement entity, which displays all Engagement records with a status of Submitted.</w:t>
+        <w:t xml:space="preserve">Admin receives an automatic system notification of the new submission.</w:t>
       </w:r>
     </w:p>
     <w:p>
@@ -7364,7 +7306,7 @@
         <w:pStyle w:val="Heading2"/>
       </w:pPr>
       <w:r>
-        <w:t xml:space="preserve">4.3 Session Processes</w:t>
+        <w:t xml:space="preserve">4.3 Session Logging</w:t>
       </w:r>
     </w:p>
     <w:p>
@@ -7372,7 +7314,7 @@
         <w:spacing w:after="120"/>
       </w:pPr>
       <w:r>
-        <w:t xml:space="preserve">This section covers all session-related processes: scheduling sessions in advance, automated session reminders, logging completed sessions, and handling missed sessions.</w:t>
+        <w:t xml:space="preserve">Sessions are logged by the assigned mentor, co-mentor, or SME after each meeting with the client. There is no admin review or approval of session records.</w:t>
       </w:r>
     </w:p>
     <w:p>
@@ -7382,27 +7324,6 @@
     </w:p>
     <w:p>
       <w:pPr>
-        <w:pStyle w:val="Heading3"/>
-      </w:pPr>
-      <w:r>
-        <w:t xml:space="preserve">4.3.1 Scheduling a Session</w:t>
-      </w:r>
-    </w:p>
-    <w:p>
-      <w:pPr>
-        <w:spacing w:after="120"/>
-      </w:pPr>
-      <w:r>
-        <w:t xml:space="preserve">Sessions may be created in advance as Scheduled records before the meeting occurs. This is the preferred approach as it enables automated reminders to be sent to all participants before the session.</w:t>
-      </w:r>
-    </w:p>
-    <w:p>
-      <w:r>
-        <w:t xml:space="preserve"/>
-      </w:r>
-    </w:p>
-    <w:p>
-      <w:pPr>
         <w:numPr>
           <w:ilvl w:val="0"/>
           <w:numId w:val="2"/>
@@ -7410,7 +7331,7 @@
         <w:spacing w:after="60"/>
       </w:pPr>
       <w:r>
-        <w:t xml:space="preserve">Mentor navigates to the Engagement record and creates a new Session record.</w:t>
+        <w:t xml:space="preserve">Mentor, co-mentor, or SME navigates to the Engagement record in EspoCRM and creates a new Session record.</w:t>
       </w:r>
     </w:p>
     <w:p>
@@ -7422,7 +7343,7 @@
         <w:spacing w:after="60"/>
       </w:pPr>
       <w:r>
-        <w:t xml:space="preserve">Session Status is set to Scheduled. Session Date/Time, Session Type, and Meeting Location details are populated. Other fields (Topics, Notes, etc.) may be left blank until after the session occurs.</w:t>
+        <w:t xml:space="preserve">Session fields completed: Date/Time, Duration, Session Type, Meeting Location Type and Details (if in-person), Topics Covered, Mentor Notes, Next Steps, New Business Started flag, and Next Session Date/Time. Mentors are encouraged to set the Next Session Date/Time while on the call with the client.</w:t>
       </w:r>
     </w:p>
     <w:p>
@@ -7446,7 +7367,7 @@
         <w:spacing w:after="60"/>
       </w:pPr>
       <w:r>
-        <w:t xml:space="preserve">System automatically sends a meeting request to all Engagement Contacts and assigned mentors (Primary Mentor, Co-Mentors, SMEs) via the Next Session Date/Time workflow (see Section 4.8).</w:t>
+        <w:t xml:space="preserve">Engagement roll-up fields update automatically: Total Sessions, Total Sessions (Last 30 Days), Last Session Date, and Total Session Hours are recalculated.</w:t>
       </w:r>
     </w:p>
     <w:p>
@@ -7458,114 +7379,7 @@
         <w:spacing w:after="60"/>
       </w:pPr>
       <w:r>
-        <w:t xml:space="preserve">Automated reminders are sent to all Engagement Contacts and assigned mentors 24 hours and 1 hour before the session via both email and SMS (Twilio). See Section 4.3.2 for reminder workflow details.</w:t>
-      </w:r>
-    </w:p>
-    <w:p>
-      <w:r>
-        <w:t xml:space="preserve"/>
-      </w:r>
-    </w:p>
-    <w:p>
-      <w:pPr>
-        <w:pStyle w:val="Heading3"/>
-      </w:pPr>
-      <w:r>
-        <w:t xml:space="preserve">4.3.2 Session Reminders</w:t>
-      </w:r>
-    </w:p>
-    <w:p>
-      <w:pPr>
-        <w:spacing w:after="120"/>
-      </w:pPr>
-      <w:r>
-        <w:t xml:space="preserve">Automated reminders are sent to all participants before any Scheduled session. Reminders are delivered via both email (EspoCRM native) and SMS (Twilio). Reminders are only sent for sessions with Status = Scheduled.</w:t>
-      </w:r>
-    </w:p>
-    <w:p>
-      <w:r>
-        <w:t xml:space="preserve"/>
-      </w:r>
-    </w:p>
-    <w:p>
-      <w:pPr>
-        <w:numPr>
-          <w:ilvl w:val="0"/>
-          <w:numId w:val="1"/>
-        </w:numPr>
-        <w:spacing w:after="60"/>
-      </w:pPr>
-      <w:r>
-        <w:t xml:space="preserve">24-hour reminder — sent to all Engagement Contacts and assigned mentors 24 hours before the scheduled Session Date/Time.</w:t>
-      </w:r>
-    </w:p>
-    <w:p>
-      <w:pPr>
-        <w:numPr>
-          <w:ilvl w:val="0"/>
-          <w:numId w:val="1"/>
-        </w:numPr>
-        <w:spacing w:after="60"/>
-      </w:pPr>
-      <w:r>
-        <w:t xml:space="preserve">1-hour reminder — sent to all Engagement Contacts and assigned mentors 1 hour before the scheduled Session Date/Time.</w:t>
-      </w:r>
-    </w:p>
-    <w:p>
-      <w:r>
-        <w:t xml:space="preserve"/>
-      </w:r>
-    </w:p>
-    <w:p>
-      <w:pPr>
-        <w:spacing w:after="120"/>
-      </w:pPr>
-      <w:r>
-        <w:t xml:space="preserve">Reminder content includes: session date/time, session type, meeting link (if Video Call), and meeting location (if In-Person).</w:t>
-      </w:r>
-    </w:p>
-    <w:p>
-      <w:r>
-        <w:t xml:space="preserve"/>
-      </w:r>
-    </w:p>
-    <w:p>
-      <w:pPr>
-        <w:spacing w:after="120"/>
-      </w:pPr>
-      <w:r>
-        <w:rPr>
-          <w:i/>
-          <w:iCs/>
-          <w:color w:val="888888"/>
-        </w:rPr>
-        <w:t xml:space="preserve">Note: SMS delivery requires Twilio integration (see Section 6.11). Phone numbers must be present on all Contact and mentor Contact records for SMS reminders to be delivered. If no phone number is on file, the reminder falls back to email only.</w:t>
-      </w:r>
-    </w:p>
-    <w:p>
-      <w:r>
-        <w:t xml:space="preserve"/>
-      </w:r>
-    </w:p>
-    <w:p>
-      <w:pPr>
-        <w:pStyle w:val="Heading3"/>
-      </w:pPr>
-      <w:r>
-        <w:t xml:space="preserve">4.3.3 Logging a Completed Session</w:t>
-      </w:r>
-    </w:p>
-    <w:p>
-      <w:pPr>
-        <w:spacing w:after="120"/>
-      </w:pPr>
-      <w:r>
-        <w:t xml:space="preserve">After a session occurs, the mentor updates the Session record with all relevant details and changes the status to Completed. This may be done during the session or immediately after.</w:t>
-      </w:r>
-    </w:p>
-    <w:p>
-      <w:r>
-        <w:t xml:space="preserve"/>
+        <w:t xml:space="preserve">Inactivity monitoring clock resets — the new session date is recognized as the most recent activity event.</w:t>
       </w:r>
     </w:p>
     <w:p>
@@ -7577,7 +7391,7 @@
         <w:spacing w:after="60"/>
       </w:pPr>
       <w:r>
-        <w:t xml:space="preserve">Mentor opens the existing Scheduled Session record (or creates a new Session record if one was not created in advance).</w:t>
+        <w:t xml:space="preserve">If Next Session Date/Time was set on the Session form, the Engagement’s Next Session Date/Time field is automatically updated and a meeting request is sent to all Engagement Contacts and assigned mentors (Primary Mentor, Co-Mentors, SMEs). See Section 4.8 for meeting request workflow details.</w:t>
       </w:r>
     </w:p>
     <w:p>
@@ -7589,7 +7403,7 @@
         <w:spacing w:after="60"/>
       </w:pPr>
       <w:r>
-        <w:t xml:space="preserve">Session Status is set to Completed.</w:t>
+        <w:t xml:space="preserve">System checks session count against NPS survey trigger thresholds (see Section 4.4).</w:t>
       </w:r>
     </w:p>
     <w:p>
@@ -7601,245 +7415,7 @@
         <w:spacing w:after="60"/>
       </w:pPr>
       <w:r>
-        <w:t xml:space="preserve">Session fields completed: Duration, Session Type, Meeting Location Type and Details (if in-person), Topics Covered, Mentor Notes, Next Steps, New Business Started flag, and Next Session Date/Time. Mentors are encouraged to set Next Session Date/Time while on the call with the client.</w:t>
-      </w:r>
-    </w:p>
-    <w:p>
-      <w:pPr>
-        <w:numPr>
-          <w:ilvl w:val="0"/>
-          <w:numId w:val="2"/>
-        </w:numPr>
-        <w:spacing w:after="60"/>
-      </w:pPr>
-      <w:r>
-        <w:t xml:space="preserve">Session record is saved and linked to the Engagement.</w:t>
-      </w:r>
-    </w:p>
-    <w:p>
-      <w:pPr>
-        <w:numPr>
-          <w:ilvl w:val="0"/>
-          <w:numId w:val="2"/>
-        </w:numPr>
-        <w:spacing w:after="60"/>
-      </w:pPr>
-      <w:r>
-        <w:t xml:space="preserve">Engagement roll-up fields update automatically: Total Sessions, Total Sessions (Last 30 Days), Last Session Date, and Total Session Hours are recalculated. Only Completed sessions are counted.</w:t>
-      </w:r>
-    </w:p>
-    <w:p>
-      <w:pPr>
-        <w:numPr>
-          <w:ilvl w:val="0"/>
-          <w:numId w:val="2"/>
-        </w:numPr>
-        <w:spacing w:after="60"/>
-      </w:pPr>
-      <w:r>
-        <w:t xml:space="preserve">Inactivity monitoring clock resets — the completed session date is recognized as the most recent qualifying activity event.</w:t>
-      </w:r>
-    </w:p>
-    <w:p>
-      <w:pPr>
-        <w:numPr>
-          <w:ilvl w:val="0"/>
-          <w:numId w:val="2"/>
-        </w:numPr>
-        <w:spacing w:after="60"/>
-      </w:pPr>
-      <w:r>
-        <w:t xml:space="preserve">If Next Session Date/Time was set, the Engagement’s Next Session Date/Time field is automatically updated and a meeting request is sent to all participants. See Section 4.8.</w:t>
-      </w:r>
-    </w:p>
-    <w:p>
-      <w:pPr>
-        <w:numPr>
-          <w:ilvl w:val="0"/>
-          <w:numId w:val="2"/>
-        </w:numPr>
-        <w:spacing w:after="60"/>
-      </w:pPr>
-      <w:r>
-        <w:t xml:space="preserve">System checks session count against NPS survey trigger thresholds (see Section 4.4).</w:t>
-      </w:r>
-    </w:p>
-    <w:p>
-      <w:pPr>
-        <w:numPr>
-          <w:ilvl w:val="0"/>
-          <w:numId w:val="2"/>
-        </w:numPr>
-        <w:spacing w:after="60"/>
-      </w:pPr>
-      <w:r>
-        <w:t xml:space="preserve">If this is the first Completed session on an Assigned Engagement, Engagement status automatically changes to Active.</w:t>
-      </w:r>
-    </w:p>
-    <w:p>
-      <w:r>
-        <w:t xml:space="preserve"/>
-      </w:r>
-    </w:p>
-    <w:p>
-      <w:pPr>
-        <w:pStyle w:val="Heading3"/>
-      </w:pPr>
-      <w:r>
-        <w:t xml:space="preserve">4.3.4 Missed Session</w:t>
-      </w:r>
-    </w:p>
-    <w:p>
-      <w:pPr>
-        <w:spacing w:after="120"/>
-      </w:pPr>
-      <w:r>
-        <w:t xml:space="preserve">A missed session occurs when a client does not attend a scheduled meeting. Missed sessions do not count as qualifying activity events for inactivity monitoring — the Dormant clock continues to run as if no activity occurred. If enough sessions are missed without rescheduling, the engagement will progress through Dormant to Inactive and ultimately Abandoned via the standard inactivity workflow.</w:t>
-      </w:r>
-    </w:p>
-    <w:p>
-      <w:r>
-        <w:t xml:space="preserve"/>
-      </w:r>
-    </w:p>
-    <w:p>
-      <w:pPr>
-        <w:numPr>
-          <w:ilvl w:val="0"/>
-          <w:numId w:val="2"/>
-        </w:numPr>
-        <w:spacing w:after="60"/>
-      </w:pPr>
-      <w:r>
-        <w:t xml:space="preserve">Mentor opens the Scheduled Session record and sets Status to Missed.</w:t>
-      </w:r>
-    </w:p>
-    <w:p>
-      <w:pPr>
-        <w:numPr>
-          <w:ilvl w:val="0"/>
-          <w:numId w:val="2"/>
-        </w:numPr>
-        <w:spacing w:after="60"/>
-      </w:pPr>
-      <w:r>
-        <w:t xml:space="preserve">Mentor sends a follow-up email to the client through EspoCRM, either proposing a new session date or requesting the client to suggest a time. EspoCRM email templates are available as a starting point.</w:t>
-      </w:r>
-    </w:p>
-    <w:p>
-      <w:pPr>
-        <w:numPr>
-          <w:ilvl w:val="0"/>
-          <w:numId w:val="2"/>
-        </w:numPr>
-        <w:spacing w:after="60"/>
-      </w:pPr>
-      <w:r>
-        <w:t xml:space="preserve">Missed session email is automatically linked to the Engagement and Contact activity streams.</w:t>
-      </w:r>
-    </w:p>
-    <w:p>
-      <w:pPr>
-        <w:numPr>
-          <w:ilvl w:val="0"/>
-          <w:numId w:val="2"/>
-        </w:numPr>
-        <w:spacing w:after="60"/>
-      </w:pPr>
-      <w:r>
-        <w:t xml:space="preserve">Mentor waits for client response. If the client proposes or confirms a new date, the mentor creates a new Scheduled Session record with the agreed date/time. The new Scheduled session resets the inactivity monitoring clock.</w:t>
-      </w:r>
-    </w:p>
-    <w:p>
-      <w:pPr>
-        <w:numPr>
-          <w:ilvl w:val="0"/>
-          <w:numId w:val="2"/>
-        </w:numPr>
-        <w:spacing w:after="60"/>
-      </w:pPr>
-      <w:r>
-        <w:t xml:space="preserve">If no client response is received within the normal cadence window, the inactivity monitoring workflow will automatically progress the Engagement to Dormant status per the configured thresholds (see Section 4.5).</w:t>
-      </w:r>
-    </w:p>
-    <w:p>
-      <w:r>
-        <w:t xml:space="preserve"/>
-      </w:r>
-    </w:p>
-    <w:p>
-      <w:pPr>
-        <w:spacing w:after="120"/>
-      </w:pPr>
-      <w:r>
-        <w:rPr>
-          <w:i/>
-          <w:iCs/>
-          <w:color w:val="888888"/>
-        </w:rPr>
-        <w:t xml:space="preserve">Note: Missed sessions are retained as permanent records on the Engagement. They are excluded from Total Sessions and Total Session Hours roll-up calculations but provide a useful audit trail of engagement history.</w:t>
-      </w:r>
-    </w:p>
-    <w:p>
-      <w:r>
-        <w:t xml:space="preserve"/>
-      </w:r>
-    </w:p>
-    <w:p>
-      <w:pPr>
-        <w:pStyle w:val="Heading3"/>
-      </w:pPr>
-      <w:r>
-        <w:t xml:space="preserve">4.3.5 Cancelled Session</w:t>
-      </w:r>
-    </w:p>
-    <w:p>
-      <w:pPr>
-        <w:spacing w:after="120"/>
-      </w:pPr>
-      <w:r>
-        <w:t xml:space="preserve">A cancelled session occurs when either the mentor or client cancels a scheduled meeting before it occurs. Unlike a missed session, a cancellation implies prior communication and mutual awareness.</w:t>
-      </w:r>
-    </w:p>
-    <w:p>
-      <w:r>
-        <w:t xml:space="preserve"/>
-      </w:r>
-    </w:p>
-    <w:p>
-      <w:pPr>
-        <w:numPr>
-          <w:ilvl w:val="0"/>
-          <w:numId w:val="2"/>
-        </w:numPr>
-        <w:spacing w:after="60"/>
-      </w:pPr>
-      <w:r>
-        <w:t xml:space="preserve">Mentor opens the Scheduled Session record and sets Status to Cancelled.</w:t>
-      </w:r>
-    </w:p>
-    <w:p>
-      <w:pPr>
-        <w:numPr>
-          <w:ilvl w:val="0"/>
-          <w:numId w:val="2"/>
-        </w:numPr>
-        <w:spacing w:after="60"/>
-      </w:pPr>
-      <w:r>
-        <w:t xml:space="preserve">If a new session date has already been agreed, the mentor creates a new Scheduled Session record immediately.</w:t>
-      </w:r>
-    </w:p>
-    <w:p>
-      <w:pPr>
-        <w:numPr>
-          <w:ilvl w:val="0"/>
-          <w:numId w:val="2"/>
-        </w:numPr>
-        <w:spacing w:after="60"/>
-      </w:pPr>
-      <w:r>
-        <w:t xml:space="preserve">Cancelled sessions do not count as qualifying activity events for inactivity monitoring. However, if a new Scheduled Session is created, that scheduled date resets the clock.</w:t>
+        <w:t xml:space="preserve">If this is the first session logged on an Assigned Engagement, Engagement status automatically changes to Active.</w:t>
       </w:r>
     </w:p>
     <w:p>
@@ -14479,7 +14055,7 @@
         <w:spacing w:after="60"/>
       </w:pPr>
       <w:r>
-        <w:t xml:space="preserve">☐ Add Phase 1 fields to the Company entity: Organization Type (dropdown), Business Stage (dropdown), NAICS Sector (dropdown), NAICS Subsector (dropdown), Mentoring Focus Areas (multi-select), Mentoring Needs Description (rich text).</w:t>
+        <w:t xml:space="preserve">☐ Add Phase 1 fields to the Company entity: Organization Type (dropdown), Company Role (dropdown), Business Stage (dropdown), NAICS Sector (dropdown), NAICS Subsector (dropdown), Mentoring Focus Areas (multi-select), Mentoring Needs Description (rich text).</w:t>
       </w:r>
     </w:p>
     <w:p>
@@ -15049,18 +14625,6 @@
         <w:spacing w:after="60"/>
       </w:pPr>
       <w:r>
-        <w:t xml:space="preserve">☐ Add Status field (dropdown) with values: Scheduled | Completed | Missed | Cancelled. Set default value to Scheduled.</w:t>
-      </w:r>
-    </w:p>
-    <w:p>
-      <w:pPr>
-        <w:numPr>
-          <w:ilvl w:val="0"/>
-          <w:numId w:val="1"/>
-        </w:numPr>
-        <w:spacing w:after="60"/>
-      </w:pPr>
-      <w:r>
         <w:t xml:space="preserve">☐ Add New Business Started field (checkbox/boolean).</w:t>
       </w:r>
     </w:p>
@@ -15973,54 +15537,6 @@
         <w:spacing w:after="60"/>
       </w:pPr>
       <w:r>
-        <w:t xml:space="preserve">☐ Configure Twilio integration: create Twilio account, provision a CBM SMS phone number, install and configure the EspoCRM Twilio integration extension with CBM’s Account SID and Auth Token.</w:t>
-      </w:r>
-    </w:p>
-    <w:p>
-      <w:pPr>
-        <w:numPr>
-          <w:ilvl w:val="0"/>
-          <w:numId w:val="1"/>
-        </w:numPr>
-        <w:spacing w:after="60"/>
-      </w:pPr>
-      <w:r>
-        <w:t xml:space="preserve">☐ Configure 24-hour session reminder workflow: for all Sessions with Status = Scheduled, send email and SMS (Twilio) to all Engagement Contacts and assigned mentors 24 hours before Session Date/Time.</w:t>
-      </w:r>
-    </w:p>
-    <w:p>
-      <w:pPr>
-        <w:numPr>
-          <w:ilvl w:val="0"/>
-          <w:numId w:val="1"/>
-        </w:numPr>
-        <w:spacing w:after="60"/>
-      </w:pPr>
-      <w:r>
-        <w:t xml:space="preserve">☐ Configure 1-hour session reminder workflow: for all Sessions with Status = Scheduled, send email and SMS (Twilio) to all Engagement Contacts and assigned mentors 1 hour before Session Date/Time.</w:t>
-      </w:r>
-    </w:p>
-    <w:p>
-      <w:pPr>
-        <w:numPr>
-          <w:ilvl w:val="0"/>
-          <w:numId w:val="1"/>
-        </w:numPr>
-        <w:spacing w:after="60"/>
-      </w:pPr>
-      <w:r>
-        <w:t xml:space="preserve">☐ Configure SMS fallback behavior: if Contact or mentor Contact record has no phone number on file, reminder falls back to email only. Log failed SMS attempts.</w:t>
-      </w:r>
-    </w:p>
-    <w:p>
-      <w:pPr>
-        <w:numPr>
-          <w:ilvl w:val="0"/>
-          <w:numId w:val="1"/>
-        </w:numPr>
-        <w:spacing w:after="60"/>
-      </w:pPr>
-      <w:r>
         <w:t xml:space="preserve">☐ Test all workflows end-to-end in a development environment before enabling in production.</w:t>
       </w:r>
     </w:p>
@@ -16059,7 +15575,7 @@
         <w:spacing w:after="60"/>
       </w:pPr>
       <w:r>
-        <w:t xml:space="preserve">☐ Create Engagement presets: New Client Submissions (Status = Submitted — used by admin for daily intake review), Pending Acceptance, Active Engagements, Dormant Engagements, Inactive Engagements, Abandoned Engagements, Completed Engagements.</w:t>
+        <w:t xml:space="preserve">☐ Create Engagement presets: Submitted Engagements, Pending Acceptance, Active Engagements, Dormant Engagements, Inactive Engagements, Abandoned Engagements, Completed Engagements.</w:t>
       </w:r>
     </w:p>
     <w:p>
@@ -16429,7 +15945,7 @@
                 <w:sz w:val="20"/>
                 <w:szCs w:val="20"/>
               </w:rPr>
-              <w:t xml:space="preserve">1.5</w:t>
+              <w:t xml:space="preserve">1.4</w:t>
             </w:r>
           </w:p>
         </w:tc>
@@ -16545,7 +16061,7 @@
                 <w:sz w:val="20"/>
                 <w:szCs w:val="20"/>
               </w:rPr>
-              <w:t xml:space="preserve">March 15, 2026</w:t>
+              <w:t xml:space="preserve">March 18, 2026</w:t>
             </w:r>
           </w:p>
         </w:tc>

</xml_diff>

<commit_message>
Mentor v0.3 (Section 3 Relationships) + Client v1.5 (Account→Company fixes)
</commit_message>
<xml_diff>
--- a/PRDs/CBM-PRD-CRM-Client.docx
+++ b/PRDs/CBM-PRD-CRM-Client.docx
@@ -46,7 +46,7 @@
           <w:sz w:val="22"/>
           <w:szCs w:val="22"/>
         </w:rPr>
-        <w:t xml:space="preserve">Version 1.4  |  In Progress  |  March 18, 2026</w:t>
+        <w:t xml:space="preserve">Version 1.5  |  In Progress  |  March 18, 2026</w:t>
       </w:r>
     </w:p>
     <w:p>
@@ -13572,7 +13572,7 @@
                 <w:sz w:val="18"/>
                 <w:szCs w:val="18"/>
               </w:rPr>
-              <w:t xml:space="preserve">EIN Number (Account)</w:t>
+              <w:t xml:space="preserve">EIN Number (Company)</w:t>
             </w:r>
           </w:p>
         </w:tc>
@@ -15945,7 +15945,7 @@
                 <w:sz w:val="20"/>
                 <w:szCs w:val="20"/>
               </w:rPr>
-              <w:t xml:space="preserve">1.4</w:t>
+              <w:t xml:space="preserve">1.5</w:t>
             </w:r>
           </w:p>
         </w:tc>

</xml_diff>

<commit_message>
CBM-PRD-CRM-Client v1.6 - Add Mentor Attendees to Session entity
</commit_message>
<xml_diff>
--- a/PRDs/CBM-PRD-CRM-Client.docx
+++ b/PRDs/CBM-PRD-CRM-Client.docx
@@ -46,7 +46,7 @@
           <w:sz w:val="22"/>
           <w:szCs w:val="22"/>
         </w:rPr>
-        <w:t xml:space="preserve">Version 1.5  |  In Progress  |  March 18, 2026</w:t>
+        <w:t xml:space="preserve">Version 1.6  |  In Progress  |  March 18, 2026</w:t>
       </w:r>
     </w:p>
     <w:p>
@@ -3912,7 +3912,7 @@
         <w:spacing w:after="120"/>
       </w:pPr>
       <w:r>
-        <w:t xml:space="preserve">The Session entity records each individual meeting between a mentor and client. Sessions are linked to an Engagement and drive both the roll-up analytics on the Engagement record and the NPS survey trigger logic. Mentors are encouraged to complete the session form while on the call with the client so that Next Session Date can be set in real time. All note fields support rich text formatting.</w:t>
+        <w:t xml:space="preserve">The Session entity records each individual meeting between a mentor and client. Sessions are linked to an Engagement and drive both the roll-up analytics on the Engagement record and the NPS survey trigger logic. Mentors are encouraged to complete the session form while on the call with the client so that Next Session Date can be set in real time. All note fields support rich text formatting. Each Session record must have at least one Contact from a Mentoring Company (Company Role = Mentoring Company) listed in the Mentor Attendees panel before the record can be saved. This is enforced as a save validation rule in EspoCRM.</w:t>
       </w:r>
     </w:p>
     <w:p>
@@ -4641,6 +4641,64 @@
           </w:p>
         </w:tc>
       </w:tr>
+      <w:tr>
+        <w:tc>
+          <w:tcPr>
+            <w:tcW w:type="dxa" w:w="2500"/>
+            <w:tcBorders>
+              <w:top w:val="single" w:color="CCCCCC" w:sz="1"/>
+              <w:left w:val="single" w:color="CCCCCC" w:sz="1"/>
+              <w:bottom w:val="single" w:color="CCCCCC" w:sz="1"/>
+              <w:right w:val="single" w:color="CCCCCC" w:sz="1"/>
+            </w:tcBorders>
+            <w:shd w:fill="F2F2F2" w:val="clear"/>
+            <w:tcMar>
+              <w:top w:type="dxa" w:w="80"/>
+              <w:left w:type="dxa" w:w="120"/>
+              <w:bottom w:type="dxa" w:w="80"/>
+              <w:right w:type="dxa" w:w="120"/>
+            </w:tcMar>
+          </w:tcPr>
+          <w:p>
+            <w:r>
+              <w:rPr>
+                <w:rFonts w:ascii="Arial" w:cs="Arial" w:eastAsia="Arial" w:hAnsi="Arial"/>
+                <w:sz w:val="18"/>
+                <w:szCs w:val="18"/>
+              </w:rPr>
+              <w:t xml:space="preserve">Mentor Attendees</w:t>
+            </w:r>
+          </w:p>
+        </w:tc>
+        <w:tc>
+          <w:tcPr>
+            <w:tcW w:type="dxa" w:w="6860"/>
+            <w:tcBorders>
+              <w:top w:val="single" w:color="CCCCCC" w:sz="1"/>
+              <w:left w:val="single" w:color="CCCCCC" w:sz="1"/>
+              <w:bottom w:val="single" w:color="CCCCCC" w:sz="1"/>
+              <w:right w:val="single" w:color="CCCCCC" w:sz="1"/>
+            </w:tcBorders>
+            <w:shd w:fill="F2F2F2" w:val="clear"/>
+            <w:tcMar>
+              <w:top w:type="dxa" w:w="80"/>
+              <w:left w:type="dxa" w:w="120"/>
+              <w:bottom w:type="dxa" w:w="80"/>
+              <w:right w:type="dxa" w:w="120"/>
+            </w:tcMar>
+          </w:tcPr>
+          <w:p>
+            <w:r>
+              <w:rPr>
+                <w:rFonts w:ascii="Arial" w:cs="Arial" w:eastAsia="Arial" w:hAnsi="Arial"/>
+                <w:sz w:val="18"/>
+                <w:szCs w:val="18"/>
+              </w:rPr>
+              <w:t xml:space="preserve">Many-to-many relationship panel. Links one or more mentor Contact records (Company Role = Mentoring Company) who were physically present at the session. Required. At least one Contact from a Mentoring Company must be selected before the Session record can be saved. This is enforced as a save validation rule. The mentor who logs the session and the mentors listed here are independent — the logger need not be listed as an attendee.</w:t>
+            </w:r>
+          </w:p>
+        </w:tc>
+      </w:tr>
     </w:tbl>
     <w:p>
       <w:r>
@@ -7343,7 +7401,7 @@
         <w:spacing w:after="60"/>
       </w:pPr>
       <w:r>
-        <w:t xml:space="preserve">Session fields completed: Date/Time, Duration, Session Type, Meeting Location Type and Details (if in-person), Topics Covered, Mentor Notes, Next Steps, New Business Started flag, and Next Session Date/Time. Mentors are encouraged to set the Next Session Date/Time while on the call with the client.</w:t>
+        <w:t xml:space="preserve">Session fields completed: Date/Time, Duration, Session Type, Meeting Location Type and Details (if in-person), Topics Covered, Mentor Notes, Next Steps, New Business Started flag, Next Session Date/Time, and Mentor Attendees (at least one Mentoring Company contact required). Mentors are encouraged to set the Next Session Date/Time while on the call with the client.</w:t>
       </w:r>
     </w:p>
     <w:p>
@@ -14641,6 +14699,30 @@
       </w:r>
     </w:p>
     <w:p>
+      <w:pPr>
+        <w:numPr>
+          <w:ilvl w:val="0"/>
+          <w:numId w:val="1"/>
+        </w:numPr>
+        <w:spacing w:after="60"/>
+      </w:pPr>
+      <w:r>
+        <w:t xml:space="preserve">☐ Configure Mentor Attendees as a many-to-many relationship panel on the Session entity, linking to Contact records where Company Role = Mentoring Company.</w:t>
+      </w:r>
+    </w:p>
+    <w:p>
+      <w:pPr>
+        <w:numPr>
+          <w:ilvl w:val="0"/>
+          <w:numId w:val="1"/>
+        </w:numPr>
+        <w:spacing w:after="60"/>
+      </w:pPr>
+      <w:r>
+        <w:t xml:space="preserve">☐ Configure save validation rule on the Session entity requiring at least one Contact from a Mentoring Company to be present in the Mentor Attendees panel before the record can be saved.</w:t>
+      </w:r>
+    </w:p>
+    <w:p>
       <w:r>
         <w:t xml:space="preserve"/>
       </w:r>
@@ -15945,7 +16027,7 @@
                 <w:sz w:val="20"/>
                 <w:szCs w:val="20"/>
               </w:rPr>
-              <w:t xml:space="preserve">1.5</w:t>
+              <w:t xml:space="preserve">1.6</w:t>
             </w:r>
           </w:p>
         </w:tc>

</xml_diff>

<commit_message>
CBM-PRD-CRM-Client v1.7 - Add Middle Name and Preferred Name to Contact entity
</commit_message>
<xml_diff>
--- a/PRDs/CBM-PRD-CRM-Client.docx
+++ b/PRDs/CBM-PRD-CRM-Client.docx
@@ -46,7 +46,7 @@
           <w:sz w:val="22"/>
           <w:szCs w:val="22"/>
         </w:rPr>
-        <w:t xml:space="preserve">Version 1.6  |  In Progress  |  March 18, 2026</w:t>
+        <w:t xml:space="preserve">Version 1.7  |  In Progress  |  March 18, 2026</w:t>
       </w:r>
     </w:p>
     <w:p>
@@ -2540,6 +2540,122 @@
                 <w:szCs w:val="18"/>
               </w:rPr>
               <w:t xml:space="preserve">Contact's last name. Required. Text field.</w:t>
+            </w:r>
+          </w:p>
+        </w:tc>
+      </w:tr>
+      <w:tr>
+        <w:tc>
+          <w:tcPr>
+            <w:tcW w:type="dxa" w:w="2500"/>
+            <w:tcBorders>
+              <w:top w:val="single" w:color="CCCCCC" w:sz="1"/>
+              <w:left w:val="single" w:color="CCCCCC" w:sz="1"/>
+              <w:bottom w:val="single" w:color="CCCCCC" w:sz="1"/>
+              <w:right w:val="single" w:color="CCCCCC" w:sz="1"/>
+            </w:tcBorders>
+            <w:shd w:fill="F2F2F2" w:val="clear"/>
+            <w:tcMar>
+              <w:top w:type="dxa" w:w="80"/>
+              <w:left w:type="dxa" w:w="120"/>
+              <w:bottom w:type="dxa" w:w="80"/>
+              <w:right w:type="dxa" w:w="120"/>
+            </w:tcMar>
+          </w:tcPr>
+          <w:p>
+            <w:r>
+              <w:rPr>
+                <w:rFonts w:ascii="Arial" w:cs="Arial" w:eastAsia="Arial" w:hAnsi="Arial"/>
+                <w:sz w:val="18"/>
+                <w:szCs w:val="18"/>
+              </w:rPr>
+              <w:t xml:space="preserve">Middle Name</w:t>
+            </w:r>
+          </w:p>
+        </w:tc>
+        <w:tc>
+          <w:tcPr>
+            <w:tcW w:type="dxa" w:w="6860"/>
+            <w:tcBorders>
+              <w:top w:val="single" w:color="CCCCCC" w:sz="1"/>
+              <w:left w:val="single" w:color="CCCCCC" w:sz="1"/>
+              <w:bottom w:val="single" w:color="CCCCCC" w:sz="1"/>
+              <w:right w:val="single" w:color="CCCCCC" w:sz="1"/>
+            </w:tcBorders>
+            <w:shd w:fill="F2F2F2" w:val="clear"/>
+            <w:tcMar>
+              <w:top w:type="dxa" w:w="80"/>
+              <w:left w:type="dxa" w:w="120"/>
+              <w:bottom w:type="dxa" w:w="80"/>
+              <w:right w:type="dxa" w:w="120"/>
+            </w:tcMar>
+          </w:tcPr>
+          <w:p>
+            <w:r>
+              <w:rPr>
+                <w:rFonts w:ascii="Arial" w:cs="Arial" w:eastAsia="Arial" w:hAnsi="Arial"/>
+                <w:sz w:val="18"/>
+                <w:szCs w:val="18"/>
+              </w:rPr>
+              <w:t xml:space="preserve">Contact’s middle name. Optional. Text field.</w:t>
+            </w:r>
+          </w:p>
+        </w:tc>
+      </w:tr>
+      <w:tr>
+        <w:tc>
+          <w:tcPr>
+            <w:tcW w:type="dxa" w:w="2500"/>
+            <w:tcBorders>
+              <w:top w:val="single" w:color="CCCCCC" w:sz="1"/>
+              <w:left w:val="single" w:color="CCCCCC" w:sz="1"/>
+              <w:bottom w:val="single" w:color="CCCCCC" w:sz="1"/>
+              <w:right w:val="single" w:color="CCCCCC" w:sz="1"/>
+            </w:tcBorders>
+            <w:shd w:fill="FFFFFF" w:val="clear"/>
+            <w:tcMar>
+              <w:top w:type="dxa" w:w="80"/>
+              <w:left w:type="dxa" w:w="120"/>
+              <w:bottom w:type="dxa" w:w="80"/>
+              <w:right w:type="dxa" w:w="120"/>
+            </w:tcMar>
+          </w:tcPr>
+          <w:p>
+            <w:r>
+              <w:rPr>
+                <w:rFonts w:ascii="Arial" w:cs="Arial" w:eastAsia="Arial" w:hAnsi="Arial"/>
+                <w:sz w:val="18"/>
+                <w:szCs w:val="18"/>
+              </w:rPr>
+              <w:t xml:space="preserve">Preferred Name</w:t>
+            </w:r>
+          </w:p>
+        </w:tc>
+        <w:tc>
+          <w:tcPr>
+            <w:tcW w:type="dxa" w:w="6860"/>
+            <w:tcBorders>
+              <w:top w:val="single" w:color="CCCCCC" w:sz="1"/>
+              <w:left w:val="single" w:color="CCCCCC" w:sz="1"/>
+              <w:bottom w:val="single" w:color="CCCCCC" w:sz="1"/>
+              <w:right w:val="single" w:color="CCCCCC" w:sz="1"/>
+            </w:tcBorders>
+            <w:shd w:fill="FFFFFF" w:val="clear"/>
+            <w:tcMar>
+              <w:top w:type="dxa" w:w="80"/>
+              <w:left w:type="dxa" w:w="120"/>
+              <w:bottom w:type="dxa" w:w="80"/>
+              <w:right w:type="dxa" w:w="120"/>
+            </w:tcMar>
+          </w:tcPr>
+          <w:p>
+            <w:r>
+              <w:rPr>
+                <w:rFonts w:ascii="Arial" w:cs="Arial" w:eastAsia="Arial" w:hAnsi="Arial"/>
+                <w:sz w:val="18"/>
+                <w:szCs w:val="18"/>
+              </w:rPr>
+              <w:t xml:space="preserve">The name the contact prefers to be called. Optional. Text field. Used in communications and engagement materials.</w:t>
             </w:r>
           </w:p>
         </w:tc>
@@ -14271,6 +14387,30 @@
         <w:spacing w:after="60"/>
       </w:pPr>
       <w:r>
+        <w:t xml:space="preserve">☐ Add Middle Name field (text field) to the Contact entity.</w:t>
+      </w:r>
+    </w:p>
+    <w:p>
+      <w:pPr>
+        <w:numPr>
+          <w:ilvl w:val="0"/>
+          <w:numId w:val="1"/>
+        </w:numPr>
+        <w:spacing w:after="60"/>
+      </w:pPr>
+      <w:r>
+        <w:t xml:space="preserve">☐ Add Preferred Name field (text field) to the Contact entity.</w:t>
+      </w:r>
+    </w:p>
+    <w:p>
+      <w:pPr>
+        <w:numPr>
+          <w:ilvl w:val="0"/>
+          <w:numId w:val="1"/>
+        </w:numPr>
+        <w:spacing w:after="60"/>
+      </w:pPr>
+      <w:r>
         <w:t xml:space="preserve">☐ Add Primary Contact field (checkbox/boolean) to the Contact entity.</w:t>
       </w:r>
     </w:p>
@@ -16027,7 +16167,7 @@
                 <w:sz w:val="20"/>
                 <w:szCs w:val="20"/>
               </w:rPr>
-              <w:t xml:space="preserve">1.6</w:t>
+              <w:t xml:space="preserve">1.7</w:t>
             </w:r>
           </w:p>
         </w:tc>

</xml_diff>

<commit_message>
Add CBM-PRD-CRM-Implementation.docx v0.1; Mentor v0.8 and Client v1.8 - replace §6 with cross-reference
</commit_message>
<xml_diff>
--- a/PRDs/CBM-PRD-CRM-Client.docx
+++ b/PRDs/CBM-PRD-CRM-Client.docx
@@ -46,7 +46,7 @@
           <w:sz w:val="22"/>
           <w:szCs w:val="22"/>
         </w:rPr>
-        <w:t xml:space="preserve">Version 1.7  |  In Progress  |  March 18, 2026</w:t>
+        <w:t xml:space="preserve">Version 1.8  |  In Progress  |  March 18, 2026</w:t>
       </w:r>
     </w:p>
     <w:p>
@@ -14065,7 +14065,7 @@
         <w:pStyle w:val="Heading1"/>
       </w:pPr>
       <w:r>
-        <w:t xml:space="preserve">6. Implementation Steps</w:t>
+        <w:t xml:space="preserve">6. Implementation</w:t>
       </w:r>
     </w:p>
     <w:p>
@@ -14073,15 +14073,7 @@
         <w:spacing w:after="120"/>
       </w:pPr>
       <w:r>
-        <w:t xml:space="preserve">This section provides a sequenced implementation checklist for configuring the client domain in EspoCRM. Steps are listed at the operational task level — sufficient to guide a CBM technology administrator familiar with EspoCRM through the full configuration. Detailed button-by-button instructions are not included here; those will be documented separately if needed.</w:t>
-      </w:r>
-    </w:p>
-    <w:p>
-      <w:pPr>
-        <w:spacing w:after="120"/>
-      </w:pPr>
-      <w:r>
-        <w:t xml:space="preserve">Steps must be completed in the order presented, as later steps depend on entities and relationships configured in earlier steps.</w:t>
+        <w:t xml:space="preserve">Implementation steps for the client domain are documented in CBM-PRD-CRM-Implementation.docx. That document provides the complete sequenced configuration guide covering all entities, fields, relationships, roles, workflows, integrations, and testing procedures across both the client and mentor domains.</w:t>
       </w:r>
     </w:p>
     <w:p>
@@ -14091,1944 +14083,10 @@
     </w:p>
     <w:p>
       <w:pPr>
-        <w:pStyle w:val="Heading2"/>
-      </w:pPr>
-      <w:r>
-        <w:t xml:space="preserve">6.1 Shared Platform Entities</w:t>
-      </w:r>
-    </w:p>
-    <w:p>
-      <w:pPr>
-        <w:spacing w:after="120"/>
-      </w:pPr>
-      <w:r>
-        <w:t xml:space="preserve">These entities are used across all CBM CRM domains and must be configured before any domain-specific entities. Reference CBM-PRD-CRM.docx Section 18 for full field specifications.</w:t>
-      </w:r>
-    </w:p>
-    <w:p>
-      <w:r>
-        <w:t xml:space="preserve"/>
-      </w:r>
-    </w:p>
-    <w:p>
-      <w:pPr>
-        <w:numPr>
-          <w:ilvl w:val="0"/>
-          <w:numId w:val="1"/>
-        </w:numPr>
-        <w:spacing w:after="60"/>
-      </w:pPr>
-      <w:r>
-        <w:t xml:space="preserve">☐ Create the Note entity with all defined fields (Title, Body, Internal Only, Created By, Created Date/Time).</w:t>
-      </w:r>
-    </w:p>
-    <w:p>
-      <w:pPr>
-        <w:numPr>
-          <w:ilvl w:val="0"/>
-          <w:numId w:val="1"/>
-        </w:numPr>
-        <w:spacing w:after="60"/>
-      </w:pPr>
-      <w:r>
-        <w:t xml:space="preserve">☐ Create the Comment entity with all defined fields (Note link, Body, Created By, Created Date/Time).</w:t>
-      </w:r>
-    </w:p>
-    <w:p>
-      <w:pPr>
-        <w:numPr>
-          <w:ilvl w:val="0"/>
-          <w:numId w:val="1"/>
-        </w:numPr>
-        <w:spacing w:after="60"/>
-      </w:pPr>
-      <w:r>
-        <w:t xml:space="preserve">☐ Configure the Comment entity as a child relationship of the Note entity (one Note, many Comments).</w:t>
-      </w:r>
-    </w:p>
-    <w:p>
-      <w:pPr>
-        <w:numPr>
-          <w:ilvl w:val="0"/>
-          <w:numId w:val="1"/>
-        </w:numPr>
-        <w:spacing w:after="60"/>
-      </w:pPr>
-      <w:r>
-        <w:t xml:space="preserve">☐ Create the Document entity with all defined fields (Title, Document Type, Description, File Attachment, External URL, Internal Only, Created By, Created Date/Time).</w:t>
-      </w:r>
-    </w:p>
-    <w:p>
-      <w:pPr>
-        <w:numPr>
-          <w:ilvl w:val="0"/>
-          <w:numId w:val="1"/>
-        </w:numPr>
-        <w:spacing w:after="60"/>
-      </w:pPr>
-      <w:r>
-        <w:t xml:space="preserve">☐ Configure Internal Only field-level access on Note and Document entities to restrict visibility to Admin role only when flagged.</w:t>
-      </w:r>
-    </w:p>
-    <w:p>
-      <w:pPr>
-        <w:numPr>
-          <w:ilvl w:val="0"/>
-          <w:numId w:val="1"/>
-        </w:numPr>
-        <w:spacing w:after="60"/>
-      </w:pPr>
-      <w:r>
-        <w:t xml:space="preserve">☐ Create a “My Notes” global search preset on the Note entity filtered by Created By = current user, sorted by Created Date/Time descending.</w:t>
-      </w:r>
-    </w:p>
-    <w:p>
-      <w:r>
-        <w:t xml:space="preserve"/>
-      </w:r>
-    </w:p>
-    <w:p>
-      <w:pPr>
-        <w:pStyle w:val="Heading2"/>
-      </w:pPr>
-      <w:r>
-        <w:t xml:space="preserve">6.2 Company Entity</w:t>
-      </w:r>
-    </w:p>
-    <w:p>
-      <w:pPr>
-        <w:spacing w:after="120"/>
-      </w:pPr>
-      <w:r>
-        <w:t xml:space="preserve">Configure the Company entity (EspoCRM’s native Account entity, relabeled) with all Phase 1 and Phase 2 fields defined in Section 2.2.</w:t>
-      </w:r>
-    </w:p>
-    <w:p>
-      <w:r>
-        <w:t xml:space="preserve"/>
-      </w:r>
-    </w:p>
-    <w:p>
-      <w:pPr>
-        <w:numPr>
-          <w:ilvl w:val="0"/>
-          <w:numId w:val="1"/>
-        </w:numPr>
-        <w:spacing w:after="60"/>
-      </w:pPr>
-      <w:r>
-        <w:t xml:space="preserve">☐ Relabel the Account entity display name to “Company” throughout the EspoCRM UI via Entity Manager label settings.</w:t>
-      </w:r>
-    </w:p>
-    <w:p>
-      <w:pPr>
-        <w:numPr>
-          <w:ilvl w:val="0"/>
-          <w:numId w:val="1"/>
-        </w:numPr>
-        <w:spacing w:after="60"/>
-      </w:pPr>
-      <w:r>
-        <w:t xml:space="preserve">☐ Add Phase 1 fields to the Company entity: Organization Type (dropdown), Company Role (dropdown), Business Stage (dropdown), NAICS Sector (dropdown), NAICS Subsector (dropdown), Mentoring Focus Areas (multi-select), Mentoring Needs Description (rich text).</w:t>
-      </w:r>
-    </w:p>
-    <w:p>
-      <w:pPr>
-        <w:numPr>
-          <w:ilvl w:val="0"/>
-          <w:numId w:val="1"/>
-        </w:numPr>
-        <w:spacing w:after="60"/>
-      </w:pPr>
-      <w:r>
-        <w:t xml:space="preserve">☐ Add Phase 2 fields to the Company entity: Business Description, Time in Operation, Current Team Size, Revenue Range, Funding Situation, Current Challenges, Goals and Objectives, Desired Outcomes, Previous Mentoring/Advisory Experience (all rich text or appropriate field types per Section 2.2).</w:t>
-      </w:r>
-    </w:p>
-    <w:p>
-      <w:pPr>
-        <w:numPr>
-          <w:ilvl w:val="0"/>
-          <w:numId w:val="1"/>
-        </w:numPr>
-        <w:spacing w:after="60"/>
-      </w:pPr>
-      <w:r>
-        <w:t xml:space="preserve">☐ Add Professional Advisors field (multi-select checklist) with all defined values.</w:t>
-      </w:r>
-    </w:p>
-    <w:p>
-      <w:pPr>
-        <w:numPr>
-          <w:ilvl w:val="0"/>
-          <w:numId w:val="1"/>
-        </w:numPr>
-        <w:spacing w:after="60"/>
-      </w:pPr>
-      <w:r>
-        <w:t xml:space="preserve">☐ Add business registration fields: Registered with State, State of Registration, Legal Business Structure, EIN on File, Date of Formation, Registered Agent, EIN Number.</w:t>
-      </w:r>
-    </w:p>
-    <w:p>
-      <w:pPr>
-        <w:numPr>
-          <w:ilvl w:val="0"/>
-          <w:numId w:val="1"/>
-        </w:numPr>
-        <w:spacing w:after="60"/>
-      </w:pPr>
-      <w:r>
-        <w:t xml:space="preserve">☐ Configure Dynamic Logic to show/hide registration fields conditionally based on Registered with State value.</w:t>
-      </w:r>
-    </w:p>
-    <w:p>
-      <w:pPr>
-        <w:numPr>
-          <w:ilvl w:val="0"/>
-          <w:numId w:val="1"/>
-        </w:numPr>
-        <w:spacing w:after="60"/>
-      </w:pPr>
-      <w:r>
-        <w:t xml:space="preserve">☐ Configure field-level access on EIN Number to restrict visibility to Admin and assigned Primary Mentor only.</w:t>
-      </w:r>
-    </w:p>
-    <w:p>
-      <w:pPr>
-        <w:numPr>
-          <w:ilvl w:val="0"/>
-          <w:numId w:val="1"/>
-        </w:numPr>
-        <w:spacing w:after="60"/>
-      </w:pPr>
-      <w:r>
-        <w:t xml:space="preserve">☐ Organize all fields into logical panel groups on the Company detail view: Contact Information, Business Classification, Mentoring Context (Phase 1), Business Detail (Phase 2), Professional Advisors, Business Registration.</w:t>
-      </w:r>
-    </w:p>
-    <w:p>
-      <w:pPr>
-        <w:numPr>
-          <w:ilvl w:val="0"/>
-          <w:numId w:val="1"/>
-        </w:numPr>
-        <w:spacing w:after="60"/>
-      </w:pPr>
-      <w:r>
-        <w:t xml:space="preserve">☐ Configure Phase 2 panel group to be collapsible and clearly labeled as post-assignment information.</w:t>
-      </w:r>
-    </w:p>
-    <w:p>
-      <w:pPr>
-        <w:numPr>
-          <w:ilvl w:val="0"/>
-          <w:numId w:val="1"/>
-        </w:numPr>
-        <w:spacing w:after="60"/>
-      </w:pPr>
-      <w:r>
-        <w:t xml:space="preserve">☐ Add Note, Document, Email, and Calls relationship panels to the Company detail view.</w:t>
-      </w:r>
-    </w:p>
-    <w:p>
-      <w:r>
-        <w:t xml:space="preserve"/>
-      </w:r>
-    </w:p>
-    <w:p>
-      <w:pPr>
-        <w:pStyle w:val="Heading2"/>
-      </w:pPr>
-      <w:r>
-        <w:t xml:space="preserve">6.3 Contact Entity</w:t>
-      </w:r>
-    </w:p>
-    <w:p>
-      <w:pPr>
-        <w:spacing w:after="120"/>
-      </w:pPr>
-      <w:r>
-        <w:t xml:space="preserve">The Contact entity uses EspoCRM’s native Contact entity. Add the fields defined in Section 2.3 that are not already present natively.</w:t>
-      </w:r>
-    </w:p>
-    <w:p>
-      <w:r>
-        <w:t xml:space="preserve"/>
-      </w:r>
-    </w:p>
-    <w:p>
-      <w:pPr>
-        <w:numPr>
-          <w:ilvl w:val="0"/>
-          <w:numId w:val="1"/>
-        </w:numPr>
-        <w:spacing w:after="60"/>
-      </w:pPr>
-      <w:r>
-        <w:t xml:space="preserve">☐ Verify native Contact fields are present: First Name, Last Name, Email, Phone.</w:t>
-      </w:r>
-    </w:p>
-    <w:p>
-      <w:pPr>
-        <w:numPr>
-          <w:ilvl w:val="0"/>
-          <w:numId w:val="1"/>
-        </w:numPr>
-        <w:spacing w:after="60"/>
-      </w:pPr>
-      <w:r>
-        <w:t xml:space="preserve">☐ Add Role at Business field (text field) to the Contact entity.</w:t>
-      </w:r>
-    </w:p>
-    <w:p>
-      <w:pPr>
-        <w:numPr>
-          <w:ilvl w:val="0"/>
-          <w:numId w:val="1"/>
-        </w:numPr>
-        <w:spacing w:after="60"/>
-      </w:pPr>
-      <w:r>
-        <w:t xml:space="preserve">☐ Add Middle Name field (text field) to the Contact entity.</w:t>
-      </w:r>
-    </w:p>
-    <w:p>
-      <w:pPr>
-        <w:numPr>
-          <w:ilvl w:val="0"/>
-          <w:numId w:val="1"/>
-        </w:numPr>
-        <w:spacing w:after="60"/>
-      </w:pPr>
-      <w:r>
-        <w:t xml:space="preserve">☐ Add Preferred Name field (text field) to the Contact entity.</w:t>
-      </w:r>
-    </w:p>
-    <w:p>
-      <w:pPr>
-        <w:numPr>
-          <w:ilvl w:val="0"/>
-          <w:numId w:val="1"/>
-        </w:numPr>
-        <w:spacing w:after="60"/>
-      </w:pPr>
-      <w:r>
-        <w:t xml:space="preserve">☐ Add Primary Contact field (checkbox/boolean) to the Contact entity.</w:t>
-      </w:r>
-    </w:p>
-    <w:p>
-      <w:pPr>
-        <w:numPr>
-          <w:ilvl w:val="0"/>
-          <w:numId w:val="1"/>
-        </w:numPr>
-        <w:spacing w:after="60"/>
-      </w:pPr>
-      <w:r>
-        <w:t xml:space="preserve">☐ Add Zip Code field to the Contact entity if not already present as part of the native address field set.</w:t>
-      </w:r>
-    </w:p>
-    <w:p>
-      <w:pPr>
-        <w:numPr>
-          <w:ilvl w:val="0"/>
-          <w:numId w:val="1"/>
-        </w:numPr>
-        <w:spacing w:after="60"/>
-      </w:pPr>
-      <w:r>
-        <w:t xml:space="preserve">☐ Organize Contact detail view panels logically: Personal Information, Role at Business.</w:t>
-      </w:r>
-    </w:p>
-    <w:p>
-      <w:pPr>
-        <w:numPr>
-          <w:ilvl w:val="0"/>
-          <w:numId w:val="1"/>
-        </w:numPr>
-        <w:spacing w:after="60"/>
-      </w:pPr>
-      <w:r>
-        <w:t xml:space="preserve">☐ Add Note, Document, Email, and Calls relationship panels to the Contact detail view.</w:t>
-      </w:r>
-    </w:p>
-    <w:p>
-      <w:r>
-        <w:t xml:space="preserve"/>
-      </w:r>
-    </w:p>
-    <w:p>
-      <w:pPr>
-        <w:pStyle w:val="Heading2"/>
-      </w:pPr>
-      <w:r>
-        <w:t xml:space="preserve">6.4 Engagement Entity</w:t>
-      </w:r>
-    </w:p>
-    <w:p>
-      <w:pPr>
-        <w:spacing w:after="120"/>
-      </w:pPr>
-      <w:r>
-        <w:t xml:space="preserve">Create the Engagement entity as a custom entity. This entity does not exist natively in EspoCRM and must be built from scratch via Entity Manager.</w:t>
-      </w:r>
-    </w:p>
-    <w:p>
-      <w:r>
-        <w:t xml:space="preserve"/>
-      </w:r>
-    </w:p>
-    <w:p>
-      <w:pPr>
-        <w:numPr>
-          <w:ilvl w:val="0"/>
-          <w:numId w:val="1"/>
-        </w:numPr>
-        <w:spacing w:after="60"/>
-      </w:pPr>
-      <w:r>
-        <w:t xml:space="preserve">☐ Create the Engagement custom entity.</w:t>
-      </w:r>
-    </w:p>
-    <w:p>
-      <w:pPr>
-        <w:numPr>
-          <w:ilvl w:val="0"/>
-          <w:numId w:val="1"/>
-        </w:numPr>
-        <w:spacing w:after="60"/>
-      </w:pPr>
-      <w:r>
-        <w:t xml:space="preserve">☐ Add Status field (dropdown) with all defined values: Submitted, Pending Acceptance, Assigned, Active, On-Hold, Dormant, Inactive, Abandoned, Completed.</w:t>
-      </w:r>
-    </w:p>
-    <w:p>
-      <w:pPr>
-        <w:numPr>
-          <w:ilvl w:val="0"/>
-          <w:numId w:val="1"/>
-        </w:numPr>
-        <w:spacing w:after="60"/>
-      </w:pPr>
-      <w:r>
-        <w:t xml:space="preserve">☐ Add Start Date field (date).</w:t>
-      </w:r>
-    </w:p>
-    <w:p>
-      <w:pPr>
-        <w:numPr>
-          <w:ilvl w:val="0"/>
-          <w:numId w:val="1"/>
-        </w:numPr>
-        <w:spacing w:after="60"/>
-      </w:pPr>
-      <w:r>
-        <w:t xml:space="preserve">☐ Add Close Date field (date).</w:t>
-      </w:r>
-    </w:p>
-    <w:p>
-      <w:pPr>
-        <w:numPr>
-          <w:ilvl w:val="0"/>
-          <w:numId w:val="1"/>
-        </w:numPr>
-        <w:spacing w:after="60"/>
-      </w:pPr>
-      <w:r>
-        <w:t xml:space="preserve">☐ Add Meeting Cadence field (dropdown) with values: Weekly, Bi-Weekly, Monthly, As Needed.</w:t>
-      </w:r>
-    </w:p>
-    <w:p>
-      <w:pPr>
-        <w:numPr>
-          <w:ilvl w:val="0"/>
-          <w:numId w:val="1"/>
-        </w:numPr>
-        <w:spacing w:after="60"/>
-      </w:pPr>
-      <w:r>
-        <w:t xml:space="preserve">☐ Add Engagement Close Reason field (dropdown) with values: Goals Achieved, Client Withdrew, Inactive / No Response, Other.</w:t>
-      </w:r>
-    </w:p>
-    <w:p>
-      <w:pPr>
-        <w:numPr>
-          <w:ilvl w:val="0"/>
-          <w:numId w:val="1"/>
-        </w:numPr>
-        <w:spacing w:after="60"/>
-      </w:pPr>
-      <w:r>
-        <w:t xml:space="preserve">☐ Add Assigned Mentor field (link to Contact entity).</w:t>
-      </w:r>
-    </w:p>
-    <w:p>
-      <w:pPr>
-        <w:numPr>
-          <w:ilvl w:val="0"/>
-          <w:numId w:val="1"/>
-        </w:numPr>
-        <w:spacing w:after="60"/>
-      </w:pPr>
-      <w:r>
-        <w:t xml:space="preserve">☐ Configure Co-Mentor as a many-to-many relationship panel linking multiple Contact records with Co-Mentor role.</w:t>
-      </w:r>
-    </w:p>
-    <w:p>
-      <w:pPr>
-        <w:numPr>
-          <w:ilvl w:val="0"/>
-          <w:numId w:val="1"/>
-        </w:numPr>
-        <w:spacing w:after="60"/>
-      </w:pPr>
-      <w:r>
-        <w:t xml:space="preserve">☐ Configure SME as a many-to-many relationship panel linking multiple Contact records with SME role.</w:t>
-      </w:r>
-    </w:p>
-    <w:p>
-      <w:pPr>
-        <w:numPr>
-          <w:ilvl w:val="0"/>
-          <w:numId w:val="1"/>
-        </w:numPr>
-        <w:spacing w:after="60"/>
-      </w:pPr>
-      <w:r>
-        <w:t xml:space="preserve">☐ Add formula/roll-up fields: Total Sessions (count of linked Sessions), Total Sessions Last 30 Days (count of Sessions in last 30 days), Last Session Date (date of most recent Session), Total Session Hours (sum of Session Duration).</w:t>
-      </w:r>
-    </w:p>
-    <w:p>
-      <w:pPr>
-        <w:numPr>
-          <w:ilvl w:val="0"/>
-          <w:numId w:val="1"/>
-        </w:numPr>
-        <w:spacing w:after="60"/>
-      </w:pPr>
-      <w:r>
-        <w:t xml:space="preserve">☐ Add Next Session Date/Time field (date/time). Configure as editable by mentor and admin. Configure formula to auto-populate from the most recently logged Session’s Next Session Date/Time field.</w:t>
-      </w:r>
-    </w:p>
-    <w:p>
-      <w:pPr>
-        <w:numPr>
-          <w:ilvl w:val="0"/>
-          <w:numId w:val="1"/>
-        </w:numPr>
-        <w:spacing w:after="60"/>
-      </w:pPr>
-      <w:r>
-        <w:t xml:space="preserve">☐ Organize Engagement detail view panels: Engagement Details, Mentor Assignment, Analytics Summary.</w:t>
-      </w:r>
-    </w:p>
-    <w:p>
-      <w:pPr>
-        <w:numPr>
-          <w:ilvl w:val="0"/>
-          <w:numId w:val="1"/>
-        </w:numPr>
-        <w:spacing w:after="60"/>
-      </w:pPr>
-      <w:r>
-        <w:t xml:space="preserve">☐ Configure Engagement Contacts as a many-to-many relationship panel on the Engagement entity, linking to the Contact entity.</w:t>
-      </w:r>
-    </w:p>
-    <w:p>
-      <w:pPr>
-        <w:numPr>
-          <w:ilvl w:val="0"/>
-          <w:numId w:val="1"/>
-        </w:numPr>
-        <w:spacing w:after="60"/>
-      </w:pPr>
-      <w:r>
-        <w:t xml:space="preserve">☐ Add Note, Document, Email, and Calls relationship panels to the Engagement detail view.</w:t>
-      </w:r>
-    </w:p>
-    <w:p>
-      <w:r>
-        <w:t xml:space="preserve"/>
-      </w:r>
-    </w:p>
-    <w:p>
-      <w:pPr>
-        <w:pStyle w:val="Heading2"/>
-      </w:pPr>
-      <w:r>
-        <w:t xml:space="preserve">6.5 Session Entity</w:t>
-      </w:r>
-    </w:p>
-    <w:p>
-      <w:pPr>
-        <w:spacing w:after="120"/>
-      </w:pPr>
-      <w:r>
-        <w:t xml:space="preserve">Create the Session entity as a custom entity.</w:t>
-      </w:r>
-    </w:p>
-    <w:p>
-      <w:r>
-        <w:t xml:space="preserve"/>
-      </w:r>
-    </w:p>
-    <w:p>
-      <w:pPr>
-        <w:numPr>
-          <w:ilvl w:val="0"/>
-          <w:numId w:val="1"/>
-        </w:numPr>
-        <w:spacing w:after="60"/>
-      </w:pPr>
-      <w:r>
-        <w:t xml:space="preserve">☐ Create the Session custom entity.</w:t>
-      </w:r>
-    </w:p>
-    <w:p>
-      <w:pPr>
-        <w:numPr>
-          <w:ilvl w:val="0"/>
-          <w:numId w:val="1"/>
-        </w:numPr>
-        <w:spacing w:after="60"/>
-      </w:pPr>
-      <w:r>
-        <w:t xml:space="preserve">☐ Add Session Date/Time field (date/time).</w:t>
-      </w:r>
-    </w:p>
-    <w:p>
-      <w:pPr>
-        <w:numPr>
-          <w:ilvl w:val="0"/>
-          <w:numId w:val="1"/>
-        </w:numPr>
-        <w:spacing w:after="60"/>
-      </w:pPr>
-      <w:r>
-        <w:t xml:space="preserve">☐ Add Duration field (integer, minutes).</w:t>
-      </w:r>
-    </w:p>
-    <w:p>
-      <w:pPr>
-        <w:numPr>
-          <w:ilvl w:val="0"/>
-          <w:numId w:val="1"/>
-        </w:numPr>
-        <w:spacing w:after="60"/>
-      </w:pPr>
-      <w:r>
-        <w:t xml:space="preserve">☐ Add Session Type field (dropdown) with values: In-Person, Video Call, Phone Call.</w:t>
-      </w:r>
-    </w:p>
-    <w:p>
-      <w:pPr>
-        <w:numPr>
-          <w:ilvl w:val="0"/>
-          <w:numId w:val="1"/>
-        </w:numPr>
-        <w:spacing w:after="60"/>
-      </w:pPr>
-      <w:r>
-        <w:t xml:space="preserve">☐ Add Meeting Location Type field (dropdown) with values: CBM Office, Client’s Place of Business, Other.</w:t>
-      </w:r>
-    </w:p>
-    <w:p>
-      <w:pPr>
-        <w:numPr>
-          <w:ilvl w:val="0"/>
-          <w:numId w:val="1"/>
-        </w:numPr>
-        <w:spacing w:after="60"/>
-      </w:pPr>
-      <w:r>
-        <w:t xml:space="preserve">☐ Add Location Details field (text).</w:t>
-      </w:r>
-    </w:p>
-    <w:p>
-      <w:pPr>
-        <w:numPr>
-          <w:ilvl w:val="0"/>
-          <w:numId w:val="1"/>
-        </w:numPr>
-        <w:spacing w:after="60"/>
-      </w:pPr>
-      <w:r>
-        <w:t xml:space="preserve">☐ Configure Dynamic Logic to show Meeting Location Type only when Session Type = In-Person.</w:t>
-      </w:r>
-    </w:p>
-    <w:p>
-      <w:pPr>
-        <w:numPr>
-          <w:ilvl w:val="0"/>
-          <w:numId w:val="1"/>
-        </w:numPr>
-        <w:spacing w:after="60"/>
-      </w:pPr>
-      <w:r>
-        <w:t xml:space="preserve">☐ Configure Dynamic Logic to show Location Details only when Meeting Location Type = Other.</w:t>
-      </w:r>
-    </w:p>
-    <w:p>
-      <w:pPr>
-        <w:numPr>
-          <w:ilvl w:val="0"/>
-          <w:numId w:val="1"/>
-        </w:numPr>
-        <w:spacing w:after="60"/>
-      </w:pPr>
-      <w:r>
-        <w:t xml:space="preserve">☐ Add Topics Covered field (multi-select dropdown, values TBD).</w:t>
-      </w:r>
-    </w:p>
-    <w:p>
-      <w:pPr>
-        <w:numPr>
-          <w:ilvl w:val="0"/>
-          <w:numId w:val="1"/>
-        </w:numPr>
-        <w:spacing w:after="60"/>
-      </w:pPr>
-      <w:r>
-        <w:t xml:space="preserve">☐ Add Topics Covered Notes field (rich text) for free-text topic detail.</w:t>
-      </w:r>
-    </w:p>
-    <w:p>
-      <w:pPr>
-        <w:numPr>
-          <w:ilvl w:val="0"/>
-          <w:numId w:val="1"/>
-        </w:numPr>
-        <w:spacing w:after="60"/>
-      </w:pPr>
-      <w:r>
-        <w:t xml:space="preserve">☐ Add Mentor Notes field (rich text).</w:t>
-      </w:r>
-    </w:p>
-    <w:p>
-      <w:pPr>
-        <w:numPr>
-          <w:ilvl w:val="0"/>
-          <w:numId w:val="1"/>
-        </w:numPr>
-        <w:spacing w:after="60"/>
-      </w:pPr>
-      <w:r>
-        <w:t xml:space="preserve">☐ Add Next Steps field (rich text).</w:t>
-      </w:r>
-    </w:p>
-    <w:p>
-      <w:pPr>
-        <w:numPr>
-          <w:ilvl w:val="0"/>
-          <w:numId w:val="1"/>
-        </w:numPr>
-        <w:spacing w:after="60"/>
-      </w:pPr>
-      <w:r>
-        <w:t xml:space="preserve">☐ Add New Business Started field (checkbox/boolean).</w:t>
-      </w:r>
-    </w:p>
-    <w:p>
-      <w:pPr>
-        <w:numPr>
-          <w:ilvl w:val="0"/>
-          <w:numId w:val="1"/>
-        </w:numPr>
-        <w:spacing w:after="60"/>
-      </w:pPr>
-      <w:r>
-        <w:t xml:space="preserve">☐ Add Note and Document relationship panels to the Session detail view.</w:t>
-      </w:r>
-    </w:p>
-    <w:p>
-      <w:pPr>
-        <w:numPr>
-          <w:ilvl w:val="0"/>
-          <w:numId w:val="1"/>
-        </w:numPr>
-        <w:spacing w:after="60"/>
-      </w:pPr>
-      <w:r>
-        <w:t xml:space="preserve">☐ Configure Mentor Attendees as a many-to-many relationship panel on the Session entity, linking to Contact records where Company Role = Mentoring Company.</w:t>
-      </w:r>
-    </w:p>
-    <w:p>
-      <w:pPr>
-        <w:numPr>
-          <w:ilvl w:val="0"/>
-          <w:numId w:val="1"/>
-        </w:numPr>
-        <w:spacing w:after="60"/>
-      </w:pPr>
-      <w:r>
-        <w:t xml:space="preserve">☐ Configure save validation rule on the Session entity requiring at least one Contact from a Mentoring Company to be present in the Mentor Attendees panel before the record can be saved.</w:t>
-      </w:r>
-    </w:p>
-    <w:p>
-      <w:r>
-        <w:t xml:space="preserve"/>
-      </w:r>
-    </w:p>
-    <w:p>
-      <w:pPr>
-        <w:pStyle w:val="Heading2"/>
-      </w:pPr>
-      <w:r>
-        <w:t xml:space="preserve">6.6 NPS Survey Response Entity</w:t>
-      </w:r>
-    </w:p>
-    <w:p>
-      <w:pPr>
-        <w:spacing w:after="120"/>
-      </w:pPr>
-      <w:r>
-        <w:t xml:space="preserve">Create the NPS Survey Response entity as a custom entity and configure the LimeSurvey integration.</w:t>
-      </w:r>
-    </w:p>
-    <w:p>
-      <w:r>
-        <w:t xml:space="preserve"/>
-      </w:r>
-    </w:p>
-    <w:p>
-      <w:pPr>
-        <w:numPr>
-          <w:ilvl w:val="0"/>
-          <w:numId w:val="1"/>
-        </w:numPr>
-        <w:spacing w:after="60"/>
-      </w:pPr>
-      <w:r>
-        <w:t xml:space="preserve">☐ Create the NPS Survey Response custom entity.</w:t>
-      </w:r>
-    </w:p>
-    <w:p>
-      <w:pPr>
-        <w:numPr>
-          <w:ilvl w:val="0"/>
-          <w:numId w:val="1"/>
-        </w:numPr>
-        <w:spacing w:after="60"/>
-      </w:pPr>
-      <w:r>
-        <w:t xml:space="preserve">☐ Add Survey Trigger field (dropdown, read-only) with values: 2nd Session, Every 5 Sessions, Engagement Close.</w:t>
-      </w:r>
-    </w:p>
-    <w:p>
-      <w:pPr>
-        <w:numPr>
-          <w:ilvl w:val="0"/>
-          <w:numId w:val="1"/>
-        </w:numPr>
-        <w:spacing w:after="60"/>
-      </w:pPr>
-      <w:r>
-        <w:t xml:space="preserve">☐ Add Survey Date/Time field (date/time, system-populated).</w:t>
-      </w:r>
-    </w:p>
-    <w:p>
-      <w:pPr>
-        <w:numPr>
-          <w:ilvl w:val="0"/>
-          <w:numId w:val="1"/>
-        </w:numPr>
-        <w:spacing w:after="60"/>
-      </w:pPr>
-      <w:r>
-        <w:t xml:space="preserve">☐ Add NPS Score field (integer, 0-10).</w:t>
-      </w:r>
-    </w:p>
-    <w:p>
-      <w:pPr>
-        <w:numPr>
-          <w:ilvl w:val="0"/>
-          <w:numId w:val="1"/>
-        </w:numPr>
-        <w:spacing w:after="60"/>
-      </w:pPr>
-      <w:r>
-        <w:t xml:space="preserve">☐ Add Did CBM Help You field (boolean yes/no).</w:t>
-      </w:r>
-    </w:p>
-    <w:p>
-      <w:pPr>
-        <w:numPr>
-          <w:ilvl w:val="0"/>
-          <w:numId w:val="1"/>
-        </w:numPr>
-        <w:spacing w:after="60"/>
-      </w:pPr>
-      <w:r>
-        <w:t xml:space="preserve">☐ Add I Would Return to See This Mentor Again field (integer, 1-5).</w:t>
-      </w:r>
-    </w:p>
-    <w:p>
-      <w:pPr>
-        <w:numPr>
-          <w:ilvl w:val="0"/>
-          <w:numId w:val="1"/>
-        </w:numPr>
-        <w:spacing w:after="60"/>
-      </w:pPr>
-      <w:r>
-        <w:t xml:space="preserve">☐ Add Mentor Listened and Understood My Needs field (integer, 1-5).</w:t>
-      </w:r>
-    </w:p>
-    <w:p>
-      <w:pPr>
-        <w:numPr>
-          <w:ilvl w:val="0"/>
-          <w:numId w:val="1"/>
-        </w:numPr>
-        <w:spacing w:after="60"/>
-      </w:pPr>
-      <w:r>
-        <w:t xml:space="preserve">☐ Add How Could CBM Better Meet Your Needs field (rich text, optional).</w:t>
-      </w:r>
-    </w:p>
-    <w:p>
-      <w:pPr>
-        <w:numPr>
-          <w:ilvl w:val="0"/>
-          <w:numId w:val="1"/>
-        </w:numPr>
-        <w:spacing w:after="60"/>
-      </w:pPr>
-      <w:r>
-        <w:t xml:space="preserve">☐ Install and configure LimeSurvey (self-hosted on AWS).</w:t>
-      </w:r>
-    </w:p>
-    <w:p>
-      <w:pPr>
-        <w:numPr>
-          <w:ilvl w:val="0"/>
-          <w:numId w:val="1"/>
-        </w:numPr>
-        <w:spacing w:after="60"/>
-      </w:pPr>
-      <w:r>
-        <w:t xml:space="preserve">☐ Build the NPS survey in LimeSurvey with all defined questions.</w:t>
-      </w:r>
-    </w:p>
-    <w:p>
-      <w:pPr>
-        <w:numPr>
-          <w:ilvl w:val="0"/>
-          <w:numId w:val="1"/>
-        </w:numPr>
-        <w:spacing w:after="60"/>
-      </w:pPr>
-      <w:r>
-        <w:t xml:space="preserve">☐ Configure LimeSurvey API connection to EspoCRM for response posting.</w:t>
-      </w:r>
-    </w:p>
-    <w:p>
-      <w:pPr>
-        <w:numPr>
-          <w:ilvl w:val="0"/>
-          <w:numId w:val="1"/>
-        </w:numPr>
-        <w:spacing w:after="60"/>
-      </w:pPr>
-      <w:r>
-        <w:t xml:space="preserve">☐ Test end-to-end survey delivery and response capture before go-live.</w:t>
-      </w:r>
-    </w:p>
-    <w:p>
-      <w:r>
-        <w:t xml:space="preserve"/>
-      </w:r>
-    </w:p>
-    <w:p>
-      <w:pPr>
-        <w:pStyle w:val="Heading2"/>
-      </w:pPr>
-      <w:r>
-        <w:t xml:space="preserve">6.7 Workshop Entity</w:t>
-      </w:r>
-    </w:p>
-    <w:p>
-      <w:pPr>
-        <w:spacing w:after="120"/>
-      </w:pPr>
-      <w:r>
-        <w:t xml:space="preserve">Create the Workshop entity as a custom entity.</w:t>
-      </w:r>
-    </w:p>
-    <w:p>
-      <w:r>
-        <w:t xml:space="preserve"/>
-      </w:r>
-    </w:p>
-    <w:p>
-      <w:pPr>
-        <w:numPr>
-          <w:ilvl w:val="0"/>
-          <w:numId w:val="1"/>
-        </w:numPr>
-        <w:spacing w:after="60"/>
-      </w:pPr>
-      <w:r>
-        <w:t xml:space="preserve">☐ Create the Workshop custom entity.</w:t>
-      </w:r>
-    </w:p>
-    <w:p>
-      <w:pPr>
-        <w:numPr>
-          <w:ilvl w:val="0"/>
-          <w:numId w:val="1"/>
-        </w:numPr>
-        <w:spacing w:after="60"/>
-      </w:pPr>
-      <w:r>
-        <w:t xml:space="preserve">☐ Add Title field (text).</w:t>
-      </w:r>
-    </w:p>
-    <w:p>
-      <w:pPr>
-        <w:numPr>
-          <w:ilvl w:val="0"/>
-          <w:numId w:val="1"/>
-        </w:numPr>
-        <w:spacing w:after="60"/>
-      </w:pPr>
-      <w:r>
-        <w:t xml:space="preserve">☐ Add Date/Time field (date/time).</w:t>
-      </w:r>
-    </w:p>
-    <w:p>
-      <w:pPr>
-        <w:numPr>
-          <w:ilvl w:val="0"/>
-          <w:numId w:val="1"/>
-        </w:numPr>
-        <w:spacing w:after="60"/>
-      </w:pPr>
-      <w:r>
-        <w:t xml:space="preserve">☐ Add Topic/Category field (dropdown, aligned with Mentoring Focus Areas values).</w:t>
-      </w:r>
-    </w:p>
-    <w:p>
-      <w:pPr>
-        <w:numPr>
-          <w:ilvl w:val="0"/>
-          <w:numId w:val="1"/>
-        </w:numPr>
-        <w:spacing w:after="60"/>
-      </w:pPr>
-      <w:r>
-        <w:t xml:space="preserve">☐ Add Presenter field (text or link to Contact).</w:t>
-      </w:r>
-    </w:p>
-    <w:p>
-      <w:pPr>
-        <w:numPr>
-          <w:ilvl w:val="0"/>
-          <w:numId w:val="1"/>
-        </w:numPr>
-        <w:spacing w:after="60"/>
-      </w:pPr>
-      <w:r>
-        <w:t xml:space="preserve">☐ Add Location field (text).</w:t>
-      </w:r>
-    </w:p>
-    <w:p>
-      <w:pPr>
-        <w:numPr>
-          <w:ilvl w:val="0"/>
-          <w:numId w:val="1"/>
-        </w:numPr>
-        <w:spacing w:after="60"/>
-      </w:pPr>
-      <w:r>
-        <w:t xml:space="preserve">☐ Add Description field (rich text).</w:t>
-      </w:r>
-    </w:p>
-    <w:p>
-      <w:pPr>
-        <w:numPr>
-          <w:ilvl w:val="0"/>
-          <w:numId w:val="1"/>
-        </w:numPr>
-        <w:spacing w:after="60"/>
-      </w:pPr>
-      <w:r>
-        <w:t xml:space="preserve">☐ Add Maximum Capacity field (integer).</w:t>
-      </w:r>
-    </w:p>
-    <w:p>
-      <w:pPr>
-        <w:numPr>
-          <w:ilvl w:val="0"/>
-          <w:numId w:val="1"/>
-        </w:numPr>
-        <w:spacing w:after="60"/>
-      </w:pPr>
-      <w:r>
-        <w:t xml:space="preserve">☐ Add Status field (dropdown) with values: Scheduled, Completed, Cancelled.</w:t>
-      </w:r>
-    </w:p>
-    <w:p>
-      <w:pPr>
-        <w:numPr>
-          <w:ilvl w:val="0"/>
-          <w:numId w:val="1"/>
-        </w:numPr>
-        <w:spacing w:after="60"/>
-      </w:pPr>
-      <w:r>
-        <w:t xml:space="preserve">☐ Add Note and Document relationship panels to the Workshop detail view.</w:t>
-      </w:r>
-    </w:p>
-    <w:p>
-      <w:r>
-        <w:t xml:space="preserve"/>
-      </w:r>
-    </w:p>
-    <w:p>
-      <w:pPr>
-        <w:pStyle w:val="Heading2"/>
-      </w:pPr>
-      <w:r>
-        <w:t xml:space="preserve">6.8 Workshop Attendance Entity</w:t>
-      </w:r>
-    </w:p>
-    <w:p>
-      <w:pPr>
-        <w:spacing w:after="120"/>
-      </w:pPr>
-      <w:r>
-        <w:t xml:space="preserve">Create the Workshop Attendance entity as a custom entity.</w:t>
-      </w:r>
-    </w:p>
-    <w:p>
-      <w:r>
-        <w:t xml:space="preserve"/>
-      </w:r>
-    </w:p>
-    <w:p>
-      <w:pPr>
-        <w:numPr>
-          <w:ilvl w:val="0"/>
-          <w:numId w:val="1"/>
-        </w:numPr>
-        <w:spacing w:after="60"/>
-      </w:pPr>
-      <w:r>
-        <w:t xml:space="preserve">☐ Create the Workshop Attendance custom entity.</w:t>
-      </w:r>
-    </w:p>
-    <w:p>
-      <w:pPr>
-        <w:numPr>
-          <w:ilvl w:val="0"/>
-          <w:numId w:val="1"/>
-        </w:numPr>
-        <w:spacing w:after="60"/>
-      </w:pPr>
-      <w:r>
-        <w:t xml:space="preserve">☐ Add Workshop link field (link to Workshop entity).</w:t>
-      </w:r>
-    </w:p>
-    <w:p>
-      <w:pPr>
-        <w:numPr>
-          <w:ilvl w:val="0"/>
-          <w:numId w:val="1"/>
-        </w:numPr>
-        <w:spacing w:after="60"/>
-      </w:pPr>
-      <w:r>
-        <w:t xml:space="preserve">☐ Add Contact link field (link to Contact entity).</w:t>
-      </w:r>
-    </w:p>
-    <w:p>
-      <w:pPr>
-        <w:numPr>
-          <w:ilvl w:val="0"/>
-          <w:numId w:val="1"/>
-        </w:numPr>
-        <w:spacing w:after="60"/>
-      </w:pPr>
-      <w:r>
-        <w:t xml:space="preserve">☐ Add Engagement link field (link to Engagement entity).</w:t>
-      </w:r>
-    </w:p>
-    <w:p>
-      <w:pPr>
-        <w:numPr>
-          <w:ilvl w:val="0"/>
-          <w:numId w:val="1"/>
-        </w:numPr>
-        <w:spacing w:after="60"/>
-      </w:pPr>
-      <w:r>
-        <w:t xml:space="preserve">☐ Add Attendance Date field (date, auto-populated from linked Workshop).</w:t>
-      </w:r>
-    </w:p>
-    <w:p>
-      <w:pPr>
-        <w:numPr>
-          <w:ilvl w:val="0"/>
-          <w:numId w:val="1"/>
-        </w:numPr>
-        <w:spacing w:after="60"/>
-      </w:pPr>
-      <w:r>
-        <w:t xml:space="preserve">☐ Add Attended field (boolean yes/no, defaults to Yes).</w:t>
-      </w:r>
-    </w:p>
-    <w:p>
-      <w:r>
-        <w:t xml:space="preserve"/>
-      </w:r>
-    </w:p>
-    <w:p>
-      <w:pPr>
-        <w:pStyle w:val="Heading2"/>
-      </w:pPr>
-      <w:r>
-        <w:t xml:space="preserve">6.9 Relationships</w:t>
-      </w:r>
-    </w:p>
-    <w:p>
-      <w:pPr>
-        <w:spacing w:after="120"/>
-      </w:pPr>
-      <w:r>
-        <w:t xml:space="preserve">Configure all entity relationships and relationship panels as defined in Section 3. Verify each relationship displays correctly from both sides.</w:t>
-      </w:r>
-    </w:p>
-    <w:p>
-      <w:r>
-        <w:t xml:space="preserve"/>
-      </w:r>
-    </w:p>
-    <w:p>
-      <w:pPr>
-        <w:numPr>
-          <w:ilvl w:val="0"/>
-          <w:numId w:val="1"/>
-        </w:numPr>
-        <w:spacing w:after="60"/>
-      </w:pPr>
-      <w:r>
-        <w:t xml:space="preserve">☐ Configure Company → Contact relationship (one-to-many). Add Contact panel to Company detail view. Verify Company link appears on Contact detail view.</w:t>
-      </w:r>
-    </w:p>
-    <w:p>
-      <w:pPr>
-        <w:numPr>
-          <w:ilvl w:val="0"/>
-          <w:numId w:val="1"/>
-        </w:numPr>
-        <w:spacing w:after="60"/>
-      </w:pPr>
-      <w:r>
-        <w:t xml:space="preserve">☐ Configure Company → Engagement relationship (one-to-many). Add Engagement panel to Company detail view. Verify Company link appears on Engagement detail view.</w:t>
-      </w:r>
-    </w:p>
-    <w:p>
-      <w:pPr>
-        <w:numPr>
-          <w:ilvl w:val="0"/>
-          <w:numId w:val="1"/>
-        </w:numPr>
-        <w:spacing w:after="60"/>
-      </w:pPr>
-      <w:r>
-        <w:t xml:space="preserve">☐ Configure Engagement → Session relationship (one-to-many). Add Session panel to Engagement detail view. Verify Engagement link appears on Session detail view.</w:t>
-      </w:r>
-    </w:p>
-    <w:p>
-      <w:pPr>
-        <w:numPr>
-          <w:ilvl w:val="0"/>
-          <w:numId w:val="1"/>
-        </w:numPr>
-        <w:spacing w:after="60"/>
-      </w:pPr>
-      <w:r>
-        <w:t xml:space="preserve">☐ Configure Engagement → NPS Survey Response relationship (one-to-many). Add NPS Survey Response panel to Engagement detail view.</w:t>
-      </w:r>
-    </w:p>
-    <w:p>
-      <w:pPr>
-        <w:numPr>
-          <w:ilvl w:val="0"/>
-          <w:numId w:val="1"/>
-        </w:numPr>
-        <w:spacing w:after="60"/>
-      </w:pPr>
-      <w:r>
-        <w:t xml:space="preserve">☐ Configure Contact → Workshop Attendance relationship (one-to-many). Add Workshop Attendance panel to Contact detail view.</w:t>
-      </w:r>
-    </w:p>
-    <w:p>
-      <w:pPr>
-        <w:numPr>
-          <w:ilvl w:val="0"/>
-          <w:numId w:val="1"/>
-        </w:numPr>
-        <w:spacing w:after="60"/>
-      </w:pPr>
-      <w:r>
-        <w:t xml:space="preserve">☐ Configure Workshop → Workshop Attendance relationship (one-to-many). Add Workshop Attendance panel to Workshop detail view.</w:t>
-      </w:r>
-    </w:p>
-    <w:p>
-      <w:pPr>
-        <w:numPr>
-          <w:ilvl w:val="0"/>
-          <w:numId w:val="1"/>
-        </w:numPr>
-        <w:spacing w:after="60"/>
-      </w:pPr>
-      <w:r>
-        <w:t xml:space="preserve">☐ Configure Note many-to-many relationship panels on all entities: Company, Contact, Engagement, Session, NPS Survey Response, Workshop, Workshop Attendance.</w:t>
-      </w:r>
-    </w:p>
-    <w:p>
-      <w:pPr>
-        <w:numPr>
-          <w:ilvl w:val="0"/>
-          <w:numId w:val="1"/>
-        </w:numPr>
-        <w:spacing w:after="60"/>
-      </w:pPr>
-      <w:r>
-        <w:t xml:space="preserve">☐ Configure Document many-to-many relationship panels on all entities: Company, Contact, Engagement, Session, NPS Survey Response, Workshop, Workshop Attendance.</w:t>
-      </w:r>
-    </w:p>
-    <w:p>
-      <w:pPr>
-        <w:numPr>
-          <w:ilvl w:val="0"/>
-          <w:numId w:val="1"/>
-        </w:numPr>
-        <w:spacing w:after="60"/>
-      </w:pPr>
-      <w:r>
-        <w:t xml:space="preserve">☐ Configure Engagement → Engagement Contacts many-to-many relationship panel. Add Engagement Contacts panel to Engagement detail view. Verify Contact records show linked Engagements.</w:t>
-      </w:r>
-    </w:p>
-    <w:p>
-      <w:pPr>
-        <w:numPr>
-          <w:ilvl w:val="0"/>
-          <w:numId w:val="1"/>
-        </w:numPr>
-        <w:spacing w:after="60"/>
-      </w:pPr>
-      <w:r>
-        <w:t xml:space="preserve">☐ Verify Email and Calls activity panels are present on Company, Contact, and Engagement detail views.</w:t>
-      </w:r>
-    </w:p>
-    <w:p>
-      <w:r>
-        <w:t xml:space="preserve"/>
-      </w:r>
-    </w:p>
-    <w:p>
-      <w:pPr>
-        <w:pStyle w:val="Heading2"/>
-      </w:pPr>
-      <w:r>
-        <w:t xml:space="preserve">6.10 Role-Based Access Control</w:t>
-      </w:r>
-    </w:p>
-    <w:p>
-      <w:pPr>
-        <w:spacing w:after="120"/>
-      </w:pPr>
-      <w:r>
-        <w:t xml:space="preserve">Configure EspoCRM Roles and Teams to enforce the access rules defined in Section 5. Test each role by logging in as a test user with that role assigned.</w:t>
-      </w:r>
-    </w:p>
-    <w:p>
-      <w:r>
-        <w:t xml:space="preserve"/>
-      </w:r>
-    </w:p>
-    <w:p>
-      <w:pPr>
-        <w:numPr>
-          <w:ilvl w:val="0"/>
-          <w:numId w:val="1"/>
-        </w:numPr>
-        <w:spacing w:after="60"/>
-      </w:pPr>
-      <w:r>
-        <w:t xml:space="preserve">☐ Create or verify the Admin role with full Create/Read/Update/Delete access across all client domain entities.</w:t>
-      </w:r>
-    </w:p>
-    <w:p>
-      <w:pPr>
-        <w:numPr>
-          <w:ilvl w:val="0"/>
-          <w:numId w:val="1"/>
-        </w:numPr>
-        <w:spacing w:after="60"/>
-      </w:pPr>
-      <w:r>
-        <w:t xml:space="preserve">☐ Create the Primary Mentor role with Own Read/Update access on Company, Contact, and Engagement; Own Create/Read/Update on Session, Notes, and Documents; Own Read on NPS Survey Responses and Workshops.</w:t>
-      </w:r>
-    </w:p>
-    <w:p>
-      <w:pPr>
-        <w:numPr>
-          <w:ilvl w:val="0"/>
-          <w:numId w:val="1"/>
-        </w:numPr>
-        <w:spacing w:after="60"/>
-      </w:pPr>
-      <w:r>
-        <w:t xml:space="preserve">☐ Create the Co-Mentor role with the same permissions as Primary Mentor, scoped to assigned engagements only.</w:t>
-      </w:r>
-    </w:p>
-    <w:p>
-      <w:pPr>
-        <w:numPr>
-          <w:ilvl w:val="0"/>
-          <w:numId w:val="1"/>
-        </w:numPr>
-        <w:spacing w:after="60"/>
-      </w:pPr>
-      <w:r>
-        <w:t xml:space="preserve">☐ Create the SME role with Own Read access on Company, Contact, and Engagement; Own Create/Read/Update on Session, Notes, and Documents; Own Read on NPS Survey Responses.</w:t>
-      </w:r>
-    </w:p>
-    <w:p>
-      <w:pPr>
-        <w:numPr>
-          <w:ilvl w:val="0"/>
-          <w:numId w:val="1"/>
-        </w:numPr>
-        <w:spacing w:after="60"/>
-      </w:pPr>
-      <w:r>
-        <w:t xml:space="preserve">☐ Create the Board Member role with no access to individual client records. Configure access to aggregate reporting dashboards only.</w:t>
-      </w:r>
-    </w:p>
-    <w:p>
-      <w:pPr>
-        <w:numPr>
-          <w:ilvl w:val="0"/>
-          <w:numId w:val="1"/>
-        </w:numPr>
-        <w:spacing w:after="60"/>
-      </w:pPr>
-      <w:r>
-        <w:t xml:space="preserve">☐ Configure field-level access on EIN Number to restrict visibility to Admin and Primary Mentor roles only.</w:t>
-      </w:r>
-    </w:p>
-    <w:p>
-      <w:pPr>
-        <w:numPr>
-          <w:ilvl w:val="0"/>
-          <w:numId w:val="1"/>
-        </w:numPr>
-        <w:spacing w:after="60"/>
-      </w:pPr>
-      <w:r>
-        <w:t xml:space="preserve">☐ Configure Internal Only flag behavior on Note and Document entities to hide records from all non-Admin roles when flagged.</w:t>
-      </w:r>
-    </w:p>
-    <w:p>
-      <w:pPr>
-        <w:numPr>
-          <w:ilvl w:val="0"/>
-          <w:numId w:val="1"/>
-        </w:numPr>
-        <w:spacing w:after="60"/>
-      </w:pPr>
-      <w:r>
-        <w:t xml:space="preserve">☐ Configure Teams to enforce record-level visibility scoping — mentors see only records linked to their assigned Engagements.</w:t>
-      </w:r>
-    </w:p>
-    <w:p>
-      <w:pPr>
-        <w:numPr>
-          <w:ilvl w:val="0"/>
-          <w:numId w:val="1"/>
-        </w:numPr>
-        <w:spacing w:after="60"/>
-      </w:pPr>
-      <w:r>
-        <w:t xml:space="preserve">☐ Test each role by logging in as a test user and verifying correct visibility and action permissions across all entity types.</w:t>
-      </w:r>
-    </w:p>
-    <w:p>
-      <w:r>
-        <w:t xml:space="preserve"/>
-      </w:r>
-    </w:p>
-    <w:p>
-      <w:pPr>
-        <w:pStyle w:val="Heading2"/>
-      </w:pPr>
-      <w:r>
-        <w:t xml:space="preserve">6.11 Workflows and Automation</w:t>
-      </w:r>
-    </w:p>
-    <w:p>
-      <w:pPr>
-        <w:spacing w:after="120"/>
-      </w:pPr>
-      <w:r>
-        <w:t xml:space="preserve">Configure EspoCRM workflow rules to automate the processes defined in Section 4. Test each workflow in a development environment before enabling in production.</w:t>
-      </w:r>
-    </w:p>
-    <w:p>
-      <w:r>
-        <w:t xml:space="preserve"/>
-      </w:r>
-    </w:p>
-    <w:p>
-      <w:pPr>
-        <w:numPr>
-          <w:ilvl w:val="0"/>
-          <w:numId w:val="1"/>
-        </w:numPr>
-        <w:spacing w:after="60"/>
-      </w:pPr>
-      <w:r>
-        <w:t xml:space="preserve">☐ Configure intake workflow: on new Engagement record creation via REST API, set Status = Submitted and notify admin.</w:t>
-      </w:r>
-    </w:p>
-    <w:p>
-      <w:pPr>
-        <w:numPr>
-          <w:ilvl w:val="0"/>
-          <w:numId w:val="1"/>
-        </w:numPr>
-        <w:spacing w:after="60"/>
-      </w:pPr>
-      <w:r>
-        <w:t xml:space="preserve">☐ Configure mentor nomination workflow: on Engagement Status change to Pending Acceptance, send acceptance/refusal notification email to nominated mentor with configurable acceptance window (default 48 hours).</w:t>
-      </w:r>
-    </w:p>
-    <w:p>
-      <w:pPr>
-        <w:numPr>
-          <w:ilvl w:val="0"/>
-          <w:numId w:val="1"/>
-        </w:numPr>
-        <w:spacing w:after="60"/>
-      </w:pPr>
-      <w:r>
-        <w:t xml:space="preserve">☐ Configure mentor refusal workflow: on mentor refusal action, revert Engagement Status to Submitted and notify admin.</w:t>
-      </w:r>
-    </w:p>
-    <w:p>
-      <w:pPr>
-        <w:numPr>
-          <w:ilvl w:val="0"/>
-          <w:numId w:val="1"/>
-        </w:numPr>
-        <w:spacing w:after="60"/>
-      </w:pPr>
-      <w:r>
-        <w:t xml:space="preserve">☐ Configure acceptance window alert: if no mentor response within configured threshold, notify admin to follow up.</w:t>
-      </w:r>
-    </w:p>
-    <w:p>
-      <w:pPr>
-        <w:numPr>
-          <w:ilvl w:val="0"/>
-          <w:numId w:val="1"/>
-        </w:numPr>
-        <w:spacing w:after="60"/>
-      </w:pPr>
-      <w:r>
-        <w:t xml:space="preserve">☐ Configure first session workflow: on first Session record created against an Assigned Engagement, change Engagement Status to Active.</w:t>
-      </w:r>
-    </w:p>
-    <w:p>
-      <w:pPr>
-        <w:numPr>
-          <w:ilvl w:val="0"/>
-          <w:numId w:val="1"/>
-        </w:numPr>
-        <w:spacing w:after="60"/>
-      </w:pPr>
-      <w:r>
-        <w:t xml:space="preserve">☐ Configure inactivity monitoring workflow: daily check of Last Activity Date against cadence-aware Dormant threshold per Meeting Cadence setting. Change Status to Dormant and notify admin when threshold exceeded.</w:t>
-      </w:r>
-    </w:p>
-    <w:p>
-      <w:pPr>
-        <w:numPr>
-          <w:ilvl w:val="0"/>
-          <w:numId w:val="1"/>
-        </w:numPr>
-        <w:spacing w:after="60"/>
-      </w:pPr>
-      <w:r>
-        <w:t xml:space="preserve">☐ Configure Dormant-to-Inactive workflow: change Status to Inactive after configurable additional period (default 60 days) with no activity.</w:t>
-      </w:r>
-    </w:p>
-    <w:p>
-      <w:pPr>
-        <w:numPr>
-          <w:ilvl w:val="0"/>
-          <w:numId w:val="1"/>
-        </w:numPr>
-        <w:spacing w:after="60"/>
-      </w:pPr>
-      <w:r>
-        <w:t xml:space="preserve">☐ Configure Inactive-to-Abandoned workflow: change Status to Abandoned after configurable period (default 90 days). Trigger final NPS survey. Notify admin.</w:t>
-      </w:r>
-    </w:p>
-    <w:p>
-      <w:pPr>
-        <w:numPr>
-          <w:ilvl w:val="0"/>
-          <w:numId w:val="1"/>
-        </w:numPr>
-        <w:spacing w:after="60"/>
-      </w:pPr>
-      <w:r>
-        <w:t xml:space="preserve">☐ Configure NPS trigger workflow: after 2nd Session, trigger LimeSurvey API call to send survey to client. Repeat every 5 sessions thereafter.</w:t>
-      </w:r>
-    </w:p>
-    <w:p>
-      <w:pPr>
-        <w:numPr>
-          <w:ilvl w:val="0"/>
-          <w:numId w:val="1"/>
-        </w:numPr>
-        <w:spacing w:after="60"/>
-      </w:pPr>
-      <w:r>
-        <w:t xml:space="preserve">☐ Configure Engagement Close NPS trigger: on Status change to Completed or Abandoned, trigger final LimeSurvey API call.</w:t>
-      </w:r>
-    </w:p>
-    <w:p>
-      <w:pPr>
-        <w:numPr>
-          <w:ilvl w:val="0"/>
-          <w:numId w:val="1"/>
-        </w:numPr>
-        <w:spacing w:after="60"/>
-      </w:pPr>
-      <w:r>
-        <w:t xml:space="preserve">☐ Configure email auto-link workflow: automatically link inbound and outbound emails to the active Engagement when linked to a Contact with an active Engagement.</w:t>
-      </w:r>
-    </w:p>
-    <w:p>
-      <w:pPr>
-        <w:numPr>
-          <w:ilvl w:val="0"/>
-          <w:numId w:val="1"/>
-        </w:numPr>
-        <w:spacing w:after="60"/>
-      </w:pPr>
-      <w:r>
-        <w:t xml:space="preserve">☐ Configure meeting request workflow: when Next Session Date/Time is saved on the Engagement record (new or updated value), automatically send a calendar meeting request to all Engagement Contacts (or Primary Contact if panel is empty) and all assigned mentors (Primary Mentor, Co-Mentors, SMEs).</w:t>
-      </w:r>
-    </w:p>
-    <w:p>
-      <w:pPr>
-        <w:numPr>
-          <w:ilvl w:val="0"/>
-          <w:numId w:val="1"/>
-        </w:numPr>
-        <w:spacing w:after="60"/>
-      </w:pPr>
-      <w:r>
-        <w:t xml:space="preserve">☐ Configure session summary email draft workflow: when a Session record is saved, auto-generate a draft summary email from Topics Covered, Next Steps, and Next Session Date/Time, presented to the mentor for review and approval before sending. Configure recipients as Engagement Contacts (or Primary Contact if empty).</w:t>
-      </w:r>
-    </w:p>
-    <w:p>
-      <w:pPr>
-        <w:numPr>
-          <w:ilvl w:val="0"/>
-          <w:numId w:val="1"/>
-        </w:numPr>
-        <w:spacing w:after="60"/>
-      </w:pPr>
-      <w:r>
-        <w:t xml:space="preserve">☐ Set all configurable thresholds as admin-accessible system settings: acceptance window, Dormant thresholds per cadence, Inactive threshold, Abandoned threshold.</w:t>
-      </w:r>
-    </w:p>
-    <w:p>
-      <w:pPr>
-        <w:numPr>
-          <w:ilvl w:val="0"/>
-          <w:numId w:val="1"/>
-        </w:numPr>
-        <w:spacing w:after="60"/>
-      </w:pPr>
-      <w:r>
-        <w:t xml:space="preserve">☐ Test all workflows end-to-end in a development environment before enabling in production.</w:t>
-      </w:r>
-    </w:p>
-    <w:p>
-      <w:r>
-        <w:t xml:space="preserve"/>
-      </w:r>
-    </w:p>
-    <w:p>
-      <w:pPr>
-        <w:pStyle w:val="Heading2"/>
-      </w:pPr>
-      <w:r>
-        <w:t xml:space="preserve">6.12 Global Search Presets</w:t>
-      </w:r>
-    </w:p>
-    <w:p>
-      <w:pPr>
-        <w:spacing w:after="120"/>
-      </w:pPr>
-      <w:r>
-        <w:t xml:space="preserve">Configure global search presets for admin use across the client domain entities. These should be created as global presets visible to all users.</w:t>
-      </w:r>
-    </w:p>
-    <w:p>
-      <w:r>
-        <w:t xml:space="preserve"/>
-      </w:r>
-    </w:p>
-    <w:p>
-      <w:pPr>
-        <w:numPr>
-          <w:ilvl w:val="0"/>
-          <w:numId w:val="1"/>
-        </w:numPr>
-        <w:spacing w:after="60"/>
-      </w:pPr>
-      <w:r>
-        <w:t xml:space="preserve">☐ Create Engagement presets: Submitted Engagements, Pending Acceptance, Active Engagements, Dormant Engagements, Inactive Engagements, Abandoned Engagements, Completed Engagements.</w:t>
-      </w:r>
-    </w:p>
-    <w:p>
-      <w:pPr>
-        <w:numPr>
-          <w:ilvl w:val="0"/>
-          <w:numId w:val="1"/>
-        </w:numPr>
-        <w:spacing w:after="60"/>
-      </w:pPr>
-      <w:r>
-        <w:t xml:space="preserve">☐ Create Company presets: All Companies, Companies with Active Engagements, Companies with No Active Engagement.</w:t>
-      </w:r>
-    </w:p>
-    <w:p>
-      <w:pPr>
-        <w:numPr>
-          <w:ilvl w:val="0"/>
-          <w:numId w:val="1"/>
-        </w:numPr>
-        <w:spacing w:after="60"/>
-      </w:pPr>
-      <w:r>
-        <w:t xml:space="preserve">☐ Create Session presets: Sessions This Month, Sessions This Quarter.</w:t>
-      </w:r>
-    </w:p>
-    <w:p>
-      <w:pPr>
-        <w:numPr>
-          <w:ilvl w:val="0"/>
-          <w:numId w:val="1"/>
-        </w:numPr>
-        <w:spacing w:after="60"/>
-      </w:pPr>
-      <w:r>
-        <w:t xml:space="preserve">☐ Create NPS Survey Response presets: Recent NPS Responses, Low NPS Scores (0-6).</w:t>
-      </w:r>
-    </w:p>
-    <w:p>
-      <w:pPr>
-        <w:numPr>
-          <w:ilvl w:val="0"/>
-          <w:numId w:val="1"/>
-        </w:numPr>
-        <w:spacing w:after="60"/>
-      </w:pPr>
-      <w:r>
-        <w:t xml:space="preserve">☐ Create Note preset: My Notes (filtered by Created By = current user).</w:t>
-      </w:r>
-    </w:p>
-    <w:p>
-      <w:r>
-        <w:t xml:space="preserve"/>
-      </w:r>
-    </w:p>
-    <w:p>
-      <w:pPr>
-        <w:pStyle w:val="Heading2"/>
-      </w:pPr>
-      <w:r>
-        <w:t xml:space="preserve">6.13 Testing and Validation</w:t>
-      </w:r>
-    </w:p>
-    <w:p>
-      <w:pPr>
-        <w:spacing w:after="120"/>
-      </w:pPr>
-      <w:r>
-        <w:t xml:space="preserve">Complete end-to-end testing of the full client domain before go-live. Each test should be performed with a test user account in the appropriate role.</w:t>
-      </w:r>
-    </w:p>
-    <w:p>
-      <w:r>
-        <w:t xml:space="preserve"/>
-      </w:r>
-    </w:p>
-    <w:p>
-      <w:pPr>
-        <w:numPr>
-          <w:ilvl w:val="0"/>
-          <w:numId w:val="1"/>
-        </w:numPr>
-        <w:spacing w:after="60"/>
-      </w:pPr>
-      <w:r>
-        <w:t xml:space="preserve">☐ Submit a test Mentoring Request via the WordPress intake form and verify Company, Contact, and Engagement records are created correctly in EspoCRM.</w:t>
-      </w:r>
-    </w:p>
-    <w:p>
-      <w:pPr>
-        <w:numPr>
-          <w:ilvl w:val="0"/>
-          <w:numId w:val="1"/>
-        </w:numPr>
-        <w:spacing w:after="60"/>
-      </w:pPr>
-      <w:r>
-        <w:t xml:space="preserve">☐ Test mentor nomination workflow: nominate a mentor, verify notification sent, test acceptance path and refusal path.</w:t>
-      </w:r>
-    </w:p>
-    <w:p>
-      <w:pPr>
-        <w:numPr>
-          <w:ilvl w:val="0"/>
-          <w:numId w:val="1"/>
-        </w:numPr>
-        <w:spacing w:after="60"/>
-      </w:pPr>
-      <w:r>
-        <w:t xml:space="preserve">☐ Test Phase 2 form delivery and verify response data populates correct Company fields.</w:t>
-      </w:r>
-    </w:p>
-    <w:p>
-      <w:pPr>
-        <w:numPr>
-          <w:ilvl w:val="0"/>
-          <w:numId w:val="1"/>
-        </w:numPr>
-        <w:spacing w:after="60"/>
-      </w:pPr>
-      <w:r>
-        <w:t xml:space="preserve">☐ Log a test Session and verify Engagement roll-up fields update correctly (Total Sessions, Last Session Date, Total Session Hours, Total Sessions Last 30 Days).</w:t>
-      </w:r>
-    </w:p>
-    <w:p>
-      <w:pPr>
-        <w:numPr>
-          <w:ilvl w:val="0"/>
-          <w:numId w:val="1"/>
-        </w:numPr>
-        <w:spacing w:after="60"/>
-      </w:pPr>
-      <w:r>
-        <w:t xml:space="preserve">☐ Test NPS survey trigger at 2nd session: verify LimeSurvey sends survey and response posts back to EspoCRM as NPS Survey Response record.</w:t>
-      </w:r>
-    </w:p>
-    <w:p>
-      <w:pPr>
-        <w:numPr>
-          <w:ilvl w:val="0"/>
-          <w:numId w:val="1"/>
-        </w:numPr>
-        <w:spacing w:after="60"/>
-      </w:pPr>
-      <w:r>
-        <w:t xml:space="preserve">☐ Test inactivity monitoring by manually advancing dates and verifying Dormant, Inactive, and Abandoned status transitions fire correctly.</w:t>
-      </w:r>
-    </w:p>
-    <w:p>
-      <w:pPr>
-        <w:numPr>
-          <w:ilvl w:val="0"/>
-          <w:numId w:val="1"/>
-        </w:numPr>
-        <w:spacing w:after="60"/>
-      </w:pPr>
-      <w:r>
-        <w:t xml:space="preserve">☐ Test role-based access by logging in as each role and verifying correct record visibility, field visibility, and action permissions.</w:t>
-      </w:r>
-    </w:p>
-    <w:p>
-      <w:pPr>
-        <w:numPr>
-          <w:ilvl w:val="0"/>
-          <w:numId w:val="1"/>
-        </w:numPr>
-        <w:spacing w:after="60"/>
-      </w:pPr>
-      <w:r>
-        <w:t xml:space="preserve">☐ Test Internal Only Note and Document visibility: create an Internal Only record as Admin, verify it is hidden from Mentor role.</w:t>
-      </w:r>
-    </w:p>
-    <w:p>
-      <w:pPr>
-        <w:numPr>
-          <w:ilvl w:val="0"/>
-          <w:numId w:val="1"/>
-        </w:numPr>
-        <w:spacing w:after="60"/>
-      </w:pPr>
-      <w:r>
-        <w:t xml:space="preserve">☐ Test EIN Number field-level access: verify Co-Mentor and SME roles cannot see the field.</w:t>
-      </w:r>
-    </w:p>
-    <w:p>
-      <w:pPr>
-        <w:numPr>
-          <w:ilvl w:val="0"/>
-          <w:numId w:val="1"/>
-        </w:numPr>
-        <w:spacing w:after="60"/>
-      </w:pPr>
-      <w:r>
-        <w:t xml:space="preserve">☐ Test email auto-link workflow: send an email from mentor Gmail, verify it appears on both the Contact and Engagement activity streams.</w:t>
-      </w:r>
-    </w:p>
-    <w:p>
-      <w:pPr>
-        <w:numPr>
-          <w:ilvl w:val="0"/>
-          <w:numId w:val="1"/>
-        </w:numPr>
-        <w:spacing w:after="60"/>
-      </w:pPr>
-      <w:r>
-        <w:t xml:space="preserve">☐ Test global search presets: verify all presets return expected results.</w:t>
-      </w:r>
-    </w:p>
-    <w:p>
-      <w:pPr>
-        <w:numPr>
-          <w:ilvl w:val="0"/>
-          <w:numId w:val="1"/>
-        </w:numPr>
-        <w:spacing w:after="60"/>
-      </w:pPr>
-      <w:r>
-        <w:t xml:space="preserve">☐ Conduct a full end-to-end walkthrough of the client lifecycle from intake through engagement close with a test admin and test mentor account.</w:t>
-      </w:r>
-    </w:p>
-    <w:p>
-      <w:r>
-        <w:t xml:space="preserve"/>
-      </w:r>
-    </w:p>
-    <w:p>
-      <w:pPr>
         <w:pStyle w:val="Heading1"/>
       </w:pPr>
       <w:r>
-        <w:t xml:space="preserve">7. Document Control</w:t>
+        <w:t xml:space="preserve">6. Document Control</w:t>
       </w:r>
     </w:p>
     <w:tbl>
@@ -16167,7 +14225,7 @@
                 <w:sz w:val="20"/>
                 <w:szCs w:val="20"/>
               </w:rPr>
-              <w:t xml:space="preserve">1.7</w:t>
+              <w:t xml:space="preserve">1.8</w:t>
             </w:r>
           </w:p>
         </w:tc>

</xml_diff>

<commit_message>
Add Declined status to Engagement: status list, dropdown values, Close Date field, Section 4.1 workflow
</commit_message>
<xml_diff>
--- a/PRDs/CBM-PRD-CRM-Client.docx
+++ b/PRDs/CBM-PRD-CRM-Client.docx
@@ -2956,6 +2956,18 @@
         <w:spacing w:after="60"/>
       </w:pPr>
       <w:r>
+        <w:t xml:space="preserve">Declined — Admin has reviewed the application and determined the request is not suitable for the program. Terminal status. No mentor assignment occurs. Admin notifies the applicant via email. The Contact and Company records are retained permanently for historical reference.</w:t>
+      </w:r>
+    </w:p>
+    <w:p>
+      <w:pPr>
+        <w:numPr>
+          <w:ilvl w:val="0"/>
+          <w:numId w:val="1"/>
+        </w:numPr>
+        <w:spacing w:after="60"/>
+      </w:pPr>
+      <w:r>
         <w:t xml:space="preserve">Pending Acceptance — Admin has nominated a mentor; system has notified the mentor and is awaiting their acceptance or refusal. A configurable acceptance window applies (default: 48 hours). If the mentor refuses, the Engagement reverts to Submitted and the admin is notified to nominate another mentor.</w:t>
       </w:r>
     </w:p>
@@ -3250,7 +3262,7 @@
                 <w:sz w:val="18"/>
                 <w:szCs w:val="18"/>
               </w:rPr>
-              <w:t xml:space="preserve">Dropdown. Values: Submitted | Assigned | Active | On-Hold | Inactive | Abandoned | Completed. Required.</w:t>
+              <w:t xml:space="preserve">Dropdown. Values: Submitted | Declined | Pending Acceptance | Assigned | Active | On-Hold | Inactive | Abandoned | Completed. Required.</w:t>
             </w:r>
           </w:p>
         </w:tc>
@@ -3366,7 +3378,7 @@
                 <w:sz w:val="18"/>
                 <w:szCs w:val="18"/>
               </w:rPr>
-              <w:t xml:space="preserve">Date the engagement was closed (Completed or Abandoned). Date field. System-populated on status change to Completed or Abandoned.</w:t>
+              <w:t xml:space="preserve">Date the engagement was closed (Completed, Abandoned, or Declined). Date field. System-populated on status change to Completed, Abandoned, or Declined.</w:t>
             </w:r>
           </w:p>
         </w:tc>
@@ -7273,7 +7285,7 @@
         <w:spacing w:after="60"/>
       </w:pPr>
       <w:r>
-        <w:t xml:space="preserve">If eligible, admin proceeds to mentor nomination (see Section 4.2). If not eligible, admin updates the Engagement status to Abandoned with Close Reason: Other, and notifies the applicant via email.</w:t>
+        <w:t xml:space="preserve">If eligible, admin proceeds to mentor nomination (see Section 4.2). If not eligible, admin updates the Engagement status to Declined and notifies the applicant via email. No automated notification is sent. The Contact and Company records are retained permanently for historical reference.</w:t>
       </w:r>
     </w:p>
     <w:p>

</xml_diff>

<commit_message>
Client PRD v1.4: Clarify 4.1 step 3 — admin uses New Client Submissions preset view, not automatic notification
</commit_message>
<xml_diff>
--- a/PRDs/CBM-PRD-CRM-Client.docx
+++ b/PRDs/CBM-PRD-CRM-Client.docx
@@ -46,7 +46,7 @@
           <w:sz w:val="22"/>
           <w:szCs w:val="22"/>
         </w:rPr>
-        <w:t xml:space="preserve">Version 1.3  |  In Progress  |  March 15, 2026</w:t>
+        <w:t xml:space="preserve">Version 1.4  |  In Progress  |  March 15, 2026</w:t>
       </w:r>
     </w:p>
     <w:p>
@@ -7017,7 +7017,7 @@
         <w:spacing w:after="60"/>
       </w:pPr>
       <w:r>
-        <w:t xml:space="preserve">Admin receives an automatic system notification of the new submission.</w:t>
+        <w:t xml:space="preserve">Admin reviews new submissions by selecting the “New Client Submissions” global search preset on the Engagement entity, which displays all Engagement records with a status of Submitted.</w:t>
       </w:r>
     </w:p>
     <w:p>
@@ -15517,7 +15517,7 @@
         <w:spacing w:after="60"/>
       </w:pPr>
       <w:r>
-        <w:t xml:space="preserve">☐ Create Engagement presets: Submitted Engagements, Pending Acceptance, Active Engagements, Dormant Engagements, Inactive Engagements, Abandoned Engagements, Completed Engagements.</w:t>
+        <w:t xml:space="preserve">☐ Create Engagement presets: New Client Submissions (Status = Submitted — used by admin for daily intake review), Pending Acceptance, Active Engagements, Dormant Engagements, Inactive Engagements, Abandoned Engagements, Completed Engagements.</w:t>
       </w:r>
     </w:p>
     <w:p>
@@ -15887,7 +15887,7 @@
                 <w:sz w:val="20"/>
                 <w:szCs w:val="20"/>
               </w:rPr>
-              <w:t xml:space="preserve">1.3</w:t>
+              <w:t xml:space="preserve">1.4</w:t>
             </w:r>
           </w:p>
         </w:tc>

</xml_diff>

<commit_message>
Fixed git sucks mistake!
</commit_message>
<xml_diff>
--- a/PRDs/CBM-PRD-CRM-Client.docx
+++ b/PRDs/CBM-PRD-CRM-Client.docx
@@ -46,7 +46,7 @@
           <w:sz w:val="22"/>
           <w:szCs w:val="22"/>
         </w:rPr>
-        <w:t xml:space="preserve">Version 1.4  |  In Progress  |  March 18, 2026</w:t>
+        <w:t xml:space="preserve">Version 1.4  |  In Progress  |  March 15, 2026</w:t>
       </w:r>
     </w:p>
     <w:p>
@@ -899,64 +899,6 @@
                 <w:sz w:val="18"/>
                 <w:szCs w:val="18"/>
               </w:rPr>
-              <w:t xml:space="preserve">Company Role</w:t>
-            </w:r>
-          </w:p>
-        </w:tc>
-        <w:tc>
-          <w:tcPr>
-            <w:tcW w:type="dxa" w:w="6860"/>
-            <w:tcBorders>
-              <w:top w:val="single" w:color="CCCCCC" w:sz="1"/>
-              <w:left w:val="single" w:color="CCCCCC" w:sz="1"/>
-              <w:bottom w:val="single" w:color="CCCCCC" w:sz="1"/>
-              <w:right w:val="single" w:color="CCCCCC" w:sz="1"/>
-            </w:tcBorders>
-            <w:shd w:fill="FFFFFF" w:val="clear"/>
-            <w:tcMar>
-              <w:top w:type="dxa" w:w="80"/>
-              <w:left w:type="dxa" w:w="120"/>
-              <w:bottom w:type="dxa" w:w="80"/>
-              <w:right w:type="dxa" w:w="120"/>
-            </w:tcMar>
-          </w:tcPr>
-          <w:p>
-            <w:r>
-              <w:rPr>
-                <w:rFonts w:ascii="Arial" w:cs="Arial" w:eastAsia="Arial" w:hAnsi="Arial"/>
-                <w:sz w:val="18"/>
-                <w:szCs w:val="18"/>
-              </w:rPr>
-              <w:t xml:space="preserve">Dropdown. Values: Client Company | Mentoring Company | Partner Company | Sponsor Company | Vendor Company. Required. Identifies the company’s relationship to CBM. Cleveland Business Mentors is configured as Mentoring Company. Other mentoring organizations partnering with CBM would also use this value.</w:t>
-            </w:r>
-          </w:p>
-        </w:tc>
-      </w:tr>
-      <w:tr>
-        <w:tc>
-          <w:tcPr>
-            <w:tcW w:type="dxa" w:w="2500"/>
-            <w:tcBorders>
-              <w:top w:val="single" w:color="CCCCCC" w:sz="1"/>
-              <w:left w:val="single" w:color="CCCCCC" w:sz="1"/>
-              <w:bottom w:val="single" w:color="CCCCCC" w:sz="1"/>
-              <w:right w:val="single" w:color="CCCCCC" w:sz="1"/>
-            </w:tcBorders>
-            <w:shd w:fill="F2F2F2" w:val="clear"/>
-            <w:tcMar>
-              <w:top w:type="dxa" w:w="80"/>
-              <w:left w:type="dxa" w:w="120"/>
-              <w:bottom w:type="dxa" w:w="80"/>
-              <w:right w:type="dxa" w:w="120"/>
-            </w:tcMar>
-          </w:tcPr>
-          <w:p>
-            <w:r>
-              <w:rPr>
-                <w:rFonts w:ascii="Arial" w:cs="Arial" w:eastAsia="Arial" w:hAnsi="Arial"/>
-                <w:sz w:val="18"/>
-                <w:szCs w:val="18"/>
-              </w:rPr>
               <w:t xml:space="preserve">Business Stage</w:t>
             </w:r>
           </w:p>
@@ -7075,7 +7017,7 @@
         <w:spacing w:after="60"/>
       </w:pPr>
       <w:r>
-        <w:t xml:space="preserve">Admin receives an automatic system notification of the new submission.</w:t>
+        <w:t xml:space="preserve">Admin reviews new submissions by selecting the “New Client Submissions” global search preset on the Engagement entity, which displays all Engagement records with a status of Submitted.</w:t>
       </w:r>
     </w:p>
     <w:p>
@@ -14055,7 +13997,7 @@
         <w:spacing w:after="60"/>
       </w:pPr>
       <w:r>
-        <w:t xml:space="preserve">☐ Add Phase 1 fields to the Company entity: Organization Type (dropdown), Company Role (dropdown), Business Stage (dropdown), NAICS Sector (dropdown), NAICS Subsector (dropdown), Mentoring Focus Areas (multi-select), Mentoring Needs Description (rich text).</w:t>
+        <w:t xml:space="preserve">☐ Add Phase 1 fields to the Company entity: Organization Type (dropdown), Business Stage (dropdown), NAICS Sector (dropdown), NAICS Subsector (dropdown), Mentoring Focus Areas (multi-select), Mentoring Needs Description (rich text).</w:t>
       </w:r>
     </w:p>
     <w:p>
@@ -15575,7 +15517,7 @@
         <w:spacing w:after="60"/>
       </w:pPr>
       <w:r>
-        <w:t xml:space="preserve">☐ Create Engagement presets: Submitted Engagements, Pending Acceptance, Active Engagements, Dormant Engagements, Inactive Engagements, Abandoned Engagements, Completed Engagements.</w:t>
+        <w:t xml:space="preserve">☐ Create Engagement presets: New Client Submissions (Status = Submitted — used by admin for daily intake review), Pending Acceptance, Active Engagements, Dormant Engagements, Inactive Engagements, Abandoned Engagements, Completed Engagements.</w:t>
       </w:r>
     </w:p>
     <w:p>
@@ -16061,7 +16003,7 @@
                 <w:sz w:val="20"/>
                 <w:szCs w:val="20"/>
               </w:rPr>
-              <w:t xml:space="preserve">March 18, 2026</w:t>
+              <w:t xml:space="preserve">March 15, 2026</w:t>
             </w:r>
           </w:p>
         </w:tc>

</xml_diff>

<commit_message>
Client PRD: Add Mentor Declined status; sync Pending Acceptance and Dormant across all sections
</commit_message>
<xml_diff>
--- a/PRDs/CBM-PRD-CRM-Client.docx
+++ b/PRDs/CBM-PRD-CRM-Client.docx
@@ -94,23 +94,7 @@
       </w:pPr>
       <w:r>
         <w:rPr/>
-        <w:t xml:space="preserve">This document defines the complete CRM design and implementation specification for the </w:t>
-      </w:r>
-      <w:r>
-        <w:rPr/>
-        <w:t xml:space="preserve">CBM </w:t>
-      </w:r>
-      <w:r>
-        <w:rPr/>
-        <w:t xml:space="preserve">Client </w:t>
-      </w:r>
-      <w:r>
-        <w:rPr/>
-        <w:t>Entity</w:t>
-      </w:r>
-      <w:r>
-        <w:rPr/>
-        <w:t xml:space="preserve"> within CRM. It covers all client data structures, field definitions, entity relationships, workflows and automation, and role-based security rules.</w:t>
+        <w:t>This document defines the complete CRM design and implementation specification for the CBM Client Entity within CRM. It covers all client data structures, field definitions, entity relationships, workflows and automation, and role-based security rules.</w:t>
       </w:r>
     </w:p>
     <w:p>
@@ -2812,7 +2796,22 @@
       </w:pPr>
       <w:r>
         <w:rPr/>
-        <w:t>Pending Acceptance — Admin has nominated a mentor; system has notified the mentor and is awaiting their acceptance or refusal. A configurable acceptance window applies (default: 48 hours). If the mentor refuses, the Engagement reverts to Submitted and the admin is notified to nominate another mentor.</w:t>
+        <w:t>Pending Acceptance — Admin has nominated a mentor; system has notified the mentor and is awaiting their acceptance or refusal. A configurable acceptance window applies (default: 48 hours). If the mentor declines, the Engagement transitions to Mentor Declined and the admin is notified to nominate another mentor.</w:t>
+      </w:r>
+    </w:p>
+    <w:p>
+      <w:pPr>
+        <w:pStyle w:val="Normal"/>
+        <w:numPr>
+          <w:ilvl w:val="0"/>
+          <w:numId w:val="1"/>
+        </w:numPr>
+        <w:spacing w:before="0" w:after="60"/>
+        <w:rPr/>
+      </w:pPr>
+      <w:r>
+        <w:rPr/>
+        <w:t>Mentor Declined — The nominated mentor has declined the assignment. The admin uses the Mentor Declined view to identify these engagements and nominates a new mentor, starting the process over. No explanation is required from the declining mentor.</w:t>
       </w:r>
     </w:p>
     <w:p>
@@ -3124,7 +3123,7 @@
                 <w:sz w:val="18"/>
                 <w:szCs w:val="18"/>
               </w:rPr>
-              <w:t>Dropdown. Values: Submitted | Assigned | Active | On-Hold | Inactive | Abandoned | Completed. Required.</w:t>
+              <w:t>Dropdown. Values: Submitted | Pending Acceptance | Mentor Declined | Assigned | Active | On-Hold | Dormant | Inactive | Abandoned | Completed. Required.</w:t>
             </w:r>
           </w:p>
         </w:tc>
@@ -7381,23 +7380,7 @@
       </w:pPr>
       <w:r>
         <w:rPr/>
-        <w:t xml:space="preserve">Admin searches the </w:t>
-      </w:r>
-      <w:r>
-        <w:rPr/>
-        <w:t>Available M</w:t>
-      </w:r>
-      <w:r>
-        <w:rPr/>
-        <w:t xml:space="preserve">entor </w:t>
-      </w:r>
-      <w:r>
-        <w:rPr/>
-        <w:t xml:space="preserve">list under the Mentors/Contacts Entity and can </w:t>
-      </w:r>
-      <w:r>
-        <w:rPr/>
-        <w:t>filter by NAICS sector/subsector, Mentoring Focus Areas, skills/expertise tags, Active status, accepting clients = Yes, and available capacity.</w:t>
+        <w:t>Admin searches the Available Mentor list under the Mentors/Contacts Entity and can filter by NAICS sector/subsector, Mentoring Focus Areas, skills/expertise tags, Active status, accepting clients = Yes, and available capacity.</w:t>
       </w:r>
     </w:p>
     <w:p>
@@ -7412,47 +7395,7 @@
       </w:pPr>
       <w:r>
         <w:rPr/>
-        <w:t xml:space="preserve">Admin </w:t>
-      </w:r>
-      <w:r>
-        <w:rPr/>
-        <w:t xml:space="preserve">selects </w:t>
-      </w:r>
-      <w:r>
-        <w:rPr/>
-        <w:t xml:space="preserve">a primary mentor (and optionally one or more co-mentors and/or SMEs) </w:t>
-      </w:r>
-      <w:r>
-        <w:rPr/>
-        <w:t>on the Engagement form</w:t>
-      </w:r>
-      <w:r>
-        <w:rPr/>
-        <w:t xml:space="preserve">. </w:t>
-      </w:r>
-      <w:r>
-        <w:rPr/>
-        <w:t xml:space="preserve">The </w:t>
-      </w:r>
-      <w:r>
-        <w:rPr/>
-        <w:t xml:space="preserve">System </w:t>
-      </w:r>
-      <w:r>
-        <w:rPr/>
-        <w:t>only allows the Admin to select a M</w:t>
-      </w:r>
-      <w:r>
-        <w:rPr/>
-        <w:t xml:space="preserve">entor </w:t>
-      </w:r>
-      <w:r>
-        <w:rPr/>
-        <w:t xml:space="preserve">that </w:t>
-      </w:r>
-      <w:r>
-        <w:rPr/>
-        <w:t>is Active, accepting clients, and has capacity before allowing nomination.</w:t>
+        <w:t>Admin selects a primary mentor (and optionally one or more co-mentors and/or SMEs) on the Engagement form. The System only allows the Admin to select a Mentor that is Active, accepting clients, and has capacity before allowing nomination.</w:t>
       </w:r>
     </w:p>
     <w:p>
@@ -7467,19 +7410,7 @@
       </w:pPr>
       <w:r>
         <w:rPr/>
-        <w:t xml:space="preserve">The </w:t>
-      </w:r>
-      <w:r>
-        <w:rPr/>
-        <w:t xml:space="preserve">Engagement status </w:t>
-      </w:r>
-      <w:r>
-        <w:rPr/>
-        <w:t xml:space="preserve">is </w:t>
-      </w:r>
-      <w:r>
-        <w:rPr/>
-        <w:t>changes to Pending Acceptance.</w:t>
+        <w:t>The Engagement status is changes to Pending Acceptance.</w:t>
       </w:r>
     </w:p>
     <w:p>
@@ -7524,7 +7455,7 @@
       </w:pPr>
       <w:r>
         <w:rPr/>
-        <w:t>If the mentor refuses: Engagement status reverts to Submitted. Admin is notified and returns to Step 1 to nominate a different mentor. No explanation is required from the refusing mentor.</w:t>
+        <w:t>If the mentor declines: Engagement status is set to Mentor Declined. The admin determines the mentor declined using the Mentor Declined view and nominates a new mentor, starting the process over. No explanation is required from the declining mentor.</w:t>
       </w:r>
     </w:p>
     <w:p>
@@ -7554,19 +7485,7 @@
       </w:pPr>
       <w:r>
         <w:rPr/>
-        <w:t xml:space="preserve">Assigned </w:t>
-      </w:r>
-      <w:r>
-        <w:rPr/>
-        <w:t xml:space="preserve">Mentor </w:t>
-      </w:r>
-      <w:r>
-        <w:rPr/>
-        <w:t xml:space="preserve">accesses the Engagement record and </w:t>
-      </w:r>
-      <w:r>
-        <w:rPr/>
-        <w:t>sets the Meeting Cadence field on the Engagement record.</w:t>
+        <w:t>Assigned Mentor accesses the Engagement record and sets the Meeting Cadence field on the Engagement record.</w:t>
       </w:r>
     </w:p>
     <w:p>
@@ -7581,39 +7500,7 @@
       </w:pPr>
       <w:r>
         <w:rPr/>
-        <w:t xml:space="preserve">Mentor personally introduces themselves to the client via </w:t>
-      </w:r>
-      <w:r>
-        <w:rPr/>
-        <w:t xml:space="preserve">an </w:t>
-      </w:r>
-      <w:r>
-        <w:rPr/>
-        <w:t xml:space="preserve">email </w:t>
-      </w:r>
-      <w:r>
-        <w:rPr/>
-        <w:t>generated from the Engagement record</w:t>
-      </w:r>
-      <w:r>
-        <w:rPr/>
-        <w:t xml:space="preserve">. </w:t>
-      </w:r>
-      <w:r>
-        <w:rPr/>
-        <w:t>E</w:t>
-      </w:r>
-      <w:r>
-        <w:rPr/>
-        <w:t xml:space="preserve">mail templates are available to mentors as a starting point for personalized introductions. The introduction is sent by the mentor — not auto-generated by the system </w:t>
-      </w:r>
-      <w:r>
-        <w:rPr/>
-        <w:t>to maintain a more personable relationship</w:t>
-      </w:r>
-      <w:r>
-        <w:rPr/>
-        <w:t>.</w:t>
+        <w:t>Mentor personally introduces themselves to the client via an email generated from the Engagement record. Email templates are available to mentors as a starting point for personalized introductions. The introduction is sent by the mentor — not auto-generated by the system to maintain a more personable relationship.</w:t>
       </w:r>
     </w:p>
     <w:p>
@@ -7628,27 +7515,7 @@
       </w:pPr>
       <w:r>
         <w:rPr/>
-        <w:t xml:space="preserve">The collection of more detailed client information via the </w:t>
-      </w:r>
-      <w:r>
-        <w:rPr/>
-        <w:t xml:space="preserve">Phase 2 </w:t>
-      </w:r>
-      <w:r>
-        <w:rPr/>
-        <w:t xml:space="preserve">Client Registration </w:t>
-      </w:r>
-      <w:r>
-        <w:rPr/>
-        <w:t xml:space="preserve">form is at the mentor’s discretion. The mentor may include the Phase 2 form link in the introduction email or deploy it after the first session to </w:t>
-      </w:r>
-      <w:r>
-        <w:rPr/>
-        <w:t xml:space="preserve">give the mentor time to </w:t>
-      </w:r>
-      <w:r>
-        <w:rPr/>
-        <w:t>explain it in person.</w:t>
+        <w:t>The collection of more detailed client information via the Phase 2 Client Registration form is at the mentor’s discretion. The mentor may include the Phase 2 form link in the introduction email or deploy it after the first session to give the mentor time to explain it in person.</w:t>
       </w:r>
     </w:p>
     <w:p>
@@ -7663,15 +7530,7 @@
       </w:pPr>
       <w:r>
         <w:rPr/>
-        <w:t xml:space="preserve">Once the first session is logged, </w:t>
-      </w:r>
-      <w:r>
-        <w:rPr/>
-        <w:t xml:space="preserve">the </w:t>
-      </w:r>
-      <w:r>
-        <w:rPr/>
-        <w:t>Engagement status changes to Active.</w:t>
+        <w:t>Once the first session is logged, the Engagement status changes to Active.</w:t>
       </w:r>
     </w:p>
     <w:p>
@@ -7725,15 +7584,7 @@
       </w:pPr>
       <w:r>
         <w:rPr/>
-        <w:t xml:space="preserve">Mentor, co-mentor, or SME navigates to the Engagement record in CRM and creates a new Session record, </w:t>
-      </w:r>
-      <w:r>
-        <w:rPr/>
-        <w:t>or edits a previously scheduled Session Record</w:t>
-      </w:r>
-      <w:r>
-        <w:rPr/>
-        <w:t>.</w:t>
+        <w:t>Mentor, co-mentor, or SME navigates to the Engagement record in CRM and creates a new Session record, or edits a previously scheduled Session Record.</w:t>
       </w:r>
     </w:p>
     <w:p>
@@ -7868,23 +7719,7 @@
       </w:pPr>
       <w:r>
         <w:rPr/>
-        <w:t xml:space="preserve">NPS surveys are delivered via LimeSurvey  and triggered automatically by </w:t>
-      </w:r>
-      <w:r>
-        <w:rPr/>
-        <w:t xml:space="preserve">the </w:t>
-      </w:r>
-      <w:r>
-        <w:rPr/>
-        <w:t xml:space="preserve">CRM’s workflow engine based on session count per Engagement. Survey responses are posted back to </w:t>
-      </w:r>
-      <w:r>
-        <w:rPr/>
-        <w:t xml:space="preserve">the </w:t>
-      </w:r>
-      <w:r>
-        <w:rPr/>
-        <w:t>CRM via the LimeSurvey API and stored as NPS Survey Response records linked to the Engagement.</w:t>
+        <w:t>NPS surveys are delivered via LimeSurvey  and triggered automatically by the CRM’s workflow engine based on session count per Engagement. Survey responses are posted back to the CRM via the LimeSurvey API and stored as NPS Survey Response records linked to the Engagement.</w:t>
       </w:r>
     </w:p>
     <w:p>
@@ -7904,15 +7739,7 @@
       </w:pPr>
       <w:r>
         <w:rPr/>
-        <w:t>Trigger points</w:t>
-      </w:r>
-      <w:r>
-        <w:rPr/>
-        <w:t>(Proposed)</w:t>
-      </w:r>
-      <w:r>
-        <w:rPr/>
-        <w:t>:</w:t>
+        <w:t>Trigger points(Proposed):</w:t>
       </w:r>
     </w:p>
     <w:p>
@@ -15743,106 +15570,82 @@
       </w:pPr>
       <w:r>
         <w:rPr/>
-        <w:t xml:space="preserve">☐ </w:t>
-      </w:r>
-      <w:r>
-        <w:rPr/>
-        <w:t>Create the Note entity with all defined fields (Title, Body, Internal Only, Created By, Created Date/Time).</w:t>
-      </w:r>
-    </w:p>
-    <w:p>
-      <w:pPr>
-        <w:pStyle w:val="Normal"/>
-        <w:numPr>
-          <w:ilvl w:val="0"/>
-          <w:numId w:val="1"/>
-        </w:numPr>
-        <w:spacing w:before="0" w:after="60"/>
-        <w:rPr/>
-      </w:pPr>
-      <w:r>
-        <w:rPr/>
-        <w:t xml:space="preserve">☐ </w:t>
-      </w:r>
-      <w:r>
-        <w:rPr/>
-        <w:t>Create the Comment entity with all defined fields (Note link, Body, Created By, Created Date/Time).</w:t>
-      </w:r>
-    </w:p>
-    <w:p>
-      <w:pPr>
-        <w:pStyle w:val="Normal"/>
-        <w:numPr>
-          <w:ilvl w:val="0"/>
-          <w:numId w:val="1"/>
-        </w:numPr>
-        <w:spacing w:before="0" w:after="60"/>
-        <w:rPr/>
-      </w:pPr>
-      <w:r>
-        <w:rPr/>
-        <w:t xml:space="preserve">☐ </w:t>
-      </w:r>
-      <w:r>
-        <w:rPr/>
-        <w:t>Configure the Comment entity as a child relationship of the Note entity (one Note, many Comments).</w:t>
-      </w:r>
-    </w:p>
-    <w:p>
-      <w:pPr>
-        <w:pStyle w:val="Normal"/>
-        <w:numPr>
-          <w:ilvl w:val="0"/>
-          <w:numId w:val="1"/>
-        </w:numPr>
-        <w:spacing w:before="0" w:after="60"/>
-        <w:rPr/>
-      </w:pPr>
-      <w:r>
-        <w:rPr/>
-        <w:t xml:space="preserve">☐ </w:t>
-      </w:r>
-      <w:r>
-        <w:rPr/>
-        <w:t>Create the Document entity with all defined fields (Title, Document Type, Description, File Attachment, External URL, Internal Only, Created By, Created Date/Time).</w:t>
-      </w:r>
-    </w:p>
-    <w:p>
-      <w:pPr>
-        <w:pStyle w:val="Normal"/>
-        <w:numPr>
-          <w:ilvl w:val="0"/>
-          <w:numId w:val="1"/>
-        </w:numPr>
-        <w:spacing w:before="0" w:after="60"/>
-        <w:rPr/>
-      </w:pPr>
-      <w:r>
-        <w:rPr/>
-        <w:t xml:space="preserve">☐ </w:t>
-      </w:r>
-      <w:r>
-        <w:rPr/>
-        <w:t>Configure Internal Only field-level access on Note and Document entities to restrict visibility to Admin role only when flagged.</w:t>
-      </w:r>
-    </w:p>
-    <w:p>
-      <w:pPr>
-        <w:pStyle w:val="Normal"/>
-        <w:numPr>
-          <w:ilvl w:val="0"/>
-          <w:numId w:val="1"/>
-        </w:numPr>
-        <w:spacing w:before="0" w:after="60"/>
-        <w:rPr/>
-      </w:pPr>
-      <w:r>
-        <w:rPr/>
-        <w:t xml:space="preserve">☐ </w:t>
-      </w:r>
-      <w:r>
-        <w:rPr/>
-        <w:t>Create a “My Notes” global search preset on the Note entity filtered by Created By = current user, sorted by Created Date/Time descending.</w:t>
+        <w:t>☐ Create the Note entity with all defined fields (Title, Body, Internal Only, Created By, Created Date/Time).</w:t>
+      </w:r>
+    </w:p>
+    <w:p>
+      <w:pPr>
+        <w:pStyle w:val="Normal"/>
+        <w:numPr>
+          <w:ilvl w:val="0"/>
+          <w:numId w:val="1"/>
+        </w:numPr>
+        <w:spacing w:before="0" w:after="60"/>
+        <w:rPr/>
+      </w:pPr>
+      <w:r>
+        <w:rPr/>
+        <w:t>☐ Create the Comment entity with all defined fields (Note link, Body, Created By, Created Date/Time).</w:t>
+      </w:r>
+    </w:p>
+    <w:p>
+      <w:pPr>
+        <w:pStyle w:val="Normal"/>
+        <w:numPr>
+          <w:ilvl w:val="0"/>
+          <w:numId w:val="1"/>
+        </w:numPr>
+        <w:spacing w:before="0" w:after="60"/>
+        <w:rPr/>
+      </w:pPr>
+      <w:r>
+        <w:rPr/>
+        <w:t>☐ Configure the Comment entity as a child relationship of the Note entity (one Note, many Comments).</w:t>
+      </w:r>
+    </w:p>
+    <w:p>
+      <w:pPr>
+        <w:pStyle w:val="Normal"/>
+        <w:numPr>
+          <w:ilvl w:val="0"/>
+          <w:numId w:val="1"/>
+        </w:numPr>
+        <w:spacing w:before="0" w:after="60"/>
+        <w:rPr/>
+      </w:pPr>
+      <w:r>
+        <w:rPr/>
+        <w:t>☐ Create the Document entity with all defined fields (Title, Document Type, Description, File Attachment, External URL, Internal Only, Created By, Created Date/Time).</w:t>
+      </w:r>
+    </w:p>
+    <w:p>
+      <w:pPr>
+        <w:pStyle w:val="Normal"/>
+        <w:numPr>
+          <w:ilvl w:val="0"/>
+          <w:numId w:val="1"/>
+        </w:numPr>
+        <w:spacing w:before="0" w:after="60"/>
+        <w:rPr/>
+      </w:pPr>
+      <w:r>
+        <w:rPr/>
+        <w:t>☐ Configure Internal Only field-level access on Note and Document entities to restrict visibility to Admin role only when flagged.</w:t>
+      </w:r>
+    </w:p>
+    <w:p>
+      <w:pPr>
+        <w:pStyle w:val="Normal"/>
+        <w:numPr>
+          <w:ilvl w:val="0"/>
+          <w:numId w:val="1"/>
+        </w:numPr>
+        <w:spacing w:before="0" w:after="60"/>
+        <w:rPr/>
+      </w:pPr>
+      <w:r>
+        <w:rPr/>
+        <w:t>☐ Create a “My Notes” global search preset on the Note entity filtered by Created By = current user, sorted by Created Date/Time descending.</w:t>
       </w:r>
     </w:p>
     <w:p>
@@ -15896,182 +15699,142 @@
       </w:pPr>
       <w:r>
         <w:rPr/>
-        <w:t xml:space="preserve">☐ </w:t>
-      </w:r>
-      <w:r>
-        <w:rPr/>
-        <w:t>Relabel the Account entity display name to “Company” throughout the CRM UI via Entity Manager label settings.</w:t>
-      </w:r>
-    </w:p>
-    <w:p>
-      <w:pPr>
-        <w:pStyle w:val="Normal"/>
-        <w:numPr>
-          <w:ilvl w:val="0"/>
-          <w:numId w:val="1"/>
-        </w:numPr>
-        <w:spacing w:before="0" w:after="60"/>
-        <w:rPr/>
-      </w:pPr>
-      <w:r>
-        <w:rPr/>
-        <w:t xml:space="preserve">☐ </w:t>
-      </w:r>
-      <w:r>
-        <w:rPr/>
-        <w:t>Add Phase 1 fields to the Company entity: Organization Type (dropdown), Business Stage (dropdown), NAICS Sector (dropdown), NAICS Subsector (dropdown), Mentoring Focus Areas (multi-select), Mentoring Needs Description (rich text).</w:t>
-      </w:r>
-    </w:p>
-    <w:p>
-      <w:pPr>
-        <w:pStyle w:val="Normal"/>
-        <w:numPr>
-          <w:ilvl w:val="0"/>
-          <w:numId w:val="1"/>
-        </w:numPr>
-        <w:spacing w:before="0" w:after="60"/>
-        <w:rPr/>
-      </w:pPr>
-      <w:r>
-        <w:rPr/>
-        <w:t xml:space="preserve">☐ </w:t>
-      </w:r>
-      <w:r>
-        <w:rPr/>
-        <w:t>Add Phase 2 fields to the Company entity: Business Description, Time in Operation, Current Team Size, Revenue Range, Funding Situation, Current Challenges, Goals and Objectives, Desired Outcomes, Previous Mentoring/Advisory Experience (all rich text or appropriate field types per Section 2.2).</w:t>
-      </w:r>
-    </w:p>
-    <w:p>
-      <w:pPr>
-        <w:pStyle w:val="Normal"/>
-        <w:numPr>
-          <w:ilvl w:val="0"/>
-          <w:numId w:val="1"/>
-        </w:numPr>
-        <w:spacing w:before="0" w:after="60"/>
-        <w:rPr/>
-      </w:pPr>
-      <w:r>
-        <w:rPr/>
-        <w:t xml:space="preserve">☐ </w:t>
-      </w:r>
-      <w:r>
-        <w:rPr/>
-        <w:t>Add Professional Advisors field (multi-select checklist) with all defined values.</w:t>
-      </w:r>
-    </w:p>
-    <w:p>
-      <w:pPr>
-        <w:pStyle w:val="Normal"/>
-        <w:numPr>
-          <w:ilvl w:val="0"/>
-          <w:numId w:val="1"/>
-        </w:numPr>
-        <w:spacing w:before="0" w:after="60"/>
-        <w:rPr/>
-      </w:pPr>
-      <w:r>
-        <w:rPr/>
-        <w:t xml:space="preserve">☐ </w:t>
-      </w:r>
-      <w:r>
-        <w:rPr/>
-        <w:t>Add business registration fields: Registered with State, State of Registration, Legal Business Structure, EIN on File, Date of Formation, Registered Agent, EIN Number.</w:t>
-      </w:r>
-    </w:p>
-    <w:p>
-      <w:pPr>
-        <w:pStyle w:val="Normal"/>
-        <w:numPr>
-          <w:ilvl w:val="0"/>
-          <w:numId w:val="1"/>
-        </w:numPr>
-        <w:spacing w:before="0" w:after="60"/>
-        <w:rPr/>
-      </w:pPr>
-      <w:r>
-        <w:rPr/>
-        <w:t xml:space="preserve">☐ </w:t>
-      </w:r>
-      <w:r>
-        <w:rPr/>
-        <w:t>Configure Dynamic Logic to show/hide registration fields conditionally based on Registered with State value.</w:t>
-      </w:r>
-    </w:p>
-    <w:p>
-      <w:pPr>
-        <w:pStyle w:val="Normal"/>
-        <w:numPr>
-          <w:ilvl w:val="0"/>
-          <w:numId w:val="1"/>
-        </w:numPr>
-        <w:spacing w:before="0" w:after="60"/>
-        <w:rPr/>
-      </w:pPr>
-      <w:r>
-        <w:rPr/>
-        <w:t xml:space="preserve">☐ </w:t>
-      </w:r>
-      <w:r>
-        <w:rPr/>
-        <w:t>Configure field-level access on EIN Number to restrict visibility to Admin and assigned Primary Mentor only.</w:t>
-      </w:r>
-    </w:p>
-    <w:p>
-      <w:pPr>
-        <w:pStyle w:val="Normal"/>
-        <w:numPr>
-          <w:ilvl w:val="0"/>
-          <w:numId w:val="1"/>
-        </w:numPr>
-        <w:spacing w:before="0" w:after="60"/>
-        <w:rPr/>
-      </w:pPr>
-      <w:r>
-        <w:rPr/>
-        <w:t xml:space="preserve">☐ </w:t>
-      </w:r>
-      <w:r>
-        <w:rPr/>
-        <w:t>Organize all fields into logical panel groups on the Company detail view: Contact Information, Business Classification, Mentoring Context (Phase 1), Business Detail (Phase 2), Professional Advisors, Business Registration.</w:t>
-      </w:r>
-    </w:p>
-    <w:p>
-      <w:pPr>
-        <w:pStyle w:val="Normal"/>
-        <w:numPr>
-          <w:ilvl w:val="0"/>
-          <w:numId w:val="1"/>
-        </w:numPr>
-        <w:spacing w:before="0" w:after="60"/>
-        <w:rPr/>
-      </w:pPr>
-      <w:r>
-        <w:rPr/>
-        <w:t xml:space="preserve">☐ </w:t>
-      </w:r>
-      <w:r>
-        <w:rPr/>
-        <w:t>Configure Phase 2 panel group to be collapsible and clearly labeled as post-assignment information.</w:t>
-      </w:r>
-    </w:p>
-    <w:p>
-      <w:pPr>
-        <w:pStyle w:val="Normal"/>
-        <w:numPr>
-          <w:ilvl w:val="0"/>
-          <w:numId w:val="1"/>
-        </w:numPr>
-        <w:spacing w:before="0" w:after="60"/>
-        <w:rPr/>
-      </w:pPr>
-      <w:r>
-        <w:rPr/>
-        <w:t xml:space="preserve">☐ </w:t>
-      </w:r>
-      <w:r>
-        <w:rPr/>
-        <w:t>Add Note, Document, Email, and Calls relationship panels to the Company detail view.</w:t>
+        <w:t>☐ Relabel the Account entity display name to “Company” throughout the CRM UI via Entity Manager label settings.</w:t>
+      </w:r>
+    </w:p>
+    <w:p>
+      <w:pPr>
+        <w:pStyle w:val="Normal"/>
+        <w:numPr>
+          <w:ilvl w:val="0"/>
+          <w:numId w:val="1"/>
+        </w:numPr>
+        <w:spacing w:before="0" w:after="60"/>
+        <w:rPr/>
+      </w:pPr>
+      <w:r>
+        <w:rPr/>
+        <w:t>☐ Add Phase 1 fields to the Company entity: Organization Type (dropdown), Business Stage (dropdown), NAICS Sector (dropdown), NAICS Subsector (dropdown), Mentoring Focus Areas (multi-select), Mentoring Needs Description (rich text).</w:t>
+      </w:r>
+    </w:p>
+    <w:p>
+      <w:pPr>
+        <w:pStyle w:val="Normal"/>
+        <w:numPr>
+          <w:ilvl w:val="0"/>
+          <w:numId w:val="1"/>
+        </w:numPr>
+        <w:spacing w:before="0" w:after="60"/>
+        <w:rPr/>
+      </w:pPr>
+      <w:r>
+        <w:rPr/>
+        <w:t>☐ Add Phase 2 fields to the Company entity: Business Description, Time in Operation, Current Team Size, Revenue Range, Funding Situation, Current Challenges, Goals and Objectives, Desired Outcomes, Previous Mentoring/Advisory Experience (all rich text or appropriate field types per Section 2.2).</w:t>
+      </w:r>
+    </w:p>
+    <w:p>
+      <w:pPr>
+        <w:pStyle w:val="Normal"/>
+        <w:numPr>
+          <w:ilvl w:val="0"/>
+          <w:numId w:val="1"/>
+        </w:numPr>
+        <w:spacing w:before="0" w:after="60"/>
+        <w:rPr/>
+      </w:pPr>
+      <w:r>
+        <w:rPr/>
+        <w:t>☐ Add Professional Advisors field (multi-select checklist) with all defined values.</w:t>
+      </w:r>
+    </w:p>
+    <w:p>
+      <w:pPr>
+        <w:pStyle w:val="Normal"/>
+        <w:numPr>
+          <w:ilvl w:val="0"/>
+          <w:numId w:val="1"/>
+        </w:numPr>
+        <w:spacing w:before="0" w:after="60"/>
+        <w:rPr/>
+      </w:pPr>
+      <w:r>
+        <w:rPr/>
+        <w:t>☐ Add business registration fields: Registered with State, State of Registration, Legal Business Structure, EIN on File, Date of Formation, Registered Agent, EIN Number.</w:t>
+      </w:r>
+    </w:p>
+    <w:p>
+      <w:pPr>
+        <w:pStyle w:val="Normal"/>
+        <w:numPr>
+          <w:ilvl w:val="0"/>
+          <w:numId w:val="1"/>
+        </w:numPr>
+        <w:spacing w:before="0" w:after="60"/>
+        <w:rPr/>
+      </w:pPr>
+      <w:r>
+        <w:rPr/>
+        <w:t>☐ Configure Dynamic Logic to show/hide registration fields conditionally based on Registered with State value.</w:t>
+      </w:r>
+    </w:p>
+    <w:p>
+      <w:pPr>
+        <w:pStyle w:val="Normal"/>
+        <w:numPr>
+          <w:ilvl w:val="0"/>
+          <w:numId w:val="1"/>
+        </w:numPr>
+        <w:spacing w:before="0" w:after="60"/>
+        <w:rPr/>
+      </w:pPr>
+      <w:r>
+        <w:rPr/>
+        <w:t>☐ Configure field-level access on EIN Number to restrict visibility to Admin and assigned Primary Mentor only.</w:t>
+      </w:r>
+    </w:p>
+    <w:p>
+      <w:pPr>
+        <w:pStyle w:val="Normal"/>
+        <w:numPr>
+          <w:ilvl w:val="0"/>
+          <w:numId w:val="1"/>
+        </w:numPr>
+        <w:spacing w:before="0" w:after="60"/>
+        <w:rPr/>
+      </w:pPr>
+      <w:r>
+        <w:rPr/>
+        <w:t>☐ Organize all fields into logical panel groups on the Company detail view: Contact Information, Business Classification, Mentoring Context (Phase 1), Business Detail (Phase 2), Professional Advisors, Business Registration.</w:t>
+      </w:r>
+    </w:p>
+    <w:p>
+      <w:pPr>
+        <w:pStyle w:val="Normal"/>
+        <w:numPr>
+          <w:ilvl w:val="0"/>
+          <w:numId w:val="1"/>
+        </w:numPr>
+        <w:spacing w:before="0" w:after="60"/>
+        <w:rPr/>
+      </w:pPr>
+      <w:r>
+        <w:rPr/>
+        <w:t>☐ Configure Phase 2 panel group to be collapsible and clearly labeled as post-assignment information.</w:t>
+      </w:r>
+    </w:p>
+    <w:p>
+      <w:pPr>
+        <w:pStyle w:val="Normal"/>
+        <w:numPr>
+          <w:ilvl w:val="0"/>
+          <w:numId w:val="1"/>
+        </w:numPr>
+        <w:spacing w:before="0" w:after="60"/>
+        <w:rPr/>
+      </w:pPr>
+      <w:r>
+        <w:rPr/>
+        <w:t>☐ Add Note, Document, Email, and Calls relationship panels to the Company detail view.</w:t>
       </w:r>
     </w:p>
     <w:p>
@@ -16125,106 +15888,82 @@
       </w:pPr>
       <w:r>
         <w:rPr/>
-        <w:t xml:space="preserve">☐ </w:t>
-      </w:r>
-      <w:r>
-        <w:rPr/>
-        <w:t>Verify native Contact fields are present: First Name, Last Name, Email, Phone.</w:t>
-      </w:r>
-    </w:p>
-    <w:p>
-      <w:pPr>
-        <w:pStyle w:val="Normal"/>
-        <w:numPr>
-          <w:ilvl w:val="0"/>
-          <w:numId w:val="1"/>
-        </w:numPr>
-        <w:spacing w:before="0" w:after="60"/>
-        <w:rPr/>
-      </w:pPr>
-      <w:r>
-        <w:rPr/>
-        <w:t xml:space="preserve">☐ </w:t>
-      </w:r>
-      <w:r>
-        <w:rPr/>
-        <w:t>Add Role at Business field (text field) to the Contact entity.</w:t>
-      </w:r>
-    </w:p>
-    <w:p>
-      <w:pPr>
-        <w:pStyle w:val="Normal"/>
-        <w:numPr>
-          <w:ilvl w:val="0"/>
-          <w:numId w:val="1"/>
-        </w:numPr>
-        <w:spacing w:before="0" w:after="60"/>
-        <w:rPr/>
-      </w:pPr>
-      <w:r>
-        <w:rPr/>
-        <w:t xml:space="preserve">☐ </w:t>
-      </w:r>
-      <w:r>
-        <w:rPr/>
-        <w:t>Add Primary Contact field (checkbox/boolean) to the Contact entity.</w:t>
-      </w:r>
-    </w:p>
-    <w:p>
-      <w:pPr>
-        <w:pStyle w:val="Normal"/>
-        <w:numPr>
-          <w:ilvl w:val="0"/>
-          <w:numId w:val="1"/>
-        </w:numPr>
-        <w:spacing w:before="0" w:after="60"/>
-        <w:rPr/>
-      </w:pPr>
-      <w:r>
-        <w:rPr/>
-        <w:t xml:space="preserve">☐ </w:t>
-      </w:r>
-      <w:r>
-        <w:rPr/>
-        <w:t>Add Zip Code field to the Contact entity if not already present as part of the native address field set.</w:t>
-      </w:r>
-    </w:p>
-    <w:p>
-      <w:pPr>
-        <w:pStyle w:val="Normal"/>
-        <w:numPr>
-          <w:ilvl w:val="0"/>
-          <w:numId w:val="1"/>
-        </w:numPr>
-        <w:spacing w:before="0" w:after="60"/>
-        <w:rPr/>
-      </w:pPr>
-      <w:r>
-        <w:rPr/>
-        <w:t xml:space="preserve">☐ </w:t>
-      </w:r>
-      <w:r>
-        <w:rPr/>
-        <w:t>Organize Contact detail view panels logically: Personal Information, Role at Business.</w:t>
-      </w:r>
-    </w:p>
-    <w:p>
-      <w:pPr>
-        <w:pStyle w:val="Normal"/>
-        <w:numPr>
-          <w:ilvl w:val="0"/>
-          <w:numId w:val="1"/>
-        </w:numPr>
-        <w:spacing w:before="0" w:after="60"/>
-        <w:rPr/>
-      </w:pPr>
-      <w:r>
-        <w:rPr/>
-        <w:t xml:space="preserve">☐ </w:t>
-      </w:r>
-      <w:r>
-        <w:rPr/>
-        <w:t>Add Note, Document, Email, and Calls relationship panels to the Contact detail view.</w:t>
+        <w:t>☐ Verify native Contact fields are present: First Name, Last Name, Email, Phone.</w:t>
+      </w:r>
+    </w:p>
+    <w:p>
+      <w:pPr>
+        <w:pStyle w:val="Normal"/>
+        <w:numPr>
+          <w:ilvl w:val="0"/>
+          <w:numId w:val="1"/>
+        </w:numPr>
+        <w:spacing w:before="0" w:after="60"/>
+        <w:rPr/>
+      </w:pPr>
+      <w:r>
+        <w:rPr/>
+        <w:t>☐ Add Role at Business field (text field) to the Contact entity.</w:t>
+      </w:r>
+    </w:p>
+    <w:p>
+      <w:pPr>
+        <w:pStyle w:val="Normal"/>
+        <w:numPr>
+          <w:ilvl w:val="0"/>
+          <w:numId w:val="1"/>
+        </w:numPr>
+        <w:spacing w:before="0" w:after="60"/>
+        <w:rPr/>
+      </w:pPr>
+      <w:r>
+        <w:rPr/>
+        <w:t>☐ Add Primary Contact field (checkbox/boolean) to the Contact entity.</w:t>
+      </w:r>
+    </w:p>
+    <w:p>
+      <w:pPr>
+        <w:pStyle w:val="Normal"/>
+        <w:numPr>
+          <w:ilvl w:val="0"/>
+          <w:numId w:val="1"/>
+        </w:numPr>
+        <w:spacing w:before="0" w:after="60"/>
+        <w:rPr/>
+      </w:pPr>
+      <w:r>
+        <w:rPr/>
+        <w:t>☐ Add Zip Code field to the Contact entity if not already present as part of the native address field set.</w:t>
+      </w:r>
+    </w:p>
+    <w:p>
+      <w:pPr>
+        <w:pStyle w:val="Normal"/>
+        <w:numPr>
+          <w:ilvl w:val="0"/>
+          <w:numId w:val="1"/>
+        </w:numPr>
+        <w:spacing w:before="0" w:after="60"/>
+        <w:rPr/>
+      </w:pPr>
+      <w:r>
+        <w:rPr/>
+        <w:t>☐ Organize Contact detail view panels logically: Personal Information, Role at Business.</w:t>
+      </w:r>
+    </w:p>
+    <w:p>
+      <w:pPr>
+        <w:pStyle w:val="Normal"/>
+        <w:numPr>
+          <w:ilvl w:val="0"/>
+          <w:numId w:val="1"/>
+        </w:numPr>
+        <w:spacing w:before="0" w:after="60"/>
+        <w:rPr/>
+      </w:pPr>
+      <w:r>
+        <w:rPr/>
+        <w:t>☐ Add Note, Document, Email, and Calls relationship panels to the Contact detail view.</w:t>
       </w:r>
     </w:p>
     <w:p>
@@ -16278,258 +16017,202 @@
       </w:pPr>
       <w:r>
         <w:rPr/>
-        <w:t xml:space="preserve">☐ </w:t>
-      </w:r>
-      <w:r>
-        <w:rPr/>
-        <w:t>Create the Engagement custom entity.</w:t>
-      </w:r>
-    </w:p>
-    <w:p>
-      <w:pPr>
-        <w:pStyle w:val="Normal"/>
-        <w:numPr>
-          <w:ilvl w:val="0"/>
-          <w:numId w:val="1"/>
-        </w:numPr>
-        <w:spacing w:before="0" w:after="60"/>
-        <w:rPr/>
-      </w:pPr>
-      <w:r>
-        <w:rPr/>
-        <w:t xml:space="preserve">☐ </w:t>
-      </w:r>
-      <w:r>
-        <w:rPr/>
-        <w:t>Add Status field (dropdown) with all defined values: Submitted, Pending Acceptance, Assigned, Active, On-Hold, Dormant, Inactive, Abandoned, Completed.</w:t>
-      </w:r>
-    </w:p>
-    <w:p>
-      <w:pPr>
-        <w:pStyle w:val="Normal"/>
-        <w:numPr>
-          <w:ilvl w:val="0"/>
-          <w:numId w:val="1"/>
-        </w:numPr>
-        <w:spacing w:before="0" w:after="60"/>
-        <w:rPr/>
-      </w:pPr>
-      <w:r>
-        <w:rPr/>
-        <w:t xml:space="preserve">☐ </w:t>
-      </w:r>
-      <w:r>
-        <w:rPr/>
-        <w:t>Add Start Date field (date).</w:t>
-      </w:r>
-    </w:p>
-    <w:p>
-      <w:pPr>
-        <w:pStyle w:val="Normal"/>
-        <w:numPr>
-          <w:ilvl w:val="0"/>
-          <w:numId w:val="1"/>
-        </w:numPr>
-        <w:spacing w:before="0" w:after="60"/>
-        <w:rPr/>
-      </w:pPr>
-      <w:r>
-        <w:rPr/>
-        <w:t xml:space="preserve">☐ </w:t>
-      </w:r>
-      <w:r>
-        <w:rPr/>
-        <w:t>Add Close Date field (date).</w:t>
-      </w:r>
-    </w:p>
-    <w:p>
-      <w:pPr>
-        <w:pStyle w:val="Normal"/>
-        <w:numPr>
-          <w:ilvl w:val="0"/>
-          <w:numId w:val="1"/>
-        </w:numPr>
-        <w:spacing w:before="0" w:after="60"/>
-        <w:rPr/>
-      </w:pPr>
-      <w:r>
-        <w:rPr/>
-        <w:t xml:space="preserve">☐ </w:t>
-      </w:r>
-      <w:r>
-        <w:rPr/>
-        <w:t>Add Meeting Cadence field (dropdown) with values: Weekly, Bi-Weekly, Monthly, As Needed.</w:t>
-      </w:r>
-    </w:p>
-    <w:p>
-      <w:pPr>
-        <w:pStyle w:val="Normal"/>
-        <w:numPr>
-          <w:ilvl w:val="0"/>
-          <w:numId w:val="1"/>
-        </w:numPr>
-        <w:spacing w:before="0" w:after="60"/>
-        <w:rPr/>
-      </w:pPr>
-      <w:r>
-        <w:rPr/>
-        <w:t xml:space="preserve">☐ </w:t>
-      </w:r>
-      <w:r>
-        <w:rPr/>
-        <w:t>Add Engagement Close Reason field (dropdown) with values: Goals Achieved, Client Withdrew, Inactive / No Response, Other.</w:t>
-      </w:r>
-    </w:p>
-    <w:p>
-      <w:pPr>
-        <w:pStyle w:val="Normal"/>
-        <w:numPr>
-          <w:ilvl w:val="0"/>
-          <w:numId w:val="1"/>
-        </w:numPr>
-        <w:spacing w:before="0" w:after="60"/>
-        <w:rPr/>
-      </w:pPr>
-      <w:r>
-        <w:rPr/>
-        <w:t xml:space="preserve">☐ </w:t>
-      </w:r>
-      <w:r>
-        <w:rPr/>
-        <w:t>Add Assigned Mentor field (link to Contact entity).</w:t>
-      </w:r>
-    </w:p>
-    <w:p>
-      <w:pPr>
-        <w:pStyle w:val="Normal"/>
-        <w:numPr>
-          <w:ilvl w:val="0"/>
-          <w:numId w:val="1"/>
-        </w:numPr>
-        <w:spacing w:before="0" w:after="60"/>
-        <w:rPr/>
-      </w:pPr>
-      <w:r>
-        <w:rPr/>
-        <w:t xml:space="preserve">☐ </w:t>
-      </w:r>
-      <w:r>
-        <w:rPr/>
-        <w:t>Configure Co-Mentor as a many-to-many relationship panel linking multiple Contact records with Co-Mentor role.</w:t>
-      </w:r>
-    </w:p>
-    <w:p>
-      <w:pPr>
-        <w:pStyle w:val="Normal"/>
-        <w:numPr>
-          <w:ilvl w:val="0"/>
-          <w:numId w:val="1"/>
-        </w:numPr>
-        <w:spacing w:before="0" w:after="60"/>
-        <w:rPr/>
-      </w:pPr>
-      <w:r>
-        <w:rPr/>
-        <w:t xml:space="preserve">☐ </w:t>
-      </w:r>
-      <w:r>
-        <w:rPr/>
-        <w:t>Configure SME as a many-to-many relationship panel linking multiple Contact records with SME role.</w:t>
-      </w:r>
-    </w:p>
-    <w:p>
-      <w:pPr>
-        <w:pStyle w:val="Normal"/>
-        <w:numPr>
-          <w:ilvl w:val="0"/>
-          <w:numId w:val="1"/>
-        </w:numPr>
-        <w:spacing w:before="0" w:after="60"/>
-        <w:rPr/>
-      </w:pPr>
-      <w:r>
-        <w:rPr/>
-        <w:t xml:space="preserve">☐ </w:t>
-      </w:r>
-      <w:r>
-        <w:rPr/>
-        <w:t>Add formula/roll-up fields: Total Sessions (count of linked Sessions), Total Sessions Last 30 Days (count of Sessions in last 30 days), Last Session Date (date of most recent Session), Total Session Hours (sum of Session Duration).</w:t>
-      </w:r>
-    </w:p>
-    <w:p>
-      <w:pPr>
-        <w:pStyle w:val="Normal"/>
-        <w:numPr>
-          <w:ilvl w:val="0"/>
-          <w:numId w:val="1"/>
-        </w:numPr>
-        <w:spacing w:before="0" w:after="60"/>
-        <w:rPr/>
-      </w:pPr>
-      <w:r>
-        <w:rPr/>
-        <w:t xml:space="preserve">☐ </w:t>
-      </w:r>
-      <w:r>
-        <w:rPr/>
-        <w:t>Add Next Session Date/Time field (date/time). Configure as editable by mentor and admin. Configure formula to auto-populate from the most recently logged Session’s Next Session Date/Time field.</w:t>
-      </w:r>
-    </w:p>
-    <w:p>
-      <w:pPr>
-        <w:pStyle w:val="Normal"/>
-        <w:numPr>
-          <w:ilvl w:val="0"/>
-          <w:numId w:val="1"/>
-        </w:numPr>
-        <w:spacing w:before="0" w:after="60"/>
-        <w:rPr/>
-      </w:pPr>
-      <w:r>
-        <w:rPr/>
-        <w:t xml:space="preserve">☐ </w:t>
-      </w:r>
-      <w:r>
-        <w:rPr/>
-        <w:t>Organize Engagement detail view panels: Engagement Details, Mentor Assignment, Analytics Summary.</w:t>
-      </w:r>
-    </w:p>
-    <w:p>
-      <w:pPr>
-        <w:pStyle w:val="Normal"/>
-        <w:numPr>
-          <w:ilvl w:val="0"/>
-          <w:numId w:val="1"/>
-        </w:numPr>
-        <w:spacing w:before="0" w:after="60"/>
-        <w:rPr/>
-      </w:pPr>
-      <w:r>
-        <w:rPr/>
-        <w:t xml:space="preserve">☐ </w:t>
-      </w:r>
-      <w:r>
-        <w:rPr/>
-        <w:t>Configure Engagement Contacts as a many-to-many relationship panel on the Engagement entity, linking to the Contact entity.</w:t>
-      </w:r>
-    </w:p>
-    <w:p>
-      <w:pPr>
-        <w:pStyle w:val="Normal"/>
-        <w:numPr>
-          <w:ilvl w:val="0"/>
-          <w:numId w:val="1"/>
-        </w:numPr>
-        <w:spacing w:before="0" w:after="60"/>
-        <w:rPr/>
-      </w:pPr>
-      <w:r>
-        <w:rPr/>
-        <w:t xml:space="preserve">☐ </w:t>
-      </w:r>
-      <w:r>
-        <w:rPr/>
-        <w:t>Add Note, Document, Email, and Calls relationship panels to the Engagement detail view.</w:t>
+        <w:t>☐ Create the Engagement custom entity.</w:t>
+      </w:r>
+    </w:p>
+    <w:p>
+      <w:pPr>
+        <w:pStyle w:val="Normal"/>
+        <w:numPr>
+          <w:ilvl w:val="0"/>
+          <w:numId w:val="1"/>
+        </w:numPr>
+        <w:spacing w:before="0" w:after="60"/>
+        <w:rPr/>
+      </w:pPr>
+      <w:r>
+        <w:rPr/>
+        <w:t>☐ Add Status field (dropdown) with all defined values: Submitted, Pending Acceptance, Mentor Declined, Assigned, Active, On-Hold, Dormant, Inactive, Abandoned, Completed.</w:t>
+      </w:r>
+    </w:p>
+    <w:p>
+      <w:pPr>
+        <w:pStyle w:val="Normal"/>
+        <w:numPr>
+          <w:ilvl w:val="0"/>
+          <w:numId w:val="1"/>
+        </w:numPr>
+        <w:spacing w:before="0" w:after="60"/>
+        <w:rPr/>
+      </w:pPr>
+      <w:r>
+        <w:rPr/>
+        <w:t>☐ Add Start Date field (date).</w:t>
+      </w:r>
+    </w:p>
+    <w:p>
+      <w:pPr>
+        <w:pStyle w:val="Normal"/>
+        <w:numPr>
+          <w:ilvl w:val="0"/>
+          <w:numId w:val="1"/>
+        </w:numPr>
+        <w:spacing w:before="0" w:after="60"/>
+        <w:rPr/>
+      </w:pPr>
+      <w:r>
+        <w:rPr/>
+        <w:t>☐ Add Close Date field (date).</w:t>
+      </w:r>
+    </w:p>
+    <w:p>
+      <w:pPr>
+        <w:pStyle w:val="Normal"/>
+        <w:numPr>
+          <w:ilvl w:val="0"/>
+          <w:numId w:val="1"/>
+        </w:numPr>
+        <w:spacing w:before="0" w:after="60"/>
+        <w:rPr/>
+      </w:pPr>
+      <w:r>
+        <w:rPr/>
+        <w:t>☐ Add Meeting Cadence field (dropdown) with values: Weekly, Bi-Weekly, Monthly, As Needed.</w:t>
+      </w:r>
+    </w:p>
+    <w:p>
+      <w:pPr>
+        <w:pStyle w:val="Normal"/>
+        <w:numPr>
+          <w:ilvl w:val="0"/>
+          <w:numId w:val="1"/>
+        </w:numPr>
+        <w:spacing w:before="0" w:after="60"/>
+        <w:rPr/>
+      </w:pPr>
+      <w:r>
+        <w:rPr/>
+        <w:t>☐ Add Engagement Close Reason field (dropdown) with values: Goals Achieved, Client Withdrew, Inactive / No Response, Other.</w:t>
+      </w:r>
+    </w:p>
+    <w:p>
+      <w:pPr>
+        <w:pStyle w:val="Normal"/>
+        <w:numPr>
+          <w:ilvl w:val="0"/>
+          <w:numId w:val="1"/>
+        </w:numPr>
+        <w:spacing w:before="0" w:after="60"/>
+        <w:rPr/>
+      </w:pPr>
+      <w:r>
+        <w:rPr/>
+        <w:t>☐ Add Assigned Mentor field (link to Contact entity).</w:t>
+      </w:r>
+    </w:p>
+    <w:p>
+      <w:pPr>
+        <w:pStyle w:val="Normal"/>
+        <w:numPr>
+          <w:ilvl w:val="0"/>
+          <w:numId w:val="1"/>
+        </w:numPr>
+        <w:spacing w:before="0" w:after="60"/>
+        <w:rPr/>
+      </w:pPr>
+      <w:r>
+        <w:rPr/>
+        <w:t>☐ Configure Co-Mentor as a many-to-many relationship panel linking multiple Contact records with Co-Mentor role.</w:t>
+      </w:r>
+    </w:p>
+    <w:p>
+      <w:pPr>
+        <w:pStyle w:val="Normal"/>
+        <w:numPr>
+          <w:ilvl w:val="0"/>
+          <w:numId w:val="1"/>
+        </w:numPr>
+        <w:spacing w:before="0" w:after="60"/>
+        <w:rPr/>
+      </w:pPr>
+      <w:r>
+        <w:rPr/>
+        <w:t>☐ Configure SME as a many-to-many relationship panel linking multiple Contact records with SME role.</w:t>
+      </w:r>
+    </w:p>
+    <w:p>
+      <w:pPr>
+        <w:pStyle w:val="Normal"/>
+        <w:numPr>
+          <w:ilvl w:val="0"/>
+          <w:numId w:val="1"/>
+        </w:numPr>
+        <w:spacing w:before="0" w:after="60"/>
+        <w:rPr/>
+      </w:pPr>
+      <w:r>
+        <w:rPr/>
+        <w:t>☐ Add formula/roll-up fields: Total Sessions (count of linked Sessions), Total Sessions Last 30 Days (count of Sessions in last 30 days), Last Session Date (date of most recent Session), Total Session Hours (sum of Session Duration).</w:t>
+      </w:r>
+    </w:p>
+    <w:p>
+      <w:pPr>
+        <w:pStyle w:val="Normal"/>
+        <w:numPr>
+          <w:ilvl w:val="0"/>
+          <w:numId w:val="1"/>
+        </w:numPr>
+        <w:spacing w:before="0" w:after="60"/>
+        <w:rPr/>
+      </w:pPr>
+      <w:r>
+        <w:rPr/>
+        <w:t>☐ Add Next Session Date/Time field (date/time). Configure as editable by mentor and admin. Configure formula to auto-populate from the most recently logged Session’s Next Session Date/Time field.</w:t>
+      </w:r>
+    </w:p>
+    <w:p>
+      <w:pPr>
+        <w:pStyle w:val="Normal"/>
+        <w:numPr>
+          <w:ilvl w:val="0"/>
+          <w:numId w:val="1"/>
+        </w:numPr>
+        <w:spacing w:before="0" w:after="60"/>
+        <w:rPr/>
+      </w:pPr>
+      <w:r>
+        <w:rPr/>
+        <w:t>☐ Organize Engagement detail view panels: Engagement Details, Mentor Assignment, Analytics Summary.</w:t>
+      </w:r>
+    </w:p>
+    <w:p>
+      <w:pPr>
+        <w:pStyle w:val="Normal"/>
+        <w:numPr>
+          <w:ilvl w:val="0"/>
+          <w:numId w:val="1"/>
+        </w:numPr>
+        <w:spacing w:before="0" w:after="60"/>
+        <w:rPr/>
+      </w:pPr>
+      <w:r>
+        <w:rPr/>
+        <w:t>☐ Configure Engagement Contacts as a many-to-many relationship panel on the Engagement entity, linking to the Contact entity.</w:t>
+      </w:r>
+    </w:p>
+    <w:p>
+      <w:pPr>
+        <w:pStyle w:val="Normal"/>
+        <w:numPr>
+          <w:ilvl w:val="0"/>
+          <w:numId w:val="1"/>
+        </w:numPr>
+        <w:spacing w:before="0" w:after="60"/>
+        <w:rPr/>
+      </w:pPr>
+      <w:r>
+        <w:rPr/>
+        <w:t>☐ Add Note, Document, Email, and Calls relationship panels to the Engagement detail view.</w:t>
       </w:r>
     </w:p>
     <w:p>
@@ -16583,258 +16266,202 @@
       </w:pPr>
       <w:r>
         <w:rPr/>
-        <w:t xml:space="preserve">☐ </w:t>
-      </w:r>
-      <w:r>
-        <w:rPr/>
-        <w:t>Create the Session custom entity.</w:t>
-      </w:r>
-    </w:p>
-    <w:p>
-      <w:pPr>
-        <w:pStyle w:val="Normal"/>
-        <w:numPr>
-          <w:ilvl w:val="0"/>
-          <w:numId w:val="1"/>
-        </w:numPr>
-        <w:spacing w:before="0" w:after="60"/>
-        <w:rPr/>
-      </w:pPr>
-      <w:r>
-        <w:rPr/>
-        <w:t xml:space="preserve">☐ </w:t>
-      </w:r>
-      <w:r>
-        <w:rPr/>
-        <w:t>Add Session Date/Time field (date/time).</w:t>
-      </w:r>
-    </w:p>
-    <w:p>
-      <w:pPr>
-        <w:pStyle w:val="Normal"/>
-        <w:numPr>
-          <w:ilvl w:val="0"/>
-          <w:numId w:val="1"/>
-        </w:numPr>
-        <w:spacing w:before="0" w:after="60"/>
-        <w:rPr/>
-      </w:pPr>
-      <w:r>
-        <w:rPr/>
-        <w:t xml:space="preserve">☐ </w:t>
-      </w:r>
-      <w:r>
-        <w:rPr/>
-        <w:t>Add Duration field (integer, minutes).</w:t>
-      </w:r>
-    </w:p>
-    <w:p>
-      <w:pPr>
-        <w:pStyle w:val="Normal"/>
-        <w:numPr>
-          <w:ilvl w:val="0"/>
-          <w:numId w:val="1"/>
-        </w:numPr>
-        <w:spacing w:before="0" w:after="60"/>
-        <w:rPr/>
-      </w:pPr>
-      <w:r>
-        <w:rPr/>
-        <w:t xml:space="preserve">☐ </w:t>
-      </w:r>
-      <w:r>
-        <w:rPr/>
-        <w:t>Add Session Type field (dropdown) with values: In-Person, Video Call, Phone Call.</w:t>
-      </w:r>
-    </w:p>
-    <w:p>
-      <w:pPr>
-        <w:pStyle w:val="Normal"/>
-        <w:numPr>
-          <w:ilvl w:val="0"/>
-          <w:numId w:val="1"/>
-        </w:numPr>
-        <w:spacing w:before="0" w:after="60"/>
-        <w:rPr/>
-      </w:pPr>
-      <w:r>
-        <w:rPr/>
-        <w:t xml:space="preserve">☐ </w:t>
-      </w:r>
-      <w:r>
-        <w:rPr/>
-        <w:t>Add Meeting Location Type field (dropdown) with values: CBM Office, Client’s Place of Business, Other.</w:t>
-      </w:r>
-    </w:p>
-    <w:p>
-      <w:pPr>
-        <w:pStyle w:val="Normal"/>
-        <w:numPr>
-          <w:ilvl w:val="0"/>
-          <w:numId w:val="1"/>
-        </w:numPr>
-        <w:spacing w:before="0" w:after="60"/>
-        <w:rPr/>
-      </w:pPr>
-      <w:r>
-        <w:rPr/>
-        <w:t xml:space="preserve">☐ </w:t>
-      </w:r>
-      <w:r>
-        <w:rPr/>
-        <w:t>Add Location Details field (text).</w:t>
-      </w:r>
-    </w:p>
-    <w:p>
-      <w:pPr>
-        <w:pStyle w:val="Normal"/>
-        <w:numPr>
-          <w:ilvl w:val="0"/>
-          <w:numId w:val="1"/>
-        </w:numPr>
-        <w:spacing w:before="0" w:after="60"/>
-        <w:rPr/>
-      </w:pPr>
-      <w:r>
-        <w:rPr/>
-        <w:t xml:space="preserve">☐ </w:t>
-      </w:r>
-      <w:r>
-        <w:rPr/>
-        <w:t>Configure Dynamic Logic to show Meeting Location Type only when Session Type = In-Person.</w:t>
-      </w:r>
-    </w:p>
-    <w:p>
-      <w:pPr>
-        <w:pStyle w:val="Normal"/>
-        <w:numPr>
-          <w:ilvl w:val="0"/>
-          <w:numId w:val="1"/>
-        </w:numPr>
-        <w:spacing w:before="0" w:after="60"/>
-        <w:rPr/>
-      </w:pPr>
-      <w:r>
-        <w:rPr/>
-        <w:t xml:space="preserve">☐ </w:t>
-      </w:r>
-      <w:r>
-        <w:rPr/>
-        <w:t>Configure Dynamic Logic to show Location Details only when Meeting Location Type = Other.</w:t>
-      </w:r>
-    </w:p>
-    <w:p>
-      <w:pPr>
-        <w:pStyle w:val="Normal"/>
-        <w:numPr>
-          <w:ilvl w:val="0"/>
-          <w:numId w:val="1"/>
-        </w:numPr>
-        <w:spacing w:before="0" w:after="60"/>
-        <w:rPr/>
-      </w:pPr>
-      <w:r>
-        <w:rPr/>
-        <w:t xml:space="preserve">☐ </w:t>
-      </w:r>
-      <w:r>
-        <w:rPr/>
-        <w:t>Add Topics Covered field (multi-select dropdown, values TBD).</w:t>
-      </w:r>
-    </w:p>
-    <w:p>
-      <w:pPr>
-        <w:pStyle w:val="Normal"/>
-        <w:numPr>
-          <w:ilvl w:val="0"/>
-          <w:numId w:val="1"/>
-        </w:numPr>
-        <w:spacing w:before="0" w:after="60"/>
-        <w:rPr/>
-      </w:pPr>
-      <w:r>
-        <w:rPr/>
-        <w:t xml:space="preserve">☐ </w:t>
-      </w:r>
-      <w:r>
-        <w:rPr/>
-        <w:t>Add Topics Covered Notes field (rich text) for free-text topic detail.</w:t>
-      </w:r>
-    </w:p>
-    <w:p>
-      <w:pPr>
-        <w:pStyle w:val="Normal"/>
-        <w:numPr>
-          <w:ilvl w:val="0"/>
-          <w:numId w:val="1"/>
-        </w:numPr>
-        <w:spacing w:before="0" w:after="60"/>
-        <w:rPr/>
-      </w:pPr>
-      <w:r>
-        <w:rPr/>
-        <w:t xml:space="preserve">☐ </w:t>
-      </w:r>
-      <w:r>
-        <w:rPr/>
-        <w:t>Add Mentor Notes field (rich text).</w:t>
-      </w:r>
-    </w:p>
-    <w:p>
-      <w:pPr>
-        <w:pStyle w:val="Normal"/>
-        <w:numPr>
-          <w:ilvl w:val="0"/>
-          <w:numId w:val="1"/>
-        </w:numPr>
-        <w:spacing w:before="0" w:after="60"/>
-        <w:rPr/>
-      </w:pPr>
-      <w:r>
-        <w:rPr/>
-        <w:t xml:space="preserve">☐ </w:t>
-      </w:r>
-      <w:r>
-        <w:rPr/>
-        <w:t>Add Next Steps field (rich text).</w:t>
-      </w:r>
-    </w:p>
-    <w:p>
-      <w:pPr>
-        <w:pStyle w:val="Normal"/>
-        <w:numPr>
-          <w:ilvl w:val="0"/>
-          <w:numId w:val="1"/>
-        </w:numPr>
-        <w:spacing w:before="0" w:after="60"/>
-        <w:rPr/>
-      </w:pPr>
-      <w:r>
-        <w:rPr/>
-        <w:t xml:space="preserve">☐ </w:t>
-      </w:r>
-      <w:r>
-        <w:rPr/>
-        <w:t>Add New Business Started field (checkbox/boolean).</w:t>
-      </w:r>
-    </w:p>
-    <w:p>
-      <w:pPr>
-        <w:pStyle w:val="Normal"/>
-        <w:numPr>
-          <w:ilvl w:val="0"/>
-          <w:numId w:val="1"/>
-        </w:numPr>
-        <w:spacing w:before="0" w:after="60"/>
-        <w:rPr/>
-      </w:pPr>
-      <w:r>
-        <w:rPr/>
-        <w:t xml:space="preserve">☐ </w:t>
-      </w:r>
-      <w:r>
-        <w:rPr/>
-        <w:t>Add Note and Document relationship panels to the Session detail view.</w:t>
+        <w:t>☐ Create the Session custom entity.</w:t>
+      </w:r>
+    </w:p>
+    <w:p>
+      <w:pPr>
+        <w:pStyle w:val="Normal"/>
+        <w:numPr>
+          <w:ilvl w:val="0"/>
+          <w:numId w:val="1"/>
+        </w:numPr>
+        <w:spacing w:before="0" w:after="60"/>
+        <w:rPr/>
+      </w:pPr>
+      <w:r>
+        <w:rPr/>
+        <w:t>☐ Add Session Date/Time field (date/time).</w:t>
+      </w:r>
+    </w:p>
+    <w:p>
+      <w:pPr>
+        <w:pStyle w:val="Normal"/>
+        <w:numPr>
+          <w:ilvl w:val="0"/>
+          <w:numId w:val="1"/>
+        </w:numPr>
+        <w:spacing w:before="0" w:after="60"/>
+        <w:rPr/>
+      </w:pPr>
+      <w:r>
+        <w:rPr/>
+        <w:t>☐ Add Duration field (integer, minutes).</w:t>
+      </w:r>
+    </w:p>
+    <w:p>
+      <w:pPr>
+        <w:pStyle w:val="Normal"/>
+        <w:numPr>
+          <w:ilvl w:val="0"/>
+          <w:numId w:val="1"/>
+        </w:numPr>
+        <w:spacing w:before="0" w:after="60"/>
+        <w:rPr/>
+      </w:pPr>
+      <w:r>
+        <w:rPr/>
+        <w:t>☐ Add Session Type field (dropdown) with values: In-Person, Video Call, Phone Call.</w:t>
+      </w:r>
+    </w:p>
+    <w:p>
+      <w:pPr>
+        <w:pStyle w:val="Normal"/>
+        <w:numPr>
+          <w:ilvl w:val="0"/>
+          <w:numId w:val="1"/>
+        </w:numPr>
+        <w:spacing w:before="0" w:after="60"/>
+        <w:rPr/>
+      </w:pPr>
+      <w:r>
+        <w:rPr/>
+        <w:t>☐ Add Meeting Location Type field (dropdown) with values: CBM Office, Client’s Place of Business, Other.</w:t>
+      </w:r>
+    </w:p>
+    <w:p>
+      <w:pPr>
+        <w:pStyle w:val="Normal"/>
+        <w:numPr>
+          <w:ilvl w:val="0"/>
+          <w:numId w:val="1"/>
+        </w:numPr>
+        <w:spacing w:before="0" w:after="60"/>
+        <w:rPr/>
+      </w:pPr>
+      <w:r>
+        <w:rPr/>
+        <w:t>☐ Add Location Details field (text).</w:t>
+      </w:r>
+    </w:p>
+    <w:p>
+      <w:pPr>
+        <w:pStyle w:val="Normal"/>
+        <w:numPr>
+          <w:ilvl w:val="0"/>
+          <w:numId w:val="1"/>
+        </w:numPr>
+        <w:spacing w:before="0" w:after="60"/>
+        <w:rPr/>
+      </w:pPr>
+      <w:r>
+        <w:rPr/>
+        <w:t>☐ Configure Dynamic Logic to show Meeting Location Type only when Session Type = In-Person.</w:t>
+      </w:r>
+    </w:p>
+    <w:p>
+      <w:pPr>
+        <w:pStyle w:val="Normal"/>
+        <w:numPr>
+          <w:ilvl w:val="0"/>
+          <w:numId w:val="1"/>
+        </w:numPr>
+        <w:spacing w:before="0" w:after="60"/>
+        <w:rPr/>
+      </w:pPr>
+      <w:r>
+        <w:rPr/>
+        <w:t>☐ Configure Dynamic Logic to show Location Details only when Meeting Location Type = Other.</w:t>
+      </w:r>
+    </w:p>
+    <w:p>
+      <w:pPr>
+        <w:pStyle w:val="Normal"/>
+        <w:numPr>
+          <w:ilvl w:val="0"/>
+          <w:numId w:val="1"/>
+        </w:numPr>
+        <w:spacing w:before="0" w:after="60"/>
+        <w:rPr/>
+      </w:pPr>
+      <w:r>
+        <w:rPr/>
+        <w:t>☐ Add Topics Covered field (multi-select dropdown, values TBD).</w:t>
+      </w:r>
+    </w:p>
+    <w:p>
+      <w:pPr>
+        <w:pStyle w:val="Normal"/>
+        <w:numPr>
+          <w:ilvl w:val="0"/>
+          <w:numId w:val="1"/>
+        </w:numPr>
+        <w:spacing w:before="0" w:after="60"/>
+        <w:rPr/>
+      </w:pPr>
+      <w:r>
+        <w:rPr/>
+        <w:t>☐ Add Topics Covered Notes field (rich text) for free-text topic detail.</w:t>
+      </w:r>
+    </w:p>
+    <w:p>
+      <w:pPr>
+        <w:pStyle w:val="Normal"/>
+        <w:numPr>
+          <w:ilvl w:val="0"/>
+          <w:numId w:val="1"/>
+        </w:numPr>
+        <w:spacing w:before="0" w:after="60"/>
+        <w:rPr/>
+      </w:pPr>
+      <w:r>
+        <w:rPr/>
+        <w:t>☐ Add Mentor Notes field (rich text).</w:t>
+      </w:r>
+    </w:p>
+    <w:p>
+      <w:pPr>
+        <w:pStyle w:val="Normal"/>
+        <w:numPr>
+          <w:ilvl w:val="0"/>
+          <w:numId w:val="1"/>
+        </w:numPr>
+        <w:spacing w:before="0" w:after="60"/>
+        <w:rPr/>
+      </w:pPr>
+      <w:r>
+        <w:rPr/>
+        <w:t>☐ Add Next Steps field (rich text).</w:t>
+      </w:r>
+    </w:p>
+    <w:p>
+      <w:pPr>
+        <w:pStyle w:val="Normal"/>
+        <w:numPr>
+          <w:ilvl w:val="0"/>
+          <w:numId w:val="1"/>
+        </w:numPr>
+        <w:spacing w:before="0" w:after="60"/>
+        <w:rPr/>
+      </w:pPr>
+      <w:r>
+        <w:rPr/>
+        <w:t>☐ Add New Business Started field (checkbox/boolean).</w:t>
+      </w:r>
+    </w:p>
+    <w:p>
+      <w:pPr>
+        <w:pStyle w:val="Normal"/>
+        <w:numPr>
+          <w:ilvl w:val="0"/>
+          <w:numId w:val="1"/>
+        </w:numPr>
+        <w:spacing w:before="0" w:after="60"/>
+        <w:rPr/>
+      </w:pPr>
+      <w:r>
+        <w:rPr/>
+        <w:t>☐ Add Note and Document relationship panels to the Session detail view.</w:t>
       </w:r>
     </w:p>
     <w:p>
@@ -16888,220 +16515,172 @@
       </w:pPr>
       <w:r>
         <w:rPr/>
-        <w:t xml:space="preserve">☐ </w:t>
-      </w:r>
-      <w:r>
-        <w:rPr/>
-        <w:t>Create the NPS Survey Response custom entity.</w:t>
-      </w:r>
-    </w:p>
-    <w:p>
-      <w:pPr>
-        <w:pStyle w:val="Normal"/>
-        <w:numPr>
-          <w:ilvl w:val="0"/>
-          <w:numId w:val="1"/>
-        </w:numPr>
-        <w:spacing w:before="0" w:after="60"/>
-        <w:rPr/>
-      </w:pPr>
-      <w:r>
-        <w:rPr/>
-        <w:t xml:space="preserve">☐ </w:t>
-      </w:r>
-      <w:r>
-        <w:rPr/>
-        <w:t>Add Survey Trigger field (dropdown, read-only) with values: 2nd Session, Every 5 Sessions, Engagement Close.</w:t>
-      </w:r>
-    </w:p>
-    <w:p>
-      <w:pPr>
-        <w:pStyle w:val="Normal"/>
-        <w:numPr>
-          <w:ilvl w:val="0"/>
-          <w:numId w:val="1"/>
-        </w:numPr>
-        <w:spacing w:before="0" w:after="60"/>
-        <w:rPr/>
-      </w:pPr>
-      <w:r>
-        <w:rPr/>
-        <w:t xml:space="preserve">☐ </w:t>
-      </w:r>
-      <w:r>
-        <w:rPr/>
-        <w:t>Add Survey Date/Time field (date/time, system-populated).</w:t>
-      </w:r>
-    </w:p>
-    <w:p>
-      <w:pPr>
-        <w:pStyle w:val="Normal"/>
-        <w:numPr>
-          <w:ilvl w:val="0"/>
-          <w:numId w:val="1"/>
-        </w:numPr>
-        <w:spacing w:before="0" w:after="60"/>
-        <w:rPr/>
-      </w:pPr>
-      <w:r>
-        <w:rPr/>
-        <w:t xml:space="preserve">☐ </w:t>
-      </w:r>
-      <w:r>
-        <w:rPr/>
-        <w:t>Add NPS Score field (integer, 0-10).</w:t>
-      </w:r>
-    </w:p>
-    <w:p>
-      <w:pPr>
-        <w:pStyle w:val="Normal"/>
-        <w:numPr>
-          <w:ilvl w:val="0"/>
-          <w:numId w:val="1"/>
-        </w:numPr>
-        <w:spacing w:before="0" w:after="60"/>
-        <w:rPr/>
-      </w:pPr>
-      <w:r>
-        <w:rPr/>
-        <w:t xml:space="preserve">☐ </w:t>
-      </w:r>
-      <w:r>
-        <w:rPr/>
-        <w:t>Add Did CBM Help You field (boolean yes/no).</w:t>
-      </w:r>
-    </w:p>
-    <w:p>
-      <w:pPr>
-        <w:pStyle w:val="Normal"/>
-        <w:numPr>
-          <w:ilvl w:val="0"/>
-          <w:numId w:val="1"/>
-        </w:numPr>
-        <w:spacing w:before="0" w:after="60"/>
-        <w:rPr/>
-      </w:pPr>
-      <w:r>
-        <w:rPr/>
-        <w:t xml:space="preserve">☐ </w:t>
-      </w:r>
-      <w:r>
-        <w:rPr/>
-        <w:t>Add I Would Return to See This Mentor Again field (integer, 1-5).</w:t>
-      </w:r>
-    </w:p>
-    <w:p>
-      <w:pPr>
-        <w:pStyle w:val="Normal"/>
-        <w:numPr>
-          <w:ilvl w:val="0"/>
-          <w:numId w:val="1"/>
-        </w:numPr>
-        <w:spacing w:before="0" w:after="60"/>
-        <w:rPr/>
-      </w:pPr>
-      <w:r>
-        <w:rPr/>
-        <w:t xml:space="preserve">☐ </w:t>
-      </w:r>
-      <w:r>
-        <w:rPr/>
-        <w:t>Add Mentor Listened and Understood My Needs field (integer, 1-5).</w:t>
-      </w:r>
-    </w:p>
-    <w:p>
-      <w:pPr>
-        <w:pStyle w:val="Normal"/>
-        <w:numPr>
-          <w:ilvl w:val="0"/>
-          <w:numId w:val="1"/>
-        </w:numPr>
-        <w:spacing w:before="0" w:after="60"/>
-        <w:rPr/>
-      </w:pPr>
-      <w:r>
-        <w:rPr/>
-        <w:t xml:space="preserve">☐ </w:t>
-      </w:r>
-      <w:r>
-        <w:rPr/>
-        <w:t>Add How Could CBM Better Meet Your Needs field (rich text, optional).</w:t>
-      </w:r>
-    </w:p>
-    <w:p>
-      <w:pPr>
-        <w:pStyle w:val="Normal"/>
-        <w:numPr>
-          <w:ilvl w:val="0"/>
-          <w:numId w:val="1"/>
-        </w:numPr>
-        <w:spacing w:before="0" w:after="60"/>
-        <w:rPr/>
-      </w:pPr>
-      <w:r>
-        <w:rPr/>
-        <w:t xml:space="preserve">☐ </w:t>
-      </w:r>
-      <w:r>
-        <w:rPr/>
-        <w:t>Install and configure LimeSurvey (self-hosted on AWS).</w:t>
-      </w:r>
-    </w:p>
-    <w:p>
-      <w:pPr>
-        <w:pStyle w:val="Normal"/>
-        <w:numPr>
-          <w:ilvl w:val="0"/>
-          <w:numId w:val="1"/>
-        </w:numPr>
-        <w:spacing w:before="0" w:after="60"/>
-        <w:rPr/>
-      </w:pPr>
-      <w:r>
-        <w:rPr/>
-        <w:t xml:space="preserve">☐ </w:t>
-      </w:r>
-      <w:r>
-        <w:rPr/>
-        <w:t>Build the NPS survey in LimeSurvey with all defined questions.</w:t>
-      </w:r>
-    </w:p>
-    <w:p>
-      <w:pPr>
-        <w:pStyle w:val="Normal"/>
-        <w:numPr>
-          <w:ilvl w:val="0"/>
-          <w:numId w:val="1"/>
-        </w:numPr>
-        <w:spacing w:before="0" w:after="60"/>
-        <w:rPr/>
-      </w:pPr>
-      <w:r>
-        <w:rPr/>
-        <w:t xml:space="preserve">☐ </w:t>
-      </w:r>
-      <w:r>
-        <w:rPr/>
-        <w:t>Configure LimeSurvey API connection to CRM for response posting.</w:t>
-      </w:r>
-    </w:p>
-    <w:p>
-      <w:pPr>
-        <w:pStyle w:val="Normal"/>
-        <w:numPr>
-          <w:ilvl w:val="0"/>
-          <w:numId w:val="1"/>
-        </w:numPr>
-        <w:spacing w:before="0" w:after="60"/>
-        <w:rPr/>
-      </w:pPr>
-      <w:r>
-        <w:rPr/>
-        <w:t xml:space="preserve">☐ </w:t>
-      </w:r>
-      <w:r>
-        <w:rPr/>
-        <w:t>Test end-to-end survey delivery and response capture before go-live.</w:t>
+        <w:t>☐ Create the NPS Survey Response custom entity.</w:t>
+      </w:r>
+    </w:p>
+    <w:p>
+      <w:pPr>
+        <w:pStyle w:val="Normal"/>
+        <w:numPr>
+          <w:ilvl w:val="0"/>
+          <w:numId w:val="1"/>
+        </w:numPr>
+        <w:spacing w:before="0" w:after="60"/>
+        <w:rPr/>
+      </w:pPr>
+      <w:r>
+        <w:rPr/>
+        <w:t>☐ Add Survey Trigger field (dropdown, read-only) with values: 2nd Session, Every 5 Sessions, Engagement Close.</w:t>
+      </w:r>
+    </w:p>
+    <w:p>
+      <w:pPr>
+        <w:pStyle w:val="Normal"/>
+        <w:numPr>
+          <w:ilvl w:val="0"/>
+          <w:numId w:val="1"/>
+        </w:numPr>
+        <w:spacing w:before="0" w:after="60"/>
+        <w:rPr/>
+      </w:pPr>
+      <w:r>
+        <w:rPr/>
+        <w:t>☐ Add Survey Date/Time field (date/time, system-populated).</w:t>
+      </w:r>
+    </w:p>
+    <w:p>
+      <w:pPr>
+        <w:pStyle w:val="Normal"/>
+        <w:numPr>
+          <w:ilvl w:val="0"/>
+          <w:numId w:val="1"/>
+        </w:numPr>
+        <w:spacing w:before="0" w:after="60"/>
+        <w:rPr/>
+      </w:pPr>
+      <w:r>
+        <w:rPr/>
+        <w:t>☐ Add NPS Score field (integer, 0-10).</w:t>
+      </w:r>
+    </w:p>
+    <w:p>
+      <w:pPr>
+        <w:pStyle w:val="Normal"/>
+        <w:numPr>
+          <w:ilvl w:val="0"/>
+          <w:numId w:val="1"/>
+        </w:numPr>
+        <w:spacing w:before="0" w:after="60"/>
+        <w:rPr/>
+      </w:pPr>
+      <w:r>
+        <w:rPr/>
+        <w:t>☐ Add Did CBM Help You field (boolean yes/no).</w:t>
+      </w:r>
+    </w:p>
+    <w:p>
+      <w:pPr>
+        <w:pStyle w:val="Normal"/>
+        <w:numPr>
+          <w:ilvl w:val="0"/>
+          <w:numId w:val="1"/>
+        </w:numPr>
+        <w:spacing w:before="0" w:after="60"/>
+        <w:rPr/>
+      </w:pPr>
+      <w:r>
+        <w:rPr/>
+        <w:t>☐ Add I Would Return to See This Mentor Again field (integer, 1-5).</w:t>
+      </w:r>
+    </w:p>
+    <w:p>
+      <w:pPr>
+        <w:pStyle w:val="Normal"/>
+        <w:numPr>
+          <w:ilvl w:val="0"/>
+          <w:numId w:val="1"/>
+        </w:numPr>
+        <w:spacing w:before="0" w:after="60"/>
+        <w:rPr/>
+      </w:pPr>
+      <w:r>
+        <w:rPr/>
+        <w:t>☐ Add Mentor Listened and Understood My Needs field (integer, 1-5).</w:t>
+      </w:r>
+    </w:p>
+    <w:p>
+      <w:pPr>
+        <w:pStyle w:val="Normal"/>
+        <w:numPr>
+          <w:ilvl w:val="0"/>
+          <w:numId w:val="1"/>
+        </w:numPr>
+        <w:spacing w:before="0" w:after="60"/>
+        <w:rPr/>
+      </w:pPr>
+      <w:r>
+        <w:rPr/>
+        <w:t>☐ Add How Could CBM Better Meet Your Needs field (rich text, optional).</w:t>
+      </w:r>
+    </w:p>
+    <w:p>
+      <w:pPr>
+        <w:pStyle w:val="Normal"/>
+        <w:numPr>
+          <w:ilvl w:val="0"/>
+          <w:numId w:val="1"/>
+        </w:numPr>
+        <w:spacing w:before="0" w:after="60"/>
+        <w:rPr/>
+      </w:pPr>
+      <w:r>
+        <w:rPr/>
+        <w:t>☐ Install and configure LimeSurvey (self-hosted on AWS).</w:t>
+      </w:r>
+    </w:p>
+    <w:p>
+      <w:pPr>
+        <w:pStyle w:val="Normal"/>
+        <w:numPr>
+          <w:ilvl w:val="0"/>
+          <w:numId w:val="1"/>
+        </w:numPr>
+        <w:spacing w:before="0" w:after="60"/>
+        <w:rPr/>
+      </w:pPr>
+      <w:r>
+        <w:rPr/>
+        <w:t>☐ Build the NPS survey in LimeSurvey with all defined questions.</w:t>
+      </w:r>
+    </w:p>
+    <w:p>
+      <w:pPr>
+        <w:pStyle w:val="Normal"/>
+        <w:numPr>
+          <w:ilvl w:val="0"/>
+          <w:numId w:val="1"/>
+        </w:numPr>
+        <w:spacing w:before="0" w:after="60"/>
+        <w:rPr/>
+      </w:pPr>
+      <w:r>
+        <w:rPr/>
+        <w:t>☐ Configure LimeSurvey API connection to CRM for response posting.</w:t>
+      </w:r>
+    </w:p>
+    <w:p>
+      <w:pPr>
+        <w:pStyle w:val="Normal"/>
+        <w:numPr>
+          <w:ilvl w:val="0"/>
+          <w:numId w:val="1"/>
+        </w:numPr>
+        <w:spacing w:before="0" w:after="60"/>
+        <w:rPr/>
+      </w:pPr>
+      <w:r>
+        <w:rPr/>
+        <w:t>☐ Test end-to-end survey delivery and response capture before go-live.</w:t>
       </w:r>
     </w:p>
     <w:p>
@@ -17155,182 +16734,142 @@
       </w:pPr>
       <w:r>
         <w:rPr/>
-        <w:t xml:space="preserve">☐ </w:t>
-      </w:r>
-      <w:r>
-        <w:rPr/>
-        <w:t>Create the Workshop custom entity.</w:t>
-      </w:r>
-    </w:p>
-    <w:p>
-      <w:pPr>
-        <w:pStyle w:val="Normal"/>
-        <w:numPr>
-          <w:ilvl w:val="0"/>
-          <w:numId w:val="1"/>
-        </w:numPr>
-        <w:spacing w:before="0" w:after="60"/>
-        <w:rPr/>
-      </w:pPr>
-      <w:r>
-        <w:rPr/>
-        <w:t xml:space="preserve">☐ </w:t>
-      </w:r>
-      <w:r>
-        <w:rPr/>
-        <w:t>Add Title field (text).</w:t>
-      </w:r>
-    </w:p>
-    <w:p>
-      <w:pPr>
-        <w:pStyle w:val="Normal"/>
-        <w:numPr>
-          <w:ilvl w:val="0"/>
-          <w:numId w:val="1"/>
-        </w:numPr>
-        <w:spacing w:before="0" w:after="60"/>
-        <w:rPr/>
-      </w:pPr>
-      <w:r>
-        <w:rPr/>
-        <w:t xml:space="preserve">☐ </w:t>
-      </w:r>
-      <w:r>
-        <w:rPr/>
-        <w:t>Add Date/Time field (date/time).</w:t>
-      </w:r>
-    </w:p>
-    <w:p>
-      <w:pPr>
-        <w:pStyle w:val="Normal"/>
-        <w:numPr>
-          <w:ilvl w:val="0"/>
-          <w:numId w:val="1"/>
-        </w:numPr>
-        <w:spacing w:before="0" w:after="60"/>
-        <w:rPr/>
-      </w:pPr>
-      <w:r>
-        <w:rPr/>
-        <w:t xml:space="preserve">☐ </w:t>
-      </w:r>
-      <w:r>
-        <w:rPr/>
-        <w:t>Add Topic/Category field (dropdown, aligned with Mentoring Focus Areas values).</w:t>
-      </w:r>
-    </w:p>
-    <w:p>
-      <w:pPr>
-        <w:pStyle w:val="Normal"/>
-        <w:numPr>
-          <w:ilvl w:val="0"/>
-          <w:numId w:val="1"/>
-        </w:numPr>
-        <w:spacing w:before="0" w:after="60"/>
-        <w:rPr/>
-      </w:pPr>
-      <w:r>
-        <w:rPr/>
-        <w:t xml:space="preserve">☐ </w:t>
-      </w:r>
-      <w:r>
-        <w:rPr/>
-        <w:t>Add Presenter field (text or link to Contact).</w:t>
-      </w:r>
-    </w:p>
-    <w:p>
-      <w:pPr>
-        <w:pStyle w:val="Normal"/>
-        <w:numPr>
-          <w:ilvl w:val="0"/>
-          <w:numId w:val="1"/>
-        </w:numPr>
-        <w:spacing w:before="0" w:after="60"/>
-        <w:rPr/>
-      </w:pPr>
-      <w:r>
-        <w:rPr/>
-        <w:t xml:space="preserve">☐ </w:t>
-      </w:r>
-      <w:r>
-        <w:rPr/>
-        <w:t>Add Location field (text).</w:t>
-      </w:r>
-    </w:p>
-    <w:p>
-      <w:pPr>
-        <w:pStyle w:val="Normal"/>
-        <w:numPr>
-          <w:ilvl w:val="0"/>
-          <w:numId w:val="1"/>
-        </w:numPr>
-        <w:spacing w:before="0" w:after="60"/>
-        <w:rPr/>
-      </w:pPr>
-      <w:r>
-        <w:rPr/>
-        <w:t xml:space="preserve">☐ </w:t>
-      </w:r>
-      <w:r>
-        <w:rPr/>
-        <w:t>Add Description field (rich text).</w:t>
-      </w:r>
-    </w:p>
-    <w:p>
-      <w:pPr>
-        <w:pStyle w:val="Normal"/>
-        <w:numPr>
-          <w:ilvl w:val="0"/>
-          <w:numId w:val="1"/>
-        </w:numPr>
-        <w:spacing w:before="0" w:after="60"/>
-        <w:rPr/>
-      </w:pPr>
-      <w:r>
-        <w:rPr/>
-        <w:t xml:space="preserve">☐ </w:t>
-      </w:r>
-      <w:r>
-        <w:rPr/>
-        <w:t>Add Maximum Capacity field (integer).</w:t>
-      </w:r>
-    </w:p>
-    <w:p>
-      <w:pPr>
-        <w:pStyle w:val="Normal"/>
-        <w:numPr>
-          <w:ilvl w:val="0"/>
-          <w:numId w:val="1"/>
-        </w:numPr>
-        <w:spacing w:before="0" w:after="60"/>
-        <w:rPr/>
-      </w:pPr>
-      <w:r>
-        <w:rPr/>
-        <w:t xml:space="preserve">☐ </w:t>
-      </w:r>
-      <w:r>
-        <w:rPr/>
-        <w:t>Add Status field (dropdown) with values: Scheduled, Completed, Cancelled.</w:t>
-      </w:r>
-    </w:p>
-    <w:p>
-      <w:pPr>
-        <w:pStyle w:val="Normal"/>
-        <w:numPr>
-          <w:ilvl w:val="0"/>
-          <w:numId w:val="1"/>
-        </w:numPr>
-        <w:spacing w:before="0" w:after="60"/>
-        <w:rPr/>
-      </w:pPr>
-      <w:r>
-        <w:rPr/>
-        <w:t xml:space="preserve">☐ </w:t>
-      </w:r>
-      <w:r>
-        <w:rPr/>
-        <w:t>Add Note and Document relationship panels to the Workshop detail view.</w:t>
+        <w:t>☐ Create the Workshop custom entity.</w:t>
+      </w:r>
+    </w:p>
+    <w:p>
+      <w:pPr>
+        <w:pStyle w:val="Normal"/>
+        <w:numPr>
+          <w:ilvl w:val="0"/>
+          <w:numId w:val="1"/>
+        </w:numPr>
+        <w:spacing w:before="0" w:after="60"/>
+        <w:rPr/>
+      </w:pPr>
+      <w:r>
+        <w:rPr/>
+        <w:t>☐ Add Title field (text).</w:t>
+      </w:r>
+    </w:p>
+    <w:p>
+      <w:pPr>
+        <w:pStyle w:val="Normal"/>
+        <w:numPr>
+          <w:ilvl w:val="0"/>
+          <w:numId w:val="1"/>
+        </w:numPr>
+        <w:spacing w:before="0" w:after="60"/>
+        <w:rPr/>
+      </w:pPr>
+      <w:r>
+        <w:rPr/>
+        <w:t>☐ Add Date/Time field (date/time).</w:t>
+      </w:r>
+    </w:p>
+    <w:p>
+      <w:pPr>
+        <w:pStyle w:val="Normal"/>
+        <w:numPr>
+          <w:ilvl w:val="0"/>
+          <w:numId w:val="1"/>
+        </w:numPr>
+        <w:spacing w:before="0" w:after="60"/>
+        <w:rPr/>
+      </w:pPr>
+      <w:r>
+        <w:rPr/>
+        <w:t>☐ Add Topic/Category field (dropdown, aligned with Mentoring Focus Areas values).</w:t>
+      </w:r>
+    </w:p>
+    <w:p>
+      <w:pPr>
+        <w:pStyle w:val="Normal"/>
+        <w:numPr>
+          <w:ilvl w:val="0"/>
+          <w:numId w:val="1"/>
+        </w:numPr>
+        <w:spacing w:before="0" w:after="60"/>
+        <w:rPr/>
+      </w:pPr>
+      <w:r>
+        <w:rPr/>
+        <w:t>☐ Add Presenter field (text or link to Contact).</w:t>
+      </w:r>
+    </w:p>
+    <w:p>
+      <w:pPr>
+        <w:pStyle w:val="Normal"/>
+        <w:numPr>
+          <w:ilvl w:val="0"/>
+          <w:numId w:val="1"/>
+        </w:numPr>
+        <w:spacing w:before="0" w:after="60"/>
+        <w:rPr/>
+      </w:pPr>
+      <w:r>
+        <w:rPr/>
+        <w:t>☐ Add Location field (text).</w:t>
+      </w:r>
+    </w:p>
+    <w:p>
+      <w:pPr>
+        <w:pStyle w:val="Normal"/>
+        <w:numPr>
+          <w:ilvl w:val="0"/>
+          <w:numId w:val="1"/>
+        </w:numPr>
+        <w:spacing w:before="0" w:after="60"/>
+        <w:rPr/>
+      </w:pPr>
+      <w:r>
+        <w:rPr/>
+        <w:t>☐ Add Description field (rich text).</w:t>
+      </w:r>
+    </w:p>
+    <w:p>
+      <w:pPr>
+        <w:pStyle w:val="Normal"/>
+        <w:numPr>
+          <w:ilvl w:val="0"/>
+          <w:numId w:val="1"/>
+        </w:numPr>
+        <w:spacing w:before="0" w:after="60"/>
+        <w:rPr/>
+      </w:pPr>
+      <w:r>
+        <w:rPr/>
+        <w:t>☐ Add Maximum Capacity field (integer).</w:t>
+      </w:r>
+    </w:p>
+    <w:p>
+      <w:pPr>
+        <w:pStyle w:val="Normal"/>
+        <w:numPr>
+          <w:ilvl w:val="0"/>
+          <w:numId w:val="1"/>
+        </w:numPr>
+        <w:spacing w:before="0" w:after="60"/>
+        <w:rPr/>
+      </w:pPr>
+      <w:r>
+        <w:rPr/>
+        <w:t>☐ Add Status field (dropdown) with values: Scheduled, Completed, Cancelled.</w:t>
+      </w:r>
+    </w:p>
+    <w:p>
+      <w:pPr>
+        <w:pStyle w:val="Normal"/>
+        <w:numPr>
+          <w:ilvl w:val="0"/>
+          <w:numId w:val="1"/>
+        </w:numPr>
+        <w:spacing w:before="0" w:after="60"/>
+        <w:rPr/>
+      </w:pPr>
+      <w:r>
+        <w:rPr/>
+        <w:t>☐ Add Note and Document relationship panels to the Workshop detail view.</w:t>
       </w:r>
     </w:p>
     <w:p>
@@ -17384,106 +16923,82 @@
       </w:pPr>
       <w:r>
         <w:rPr/>
-        <w:t xml:space="preserve">☐ </w:t>
-      </w:r>
-      <w:r>
-        <w:rPr/>
-        <w:t>Create the Workshop Attendance custom entity.</w:t>
-      </w:r>
-    </w:p>
-    <w:p>
-      <w:pPr>
-        <w:pStyle w:val="Normal"/>
-        <w:numPr>
-          <w:ilvl w:val="0"/>
-          <w:numId w:val="1"/>
-        </w:numPr>
-        <w:spacing w:before="0" w:after="60"/>
-        <w:rPr/>
-      </w:pPr>
-      <w:r>
-        <w:rPr/>
-        <w:t xml:space="preserve">☐ </w:t>
-      </w:r>
-      <w:r>
-        <w:rPr/>
-        <w:t>Add Workshop link field (link to Workshop entity).</w:t>
-      </w:r>
-    </w:p>
-    <w:p>
-      <w:pPr>
-        <w:pStyle w:val="Normal"/>
-        <w:numPr>
-          <w:ilvl w:val="0"/>
-          <w:numId w:val="1"/>
-        </w:numPr>
-        <w:spacing w:before="0" w:after="60"/>
-        <w:rPr/>
-      </w:pPr>
-      <w:r>
-        <w:rPr/>
-        <w:t xml:space="preserve">☐ </w:t>
-      </w:r>
-      <w:r>
-        <w:rPr/>
-        <w:t>Add Contact link field (link to Contact entity).</w:t>
-      </w:r>
-    </w:p>
-    <w:p>
-      <w:pPr>
-        <w:pStyle w:val="Normal"/>
-        <w:numPr>
-          <w:ilvl w:val="0"/>
-          <w:numId w:val="1"/>
-        </w:numPr>
-        <w:spacing w:before="0" w:after="60"/>
-        <w:rPr/>
-      </w:pPr>
-      <w:r>
-        <w:rPr/>
-        <w:t xml:space="preserve">☐ </w:t>
-      </w:r>
-      <w:r>
-        <w:rPr/>
-        <w:t>Add Engagement link field (link to Engagement entity).</w:t>
-      </w:r>
-    </w:p>
-    <w:p>
-      <w:pPr>
-        <w:pStyle w:val="Normal"/>
-        <w:numPr>
-          <w:ilvl w:val="0"/>
-          <w:numId w:val="1"/>
-        </w:numPr>
-        <w:spacing w:before="0" w:after="60"/>
-        <w:rPr/>
-      </w:pPr>
-      <w:r>
-        <w:rPr/>
-        <w:t xml:space="preserve">☐ </w:t>
-      </w:r>
-      <w:r>
-        <w:rPr/>
-        <w:t>Add Attendance Date field (date, auto-populated from linked Workshop).</w:t>
-      </w:r>
-    </w:p>
-    <w:p>
-      <w:pPr>
-        <w:pStyle w:val="Normal"/>
-        <w:numPr>
-          <w:ilvl w:val="0"/>
-          <w:numId w:val="1"/>
-        </w:numPr>
-        <w:spacing w:before="0" w:after="60"/>
-        <w:rPr/>
-      </w:pPr>
-      <w:r>
-        <w:rPr/>
-        <w:t xml:space="preserve">☐ </w:t>
-      </w:r>
-      <w:r>
-        <w:rPr/>
-        <w:t>Add Attended field (boolean yes/no, defaults to Yes).</w:t>
+        <w:t>☐ Create the Workshop Attendance custom entity.</w:t>
+      </w:r>
+    </w:p>
+    <w:p>
+      <w:pPr>
+        <w:pStyle w:val="Normal"/>
+        <w:numPr>
+          <w:ilvl w:val="0"/>
+          <w:numId w:val="1"/>
+        </w:numPr>
+        <w:spacing w:before="0" w:after="60"/>
+        <w:rPr/>
+      </w:pPr>
+      <w:r>
+        <w:rPr/>
+        <w:t>☐ Add Workshop link field (link to Workshop entity).</w:t>
+      </w:r>
+    </w:p>
+    <w:p>
+      <w:pPr>
+        <w:pStyle w:val="Normal"/>
+        <w:numPr>
+          <w:ilvl w:val="0"/>
+          <w:numId w:val="1"/>
+        </w:numPr>
+        <w:spacing w:before="0" w:after="60"/>
+        <w:rPr/>
+      </w:pPr>
+      <w:r>
+        <w:rPr/>
+        <w:t>☐ Add Contact link field (link to Contact entity).</w:t>
+      </w:r>
+    </w:p>
+    <w:p>
+      <w:pPr>
+        <w:pStyle w:val="Normal"/>
+        <w:numPr>
+          <w:ilvl w:val="0"/>
+          <w:numId w:val="1"/>
+        </w:numPr>
+        <w:spacing w:before="0" w:after="60"/>
+        <w:rPr/>
+      </w:pPr>
+      <w:r>
+        <w:rPr/>
+        <w:t>☐ Add Engagement link field (link to Engagement entity).</w:t>
+      </w:r>
+    </w:p>
+    <w:p>
+      <w:pPr>
+        <w:pStyle w:val="Normal"/>
+        <w:numPr>
+          <w:ilvl w:val="0"/>
+          <w:numId w:val="1"/>
+        </w:numPr>
+        <w:spacing w:before="0" w:after="60"/>
+        <w:rPr/>
+      </w:pPr>
+      <w:r>
+        <w:rPr/>
+        <w:t>☐ Add Attendance Date field (date, auto-populated from linked Workshop).</w:t>
+      </w:r>
+    </w:p>
+    <w:p>
+      <w:pPr>
+        <w:pStyle w:val="Normal"/>
+        <w:numPr>
+          <w:ilvl w:val="0"/>
+          <w:numId w:val="1"/>
+        </w:numPr>
+        <w:spacing w:before="0" w:after="60"/>
+        <w:rPr/>
+      </w:pPr>
+      <w:r>
+        <w:rPr/>
+        <w:t>☐ Add Attended field (boolean yes/no, defaults to Yes).</w:t>
       </w:r>
     </w:p>
     <w:p>
@@ -17537,182 +17052,142 @@
       </w:pPr>
       <w:r>
         <w:rPr/>
-        <w:t xml:space="preserve">☐ </w:t>
-      </w:r>
-      <w:r>
-        <w:rPr/>
-        <w:t>Configure Company → Contact relationship (one-to-many). Add Contact panel to Company detail view. Verify Company link appears on Contact detail view.</w:t>
-      </w:r>
-    </w:p>
-    <w:p>
-      <w:pPr>
-        <w:pStyle w:val="Normal"/>
-        <w:numPr>
-          <w:ilvl w:val="0"/>
-          <w:numId w:val="1"/>
-        </w:numPr>
-        <w:spacing w:before="0" w:after="60"/>
-        <w:rPr/>
-      </w:pPr>
-      <w:r>
-        <w:rPr/>
-        <w:t xml:space="preserve">☐ </w:t>
-      </w:r>
-      <w:r>
-        <w:rPr/>
-        <w:t>Configure Company → Engagement relationship (one-to-many). Add Engagement panel to Company detail view. Verify Company link appears on Engagement detail view.</w:t>
-      </w:r>
-    </w:p>
-    <w:p>
-      <w:pPr>
-        <w:pStyle w:val="Normal"/>
-        <w:numPr>
-          <w:ilvl w:val="0"/>
-          <w:numId w:val="1"/>
-        </w:numPr>
-        <w:spacing w:before="0" w:after="60"/>
-        <w:rPr/>
-      </w:pPr>
-      <w:r>
-        <w:rPr/>
-        <w:t xml:space="preserve">☐ </w:t>
-      </w:r>
-      <w:r>
-        <w:rPr/>
-        <w:t>Configure Engagement → Session relationship (one-to-many). Add Session panel to Engagement detail view. Verify Engagement link appears on Session detail view.</w:t>
-      </w:r>
-    </w:p>
-    <w:p>
-      <w:pPr>
-        <w:pStyle w:val="Normal"/>
-        <w:numPr>
-          <w:ilvl w:val="0"/>
-          <w:numId w:val="1"/>
-        </w:numPr>
-        <w:spacing w:before="0" w:after="60"/>
-        <w:rPr/>
-      </w:pPr>
-      <w:r>
-        <w:rPr/>
-        <w:t xml:space="preserve">☐ </w:t>
-      </w:r>
-      <w:r>
-        <w:rPr/>
-        <w:t>Configure Engagement → NPS Survey Response relationship (one-to-many). Add NPS Survey Response panel to Engagement detail view.</w:t>
-      </w:r>
-    </w:p>
-    <w:p>
-      <w:pPr>
-        <w:pStyle w:val="Normal"/>
-        <w:numPr>
-          <w:ilvl w:val="0"/>
-          <w:numId w:val="1"/>
-        </w:numPr>
-        <w:spacing w:before="0" w:after="60"/>
-        <w:rPr/>
-      </w:pPr>
-      <w:r>
-        <w:rPr/>
-        <w:t xml:space="preserve">☐ </w:t>
-      </w:r>
-      <w:r>
-        <w:rPr/>
-        <w:t>Configure Contact → Workshop Attendance relationship (one-to-many). Add Workshop Attendance panel to Contact detail view.</w:t>
-      </w:r>
-    </w:p>
-    <w:p>
-      <w:pPr>
-        <w:pStyle w:val="Normal"/>
-        <w:numPr>
-          <w:ilvl w:val="0"/>
-          <w:numId w:val="1"/>
-        </w:numPr>
-        <w:spacing w:before="0" w:after="60"/>
-        <w:rPr/>
-      </w:pPr>
-      <w:r>
-        <w:rPr/>
-        <w:t xml:space="preserve">☐ </w:t>
-      </w:r>
-      <w:r>
-        <w:rPr/>
-        <w:t>Configure Workshop → Workshop Attendance relationship (one-to-many). Add Workshop Attendance panel to Workshop detail view.</w:t>
-      </w:r>
-    </w:p>
-    <w:p>
-      <w:pPr>
-        <w:pStyle w:val="Normal"/>
-        <w:numPr>
-          <w:ilvl w:val="0"/>
-          <w:numId w:val="1"/>
-        </w:numPr>
-        <w:spacing w:before="0" w:after="60"/>
-        <w:rPr/>
-      </w:pPr>
-      <w:r>
-        <w:rPr/>
-        <w:t xml:space="preserve">☐ </w:t>
-      </w:r>
-      <w:r>
-        <w:rPr/>
-        <w:t>Configure Note many-to-many relationship panels on all entities: Company, Contact, Engagement, Session, NPS Survey Response, Workshop, Workshop Attendance.</w:t>
-      </w:r>
-    </w:p>
-    <w:p>
-      <w:pPr>
-        <w:pStyle w:val="Normal"/>
-        <w:numPr>
-          <w:ilvl w:val="0"/>
-          <w:numId w:val="1"/>
-        </w:numPr>
-        <w:spacing w:before="0" w:after="60"/>
-        <w:rPr/>
-      </w:pPr>
-      <w:r>
-        <w:rPr/>
-        <w:t xml:space="preserve">☐ </w:t>
-      </w:r>
-      <w:r>
-        <w:rPr/>
-        <w:t>Configure Document many-to-many relationship panels on all entities: Company, Contact, Engagement, Session, NPS Survey Response, Workshop, Workshop Attendance.</w:t>
-      </w:r>
-    </w:p>
-    <w:p>
-      <w:pPr>
-        <w:pStyle w:val="Normal"/>
-        <w:numPr>
-          <w:ilvl w:val="0"/>
-          <w:numId w:val="1"/>
-        </w:numPr>
-        <w:spacing w:before="0" w:after="60"/>
-        <w:rPr/>
-      </w:pPr>
-      <w:r>
-        <w:rPr/>
-        <w:t xml:space="preserve">☐ </w:t>
-      </w:r>
-      <w:r>
-        <w:rPr/>
-        <w:t>Configure Engagement → Engagement Contacts many-to-many relationship panel. Add Engagement Contacts panel to Engagement detail view. Verify Contact records show linked Engagements.</w:t>
-      </w:r>
-    </w:p>
-    <w:p>
-      <w:pPr>
-        <w:pStyle w:val="Normal"/>
-        <w:numPr>
-          <w:ilvl w:val="0"/>
-          <w:numId w:val="1"/>
-        </w:numPr>
-        <w:spacing w:before="0" w:after="60"/>
-        <w:rPr/>
-      </w:pPr>
-      <w:r>
-        <w:rPr/>
-        <w:t xml:space="preserve">☐ </w:t>
-      </w:r>
-      <w:r>
-        <w:rPr/>
-        <w:t>Verify Email and Calls activity panels are present on Company, Contact, and Engagement detail views.</w:t>
+        <w:t>☐ Configure Company → Contact relationship (one-to-many). Add Contact panel to Company detail view. Verify Company link appears on Contact detail view.</w:t>
+      </w:r>
+    </w:p>
+    <w:p>
+      <w:pPr>
+        <w:pStyle w:val="Normal"/>
+        <w:numPr>
+          <w:ilvl w:val="0"/>
+          <w:numId w:val="1"/>
+        </w:numPr>
+        <w:spacing w:before="0" w:after="60"/>
+        <w:rPr/>
+      </w:pPr>
+      <w:r>
+        <w:rPr/>
+        <w:t>☐ Configure Company → Engagement relationship (one-to-many). Add Engagement panel to Company detail view. Verify Company link appears on Engagement detail view.</w:t>
+      </w:r>
+    </w:p>
+    <w:p>
+      <w:pPr>
+        <w:pStyle w:val="Normal"/>
+        <w:numPr>
+          <w:ilvl w:val="0"/>
+          <w:numId w:val="1"/>
+        </w:numPr>
+        <w:spacing w:before="0" w:after="60"/>
+        <w:rPr/>
+      </w:pPr>
+      <w:r>
+        <w:rPr/>
+        <w:t>☐ Configure Engagement → Session relationship (one-to-many). Add Session panel to Engagement detail view. Verify Engagement link appears on Session detail view.</w:t>
+      </w:r>
+    </w:p>
+    <w:p>
+      <w:pPr>
+        <w:pStyle w:val="Normal"/>
+        <w:numPr>
+          <w:ilvl w:val="0"/>
+          <w:numId w:val="1"/>
+        </w:numPr>
+        <w:spacing w:before="0" w:after="60"/>
+        <w:rPr/>
+      </w:pPr>
+      <w:r>
+        <w:rPr/>
+        <w:t>☐ Configure Engagement → NPS Survey Response relationship (one-to-many). Add NPS Survey Response panel to Engagement detail view.</w:t>
+      </w:r>
+    </w:p>
+    <w:p>
+      <w:pPr>
+        <w:pStyle w:val="Normal"/>
+        <w:numPr>
+          <w:ilvl w:val="0"/>
+          <w:numId w:val="1"/>
+        </w:numPr>
+        <w:spacing w:before="0" w:after="60"/>
+        <w:rPr/>
+      </w:pPr>
+      <w:r>
+        <w:rPr/>
+        <w:t>☐ Configure Contact → Workshop Attendance relationship (one-to-many). Add Workshop Attendance panel to Contact detail view.</w:t>
+      </w:r>
+    </w:p>
+    <w:p>
+      <w:pPr>
+        <w:pStyle w:val="Normal"/>
+        <w:numPr>
+          <w:ilvl w:val="0"/>
+          <w:numId w:val="1"/>
+        </w:numPr>
+        <w:spacing w:before="0" w:after="60"/>
+        <w:rPr/>
+      </w:pPr>
+      <w:r>
+        <w:rPr/>
+        <w:t>☐ Configure Workshop → Workshop Attendance relationship (one-to-many). Add Workshop Attendance panel to Workshop detail view.</w:t>
+      </w:r>
+    </w:p>
+    <w:p>
+      <w:pPr>
+        <w:pStyle w:val="Normal"/>
+        <w:numPr>
+          <w:ilvl w:val="0"/>
+          <w:numId w:val="1"/>
+        </w:numPr>
+        <w:spacing w:before="0" w:after="60"/>
+        <w:rPr/>
+      </w:pPr>
+      <w:r>
+        <w:rPr/>
+        <w:t>☐ Configure Note many-to-many relationship panels on all entities: Company, Contact, Engagement, Session, NPS Survey Response, Workshop, Workshop Attendance.</w:t>
+      </w:r>
+    </w:p>
+    <w:p>
+      <w:pPr>
+        <w:pStyle w:val="Normal"/>
+        <w:numPr>
+          <w:ilvl w:val="0"/>
+          <w:numId w:val="1"/>
+        </w:numPr>
+        <w:spacing w:before="0" w:after="60"/>
+        <w:rPr/>
+      </w:pPr>
+      <w:r>
+        <w:rPr/>
+        <w:t>☐ Configure Document many-to-many relationship panels on all entities: Company, Contact, Engagement, Session, NPS Survey Response, Workshop, Workshop Attendance.</w:t>
+      </w:r>
+    </w:p>
+    <w:p>
+      <w:pPr>
+        <w:pStyle w:val="Normal"/>
+        <w:numPr>
+          <w:ilvl w:val="0"/>
+          <w:numId w:val="1"/>
+        </w:numPr>
+        <w:spacing w:before="0" w:after="60"/>
+        <w:rPr/>
+      </w:pPr>
+      <w:r>
+        <w:rPr/>
+        <w:t>☐ Configure Engagement → Engagement Contacts many-to-many relationship panel. Add Engagement Contacts panel to Engagement detail view. Verify Contact records show linked Engagements.</w:t>
+      </w:r>
+    </w:p>
+    <w:p>
+      <w:pPr>
+        <w:pStyle w:val="Normal"/>
+        <w:numPr>
+          <w:ilvl w:val="0"/>
+          <w:numId w:val="1"/>
+        </w:numPr>
+        <w:spacing w:before="0" w:after="60"/>
+        <w:rPr/>
+      </w:pPr>
+      <w:r>
+        <w:rPr/>
+        <w:t>☐ Verify Email and Calls activity panels are present on Company, Contact, and Engagement detail views.</w:t>
       </w:r>
     </w:p>
     <w:p>
@@ -17766,163 +17241,127 @@
       </w:pPr>
       <w:r>
         <w:rPr/>
-        <w:t xml:space="preserve">☐ </w:t>
-      </w:r>
-      <w:r>
-        <w:rPr/>
-        <w:t>Create or verify the Admin role with full Create/Read/Update/Delete access across all client domain entities.</w:t>
-      </w:r>
-    </w:p>
-    <w:p>
-      <w:pPr>
-        <w:pStyle w:val="Normal"/>
-        <w:numPr>
-          <w:ilvl w:val="0"/>
-          <w:numId w:val="1"/>
-        </w:numPr>
-        <w:spacing w:before="0" w:after="60"/>
-        <w:rPr/>
-      </w:pPr>
-      <w:r>
-        <w:rPr/>
-        <w:t xml:space="preserve">☐ </w:t>
-      </w:r>
-      <w:r>
-        <w:rPr/>
-        <w:t>Create the Primary Mentor role with Own Read/Update access on Company, Contact, and Engagement; Own Create/Read/Update on Session, Notes, and Documents; Own Read on NPS Survey Responses and Workshops.</w:t>
-      </w:r>
-    </w:p>
-    <w:p>
-      <w:pPr>
-        <w:pStyle w:val="Normal"/>
-        <w:numPr>
-          <w:ilvl w:val="0"/>
-          <w:numId w:val="1"/>
-        </w:numPr>
-        <w:spacing w:before="0" w:after="60"/>
-        <w:rPr/>
-      </w:pPr>
-      <w:r>
-        <w:rPr/>
-        <w:t xml:space="preserve">☐ </w:t>
-      </w:r>
-      <w:r>
-        <w:rPr/>
-        <w:t>Create the Co-Mentor role with the same permissions as Primary Mentor, scoped to assigned engagements only.</w:t>
-      </w:r>
-    </w:p>
-    <w:p>
-      <w:pPr>
-        <w:pStyle w:val="Normal"/>
-        <w:numPr>
-          <w:ilvl w:val="0"/>
-          <w:numId w:val="1"/>
-        </w:numPr>
-        <w:spacing w:before="0" w:after="60"/>
-        <w:rPr/>
-      </w:pPr>
-      <w:r>
-        <w:rPr/>
-        <w:t xml:space="preserve">☐ </w:t>
-      </w:r>
-      <w:r>
-        <w:rPr/>
-        <w:t>Create the SME role with Own Read access on Company, Contact, and Engagement; Own Create/Read/Update on Session, Notes, and Documents; Own Read on NPS Survey Responses.</w:t>
-      </w:r>
-    </w:p>
-    <w:p>
-      <w:pPr>
-        <w:pStyle w:val="Normal"/>
-        <w:numPr>
-          <w:ilvl w:val="0"/>
-          <w:numId w:val="1"/>
-        </w:numPr>
-        <w:spacing w:before="0" w:after="60"/>
-        <w:rPr/>
-      </w:pPr>
-      <w:r>
-        <w:rPr/>
-        <w:t xml:space="preserve">☐ </w:t>
-      </w:r>
-      <w:r>
-        <w:rPr/>
-        <w:t>Create the Board Member role with no access to individual client records. Configure access to aggregate reporting dashboards only.</w:t>
-      </w:r>
-    </w:p>
-    <w:p>
-      <w:pPr>
-        <w:pStyle w:val="Normal"/>
-        <w:numPr>
-          <w:ilvl w:val="0"/>
-          <w:numId w:val="1"/>
-        </w:numPr>
-        <w:spacing w:before="0" w:after="60"/>
-        <w:rPr/>
-      </w:pPr>
-      <w:r>
-        <w:rPr/>
-        <w:t xml:space="preserve">☐ </w:t>
-      </w:r>
-      <w:r>
-        <w:rPr/>
-        <w:t>Configure field-level access on EIN Number to restrict visibility to Admin and Primary Mentor roles only.</w:t>
-      </w:r>
-    </w:p>
-    <w:p>
-      <w:pPr>
-        <w:pStyle w:val="Normal"/>
-        <w:numPr>
-          <w:ilvl w:val="0"/>
-          <w:numId w:val="1"/>
-        </w:numPr>
-        <w:spacing w:before="0" w:after="60"/>
-        <w:rPr/>
-      </w:pPr>
-      <w:r>
-        <w:rPr/>
-        <w:t xml:space="preserve">☐ </w:t>
-      </w:r>
-      <w:r>
-        <w:rPr/>
-        <w:t>Configure Internal Only flag behavior on Note and Document entities to hide records from all non-Admin roles when flagged.</w:t>
-      </w:r>
-    </w:p>
-    <w:p>
-      <w:pPr>
-        <w:pStyle w:val="Normal"/>
-        <w:numPr>
-          <w:ilvl w:val="0"/>
-          <w:numId w:val="1"/>
-        </w:numPr>
-        <w:spacing w:before="0" w:after="60"/>
-        <w:rPr/>
-      </w:pPr>
-      <w:r>
-        <w:rPr/>
-        <w:t xml:space="preserve">☐ </w:t>
-      </w:r>
-      <w:r>
-        <w:rPr/>
-        <w:t>Configure Teams to enforce record-level visibility scoping — mentors see only records linked to their assigned Engagements.</w:t>
-      </w:r>
-    </w:p>
-    <w:p>
-      <w:pPr>
-        <w:pStyle w:val="Normal"/>
-        <w:numPr>
-          <w:ilvl w:val="0"/>
-          <w:numId w:val="1"/>
-        </w:numPr>
-        <w:spacing w:before="0" w:after="60"/>
-        <w:rPr/>
-      </w:pPr>
-      <w:r>
-        <w:rPr/>
-        <w:t xml:space="preserve">☐ </w:t>
-      </w:r>
-      <w:r>
-        <w:rPr/>
-        <w:t>Test each role by logging in as a test user and verifying correct visibility and action permissions across all entity types.</w:t>
+        <w:t>☐ Create or verify the Admin role with full Create/Read/Update/Delete access across all client domain entities.</w:t>
+      </w:r>
+    </w:p>
+    <w:p>
+      <w:pPr>
+        <w:pStyle w:val="Normal"/>
+        <w:numPr>
+          <w:ilvl w:val="0"/>
+          <w:numId w:val="1"/>
+        </w:numPr>
+        <w:spacing w:before="0" w:after="60"/>
+        <w:rPr/>
+      </w:pPr>
+      <w:r>
+        <w:rPr/>
+        <w:t>☐ Create the Primary Mentor role with Own Read/Update access on Company, Contact, and Engagement; Own Create/Read/Update on Session, Notes, and Documents; Own Read on NPS Survey Responses and Workshops.</w:t>
+      </w:r>
+    </w:p>
+    <w:p>
+      <w:pPr>
+        <w:pStyle w:val="Normal"/>
+        <w:numPr>
+          <w:ilvl w:val="0"/>
+          <w:numId w:val="1"/>
+        </w:numPr>
+        <w:spacing w:before="0" w:after="60"/>
+        <w:rPr/>
+      </w:pPr>
+      <w:r>
+        <w:rPr/>
+        <w:t>☐ Create the Co-Mentor role with the same permissions as Primary Mentor, scoped to assigned engagements only.</w:t>
+      </w:r>
+    </w:p>
+    <w:p>
+      <w:pPr>
+        <w:pStyle w:val="Normal"/>
+        <w:numPr>
+          <w:ilvl w:val="0"/>
+          <w:numId w:val="1"/>
+        </w:numPr>
+        <w:spacing w:before="0" w:after="60"/>
+        <w:rPr/>
+      </w:pPr>
+      <w:r>
+        <w:rPr/>
+        <w:t>☐ Create the SME role with Own Read access on Company, Contact, and Engagement; Own Create/Read/Update on Session, Notes, and Documents; Own Read on NPS Survey Responses.</w:t>
+      </w:r>
+    </w:p>
+    <w:p>
+      <w:pPr>
+        <w:pStyle w:val="Normal"/>
+        <w:numPr>
+          <w:ilvl w:val="0"/>
+          <w:numId w:val="1"/>
+        </w:numPr>
+        <w:spacing w:before="0" w:after="60"/>
+        <w:rPr/>
+      </w:pPr>
+      <w:r>
+        <w:rPr/>
+        <w:t>☐ Create the Board Member role with no access to individual client records. Configure access to aggregate reporting dashboards only.</w:t>
+      </w:r>
+    </w:p>
+    <w:p>
+      <w:pPr>
+        <w:pStyle w:val="Normal"/>
+        <w:numPr>
+          <w:ilvl w:val="0"/>
+          <w:numId w:val="1"/>
+        </w:numPr>
+        <w:spacing w:before="0" w:after="60"/>
+        <w:rPr/>
+      </w:pPr>
+      <w:r>
+        <w:rPr/>
+        <w:t>☐ Configure field-level access on EIN Number to restrict visibility to Admin and Primary Mentor roles only.</w:t>
+      </w:r>
+    </w:p>
+    <w:p>
+      <w:pPr>
+        <w:pStyle w:val="Normal"/>
+        <w:numPr>
+          <w:ilvl w:val="0"/>
+          <w:numId w:val="1"/>
+        </w:numPr>
+        <w:spacing w:before="0" w:after="60"/>
+        <w:rPr/>
+      </w:pPr>
+      <w:r>
+        <w:rPr/>
+        <w:t>☐ Configure Internal Only flag behavior on Note and Document entities to hide records from all non-Admin roles when flagged.</w:t>
+      </w:r>
+    </w:p>
+    <w:p>
+      <w:pPr>
+        <w:pStyle w:val="Normal"/>
+        <w:numPr>
+          <w:ilvl w:val="0"/>
+          <w:numId w:val="1"/>
+        </w:numPr>
+        <w:spacing w:before="0" w:after="60"/>
+        <w:rPr/>
+      </w:pPr>
+      <w:r>
+        <w:rPr/>
+        <w:t>☐ Configure Teams to enforce record-level visibility scoping — mentors see only records linked to their assigned Engagements.</w:t>
+      </w:r>
+    </w:p>
+    <w:p>
+      <w:pPr>
+        <w:pStyle w:val="Normal"/>
+        <w:numPr>
+          <w:ilvl w:val="0"/>
+          <w:numId w:val="1"/>
+        </w:numPr>
+        <w:spacing w:before="0" w:after="60"/>
+        <w:rPr/>
+      </w:pPr>
+      <w:r>
+        <w:rPr/>
+        <w:t>☐ Test each role by logging in as a test user and verifying correct visibility and action permissions across all entity types.</w:t>
       </w:r>
     </w:p>
     <w:p>
@@ -17976,277 +17415,217 @@
       </w:pPr>
       <w:r>
         <w:rPr/>
-        <w:t xml:space="preserve">☐ </w:t>
-      </w:r>
-      <w:r>
-        <w:rPr/>
-        <w:t>Configure intake workflow: on new Engagement record creation via REST API, set Status = Submitted and notify admin.</w:t>
-      </w:r>
-    </w:p>
-    <w:p>
-      <w:pPr>
-        <w:pStyle w:val="Normal"/>
-        <w:numPr>
-          <w:ilvl w:val="0"/>
-          <w:numId w:val="1"/>
-        </w:numPr>
-        <w:spacing w:before="0" w:after="60"/>
-        <w:rPr/>
-      </w:pPr>
-      <w:r>
-        <w:rPr/>
-        <w:t xml:space="preserve">☐ </w:t>
-      </w:r>
-      <w:r>
-        <w:rPr/>
-        <w:t>Configure mentor nomination workflow: on Engagement Status change to Pending Acceptance, send acceptance/refusal notification email to nominated mentor with configurable acceptance window (default 48 hours).</w:t>
-      </w:r>
-    </w:p>
-    <w:p>
-      <w:pPr>
-        <w:pStyle w:val="Normal"/>
-        <w:numPr>
-          <w:ilvl w:val="0"/>
-          <w:numId w:val="1"/>
-        </w:numPr>
-        <w:spacing w:before="0" w:after="60"/>
-        <w:rPr/>
-      </w:pPr>
-      <w:r>
-        <w:rPr/>
-        <w:t xml:space="preserve">☐ </w:t>
-      </w:r>
-      <w:r>
-        <w:rPr/>
-        <w:t>Configure mentor refusal workflow: on mentor refusal action, revert Engagement Status to Submitted and notify admin.</w:t>
-      </w:r>
-    </w:p>
-    <w:p>
-      <w:pPr>
-        <w:pStyle w:val="Normal"/>
-        <w:numPr>
-          <w:ilvl w:val="0"/>
-          <w:numId w:val="1"/>
-        </w:numPr>
-        <w:spacing w:before="0" w:after="60"/>
-        <w:rPr/>
-      </w:pPr>
-      <w:r>
-        <w:rPr/>
-        <w:t xml:space="preserve">☐ </w:t>
-      </w:r>
-      <w:r>
-        <w:rPr/>
-        <w:t>Configure acceptance window alert: if no mentor response within configured threshold, notify admin to follow up.</w:t>
-      </w:r>
-    </w:p>
-    <w:p>
-      <w:pPr>
-        <w:pStyle w:val="Normal"/>
-        <w:numPr>
-          <w:ilvl w:val="0"/>
-          <w:numId w:val="1"/>
-        </w:numPr>
-        <w:spacing w:before="0" w:after="60"/>
-        <w:rPr/>
-      </w:pPr>
-      <w:r>
-        <w:rPr/>
-        <w:t xml:space="preserve">☐ </w:t>
-      </w:r>
-      <w:r>
-        <w:rPr/>
-        <w:t>Configure first session workflow: on first Session record created against an Assigned Engagement, change Engagement Status to Active.</w:t>
-      </w:r>
-    </w:p>
-    <w:p>
-      <w:pPr>
-        <w:pStyle w:val="Normal"/>
-        <w:numPr>
-          <w:ilvl w:val="0"/>
-          <w:numId w:val="1"/>
-        </w:numPr>
-        <w:spacing w:before="0" w:after="60"/>
-        <w:rPr/>
-      </w:pPr>
-      <w:r>
-        <w:rPr/>
-        <w:t xml:space="preserve">☐ </w:t>
-      </w:r>
-      <w:r>
-        <w:rPr/>
-        <w:t>Configure inactivity monitoring workflow: daily check of Last Activity Date against cadence-aware Dormant threshold per Meeting Cadence setting. Change Status to Dormant and notify admin when threshold exceeded.</w:t>
-      </w:r>
-    </w:p>
-    <w:p>
-      <w:pPr>
-        <w:pStyle w:val="Normal"/>
-        <w:numPr>
-          <w:ilvl w:val="0"/>
-          <w:numId w:val="1"/>
-        </w:numPr>
-        <w:spacing w:before="0" w:after="60"/>
-        <w:rPr/>
-      </w:pPr>
-      <w:r>
-        <w:rPr/>
-        <w:t xml:space="preserve">☐ </w:t>
-      </w:r>
-      <w:r>
-        <w:rPr/>
-        <w:t>Configure Dormant-to-Inactive workflow: change Status to Inactive after configurable additional period (default 60 days) with no activity.</w:t>
-      </w:r>
-    </w:p>
-    <w:p>
-      <w:pPr>
-        <w:pStyle w:val="Normal"/>
-        <w:numPr>
-          <w:ilvl w:val="0"/>
-          <w:numId w:val="1"/>
-        </w:numPr>
-        <w:spacing w:before="0" w:after="60"/>
-        <w:rPr/>
-      </w:pPr>
-      <w:r>
-        <w:rPr/>
-        <w:t xml:space="preserve">☐ </w:t>
-      </w:r>
-      <w:r>
-        <w:rPr/>
-        <w:t>Configure Inactive-to-Abandoned workflow: change Status to Abandoned after configurable period (default 90 days). Trigger final NPS survey. Notify admin.</w:t>
-      </w:r>
-    </w:p>
-    <w:p>
-      <w:pPr>
-        <w:pStyle w:val="Normal"/>
-        <w:numPr>
-          <w:ilvl w:val="0"/>
-          <w:numId w:val="1"/>
-        </w:numPr>
-        <w:spacing w:before="0" w:after="60"/>
-        <w:rPr/>
-      </w:pPr>
-      <w:r>
-        <w:rPr/>
-        <w:t xml:space="preserve">☐ </w:t>
-      </w:r>
-      <w:r>
-        <w:rPr/>
-        <w:t>Configure NPS trigger workflow: after 2nd Session, trigger LimeSurvey API call to send survey to client. Repeat every 5 sessions thereafter.</w:t>
-      </w:r>
-    </w:p>
-    <w:p>
-      <w:pPr>
-        <w:pStyle w:val="Normal"/>
-        <w:numPr>
-          <w:ilvl w:val="0"/>
-          <w:numId w:val="1"/>
-        </w:numPr>
-        <w:spacing w:before="0" w:after="60"/>
-        <w:rPr/>
-      </w:pPr>
-      <w:r>
-        <w:rPr/>
-        <w:t xml:space="preserve">☐ </w:t>
-      </w:r>
-      <w:r>
-        <w:rPr/>
-        <w:t>Configure Engagement Close NPS trigger: on Status change to Completed or Abandoned, trigger final LimeSurvey API call.</w:t>
-      </w:r>
-    </w:p>
-    <w:p>
-      <w:pPr>
-        <w:pStyle w:val="Normal"/>
-        <w:numPr>
-          <w:ilvl w:val="0"/>
-          <w:numId w:val="1"/>
-        </w:numPr>
-        <w:spacing w:before="0" w:after="60"/>
-        <w:rPr/>
-      </w:pPr>
-      <w:r>
-        <w:rPr/>
-        <w:t xml:space="preserve">☐ </w:t>
-      </w:r>
-      <w:r>
-        <w:rPr/>
-        <w:t>Configure email auto-link workflow: automatically link inbound and outbound emails to the active Engagement when linked to a Contact with an active Engagement.</w:t>
-      </w:r>
-    </w:p>
-    <w:p>
-      <w:pPr>
-        <w:pStyle w:val="Normal"/>
-        <w:numPr>
-          <w:ilvl w:val="0"/>
-          <w:numId w:val="1"/>
-        </w:numPr>
-        <w:spacing w:before="0" w:after="60"/>
-        <w:rPr/>
-      </w:pPr>
-      <w:r>
-        <w:rPr/>
-        <w:t xml:space="preserve">☐ </w:t>
-      </w:r>
-      <w:r>
-        <w:rPr/>
-        <w:t>Configure meeting request workflow: when Next Session Date/Time is saved on the Engagement record (new or updated value), automatically send a calendar meeting request to all Engagement Contacts (or Primary Contact if panel is empty) and all assigned mentors (Primary Mentor, Co-Mentors, SMEs).</w:t>
-      </w:r>
-    </w:p>
-    <w:p>
-      <w:pPr>
-        <w:pStyle w:val="Normal"/>
-        <w:numPr>
-          <w:ilvl w:val="0"/>
-          <w:numId w:val="1"/>
-        </w:numPr>
-        <w:spacing w:before="0" w:after="60"/>
-        <w:rPr/>
-      </w:pPr>
-      <w:r>
-        <w:rPr/>
-        <w:t xml:space="preserve">☐ </w:t>
-      </w:r>
-      <w:r>
-        <w:rPr/>
-        <w:t>Configure session summary email draft workflow: when a Session record is saved, auto-generate a draft summary email from Topics Covered, Next Steps, and Next Session Date/Time, presented to the mentor for review and approval before sending. Configure recipients as Engagement Contacts (or Primary Contact if empty).</w:t>
-      </w:r>
-    </w:p>
-    <w:p>
-      <w:pPr>
-        <w:pStyle w:val="Normal"/>
-        <w:numPr>
-          <w:ilvl w:val="0"/>
-          <w:numId w:val="1"/>
-        </w:numPr>
-        <w:spacing w:before="0" w:after="60"/>
-        <w:rPr/>
-      </w:pPr>
-      <w:r>
-        <w:rPr/>
-        <w:t xml:space="preserve">☐ </w:t>
-      </w:r>
-      <w:r>
-        <w:rPr/>
-        <w:t>Set all configurable thresholds as admin-accessible system settings: acceptance window, Dormant thresholds per cadence, Inactive threshold, Abandoned threshold.</w:t>
-      </w:r>
-    </w:p>
-    <w:p>
-      <w:pPr>
-        <w:pStyle w:val="Normal"/>
-        <w:numPr>
-          <w:ilvl w:val="0"/>
-          <w:numId w:val="1"/>
-        </w:numPr>
-        <w:spacing w:before="0" w:after="60"/>
-        <w:rPr/>
-      </w:pPr>
-      <w:r>
-        <w:rPr/>
-        <w:t xml:space="preserve">☐ </w:t>
-      </w:r>
-      <w:r>
-        <w:rPr/>
-        <w:t>Test all workflows end-to-end in a development environment before enabling in production.</w:t>
+        <w:t>☐ Configure intake workflow: on new Engagement record creation via REST API, set Status = Submitted and notify admin.</w:t>
+      </w:r>
+    </w:p>
+    <w:p>
+      <w:pPr>
+        <w:pStyle w:val="Normal"/>
+        <w:numPr>
+          <w:ilvl w:val="0"/>
+          <w:numId w:val="1"/>
+        </w:numPr>
+        <w:spacing w:before="0" w:after="60"/>
+        <w:rPr/>
+      </w:pPr>
+      <w:r>
+        <w:rPr/>
+        <w:t>☐ Configure mentor nomination workflow: on Engagement Status change to Pending Acceptance, send acceptance/refusal notification email to nominated mentor with configurable acceptance window (default 48 hours).</w:t>
+      </w:r>
+    </w:p>
+    <w:p>
+      <w:pPr>
+        <w:pStyle w:val="Normal"/>
+        <w:numPr>
+          <w:ilvl w:val="0"/>
+          <w:numId w:val="1"/>
+        </w:numPr>
+        <w:spacing w:before="0" w:after="60"/>
+        <w:rPr/>
+      </w:pPr>
+      <w:r>
+        <w:rPr/>
+        <w:t>☐ Configure mentor decline workflow: on mentor decline action, set Engagement Status to Mentor Declined and notify admin.</w:t>
+      </w:r>
+    </w:p>
+    <w:p>
+      <w:pPr>
+        <w:pStyle w:val="Normal"/>
+        <w:numPr>
+          <w:ilvl w:val="0"/>
+          <w:numId w:val="1"/>
+        </w:numPr>
+        <w:spacing w:before="0" w:after="60"/>
+        <w:rPr/>
+      </w:pPr>
+      <w:r>
+        <w:rPr/>
+        <w:t>☐ Configure acceptance window alert: if no mentor response within configured threshold, notify admin to follow up.</w:t>
+      </w:r>
+    </w:p>
+    <w:p>
+      <w:pPr>
+        <w:pStyle w:val="Normal"/>
+        <w:numPr>
+          <w:ilvl w:val="0"/>
+          <w:numId w:val="1"/>
+        </w:numPr>
+        <w:spacing w:before="0" w:after="60"/>
+        <w:rPr/>
+      </w:pPr>
+      <w:r>
+        <w:rPr/>
+        <w:t>☐ Configure first session workflow: on first Session record created against an Assigned Engagement, change Engagement Status to Active.</w:t>
+      </w:r>
+    </w:p>
+    <w:p>
+      <w:pPr>
+        <w:pStyle w:val="Normal"/>
+        <w:numPr>
+          <w:ilvl w:val="0"/>
+          <w:numId w:val="1"/>
+        </w:numPr>
+        <w:spacing w:before="0" w:after="60"/>
+        <w:rPr/>
+      </w:pPr>
+      <w:r>
+        <w:rPr/>
+        <w:t>☐ Configure inactivity monitoring workflow: daily check of Last Activity Date against cadence-aware Dormant threshold per Meeting Cadence setting. Change Status to Dormant and notify admin when threshold exceeded.</w:t>
+      </w:r>
+    </w:p>
+    <w:p>
+      <w:pPr>
+        <w:pStyle w:val="Normal"/>
+        <w:numPr>
+          <w:ilvl w:val="0"/>
+          <w:numId w:val="1"/>
+        </w:numPr>
+        <w:spacing w:before="0" w:after="60"/>
+        <w:rPr/>
+      </w:pPr>
+      <w:r>
+        <w:rPr/>
+        <w:t>☐ Configure Dormant-to-Inactive workflow: change Status to Inactive after configurable additional period (default 60 days) with no activity.</w:t>
+      </w:r>
+    </w:p>
+    <w:p>
+      <w:pPr>
+        <w:pStyle w:val="Normal"/>
+        <w:numPr>
+          <w:ilvl w:val="0"/>
+          <w:numId w:val="1"/>
+        </w:numPr>
+        <w:spacing w:before="0" w:after="60"/>
+        <w:rPr/>
+      </w:pPr>
+      <w:r>
+        <w:rPr/>
+        <w:t>☐ Configure Inactive-to-Abandoned workflow: change Status to Abandoned after configurable period (default 90 days). Trigger final NPS survey. Notify admin.</w:t>
+      </w:r>
+    </w:p>
+    <w:p>
+      <w:pPr>
+        <w:pStyle w:val="Normal"/>
+        <w:numPr>
+          <w:ilvl w:val="0"/>
+          <w:numId w:val="1"/>
+        </w:numPr>
+        <w:spacing w:before="0" w:after="60"/>
+        <w:rPr/>
+      </w:pPr>
+      <w:r>
+        <w:rPr/>
+        <w:t>☐ Configure NPS trigger workflow: after 2nd Session, trigger LimeSurvey API call to send survey to client. Repeat every 5 sessions thereafter.</w:t>
+      </w:r>
+    </w:p>
+    <w:p>
+      <w:pPr>
+        <w:pStyle w:val="Normal"/>
+        <w:numPr>
+          <w:ilvl w:val="0"/>
+          <w:numId w:val="1"/>
+        </w:numPr>
+        <w:spacing w:before="0" w:after="60"/>
+        <w:rPr/>
+      </w:pPr>
+      <w:r>
+        <w:rPr/>
+        <w:t>☐ Configure Engagement Close NPS trigger: on Status change to Completed or Abandoned, trigger final LimeSurvey API call.</w:t>
+      </w:r>
+    </w:p>
+    <w:p>
+      <w:pPr>
+        <w:pStyle w:val="Normal"/>
+        <w:numPr>
+          <w:ilvl w:val="0"/>
+          <w:numId w:val="1"/>
+        </w:numPr>
+        <w:spacing w:before="0" w:after="60"/>
+        <w:rPr/>
+      </w:pPr>
+      <w:r>
+        <w:rPr/>
+        <w:t>☐ Configure email auto-link workflow: automatically link inbound and outbound emails to the active Engagement when linked to a Contact with an active Engagement.</w:t>
+      </w:r>
+    </w:p>
+    <w:p>
+      <w:pPr>
+        <w:pStyle w:val="Normal"/>
+        <w:numPr>
+          <w:ilvl w:val="0"/>
+          <w:numId w:val="1"/>
+        </w:numPr>
+        <w:spacing w:before="0" w:after="60"/>
+        <w:rPr/>
+      </w:pPr>
+      <w:r>
+        <w:rPr/>
+        <w:t>☐ Configure meeting request workflow: when Next Session Date/Time is saved on the Engagement record (new or updated value), automatically send a calendar meeting request to all Engagement Contacts (or Primary Contact if panel is empty) and all assigned mentors (Primary Mentor, Co-Mentors, SMEs).</w:t>
+      </w:r>
+    </w:p>
+    <w:p>
+      <w:pPr>
+        <w:pStyle w:val="Normal"/>
+        <w:numPr>
+          <w:ilvl w:val="0"/>
+          <w:numId w:val="1"/>
+        </w:numPr>
+        <w:spacing w:before="0" w:after="60"/>
+        <w:rPr/>
+      </w:pPr>
+      <w:r>
+        <w:rPr/>
+        <w:t>☐ Configure session summary email draft workflow: when a Session record is saved, auto-generate a draft summary email from Topics Covered, Next Steps, and Next Session Date/Time, presented to the mentor for review and approval before sending. Configure recipients as Engagement Contacts (or Primary Contact if empty).</w:t>
+      </w:r>
+    </w:p>
+    <w:p>
+      <w:pPr>
+        <w:pStyle w:val="Normal"/>
+        <w:numPr>
+          <w:ilvl w:val="0"/>
+          <w:numId w:val="1"/>
+        </w:numPr>
+        <w:spacing w:before="0" w:after="60"/>
+        <w:rPr/>
+      </w:pPr>
+      <w:r>
+        <w:rPr/>
+        <w:t>☐ Set all configurable thresholds as admin-accessible system settings: acceptance window, Dormant thresholds per cadence, Inactive threshold, Abandoned threshold.</w:t>
+      </w:r>
+    </w:p>
+    <w:p>
+      <w:pPr>
+        <w:pStyle w:val="Normal"/>
+        <w:numPr>
+          <w:ilvl w:val="0"/>
+          <w:numId w:val="1"/>
+        </w:numPr>
+        <w:spacing w:before="0" w:after="60"/>
+        <w:rPr/>
+      </w:pPr>
+      <w:r>
+        <w:rPr/>
+        <w:t>☐ Test all workflows end-to-end in a development environment before enabling in production.</w:t>
       </w:r>
     </w:p>
     <w:p>
@@ -18300,87 +17679,67 @@
       </w:pPr>
       <w:r>
         <w:rPr/>
-        <w:t xml:space="preserve">☐ </w:t>
-      </w:r>
-      <w:r>
-        <w:rPr/>
-        <w:t>Create Engagement presets: New Client Submissions (Status = Submitted — used by admin for daily intake review), Pending Acceptance, Active Engagements, Dormant Engagements, Inactive Engagements, Abandoned Engagements, Completed Engagements.</w:t>
-      </w:r>
-    </w:p>
-    <w:p>
-      <w:pPr>
-        <w:pStyle w:val="Normal"/>
-        <w:numPr>
-          <w:ilvl w:val="0"/>
-          <w:numId w:val="1"/>
-        </w:numPr>
-        <w:spacing w:before="0" w:after="60"/>
-        <w:rPr/>
-      </w:pPr>
-      <w:r>
-        <w:rPr/>
-        <w:t xml:space="preserve">☐ </w:t>
-      </w:r>
-      <w:r>
-        <w:rPr/>
-        <w:t>Create Company presets: All Companies, Companies with Active Engagements, Companies with No Active Engagement.</w:t>
-      </w:r>
-    </w:p>
-    <w:p>
-      <w:pPr>
-        <w:pStyle w:val="Normal"/>
-        <w:numPr>
-          <w:ilvl w:val="0"/>
-          <w:numId w:val="1"/>
-        </w:numPr>
-        <w:spacing w:before="0" w:after="60"/>
-        <w:rPr/>
-      </w:pPr>
-      <w:r>
-        <w:rPr/>
-        <w:t xml:space="preserve">☐ </w:t>
-      </w:r>
-      <w:r>
-        <w:rPr/>
-        <w:t>Create Session presets: Sessions This Month, Sessions This Quarter.</w:t>
-      </w:r>
-    </w:p>
-    <w:p>
-      <w:pPr>
-        <w:pStyle w:val="Normal"/>
-        <w:numPr>
-          <w:ilvl w:val="0"/>
-          <w:numId w:val="1"/>
-        </w:numPr>
-        <w:spacing w:before="0" w:after="60"/>
-        <w:rPr/>
-      </w:pPr>
-      <w:r>
-        <w:rPr/>
-        <w:t xml:space="preserve">☐ </w:t>
-      </w:r>
-      <w:r>
-        <w:rPr/>
-        <w:t>Create NPS Survey Response presets: Recent NPS Responses, Low NPS Scores (0-6).</w:t>
-      </w:r>
-    </w:p>
-    <w:p>
-      <w:pPr>
-        <w:pStyle w:val="Normal"/>
-        <w:numPr>
-          <w:ilvl w:val="0"/>
-          <w:numId w:val="1"/>
-        </w:numPr>
-        <w:spacing w:before="0" w:after="60"/>
-        <w:rPr/>
-      </w:pPr>
-      <w:r>
-        <w:rPr/>
-        <w:t xml:space="preserve">☐ </w:t>
-      </w:r>
-      <w:r>
-        <w:rPr/>
-        <w:t>Create Note preset: My Notes (filtered by Created By = current user).</w:t>
+        <w:t>☐ Create Engagement presets: New Client Submissions (Status = Submitted — used by admin for daily intake review), Pending Acceptance, Active Engagements, Dormant Engagements, Inactive Engagements, Abandoned Engagements, Completed Engagements.</w:t>
+      </w:r>
+    </w:p>
+    <w:p>
+      <w:pPr>
+        <w:pStyle w:val="Normal"/>
+        <w:numPr>
+          <w:ilvl w:val="0"/>
+          <w:numId w:val="1"/>
+        </w:numPr>
+        <w:spacing w:before="0" w:after="60"/>
+        <w:rPr/>
+      </w:pPr>
+      <w:r>
+        <w:rPr/>
+        <w:t>☐ Create Company presets: All Companies, Companies with Active Engagements, Companies with No Active Engagement.</w:t>
+      </w:r>
+    </w:p>
+    <w:p>
+      <w:pPr>
+        <w:pStyle w:val="Normal"/>
+        <w:numPr>
+          <w:ilvl w:val="0"/>
+          <w:numId w:val="1"/>
+        </w:numPr>
+        <w:spacing w:before="0" w:after="60"/>
+        <w:rPr/>
+      </w:pPr>
+      <w:r>
+        <w:rPr/>
+        <w:t>☐ Create Session presets: Sessions This Month, Sessions This Quarter.</w:t>
+      </w:r>
+    </w:p>
+    <w:p>
+      <w:pPr>
+        <w:pStyle w:val="Normal"/>
+        <w:numPr>
+          <w:ilvl w:val="0"/>
+          <w:numId w:val="1"/>
+        </w:numPr>
+        <w:spacing w:before="0" w:after="60"/>
+        <w:rPr/>
+      </w:pPr>
+      <w:r>
+        <w:rPr/>
+        <w:t>☐ Create NPS Survey Response presets: Recent NPS Responses, Low NPS Scores (0-6).</w:t>
+      </w:r>
+    </w:p>
+    <w:p>
+      <w:pPr>
+        <w:pStyle w:val="Normal"/>
+        <w:numPr>
+          <w:ilvl w:val="0"/>
+          <w:numId w:val="1"/>
+        </w:numPr>
+        <w:spacing w:before="0" w:after="60"/>
+        <w:rPr/>
+      </w:pPr>
+      <w:r>
+        <w:rPr/>
+        <w:t>☐ Create Note preset: My Notes (filtered by Created By = current user).</w:t>
       </w:r>
     </w:p>
     <w:p>
@@ -18434,220 +17793,172 @@
       </w:pPr>
       <w:r>
         <w:rPr/>
-        <w:t xml:space="preserve">☐ </w:t>
-      </w:r>
-      <w:r>
-        <w:rPr/>
-        <w:t>Submit a test Mentoring Request via the WordPress intake form and verify Company, Contact, and Engagement records are created correctly in CRM.</w:t>
-      </w:r>
-    </w:p>
-    <w:p>
-      <w:pPr>
-        <w:pStyle w:val="Normal"/>
-        <w:numPr>
-          <w:ilvl w:val="0"/>
-          <w:numId w:val="1"/>
-        </w:numPr>
-        <w:spacing w:before="0" w:after="60"/>
-        <w:rPr/>
-      </w:pPr>
-      <w:r>
-        <w:rPr/>
-        <w:t xml:space="preserve">☐ </w:t>
-      </w:r>
-      <w:r>
-        <w:rPr/>
-        <w:t>Test mentor nomination workflow: nominate a mentor, verify notification sent, test acceptance path and refusal path.</w:t>
-      </w:r>
-    </w:p>
-    <w:p>
-      <w:pPr>
-        <w:pStyle w:val="Normal"/>
-        <w:numPr>
-          <w:ilvl w:val="0"/>
-          <w:numId w:val="1"/>
-        </w:numPr>
-        <w:spacing w:before="0" w:after="60"/>
-        <w:rPr/>
-      </w:pPr>
-      <w:r>
-        <w:rPr/>
-        <w:t xml:space="preserve">☐ </w:t>
-      </w:r>
-      <w:r>
-        <w:rPr/>
-        <w:t>Test Phase 2 form delivery and verify response data populates correct Company fields.</w:t>
-      </w:r>
-    </w:p>
-    <w:p>
-      <w:pPr>
-        <w:pStyle w:val="Normal"/>
-        <w:numPr>
-          <w:ilvl w:val="0"/>
-          <w:numId w:val="1"/>
-        </w:numPr>
-        <w:spacing w:before="0" w:after="60"/>
-        <w:rPr/>
-      </w:pPr>
-      <w:r>
-        <w:rPr/>
-        <w:t xml:space="preserve">☐ </w:t>
-      </w:r>
-      <w:r>
-        <w:rPr/>
-        <w:t>Log a test Session and verify Engagement roll-up fields update correctly (Total Sessions, Last Session Date, Total Session Hours, Total Sessions Last 30 Days).</w:t>
-      </w:r>
-    </w:p>
-    <w:p>
-      <w:pPr>
-        <w:pStyle w:val="Normal"/>
-        <w:numPr>
-          <w:ilvl w:val="0"/>
-          <w:numId w:val="1"/>
-        </w:numPr>
-        <w:spacing w:before="0" w:after="60"/>
-        <w:rPr/>
-      </w:pPr>
-      <w:r>
-        <w:rPr/>
-        <w:t xml:space="preserve">☐ </w:t>
-      </w:r>
-      <w:r>
-        <w:rPr/>
-        <w:t>Test NPS survey trigger at 2nd session: verify LimeSurvey sends survey and response posts back to CRM as NPS Survey Response record.</w:t>
-      </w:r>
-    </w:p>
-    <w:p>
-      <w:pPr>
-        <w:pStyle w:val="Normal"/>
-        <w:numPr>
-          <w:ilvl w:val="0"/>
-          <w:numId w:val="1"/>
-        </w:numPr>
-        <w:spacing w:before="0" w:after="60"/>
-        <w:rPr/>
-      </w:pPr>
-      <w:r>
-        <w:rPr/>
-        <w:t xml:space="preserve">☐ </w:t>
-      </w:r>
-      <w:r>
-        <w:rPr/>
-        <w:t>Test inactivity monitoring by manually advancing dates and verifying Dormant, Inactive, and Abandoned status transitions fire correctly.</w:t>
-      </w:r>
-    </w:p>
-    <w:p>
-      <w:pPr>
-        <w:pStyle w:val="Normal"/>
-        <w:numPr>
-          <w:ilvl w:val="0"/>
-          <w:numId w:val="1"/>
-        </w:numPr>
-        <w:spacing w:before="0" w:after="60"/>
-        <w:rPr/>
-      </w:pPr>
-      <w:r>
-        <w:rPr/>
-        <w:t xml:space="preserve">☐ </w:t>
-      </w:r>
-      <w:r>
-        <w:rPr/>
-        <w:t>Test role-based access by logging in as each role and verifying correct record visibility, field visibility, and action permissions.</w:t>
-      </w:r>
-    </w:p>
-    <w:p>
-      <w:pPr>
-        <w:pStyle w:val="Normal"/>
-        <w:numPr>
-          <w:ilvl w:val="0"/>
-          <w:numId w:val="1"/>
-        </w:numPr>
-        <w:spacing w:before="0" w:after="60"/>
-        <w:rPr/>
-      </w:pPr>
-      <w:r>
-        <w:rPr/>
-        <w:t xml:space="preserve">☐ </w:t>
-      </w:r>
-      <w:r>
-        <w:rPr/>
-        <w:t>Test Internal Only Note and Document visibility: create an Internal Only record as Admin, verify it is hidden from Mentor role.</w:t>
-      </w:r>
-    </w:p>
-    <w:p>
-      <w:pPr>
-        <w:pStyle w:val="Normal"/>
-        <w:numPr>
-          <w:ilvl w:val="0"/>
-          <w:numId w:val="1"/>
-        </w:numPr>
-        <w:spacing w:before="0" w:after="60"/>
-        <w:rPr/>
-      </w:pPr>
-      <w:r>
-        <w:rPr/>
-        <w:t xml:space="preserve">☐ </w:t>
-      </w:r>
-      <w:r>
-        <w:rPr/>
-        <w:t>Test EIN Number field-level access: verify Co-Mentor and SME roles cannot see the field.</w:t>
-      </w:r>
-    </w:p>
-    <w:p>
-      <w:pPr>
-        <w:pStyle w:val="Normal"/>
-        <w:numPr>
-          <w:ilvl w:val="0"/>
-          <w:numId w:val="1"/>
-        </w:numPr>
-        <w:spacing w:before="0" w:after="60"/>
-        <w:rPr/>
-      </w:pPr>
-      <w:r>
-        <w:rPr/>
-        <w:t xml:space="preserve">☐ </w:t>
-      </w:r>
-      <w:r>
-        <w:rPr/>
-        <w:t>Test email auto-link workflow: send an email from mentor Gmail, verify it appears on both the Contact and Engagement activity streams.</w:t>
-      </w:r>
-    </w:p>
-    <w:p>
-      <w:pPr>
-        <w:pStyle w:val="Normal"/>
-        <w:numPr>
-          <w:ilvl w:val="0"/>
-          <w:numId w:val="1"/>
-        </w:numPr>
-        <w:spacing w:before="0" w:after="60"/>
-        <w:rPr/>
-      </w:pPr>
-      <w:r>
-        <w:rPr/>
-        <w:t xml:space="preserve">☐ </w:t>
-      </w:r>
-      <w:r>
-        <w:rPr/>
-        <w:t>Test global search presets: verify all presets return expected results.</w:t>
-      </w:r>
-    </w:p>
-    <w:p>
-      <w:pPr>
-        <w:pStyle w:val="Normal"/>
-        <w:numPr>
-          <w:ilvl w:val="0"/>
-          <w:numId w:val="1"/>
-        </w:numPr>
-        <w:spacing w:before="0" w:after="60"/>
-        <w:rPr/>
-      </w:pPr>
-      <w:r>
-        <w:rPr/>
-        <w:t xml:space="preserve">☐ </w:t>
-      </w:r>
-      <w:r>
-        <w:rPr/>
-        <w:t>Conduct a full end-to-end walkthrough of the client lifecycle from intake through engagement close with a test admin and test mentor account.</w:t>
+        <w:t>☐ Submit a test Mentoring Request via the WordPress intake form and verify Company, Contact, and Engagement records are created correctly in CRM.</w:t>
+      </w:r>
+    </w:p>
+    <w:p>
+      <w:pPr>
+        <w:pStyle w:val="Normal"/>
+        <w:numPr>
+          <w:ilvl w:val="0"/>
+          <w:numId w:val="1"/>
+        </w:numPr>
+        <w:spacing w:before="0" w:after="60"/>
+        <w:rPr/>
+      </w:pPr>
+      <w:r>
+        <w:rPr/>
+        <w:t>☐ Test mentor nomination workflow: nominate a mentor, verify notification sent, test acceptance path and decline path.</w:t>
+      </w:r>
+    </w:p>
+    <w:p>
+      <w:pPr>
+        <w:pStyle w:val="Normal"/>
+        <w:numPr>
+          <w:ilvl w:val="0"/>
+          <w:numId w:val="1"/>
+        </w:numPr>
+        <w:spacing w:before="0" w:after="60"/>
+        <w:rPr/>
+      </w:pPr>
+      <w:r>
+        <w:rPr/>
+        <w:t>☐ Test Phase 2 form delivery and verify response data populates correct Company fields.</w:t>
+      </w:r>
+    </w:p>
+    <w:p>
+      <w:pPr>
+        <w:pStyle w:val="Normal"/>
+        <w:numPr>
+          <w:ilvl w:val="0"/>
+          <w:numId w:val="1"/>
+        </w:numPr>
+        <w:spacing w:before="0" w:after="60"/>
+        <w:rPr/>
+      </w:pPr>
+      <w:r>
+        <w:rPr/>
+        <w:t>☐ Log a test Session and verify Engagement roll-up fields update correctly (Total Sessions, Last Session Date, Total Session Hours, Total Sessions Last 30 Days).</w:t>
+      </w:r>
+    </w:p>
+    <w:p>
+      <w:pPr>
+        <w:pStyle w:val="Normal"/>
+        <w:numPr>
+          <w:ilvl w:val="0"/>
+          <w:numId w:val="1"/>
+        </w:numPr>
+        <w:spacing w:before="0" w:after="60"/>
+        <w:rPr/>
+      </w:pPr>
+      <w:r>
+        <w:rPr/>
+        <w:t>☐ Test NPS survey trigger at 2nd session: verify LimeSurvey sends survey and response posts back to CRM as NPS Survey Response record.</w:t>
+      </w:r>
+    </w:p>
+    <w:p>
+      <w:pPr>
+        <w:pStyle w:val="Normal"/>
+        <w:numPr>
+          <w:ilvl w:val="0"/>
+          <w:numId w:val="1"/>
+        </w:numPr>
+        <w:spacing w:before="0" w:after="60"/>
+        <w:rPr/>
+      </w:pPr>
+      <w:r>
+        <w:rPr/>
+        <w:t>☐ Test inactivity monitoring by manually advancing dates and verifying Dormant, Inactive, and Abandoned status transitions fire correctly.</w:t>
+      </w:r>
+    </w:p>
+    <w:p>
+      <w:pPr>
+        <w:pStyle w:val="Normal"/>
+        <w:numPr>
+          <w:ilvl w:val="0"/>
+          <w:numId w:val="1"/>
+        </w:numPr>
+        <w:spacing w:before="0" w:after="60"/>
+        <w:rPr/>
+      </w:pPr>
+      <w:r>
+        <w:rPr/>
+        <w:t>☐ Test role-based access by logging in as each role and verifying correct record visibility, field visibility, and action permissions.</w:t>
+      </w:r>
+    </w:p>
+    <w:p>
+      <w:pPr>
+        <w:pStyle w:val="Normal"/>
+        <w:numPr>
+          <w:ilvl w:val="0"/>
+          <w:numId w:val="1"/>
+        </w:numPr>
+        <w:spacing w:before="0" w:after="60"/>
+        <w:rPr/>
+      </w:pPr>
+      <w:r>
+        <w:rPr/>
+        <w:t>☐ Test Internal Only Note and Document visibility: create an Internal Only record as Admin, verify it is hidden from Mentor role.</w:t>
+      </w:r>
+    </w:p>
+    <w:p>
+      <w:pPr>
+        <w:pStyle w:val="Normal"/>
+        <w:numPr>
+          <w:ilvl w:val="0"/>
+          <w:numId w:val="1"/>
+        </w:numPr>
+        <w:spacing w:before="0" w:after="60"/>
+        <w:rPr/>
+      </w:pPr>
+      <w:r>
+        <w:rPr/>
+        <w:t>☐ Test EIN Number field-level access: verify Co-Mentor and SME roles cannot see the field.</w:t>
+      </w:r>
+    </w:p>
+    <w:p>
+      <w:pPr>
+        <w:pStyle w:val="Normal"/>
+        <w:numPr>
+          <w:ilvl w:val="0"/>
+          <w:numId w:val="1"/>
+        </w:numPr>
+        <w:spacing w:before="0" w:after="60"/>
+        <w:rPr/>
+      </w:pPr>
+      <w:r>
+        <w:rPr/>
+        <w:t>☐ Test email auto-link workflow: send an email from mentor Gmail, verify it appears on both the Contact and Engagement activity streams.</w:t>
+      </w:r>
+    </w:p>
+    <w:p>
+      <w:pPr>
+        <w:pStyle w:val="Normal"/>
+        <w:numPr>
+          <w:ilvl w:val="0"/>
+          <w:numId w:val="1"/>
+        </w:numPr>
+        <w:spacing w:before="0" w:after="60"/>
+        <w:rPr/>
+      </w:pPr>
+      <w:r>
+        <w:rPr/>
+        <w:t>☐ Test global search presets: verify all presets return expected results.</w:t>
+      </w:r>
+    </w:p>
+    <w:p>
+      <w:pPr>
+        <w:pStyle w:val="Normal"/>
+        <w:numPr>
+          <w:ilvl w:val="0"/>
+          <w:numId w:val="1"/>
+        </w:numPr>
+        <w:spacing w:before="0" w:after="60"/>
+        <w:rPr/>
+      </w:pPr>
+      <w:r>
+        <w:rPr/>
+        <w:t>☐ Conduct a full end-to-end walkthrough of the client lifecycle from intake through engagement close with a test admin and test mentor account.</w:t>
       </w:r>
     </w:p>
     <w:p>

</xml_diff>

<commit_message>
Client PRD: Add Logged By and Mentor Attendees fields to Session entity; add save validation rule; update 6.5 checklist
</commit_message>
<xml_diff>
--- a/PRDs/CBM-PRD-CRM-Client.docx
+++ b/PRDs/CBM-PRD-CRM-Client.docx
@@ -4564,6 +4564,116 @@
                 <w:szCs w:val="18"/>
               </w:rPr>
               <w:t>Scheduled date and time of the next meeting, set by the mentor while logging the current session. Date/time field. Optional. When saved, automatically populates the Next Session Date/Time field on the linked Engagement record. Intended to be set during the session while the mentor has the client on the call.</w:t>
+            </w:r>
+          </w:p>
+        </w:tc>
+      </w:tr>
+      <w:tr>
+        <w:trPr/>
+        <w:tc>
+          <w:tcPr>
+            <w:tcW w:w="2500" w:type="dxa"/>
+            <w:tcBorders>
+              <w:top w:val="single" w:sz="2" w:space="0" w:color="CCCCCC"/>
+              <w:left w:val="single" w:sz="2" w:space="0" w:color="CCCCCC"/>
+              <w:bottom w:val="single" w:sz="2" w:space="0" w:color="CCCCCC"/>
+              <w:right w:val="single" w:sz="2" w:space="0" w:color="CCCCCC"/>
+            </w:tcBorders>
+            <w:shd w:fill="F2F2F2" w:val="clear"/>
+          </w:tcPr>
+          <w:p>
+            <w:pPr>
+              <w:pStyle w:val="Normal"/>
+              <w:rPr/>
+            </w:pPr>
+            <w:r>
+              <w:rPr>
+                <w:rFonts w:eastAsia="Arial" w:cs="Arial"/>
+                <w:sz w:val="18"/>
+                <w:szCs w:val="18"/>
+              </w:rPr>
+              <w:t>Logged By</w:t>
+            </w:r>
+          </w:p>
+        </w:tc>
+        <w:tc>
+          <w:tcPr>
+            <w:tcW w:w="6859" w:type="dxa"/>
+            <w:tcBorders>
+              <w:top w:val="single" w:sz="2" w:space="0" w:color="CCCCCC"/>
+              <w:left w:val="single" w:sz="2" w:space="0" w:color="CCCCCC"/>
+              <w:bottom w:val="single" w:sz="2" w:space="0" w:color="CCCCCC"/>
+              <w:right w:val="single" w:sz="2" w:space="0" w:color="CCCCCC"/>
+            </w:tcBorders>
+            <w:shd w:fill="F2F2F2" w:val="clear"/>
+          </w:tcPr>
+          <w:p>
+            <w:pPr>
+              <w:pStyle w:val="Normal"/>
+              <w:rPr/>
+            </w:pPr>
+            <w:r>
+              <w:rPr>
+                <w:rFonts w:eastAsia="Arial" w:cs="Arial"/>
+                <w:sz w:val="18"/>
+                <w:szCs w:val="18"/>
+              </w:rPr>
+              <w:t>Native EspoCRM Created By field, relabeled to “Logged By.” System-populated. Read-only. The CRM user who created the Session record. Visible on the Session detail view and used as a column on the Session list view to identify which mentor logged each session.</w:t>
+            </w:r>
+          </w:p>
+        </w:tc>
+      </w:tr>
+      <w:tr>
+        <w:trPr/>
+        <w:tc>
+          <w:tcPr>
+            <w:tcW w:w="2500" w:type="dxa"/>
+            <w:tcBorders>
+              <w:top w:val="single" w:sz="2" w:space="0" w:color="CCCCCC"/>
+              <w:left w:val="single" w:sz="2" w:space="0" w:color="CCCCCC"/>
+              <w:bottom w:val="single" w:sz="2" w:space="0" w:color="CCCCCC"/>
+              <w:right w:val="single" w:sz="2" w:space="0" w:color="CCCCCC"/>
+            </w:tcBorders>
+            <w:shd w:fill="FFFFFF" w:val="clear"/>
+          </w:tcPr>
+          <w:p>
+            <w:pPr>
+              <w:pStyle w:val="Normal"/>
+              <w:rPr/>
+            </w:pPr>
+            <w:r>
+              <w:rPr>
+                <w:rFonts w:eastAsia="Arial" w:cs="Arial"/>
+                <w:sz w:val="18"/>
+                <w:szCs w:val="18"/>
+              </w:rPr>
+              <w:t>Mentor Attendees</w:t>
+            </w:r>
+          </w:p>
+        </w:tc>
+        <w:tc>
+          <w:tcPr>
+            <w:tcW w:w="6859" w:type="dxa"/>
+            <w:tcBorders>
+              <w:top w:val="single" w:sz="2" w:space="0" w:color="CCCCCC"/>
+              <w:left w:val="single" w:sz="2" w:space="0" w:color="CCCCCC"/>
+              <w:bottom w:val="single" w:sz="2" w:space="0" w:color="CCCCCC"/>
+              <w:right w:val="single" w:sz="2" w:space="0" w:color="CCCCCC"/>
+            </w:tcBorders>
+            <w:shd w:fill="FFFFFF" w:val="clear"/>
+          </w:tcPr>
+          <w:p>
+            <w:pPr>
+              <w:pStyle w:val="Normal"/>
+              <w:rPr/>
+            </w:pPr>
+            <w:r>
+              <w:rPr>
+                <w:rFonts w:eastAsia="Arial" w:cs="Arial"/>
+                <w:sz w:val="18"/>
+                <w:szCs w:val="18"/>
+              </w:rPr>
+              <w:t>Many-to-many relationship panel. Links the mentor Contact records who were physically present at this session. A session may have multiple mentor attendees; a mentor may be listed on multiple sessions. Required (save validation): at least one Contact from a Mentoring Company (Company Role = Mentoring Company) must be added to this panel before the Session record can be saved. The mentor who logs the session and the mentors listed as attendees are independent — the logger need not be an attendee and attendees need not be the logger.</w:t>
             </w:r>
           </w:p>
         </w:tc>
@@ -16447,6 +16557,66 @@
       <w:r>
         <w:rPr/>
         <w:t>☐ Add New Business Started field (checkbox/boolean).</w:t>
+      </w:r>
+    </w:p>
+    <w:p>
+      <w:pPr>
+        <w:pStyle w:val="Normal"/>
+        <w:numPr>
+          <w:ilvl w:val="0"/>
+          <w:numId w:val="1"/>
+        </w:numPr>
+        <w:spacing w:before="0" w:after="60"/>
+        <w:rPr/>
+      </w:pPr>
+      <w:r>
+        <w:rPr/>
+        <w:t>☐ Add Next Session Date/Time field (date/time).</w:t>
+      </w:r>
+    </w:p>
+    <w:p>
+      <w:pPr>
+        <w:pStyle w:val="Normal"/>
+        <w:numPr>
+          <w:ilvl w:val="0"/>
+          <w:numId w:val="1"/>
+        </w:numPr>
+        <w:spacing w:before="0" w:after="60"/>
+        <w:rPr/>
+      </w:pPr>
+      <w:r>
+        <w:rPr/>
+        <w:t>☐ Relabel the native EspoCRM Created By field to “Logged By” on the Session entity. Verify it is displayed on the Session detail view and included as a column on the Session list view.</w:t>
+      </w:r>
+    </w:p>
+    <w:p>
+      <w:pPr>
+        <w:pStyle w:val="Normal"/>
+        <w:numPr>
+          <w:ilvl w:val="0"/>
+          <w:numId w:val="1"/>
+        </w:numPr>
+        <w:spacing w:before="0" w:after="60"/>
+        <w:rPr/>
+      </w:pPr>
+      <w:r>
+        <w:rPr/>
+        <w:t>☐ Configure Mentor Attendees as a many-to-many relationship between the Session entity and the Contact entity (mentor contacts). Add a Mentor Attendees relationship panel to the Session detail view.</w:t>
+      </w:r>
+    </w:p>
+    <w:p>
+      <w:pPr>
+        <w:pStyle w:val="Normal"/>
+        <w:numPr>
+          <w:ilvl w:val="0"/>
+          <w:numId w:val="1"/>
+        </w:numPr>
+        <w:spacing w:before="0" w:after="60"/>
+        <w:rPr/>
+      </w:pPr>
+      <w:r>
+        <w:rPr/>
+        <w:t>☐ Configure a save validation rule on the Session entity requiring at least one Contact from a Mentoring Company (Company Role = Mentoring Company) to be present in the Mentor Attendees panel before the record can be saved.</w:t>
       </w:r>
     </w:p>
     <w:p>

</xml_diff>

<commit_message>
Client PRD: Company UI layout — Business Identity panels, Phase 2 separate tab, Contacts and Engagements relationship panels with List Short config
</commit_message>
<xml_diff>
--- a/PRDs/CBM-PRD-CRM-Client.docx
+++ b/PRDs/CBM-PRD-CRM-Client.docx
@@ -15914,22 +15914,22 @@
       </w:pPr>
       <w:r>
         <w:rPr/>
-        <w:t>☐ Organize all fields into logical panel groups on the Company detail view: Contact Information, Business Classification, Mentoring Context (Phase 1), Business Detail (Phase 2), Professional Advisors, Business Registration.</w:t>
-      </w:r>
-    </w:p>
-    <w:p>
-      <w:pPr>
-        <w:pStyle w:val="Normal"/>
-        <w:numPr>
-          <w:ilvl w:val="0"/>
-          <w:numId w:val="1"/>
-        </w:numPr>
-        <w:spacing w:before="0" w:after="60"/>
-        <w:rPr/>
-      </w:pPr>
-      <w:r>
-        <w:rPr/>
-        <w:t>☐ Configure Phase 2 panel group to be collapsible and clearly labeled as post-assignment information.</w:t>
+        <w:t>☐ Organize fields into labeled panels on the Company detail view main tab: Business Identity (Business Name, Website, Address), Business Classification (Organization Type, Business Stage, NAICS Sector, NAICS Subsector, Mentoring Focus Areas), Mentoring Context (Mentoring Needs Description), Professional Advisors (Current Professional Advisors), Business Registration (Registered with State, and conditional fields: State of Registration, Legal Business Structure, EIN on File, Date of Formation, Registered Agent, EIN Number).</w:t>
+      </w:r>
+    </w:p>
+    <w:p>
+      <w:pPr>
+        <w:pStyle w:val="Normal"/>
+        <w:numPr>
+          <w:ilvl w:val="0"/>
+          <w:numId w:val="1"/>
+        </w:numPr>
+        <w:spacing w:before="0" w:after="60"/>
+        <w:rPr/>
+      </w:pPr>
+      <w:r>
+        <w:rPr/>
+        <w:t>☐ Configure Phase 2 fields (Business Description, Time in Operation, Current Team Size, Revenue Range, Funding Situation, Current Challenges, Goals and Objectives, Desired Outcomes, Previous Mentoring/Advisory Experience) as a separate tab on the Company detail view, labeled “Business Detail (Phase 2).” This tab is completed post-assignment at the mentor’s discretion and should be clearly labeled as post-assignment information.</w:t>
       </w:r>
     </w:p>
     <w:p>
@@ -15945,6 +15945,36 @@
       <w:r>
         <w:rPr/>
         <w:t>☐ Add Note, Document, Email, and Calls relationship panels to the Company detail view.</w:t>
+      </w:r>
+    </w:p>
+    <w:p>
+      <w:pPr>
+        <w:pStyle w:val="Normal"/>
+        <w:numPr>
+          <w:ilvl w:val="0"/>
+          <w:numId w:val="1"/>
+        </w:numPr>
+        <w:spacing w:before="0" w:after="60"/>
+        <w:rPr/>
+      </w:pPr>
+      <w:r>
+        <w:rPr/>
+        <w:t>☐ Add Contacts relationship panel to the Company detail view. Configure the List (Short) for this panel to display: Full Name, Email, Phone, Role at Business, Primary Contact.</w:t>
+      </w:r>
+    </w:p>
+    <w:p>
+      <w:pPr>
+        <w:pStyle w:val="Normal"/>
+        <w:numPr>
+          <w:ilvl w:val="0"/>
+          <w:numId w:val="1"/>
+        </w:numPr>
+        <w:spacing w:before="0" w:after="60"/>
+        <w:rPr/>
+      </w:pPr>
+      <w:r>
+        <w:rPr/>
+        <w:t>☐ Add Engagements relationship panel to the Company detail view. Configure the List (Short) for this panel to display: Engagement Name, Status. This allows the current engagement status to be visible directly from the Company record without requiring a separate roll-up formula field.</w:t>
       </w:r>
     </w:p>
     <w:p>

</xml_diff>

<commit_message>
Client PRD: Engagement UI layout — Activity Summary panel read-only, panel names, Workshop Attendance relationship panel
</commit_message>
<xml_diff>
--- a/PRDs/CBM-PRD-CRM-Client.docx
+++ b/PRDs/CBM-PRD-CRM-Client.docx
@@ -16292,7 +16292,7 @@
       </w:pPr>
       <w:r>
         <w:rPr/>
-        <w:t>☐ Add formula/roll-up fields: Total Sessions (count of linked Sessions), Total Sessions Last 30 Days (count of Sessions in last 30 days), Last Session Date (date of most recent Session), Total Session Hours (sum of Session Duration).</w:t>
+        <w:t>☐ Add formula/roll-up fields grouped in a panel named “Activity Summary”: Total Sessions (count of linked Sessions), Total Sessions Last 30 Days (count of Sessions in last 30 days), Last Session Date (date of most recent Session), Total Session Hours (sum of Session Duration). All four fields are system-calculated and must be configured as read-only. The Activity Summary panel itself should be labeled as read-only / system-calculated so implementers do not expose these fields as editable.</w:t>
       </w:r>
     </w:p>
     <w:p>
@@ -16322,7 +16322,7 @@
       </w:pPr>
       <w:r>
         <w:rPr/>
-        <w:t>☐ Organize Engagement detail view panels: Engagement Details, Mentor Assignment, Analytics Summary.</w:t>
+        <w:t>☐ Organize Engagement detail view panels: Engagement Summary (Company, Status, Start Date, Close Date, Engagement Close Reason), Mentor Assignment (Assigned Mentor, Meeting Cadence, Next Session Date/Time), Activity Summary (Total Sessions, Total Sessions Last 30 Days, Last Session Date, Total Session Hours — all read-only/system-calculated).</w:t>
       </w:r>
     </w:p>
     <w:p>
@@ -16353,6 +16353,21 @@
       <w:r>
         <w:rPr/>
         <w:t>☐ Add Note, Document, Email, and Calls relationship panels to the Engagement detail view.</w:t>
+      </w:r>
+    </w:p>
+    <w:p>
+      <w:pPr>
+        <w:pStyle w:val="Normal"/>
+        <w:numPr>
+          <w:ilvl w:val="0"/>
+          <w:numId w:val="1"/>
+        </w:numPr>
+        <w:spacing w:before="0" w:after="60"/>
+        <w:rPr/>
+      </w:pPr>
+      <w:r>
+        <w:rPr/>
+        <w:t>☐ Add Workshop Attendance relationship panel to the Engagement detail view. This panel gives mentors visibility into which workshops their assigned clients have attended within the context of the engagement. Configure the List (Short) to display: Contact Name, Workshop Title, Attendance Date, Attended.</w:t>
       </w:r>
     </w:p>
     <w:p>

</xml_diff>

<commit_message>
Client PRD: Session UI layout — panel organization and list view column spec
</commit_message>
<xml_diff>
--- a/PRDs/CBM-PRD-CRM-Client.docx
+++ b/PRDs/CBM-PRD-CRM-Client.docx
@@ -16677,6 +16677,36 @@
       <w:r>
         <w:rPr/>
         <w:t>☐ Add Note and Document relationship panels to the Session detail view.</w:t>
+      </w:r>
+    </w:p>
+    <w:p>
+      <w:pPr>
+        <w:pStyle w:val="Normal"/>
+        <w:numPr>
+          <w:ilvl w:val="0"/>
+          <w:numId w:val="1"/>
+        </w:numPr>
+        <w:spacing w:before="0" w:after="60"/>
+        <w:rPr/>
+      </w:pPr>
+      <w:r>
+        <w:rPr/>
+        <w:t>☐ Organize Session detail view panels: Session Details (Engagement, Session Date/Time, Duration, Session Type, Meeting Location Type, Location Details), Session Content (Topics Covered, Topics Covered Notes, Next Steps, New Business Started, Next Session Date/Time), Mentor Notes (Mentor Notes field), Mentor Attendees (relationship panel).</w:t>
+      </w:r>
+    </w:p>
+    <w:p>
+      <w:pPr>
+        <w:pStyle w:val="Normal"/>
+        <w:numPr>
+          <w:ilvl w:val="0"/>
+          <w:numId w:val="1"/>
+        </w:numPr>
+        <w:spacing w:before="0" w:after="60"/>
+        <w:rPr/>
+      </w:pPr>
+      <w:r>
+        <w:rPr/>
+        <w:t>☐ Configure the Session list view columns: Session Date/Time (primary sort, descending), Engagement, Session Type, Duration, Topics Covered, Next Session Date/Time, Logged By.</w:t>
       </w:r>
     </w:p>
     <w:p>

</xml_diff>

<commit_message>
Client PRD: NPS Survey Response UI layout — rename Mentor Listened field, record label, panel org, list view columns
</commit_message>
<xml_diff>
--- a/PRDs/CBM-PRD-CRM-Client.docx
+++ b/PRDs/CBM-PRD-CRM-Client.docx
@@ -5207,7 +5207,7 @@
                 <w:sz w:val="18"/>
                 <w:szCs w:val="18"/>
               </w:rPr>
-              <w:t>Mentor Listened and Understood My Needs</w:t>
+              <w:t>Mentor Listened to My Needs</w:t>
             </w:r>
           </w:p>
         </w:tc>
@@ -7974,7 +7974,7 @@
       </w:pPr>
       <w:r>
         <w:rPr/>
-        <w:t>Client completes the survey: NPS Score (0-10), Did CBM Help You (Yes/No), I Would Return to See This Mentor Again (1-5), Mentor Listened and Understood My Needs (1-5), and optional free-text feedback.</w:t>
+        <w:t>Client completes the survey: NPS Score (0-10), Did CBM Help You (Yes/No), I Would Return to See This Mentor Again (1-5), Mentor Listened to My Needs (1-5), and optional free-text feedback.</w:t>
       </w:r>
     </w:p>
     <w:p>
@@ -16850,7 +16850,52 @@
       </w:pPr>
       <w:r>
         <w:rPr/>
-        <w:t>☐ Add Mentor Listened and Understood My Needs field (integer, 1-5).</w:t>
+        <w:t>☐ Add Mentor Listened to My Needs field (integer, 1-5).</w:t>
+      </w:r>
+    </w:p>
+    <w:p>
+      <w:pPr>
+        <w:pStyle w:val="Normal"/>
+        <w:numPr>
+          <w:ilvl w:val="0"/>
+          <w:numId w:val="1"/>
+        </w:numPr>
+        <w:spacing w:before="0" w:after="60"/>
+        <w:rPr/>
+      </w:pPr>
+      <w:r>
+        <w:rPr/>
+        <w:t>☐ Configure the NPS Survey Response entity record label as a system-generated formula field combining Engagement name and Survey Date/Time in the format: [Engagement Name] – [Survey Date]. This label is used in relationship panels and search results to identify individual survey records.</w:t>
+      </w:r>
+    </w:p>
+    <w:p>
+      <w:pPr>
+        <w:pStyle w:val="Normal"/>
+        <w:numPr>
+          <w:ilvl w:val="0"/>
+          <w:numId w:val="1"/>
+        </w:numPr>
+        <w:spacing w:before="0" w:after="60"/>
+        <w:rPr/>
+      </w:pPr>
+      <w:r>
+        <w:rPr/>
+        <w:t>☐ Organize NPS Survey Response detail view panels: Survey Summary (Engagement, Session, Survey Trigger, Survey Date/Time), Survey Results (NPS Score, Did CBM Help You?, I Would Return to See This Mentor Again, Mentor Listened to My Needs), Client Feedback (How Could CBM Better Meet Your Needs?). All fields are read-only — no user should be able to edit survey response data. Restrict the Edit view to Admin only as a backstop for data correction.</w:t>
+      </w:r>
+    </w:p>
+    <w:p>
+      <w:pPr>
+        <w:pStyle w:val="Normal"/>
+        <w:numPr>
+          <w:ilvl w:val="0"/>
+          <w:numId w:val="1"/>
+        </w:numPr>
+        <w:spacing w:before="0" w:after="60"/>
+        <w:rPr/>
+      </w:pPr>
+      <w:r>
+        <w:rPr/>
+        <w:t>☐ Configure the NPS Survey Response list view columns: Survey Date/Time (primary sort, descending), Engagement, NPS Score, Survey Trigger, Did CBM Help You?, I Would Return to See This Mentor Again.</w:t>
       </w:r>
     </w:p>
     <w:p>

</xml_diff>

<commit_message>
Client PRD: Workshop UI layout — Confirmed Attendees field, panel organization, list view columns, Workshop Attendance panel
</commit_message>
<xml_diff>
--- a/PRDs/CBM-PRD-CRM-Client.docx
+++ b/PRDs/CBM-PRD-CRM-Client.docx
@@ -5849,6 +5849,61 @@
                 <w:szCs w:val="18"/>
               </w:rPr>
               <w:t>Dropdown. Values: Scheduled | Completed | Cancelled. Required.</w:t>
+            </w:r>
+          </w:p>
+        </w:tc>
+      </w:tr>
+      <w:tr>
+        <w:trPr/>
+        <w:tc>
+          <w:tcPr>
+            <w:tcW w:w="2500" w:type="dxa"/>
+            <w:tcBorders>
+              <w:top w:val="single" w:sz="2" w:space="0" w:color="CCCCCC"/>
+              <w:left w:val="single" w:sz="2" w:space="0" w:color="CCCCCC"/>
+              <w:bottom w:val="single" w:sz="2" w:space="0" w:color="CCCCCC"/>
+              <w:right w:val="single" w:sz="2" w:space="0" w:color="CCCCCC"/>
+            </w:tcBorders>
+            <w:shd w:fill="FFFFFF" w:val="clear"/>
+          </w:tcPr>
+          <w:p>
+            <w:pPr>
+              <w:pStyle w:val="Normal"/>
+              <w:rPr/>
+            </w:pPr>
+            <w:r>
+              <w:rPr>
+                <w:rFonts w:eastAsia="Arial" w:cs="Arial"/>
+                <w:sz w:val="18"/>
+                <w:szCs w:val="18"/>
+              </w:rPr>
+              <w:t>Confirmed Attendees</w:t>
+            </w:r>
+          </w:p>
+        </w:tc>
+        <w:tc>
+          <w:tcPr>
+            <w:tcW w:w="6859" w:type="dxa"/>
+            <w:tcBorders>
+              <w:top w:val="single" w:sz="2" w:space="0" w:color="CCCCCC"/>
+              <w:left w:val="single" w:sz="2" w:space="0" w:color="CCCCCC"/>
+              <w:bottom w:val="single" w:sz="2" w:space="0" w:color="CCCCCC"/>
+              <w:right w:val="single" w:sz="2" w:space="0" w:color="CCCCCC"/>
+            </w:tcBorders>
+            <w:shd w:fill="FFFFFF" w:val="clear"/>
+          </w:tcPr>
+          <w:p>
+            <w:pPr>
+              <w:pStyle w:val="Normal"/>
+              <w:rPr/>
+            </w:pPr>
+            <w:r>
+              <w:rPr>
+                <w:rFonts w:eastAsia="Arial" w:cs="Arial"/>
+                <w:sz w:val="18"/>
+                <w:szCs w:val="18"/>
+              </w:rPr>
+              <w:t>System-calculated. Read-only. Integer field. Count of linked Workshop Attendance records where Attended = Yes. Displayed on the Workshop detail view and list view to show actual attendance at a glance.</w:t>
             </w:r>
           </w:p>
         </w:tc>
@@ -17160,6 +17215,66 @@
       <w:r>
         <w:rPr/>
         <w:t>☐ Add Note and Document relationship panels to the Workshop detail view.</w:t>
+      </w:r>
+    </w:p>
+    <w:p>
+      <w:pPr>
+        <w:pStyle w:val="Normal"/>
+        <w:numPr>
+          <w:ilvl w:val="0"/>
+          <w:numId w:val="1"/>
+        </w:numPr>
+        <w:spacing w:before="0" w:after="60"/>
+        <w:rPr/>
+      </w:pPr>
+      <w:r>
+        <w:rPr/>
+        <w:t>☐ Add Confirmed Attendees as a formula/roll-up field on the Workshop entity: count of linked Workshop Attendance records where Attended = Yes. Configure as read-only and system-calculated.</w:t>
+      </w:r>
+    </w:p>
+    <w:p>
+      <w:pPr>
+        <w:pStyle w:val="Normal"/>
+        <w:numPr>
+          <w:ilvl w:val="0"/>
+          <w:numId w:val="1"/>
+        </w:numPr>
+        <w:spacing w:before="0" w:after="60"/>
+        <w:rPr/>
+      </w:pPr>
+      <w:r>
+        <w:rPr/>
+        <w:t>☐ Add Workshop Attendance relationship panel to the Workshop detail view to display the full attendee list. Configure the List (Short) to display: Contact Name, Engagement, Attended.</w:t>
+      </w:r>
+    </w:p>
+    <w:p>
+      <w:pPr>
+        <w:pStyle w:val="Normal"/>
+        <w:numPr>
+          <w:ilvl w:val="0"/>
+          <w:numId w:val="1"/>
+        </w:numPr>
+        <w:spacing w:before="0" w:after="60"/>
+        <w:rPr/>
+      </w:pPr>
+      <w:r>
+        <w:rPr/>
+        <w:t>☐ Organize Workshop detail view panels: Workshop Details (Title, Date/Time, Topic/Category, Status, Presenter, Location, Maximum Capacity, Confirmed Attendees), Description (Description), Workshop Attendance (relationship panel).</w:t>
+      </w:r>
+    </w:p>
+    <w:p>
+      <w:pPr>
+        <w:pStyle w:val="Normal"/>
+        <w:numPr>
+          <w:ilvl w:val="0"/>
+          <w:numId w:val="1"/>
+        </w:numPr>
+        <w:spacing w:before="0" w:after="60"/>
+        <w:rPr/>
+      </w:pPr>
+      <w:r>
+        <w:rPr/>
+        <w:t>☐ Configure the Workshop list view columns: Title, Date/Time (primary sort, descending), Topic/Category, Status, Presenter, Location, Confirmed Attendees.</w:t>
       </w:r>
     </w:p>
     <w:p>

</xml_diff>

<commit_message>
Client PRD: Workshop Attendance UI layout — Attendance Date formula field, record label, RBAC Create permissions, panel org, list view
</commit_message>
<xml_diff>
--- a/PRDs/CBM-PRD-CRM-Client.docx
+++ b/PRDs/CBM-PRD-CRM-Client.docx
@@ -6243,7 +6243,7 @@
                 <w:sz w:val="18"/>
                 <w:szCs w:val="18"/>
               </w:rPr>
-              <w:t>Date of the workshop. System-populated from the linked Workshop record. Read-only.</w:t>
+              <w:t>Date of the workshop. Formula field that pulls dynamically from the linked Workshop’s Date/Time field. Read-only. Always reflects the current Workshop date, even if the Workshop record is updated after the Attendance record is created.</w:t>
             </w:r>
           </w:p>
         </w:tc>
@@ -14499,6 +14499,58 @@
                 <w:sz w:val="18"/>
                 <w:szCs w:val="18"/>
               </w:rPr>
+              <w:t>Own</w:t>
+            </w:r>
+          </w:p>
+        </w:tc>
+        <w:tc>
+          <w:tcPr>
+            <w:tcW w:w="899" w:type="dxa"/>
+            <w:tcBorders>
+              <w:top w:val="single" w:sz="2" w:space="0" w:color="CCCCCC"/>
+              <w:left w:val="single" w:sz="2" w:space="0" w:color="CCCCCC"/>
+              <w:bottom w:val="single" w:sz="2" w:space="0" w:color="CCCCCC"/>
+              <w:right w:val="single" w:sz="2" w:space="0" w:color="CCCCCC"/>
+            </w:tcBorders>
+            <w:shd w:fill="F2F2F2" w:val="clear"/>
+          </w:tcPr>
+          <w:p>
+            <w:pPr>
+              <w:pStyle w:val="Normal"/>
+              <w:rPr/>
+            </w:pPr>
+            <w:r>
+              <w:rPr>
+                <w:rFonts w:cs="Arial"/>
+                <w:sz w:val="18"/>
+                <w:szCs w:val="18"/>
+              </w:rPr>
+              <w:t>All</w:t>
+            </w:r>
+          </w:p>
+        </w:tc>
+        <w:tc>
+          <w:tcPr>
+            <w:tcW w:w="901" w:type="dxa"/>
+            <w:tcBorders>
+              <w:top w:val="single" w:sz="2" w:space="0" w:color="CCCCCC"/>
+              <w:left w:val="single" w:sz="2" w:space="0" w:color="CCCCCC"/>
+              <w:bottom w:val="single" w:sz="2" w:space="0" w:color="CCCCCC"/>
+              <w:right w:val="single" w:sz="2" w:space="0" w:color="CCCCCC"/>
+            </w:tcBorders>
+            <w:shd w:fill="F2F2F2" w:val="clear"/>
+          </w:tcPr>
+          <w:p>
+            <w:pPr>
+              <w:pStyle w:val="Normal"/>
+              <w:rPr/>
+            </w:pPr>
+            <w:r>
+              <w:rPr>
+                <w:rFonts w:cs="Arial"/>
+                <w:sz w:val="18"/>
+                <w:szCs w:val="18"/>
+              </w:rPr>
               <w:t>No</w:t>
             </w:r>
           </w:p>
@@ -14525,13 +14577,13 @@
                 <w:sz w:val="18"/>
                 <w:szCs w:val="18"/>
               </w:rPr>
-              <w:t>All</w:t>
-            </w:r>
-          </w:p>
-        </w:tc>
-        <w:tc>
-          <w:tcPr>
-            <w:tcW w:w="901" w:type="dxa"/>
+              <w:t>No</w:t>
+            </w:r>
+          </w:p>
+        </w:tc>
+        <w:tc>
+          <w:tcPr>
+            <w:tcW w:w="3960" w:type="dxa"/>
             <w:tcBorders>
               <w:top w:val="single" w:sz="2" w:space="0" w:color="CCCCCC"/>
               <w:left w:val="single" w:sz="2" w:space="0" w:color="CCCCCC"/>
@@ -14551,59 +14603,7 @@
                 <w:sz w:val="18"/>
                 <w:szCs w:val="18"/>
               </w:rPr>
-              <w:t>No</w:t>
-            </w:r>
-          </w:p>
-        </w:tc>
-        <w:tc>
-          <w:tcPr>
-            <w:tcW w:w="899" w:type="dxa"/>
-            <w:tcBorders>
-              <w:top w:val="single" w:sz="2" w:space="0" w:color="CCCCCC"/>
-              <w:left w:val="single" w:sz="2" w:space="0" w:color="CCCCCC"/>
-              <w:bottom w:val="single" w:sz="2" w:space="0" w:color="CCCCCC"/>
-              <w:right w:val="single" w:sz="2" w:space="0" w:color="CCCCCC"/>
-            </w:tcBorders>
-            <w:shd w:fill="F2F2F2" w:val="clear"/>
-          </w:tcPr>
-          <w:p>
-            <w:pPr>
-              <w:pStyle w:val="Normal"/>
-              <w:rPr/>
-            </w:pPr>
-            <w:r>
-              <w:rPr>
-                <w:rFonts w:cs="Arial"/>
-                <w:sz w:val="18"/>
-                <w:szCs w:val="18"/>
-              </w:rPr>
-              <w:t>No</w:t>
-            </w:r>
-          </w:p>
-        </w:tc>
-        <w:tc>
-          <w:tcPr>
-            <w:tcW w:w="3960" w:type="dxa"/>
-            <w:tcBorders>
-              <w:top w:val="single" w:sz="2" w:space="0" w:color="CCCCCC"/>
-              <w:left w:val="single" w:sz="2" w:space="0" w:color="CCCCCC"/>
-              <w:bottom w:val="single" w:sz="2" w:space="0" w:color="CCCCCC"/>
-              <w:right w:val="single" w:sz="2" w:space="0" w:color="CCCCCC"/>
-            </w:tcBorders>
-            <w:shd w:fill="F2F2F2" w:val="clear"/>
-          </w:tcPr>
-          <w:p>
-            <w:pPr>
-              <w:pStyle w:val="Normal"/>
-              <w:rPr/>
-            </w:pPr>
-            <w:r>
-              <w:rPr>
-                <w:rFonts w:cs="Arial"/>
-                <w:sz w:val="18"/>
-                <w:szCs w:val="18"/>
-              </w:rPr>
-              <w:t>Read only on all workshops. Can view attendance for own clients.</w:t>
+              <w:t>Read only on Workshop records. Can create and update Workshop Attendance records for own assigned clients.</w:t>
             </w:r>
           </w:p>
         </w:tc>
@@ -14658,6 +14658,58 @@
                 <w:sz w:val="18"/>
                 <w:szCs w:val="18"/>
               </w:rPr>
+              <w:t>Own</w:t>
+            </w:r>
+          </w:p>
+        </w:tc>
+        <w:tc>
+          <w:tcPr>
+            <w:tcW w:w="899" w:type="dxa"/>
+            <w:tcBorders>
+              <w:top w:val="single" w:sz="2" w:space="0" w:color="CCCCCC"/>
+              <w:left w:val="single" w:sz="2" w:space="0" w:color="CCCCCC"/>
+              <w:bottom w:val="single" w:sz="2" w:space="0" w:color="CCCCCC"/>
+              <w:right w:val="single" w:sz="2" w:space="0" w:color="CCCCCC"/>
+            </w:tcBorders>
+            <w:shd w:fill="FFFFFF" w:val="clear"/>
+          </w:tcPr>
+          <w:p>
+            <w:pPr>
+              <w:pStyle w:val="Normal"/>
+              <w:rPr/>
+            </w:pPr>
+            <w:r>
+              <w:rPr>
+                <w:rFonts w:cs="Arial"/>
+                <w:sz w:val="18"/>
+                <w:szCs w:val="18"/>
+              </w:rPr>
+              <w:t>All</w:t>
+            </w:r>
+          </w:p>
+        </w:tc>
+        <w:tc>
+          <w:tcPr>
+            <w:tcW w:w="901" w:type="dxa"/>
+            <w:tcBorders>
+              <w:top w:val="single" w:sz="2" w:space="0" w:color="CCCCCC"/>
+              <w:left w:val="single" w:sz="2" w:space="0" w:color="CCCCCC"/>
+              <w:bottom w:val="single" w:sz="2" w:space="0" w:color="CCCCCC"/>
+              <w:right w:val="single" w:sz="2" w:space="0" w:color="CCCCCC"/>
+            </w:tcBorders>
+            <w:shd w:fill="FFFFFF" w:val="clear"/>
+          </w:tcPr>
+          <w:p>
+            <w:pPr>
+              <w:pStyle w:val="Normal"/>
+              <w:rPr/>
+            </w:pPr>
+            <w:r>
+              <w:rPr>
+                <w:rFonts w:cs="Arial"/>
+                <w:sz w:val="18"/>
+                <w:szCs w:val="18"/>
+              </w:rPr>
               <w:t>No</w:t>
             </w:r>
           </w:p>
@@ -14684,64 +14736,12 @@
                 <w:sz w:val="18"/>
                 <w:szCs w:val="18"/>
               </w:rPr>
-              <w:t>All</w:t>
-            </w:r>
-          </w:p>
-        </w:tc>
-        <w:tc>
-          <w:tcPr>
-            <w:tcW w:w="901" w:type="dxa"/>
-            <w:tcBorders>
-              <w:top w:val="single" w:sz="2" w:space="0" w:color="CCCCCC"/>
-              <w:left w:val="single" w:sz="2" w:space="0" w:color="CCCCCC"/>
-              <w:bottom w:val="single" w:sz="2" w:space="0" w:color="CCCCCC"/>
-              <w:right w:val="single" w:sz="2" w:space="0" w:color="CCCCCC"/>
-            </w:tcBorders>
-            <w:shd w:fill="FFFFFF" w:val="clear"/>
-          </w:tcPr>
-          <w:p>
-            <w:pPr>
-              <w:pStyle w:val="Normal"/>
-              <w:rPr/>
-            </w:pPr>
-            <w:r>
-              <w:rPr>
-                <w:rFonts w:cs="Arial"/>
-                <w:sz w:val="18"/>
-                <w:szCs w:val="18"/>
-              </w:rPr>
               <w:t>No</w:t>
             </w:r>
           </w:p>
         </w:tc>
         <w:tc>
           <w:tcPr>
-            <w:tcW w:w="899" w:type="dxa"/>
-            <w:tcBorders>
-              <w:top w:val="single" w:sz="2" w:space="0" w:color="CCCCCC"/>
-              <w:left w:val="single" w:sz="2" w:space="0" w:color="CCCCCC"/>
-              <w:bottom w:val="single" w:sz="2" w:space="0" w:color="CCCCCC"/>
-              <w:right w:val="single" w:sz="2" w:space="0" w:color="CCCCCC"/>
-            </w:tcBorders>
-            <w:shd w:fill="FFFFFF" w:val="clear"/>
-          </w:tcPr>
-          <w:p>
-            <w:pPr>
-              <w:pStyle w:val="Normal"/>
-              <w:rPr/>
-            </w:pPr>
-            <w:r>
-              <w:rPr>
-                <w:rFonts w:cs="Arial"/>
-                <w:sz w:val="18"/>
-                <w:szCs w:val="18"/>
-              </w:rPr>
-              <w:t>No</w:t>
-            </w:r>
-          </w:p>
-        </w:tc>
-        <w:tc>
-          <w:tcPr>
             <w:tcW w:w="3960" w:type="dxa"/>
             <w:tcBorders>
               <w:top w:val="single" w:sz="2" w:space="0" w:color="CCCCCC"/>
@@ -14762,7 +14762,7 @@
                 <w:sz w:val="18"/>
                 <w:szCs w:val="18"/>
               </w:rPr>
-              <w:t>Read only on all workshops. Can view attendance for assigned clients.</w:t>
+              <w:t>Read only on Workshop records. Can create and update Workshop Attendance records for own assigned clients.</w:t>
             </w:r>
           </w:p>
         </w:tc>
@@ -17388,7 +17388,7 @@
       </w:pPr>
       <w:r>
         <w:rPr/>
-        <w:t>☐ Add Attendance Date field (date, auto-populated from linked Workshop).</w:t>
+        <w:t>☐ Add Attendance Date field (date). Configure as a formula field that pulls dynamically from the linked Workshop’s Date/Time field. Set as read-only.</w:t>
       </w:r>
     </w:p>
     <w:p>
@@ -17404,6 +17404,66 @@
       <w:r>
         <w:rPr/>
         <w:t>☐ Add Attended field (boolean yes/no, defaults to Yes).</w:t>
+      </w:r>
+    </w:p>
+    <w:p>
+      <w:pPr>
+        <w:pStyle w:val="Normal"/>
+        <w:numPr>
+          <w:ilvl w:val="0"/>
+          <w:numId w:val="1"/>
+        </w:numPr>
+        <w:spacing w:before="0" w:after="60"/>
+        <w:rPr/>
+      </w:pPr>
+      <w:r>
+        <w:rPr/>
+        <w:t>☐ Configure the Workshop Attendance entity record label as a system-generated formula field in the format: [Contact Name] – [Workshop Title]. This label is used in relationship panels and search results to identify individual attendance records.</w:t>
+      </w:r>
+    </w:p>
+    <w:p>
+      <w:pPr>
+        <w:pStyle w:val="Normal"/>
+        <w:numPr>
+          <w:ilvl w:val="0"/>
+          <w:numId w:val="1"/>
+        </w:numPr>
+        <w:spacing w:before="0" w:after="60"/>
+        <w:rPr/>
+      </w:pPr>
+      <w:r>
+        <w:rPr/>
+        <w:t>☐ Configure Primary Mentor and Co-Mentor Create permission on Workshop Attendance only (not Workshop). Primary Mentor and Co-Mentor may create Workshop Attendance records on behalf of their own assigned clients. Workshop records themselves remain admin-only for Create.</w:t>
+      </w:r>
+    </w:p>
+    <w:p>
+      <w:pPr>
+        <w:pStyle w:val="Normal"/>
+        <w:numPr>
+          <w:ilvl w:val="0"/>
+          <w:numId w:val="1"/>
+        </w:numPr>
+        <w:spacing w:before="0" w:after="60"/>
+        <w:rPr/>
+      </w:pPr>
+      <w:r>
+        <w:rPr/>
+        <w:t>☐ Organize Workshop Attendance detail view panels: Attendance Details (Workshop, Contact, Engagement, Attendance Date, Attended).</w:t>
+      </w:r>
+    </w:p>
+    <w:p>
+      <w:pPr>
+        <w:pStyle w:val="Normal"/>
+        <w:numPr>
+          <w:ilvl w:val="0"/>
+          <w:numId w:val="1"/>
+        </w:numPr>
+        <w:spacing w:before="0" w:after="60"/>
+        <w:rPr/>
+      </w:pPr>
+      <w:r>
+        <w:rPr/>
+        <w:t>☐ Configure the Workshop Attendance list view columns: Workshop, Contact, Engagement, Attendance Date, Attended.</w:t>
       </w:r>
     </w:p>
     <w:p>

</xml_diff>

<commit_message>
Client PRD: Restructure Section 2.2 as clean Company entity definition; move form field specs to new Sections 4.1.1 and 4.1.2; remove Phase 1/Phase 2 framing from 6.2 checklist
</commit_message>
<xml_diff>
--- a/PRDs/CBM-PRD-CRM-Client.docx
+++ b/PRDs/CBM-PRD-CRM-Client.docx
@@ -311,46 +311,7 @@
       </w:pPr>
       <w:r>
         <w:rPr/>
-        <w:t>The Company entity represents the business being mentored. It is the anchor record to which all Contacts, Engagements, and related activity are linked. Company data is collected in two phases: Phase 1 fields are captured on the public Mentoring Request intake form; Phase 2 fields are collected via a second form deployed at the mentor’s discretion. Both Phase 1 and Phase 2 fields may be viewed and modified at any time by the assigned mentor or any administrator directly within The CRM, regardless of how the data was originally collected.</w:t>
-      </w:r>
-    </w:p>
-    <w:p>
-      <w:pPr>
-        <w:pStyle w:val="Normal"/>
-        <w:rPr/>
-      </w:pPr>
-      <w:r>
-        <w:rPr/>
-      </w:r>
-    </w:p>
-    <w:p>
-      <w:pPr>
-        <w:pStyle w:val="Heading3"/>
-        <w:rPr/>
-      </w:pPr>
-      <w:r>
-        <w:rPr/>
-        <w:t>Phase 1 — Intake Fields</w:t>
-      </w:r>
-    </w:p>
-    <w:p>
-      <w:pPr>
-        <w:pStyle w:val="Normal"/>
-        <w:spacing w:before="0" w:after="120"/>
-        <w:rPr/>
-      </w:pPr>
-      <w:r>
-        <w:rPr/>
-        <w:t>These fields are collected on the public Mentoring Request form and must be sufficient to allow an admin to identify and assign an appropriate mentor. Contact information fields (First Name through Zip Code) populate the Contact record; all remaining fields populate the Company record.</w:t>
-      </w:r>
-    </w:p>
-    <w:p>
-      <w:pPr>
-        <w:pStyle w:val="Normal"/>
-        <w:rPr/>
-      </w:pPr>
-      <w:r>
-        <w:rPr/>
+        <w:t>The Company entity represents the business being mentored. It is the anchor record to which all Contacts, Engagements, and related activity are linked. All Company fields may be viewed and modified at any time by the assigned mentor or any administrator directly within the CRM. The forms through which these fields are initially populated are defined in Section 4.1.</w:t>
       </w:r>
     </w:p>
     <w:tbl>
@@ -457,7 +418,7 @@
                 <w:sz w:val="18"/>
                 <w:szCs w:val="18"/>
               </w:rPr>
-              <w:t>First Name</w:t>
+              <w:t>Business Name</w:t>
             </w:r>
           </w:p>
         </w:tc>
@@ -470,20 +431,20 @@
               <w:bottom w:val="single" w:sz="2" w:space="0" w:color="CCCCCC"/>
               <w:right w:val="single" w:sz="2" w:space="0" w:color="CCCCCC"/>
             </w:tcBorders>
-            <w:shd w:fill="FFFFFF" w:val="clear"/>
-          </w:tcPr>
-          <w:p>
-            <w:pPr>
-              <w:pStyle w:val="Normal"/>
-              <w:rPr/>
-            </w:pPr>
-            <w:r>
-              <w:rPr>
-                <w:rFonts w:eastAsia="Arial" w:cs="Arial"/>
-                <w:sz w:val="18"/>
-                <w:szCs w:val="18"/>
-              </w:rPr>
-              <w:t>First name of the person submitting the request. Required. Text field. Populates the Contact record.</w:t>
+            <w:shd w:fill="F2F2F2" w:val="clear"/>
+          </w:tcPr>
+          <w:p>
+            <w:pPr>
+              <w:pStyle w:val="Normal"/>
+              <w:rPr/>
+            </w:pPr>
+            <w:r>
+              <w:rPr>
+                <w:rFonts w:eastAsia="Arial" w:cs="Arial"/>
+                <w:sz w:val="18"/>
+                <w:szCs w:val="18"/>
+              </w:rPr>
+              <w:t>Full legal or operating name of the business. Optional. Text field. May be left blank for pre-startup applicants who have not yet named their business.</w:t>
             </w:r>
           </w:p>
         </w:tc>
@@ -512,7 +473,7 @@
                 <w:sz w:val="18"/>
                 <w:szCs w:val="18"/>
               </w:rPr>
-              <w:t>Last Name</w:t>
+              <w:t>Website</w:t>
             </w:r>
           </w:p>
         </w:tc>
@@ -538,7 +499,7 @@
                 <w:sz w:val="18"/>
                 <w:szCs w:val="18"/>
               </w:rPr>
-              <w:t>Last name of the person submitting the request. Required. Text field. Populates the Contact record.</w:t>
+              <w:t>Business website URL. Optional. URL field.</w:t>
             </w:r>
           </w:p>
         </w:tc>
@@ -567,7 +528,7 @@
                 <w:sz w:val="18"/>
                 <w:szCs w:val="18"/>
               </w:rPr>
-              <w:t>Email Address</w:t>
+              <w:t>Address</w:t>
             </w:r>
           </w:p>
         </w:tc>
@@ -593,7 +554,7 @@
                 <w:sz w:val="18"/>
                 <w:szCs w:val="18"/>
               </w:rPr>
-              <w:t>Primary email address of the submitting contact. Required. Email field. Populates the Contact record. Used for all follow-up communication including mentor introduction and Phase 2 form delivery.</w:t>
+              <w:t>Business mailing or physical address. Optional. Address field (street, city, state, zip).</w:t>
             </w:r>
           </w:p>
         </w:tc>
@@ -622,7 +583,7 @@
                 <w:sz w:val="18"/>
                 <w:szCs w:val="18"/>
               </w:rPr>
-              <w:t>Phone</w:t>
+              <w:t>Organization Type</w:t>
             </w:r>
           </w:p>
         </w:tc>
@@ -648,7 +609,7 @@
                 <w:sz w:val="18"/>
                 <w:szCs w:val="18"/>
               </w:rPr>
-              <w:t>Primary phone number of the submitting contact. Required. Phone field. Populates the Contact record.</w:t>
+              <w:t>Dropdown. Values: For-Profit | Non-Profit. Required.</w:t>
             </w:r>
           </w:p>
         </w:tc>
@@ -677,7 +638,7 @@
                 <w:sz w:val="18"/>
                 <w:szCs w:val="18"/>
               </w:rPr>
-              <w:t>Zip Code</w:t>
+              <w:t>Business Stage</w:t>
             </w:r>
           </w:p>
         </w:tc>
@@ -703,7 +664,7 @@
                 <w:sz w:val="18"/>
                 <w:szCs w:val="18"/>
               </w:rPr>
-              <w:t>Zip code of the submitting contact. Required. Text field. Populates the Contact record. Used for geographic reporting.</w:t>
+              <w:t>Dropdown. Values: Pre-Startup | Startup | Early Stage | Growth Stage | Established. Required. Note: Revenue thresholds to differentiate Startup from Early Stage are a planned future enhancement.</w:t>
             </w:r>
           </w:p>
         </w:tc>
@@ -732,7 +693,7 @@
                 <w:sz w:val="18"/>
                 <w:szCs w:val="18"/>
               </w:rPr>
-              <w:t>Business Name</w:t>
+              <w:t>NAICS Sector</w:t>
             </w:r>
           </w:p>
         </w:tc>
@@ -758,7 +719,7 @@
                 <w:sz w:val="18"/>
                 <w:szCs w:val="18"/>
               </w:rPr>
-              <w:t>Full legal or operating name of the business. Optional. Text field. May be left blank for pre-startup applicants who have not yet named their business.</w:t>
+              <w:t>Top-level industry classification. Dropdown of 20 NAICS sectors. Required.</w:t>
             </w:r>
           </w:p>
         </w:tc>
@@ -774,20 +735,20 @@
               <w:bottom w:val="single" w:sz="2" w:space="0" w:color="CCCCCC"/>
               <w:right w:val="single" w:sz="2" w:space="0" w:color="CCCCCC"/>
             </w:tcBorders>
-            <w:shd w:fill="F2F2F2" w:val="clear"/>
-          </w:tcPr>
-          <w:p>
-            <w:pPr>
-              <w:pStyle w:val="Normal"/>
-              <w:rPr/>
-            </w:pPr>
-            <w:r>
-              <w:rPr>
-                <w:rFonts w:eastAsia="Arial" w:cs="Arial"/>
-                <w:sz w:val="18"/>
-                <w:szCs w:val="18"/>
-              </w:rPr>
-              <w:t>Website</w:t>
+            <w:shd w:fill="FFFFFF" w:val="clear"/>
+          </w:tcPr>
+          <w:p>
+            <w:pPr>
+              <w:pStyle w:val="Normal"/>
+              <w:rPr/>
+            </w:pPr>
+            <w:r>
+              <w:rPr>
+                <w:rFonts w:eastAsia="Arial" w:cs="Arial"/>
+                <w:sz w:val="18"/>
+                <w:szCs w:val="18"/>
+              </w:rPr>
+              <w:t>NAICS Subsector</w:t>
             </w:r>
           </w:p>
         </w:tc>
@@ -800,20 +761,20 @@
               <w:bottom w:val="single" w:sz="2" w:space="0" w:color="CCCCCC"/>
               <w:right w:val="single" w:sz="2" w:space="0" w:color="CCCCCC"/>
             </w:tcBorders>
-            <w:shd w:fill="F2F2F2" w:val="clear"/>
-          </w:tcPr>
-          <w:p>
-            <w:pPr>
-              <w:pStyle w:val="Normal"/>
-              <w:rPr/>
-            </w:pPr>
-            <w:r>
-              <w:rPr>
-                <w:rFonts w:eastAsia="Arial" w:cs="Arial"/>
-                <w:sz w:val="18"/>
-                <w:szCs w:val="18"/>
-              </w:rPr>
-              <w:t>Business website URL. Optional. URL field.</w:t>
+            <w:shd w:fill="FFFFFF" w:val="clear"/>
+          </w:tcPr>
+          <w:p>
+            <w:pPr>
+              <w:pStyle w:val="Normal"/>
+              <w:rPr/>
+            </w:pPr>
+            <w:r>
+              <w:rPr>
+                <w:rFonts w:eastAsia="Arial" w:cs="Arial"/>
+                <w:sz w:val="18"/>
+                <w:szCs w:val="18"/>
+              </w:rPr>
+              <w:t>Second-level industry classification. Dropdown of ~100 NAICS subsectors, filtered by selected Sector. Both Sector and Subsector are stored as separate fields on the Company record. Required.</w:t>
             </w:r>
           </w:p>
         </w:tc>
@@ -829,20 +790,20 @@
               <w:bottom w:val="single" w:sz="2" w:space="0" w:color="CCCCCC"/>
               <w:right w:val="single" w:sz="2" w:space="0" w:color="CCCCCC"/>
             </w:tcBorders>
-            <w:shd w:fill="FFFFFF" w:val="clear"/>
-          </w:tcPr>
-          <w:p>
-            <w:pPr>
-              <w:pStyle w:val="Normal"/>
-              <w:rPr/>
-            </w:pPr>
-            <w:r>
-              <w:rPr>
-                <w:rFonts w:eastAsia="Arial" w:cs="Arial"/>
-                <w:sz w:val="18"/>
-                <w:szCs w:val="18"/>
-              </w:rPr>
-              <w:t>Address</w:t>
+            <w:shd w:fill="F2F2F2" w:val="clear"/>
+          </w:tcPr>
+          <w:p>
+            <w:pPr>
+              <w:pStyle w:val="Normal"/>
+              <w:rPr/>
+            </w:pPr>
+            <w:r>
+              <w:rPr>
+                <w:rFonts w:eastAsia="Arial" w:cs="Arial"/>
+                <w:sz w:val="18"/>
+                <w:szCs w:val="18"/>
+              </w:rPr>
+              <w:t>Mentoring Focus Areas</w:t>
             </w:r>
           </w:p>
         </w:tc>
@@ -855,20 +816,20 @@
               <w:bottom w:val="single" w:sz="2" w:space="0" w:color="CCCCCC"/>
               <w:right w:val="single" w:sz="2" w:space="0" w:color="CCCCCC"/>
             </w:tcBorders>
-            <w:shd w:fill="FFFFFF" w:val="clear"/>
-          </w:tcPr>
-          <w:p>
-            <w:pPr>
-              <w:pStyle w:val="Normal"/>
-              <w:rPr/>
-            </w:pPr>
-            <w:r>
-              <w:rPr>
-                <w:rFonts w:eastAsia="Arial" w:cs="Arial"/>
-                <w:sz w:val="18"/>
-                <w:szCs w:val="18"/>
-              </w:rPr>
-              <w:t>Business mailing or physical address. Optional. Address field (street, city, state, zip).</w:t>
+            <w:shd w:fill="F2F2F2" w:val="clear"/>
+          </w:tcPr>
+          <w:p>
+            <w:pPr>
+              <w:pStyle w:val="Normal"/>
+              <w:rPr/>
+            </w:pPr>
+            <w:r>
+              <w:rPr>
+                <w:rFonts w:eastAsia="Arial" w:cs="Arial"/>
+                <w:sz w:val="18"/>
+                <w:szCs w:val="18"/>
+              </w:rPr>
+              <w:t>Multi-select dropdown. Values to be defined by CBM leadership. Required. Used for mentor matching and funder reporting.</w:t>
             </w:r>
           </w:p>
         </w:tc>
@@ -884,281 +845,6 @@
               <w:bottom w:val="single" w:sz="2" w:space="0" w:color="CCCCCC"/>
               <w:right w:val="single" w:sz="2" w:space="0" w:color="CCCCCC"/>
             </w:tcBorders>
-            <w:shd w:fill="F2F2F2" w:val="clear"/>
-          </w:tcPr>
-          <w:p>
-            <w:pPr>
-              <w:pStyle w:val="Normal"/>
-              <w:rPr/>
-            </w:pPr>
-            <w:r>
-              <w:rPr>
-                <w:rFonts w:eastAsia="Arial" w:cs="Arial"/>
-                <w:sz w:val="18"/>
-                <w:szCs w:val="18"/>
-              </w:rPr>
-              <w:t>Organization Type</w:t>
-            </w:r>
-          </w:p>
-        </w:tc>
-        <w:tc>
-          <w:tcPr>
-            <w:tcW w:w="6859" w:type="dxa"/>
-            <w:tcBorders>
-              <w:top w:val="single" w:sz="2" w:space="0" w:color="CCCCCC"/>
-              <w:left w:val="single" w:sz="2" w:space="0" w:color="CCCCCC"/>
-              <w:bottom w:val="single" w:sz="2" w:space="0" w:color="CCCCCC"/>
-              <w:right w:val="single" w:sz="2" w:space="0" w:color="CCCCCC"/>
-            </w:tcBorders>
-            <w:shd w:fill="F2F2F2" w:val="clear"/>
-          </w:tcPr>
-          <w:p>
-            <w:pPr>
-              <w:pStyle w:val="Normal"/>
-              <w:rPr/>
-            </w:pPr>
-            <w:r>
-              <w:rPr>
-                <w:rFonts w:eastAsia="Arial" w:cs="Arial"/>
-                <w:sz w:val="18"/>
-                <w:szCs w:val="18"/>
-              </w:rPr>
-              <w:t>Dropdown. Values: For-Profit | Non-Profit. Required.</w:t>
-            </w:r>
-          </w:p>
-        </w:tc>
-      </w:tr>
-      <w:tr>
-        <w:trPr/>
-        <w:tc>
-          <w:tcPr>
-            <w:tcW w:w="2500" w:type="dxa"/>
-            <w:tcBorders>
-              <w:top w:val="single" w:sz="2" w:space="0" w:color="CCCCCC"/>
-              <w:left w:val="single" w:sz="2" w:space="0" w:color="CCCCCC"/>
-              <w:bottom w:val="single" w:sz="2" w:space="0" w:color="CCCCCC"/>
-              <w:right w:val="single" w:sz="2" w:space="0" w:color="CCCCCC"/>
-            </w:tcBorders>
-            <w:shd w:fill="FFFFFF" w:val="clear"/>
-          </w:tcPr>
-          <w:p>
-            <w:pPr>
-              <w:pStyle w:val="Normal"/>
-              <w:rPr/>
-            </w:pPr>
-            <w:r>
-              <w:rPr>
-                <w:rFonts w:eastAsia="Arial" w:cs="Arial"/>
-                <w:sz w:val="18"/>
-                <w:szCs w:val="18"/>
-              </w:rPr>
-              <w:t>Business Stage</w:t>
-            </w:r>
-          </w:p>
-        </w:tc>
-        <w:tc>
-          <w:tcPr>
-            <w:tcW w:w="6859" w:type="dxa"/>
-            <w:tcBorders>
-              <w:top w:val="single" w:sz="2" w:space="0" w:color="CCCCCC"/>
-              <w:left w:val="single" w:sz="2" w:space="0" w:color="CCCCCC"/>
-              <w:bottom w:val="single" w:sz="2" w:space="0" w:color="CCCCCC"/>
-              <w:right w:val="single" w:sz="2" w:space="0" w:color="CCCCCC"/>
-            </w:tcBorders>
-            <w:shd w:fill="FFFFFF" w:val="clear"/>
-          </w:tcPr>
-          <w:p>
-            <w:pPr>
-              <w:pStyle w:val="Normal"/>
-              <w:rPr/>
-            </w:pPr>
-            <w:r>
-              <w:rPr>
-                <w:rFonts w:eastAsia="Arial" w:cs="Arial"/>
-                <w:sz w:val="18"/>
-                <w:szCs w:val="18"/>
-              </w:rPr>
-              <w:t>Dropdown. Values: Pre-Startup | Startup | Early Stage | Growth Stage | Established. Required. Note: Revenue thresholds to differentiate Startup from Early Stage are a planned future enhancement.</w:t>
-            </w:r>
-          </w:p>
-        </w:tc>
-      </w:tr>
-      <w:tr>
-        <w:trPr/>
-        <w:tc>
-          <w:tcPr>
-            <w:tcW w:w="2500" w:type="dxa"/>
-            <w:tcBorders>
-              <w:top w:val="single" w:sz="2" w:space="0" w:color="CCCCCC"/>
-              <w:left w:val="single" w:sz="2" w:space="0" w:color="CCCCCC"/>
-              <w:bottom w:val="single" w:sz="2" w:space="0" w:color="CCCCCC"/>
-              <w:right w:val="single" w:sz="2" w:space="0" w:color="CCCCCC"/>
-            </w:tcBorders>
-            <w:shd w:fill="F2F2F2" w:val="clear"/>
-          </w:tcPr>
-          <w:p>
-            <w:pPr>
-              <w:pStyle w:val="Normal"/>
-              <w:rPr/>
-            </w:pPr>
-            <w:r>
-              <w:rPr>
-                <w:rFonts w:eastAsia="Arial" w:cs="Arial"/>
-                <w:sz w:val="18"/>
-                <w:szCs w:val="18"/>
-              </w:rPr>
-              <w:t>NAICS Sector</w:t>
-            </w:r>
-          </w:p>
-        </w:tc>
-        <w:tc>
-          <w:tcPr>
-            <w:tcW w:w="6859" w:type="dxa"/>
-            <w:tcBorders>
-              <w:top w:val="single" w:sz="2" w:space="0" w:color="CCCCCC"/>
-              <w:left w:val="single" w:sz="2" w:space="0" w:color="CCCCCC"/>
-              <w:bottom w:val="single" w:sz="2" w:space="0" w:color="CCCCCC"/>
-              <w:right w:val="single" w:sz="2" w:space="0" w:color="CCCCCC"/>
-            </w:tcBorders>
-            <w:shd w:fill="F2F2F2" w:val="clear"/>
-          </w:tcPr>
-          <w:p>
-            <w:pPr>
-              <w:pStyle w:val="Normal"/>
-              <w:rPr/>
-            </w:pPr>
-            <w:r>
-              <w:rPr>
-                <w:rFonts w:eastAsia="Arial" w:cs="Arial"/>
-                <w:sz w:val="18"/>
-                <w:szCs w:val="18"/>
-              </w:rPr>
-              <w:t>Top-level industry classification. Dropdown of 20 NAICS sectors. Required.</w:t>
-            </w:r>
-          </w:p>
-        </w:tc>
-      </w:tr>
-      <w:tr>
-        <w:trPr/>
-        <w:tc>
-          <w:tcPr>
-            <w:tcW w:w="2500" w:type="dxa"/>
-            <w:tcBorders>
-              <w:top w:val="single" w:sz="2" w:space="0" w:color="CCCCCC"/>
-              <w:left w:val="single" w:sz="2" w:space="0" w:color="CCCCCC"/>
-              <w:bottom w:val="single" w:sz="2" w:space="0" w:color="CCCCCC"/>
-              <w:right w:val="single" w:sz="2" w:space="0" w:color="CCCCCC"/>
-            </w:tcBorders>
-            <w:shd w:fill="FFFFFF" w:val="clear"/>
-          </w:tcPr>
-          <w:p>
-            <w:pPr>
-              <w:pStyle w:val="Normal"/>
-              <w:rPr/>
-            </w:pPr>
-            <w:r>
-              <w:rPr>
-                <w:rFonts w:eastAsia="Arial" w:cs="Arial"/>
-                <w:sz w:val="18"/>
-                <w:szCs w:val="18"/>
-              </w:rPr>
-              <w:t>NAICS Subsector</w:t>
-            </w:r>
-          </w:p>
-        </w:tc>
-        <w:tc>
-          <w:tcPr>
-            <w:tcW w:w="6859" w:type="dxa"/>
-            <w:tcBorders>
-              <w:top w:val="single" w:sz="2" w:space="0" w:color="CCCCCC"/>
-              <w:left w:val="single" w:sz="2" w:space="0" w:color="CCCCCC"/>
-              <w:bottom w:val="single" w:sz="2" w:space="0" w:color="CCCCCC"/>
-              <w:right w:val="single" w:sz="2" w:space="0" w:color="CCCCCC"/>
-            </w:tcBorders>
-            <w:shd w:fill="FFFFFF" w:val="clear"/>
-          </w:tcPr>
-          <w:p>
-            <w:pPr>
-              <w:pStyle w:val="Normal"/>
-              <w:rPr/>
-            </w:pPr>
-            <w:r>
-              <w:rPr>
-                <w:rFonts w:eastAsia="Arial" w:cs="Arial"/>
-                <w:sz w:val="18"/>
-                <w:szCs w:val="18"/>
-              </w:rPr>
-              <w:t>Second-level industry classification. Dropdown of ~100 NAICS subsectors, filtered by selected Sector on the intake form. Both Sector and Subsector are stored as separate fields on the Company record. Required.</w:t>
-            </w:r>
-          </w:p>
-        </w:tc>
-      </w:tr>
-      <w:tr>
-        <w:trPr/>
-        <w:tc>
-          <w:tcPr>
-            <w:tcW w:w="2500" w:type="dxa"/>
-            <w:tcBorders>
-              <w:top w:val="single" w:sz="2" w:space="0" w:color="CCCCCC"/>
-              <w:left w:val="single" w:sz="2" w:space="0" w:color="CCCCCC"/>
-              <w:bottom w:val="single" w:sz="2" w:space="0" w:color="CCCCCC"/>
-              <w:right w:val="single" w:sz="2" w:space="0" w:color="CCCCCC"/>
-            </w:tcBorders>
-            <w:shd w:fill="F2F2F2" w:val="clear"/>
-          </w:tcPr>
-          <w:p>
-            <w:pPr>
-              <w:pStyle w:val="Normal"/>
-              <w:rPr/>
-            </w:pPr>
-            <w:r>
-              <w:rPr>
-                <w:rFonts w:eastAsia="Arial" w:cs="Arial"/>
-                <w:sz w:val="18"/>
-                <w:szCs w:val="18"/>
-              </w:rPr>
-              <w:t>Mentoring Focus Areas</w:t>
-            </w:r>
-          </w:p>
-        </w:tc>
-        <w:tc>
-          <w:tcPr>
-            <w:tcW w:w="6859" w:type="dxa"/>
-            <w:tcBorders>
-              <w:top w:val="single" w:sz="2" w:space="0" w:color="CCCCCC"/>
-              <w:left w:val="single" w:sz="2" w:space="0" w:color="CCCCCC"/>
-              <w:bottom w:val="single" w:sz="2" w:space="0" w:color="CCCCCC"/>
-              <w:right w:val="single" w:sz="2" w:space="0" w:color="CCCCCC"/>
-            </w:tcBorders>
-            <w:shd w:fill="F2F2F2" w:val="clear"/>
-          </w:tcPr>
-          <w:p>
-            <w:pPr>
-              <w:pStyle w:val="Normal"/>
-              <w:rPr/>
-            </w:pPr>
-            <w:r>
-              <w:rPr>
-                <w:rFonts w:eastAsia="Arial" w:cs="Arial"/>
-                <w:sz w:val="18"/>
-                <w:szCs w:val="18"/>
-              </w:rPr>
-              <w:t>Multi-select dropdown. Values to be defined by CBM leadership. Required. Used for mentor matching and funder reporting.</w:t>
-            </w:r>
-          </w:p>
-        </w:tc>
-      </w:tr>
-      <w:tr>
-        <w:trPr/>
-        <w:tc>
-          <w:tcPr>
-            <w:tcW w:w="2500" w:type="dxa"/>
-            <w:tcBorders>
-              <w:top w:val="single" w:sz="2" w:space="0" w:color="CCCCCC"/>
-              <w:left w:val="single" w:sz="2" w:space="0" w:color="CCCCCC"/>
-              <w:bottom w:val="single" w:sz="2" w:space="0" w:color="CCCCCC"/>
-              <w:right w:val="single" w:sz="2" w:space="0" w:color="CCCCCC"/>
-            </w:tcBorders>
             <w:shd w:fill="FFFFFF" w:val="clear"/>
           </w:tcPr>
           <w:p>
@@ -1215,23 +901,13 @@
     </w:p>
     <w:p>
       <w:pPr>
-        <w:pStyle w:val="Heading3"/>
-        <w:rPr/>
-      </w:pPr>
-      <w:r>
-        <w:rPr/>
-        <w:t>Phase 2 — Post-Assignment Fields</w:t>
-      </w:r>
-    </w:p>
-    <w:p>
-      <w:pPr>
         <w:pStyle w:val="Normal"/>
         <w:spacing w:before="0" w:after="120"/>
         <w:rPr/>
       </w:pPr>
       <w:r>
         <w:rPr/>
-        <w:t>These fields are collected via a second form deployed at the mentor’s discretion after they have been assigned. The mentor may send the Phase 2 form link as part of their initial introduction to the client, or after the first session so they can explain it in person. All free-text fields in Phase 2 support rich text formatting.</w:t>
+        <w:t>The following fields capture additional business detail. They are typically empty for newly submitted clients and are completed at the mentor’s discretion after assignment. All free-text fields support rich text formatting.</w:t>
       </w:r>
     </w:p>
     <w:p>
@@ -7494,6 +7170,2736 @@
         <w:t>Future enhancement: Automated or AI-assisted mentor matching is a planned future capability. The data model — NAICS sector/subsector and Mentoring Focus Areas on the Company; skills and expertise tags on the mentor Contact — is designed from day one to support this. No restructuring will be required when this feature is implemented.</w:t>
       </w:r>
     </w:p>
+    <w:p>
+      <w:pPr>
+        <w:pStyle w:val="Normal"/>
+        <w:rPr/>
+      </w:pPr>
+      <w:r>
+        <w:rPr/>
+      </w:r>
+    </w:p>
+    <w:p>
+      <w:pPr>
+        <w:pStyle w:val="Heading3"/>
+        <w:rPr/>
+      </w:pPr>
+      <w:r>
+        <w:rPr/>
+        <w:t>4.1.1 Phase 1 Mentoring Request Form Fields</w:t>
+      </w:r>
+    </w:p>
+    <w:p>
+      <w:pPr>
+        <w:pStyle w:val="Normal"/>
+        <w:spacing w:before="0" w:after="120"/>
+        <w:rPr/>
+      </w:pPr>
+      <w:r>
+        <w:rPr/>
+        <w:t>The following fields are collected on the public Mentoring Request form on the CBM website. The form is built in WordPress and posts data to the CRM via the REST API, which automatically creates the Company, Contact, and Engagement records. The Populates column identifies which CRM entity each field is stored on.</w:t>
+      </w:r>
+    </w:p>
+    <w:p>
+      <w:pPr>
+        <w:pStyle w:val="Normal"/>
+        <w:rPr/>
+      </w:pPr>
+      <w:r>
+        <w:rPr/>
+      </w:r>
+    </w:p>
+    <w:tbl>
+      <w:tblPr>
+        <w:tblW w:w="9360" w:type="dxa"/>
+        <w:jc w:val="left"/>
+        <w:tblInd w:w="0" w:type="dxa"/>
+        <w:tblLayout w:type="fixed"/>
+        <w:tblCellMar>
+          <w:top w:w="80" w:type="dxa"/>
+          <w:left w:w="120" w:type="dxa"/>
+          <w:bottom w:w="80" w:type="dxa"/>
+          <w:right w:w="120" w:type="dxa"/>
+        </w:tblCellMar>
+      </w:tblPr>
+      <w:tblGrid>
+        <w:gridCol w:w="2200"/>
+        <w:gridCol w:w="1400"/>
+        <w:gridCol w:w="5760"/>
+      </w:tblGrid>
+      <w:tr>
+        <w:trPr>
+          <w:tblHeader w:val="true"/>
+        </w:trPr>
+        <w:tc>
+          <w:tcPr>
+            <w:tcW w:w="2200" w:type="dxa"/>
+            <w:tcBorders>
+              <w:top w:val="single" w:sz="2" w:space="0" w:color="CCCCCC"/>
+              <w:left w:val="single" w:sz="2" w:space="0" w:color="CCCCCC"/>
+              <w:bottom w:val="single" w:sz="2" w:space="0" w:color="CCCCCC"/>
+              <w:right w:val="single" w:sz="2" w:space="0" w:color="CCCCCC"/>
+            </w:tcBorders>
+            <w:shd w:fill="1F4E79" w:val="clear"/>
+          </w:tcPr>
+          <w:p>
+            <w:pPr>
+              <w:pStyle w:val="Normal"/>
+              <w:rPr/>
+            </w:pPr>
+            <w:r>
+              <w:rPr>
+                <w:rFonts w:eastAsia="Arial" w:cs="Arial"/>
+                <w:b/>
+                <w:bCs/>
+                <w:color w:val="FFFFFF"/>
+                <w:sz w:val="18"/>
+                <w:szCs w:val="18"/>
+              </w:rPr>
+              <w:t>Field</w:t>
+            </w:r>
+          </w:p>
+        </w:tc>
+        <w:tc>
+          <w:tcPr>
+            <w:tcW w:w="1400" w:type="dxa"/>
+            <w:tcBorders>
+              <w:top w:val="single" w:sz="2" w:space="0" w:color="CCCCCC"/>
+              <w:left w:val="single" w:sz="2" w:space="0" w:color="CCCCCC"/>
+              <w:bottom w:val="single" w:sz="2" w:space="0" w:color="CCCCCC"/>
+              <w:right w:val="single" w:sz="2" w:space="0" w:color="CCCCCC"/>
+            </w:tcBorders>
+            <w:shd w:fill="1F4E79" w:val="clear"/>
+          </w:tcPr>
+          <w:p>
+            <w:pPr>
+              <w:pStyle w:val="Normal"/>
+              <w:rPr/>
+            </w:pPr>
+            <w:r>
+              <w:rPr>
+                <w:rFonts w:eastAsia="Arial" w:cs="Arial"/>
+                <w:b/>
+                <w:bCs/>
+                <w:color w:val="FFFFFF"/>
+                <w:sz w:val="18"/>
+                <w:szCs w:val="18"/>
+              </w:rPr>
+              <w:t>Populates</w:t>
+            </w:r>
+          </w:p>
+        </w:tc>
+        <w:tc>
+          <w:tcPr>
+            <w:tcW w:w="5760" w:type="dxa"/>
+            <w:tcBorders>
+              <w:top w:val="single" w:sz="2" w:space="0" w:color="CCCCCC"/>
+              <w:left w:val="single" w:sz="2" w:space="0" w:color="CCCCCC"/>
+              <w:bottom w:val="single" w:sz="2" w:space="0" w:color="CCCCCC"/>
+              <w:right w:val="single" w:sz="2" w:space="0" w:color="CCCCCC"/>
+            </w:tcBorders>
+            <w:shd w:fill="1F4E79" w:val="clear"/>
+          </w:tcPr>
+          <w:p>
+            <w:pPr>
+              <w:pStyle w:val="Normal"/>
+              <w:rPr/>
+            </w:pPr>
+            <w:r>
+              <w:rPr>
+                <w:rFonts w:eastAsia="Arial" w:cs="Arial"/>
+                <w:b/>
+                <w:bCs/>
+                <w:color w:val="FFFFFF"/>
+                <w:sz w:val="18"/>
+                <w:szCs w:val="18"/>
+              </w:rPr>
+              <w:t>Description / Notes</w:t>
+            </w:r>
+          </w:p>
+        </w:tc>
+      </w:tr>
+      <w:tr>
+        <w:trPr/>
+        <w:tc>
+          <w:tcPr>
+            <w:tcW w:w="2200" w:type="dxa"/>
+            <w:tcBorders>
+              <w:top w:val="single" w:sz="2" w:space="0" w:color="CCCCCC"/>
+              <w:left w:val="single" w:sz="2" w:space="0" w:color="CCCCCC"/>
+              <w:bottom w:val="single" w:sz="2" w:space="0" w:color="CCCCCC"/>
+              <w:right w:val="single" w:sz="2" w:space="0" w:color="CCCCCC"/>
+            </w:tcBorders>
+            <w:shd w:fill="FFFFFF" w:val="clear"/>
+          </w:tcPr>
+          <w:p>
+            <w:pPr>
+              <w:pStyle w:val="Normal"/>
+              <w:rPr/>
+            </w:pPr>
+            <w:r>
+              <w:rPr>
+                <w:rFonts w:eastAsia="Arial" w:cs="Arial"/>
+                <w:sz w:val="18"/>
+                <w:szCs w:val="18"/>
+              </w:rPr>
+              <w:t>First Name</w:t>
+            </w:r>
+          </w:p>
+        </w:tc>
+        <w:tc>
+          <w:tcPr>
+            <w:tcW w:w="1400" w:type="dxa"/>
+            <w:tcBorders>
+              <w:top w:val="single" w:sz="2" w:space="0" w:color="CCCCCC"/>
+              <w:left w:val="single" w:sz="2" w:space="0" w:color="CCCCCC"/>
+              <w:bottom w:val="single" w:sz="2" w:space="0" w:color="CCCCCC"/>
+              <w:right w:val="single" w:sz="2" w:space="0" w:color="CCCCCC"/>
+            </w:tcBorders>
+            <w:shd w:fill="FFFFFF" w:val="clear"/>
+          </w:tcPr>
+          <w:p>
+            <w:pPr>
+              <w:pStyle w:val="Normal"/>
+              <w:rPr/>
+            </w:pPr>
+            <w:r>
+              <w:rPr>
+                <w:rFonts w:eastAsia="Arial" w:cs="Arial"/>
+                <w:sz w:val="18"/>
+                <w:szCs w:val="18"/>
+              </w:rPr>
+              <w:t>Contact</w:t>
+            </w:r>
+          </w:p>
+        </w:tc>
+        <w:tc>
+          <w:tcPr>
+            <w:tcW w:w="5760" w:type="dxa"/>
+            <w:tcBorders>
+              <w:top w:val="single" w:sz="2" w:space="0" w:color="CCCCCC"/>
+              <w:left w:val="single" w:sz="2" w:space="0" w:color="CCCCCC"/>
+              <w:bottom w:val="single" w:sz="2" w:space="0" w:color="CCCCCC"/>
+              <w:right w:val="single" w:sz="2" w:space="0" w:color="CCCCCC"/>
+            </w:tcBorders>
+            <w:shd w:fill="FFFFFF" w:val="clear"/>
+          </w:tcPr>
+          <w:p>
+            <w:pPr>
+              <w:pStyle w:val="Normal"/>
+              <w:rPr/>
+            </w:pPr>
+            <w:r>
+              <w:rPr>
+                <w:rFonts w:eastAsia="Arial" w:cs="Arial"/>
+                <w:sz w:val="18"/>
+                <w:szCs w:val="18"/>
+              </w:rPr>
+              <w:t>Required. Text field.</w:t>
+            </w:r>
+          </w:p>
+        </w:tc>
+      </w:tr>
+      <w:tr>
+        <w:trPr/>
+        <w:tc>
+          <w:tcPr>
+            <w:tcW w:w="2200" w:type="dxa"/>
+            <w:tcBorders>
+              <w:top w:val="single" w:sz="2" w:space="0" w:color="CCCCCC"/>
+              <w:left w:val="single" w:sz="2" w:space="0" w:color="CCCCCC"/>
+              <w:bottom w:val="single" w:sz="2" w:space="0" w:color="CCCCCC"/>
+              <w:right w:val="single" w:sz="2" w:space="0" w:color="CCCCCC"/>
+            </w:tcBorders>
+            <w:shd w:fill="F2F2F2" w:val="clear"/>
+          </w:tcPr>
+          <w:p>
+            <w:pPr>
+              <w:pStyle w:val="Normal"/>
+              <w:rPr/>
+            </w:pPr>
+            <w:r>
+              <w:rPr>
+                <w:rFonts w:eastAsia="Arial" w:cs="Arial"/>
+                <w:sz w:val="18"/>
+                <w:szCs w:val="18"/>
+              </w:rPr>
+              <w:t>Last Name</w:t>
+            </w:r>
+          </w:p>
+        </w:tc>
+        <w:tc>
+          <w:tcPr>
+            <w:tcW w:w="1400" w:type="dxa"/>
+            <w:tcBorders>
+              <w:top w:val="single" w:sz="2" w:space="0" w:color="CCCCCC"/>
+              <w:left w:val="single" w:sz="2" w:space="0" w:color="CCCCCC"/>
+              <w:bottom w:val="single" w:sz="2" w:space="0" w:color="CCCCCC"/>
+              <w:right w:val="single" w:sz="2" w:space="0" w:color="CCCCCC"/>
+            </w:tcBorders>
+            <w:shd w:fill="F2F2F2" w:val="clear"/>
+          </w:tcPr>
+          <w:p>
+            <w:pPr>
+              <w:pStyle w:val="Normal"/>
+              <w:rPr/>
+            </w:pPr>
+            <w:r>
+              <w:rPr>
+                <w:rFonts w:eastAsia="Arial" w:cs="Arial"/>
+                <w:sz w:val="18"/>
+                <w:szCs w:val="18"/>
+              </w:rPr>
+              <w:t>Contact</w:t>
+            </w:r>
+          </w:p>
+        </w:tc>
+        <w:tc>
+          <w:tcPr>
+            <w:tcW w:w="5760" w:type="dxa"/>
+            <w:tcBorders>
+              <w:top w:val="single" w:sz="2" w:space="0" w:color="CCCCCC"/>
+              <w:left w:val="single" w:sz="2" w:space="0" w:color="CCCCCC"/>
+              <w:bottom w:val="single" w:sz="2" w:space="0" w:color="CCCCCC"/>
+              <w:right w:val="single" w:sz="2" w:space="0" w:color="CCCCCC"/>
+            </w:tcBorders>
+            <w:shd w:fill="F2F2F2" w:val="clear"/>
+          </w:tcPr>
+          <w:p>
+            <w:pPr>
+              <w:pStyle w:val="Normal"/>
+              <w:rPr/>
+            </w:pPr>
+            <w:r>
+              <w:rPr>
+                <w:rFonts w:eastAsia="Arial" w:cs="Arial"/>
+                <w:sz w:val="18"/>
+                <w:szCs w:val="18"/>
+              </w:rPr>
+              <w:t>Required. Text field.</w:t>
+            </w:r>
+          </w:p>
+        </w:tc>
+      </w:tr>
+      <w:tr>
+        <w:trPr/>
+        <w:tc>
+          <w:tcPr>
+            <w:tcW w:w="2200" w:type="dxa"/>
+            <w:tcBorders>
+              <w:top w:val="single" w:sz="2" w:space="0" w:color="CCCCCC"/>
+              <w:left w:val="single" w:sz="2" w:space="0" w:color="CCCCCC"/>
+              <w:bottom w:val="single" w:sz="2" w:space="0" w:color="CCCCCC"/>
+              <w:right w:val="single" w:sz="2" w:space="0" w:color="CCCCCC"/>
+            </w:tcBorders>
+            <w:shd w:fill="FFFFFF" w:val="clear"/>
+          </w:tcPr>
+          <w:p>
+            <w:pPr>
+              <w:pStyle w:val="Normal"/>
+              <w:rPr/>
+            </w:pPr>
+            <w:r>
+              <w:rPr>
+                <w:rFonts w:eastAsia="Arial" w:cs="Arial"/>
+                <w:sz w:val="18"/>
+                <w:szCs w:val="18"/>
+              </w:rPr>
+              <w:t>Email Address</w:t>
+            </w:r>
+          </w:p>
+        </w:tc>
+        <w:tc>
+          <w:tcPr>
+            <w:tcW w:w="1400" w:type="dxa"/>
+            <w:tcBorders>
+              <w:top w:val="single" w:sz="2" w:space="0" w:color="CCCCCC"/>
+              <w:left w:val="single" w:sz="2" w:space="0" w:color="CCCCCC"/>
+              <w:bottom w:val="single" w:sz="2" w:space="0" w:color="CCCCCC"/>
+              <w:right w:val="single" w:sz="2" w:space="0" w:color="CCCCCC"/>
+            </w:tcBorders>
+            <w:shd w:fill="FFFFFF" w:val="clear"/>
+          </w:tcPr>
+          <w:p>
+            <w:pPr>
+              <w:pStyle w:val="Normal"/>
+              <w:rPr/>
+            </w:pPr>
+            <w:r>
+              <w:rPr>
+                <w:rFonts w:eastAsia="Arial" w:cs="Arial"/>
+                <w:sz w:val="18"/>
+                <w:szCs w:val="18"/>
+              </w:rPr>
+              <w:t>Contact</w:t>
+            </w:r>
+          </w:p>
+        </w:tc>
+        <w:tc>
+          <w:tcPr>
+            <w:tcW w:w="5760" w:type="dxa"/>
+            <w:tcBorders>
+              <w:top w:val="single" w:sz="2" w:space="0" w:color="CCCCCC"/>
+              <w:left w:val="single" w:sz="2" w:space="0" w:color="CCCCCC"/>
+              <w:bottom w:val="single" w:sz="2" w:space="0" w:color="CCCCCC"/>
+              <w:right w:val="single" w:sz="2" w:space="0" w:color="CCCCCC"/>
+            </w:tcBorders>
+            <w:shd w:fill="FFFFFF" w:val="clear"/>
+          </w:tcPr>
+          <w:p>
+            <w:pPr>
+              <w:pStyle w:val="Normal"/>
+              <w:rPr/>
+            </w:pPr>
+            <w:r>
+              <w:rPr>
+                <w:rFonts w:eastAsia="Arial" w:cs="Arial"/>
+                <w:sz w:val="18"/>
+                <w:szCs w:val="18"/>
+              </w:rPr>
+              <w:t>Required. Email field. Primary email used for all follow-up communications.</w:t>
+            </w:r>
+          </w:p>
+        </w:tc>
+      </w:tr>
+      <w:tr>
+        <w:trPr/>
+        <w:tc>
+          <w:tcPr>
+            <w:tcW w:w="2200" w:type="dxa"/>
+            <w:tcBorders>
+              <w:top w:val="single" w:sz="2" w:space="0" w:color="CCCCCC"/>
+              <w:left w:val="single" w:sz="2" w:space="0" w:color="CCCCCC"/>
+              <w:bottom w:val="single" w:sz="2" w:space="0" w:color="CCCCCC"/>
+              <w:right w:val="single" w:sz="2" w:space="0" w:color="CCCCCC"/>
+            </w:tcBorders>
+            <w:shd w:fill="F2F2F2" w:val="clear"/>
+          </w:tcPr>
+          <w:p>
+            <w:pPr>
+              <w:pStyle w:val="Normal"/>
+              <w:rPr/>
+            </w:pPr>
+            <w:r>
+              <w:rPr>
+                <w:rFonts w:eastAsia="Arial" w:cs="Arial"/>
+                <w:sz w:val="18"/>
+                <w:szCs w:val="18"/>
+              </w:rPr>
+              <w:t>Phone</w:t>
+            </w:r>
+          </w:p>
+        </w:tc>
+        <w:tc>
+          <w:tcPr>
+            <w:tcW w:w="1400" w:type="dxa"/>
+            <w:tcBorders>
+              <w:top w:val="single" w:sz="2" w:space="0" w:color="CCCCCC"/>
+              <w:left w:val="single" w:sz="2" w:space="0" w:color="CCCCCC"/>
+              <w:bottom w:val="single" w:sz="2" w:space="0" w:color="CCCCCC"/>
+              <w:right w:val="single" w:sz="2" w:space="0" w:color="CCCCCC"/>
+            </w:tcBorders>
+            <w:shd w:fill="F2F2F2" w:val="clear"/>
+          </w:tcPr>
+          <w:p>
+            <w:pPr>
+              <w:pStyle w:val="Normal"/>
+              <w:rPr/>
+            </w:pPr>
+            <w:r>
+              <w:rPr>
+                <w:rFonts w:eastAsia="Arial" w:cs="Arial"/>
+                <w:sz w:val="18"/>
+                <w:szCs w:val="18"/>
+              </w:rPr>
+              <w:t>Contact</w:t>
+            </w:r>
+          </w:p>
+        </w:tc>
+        <w:tc>
+          <w:tcPr>
+            <w:tcW w:w="5760" w:type="dxa"/>
+            <w:tcBorders>
+              <w:top w:val="single" w:sz="2" w:space="0" w:color="CCCCCC"/>
+              <w:left w:val="single" w:sz="2" w:space="0" w:color="CCCCCC"/>
+              <w:bottom w:val="single" w:sz="2" w:space="0" w:color="CCCCCC"/>
+              <w:right w:val="single" w:sz="2" w:space="0" w:color="CCCCCC"/>
+            </w:tcBorders>
+            <w:shd w:fill="F2F2F2" w:val="clear"/>
+          </w:tcPr>
+          <w:p>
+            <w:pPr>
+              <w:pStyle w:val="Normal"/>
+              <w:rPr/>
+            </w:pPr>
+            <w:r>
+              <w:rPr>
+                <w:rFonts w:eastAsia="Arial" w:cs="Arial"/>
+                <w:sz w:val="18"/>
+                <w:szCs w:val="18"/>
+              </w:rPr>
+              <w:t>Required. Phone field.</w:t>
+            </w:r>
+          </w:p>
+        </w:tc>
+      </w:tr>
+      <w:tr>
+        <w:trPr/>
+        <w:tc>
+          <w:tcPr>
+            <w:tcW w:w="2200" w:type="dxa"/>
+            <w:tcBorders>
+              <w:top w:val="single" w:sz="2" w:space="0" w:color="CCCCCC"/>
+              <w:left w:val="single" w:sz="2" w:space="0" w:color="CCCCCC"/>
+              <w:bottom w:val="single" w:sz="2" w:space="0" w:color="CCCCCC"/>
+              <w:right w:val="single" w:sz="2" w:space="0" w:color="CCCCCC"/>
+            </w:tcBorders>
+            <w:shd w:fill="FFFFFF" w:val="clear"/>
+          </w:tcPr>
+          <w:p>
+            <w:pPr>
+              <w:pStyle w:val="Normal"/>
+              <w:rPr/>
+            </w:pPr>
+            <w:r>
+              <w:rPr>
+                <w:rFonts w:eastAsia="Arial" w:cs="Arial"/>
+                <w:sz w:val="18"/>
+                <w:szCs w:val="18"/>
+              </w:rPr>
+              <w:t>Zip Code</w:t>
+            </w:r>
+          </w:p>
+        </w:tc>
+        <w:tc>
+          <w:tcPr>
+            <w:tcW w:w="1400" w:type="dxa"/>
+            <w:tcBorders>
+              <w:top w:val="single" w:sz="2" w:space="0" w:color="CCCCCC"/>
+              <w:left w:val="single" w:sz="2" w:space="0" w:color="CCCCCC"/>
+              <w:bottom w:val="single" w:sz="2" w:space="0" w:color="CCCCCC"/>
+              <w:right w:val="single" w:sz="2" w:space="0" w:color="CCCCCC"/>
+            </w:tcBorders>
+            <w:shd w:fill="FFFFFF" w:val="clear"/>
+          </w:tcPr>
+          <w:p>
+            <w:pPr>
+              <w:pStyle w:val="Normal"/>
+              <w:rPr/>
+            </w:pPr>
+            <w:r>
+              <w:rPr>
+                <w:rFonts w:eastAsia="Arial" w:cs="Arial"/>
+                <w:sz w:val="18"/>
+                <w:szCs w:val="18"/>
+              </w:rPr>
+              <w:t>Contact</w:t>
+            </w:r>
+          </w:p>
+        </w:tc>
+        <w:tc>
+          <w:tcPr>
+            <w:tcW w:w="5760" w:type="dxa"/>
+            <w:tcBorders>
+              <w:top w:val="single" w:sz="2" w:space="0" w:color="CCCCCC"/>
+              <w:left w:val="single" w:sz="2" w:space="0" w:color="CCCCCC"/>
+              <w:bottom w:val="single" w:sz="2" w:space="0" w:color="CCCCCC"/>
+              <w:right w:val="single" w:sz="2" w:space="0" w:color="CCCCCC"/>
+            </w:tcBorders>
+            <w:shd w:fill="FFFFFF" w:val="clear"/>
+          </w:tcPr>
+          <w:p>
+            <w:pPr>
+              <w:pStyle w:val="Normal"/>
+              <w:rPr/>
+            </w:pPr>
+            <w:r>
+              <w:rPr>
+                <w:rFonts w:eastAsia="Arial" w:cs="Arial"/>
+                <w:sz w:val="18"/>
+                <w:szCs w:val="18"/>
+              </w:rPr>
+              <w:t>Required. Text field. Used for geographic reporting.</w:t>
+            </w:r>
+          </w:p>
+        </w:tc>
+      </w:tr>
+      <w:tr>
+        <w:trPr/>
+        <w:tc>
+          <w:tcPr>
+            <w:tcW w:w="2200" w:type="dxa"/>
+            <w:tcBorders>
+              <w:top w:val="single" w:sz="2" w:space="0" w:color="CCCCCC"/>
+              <w:left w:val="single" w:sz="2" w:space="0" w:color="CCCCCC"/>
+              <w:bottom w:val="single" w:sz="2" w:space="0" w:color="CCCCCC"/>
+              <w:right w:val="single" w:sz="2" w:space="0" w:color="CCCCCC"/>
+            </w:tcBorders>
+            <w:shd w:fill="F2F2F2" w:val="clear"/>
+          </w:tcPr>
+          <w:p>
+            <w:pPr>
+              <w:pStyle w:val="Normal"/>
+              <w:rPr/>
+            </w:pPr>
+            <w:r>
+              <w:rPr>
+                <w:rFonts w:eastAsia="Arial" w:cs="Arial"/>
+                <w:sz w:val="18"/>
+                <w:szCs w:val="18"/>
+              </w:rPr>
+              <w:t>Business Name</w:t>
+            </w:r>
+          </w:p>
+        </w:tc>
+        <w:tc>
+          <w:tcPr>
+            <w:tcW w:w="1400" w:type="dxa"/>
+            <w:tcBorders>
+              <w:top w:val="single" w:sz="2" w:space="0" w:color="CCCCCC"/>
+              <w:left w:val="single" w:sz="2" w:space="0" w:color="CCCCCC"/>
+              <w:bottom w:val="single" w:sz="2" w:space="0" w:color="CCCCCC"/>
+              <w:right w:val="single" w:sz="2" w:space="0" w:color="CCCCCC"/>
+            </w:tcBorders>
+            <w:shd w:fill="F2F2F2" w:val="clear"/>
+          </w:tcPr>
+          <w:p>
+            <w:pPr>
+              <w:pStyle w:val="Normal"/>
+              <w:rPr/>
+            </w:pPr>
+            <w:r>
+              <w:rPr>
+                <w:rFonts w:eastAsia="Arial" w:cs="Arial"/>
+                <w:sz w:val="18"/>
+                <w:szCs w:val="18"/>
+              </w:rPr>
+              <w:t>Company</w:t>
+            </w:r>
+          </w:p>
+        </w:tc>
+        <w:tc>
+          <w:tcPr>
+            <w:tcW w:w="5760" w:type="dxa"/>
+            <w:tcBorders>
+              <w:top w:val="single" w:sz="2" w:space="0" w:color="CCCCCC"/>
+              <w:left w:val="single" w:sz="2" w:space="0" w:color="CCCCCC"/>
+              <w:bottom w:val="single" w:sz="2" w:space="0" w:color="CCCCCC"/>
+              <w:right w:val="single" w:sz="2" w:space="0" w:color="CCCCCC"/>
+            </w:tcBorders>
+            <w:shd w:fill="F2F2F2" w:val="clear"/>
+          </w:tcPr>
+          <w:p>
+            <w:pPr>
+              <w:pStyle w:val="Normal"/>
+              <w:rPr/>
+            </w:pPr>
+            <w:r>
+              <w:rPr>
+                <w:rFonts w:eastAsia="Arial" w:cs="Arial"/>
+                <w:sz w:val="18"/>
+                <w:szCs w:val="18"/>
+              </w:rPr>
+              <w:t>Optional. Text field. May be left blank for pre-startup applicants.</w:t>
+            </w:r>
+          </w:p>
+        </w:tc>
+      </w:tr>
+      <w:tr>
+        <w:trPr/>
+        <w:tc>
+          <w:tcPr>
+            <w:tcW w:w="2200" w:type="dxa"/>
+            <w:tcBorders>
+              <w:top w:val="single" w:sz="2" w:space="0" w:color="CCCCCC"/>
+              <w:left w:val="single" w:sz="2" w:space="0" w:color="CCCCCC"/>
+              <w:bottom w:val="single" w:sz="2" w:space="0" w:color="CCCCCC"/>
+              <w:right w:val="single" w:sz="2" w:space="0" w:color="CCCCCC"/>
+            </w:tcBorders>
+            <w:shd w:fill="FFFFFF" w:val="clear"/>
+          </w:tcPr>
+          <w:p>
+            <w:pPr>
+              <w:pStyle w:val="Normal"/>
+              <w:rPr/>
+            </w:pPr>
+            <w:r>
+              <w:rPr>
+                <w:rFonts w:eastAsia="Arial" w:cs="Arial"/>
+                <w:sz w:val="18"/>
+                <w:szCs w:val="18"/>
+              </w:rPr>
+              <w:t>Website</w:t>
+            </w:r>
+          </w:p>
+        </w:tc>
+        <w:tc>
+          <w:tcPr>
+            <w:tcW w:w="1400" w:type="dxa"/>
+            <w:tcBorders>
+              <w:top w:val="single" w:sz="2" w:space="0" w:color="CCCCCC"/>
+              <w:left w:val="single" w:sz="2" w:space="0" w:color="CCCCCC"/>
+              <w:bottom w:val="single" w:sz="2" w:space="0" w:color="CCCCCC"/>
+              <w:right w:val="single" w:sz="2" w:space="0" w:color="CCCCCC"/>
+            </w:tcBorders>
+            <w:shd w:fill="FFFFFF" w:val="clear"/>
+          </w:tcPr>
+          <w:p>
+            <w:pPr>
+              <w:pStyle w:val="Normal"/>
+              <w:rPr/>
+            </w:pPr>
+            <w:r>
+              <w:rPr>
+                <w:rFonts w:eastAsia="Arial" w:cs="Arial"/>
+                <w:sz w:val="18"/>
+                <w:szCs w:val="18"/>
+              </w:rPr>
+              <w:t>Company</w:t>
+            </w:r>
+          </w:p>
+        </w:tc>
+        <w:tc>
+          <w:tcPr>
+            <w:tcW w:w="5760" w:type="dxa"/>
+            <w:tcBorders>
+              <w:top w:val="single" w:sz="2" w:space="0" w:color="CCCCCC"/>
+              <w:left w:val="single" w:sz="2" w:space="0" w:color="CCCCCC"/>
+              <w:bottom w:val="single" w:sz="2" w:space="0" w:color="CCCCCC"/>
+              <w:right w:val="single" w:sz="2" w:space="0" w:color="CCCCCC"/>
+            </w:tcBorders>
+            <w:shd w:fill="FFFFFF" w:val="clear"/>
+          </w:tcPr>
+          <w:p>
+            <w:pPr>
+              <w:pStyle w:val="Normal"/>
+              <w:rPr/>
+            </w:pPr>
+            <w:r>
+              <w:rPr>
+                <w:rFonts w:eastAsia="Arial" w:cs="Arial"/>
+                <w:sz w:val="18"/>
+                <w:szCs w:val="18"/>
+              </w:rPr>
+              <w:t>Optional. URL field.</w:t>
+            </w:r>
+          </w:p>
+        </w:tc>
+      </w:tr>
+      <w:tr>
+        <w:trPr/>
+        <w:tc>
+          <w:tcPr>
+            <w:tcW w:w="2200" w:type="dxa"/>
+            <w:tcBorders>
+              <w:top w:val="single" w:sz="2" w:space="0" w:color="CCCCCC"/>
+              <w:left w:val="single" w:sz="2" w:space="0" w:color="CCCCCC"/>
+              <w:bottom w:val="single" w:sz="2" w:space="0" w:color="CCCCCC"/>
+              <w:right w:val="single" w:sz="2" w:space="0" w:color="CCCCCC"/>
+            </w:tcBorders>
+            <w:shd w:fill="F2F2F2" w:val="clear"/>
+          </w:tcPr>
+          <w:p>
+            <w:pPr>
+              <w:pStyle w:val="Normal"/>
+              <w:rPr/>
+            </w:pPr>
+            <w:r>
+              <w:rPr>
+                <w:rFonts w:eastAsia="Arial" w:cs="Arial"/>
+                <w:sz w:val="18"/>
+                <w:szCs w:val="18"/>
+              </w:rPr>
+              <w:t>Address</w:t>
+            </w:r>
+          </w:p>
+        </w:tc>
+        <w:tc>
+          <w:tcPr>
+            <w:tcW w:w="1400" w:type="dxa"/>
+            <w:tcBorders>
+              <w:top w:val="single" w:sz="2" w:space="0" w:color="CCCCCC"/>
+              <w:left w:val="single" w:sz="2" w:space="0" w:color="CCCCCC"/>
+              <w:bottom w:val="single" w:sz="2" w:space="0" w:color="CCCCCC"/>
+              <w:right w:val="single" w:sz="2" w:space="0" w:color="CCCCCC"/>
+            </w:tcBorders>
+            <w:shd w:fill="F2F2F2" w:val="clear"/>
+          </w:tcPr>
+          <w:p>
+            <w:pPr>
+              <w:pStyle w:val="Normal"/>
+              <w:rPr/>
+            </w:pPr>
+            <w:r>
+              <w:rPr>
+                <w:rFonts w:eastAsia="Arial" w:cs="Arial"/>
+                <w:sz w:val="18"/>
+                <w:szCs w:val="18"/>
+              </w:rPr>
+              <w:t>Company</w:t>
+            </w:r>
+          </w:p>
+        </w:tc>
+        <w:tc>
+          <w:tcPr>
+            <w:tcW w:w="5760" w:type="dxa"/>
+            <w:tcBorders>
+              <w:top w:val="single" w:sz="2" w:space="0" w:color="CCCCCC"/>
+              <w:left w:val="single" w:sz="2" w:space="0" w:color="CCCCCC"/>
+              <w:bottom w:val="single" w:sz="2" w:space="0" w:color="CCCCCC"/>
+              <w:right w:val="single" w:sz="2" w:space="0" w:color="CCCCCC"/>
+            </w:tcBorders>
+            <w:shd w:fill="F2F2F2" w:val="clear"/>
+          </w:tcPr>
+          <w:p>
+            <w:pPr>
+              <w:pStyle w:val="Normal"/>
+              <w:rPr/>
+            </w:pPr>
+            <w:r>
+              <w:rPr>
+                <w:rFonts w:eastAsia="Arial" w:cs="Arial"/>
+                <w:sz w:val="18"/>
+                <w:szCs w:val="18"/>
+              </w:rPr>
+              <w:t>Optional. Address field (street, city, state, zip).</w:t>
+            </w:r>
+          </w:p>
+        </w:tc>
+      </w:tr>
+      <w:tr>
+        <w:trPr/>
+        <w:tc>
+          <w:tcPr>
+            <w:tcW w:w="2200" w:type="dxa"/>
+            <w:tcBorders>
+              <w:top w:val="single" w:sz="2" w:space="0" w:color="CCCCCC"/>
+              <w:left w:val="single" w:sz="2" w:space="0" w:color="CCCCCC"/>
+              <w:bottom w:val="single" w:sz="2" w:space="0" w:color="CCCCCC"/>
+              <w:right w:val="single" w:sz="2" w:space="0" w:color="CCCCCC"/>
+            </w:tcBorders>
+            <w:shd w:fill="FFFFFF" w:val="clear"/>
+          </w:tcPr>
+          <w:p>
+            <w:pPr>
+              <w:pStyle w:val="Normal"/>
+              <w:rPr/>
+            </w:pPr>
+            <w:r>
+              <w:rPr>
+                <w:rFonts w:eastAsia="Arial" w:cs="Arial"/>
+                <w:sz w:val="18"/>
+                <w:szCs w:val="18"/>
+              </w:rPr>
+              <w:t>Organization Type</w:t>
+            </w:r>
+          </w:p>
+        </w:tc>
+        <w:tc>
+          <w:tcPr>
+            <w:tcW w:w="1400" w:type="dxa"/>
+            <w:tcBorders>
+              <w:top w:val="single" w:sz="2" w:space="0" w:color="CCCCCC"/>
+              <w:left w:val="single" w:sz="2" w:space="0" w:color="CCCCCC"/>
+              <w:bottom w:val="single" w:sz="2" w:space="0" w:color="CCCCCC"/>
+              <w:right w:val="single" w:sz="2" w:space="0" w:color="CCCCCC"/>
+            </w:tcBorders>
+            <w:shd w:fill="FFFFFF" w:val="clear"/>
+          </w:tcPr>
+          <w:p>
+            <w:pPr>
+              <w:pStyle w:val="Normal"/>
+              <w:rPr/>
+            </w:pPr>
+            <w:r>
+              <w:rPr>
+                <w:rFonts w:eastAsia="Arial" w:cs="Arial"/>
+                <w:sz w:val="18"/>
+                <w:szCs w:val="18"/>
+              </w:rPr>
+              <w:t>Company</w:t>
+            </w:r>
+          </w:p>
+        </w:tc>
+        <w:tc>
+          <w:tcPr>
+            <w:tcW w:w="5760" w:type="dxa"/>
+            <w:tcBorders>
+              <w:top w:val="single" w:sz="2" w:space="0" w:color="CCCCCC"/>
+              <w:left w:val="single" w:sz="2" w:space="0" w:color="CCCCCC"/>
+              <w:bottom w:val="single" w:sz="2" w:space="0" w:color="CCCCCC"/>
+              <w:right w:val="single" w:sz="2" w:space="0" w:color="CCCCCC"/>
+            </w:tcBorders>
+            <w:shd w:fill="FFFFFF" w:val="clear"/>
+          </w:tcPr>
+          <w:p>
+            <w:pPr>
+              <w:pStyle w:val="Normal"/>
+              <w:rPr/>
+            </w:pPr>
+            <w:r>
+              <w:rPr>
+                <w:rFonts w:eastAsia="Arial" w:cs="Arial"/>
+                <w:sz w:val="18"/>
+                <w:szCs w:val="18"/>
+              </w:rPr>
+              <w:t>Required. Dropdown. Values: For-Profit | Non-Profit.</w:t>
+            </w:r>
+          </w:p>
+        </w:tc>
+      </w:tr>
+      <w:tr>
+        <w:trPr/>
+        <w:tc>
+          <w:tcPr>
+            <w:tcW w:w="2200" w:type="dxa"/>
+            <w:tcBorders>
+              <w:top w:val="single" w:sz="2" w:space="0" w:color="CCCCCC"/>
+              <w:left w:val="single" w:sz="2" w:space="0" w:color="CCCCCC"/>
+              <w:bottom w:val="single" w:sz="2" w:space="0" w:color="CCCCCC"/>
+              <w:right w:val="single" w:sz="2" w:space="0" w:color="CCCCCC"/>
+            </w:tcBorders>
+            <w:shd w:fill="F2F2F2" w:val="clear"/>
+          </w:tcPr>
+          <w:p>
+            <w:pPr>
+              <w:pStyle w:val="Normal"/>
+              <w:rPr/>
+            </w:pPr>
+            <w:r>
+              <w:rPr>
+                <w:rFonts w:eastAsia="Arial" w:cs="Arial"/>
+                <w:sz w:val="18"/>
+                <w:szCs w:val="18"/>
+              </w:rPr>
+              <w:t>Business Stage</w:t>
+            </w:r>
+          </w:p>
+        </w:tc>
+        <w:tc>
+          <w:tcPr>
+            <w:tcW w:w="1400" w:type="dxa"/>
+            <w:tcBorders>
+              <w:top w:val="single" w:sz="2" w:space="0" w:color="CCCCCC"/>
+              <w:left w:val="single" w:sz="2" w:space="0" w:color="CCCCCC"/>
+              <w:bottom w:val="single" w:sz="2" w:space="0" w:color="CCCCCC"/>
+              <w:right w:val="single" w:sz="2" w:space="0" w:color="CCCCCC"/>
+            </w:tcBorders>
+            <w:shd w:fill="F2F2F2" w:val="clear"/>
+          </w:tcPr>
+          <w:p>
+            <w:pPr>
+              <w:pStyle w:val="Normal"/>
+              <w:rPr/>
+            </w:pPr>
+            <w:r>
+              <w:rPr>
+                <w:rFonts w:eastAsia="Arial" w:cs="Arial"/>
+                <w:sz w:val="18"/>
+                <w:szCs w:val="18"/>
+              </w:rPr>
+              <w:t>Company</w:t>
+            </w:r>
+          </w:p>
+        </w:tc>
+        <w:tc>
+          <w:tcPr>
+            <w:tcW w:w="5760" w:type="dxa"/>
+            <w:tcBorders>
+              <w:top w:val="single" w:sz="2" w:space="0" w:color="CCCCCC"/>
+              <w:left w:val="single" w:sz="2" w:space="0" w:color="CCCCCC"/>
+              <w:bottom w:val="single" w:sz="2" w:space="0" w:color="CCCCCC"/>
+              <w:right w:val="single" w:sz="2" w:space="0" w:color="CCCCCC"/>
+            </w:tcBorders>
+            <w:shd w:fill="F2F2F2" w:val="clear"/>
+          </w:tcPr>
+          <w:p>
+            <w:pPr>
+              <w:pStyle w:val="Normal"/>
+              <w:rPr/>
+            </w:pPr>
+            <w:r>
+              <w:rPr>
+                <w:rFonts w:eastAsia="Arial" w:cs="Arial"/>
+                <w:sz w:val="18"/>
+                <w:szCs w:val="18"/>
+              </w:rPr>
+              <w:t>Required. Dropdown. Values: Pre-Startup | Startup | Early Stage | Growth Stage | Established.</w:t>
+            </w:r>
+          </w:p>
+        </w:tc>
+      </w:tr>
+      <w:tr>
+        <w:trPr/>
+        <w:tc>
+          <w:tcPr>
+            <w:tcW w:w="2200" w:type="dxa"/>
+            <w:tcBorders>
+              <w:top w:val="single" w:sz="2" w:space="0" w:color="CCCCCC"/>
+              <w:left w:val="single" w:sz="2" w:space="0" w:color="CCCCCC"/>
+              <w:bottom w:val="single" w:sz="2" w:space="0" w:color="CCCCCC"/>
+              <w:right w:val="single" w:sz="2" w:space="0" w:color="CCCCCC"/>
+            </w:tcBorders>
+            <w:shd w:fill="FFFFFF" w:val="clear"/>
+          </w:tcPr>
+          <w:p>
+            <w:pPr>
+              <w:pStyle w:val="Normal"/>
+              <w:rPr/>
+            </w:pPr>
+            <w:r>
+              <w:rPr>
+                <w:rFonts w:eastAsia="Arial" w:cs="Arial"/>
+                <w:sz w:val="18"/>
+                <w:szCs w:val="18"/>
+              </w:rPr>
+              <w:t>NAICS Sector</w:t>
+            </w:r>
+          </w:p>
+        </w:tc>
+        <w:tc>
+          <w:tcPr>
+            <w:tcW w:w="1400" w:type="dxa"/>
+            <w:tcBorders>
+              <w:top w:val="single" w:sz="2" w:space="0" w:color="CCCCCC"/>
+              <w:left w:val="single" w:sz="2" w:space="0" w:color="CCCCCC"/>
+              <w:bottom w:val="single" w:sz="2" w:space="0" w:color="CCCCCC"/>
+              <w:right w:val="single" w:sz="2" w:space="0" w:color="CCCCCC"/>
+            </w:tcBorders>
+            <w:shd w:fill="FFFFFF" w:val="clear"/>
+          </w:tcPr>
+          <w:p>
+            <w:pPr>
+              <w:pStyle w:val="Normal"/>
+              <w:rPr/>
+            </w:pPr>
+            <w:r>
+              <w:rPr>
+                <w:rFonts w:eastAsia="Arial" w:cs="Arial"/>
+                <w:sz w:val="18"/>
+                <w:szCs w:val="18"/>
+              </w:rPr>
+              <w:t>Company</w:t>
+            </w:r>
+          </w:p>
+        </w:tc>
+        <w:tc>
+          <w:tcPr>
+            <w:tcW w:w="5760" w:type="dxa"/>
+            <w:tcBorders>
+              <w:top w:val="single" w:sz="2" w:space="0" w:color="CCCCCC"/>
+              <w:left w:val="single" w:sz="2" w:space="0" w:color="CCCCCC"/>
+              <w:bottom w:val="single" w:sz="2" w:space="0" w:color="CCCCCC"/>
+              <w:right w:val="single" w:sz="2" w:space="0" w:color="CCCCCC"/>
+            </w:tcBorders>
+            <w:shd w:fill="FFFFFF" w:val="clear"/>
+          </w:tcPr>
+          <w:p>
+            <w:pPr>
+              <w:pStyle w:val="Normal"/>
+              <w:rPr/>
+            </w:pPr>
+            <w:r>
+              <w:rPr>
+                <w:rFonts w:eastAsia="Arial" w:cs="Arial"/>
+                <w:sz w:val="18"/>
+                <w:szCs w:val="18"/>
+              </w:rPr>
+              <w:t>Required. Dropdown of 20 NAICS sectors.</w:t>
+            </w:r>
+          </w:p>
+        </w:tc>
+      </w:tr>
+      <w:tr>
+        <w:trPr/>
+        <w:tc>
+          <w:tcPr>
+            <w:tcW w:w="2200" w:type="dxa"/>
+            <w:tcBorders>
+              <w:top w:val="single" w:sz="2" w:space="0" w:color="CCCCCC"/>
+              <w:left w:val="single" w:sz="2" w:space="0" w:color="CCCCCC"/>
+              <w:bottom w:val="single" w:sz="2" w:space="0" w:color="CCCCCC"/>
+              <w:right w:val="single" w:sz="2" w:space="0" w:color="CCCCCC"/>
+            </w:tcBorders>
+            <w:shd w:fill="F2F2F2" w:val="clear"/>
+          </w:tcPr>
+          <w:p>
+            <w:pPr>
+              <w:pStyle w:val="Normal"/>
+              <w:rPr/>
+            </w:pPr>
+            <w:r>
+              <w:rPr>
+                <w:rFonts w:eastAsia="Arial" w:cs="Arial"/>
+                <w:sz w:val="18"/>
+                <w:szCs w:val="18"/>
+              </w:rPr>
+              <w:t>NAICS Subsector</w:t>
+            </w:r>
+          </w:p>
+        </w:tc>
+        <w:tc>
+          <w:tcPr>
+            <w:tcW w:w="1400" w:type="dxa"/>
+            <w:tcBorders>
+              <w:top w:val="single" w:sz="2" w:space="0" w:color="CCCCCC"/>
+              <w:left w:val="single" w:sz="2" w:space="0" w:color="CCCCCC"/>
+              <w:bottom w:val="single" w:sz="2" w:space="0" w:color="CCCCCC"/>
+              <w:right w:val="single" w:sz="2" w:space="0" w:color="CCCCCC"/>
+            </w:tcBorders>
+            <w:shd w:fill="F2F2F2" w:val="clear"/>
+          </w:tcPr>
+          <w:p>
+            <w:pPr>
+              <w:pStyle w:val="Normal"/>
+              <w:rPr/>
+            </w:pPr>
+            <w:r>
+              <w:rPr>
+                <w:rFonts w:eastAsia="Arial" w:cs="Arial"/>
+                <w:sz w:val="18"/>
+                <w:szCs w:val="18"/>
+              </w:rPr>
+              <w:t>Company</w:t>
+            </w:r>
+          </w:p>
+        </w:tc>
+        <w:tc>
+          <w:tcPr>
+            <w:tcW w:w="5760" w:type="dxa"/>
+            <w:tcBorders>
+              <w:top w:val="single" w:sz="2" w:space="0" w:color="CCCCCC"/>
+              <w:left w:val="single" w:sz="2" w:space="0" w:color="CCCCCC"/>
+              <w:bottom w:val="single" w:sz="2" w:space="0" w:color="CCCCCC"/>
+              <w:right w:val="single" w:sz="2" w:space="0" w:color="CCCCCC"/>
+            </w:tcBorders>
+            <w:shd w:fill="F2F2F2" w:val="clear"/>
+          </w:tcPr>
+          <w:p>
+            <w:pPr>
+              <w:pStyle w:val="Normal"/>
+              <w:rPr/>
+            </w:pPr>
+            <w:r>
+              <w:rPr>
+                <w:rFonts w:eastAsia="Arial" w:cs="Arial"/>
+                <w:sz w:val="18"/>
+                <w:szCs w:val="18"/>
+              </w:rPr>
+              <w:t>Required. Dropdown of ~100 NAICS subsectors, filtered by selected Sector. Stored as a separate field from NAICS Sector.</w:t>
+            </w:r>
+          </w:p>
+        </w:tc>
+      </w:tr>
+      <w:tr>
+        <w:trPr/>
+        <w:tc>
+          <w:tcPr>
+            <w:tcW w:w="2200" w:type="dxa"/>
+            <w:tcBorders>
+              <w:top w:val="single" w:sz="2" w:space="0" w:color="CCCCCC"/>
+              <w:left w:val="single" w:sz="2" w:space="0" w:color="CCCCCC"/>
+              <w:bottom w:val="single" w:sz="2" w:space="0" w:color="CCCCCC"/>
+              <w:right w:val="single" w:sz="2" w:space="0" w:color="CCCCCC"/>
+            </w:tcBorders>
+            <w:shd w:fill="FFFFFF" w:val="clear"/>
+          </w:tcPr>
+          <w:p>
+            <w:pPr>
+              <w:pStyle w:val="Normal"/>
+              <w:rPr/>
+            </w:pPr>
+            <w:r>
+              <w:rPr>
+                <w:rFonts w:eastAsia="Arial" w:cs="Arial"/>
+                <w:sz w:val="18"/>
+                <w:szCs w:val="18"/>
+              </w:rPr>
+              <w:t>Mentoring Focus Areas</w:t>
+            </w:r>
+          </w:p>
+        </w:tc>
+        <w:tc>
+          <w:tcPr>
+            <w:tcW w:w="1400" w:type="dxa"/>
+            <w:tcBorders>
+              <w:top w:val="single" w:sz="2" w:space="0" w:color="CCCCCC"/>
+              <w:left w:val="single" w:sz="2" w:space="0" w:color="CCCCCC"/>
+              <w:bottom w:val="single" w:sz="2" w:space="0" w:color="CCCCCC"/>
+              <w:right w:val="single" w:sz="2" w:space="0" w:color="CCCCCC"/>
+            </w:tcBorders>
+            <w:shd w:fill="FFFFFF" w:val="clear"/>
+          </w:tcPr>
+          <w:p>
+            <w:pPr>
+              <w:pStyle w:val="Normal"/>
+              <w:rPr/>
+            </w:pPr>
+            <w:r>
+              <w:rPr>
+                <w:rFonts w:eastAsia="Arial" w:cs="Arial"/>
+                <w:sz w:val="18"/>
+                <w:szCs w:val="18"/>
+              </w:rPr>
+              <w:t>Company</w:t>
+            </w:r>
+          </w:p>
+        </w:tc>
+        <w:tc>
+          <w:tcPr>
+            <w:tcW w:w="5760" w:type="dxa"/>
+            <w:tcBorders>
+              <w:top w:val="single" w:sz="2" w:space="0" w:color="CCCCCC"/>
+              <w:left w:val="single" w:sz="2" w:space="0" w:color="CCCCCC"/>
+              <w:bottom w:val="single" w:sz="2" w:space="0" w:color="CCCCCC"/>
+              <w:right w:val="single" w:sz="2" w:space="0" w:color="CCCCCC"/>
+            </w:tcBorders>
+            <w:shd w:fill="FFFFFF" w:val="clear"/>
+          </w:tcPr>
+          <w:p>
+            <w:pPr>
+              <w:pStyle w:val="Normal"/>
+              <w:rPr/>
+            </w:pPr>
+            <w:r>
+              <w:rPr>
+                <w:rFonts w:eastAsia="Arial" w:cs="Arial"/>
+                <w:sz w:val="18"/>
+                <w:szCs w:val="18"/>
+              </w:rPr>
+              <w:t>Required. Multi-select dropdown. Values to be defined by CBM leadership. Used for mentor matching and funder reporting.</w:t>
+            </w:r>
+          </w:p>
+        </w:tc>
+      </w:tr>
+      <w:tr>
+        <w:trPr/>
+        <w:tc>
+          <w:tcPr>
+            <w:tcW w:w="2200" w:type="dxa"/>
+            <w:tcBorders>
+              <w:top w:val="single" w:sz="2" w:space="0" w:color="CCCCCC"/>
+              <w:left w:val="single" w:sz="2" w:space="0" w:color="CCCCCC"/>
+              <w:bottom w:val="single" w:sz="2" w:space="0" w:color="CCCCCC"/>
+              <w:right w:val="single" w:sz="2" w:space="0" w:color="CCCCCC"/>
+            </w:tcBorders>
+            <w:shd w:fill="F2F2F2" w:val="clear"/>
+          </w:tcPr>
+          <w:p>
+            <w:pPr>
+              <w:pStyle w:val="Normal"/>
+              <w:rPr/>
+            </w:pPr>
+            <w:r>
+              <w:rPr>
+                <w:rFonts w:eastAsia="Arial" w:cs="Arial"/>
+                <w:sz w:val="18"/>
+                <w:szCs w:val="18"/>
+              </w:rPr>
+              <w:t>Mentoring Needs Description</w:t>
+            </w:r>
+          </w:p>
+        </w:tc>
+        <w:tc>
+          <w:tcPr>
+            <w:tcW w:w="1400" w:type="dxa"/>
+            <w:tcBorders>
+              <w:top w:val="single" w:sz="2" w:space="0" w:color="CCCCCC"/>
+              <w:left w:val="single" w:sz="2" w:space="0" w:color="CCCCCC"/>
+              <w:bottom w:val="single" w:sz="2" w:space="0" w:color="CCCCCC"/>
+              <w:right w:val="single" w:sz="2" w:space="0" w:color="CCCCCC"/>
+            </w:tcBorders>
+            <w:shd w:fill="F2F2F2" w:val="clear"/>
+          </w:tcPr>
+          <w:p>
+            <w:pPr>
+              <w:pStyle w:val="Normal"/>
+              <w:rPr/>
+            </w:pPr>
+            <w:r>
+              <w:rPr>
+                <w:rFonts w:eastAsia="Arial" w:cs="Arial"/>
+                <w:sz w:val="18"/>
+                <w:szCs w:val="18"/>
+              </w:rPr>
+              <w:t>Company</w:t>
+            </w:r>
+          </w:p>
+        </w:tc>
+        <w:tc>
+          <w:tcPr>
+            <w:tcW w:w="5760" w:type="dxa"/>
+            <w:tcBorders>
+              <w:top w:val="single" w:sz="2" w:space="0" w:color="CCCCCC"/>
+              <w:left w:val="single" w:sz="2" w:space="0" w:color="CCCCCC"/>
+              <w:bottom w:val="single" w:sz="2" w:space="0" w:color="CCCCCC"/>
+              <w:right w:val="single" w:sz="2" w:space="0" w:color="CCCCCC"/>
+            </w:tcBorders>
+            <w:shd w:fill="F2F2F2" w:val="clear"/>
+          </w:tcPr>
+          <w:p>
+            <w:pPr>
+              <w:pStyle w:val="Normal"/>
+              <w:rPr/>
+            </w:pPr>
+            <w:r>
+              <w:rPr>
+                <w:rFonts w:eastAsia="Arial" w:cs="Arial"/>
+                <w:sz w:val="18"/>
+                <w:szCs w:val="18"/>
+              </w:rPr>
+              <w:t>Required. Rich text. Free-form description of what the client is seeking from the mentoring engagement.</w:t>
+            </w:r>
+          </w:p>
+        </w:tc>
+      </w:tr>
+    </w:tbl>
+    <w:p>
+      <w:pPr>
+        <w:pStyle w:val="Normal"/>
+        <w:rPr/>
+      </w:pPr>
+      <w:r>
+        <w:rPr/>
+      </w:r>
+    </w:p>
+    <w:p>
+      <w:pPr>
+        <w:pStyle w:val="Heading3"/>
+        <w:rPr/>
+      </w:pPr>
+      <w:r>
+        <w:rPr/>
+        <w:t>4.1.2 Phase 2 Client Registration Form Fields</w:t>
+      </w:r>
+    </w:p>
+    <w:p>
+      <w:pPr>
+        <w:pStyle w:val="Normal"/>
+        <w:spacing w:before="0" w:after="120"/>
+        <w:rPr/>
+      </w:pPr>
+      <w:r>
+        <w:rPr/>
+        <w:t>The following fields are collected via a second form deployed by the mentor at their discretion after assignment. The mentor may send the Phase 2 form link in their initial introduction to the client or after the first session. All fields are optional. All free-text fields support rich text formatting. The EIN Number field is not collected on this form — it is entered directly in the CRM by the mentor if needed.</w:t>
+      </w:r>
+    </w:p>
+    <w:p>
+      <w:pPr>
+        <w:pStyle w:val="Normal"/>
+        <w:rPr/>
+      </w:pPr>
+      <w:r>
+        <w:rPr/>
+      </w:r>
+    </w:p>
+    <w:tbl>
+      <w:tblPr>
+        <w:tblW w:w="9360" w:type="dxa"/>
+        <w:jc w:val="left"/>
+        <w:tblInd w:w="0" w:type="dxa"/>
+        <w:tblLayout w:type="fixed"/>
+        <w:tblCellMar>
+          <w:top w:w="80" w:type="dxa"/>
+          <w:left w:w="120" w:type="dxa"/>
+          <w:bottom w:w="80" w:type="dxa"/>
+          <w:right w:w="120" w:type="dxa"/>
+        </w:tblCellMar>
+      </w:tblPr>
+      <w:tblGrid>
+        <w:gridCol w:w="2200"/>
+        <w:gridCol w:w="1400"/>
+        <w:gridCol w:w="5760"/>
+      </w:tblGrid>
+      <w:tr>
+        <w:trPr>
+          <w:tblHeader w:val="true"/>
+        </w:trPr>
+        <w:tc>
+          <w:tcPr>
+            <w:tcW w:w="2200" w:type="dxa"/>
+            <w:tcBorders>
+              <w:top w:val="single" w:sz="2" w:space="0" w:color="CCCCCC"/>
+              <w:left w:val="single" w:sz="2" w:space="0" w:color="CCCCCC"/>
+              <w:bottom w:val="single" w:sz="2" w:space="0" w:color="CCCCCC"/>
+              <w:right w:val="single" w:sz="2" w:space="0" w:color="CCCCCC"/>
+            </w:tcBorders>
+            <w:shd w:fill="1F4E79" w:val="clear"/>
+          </w:tcPr>
+          <w:p>
+            <w:pPr>
+              <w:pStyle w:val="Normal"/>
+              <w:rPr/>
+            </w:pPr>
+            <w:r>
+              <w:rPr>
+                <w:rFonts w:eastAsia="Arial" w:cs="Arial"/>
+                <w:b/>
+                <w:bCs/>
+                <w:color w:val="FFFFFF"/>
+                <w:sz w:val="18"/>
+                <w:szCs w:val="18"/>
+              </w:rPr>
+              <w:t>Field</w:t>
+            </w:r>
+          </w:p>
+        </w:tc>
+        <w:tc>
+          <w:tcPr>
+            <w:tcW w:w="1400" w:type="dxa"/>
+            <w:tcBorders>
+              <w:top w:val="single" w:sz="2" w:space="0" w:color="CCCCCC"/>
+              <w:left w:val="single" w:sz="2" w:space="0" w:color="CCCCCC"/>
+              <w:bottom w:val="single" w:sz="2" w:space="0" w:color="CCCCCC"/>
+              <w:right w:val="single" w:sz="2" w:space="0" w:color="CCCCCC"/>
+            </w:tcBorders>
+            <w:shd w:fill="1F4E79" w:val="clear"/>
+          </w:tcPr>
+          <w:p>
+            <w:pPr>
+              <w:pStyle w:val="Normal"/>
+              <w:rPr/>
+            </w:pPr>
+            <w:r>
+              <w:rPr>
+                <w:rFonts w:eastAsia="Arial" w:cs="Arial"/>
+                <w:b/>
+                <w:bCs/>
+                <w:color w:val="FFFFFF"/>
+                <w:sz w:val="18"/>
+                <w:szCs w:val="18"/>
+              </w:rPr>
+              <w:t>Populates</w:t>
+            </w:r>
+          </w:p>
+        </w:tc>
+        <w:tc>
+          <w:tcPr>
+            <w:tcW w:w="5760" w:type="dxa"/>
+            <w:tcBorders>
+              <w:top w:val="single" w:sz="2" w:space="0" w:color="CCCCCC"/>
+              <w:left w:val="single" w:sz="2" w:space="0" w:color="CCCCCC"/>
+              <w:bottom w:val="single" w:sz="2" w:space="0" w:color="CCCCCC"/>
+              <w:right w:val="single" w:sz="2" w:space="0" w:color="CCCCCC"/>
+            </w:tcBorders>
+            <w:shd w:fill="1F4E79" w:val="clear"/>
+          </w:tcPr>
+          <w:p>
+            <w:pPr>
+              <w:pStyle w:val="Normal"/>
+              <w:rPr/>
+            </w:pPr>
+            <w:r>
+              <w:rPr>
+                <w:rFonts w:eastAsia="Arial" w:cs="Arial"/>
+                <w:b/>
+                <w:bCs/>
+                <w:color w:val="FFFFFF"/>
+                <w:sz w:val="18"/>
+                <w:szCs w:val="18"/>
+              </w:rPr>
+              <w:t>Description / Notes</w:t>
+            </w:r>
+          </w:p>
+        </w:tc>
+      </w:tr>
+      <w:tr>
+        <w:trPr/>
+        <w:tc>
+          <w:tcPr>
+            <w:tcW w:w="2200" w:type="dxa"/>
+            <w:tcBorders>
+              <w:top w:val="single" w:sz="2" w:space="0" w:color="CCCCCC"/>
+              <w:left w:val="single" w:sz="2" w:space="0" w:color="CCCCCC"/>
+              <w:bottom w:val="single" w:sz="2" w:space="0" w:color="CCCCCC"/>
+              <w:right w:val="single" w:sz="2" w:space="0" w:color="CCCCCC"/>
+            </w:tcBorders>
+            <w:shd w:fill="FFFFFF" w:val="clear"/>
+          </w:tcPr>
+          <w:p>
+            <w:pPr>
+              <w:pStyle w:val="Normal"/>
+              <w:rPr/>
+            </w:pPr>
+            <w:r>
+              <w:rPr>
+                <w:rFonts w:eastAsia="Arial" w:cs="Arial"/>
+                <w:sz w:val="18"/>
+                <w:szCs w:val="18"/>
+              </w:rPr>
+              <w:t>Business Description</w:t>
+            </w:r>
+          </w:p>
+        </w:tc>
+        <w:tc>
+          <w:tcPr>
+            <w:tcW w:w="1400" w:type="dxa"/>
+            <w:tcBorders>
+              <w:top w:val="single" w:sz="2" w:space="0" w:color="CCCCCC"/>
+              <w:left w:val="single" w:sz="2" w:space="0" w:color="CCCCCC"/>
+              <w:bottom w:val="single" w:sz="2" w:space="0" w:color="CCCCCC"/>
+              <w:right w:val="single" w:sz="2" w:space="0" w:color="CCCCCC"/>
+            </w:tcBorders>
+            <w:shd w:fill="FFFFFF" w:val="clear"/>
+          </w:tcPr>
+          <w:p>
+            <w:pPr>
+              <w:pStyle w:val="Normal"/>
+              <w:rPr/>
+            </w:pPr>
+            <w:r>
+              <w:rPr>
+                <w:rFonts w:eastAsia="Arial" w:cs="Arial"/>
+                <w:sz w:val="18"/>
+                <w:szCs w:val="18"/>
+              </w:rPr>
+              <w:t>Company</w:t>
+            </w:r>
+          </w:p>
+        </w:tc>
+        <w:tc>
+          <w:tcPr>
+            <w:tcW w:w="5760" w:type="dxa"/>
+            <w:tcBorders>
+              <w:top w:val="single" w:sz="2" w:space="0" w:color="CCCCCC"/>
+              <w:left w:val="single" w:sz="2" w:space="0" w:color="CCCCCC"/>
+              <w:bottom w:val="single" w:sz="2" w:space="0" w:color="CCCCCC"/>
+              <w:right w:val="single" w:sz="2" w:space="0" w:color="CCCCCC"/>
+            </w:tcBorders>
+            <w:shd w:fill="FFFFFF" w:val="clear"/>
+          </w:tcPr>
+          <w:p>
+            <w:pPr>
+              <w:pStyle w:val="Normal"/>
+              <w:rPr/>
+            </w:pPr>
+            <w:r>
+              <w:rPr>
+                <w:rFonts w:eastAsia="Arial" w:cs="Arial"/>
+                <w:sz w:val="18"/>
+                <w:szCs w:val="18"/>
+              </w:rPr>
+              <w:t>Rich text. Detailed description of what the business does, its history, and founding story.</w:t>
+            </w:r>
+          </w:p>
+        </w:tc>
+      </w:tr>
+      <w:tr>
+        <w:trPr/>
+        <w:tc>
+          <w:tcPr>
+            <w:tcW w:w="2200" w:type="dxa"/>
+            <w:tcBorders>
+              <w:top w:val="single" w:sz="2" w:space="0" w:color="CCCCCC"/>
+              <w:left w:val="single" w:sz="2" w:space="0" w:color="CCCCCC"/>
+              <w:bottom w:val="single" w:sz="2" w:space="0" w:color="CCCCCC"/>
+              <w:right w:val="single" w:sz="2" w:space="0" w:color="CCCCCC"/>
+            </w:tcBorders>
+            <w:shd w:fill="F2F2F2" w:val="clear"/>
+          </w:tcPr>
+          <w:p>
+            <w:pPr>
+              <w:pStyle w:val="Normal"/>
+              <w:rPr/>
+            </w:pPr>
+            <w:r>
+              <w:rPr>
+                <w:rFonts w:eastAsia="Arial" w:cs="Arial"/>
+                <w:sz w:val="18"/>
+                <w:szCs w:val="18"/>
+              </w:rPr>
+              <w:t>Time in Operation</w:t>
+            </w:r>
+          </w:p>
+        </w:tc>
+        <w:tc>
+          <w:tcPr>
+            <w:tcW w:w="1400" w:type="dxa"/>
+            <w:tcBorders>
+              <w:top w:val="single" w:sz="2" w:space="0" w:color="CCCCCC"/>
+              <w:left w:val="single" w:sz="2" w:space="0" w:color="CCCCCC"/>
+              <w:bottom w:val="single" w:sz="2" w:space="0" w:color="CCCCCC"/>
+              <w:right w:val="single" w:sz="2" w:space="0" w:color="CCCCCC"/>
+            </w:tcBorders>
+            <w:shd w:fill="F2F2F2" w:val="clear"/>
+          </w:tcPr>
+          <w:p>
+            <w:pPr>
+              <w:pStyle w:val="Normal"/>
+              <w:rPr/>
+            </w:pPr>
+            <w:r>
+              <w:rPr>
+                <w:rFonts w:eastAsia="Arial" w:cs="Arial"/>
+                <w:sz w:val="18"/>
+                <w:szCs w:val="18"/>
+              </w:rPr>
+              <w:t>Company</w:t>
+            </w:r>
+          </w:p>
+        </w:tc>
+        <w:tc>
+          <w:tcPr>
+            <w:tcW w:w="5760" w:type="dxa"/>
+            <w:tcBorders>
+              <w:top w:val="single" w:sz="2" w:space="0" w:color="CCCCCC"/>
+              <w:left w:val="single" w:sz="2" w:space="0" w:color="CCCCCC"/>
+              <w:bottom w:val="single" w:sz="2" w:space="0" w:color="CCCCCC"/>
+              <w:right w:val="single" w:sz="2" w:space="0" w:color="CCCCCC"/>
+            </w:tcBorders>
+            <w:shd w:fill="F2F2F2" w:val="clear"/>
+          </w:tcPr>
+          <w:p>
+            <w:pPr>
+              <w:pStyle w:val="Normal"/>
+              <w:rPr/>
+            </w:pPr>
+            <w:r>
+              <w:rPr>
+                <w:rFonts w:eastAsia="Arial" w:cs="Arial"/>
+                <w:sz w:val="18"/>
+                <w:szCs w:val="18"/>
+              </w:rPr>
+              <w:t>Dropdown or date field. How long the business has been operating.</w:t>
+            </w:r>
+          </w:p>
+        </w:tc>
+      </w:tr>
+      <w:tr>
+        <w:trPr/>
+        <w:tc>
+          <w:tcPr>
+            <w:tcW w:w="2200" w:type="dxa"/>
+            <w:tcBorders>
+              <w:top w:val="single" w:sz="2" w:space="0" w:color="CCCCCC"/>
+              <w:left w:val="single" w:sz="2" w:space="0" w:color="CCCCCC"/>
+              <w:bottom w:val="single" w:sz="2" w:space="0" w:color="CCCCCC"/>
+              <w:right w:val="single" w:sz="2" w:space="0" w:color="CCCCCC"/>
+            </w:tcBorders>
+            <w:shd w:fill="FFFFFF" w:val="clear"/>
+          </w:tcPr>
+          <w:p>
+            <w:pPr>
+              <w:pStyle w:val="Normal"/>
+              <w:rPr/>
+            </w:pPr>
+            <w:r>
+              <w:rPr>
+                <w:rFonts w:eastAsia="Arial" w:cs="Arial"/>
+                <w:sz w:val="18"/>
+                <w:szCs w:val="18"/>
+              </w:rPr>
+              <w:t>Current Team Size</w:t>
+            </w:r>
+          </w:p>
+        </w:tc>
+        <w:tc>
+          <w:tcPr>
+            <w:tcW w:w="1400" w:type="dxa"/>
+            <w:tcBorders>
+              <w:top w:val="single" w:sz="2" w:space="0" w:color="CCCCCC"/>
+              <w:left w:val="single" w:sz="2" w:space="0" w:color="CCCCCC"/>
+              <w:bottom w:val="single" w:sz="2" w:space="0" w:color="CCCCCC"/>
+              <w:right w:val="single" w:sz="2" w:space="0" w:color="CCCCCC"/>
+            </w:tcBorders>
+            <w:shd w:fill="FFFFFF" w:val="clear"/>
+          </w:tcPr>
+          <w:p>
+            <w:pPr>
+              <w:pStyle w:val="Normal"/>
+              <w:rPr/>
+            </w:pPr>
+            <w:r>
+              <w:rPr>
+                <w:rFonts w:eastAsia="Arial" w:cs="Arial"/>
+                <w:sz w:val="18"/>
+                <w:szCs w:val="18"/>
+              </w:rPr>
+              <w:t>Company</w:t>
+            </w:r>
+          </w:p>
+        </w:tc>
+        <w:tc>
+          <w:tcPr>
+            <w:tcW w:w="5760" w:type="dxa"/>
+            <w:tcBorders>
+              <w:top w:val="single" w:sz="2" w:space="0" w:color="CCCCCC"/>
+              <w:left w:val="single" w:sz="2" w:space="0" w:color="CCCCCC"/>
+              <w:bottom w:val="single" w:sz="2" w:space="0" w:color="CCCCCC"/>
+              <w:right w:val="single" w:sz="2" w:space="0" w:color="CCCCCC"/>
+            </w:tcBorders>
+            <w:shd w:fill="FFFFFF" w:val="clear"/>
+          </w:tcPr>
+          <w:p>
+            <w:pPr>
+              <w:pStyle w:val="Normal"/>
+              <w:rPr/>
+            </w:pPr>
+            <w:r>
+              <w:rPr>
+                <w:rFonts w:eastAsia="Arial" w:cs="Arial"/>
+                <w:sz w:val="18"/>
+                <w:szCs w:val="18"/>
+              </w:rPr>
+              <w:t>Number field. Number of current employees or team members.</w:t>
+            </w:r>
+          </w:p>
+        </w:tc>
+      </w:tr>
+      <w:tr>
+        <w:trPr/>
+        <w:tc>
+          <w:tcPr>
+            <w:tcW w:w="2200" w:type="dxa"/>
+            <w:tcBorders>
+              <w:top w:val="single" w:sz="2" w:space="0" w:color="CCCCCC"/>
+              <w:left w:val="single" w:sz="2" w:space="0" w:color="CCCCCC"/>
+              <w:bottom w:val="single" w:sz="2" w:space="0" w:color="CCCCCC"/>
+              <w:right w:val="single" w:sz="2" w:space="0" w:color="CCCCCC"/>
+            </w:tcBorders>
+            <w:shd w:fill="F2F2F2" w:val="clear"/>
+          </w:tcPr>
+          <w:p>
+            <w:pPr>
+              <w:pStyle w:val="Normal"/>
+              <w:rPr/>
+            </w:pPr>
+            <w:r>
+              <w:rPr>
+                <w:rFonts w:eastAsia="Arial" w:cs="Arial"/>
+                <w:sz w:val="18"/>
+                <w:szCs w:val="18"/>
+              </w:rPr>
+              <w:t>Revenue Range</w:t>
+            </w:r>
+          </w:p>
+        </w:tc>
+        <w:tc>
+          <w:tcPr>
+            <w:tcW w:w="1400" w:type="dxa"/>
+            <w:tcBorders>
+              <w:top w:val="single" w:sz="2" w:space="0" w:color="CCCCCC"/>
+              <w:left w:val="single" w:sz="2" w:space="0" w:color="CCCCCC"/>
+              <w:bottom w:val="single" w:sz="2" w:space="0" w:color="CCCCCC"/>
+              <w:right w:val="single" w:sz="2" w:space="0" w:color="CCCCCC"/>
+            </w:tcBorders>
+            <w:shd w:fill="F2F2F2" w:val="clear"/>
+          </w:tcPr>
+          <w:p>
+            <w:pPr>
+              <w:pStyle w:val="Normal"/>
+              <w:rPr/>
+            </w:pPr>
+            <w:r>
+              <w:rPr>
+                <w:rFonts w:eastAsia="Arial" w:cs="Arial"/>
+                <w:sz w:val="18"/>
+                <w:szCs w:val="18"/>
+              </w:rPr>
+              <w:t>Company</w:t>
+            </w:r>
+          </w:p>
+        </w:tc>
+        <w:tc>
+          <w:tcPr>
+            <w:tcW w:w="5760" w:type="dxa"/>
+            <w:tcBorders>
+              <w:top w:val="single" w:sz="2" w:space="0" w:color="CCCCCC"/>
+              <w:left w:val="single" w:sz="2" w:space="0" w:color="CCCCCC"/>
+              <w:bottom w:val="single" w:sz="2" w:space="0" w:color="CCCCCC"/>
+              <w:right w:val="single" w:sz="2" w:space="0" w:color="CCCCCC"/>
+            </w:tcBorders>
+            <w:shd w:fill="F2F2F2" w:val="clear"/>
+          </w:tcPr>
+          <w:p>
+            <w:pPr>
+              <w:pStyle w:val="Normal"/>
+              <w:rPr/>
+            </w:pPr>
+            <w:r>
+              <w:rPr>
+                <w:rFonts w:eastAsia="Arial" w:cs="Arial"/>
+                <w:sz w:val="18"/>
+                <w:szCs w:val="18"/>
+              </w:rPr>
+              <w:t>Dropdown with ranges (TBD). Approximate annual revenue range.</w:t>
+            </w:r>
+          </w:p>
+        </w:tc>
+      </w:tr>
+      <w:tr>
+        <w:trPr/>
+        <w:tc>
+          <w:tcPr>
+            <w:tcW w:w="2200" w:type="dxa"/>
+            <w:tcBorders>
+              <w:top w:val="single" w:sz="2" w:space="0" w:color="CCCCCC"/>
+              <w:left w:val="single" w:sz="2" w:space="0" w:color="CCCCCC"/>
+              <w:bottom w:val="single" w:sz="2" w:space="0" w:color="CCCCCC"/>
+              <w:right w:val="single" w:sz="2" w:space="0" w:color="CCCCCC"/>
+            </w:tcBorders>
+            <w:shd w:fill="FFFFFF" w:val="clear"/>
+          </w:tcPr>
+          <w:p>
+            <w:pPr>
+              <w:pStyle w:val="Normal"/>
+              <w:rPr/>
+            </w:pPr>
+            <w:r>
+              <w:rPr>
+                <w:rFonts w:eastAsia="Arial" w:cs="Arial"/>
+                <w:sz w:val="18"/>
+                <w:szCs w:val="18"/>
+              </w:rPr>
+              <w:t>Funding Situation</w:t>
+            </w:r>
+          </w:p>
+        </w:tc>
+        <w:tc>
+          <w:tcPr>
+            <w:tcW w:w="1400" w:type="dxa"/>
+            <w:tcBorders>
+              <w:top w:val="single" w:sz="2" w:space="0" w:color="CCCCCC"/>
+              <w:left w:val="single" w:sz="2" w:space="0" w:color="CCCCCC"/>
+              <w:bottom w:val="single" w:sz="2" w:space="0" w:color="CCCCCC"/>
+              <w:right w:val="single" w:sz="2" w:space="0" w:color="CCCCCC"/>
+            </w:tcBorders>
+            <w:shd w:fill="FFFFFF" w:val="clear"/>
+          </w:tcPr>
+          <w:p>
+            <w:pPr>
+              <w:pStyle w:val="Normal"/>
+              <w:rPr/>
+            </w:pPr>
+            <w:r>
+              <w:rPr>
+                <w:rFonts w:eastAsia="Arial" w:cs="Arial"/>
+                <w:sz w:val="18"/>
+                <w:szCs w:val="18"/>
+              </w:rPr>
+              <w:t>Company</w:t>
+            </w:r>
+          </w:p>
+        </w:tc>
+        <w:tc>
+          <w:tcPr>
+            <w:tcW w:w="5760" w:type="dxa"/>
+            <w:tcBorders>
+              <w:top w:val="single" w:sz="2" w:space="0" w:color="CCCCCC"/>
+              <w:left w:val="single" w:sz="2" w:space="0" w:color="CCCCCC"/>
+              <w:bottom w:val="single" w:sz="2" w:space="0" w:color="CCCCCC"/>
+              <w:right w:val="single" w:sz="2" w:space="0" w:color="CCCCCC"/>
+            </w:tcBorders>
+            <w:shd w:fill="FFFFFF" w:val="clear"/>
+          </w:tcPr>
+          <w:p>
+            <w:pPr>
+              <w:pStyle w:val="Normal"/>
+              <w:rPr/>
+            </w:pPr>
+            <w:r>
+              <w:rPr>
+                <w:rFonts w:eastAsia="Arial" w:cs="Arial"/>
+                <w:sz w:val="18"/>
+                <w:szCs w:val="18"/>
+              </w:rPr>
+              <w:t>Rich text. Description of current funding sources or needs.</w:t>
+            </w:r>
+          </w:p>
+        </w:tc>
+      </w:tr>
+      <w:tr>
+        <w:trPr/>
+        <w:tc>
+          <w:tcPr>
+            <w:tcW w:w="2200" w:type="dxa"/>
+            <w:tcBorders>
+              <w:top w:val="single" w:sz="2" w:space="0" w:color="CCCCCC"/>
+              <w:left w:val="single" w:sz="2" w:space="0" w:color="CCCCCC"/>
+              <w:bottom w:val="single" w:sz="2" w:space="0" w:color="CCCCCC"/>
+              <w:right w:val="single" w:sz="2" w:space="0" w:color="CCCCCC"/>
+            </w:tcBorders>
+            <w:shd w:fill="F2F2F2" w:val="clear"/>
+          </w:tcPr>
+          <w:p>
+            <w:pPr>
+              <w:pStyle w:val="Normal"/>
+              <w:rPr/>
+            </w:pPr>
+            <w:r>
+              <w:rPr>
+                <w:rFonts w:eastAsia="Arial" w:cs="Arial"/>
+                <w:sz w:val="18"/>
+                <w:szCs w:val="18"/>
+              </w:rPr>
+              <w:t>Current Challenges</w:t>
+            </w:r>
+          </w:p>
+        </w:tc>
+        <w:tc>
+          <w:tcPr>
+            <w:tcW w:w="1400" w:type="dxa"/>
+            <w:tcBorders>
+              <w:top w:val="single" w:sz="2" w:space="0" w:color="CCCCCC"/>
+              <w:left w:val="single" w:sz="2" w:space="0" w:color="CCCCCC"/>
+              <w:bottom w:val="single" w:sz="2" w:space="0" w:color="CCCCCC"/>
+              <w:right w:val="single" w:sz="2" w:space="0" w:color="CCCCCC"/>
+            </w:tcBorders>
+            <w:shd w:fill="F2F2F2" w:val="clear"/>
+          </w:tcPr>
+          <w:p>
+            <w:pPr>
+              <w:pStyle w:val="Normal"/>
+              <w:rPr/>
+            </w:pPr>
+            <w:r>
+              <w:rPr>
+                <w:rFonts w:eastAsia="Arial" w:cs="Arial"/>
+                <w:sz w:val="18"/>
+                <w:szCs w:val="18"/>
+              </w:rPr>
+              <w:t>Company</w:t>
+            </w:r>
+          </w:p>
+        </w:tc>
+        <w:tc>
+          <w:tcPr>
+            <w:tcW w:w="5760" w:type="dxa"/>
+            <w:tcBorders>
+              <w:top w:val="single" w:sz="2" w:space="0" w:color="CCCCCC"/>
+              <w:left w:val="single" w:sz="2" w:space="0" w:color="CCCCCC"/>
+              <w:bottom w:val="single" w:sz="2" w:space="0" w:color="CCCCCC"/>
+              <w:right w:val="single" w:sz="2" w:space="0" w:color="CCCCCC"/>
+            </w:tcBorders>
+            <w:shd w:fill="F2F2F2" w:val="clear"/>
+          </w:tcPr>
+          <w:p>
+            <w:pPr>
+              <w:pStyle w:val="Normal"/>
+              <w:rPr/>
+            </w:pPr>
+            <w:r>
+              <w:rPr>
+                <w:rFonts w:eastAsia="Arial" w:cs="Arial"/>
+                <w:sz w:val="18"/>
+                <w:szCs w:val="18"/>
+              </w:rPr>
+              <w:t>Rich text. Primary obstacles the business is currently facing.</w:t>
+            </w:r>
+          </w:p>
+        </w:tc>
+      </w:tr>
+      <w:tr>
+        <w:trPr/>
+        <w:tc>
+          <w:tcPr>
+            <w:tcW w:w="2200" w:type="dxa"/>
+            <w:tcBorders>
+              <w:top w:val="single" w:sz="2" w:space="0" w:color="CCCCCC"/>
+              <w:left w:val="single" w:sz="2" w:space="0" w:color="CCCCCC"/>
+              <w:bottom w:val="single" w:sz="2" w:space="0" w:color="CCCCCC"/>
+              <w:right w:val="single" w:sz="2" w:space="0" w:color="CCCCCC"/>
+            </w:tcBorders>
+            <w:shd w:fill="FFFFFF" w:val="clear"/>
+          </w:tcPr>
+          <w:p>
+            <w:pPr>
+              <w:pStyle w:val="Normal"/>
+              <w:rPr/>
+            </w:pPr>
+            <w:r>
+              <w:rPr>
+                <w:rFonts w:eastAsia="Arial" w:cs="Arial"/>
+                <w:sz w:val="18"/>
+                <w:szCs w:val="18"/>
+              </w:rPr>
+              <w:t>Goals and Objectives</w:t>
+            </w:r>
+          </w:p>
+        </w:tc>
+        <w:tc>
+          <w:tcPr>
+            <w:tcW w:w="1400" w:type="dxa"/>
+            <w:tcBorders>
+              <w:top w:val="single" w:sz="2" w:space="0" w:color="CCCCCC"/>
+              <w:left w:val="single" w:sz="2" w:space="0" w:color="CCCCCC"/>
+              <w:bottom w:val="single" w:sz="2" w:space="0" w:color="CCCCCC"/>
+              <w:right w:val="single" w:sz="2" w:space="0" w:color="CCCCCC"/>
+            </w:tcBorders>
+            <w:shd w:fill="FFFFFF" w:val="clear"/>
+          </w:tcPr>
+          <w:p>
+            <w:pPr>
+              <w:pStyle w:val="Normal"/>
+              <w:rPr/>
+            </w:pPr>
+            <w:r>
+              <w:rPr>
+                <w:rFonts w:eastAsia="Arial" w:cs="Arial"/>
+                <w:sz w:val="18"/>
+                <w:szCs w:val="18"/>
+              </w:rPr>
+              <w:t>Company</w:t>
+            </w:r>
+          </w:p>
+        </w:tc>
+        <w:tc>
+          <w:tcPr>
+            <w:tcW w:w="5760" w:type="dxa"/>
+            <w:tcBorders>
+              <w:top w:val="single" w:sz="2" w:space="0" w:color="CCCCCC"/>
+              <w:left w:val="single" w:sz="2" w:space="0" w:color="CCCCCC"/>
+              <w:bottom w:val="single" w:sz="2" w:space="0" w:color="CCCCCC"/>
+              <w:right w:val="single" w:sz="2" w:space="0" w:color="CCCCCC"/>
+            </w:tcBorders>
+            <w:shd w:fill="FFFFFF" w:val="clear"/>
+          </w:tcPr>
+          <w:p>
+            <w:pPr>
+              <w:pStyle w:val="Normal"/>
+              <w:rPr/>
+            </w:pPr>
+            <w:r>
+              <w:rPr>
+                <w:rFonts w:eastAsia="Arial" w:cs="Arial"/>
+                <w:sz w:val="18"/>
+                <w:szCs w:val="18"/>
+              </w:rPr>
+              <w:t>Rich text. What the client wants to achieve through the mentoring engagement.</w:t>
+            </w:r>
+          </w:p>
+        </w:tc>
+      </w:tr>
+      <w:tr>
+        <w:trPr/>
+        <w:tc>
+          <w:tcPr>
+            <w:tcW w:w="2200" w:type="dxa"/>
+            <w:tcBorders>
+              <w:top w:val="single" w:sz="2" w:space="0" w:color="CCCCCC"/>
+              <w:left w:val="single" w:sz="2" w:space="0" w:color="CCCCCC"/>
+              <w:bottom w:val="single" w:sz="2" w:space="0" w:color="CCCCCC"/>
+              <w:right w:val="single" w:sz="2" w:space="0" w:color="CCCCCC"/>
+            </w:tcBorders>
+            <w:shd w:fill="F2F2F2" w:val="clear"/>
+          </w:tcPr>
+          <w:p>
+            <w:pPr>
+              <w:pStyle w:val="Normal"/>
+              <w:rPr/>
+            </w:pPr>
+            <w:r>
+              <w:rPr>
+                <w:rFonts w:eastAsia="Arial" w:cs="Arial"/>
+                <w:sz w:val="18"/>
+                <w:szCs w:val="18"/>
+              </w:rPr>
+              <w:t>Desired Outcomes (6-12 Months)</w:t>
+            </w:r>
+          </w:p>
+        </w:tc>
+        <w:tc>
+          <w:tcPr>
+            <w:tcW w:w="1400" w:type="dxa"/>
+            <w:tcBorders>
+              <w:top w:val="single" w:sz="2" w:space="0" w:color="CCCCCC"/>
+              <w:left w:val="single" w:sz="2" w:space="0" w:color="CCCCCC"/>
+              <w:bottom w:val="single" w:sz="2" w:space="0" w:color="CCCCCC"/>
+              <w:right w:val="single" w:sz="2" w:space="0" w:color="CCCCCC"/>
+            </w:tcBorders>
+            <w:shd w:fill="F2F2F2" w:val="clear"/>
+          </w:tcPr>
+          <w:p>
+            <w:pPr>
+              <w:pStyle w:val="Normal"/>
+              <w:rPr/>
+            </w:pPr>
+            <w:r>
+              <w:rPr>
+                <w:rFonts w:eastAsia="Arial" w:cs="Arial"/>
+                <w:sz w:val="18"/>
+                <w:szCs w:val="18"/>
+              </w:rPr>
+              <w:t>Company</w:t>
+            </w:r>
+          </w:p>
+        </w:tc>
+        <w:tc>
+          <w:tcPr>
+            <w:tcW w:w="5760" w:type="dxa"/>
+            <w:tcBorders>
+              <w:top w:val="single" w:sz="2" w:space="0" w:color="CCCCCC"/>
+              <w:left w:val="single" w:sz="2" w:space="0" w:color="CCCCCC"/>
+              <w:bottom w:val="single" w:sz="2" w:space="0" w:color="CCCCCC"/>
+              <w:right w:val="single" w:sz="2" w:space="0" w:color="CCCCCC"/>
+            </w:tcBorders>
+            <w:shd w:fill="F2F2F2" w:val="clear"/>
+          </w:tcPr>
+          <w:p>
+            <w:pPr>
+              <w:pStyle w:val="Normal"/>
+              <w:rPr/>
+            </w:pPr>
+            <w:r>
+              <w:rPr>
+                <w:rFonts w:eastAsia="Arial" w:cs="Arial"/>
+                <w:sz w:val="18"/>
+                <w:szCs w:val="18"/>
+              </w:rPr>
+              <w:t>Rich text. Specific outcomes the client hopes to achieve in the near term.</w:t>
+            </w:r>
+          </w:p>
+        </w:tc>
+      </w:tr>
+      <w:tr>
+        <w:trPr/>
+        <w:tc>
+          <w:tcPr>
+            <w:tcW w:w="2200" w:type="dxa"/>
+            <w:tcBorders>
+              <w:top w:val="single" w:sz="2" w:space="0" w:color="CCCCCC"/>
+              <w:left w:val="single" w:sz="2" w:space="0" w:color="CCCCCC"/>
+              <w:bottom w:val="single" w:sz="2" w:space="0" w:color="CCCCCC"/>
+              <w:right w:val="single" w:sz="2" w:space="0" w:color="CCCCCC"/>
+            </w:tcBorders>
+            <w:shd w:fill="FFFFFF" w:val="clear"/>
+          </w:tcPr>
+          <w:p>
+            <w:pPr>
+              <w:pStyle w:val="Normal"/>
+              <w:rPr/>
+            </w:pPr>
+            <w:r>
+              <w:rPr>
+                <w:rFonts w:eastAsia="Arial" w:cs="Arial"/>
+                <w:sz w:val="18"/>
+                <w:szCs w:val="18"/>
+              </w:rPr>
+              <w:t>Previous Mentoring / Advisory Experience</w:t>
+            </w:r>
+          </w:p>
+        </w:tc>
+        <w:tc>
+          <w:tcPr>
+            <w:tcW w:w="1400" w:type="dxa"/>
+            <w:tcBorders>
+              <w:top w:val="single" w:sz="2" w:space="0" w:color="CCCCCC"/>
+              <w:left w:val="single" w:sz="2" w:space="0" w:color="CCCCCC"/>
+              <w:bottom w:val="single" w:sz="2" w:space="0" w:color="CCCCCC"/>
+              <w:right w:val="single" w:sz="2" w:space="0" w:color="CCCCCC"/>
+            </w:tcBorders>
+            <w:shd w:fill="FFFFFF" w:val="clear"/>
+          </w:tcPr>
+          <w:p>
+            <w:pPr>
+              <w:pStyle w:val="Normal"/>
+              <w:rPr/>
+            </w:pPr>
+            <w:r>
+              <w:rPr>
+                <w:rFonts w:eastAsia="Arial" w:cs="Arial"/>
+                <w:sz w:val="18"/>
+                <w:szCs w:val="18"/>
+              </w:rPr>
+              <w:t>Company</w:t>
+            </w:r>
+          </w:p>
+        </w:tc>
+        <w:tc>
+          <w:tcPr>
+            <w:tcW w:w="5760" w:type="dxa"/>
+            <w:tcBorders>
+              <w:top w:val="single" w:sz="2" w:space="0" w:color="CCCCCC"/>
+              <w:left w:val="single" w:sz="2" w:space="0" w:color="CCCCCC"/>
+              <w:bottom w:val="single" w:sz="2" w:space="0" w:color="CCCCCC"/>
+              <w:right w:val="single" w:sz="2" w:space="0" w:color="CCCCCC"/>
+            </w:tcBorders>
+            <w:shd w:fill="FFFFFF" w:val="clear"/>
+          </w:tcPr>
+          <w:p>
+            <w:pPr>
+              <w:pStyle w:val="Normal"/>
+              <w:rPr/>
+            </w:pPr>
+            <w:r>
+              <w:rPr>
+                <w:rFonts w:eastAsia="Arial" w:cs="Arial"/>
+                <w:sz w:val="18"/>
+                <w:szCs w:val="18"/>
+              </w:rPr>
+              <w:t>Rich text. Whether the client has worked with a mentor or advisor before, and any relevant context.</w:t>
+            </w:r>
+          </w:p>
+        </w:tc>
+      </w:tr>
+      <w:tr>
+        <w:trPr/>
+        <w:tc>
+          <w:tcPr>
+            <w:tcW w:w="2200" w:type="dxa"/>
+            <w:tcBorders>
+              <w:top w:val="single" w:sz="2" w:space="0" w:color="CCCCCC"/>
+              <w:left w:val="single" w:sz="2" w:space="0" w:color="CCCCCC"/>
+              <w:bottom w:val="single" w:sz="2" w:space="0" w:color="CCCCCC"/>
+              <w:right w:val="single" w:sz="2" w:space="0" w:color="CCCCCC"/>
+            </w:tcBorders>
+            <w:shd w:fill="F2F2F2" w:val="clear"/>
+          </w:tcPr>
+          <w:p>
+            <w:pPr>
+              <w:pStyle w:val="Normal"/>
+              <w:rPr/>
+            </w:pPr>
+            <w:r>
+              <w:rPr>
+                <w:rFonts w:eastAsia="Arial" w:cs="Arial"/>
+                <w:sz w:val="18"/>
+                <w:szCs w:val="18"/>
+              </w:rPr>
+              <w:t>Current Professional Advisors</w:t>
+            </w:r>
+          </w:p>
+        </w:tc>
+        <w:tc>
+          <w:tcPr>
+            <w:tcW w:w="1400" w:type="dxa"/>
+            <w:tcBorders>
+              <w:top w:val="single" w:sz="2" w:space="0" w:color="CCCCCC"/>
+              <w:left w:val="single" w:sz="2" w:space="0" w:color="CCCCCC"/>
+              <w:bottom w:val="single" w:sz="2" w:space="0" w:color="CCCCCC"/>
+              <w:right w:val="single" w:sz="2" w:space="0" w:color="CCCCCC"/>
+            </w:tcBorders>
+            <w:shd w:fill="F2F2F2" w:val="clear"/>
+          </w:tcPr>
+          <w:p>
+            <w:pPr>
+              <w:pStyle w:val="Normal"/>
+              <w:rPr/>
+            </w:pPr>
+            <w:r>
+              <w:rPr>
+                <w:rFonts w:eastAsia="Arial" w:cs="Arial"/>
+                <w:sz w:val="18"/>
+                <w:szCs w:val="18"/>
+              </w:rPr>
+              <w:t>Company</w:t>
+            </w:r>
+          </w:p>
+        </w:tc>
+        <w:tc>
+          <w:tcPr>
+            <w:tcW w:w="5760" w:type="dxa"/>
+            <w:tcBorders>
+              <w:top w:val="single" w:sz="2" w:space="0" w:color="CCCCCC"/>
+              <w:left w:val="single" w:sz="2" w:space="0" w:color="CCCCCC"/>
+              <w:bottom w:val="single" w:sz="2" w:space="0" w:color="CCCCCC"/>
+              <w:right w:val="single" w:sz="2" w:space="0" w:color="CCCCCC"/>
+            </w:tcBorders>
+            <w:shd w:fill="F2F2F2" w:val="clear"/>
+          </w:tcPr>
+          <w:p>
+            <w:pPr>
+              <w:pStyle w:val="Normal"/>
+              <w:rPr/>
+            </w:pPr>
+            <w:r>
+              <w:rPr>
+                <w:rFonts w:eastAsia="Arial" w:cs="Arial"/>
+                <w:sz w:val="18"/>
+                <w:szCs w:val="18"/>
+              </w:rPr>
+              <w:t>Multi-select checklist. Values: Banker / Financial Institution | Attorney / Legal Counsel | Accountant / CPA | IT Consultant | Insurance Agent | Marketing / PR Consultant | Business Coach.</w:t>
+            </w:r>
+          </w:p>
+        </w:tc>
+      </w:tr>
+      <w:tr>
+        <w:trPr/>
+        <w:tc>
+          <w:tcPr>
+            <w:tcW w:w="2200" w:type="dxa"/>
+            <w:tcBorders>
+              <w:top w:val="single" w:sz="2" w:space="0" w:color="CCCCCC"/>
+              <w:left w:val="single" w:sz="2" w:space="0" w:color="CCCCCC"/>
+              <w:bottom w:val="single" w:sz="2" w:space="0" w:color="CCCCCC"/>
+              <w:right w:val="single" w:sz="2" w:space="0" w:color="CCCCCC"/>
+            </w:tcBorders>
+            <w:shd w:fill="FFFFFF" w:val="clear"/>
+          </w:tcPr>
+          <w:p>
+            <w:pPr>
+              <w:pStyle w:val="Normal"/>
+              <w:rPr/>
+            </w:pPr>
+            <w:r>
+              <w:rPr>
+                <w:rFonts w:eastAsia="Arial" w:cs="Arial"/>
+                <w:sz w:val="18"/>
+                <w:szCs w:val="18"/>
+              </w:rPr>
+              <w:t>Registered with State</w:t>
+            </w:r>
+          </w:p>
+        </w:tc>
+        <w:tc>
+          <w:tcPr>
+            <w:tcW w:w="1400" w:type="dxa"/>
+            <w:tcBorders>
+              <w:top w:val="single" w:sz="2" w:space="0" w:color="CCCCCC"/>
+              <w:left w:val="single" w:sz="2" w:space="0" w:color="CCCCCC"/>
+              <w:bottom w:val="single" w:sz="2" w:space="0" w:color="CCCCCC"/>
+              <w:right w:val="single" w:sz="2" w:space="0" w:color="CCCCCC"/>
+            </w:tcBorders>
+            <w:shd w:fill="FFFFFF" w:val="clear"/>
+          </w:tcPr>
+          <w:p>
+            <w:pPr>
+              <w:pStyle w:val="Normal"/>
+              <w:rPr/>
+            </w:pPr>
+            <w:r>
+              <w:rPr>
+                <w:rFonts w:eastAsia="Arial" w:cs="Arial"/>
+                <w:sz w:val="18"/>
+                <w:szCs w:val="18"/>
+              </w:rPr>
+              <w:t>Company</w:t>
+            </w:r>
+          </w:p>
+        </w:tc>
+        <w:tc>
+          <w:tcPr>
+            <w:tcW w:w="5760" w:type="dxa"/>
+            <w:tcBorders>
+              <w:top w:val="single" w:sz="2" w:space="0" w:color="CCCCCC"/>
+              <w:left w:val="single" w:sz="2" w:space="0" w:color="CCCCCC"/>
+              <w:bottom w:val="single" w:sz="2" w:space="0" w:color="CCCCCC"/>
+              <w:right w:val="single" w:sz="2" w:space="0" w:color="CCCCCC"/>
+            </w:tcBorders>
+            <w:shd w:fill="FFFFFF" w:val="clear"/>
+          </w:tcPr>
+          <w:p>
+            <w:pPr>
+              <w:pStyle w:val="Normal"/>
+              <w:rPr/>
+            </w:pPr>
+            <w:r>
+              <w:rPr>
+                <w:rFonts w:eastAsia="Arial" w:cs="Arial"/>
+                <w:sz w:val="18"/>
+                <w:szCs w:val="18"/>
+              </w:rPr>
+              <w:t>Yes/No. Whether the business has filed with the state as an official legal entity.</w:t>
+            </w:r>
+          </w:p>
+        </w:tc>
+      </w:tr>
+      <w:tr>
+        <w:trPr/>
+        <w:tc>
+          <w:tcPr>
+            <w:tcW w:w="2200" w:type="dxa"/>
+            <w:tcBorders>
+              <w:top w:val="single" w:sz="2" w:space="0" w:color="CCCCCC"/>
+              <w:left w:val="single" w:sz="2" w:space="0" w:color="CCCCCC"/>
+              <w:bottom w:val="single" w:sz="2" w:space="0" w:color="CCCCCC"/>
+              <w:right w:val="single" w:sz="2" w:space="0" w:color="CCCCCC"/>
+            </w:tcBorders>
+            <w:shd w:fill="F2F2F2" w:val="clear"/>
+          </w:tcPr>
+          <w:p>
+            <w:pPr>
+              <w:pStyle w:val="Normal"/>
+              <w:rPr/>
+            </w:pPr>
+            <w:r>
+              <w:rPr>
+                <w:rFonts w:eastAsia="Arial" w:cs="Arial"/>
+                <w:sz w:val="18"/>
+                <w:szCs w:val="18"/>
+              </w:rPr>
+              <w:t>State of Registration</w:t>
+            </w:r>
+          </w:p>
+        </w:tc>
+        <w:tc>
+          <w:tcPr>
+            <w:tcW w:w="1400" w:type="dxa"/>
+            <w:tcBorders>
+              <w:top w:val="single" w:sz="2" w:space="0" w:color="CCCCCC"/>
+              <w:left w:val="single" w:sz="2" w:space="0" w:color="CCCCCC"/>
+              <w:bottom w:val="single" w:sz="2" w:space="0" w:color="CCCCCC"/>
+              <w:right w:val="single" w:sz="2" w:space="0" w:color="CCCCCC"/>
+            </w:tcBorders>
+            <w:shd w:fill="F2F2F2" w:val="clear"/>
+          </w:tcPr>
+          <w:p>
+            <w:pPr>
+              <w:pStyle w:val="Normal"/>
+              <w:rPr/>
+            </w:pPr>
+            <w:r>
+              <w:rPr>
+                <w:rFonts w:eastAsia="Arial" w:cs="Arial"/>
+                <w:sz w:val="18"/>
+                <w:szCs w:val="18"/>
+              </w:rPr>
+              <w:t>Company</w:t>
+            </w:r>
+          </w:p>
+        </w:tc>
+        <w:tc>
+          <w:tcPr>
+            <w:tcW w:w="5760" w:type="dxa"/>
+            <w:tcBorders>
+              <w:top w:val="single" w:sz="2" w:space="0" w:color="CCCCCC"/>
+              <w:left w:val="single" w:sz="2" w:space="0" w:color="CCCCCC"/>
+              <w:bottom w:val="single" w:sz="2" w:space="0" w:color="CCCCCC"/>
+              <w:right w:val="single" w:sz="2" w:space="0" w:color="CCCCCC"/>
+            </w:tcBorders>
+            <w:shd w:fill="F2F2F2" w:val="clear"/>
+          </w:tcPr>
+          <w:p>
+            <w:pPr>
+              <w:pStyle w:val="Normal"/>
+              <w:rPr/>
+            </w:pPr>
+            <w:r>
+              <w:rPr>
+                <w:rFonts w:eastAsia="Arial" w:cs="Arial"/>
+                <w:sz w:val="18"/>
+                <w:szCs w:val="18"/>
+              </w:rPr>
+              <w:t>Dropdown of US states. Shown when Registered with State = Yes.</w:t>
+            </w:r>
+          </w:p>
+        </w:tc>
+      </w:tr>
+      <w:tr>
+        <w:trPr/>
+        <w:tc>
+          <w:tcPr>
+            <w:tcW w:w="2200" w:type="dxa"/>
+            <w:tcBorders>
+              <w:top w:val="single" w:sz="2" w:space="0" w:color="CCCCCC"/>
+              <w:left w:val="single" w:sz="2" w:space="0" w:color="CCCCCC"/>
+              <w:bottom w:val="single" w:sz="2" w:space="0" w:color="CCCCCC"/>
+              <w:right w:val="single" w:sz="2" w:space="0" w:color="CCCCCC"/>
+            </w:tcBorders>
+            <w:shd w:fill="FFFFFF" w:val="clear"/>
+          </w:tcPr>
+          <w:p>
+            <w:pPr>
+              <w:pStyle w:val="Normal"/>
+              <w:rPr/>
+            </w:pPr>
+            <w:r>
+              <w:rPr>
+                <w:rFonts w:eastAsia="Arial" w:cs="Arial"/>
+                <w:sz w:val="18"/>
+                <w:szCs w:val="18"/>
+              </w:rPr>
+              <w:t>Legal Business Structure</w:t>
+            </w:r>
+          </w:p>
+        </w:tc>
+        <w:tc>
+          <w:tcPr>
+            <w:tcW w:w="1400" w:type="dxa"/>
+            <w:tcBorders>
+              <w:top w:val="single" w:sz="2" w:space="0" w:color="CCCCCC"/>
+              <w:left w:val="single" w:sz="2" w:space="0" w:color="CCCCCC"/>
+              <w:bottom w:val="single" w:sz="2" w:space="0" w:color="CCCCCC"/>
+              <w:right w:val="single" w:sz="2" w:space="0" w:color="CCCCCC"/>
+            </w:tcBorders>
+            <w:shd w:fill="FFFFFF" w:val="clear"/>
+          </w:tcPr>
+          <w:p>
+            <w:pPr>
+              <w:pStyle w:val="Normal"/>
+              <w:rPr/>
+            </w:pPr>
+            <w:r>
+              <w:rPr>
+                <w:rFonts w:eastAsia="Arial" w:cs="Arial"/>
+                <w:sz w:val="18"/>
+                <w:szCs w:val="18"/>
+              </w:rPr>
+              <w:t>Company</w:t>
+            </w:r>
+          </w:p>
+        </w:tc>
+        <w:tc>
+          <w:tcPr>
+            <w:tcW w:w="5760" w:type="dxa"/>
+            <w:tcBorders>
+              <w:top w:val="single" w:sz="2" w:space="0" w:color="CCCCCC"/>
+              <w:left w:val="single" w:sz="2" w:space="0" w:color="CCCCCC"/>
+              <w:bottom w:val="single" w:sz="2" w:space="0" w:color="CCCCCC"/>
+              <w:right w:val="single" w:sz="2" w:space="0" w:color="CCCCCC"/>
+            </w:tcBorders>
+            <w:shd w:fill="FFFFFF" w:val="clear"/>
+          </w:tcPr>
+          <w:p>
+            <w:pPr>
+              <w:pStyle w:val="Normal"/>
+              <w:rPr/>
+            </w:pPr>
+            <w:r>
+              <w:rPr>
+                <w:rFonts w:eastAsia="Arial" w:cs="Arial"/>
+                <w:sz w:val="18"/>
+                <w:szCs w:val="18"/>
+              </w:rPr>
+              <w:t>Dropdown. Values: Sole Proprietor | Partnership | LLC | S-Corp | C-Corp | Non-Profit 501(c)(3) | Other. Shown when Registered with State = Yes.</w:t>
+            </w:r>
+          </w:p>
+        </w:tc>
+      </w:tr>
+      <w:tr>
+        <w:trPr/>
+        <w:tc>
+          <w:tcPr>
+            <w:tcW w:w="2200" w:type="dxa"/>
+            <w:tcBorders>
+              <w:top w:val="single" w:sz="2" w:space="0" w:color="CCCCCC"/>
+              <w:left w:val="single" w:sz="2" w:space="0" w:color="CCCCCC"/>
+              <w:bottom w:val="single" w:sz="2" w:space="0" w:color="CCCCCC"/>
+              <w:right w:val="single" w:sz="2" w:space="0" w:color="CCCCCC"/>
+            </w:tcBorders>
+            <w:shd w:fill="F2F2F2" w:val="clear"/>
+          </w:tcPr>
+          <w:p>
+            <w:pPr>
+              <w:pStyle w:val="Normal"/>
+              <w:rPr/>
+            </w:pPr>
+            <w:r>
+              <w:rPr>
+                <w:rFonts w:eastAsia="Arial" w:cs="Arial"/>
+                <w:sz w:val="18"/>
+                <w:szCs w:val="18"/>
+              </w:rPr>
+              <w:t>EIN on File</w:t>
+            </w:r>
+          </w:p>
+        </w:tc>
+        <w:tc>
+          <w:tcPr>
+            <w:tcW w:w="1400" w:type="dxa"/>
+            <w:tcBorders>
+              <w:top w:val="single" w:sz="2" w:space="0" w:color="CCCCCC"/>
+              <w:left w:val="single" w:sz="2" w:space="0" w:color="CCCCCC"/>
+              <w:bottom w:val="single" w:sz="2" w:space="0" w:color="CCCCCC"/>
+              <w:right w:val="single" w:sz="2" w:space="0" w:color="CCCCCC"/>
+            </w:tcBorders>
+            <w:shd w:fill="F2F2F2" w:val="clear"/>
+          </w:tcPr>
+          <w:p>
+            <w:pPr>
+              <w:pStyle w:val="Normal"/>
+              <w:rPr/>
+            </w:pPr>
+            <w:r>
+              <w:rPr>
+                <w:rFonts w:eastAsia="Arial" w:cs="Arial"/>
+                <w:sz w:val="18"/>
+                <w:szCs w:val="18"/>
+              </w:rPr>
+              <w:t>Company</w:t>
+            </w:r>
+          </w:p>
+        </w:tc>
+        <w:tc>
+          <w:tcPr>
+            <w:tcW w:w="5760" w:type="dxa"/>
+            <w:tcBorders>
+              <w:top w:val="single" w:sz="2" w:space="0" w:color="CCCCCC"/>
+              <w:left w:val="single" w:sz="2" w:space="0" w:color="CCCCCC"/>
+              <w:bottom w:val="single" w:sz="2" w:space="0" w:color="CCCCCC"/>
+              <w:right w:val="single" w:sz="2" w:space="0" w:color="CCCCCC"/>
+            </w:tcBorders>
+            <w:shd w:fill="F2F2F2" w:val="clear"/>
+          </w:tcPr>
+          <w:p>
+            <w:pPr>
+              <w:pStyle w:val="Normal"/>
+              <w:rPr/>
+            </w:pPr>
+            <w:r>
+              <w:rPr>
+                <w:rFonts w:eastAsia="Arial" w:cs="Arial"/>
+                <w:sz w:val="18"/>
+                <w:szCs w:val="18"/>
+              </w:rPr>
+              <w:t>Yes/No. Whether the business has obtained an Employer Identification Number. Shown when Registered with State = Yes.</w:t>
+            </w:r>
+          </w:p>
+        </w:tc>
+      </w:tr>
+      <w:tr>
+        <w:trPr/>
+        <w:tc>
+          <w:tcPr>
+            <w:tcW w:w="2200" w:type="dxa"/>
+            <w:tcBorders>
+              <w:top w:val="single" w:sz="2" w:space="0" w:color="CCCCCC"/>
+              <w:left w:val="single" w:sz="2" w:space="0" w:color="CCCCCC"/>
+              <w:bottom w:val="single" w:sz="2" w:space="0" w:color="CCCCCC"/>
+              <w:right w:val="single" w:sz="2" w:space="0" w:color="CCCCCC"/>
+            </w:tcBorders>
+            <w:shd w:fill="FFFFFF" w:val="clear"/>
+          </w:tcPr>
+          <w:p>
+            <w:pPr>
+              <w:pStyle w:val="Normal"/>
+              <w:rPr/>
+            </w:pPr>
+            <w:r>
+              <w:rPr>
+                <w:rFonts w:eastAsia="Arial" w:cs="Arial"/>
+                <w:sz w:val="18"/>
+                <w:szCs w:val="18"/>
+              </w:rPr>
+              <w:t>Date of Formation</w:t>
+            </w:r>
+          </w:p>
+        </w:tc>
+        <w:tc>
+          <w:tcPr>
+            <w:tcW w:w="1400" w:type="dxa"/>
+            <w:tcBorders>
+              <w:top w:val="single" w:sz="2" w:space="0" w:color="CCCCCC"/>
+              <w:left w:val="single" w:sz="2" w:space="0" w:color="CCCCCC"/>
+              <w:bottom w:val="single" w:sz="2" w:space="0" w:color="CCCCCC"/>
+              <w:right w:val="single" w:sz="2" w:space="0" w:color="CCCCCC"/>
+            </w:tcBorders>
+            <w:shd w:fill="FFFFFF" w:val="clear"/>
+          </w:tcPr>
+          <w:p>
+            <w:pPr>
+              <w:pStyle w:val="Normal"/>
+              <w:rPr/>
+            </w:pPr>
+            <w:r>
+              <w:rPr>
+                <w:rFonts w:eastAsia="Arial" w:cs="Arial"/>
+                <w:sz w:val="18"/>
+                <w:szCs w:val="18"/>
+              </w:rPr>
+              <w:t>Company</w:t>
+            </w:r>
+          </w:p>
+        </w:tc>
+        <w:tc>
+          <w:tcPr>
+            <w:tcW w:w="5760" w:type="dxa"/>
+            <w:tcBorders>
+              <w:top w:val="single" w:sz="2" w:space="0" w:color="CCCCCC"/>
+              <w:left w:val="single" w:sz="2" w:space="0" w:color="CCCCCC"/>
+              <w:bottom w:val="single" w:sz="2" w:space="0" w:color="CCCCCC"/>
+              <w:right w:val="single" w:sz="2" w:space="0" w:color="CCCCCC"/>
+            </w:tcBorders>
+            <w:shd w:fill="FFFFFF" w:val="clear"/>
+          </w:tcPr>
+          <w:p>
+            <w:pPr>
+              <w:pStyle w:val="Normal"/>
+              <w:rPr/>
+            </w:pPr>
+            <w:r>
+              <w:rPr>
+                <w:rFonts w:eastAsia="Arial" w:cs="Arial"/>
+                <w:sz w:val="18"/>
+                <w:szCs w:val="18"/>
+              </w:rPr>
+              <w:t>Date field. Date the business entity was formally established. Shown when Registered with State = Yes.</w:t>
+            </w:r>
+          </w:p>
+        </w:tc>
+      </w:tr>
+      <w:tr>
+        <w:trPr/>
+        <w:tc>
+          <w:tcPr>
+            <w:tcW w:w="2200" w:type="dxa"/>
+            <w:tcBorders>
+              <w:top w:val="single" w:sz="2" w:space="0" w:color="CCCCCC"/>
+              <w:left w:val="single" w:sz="2" w:space="0" w:color="CCCCCC"/>
+              <w:bottom w:val="single" w:sz="2" w:space="0" w:color="CCCCCC"/>
+              <w:right w:val="single" w:sz="2" w:space="0" w:color="CCCCCC"/>
+            </w:tcBorders>
+            <w:shd w:fill="F2F2F2" w:val="clear"/>
+          </w:tcPr>
+          <w:p>
+            <w:pPr>
+              <w:pStyle w:val="Normal"/>
+              <w:rPr/>
+            </w:pPr>
+            <w:r>
+              <w:rPr>
+                <w:rFonts w:eastAsia="Arial" w:cs="Arial"/>
+                <w:sz w:val="18"/>
+                <w:szCs w:val="18"/>
+              </w:rPr>
+              <w:t>Registered Agent</w:t>
+            </w:r>
+          </w:p>
+        </w:tc>
+        <w:tc>
+          <w:tcPr>
+            <w:tcW w:w="1400" w:type="dxa"/>
+            <w:tcBorders>
+              <w:top w:val="single" w:sz="2" w:space="0" w:color="CCCCCC"/>
+              <w:left w:val="single" w:sz="2" w:space="0" w:color="CCCCCC"/>
+              <w:bottom w:val="single" w:sz="2" w:space="0" w:color="CCCCCC"/>
+              <w:right w:val="single" w:sz="2" w:space="0" w:color="CCCCCC"/>
+            </w:tcBorders>
+            <w:shd w:fill="F2F2F2" w:val="clear"/>
+          </w:tcPr>
+          <w:p>
+            <w:pPr>
+              <w:pStyle w:val="Normal"/>
+              <w:rPr/>
+            </w:pPr>
+            <w:r>
+              <w:rPr>
+                <w:rFonts w:eastAsia="Arial" w:cs="Arial"/>
+                <w:sz w:val="18"/>
+                <w:szCs w:val="18"/>
+              </w:rPr>
+              <w:t>Company</w:t>
+            </w:r>
+          </w:p>
+        </w:tc>
+        <w:tc>
+          <w:tcPr>
+            <w:tcW w:w="5760" w:type="dxa"/>
+            <w:tcBorders>
+              <w:top w:val="single" w:sz="2" w:space="0" w:color="CCCCCC"/>
+              <w:left w:val="single" w:sz="2" w:space="0" w:color="CCCCCC"/>
+              <w:bottom w:val="single" w:sz="2" w:space="0" w:color="CCCCCC"/>
+              <w:right w:val="single" w:sz="2" w:space="0" w:color="CCCCCC"/>
+            </w:tcBorders>
+            <w:shd w:fill="F2F2F2" w:val="clear"/>
+          </w:tcPr>
+          <w:p>
+            <w:pPr>
+              <w:pStyle w:val="Normal"/>
+              <w:rPr/>
+            </w:pPr>
+            <w:r>
+              <w:rPr>
+                <w:rFonts w:eastAsia="Arial" w:cs="Arial"/>
+                <w:sz w:val="18"/>
+                <w:szCs w:val="18"/>
+              </w:rPr>
+              <w:t>Yes/No. Whether the business has a designated registered agent. Shown when Registered with State = Yes.</w:t>
+            </w:r>
+          </w:p>
+        </w:tc>
+      </w:tr>
+    </w:tbl>
     <w:p>
       <w:pPr>
         <w:pStyle w:val="Normal"/>
@@ -15840,7 +18246,7 @@
       </w:pPr>
       <w:r>
         <w:rPr/>
-        <w:t>Configure the Company entity (CRM’s native Account entity, relabeled) with all Phase 1 and Phase 2 fields defined in Section 2.2.</w:t>
+        <w:t>Configure the Company entity (CRM’s native Account entity, relabeled) with all fields defined in Section 2.2.</w:t>
       </w:r>
     </w:p>
     <w:p>
@@ -15879,22 +18285,22 @@
       </w:pPr>
       <w:r>
         <w:rPr/>
-        <w:t>☐ Add Phase 1 fields to the Company entity: Organization Type (dropdown), Business Stage (dropdown), NAICS Sector (dropdown), NAICS Subsector (dropdown), Mentoring Focus Areas (multi-select), Mentoring Needs Description (rich text).</w:t>
-      </w:r>
-    </w:p>
-    <w:p>
-      <w:pPr>
-        <w:pStyle w:val="Normal"/>
-        <w:numPr>
-          <w:ilvl w:val="0"/>
-          <w:numId w:val="1"/>
-        </w:numPr>
-        <w:spacing w:before="0" w:after="60"/>
-        <w:rPr/>
-      </w:pPr>
-      <w:r>
-        <w:rPr/>
-        <w:t>☐ Add Phase 2 fields to the Company entity: Business Description, Time in Operation, Current Team Size, Revenue Range, Funding Situation, Current Challenges, Goals and Objectives, Desired Outcomes, Previous Mentoring/Advisory Experience (all rich text or appropriate field types per Section 2.2).</w:t>
+        <w:t>☐ Add Business Classification fields to the Company entity: Organization Type (dropdown), Business Stage (dropdown), NAICS Sector (dropdown), NAICS Subsector (dropdown), Mentoring Focus Areas (multi-select), Mentoring Needs Description (rich text).</w:t>
+      </w:r>
+    </w:p>
+    <w:p>
+      <w:pPr>
+        <w:pStyle w:val="Normal"/>
+        <w:numPr>
+          <w:ilvl w:val="0"/>
+          <w:numId w:val="1"/>
+        </w:numPr>
+        <w:spacing w:before="0" w:after="60"/>
+        <w:rPr/>
+      </w:pPr>
+      <w:r>
+        <w:rPr/>
+        <w:t>☐ Add Business Detail fields to the Company entity: Business Description, Time in Operation, Current Team Size, Revenue Range, Funding Situation, Current Challenges, Goals and Objectives, Desired Outcomes, Previous Mentoring/Advisory Experience (all rich text or appropriate field types per Section 2.2).</w:t>
       </w:r>
     </w:p>
     <w:p>
@@ -15984,7 +18390,7 @@
       </w:pPr>
       <w:r>
         <w:rPr/>
-        <w:t>☐ Configure Phase 2 fields (Business Description, Time in Operation, Current Team Size, Revenue Range, Funding Situation, Current Challenges, Goals and Objectives, Desired Outcomes, Previous Mentoring/Advisory Experience) as a separate tab on the Company detail view, labeled “Business Detail (Phase 2).” This tab is completed post-assignment at the mentor’s discretion and should be clearly labeled as post-assignment information.</w:t>
+        <w:t>☐ Configure Business Detail fields (Business Description, Time in Operation, Current Team Size, Revenue Range, Funding Situation, Current Challenges, Goals and Objectives, Desired Outcomes, Previous Mentoring/Advisory Experience) as a separate tab on the Company detail view, labeled “Business Detail.” This tab is completed post-assignment at the mentor’s discretion and should be clearly labeled as post-assignment information.</w:t>
       </w:r>
     </w:p>
     <w:p>

</xml_diff>

<commit_message>
Add Business Classification & Certifications fields to Company entity
- 12 certification-track fields (enum: Ineligible/Eligible/Certified/In Progress):
  Veteran-Owned, SDVOSB, WOSB, MBE, DBE, SBA Small Business, HUBZone,
  8(a), LGBTQ+-Owned, DOBE, Native American/Tribal Owned, Certified B Corp
- 4 boolean fields: Union Shop, Family-Owned, Franchise, Social Enterprise
- 1 free-text field: Other Certifications / Designations
- Added to CBM-PRD-CRM-Client.docx as section 2.2.3
- Added to CBM-PRD-CRM-Implementation.docx as section 2.4.3
</commit_message>
<xml_diff>
--- a/PRDs/CBM-PRD-CRM-Client.docx
+++ b/PRDs/CBM-PRD-CRM-Client.docx
@@ -116,39 +116,7 @@
       </w:pPr>
       <w:r>
         <w:rPr/>
-        <w:t>Related documents: CBM-PRD-CRM.docx (platform requirements), CBM-PRD-CRM-Mentor.docx (mentor domain), CBM-PRD-CRM-</w:t>
-      </w:r>
-      <w:r>
-        <w:rPr/>
-        <w:t>Partner</w:t>
-      </w:r>
-      <w:r>
-        <w:rPr/>
-        <w:t>.docx (</w:t>
-      </w:r>
-      <w:r>
-        <w:rPr/>
-        <w:t>Partner</w:t>
-      </w:r>
-      <w:r>
-        <w:rPr/>
-        <w:t xml:space="preserve"> domain), CBM-PRD-CRM-</w:t>
-      </w:r>
-      <w:r>
-        <w:rPr/>
-        <w:t>Sponsor</w:t>
-      </w:r>
-      <w:r>
-        <w:rPr/>
-        <w:t>.docx (</w:t>
-      </w:r>
-      <w:r>
-        <w:rPr/>
-        <w:t>Spons</w:t>
-      </w:r>
-      <w:r>
-        <w:rPr/>
-        <w:t>or domain).</w:t>
+        <w:t>Related documents: CBM-PRD-CRM.docx (platform requirements), CBM-PRD-CRM-Mentor.docx (mentor domain), CBM-PRD-CRM-Partner.docx (Partner domain), CBM-PRD-CRM-Sponsor.docx (Sponsor domain).</w:t>
       </w:r>
     </w:p>
     <w:p>
@@ -325,23 +293,7 @@
       </w:pPr>
       <w:r>
         <w:rPr/>
-        <w:t xml:space="preserve">The Company entity represents the business being mentored </w:t>
-      </w:r>
-      <w:r>
-        <w:rPr/>
-        <w:t xml:space="preserve">in addition to </w:t>
-      </w:r>
-      <w:r>
-        <w:rPr/>
-        <w:t>Companies that are Sponsors, or Partners.  The four types of Companies are differentiated by the Company Role property</w:t>
-      </w:r>
-      <w:r>
-        <w:rPr/>
-        <w:t xml:space="preserve">.  </w:t>
-      </w:r>
-      <w:r>
-        <w:rPr/>
-        <w:t>A single company can be multiple types.</w:t>
+        <w:t>The Company entity represents the business being mentored in addition to Companies that are Sponsors, or Partners.  The four types of Companies are differentiated by the Company Role property.  A single company can be multiple types.</w:t>
       </w:r>
     </w:p>
     <w:p>
@@ -352,19 +304,7 @@
       </w:pPr>
       <w:r>
         <w:rPr/>
-        <w:t>Companies are</w:t>
-      </w:r>
-      <w:r>
-        <w:rPr/>
-        <w:t xml:space="preserve"> the anchor record to which all Contacts, Engagements, and related activity are linked </w:t>
-      </w:r>
-      <w:r>
-        <w:rPr/>
-        <w:t>for the Mentoring process</w:t>
-      </w:r>
-      <w:r>
-        <w:rPr/>
-        <w:t>. All Company fields may be viewed and modified by the assigned mentor or any administrator directly within the CRM. The forms through which these fields are initially populated are defined in Section 4.1.</w:t>
+        <w:t>Companies are the anchor record to which all Contacts, Engagements, and related activity are linked for the Mentoring process. All Company fields may be viewed and modified by the assigned mentor or any administrator directly within the CRM. The forms through which these fields are initially populated are defined in Section 4.1.</w:t>
       </w:r>
     </w:p>
     <w:tbl>
@@ -1012,23 +952,7 @@
                 <w:sz w:val="18"/>
                 <w:szCs w:val="18"/>
               </w:rPr>
-              <w:t xml:space="preserve">Multi-select dropdown. Values to be defined by CBM leadership. Required. Used for </w:t>
-            </w:r>
-            <w:r>
-              <w:rPr>
-                <w:rFonts w:eastAsia="Arial" w:cs="Arial"/>
-                <w:sz w:val="18"/>
-                <w:szCs w:val="18"/>
-              </w:rPr>
-              <w:t>differentiating between different types of companies</w:t>
-            </w:r>
-            <w:r>
-              <w:rPr>
-                <w:rFonts w:eastAsia="Arial" w:cs="Arial"/>
-                <w:sz w:val="18"/>
-                <w:szCs w:val="18"/>
-              </w:rPr>
-              <w:t>.</w:t>
+              <w:t>Multi-select dropdown. Values to be defined by CBM leadership. Required. Used for differentiating between different types of companies.</w:t>
             </w:r>
           </w:p>
         </w:tc>
@@ -2090,6 +2014,1060 @@
     </w:p>
     <w:p>
       <w:pPr>
+        <w:pStyle w:val="Heading3"/>
+        <w:rPr/>
+      </w:pPr>
+      <w:r>
+        <w:rPr/>
+        <w:t>2.2.3 Business Classification &amp; Certifications</w:t>
+      </w:r>
+    </w:p>
+    <w:p>
+      <w:pPr>
+        <w:pStyle w:val="Normal"/>
+        <w:spacing w:before="0" w:after="120"/>
+        <w:rPr/>
+      </w:pPr>
+      <w:r>
+        <w:rPr/>
+        <w:t>The following fields capture ownership designations and formal certifications held by the business. These are important for grant compliance reporting and program eligibility tracking. Certification-track fields use a four-value status scale: Ineligible, Eligible, Certified, or In Progress. All fields are optional.</w:t>
+      </w:r>
+    </w:p>
+    <w:tbl>
+      <w:tblPr>
+        <w:tblW w:w="9359" w:type="dxa"/>
+        <w:jc w:val="left"/>
+        <w:tblBorders>
+          <w:insideH w:val="single" w:sz="2" w:space="0" w:color="CCCCCC"/>
+          <w:insideV w:val="single" w:sz="2" w:space="0" w:color="CCCCCC"/>
+        </w:tblBorders>
+        <w:tblCellMar>
+          <w:top w:w="80" w:type="dxa"/>
+          <w:left w:w="120" w:type="dxa"/>
+          <w:bottom w:w="80" w:type="dxa"/>
+          <w:right w:w="120" w:type="dxa"/>
+        </w:tblCellMar>
+      </w:tblPr>
+      <w:tblGrid>
+        <w:gridCol w:w="2500"/>
+        <w:gridCol w:w="6859"/>
+      </w:tblGrid>
+      <w:tr>
+        <w:trPr>
+          <w:tblHeader/>
+        </w:trPr>
+        <w:tc>
+          <w:tcPr>
+            <w:tcW w:w="2500" w:type="dxa"/>
+            <w:tcBorders>
+              <w:top w:val="single" w:sz="2" w:space="0" w:color="CCCCCC"/>
+              <w:left w:val="single" w:sz="2" w:space="0" w:color="CCCCCC"/>
+              <w:bottom w:val="single" w:sz="2" w:space="0" w:color="CCCCCC"/>
+              <w:right w:val="single" w:sz="2" w:space="0" w:color="CCCCCC"/>
+            </w:tcBorders>
+            <w:shd w:fill="1F4E79" w:val="clear"/>
+          </w:tcPr>
+          <w:p>
+            <w:pPr>
+              <w:pStyle w:val="Normal"/>
+              <w:rPr/>
+            </w:pPr>
+            <w:r>
+              <w:rPr>
+                <w:b/>
+                <w:color w:val="FFFFFF"/>
+                <w:rFonts w:eastAsia="Arial" w:cs="Arial"/>
+                <w:sz w:val="18"/>
+                <w:szCs w:val="18"/>
+              </w:rPr>
+              <w:t>Field</w:t>
+            </w:r>
+          </w:p>
+        </w:tc>
+        <w:tc>
+          <w:tcPr>
+            <w:tcW w:w="6859" w:type="dxa"/>
+            <w:tcBorders>
+              <w:top w:val="single" w:sz="2" w:space="0" w:color="CCCCCC"/>
+              <w:left w:val="single" w:sz="2" w:space="0" w:color="CCCCCC"/>
+              <w:bottom w:val="single" w:sz="2" w:space="0" w:color="CCCCCC"/>
+              <w:right w:val="single" w:sz="2" w:space="0" w:color="CCCCCC"/>
+            </w:tcBorders>
+            <w:shd w:fill="1F4E79" w:val="clear"/>
+          </w:tcPr>
+          <w:p>
+            <w:pPr>
+              <w:pStyle w:val="Normal"/>
+              <w:rPr/>
+            </w:pPr>
+            <w:r>
+              <w:rPr>
+                <w:b/>
+                <w:color w:val="FFFFFF"/>
+                <w:rFonts w:eastAsia="Arial" w:cs="Arial"/>
+                <w:sz w:val="18"/>
+                <w:szCs w:val="18"/>
+              </w:rPr>
+              <w:t>Description / Values</w:t>
+            </w:r>
+          </w:p>
+        </w:tc>
+      </w:tr>
+      <w:tr>
+        <w:trPr/>
+        <w:tc>
+          <w:tcPr>
+            <w:tcW w:w="2500" w:type="dxa"/>
+            <w:tcBorders>
+              <w:top w:val="single" w:sz="2" w:space="0" w:color="CCCCCC"/>
+              <w:left w:val="single" w:sz="2" w:space="0" w:color="CCCCCC"/>
+              <w:bottom w:val="single" w:sz="2" w:space="0" w:color="CCCCCC"/>
+              <w:right w:val="single" w:sz="2" w:space="0" w:color="CCCCCC"/>
+            </w:tcBorders>
+            <w:shd w:fill="FFFFFF" w:val="clear"/>
+          </w:tcPr>
+          <w:p>
+            <w:pPr>
+              <w:pStyle w:val="Normal"/>
+              <w:rPr/>
+            </w:pPr>
+            <w:r>
+              <w:rPr>
+                <w:b/>
+                <w:rFonts w:eastAsia="Arial" w:cs="Arial"/>
+                <w:sz w:val="18"/>
+                <w:szCs w:val="18"/>
+              </w:rPr>
+              <w:t xml:space="preserve">Veteran-Owned Business</w:t>
+            </w:r>
+          </w:p>
+        </w:tc>
+        <w:tc>
+          <w:tcPr>
+            <w:tcW w:w="6859" w:type="dxa"/>
+            <w:tcBorders>
+              <w:top w:val="single" w:sz="2" w:space="0" w:color="CCCCCC"/>
+              <w:left w:val="single" w:sz="2" w:space="0" w:color="CCCCCC"/>
+              <w:bottom w:val="single" w:sz="2" w:space="0" w:color="CCCCCC"/>
+              <w:right w:val="single" w:sz="2" w:space="0" w:color="CCCCCC"/>
+            </w:tcBorders>
+            <w:shd w:fill="FFFFFF" w:val="clear"/>
+          </w:tcPr>
+          <w:p>
+            <w:pPr>
+              <w:pStyle w:val="Normal"/>
+              <w:rPr/>
+            </w:pPr>
+            <w:r>
+              <w:rPr>
+                <w:rFonts w:eastAsia="Arial" w:cs="Arial"/>
+                <w:sz w:val="18"/>
+                <w:szCs w:val="18"/>
+              </w:rPr>
+              <w:t xml:space="preserve">Whether the business is majority-owned by one or more veterans. Dropdown. Values: Ineligible | Eligible | Certified | In Progress. Optional.</w:t>
+            </w:r>
+          </w:p>
+        </w:tc>
+      </w:tr>
+      <w:tr>
+        <w:trPr/>
+        <w:tc>
+          <w:tcPr>
+            <w:tcW w:w="2500" w:type="dxa"/>
+            <w:tcBorders>
+              <w:top w:val="single" w:sz="2" w:space="0" w:color="CCCCCC"/>
+              <w:left w:val="single" w:sz="2" w:space="0" w:color="CCCCCC"/>
+              <w:bottom w:val="single" w:sz="2" w:space="0" w:color="CCCCCC"/>
+              <w:right w:val="single" w:sz="2" w:space="0" w:color="CCCCCC"/>
+            </w:tcBorders>
+            <w:shd w:fill="FFFFFF" w:val="clear"/>
+          </w:tcPr>
+          <w:p>
+            <w:pPr>
+              <w:pStyle w:val="Normal"/>
+              <w:rPr/>
+            </w:pPr>
+            <w:r>
+              <w:rPr>
+                <w:b/>
+                <w:rFonts w:eastAsia="Arial" w:cs="Arial"/>
+                <w:sz w:val="18"/>
+                <w:szCs w:val="18"/>
+              </w:rPr>
+              <w:t xml:space="preserve">Service-Disabled Veteran-Owned (SDVOSB)</w:t>
+            </w:r>
+          </w:p>
+        </w:tc>
+        <w:tc>
+          <w:tcPr>
+            <w:tcW w:w="6859" w:type="dxa"/>
+            <w:tcBorders>
+              <w:top w:val="single" w:sz="2" w:space="0" w:color="CCCCCC"/>
+              <w:left w:val="single" w:sz="2" w:space="0" w:color="CCCCCC"/>
+              <w:bottom w:val="single" w:sz="2" w:space="0" w:color="CCCCCC"/>
+              <w:right w:val="single" w:sz="2" w:space="0" w:color="CCCCCC"/>
+            </w:tcBorders>
+            <w:shd w:fill="FFFFFF" w:val="clear"/>
+          </w:tcPr>
+          <w:p>
+            <w:pPr>
+              <w:pStyle w:val="Normal"/>
+              <w:rPr/>
+            </w:pPr>
+            <w:r>
+              <w:rPr>
+                <w:rFonts w:eastAsia="Arial" w:cs="Arial"/>
+                <w:sz w:val="18"/>
+                <w:szCs w:val="18"/>
+              </w:rPr>
+              <w:t xml:space="preserve">SBA/VA certification for businesses majority-owned by service-disabled veterans. Dropdown. Values: Ineligible | Eligible | Certified | In Progress. Optional.</w:t>
+            </w:r>
+          </w:p>
+        </w:tc>
+      </w:tr>
+      <w:tr>
+        <w:trPr/>
+        <w:tc>
+          <w:tcPr>
+            <w:tcW w:w="2500" w:type="dxa"/>
+            <w:tcBorders>
+              <w:top w:val="single" w:sz="2" w:space="0" w:color="CCCCCC"/>
+              <w:left w:val="single" w:sz="2" w:space="0" w:color="CCCCCC"/>
+              <w:bottom w:val="single" w:sz="2" w:space="0" w:color="CCCCCC"/>
+              <w:right w:val="single" w:sz="2" w:space="0" w:color="CCCCCC"/>
+            </w:tcBorders>
+            <w:shd w:fill="FFFFFF" w:val="clear"/>
+          </w:tcPr>
+          <w:p>
+            <w:pPr>
+              <w:pStyle w:val="Normal"/>
+              <w:rPr/>
+            </w:pPr>
+            <w:r>
+              <w:rPr>
+                <w:b/>
+                <w:rFonts w:eastAsia="Arial" w:cs="Arial"/>
+                <w:sz w:val="18"/>
+                <w:szCs w:val="18"/>
+              </w:rPr>
+              <w:t xml:space="preserve">Woman-Owned Small Business (WOSB)</w:t>
+            </w:r>
+          </w:p>
+        </w:tc>
+        <w:tc>
+          <w:tcPr>
+            <w:tcW w:w="6859" w:type="dxa"/>
+            <w:tcBorders>
+              <w:top w:val="single" w:sz="2" w:space="0" w:color="CCCCCC"/>
+              <w:left w:val="single" w:sz="2" w:space="0" w:color="CCCCCC"/>
+              <w:bottom w:val="single" w:sz="2" w:space="0" w:color="CCCCCC"/>
+              <w:right w:val="single" w:sz="2" w:space="0" w:color="CCCCCC"/>
+            </w:tcBorders>
+            <w:shd w:fill="FFFFFF" w:val="clear"/>
+          </w:tcPr>
+          <w:p>
+            <w:pPr>
+              <w:pStyle w:val="Normal"/>
+              <w:rPr/>
+            </w:pPr>
+            <w:r>
+              <w:rPr>
+                <w:rFonts w:eastAsia="Arial" w:cs="Arial"/>
+                <w:sz w:val="18"/>
+                <w:szCs w:val="18"/>
+              </w:rPr>
+              <w:t xml:space="preserve">SBA certification for businesses majority-owned and controlled by women. Dropdown. Values: Ineligible | Eligible | Certified | In Progress. Optional.</w:t>
+            </w:r>
+          </w:p>
+        </w:tc>
+      </w:tr>
+      <w:tr>
+        <w:trPr/>
+        <w:tc>
+          <w:tcPr>
+            <w:tcW w:w="2500" w:type="dxa"/>
+            <w:tcBorders>
+              <w:top w:val="single" w:sz="2" w:space="0" w:color="CCCCCC"/>
+              <w:left w:val="single" w:sz="2" w:space="0" w:color="CCCCCC"/>
+              <w:bottom w:val="single" w:sz="2" w:space="0" w:color="CCCCCC"/>
+              <w:right w:val="single" w:sz="2" w:space="0" w:color="CCCCCC"/>
+            </w:tcBorders>
+            <w:shd w:fill="FFFFFF" w:val="clear"/>
+          </w:tcPr>
+          <w:p>
+            <w:pPr>
+              <w:pStyle w:val="Normal"/>
+              <w:rPr/>
+            </w:pPr>
+            <w:r>
+              <w:rPr>
+                <w:b/>
+                <w:rFonts w:eastAsia="Arial" w:cs="Arial"/>
+                <w:sz w:val="18"/>
+                <w:szCs w:val="18"/>
+              </w:rPr>
+              <w:t xml:space="preserve">Minority-Owned Business Enterprise (MBE)</w:t>
+            </w:r>
+          </w:p>
+        </w:tc>
+        <w:tc>
+          <w:tcPr>
+            <w:tcW w:w="6859" w:type="dxa"/>
+            <w:tcBorders>
+              <w:top w:val="single" w:sz="2" w:space="0" w:color="CCCCCC"/>
+              <w:left w:val="single" w:sz="2" w:space="0" w:color="CCCCCC"/>
+              <w:bottom w:val="single" w:sz="2" w:space="0" w:color="CCCCCC"/>
+              <w:right w:val="single" w:sz="2" w:space="0" w:color="CCCCCC"/>
+            </w:tcBorders>
+            <w:shd w:fill="FFFFFF" w:val="clear"/>
+          </w:tcPr>
+          <w:p>
+            <w:pPr>
+              <w:pStyle w:val="Normal"/>
+              <w:rPr/>
+            </w:pPr>
+            <w:r>
+              <w:rPr>
+                <w:rFonts w:eastAsia="Arial" w:cs="Arial"/>
+                <w:sz w:val="18"/>
+                <w:szCs w:val="18"/>
+              </w:rPr>
+              <w:t xml:space="preserve">Certification for businesses majority-owned by racial or ethnic minorities, typically through NMSDC or a state/local certifying agency. Dropdown. Values: Ineligible | Eligible | Certified | In Progress. Optional.</w:t>
+            </w:r>
+          </w:p>
+        </w:tc>
+      </w:tr>
+      <w:tr>
+        <w:trPr/>
+        <w:tc>
+          <w:tcPr>
+            <w:tcW w:w="2500" w:type="dxa"/>
+            <w:tcBorders>
+              <w:top w:val="single" w:sz="2" w:space="0" w:color="CCCCCC"/>
+              <w:left w:val="single" w:sz="2" w:space="0" w:color="CCCCCC"/>
+              <w:bottom w:val="single" w:sz="2" w:space="0" w:color="CCCCCC"/>
+              <w:right w:val="single" w:sz="2" w:space="0" w:color="CCCCCC"/>
+            </w:tcBorders>
+            <w:shd w:fill="FFFFFF" w:val="clear"/>
+          </w:tcPr>
+          <w:p>
+            <w:pPr>
+              <w:pStyle w:val="Normal"/>
+              <w:rPr/>
+            </w:pPr>
+            <w:r>
+              <w:rPr>
+                <w:b/>
+                <w:rFonts w:eastAsia="Arial" w:cs="Arial"/>
+                <w:sz w:val="18"/>
+                <w:szCs w:val="18"/>
+              </w:rPr>
+              <w:t xml:space="preserve">Disadvantaged Business Enterprise (DBE)</w:t>
+            </w:r>
+          </w:p>
+        </w:tc>
+        <w:tc>
+          <w:tcPr>
+            <w:tcW w:w="6859" w:type="dxa"/>
+            <w:tcBorders>
+              <w:top w:val="single" w:sz="2" w:space="0" w:color="CCCCCC"/>
+              <w:left w:val="single" w:sz="2" w:space="0" w:color="CCCCCC"/>
+              <w:bottom w:val="single" w:sz="2" w:space="0" w:color="CCCCCC"/>
+              <w:right w:val="single" w:sz="2" w:space="0" w:color="CCCCCC"/>
+            </w:tcBorders>
+            <w:shd w:fill="FFFFFF" w:val="clear"/>
+          </w:tcPr>
+          <w:p>
+            <w:pPr>
+              <w:pStyle w:val="Normal"/>
+              <w:rPr/>
+            </w:pPr>
+            <w:r>
+              <w:rPr>
+                <w:rFonts w:eastAsia="Arial" w:cs="Arial"/>
+                <w:sz w:val="18"/>
+                <w:szCs w:val="18"/>
+              </w:rPr>
+              <w:t xml:space="preserve">Federal DOT certification for socially and economically disadvantaged business owners. Dropdown. Values: Ineligible | Eligible | Certified | In Progress. Optional.</w:t>
+            </w:r>
+          </w:p>
+        </w:tc>
+      </w:tr>
+      <w:tr>
+        <w:trPr/>
+        <w:tc>
+          <w:tcPr>
+            <w:tcW w:w="2500" w:type="dxa"/>
+            <w:tcBorders>
+              <w:top w:val="single" w:sz="2" w:space="0" w:color="CCCCCC"/>
+              <w:left w:val="single" w:sz="2" w:space="0" w:color="CCCCCC"/>
+              <w:bottom w:val="single" w:sz="2" w:space="0" w:color="CCCCCC"/>
+              <w:right w:val="single" w:sz="2" w:space="0" w:color="CCCCCC"/>
+            </w:tcBorders>
+            <w:shd w:fill="FFFFFF" w:val="clear"/>
+          </w:tcPr>
+          <w:p>
+            <w:pPr>
+              <w:pStyle w:val="Normal"/>
+              <w:rPr/>
+            </w:pPr>
+            <w:r>
+              <w:rPr>
+                <w:b/>
+                <w:rFonts w:eastAsia="Arial" w:cs="Arial"/>
+                <w:sz w:val="18"/>
+                <w:szCs w:val="18"/>
+              </w:rPr>
+              <w:t xml:space="preserve">SBA Small Business</w:t>
+            </w:r>
+          </w:p>
+        </w:tc>
+        <w:tc>
+          <w:tcPr>
+            <w:tcW w:w="6859" w:type="dxa"/>
+            <w:tcBorders>
+              <w:top w:val="single" w:sz="2" w:space="0" w:color="CCCCCC"/>
+              <w:left w:val="single" w:sz="2" w:space="0" w:color="CCCCCC"/>
+              <w:bottom w:val="single" w:sz="2" w:space="0" w:color="CCCCCC"/>
+              <w:right w:val="single" w:sz="2" w:space="0" w:color="CCCCCC"/>
+            </w:tcBorders>
+            <w:shd w:fill="FFFFFF" w:val="clear"/>
+          </w:tcPr>
+          <w:p>
+            <w:pPr>
+              <w:pStyle w:val="Normal"/>
+              <w:rPr/>
+            </w:pPr>
+            <w:r>
+              <w:rPr>
+                <w:rFonts w:eastAsia="Arial" w:cs="Arial"/>
+                <w:sz w:val="18"/>
+                <w:szCs w:val="18"/>
+              </w:rPr>
+              <w:t xml:space="preserve">Whether the business meets SBA size standards and is registered as a small business in SAM.gov. Dropdown. Values: Ineligible | Eligible | Certified | In Progress. Optional.</w:t>
+            </w:r>
+          </w:p>
+        </w:tc>
+      </w:tr>
+      <w:tr>
+        <w:trPr/>
+        <w:tc>
+          <w:tcPr>
+            <w:tcW w:w="2500" w:type="dxa"/>
+            <w:tcBorders>
+              <w:top w:val="single" w:sz="2" w:space="0" w:color="CCCCCC"/>
+              <w:left w:val="single" w:sz="2" w:space="0" w:color="CCCCCC"/>
+              <w:bottom w:val="single" w:sz="2" w:space="0" w:color="CCCCCC"/>
+              <w:right w:val="single" w:sz="2" w:space="0" w:color="CCCCCC"/>
+            </w:tcBorders>
+            <w:shd w:fill="FFFFFF" w:val="clear"/>
+          </w:tcPr>
+          <w:p>
+            <w:pPr>
+              <w:pStyle w:val="Normal"/>
+              <w:rPr/>
+            </w:pPr>
+            <w:r>
+              <w:rPr>
+                <w:b/>
+                <w:rFonts w:eastAsia="Arial" w:cs="Arial"/>
+                <w:sz w:val="18"/>
+                <w:szCs w:val="18"/>
+              </w:rPr>
+              <w:t xml:space="preserve">HUBZone Certified</w:t>
+            </w:r>
+          </w:p>
+        </w:tc>
+        <w:tc>
+          <w:tcPr>
+            <w:tcW w:w="6859" w:type="dxa"/>
+            <w:tcBorders>
+              <w:top w:val="single" w:sz="2" w:space="0" w:color="CCCCCC"/>
+              <w:left w:val="single" w:sz="2" w:space="0" w:color="CCCCCC"/>
+              <w:bottom w:val="single" w:sz="2" w:space="0" w:color="CCCCCC"/>
+              <w:right w:val="single" w:sz="2" w:space="0" w:color="CCCCCC"/>
+            </w:tcBorders>
+            <w:shd w:fill="FFFFFF" w:val="clear"/>
+          </w:tcPr>
+          <w:p>
+            <w:pPr>
+              <w:pStyle w:val="Normal"/>
+              <w:rPr/>
+            </w:pPr>
+            <w:r>
+              <w:rPr>
+                <w:rFonts w:eastAsia="Arial" w:cs="Arial"/>
+                <w:sz w:val="18"/>
+                <w:szCs w:val="18"/>
+              </w:rPr>
+              <w:t xml:space="preserve">SBA certification for businesses located in and employing people from Historically Underutilized Business Zones. Dropdown. Values: Ineligible | Eligible | Certified | In Progress. Optional.</w:t>
+            </w:r>
+          </w:p>
+        </w:tc>
+      </w:tr>
+      <w:tr>
+        <w:trPr/>
+        <w:tc>
+          <w:tcPr>
+            <w:tcW w:w="2500" w:type="dxa"/>
+            <w:tcBorders>
+              <w:top w:val="single" w:sz="2" w:space="0" w:color="CCCCCC"/>
+              <w:left w:val="single" w:sz="2" w:space="0" w:color="CCCCCC"/>
+              <w:bottom w:val="single" w:sz="2" w:space="0" w:color="CCCCCC"/>
+              <w:right w:val="single" w:sz="2" w:space="0" w:color="CCCCCC"/>
+            </w:tcBorders>
+            <w:shd w:fill="FFFFFF" w:val="clear"/>
+          </w:tcPr>
+          <w:p>
+            <w:pPr>
+              <w:pStyle w:val="Normal"/>
+              <w:rPr/>
+            </w:pPr>
+            <w:r>
+              <w:rPr>
+                <w:b/>
+                <w:rFonts w:eastAsia="Arial" w:cs="Arial"/>
+                <w:sz w:val="18"/>
+                <w:szCs w:val="18"/>
+              </w:rPr>
+              <w:t xml:space="preserve">8(a) Program Participant</w:t>
+            </w:r>
+          </w:p>
+        </w:tc>
+        <w:tc>
+          <w:tcPr>
+            <w:tcW w:w="6859" w:type="dxa"/>
+            <w:tcBorders>
+              <w:top w:val="single" w:sz="2" w:space="0" w:color="CCCCCC"/>
+              <w:left w:val="single" w:sz="2" w:space="0" w:color="CCCCCC"/>
+              <w:bottom w:val="single" w:sz="2" w:space="0" w:color="CCCCCC"/>
+              <w:right w:val="single" w:sz="2" w:space="0" w:color="CCCCCC"/>
+            </w:tcBorders>
+            <w:shd w:fill="FFFFFF" w:val="clear"/>
+          </w:tcPr>
+          <w:p>
+            <w:pPr>
+              <w:pStyle w:val="Normal"/>
+              <w:rPr/>
+            </w:pPr>
+            <w:r>
+              <w:rPr>
+                <w:rFonts w:eastAsia="Arial" w:cs="Arial"/>
+                <w:sz w:val="18"/>
+                <w:szCs w:val="18"/>
+              </w:rPr>
+              <w:t xml:space="preserve">SBA 8(a) Business Development Program for socially and economically disadvantaged small business owners. Dropdown. Values: Ineligible | Eligible | Certified | In Progress. Optional.</w:t>
+            </w:r>
+          </w:p>
+        </w:tc>
+      </w:tr>
+      <w:tr>
+        <w:trPr/>
+        <w:tc>
+          <w:tcPr>
+            <w:tcW w:w="2500" w:type="dxa"/>
+            <w:tcBorders>
+              <w:top w:val="single" w:sz="2" w:space="0" w:color="CCCCCC"/>
+              <w:left w:val="single" w:sz="2" w:space="0" w:color="CCCCCC"/>
+              <w:bottom w:val="single" w:sz="2" w:space="0" w:color="CCCCCC"/>
+              <w:right w:val="single" w:sz="2" w:space="0" w:color="CCCCCC"/>
+            </w:tcBorders>
+            <w:shd w:fill="FFFFFF" w:val="clear"/>
+          </w:tcPr>
+          <w:p>
+            <w:pPr>
+              <w:pStyle w:val="Normal"/>
+              <w:rPr/>
+            </w:pPr>
+            <w:r>
+              <w:rPr>
+                <w:b/>
+                <w:rFonts w:eastAsia="Arial" w:cs="Arial"/>
+                <w:sz w:val="18"/>
+                <w:szCs w:val="18"/>
+              </w:rPr>
+              <w:t xml:space="preserve">LGBTQ+-Owned Business</w:t>
+            </w:r>
+          </w:p>
+        </w:tc>
+        <w:tc>
+          <w:tcPr>
+            <w:tcW w:w="6859" w:type="dxa"/>
+            <w:tcBorders>
+              <w:top w:val="single" w:sz="2" w:space="0" w:color="CCCCCC"/>
+              <w:left w:val="single" w:sz="2" w:space="0" w:color="CCCCCC"/>
+              <w:bottom w:val="single" w:sz="2" w:space="0" w:color="CCCCCC"/>
+              <w:right w:val="single" w:sz="2" w:space="0" w:color="CCCCCC"/>
+            </w:tcBorders>
+            <w:shd w:fill="FFFFFF" w:val="clear"/>
+          </w:tcPr>
+          <w:p>
+            <w:pPr>
+              <w:pStyle w:val="Normal"/>
+              <w:rPr/>
+            </w:pPr>
+            <w:r>
+              <w:rPr>
+                <w:rFonts w:eastAsia="Arial" w:cs="Arial"/>
+                <w:sz w:val="18"/>
+                <w:szCs w:val="18"/>
+              </w:rPr>
+              <w:t xml:space="preserve">Certification for businesses majority-owned by LGBTQ+ individuals, typically through the National LGBT Chamber of Commerce (NGLCC). Dropdown. Values: Ineligible | Eligible | Certified | In Progress. Optional.</w:t>
+            </w:r>
+          </w:p>
+        </w:tc>
+      </w:tr>
+      <w:tr>
+        <w:trPr/>
+        <w:tc>
+          <w:tcPr>
+            <w:tcW w:w="2500" w:type="dxa"/>
+            <w:tcBorders>
+              <w:top w:val="single" w:sz="2" w:space="0" w:color="CCCCCC"/>
+              <w:left w:val="single" w:sz="2" w:space="0" w:color="CCCCCC"/>
+              <w:bottom w:val="single" w:sz="2" w:space="0" w:color="CCCCCC"/>
+              <w:right w:val="single" w:sz="2" w:space="0" w:color="CCCCCC"/>
+            </w:tcBorders>
+            <w:shd w:fill="FFFFFF" w:val="clear"/>
+          </w:tcPr>
+          <w:p>
+            <w:pPr>
+              <w:pStyle w:val="Normal"/>
+              <w:rPr/>
+            </w:pPr>
+            <w:r>
+              <w:rPr>
+                <w:b/>
+                <w:rFonts w:eastAsia="Arial" w:cs="Arial"/>
+                <w:sz w:val="18"/>
+                <w:szCs w:val="18"/>
+              </w:rPr>
+              <w:t xml:space="preserve">Disability-Owned Business Enterprise (DOBE)</w:t>
+            </w:r>
+          </w:p>
+        </w:tc>
+        <w:tc>
+          <w:tcPr>
+            <w:tcW w:w="6859" w:type="dxa"/>
+            <w:tcBorders>
+              <w:top w:val="single" w:sz="2" w:space="0" w:color="CCCCCC"/>
+              <w:left w:val="single" w:sz="2" w:space="0" w:color="CCCCCC"/>
+              <w:bottom w:val="single" w:sz="2" w:space="0" w:color="CCCCCC"/>
+              <w:right w:val="single" w:sz="2" w:space="0" w:color="CCCCCC"/>
+            </w:tcBorders>
+            <w:shd w:fill="FFFFFF" w:val="clear"/>
+          </w:tcPr>
+          <w:p>
+            <w:pPr>
+              <w:pStyle w:val="Normal"/>
+              <w:rPr/>
+            </w:pPr>
+            <w:r>
+              <w:rPr>
+                <w:rFonts w:eastAsia="Arial" w:cs="Arial"/>
+                <w:sz w:val="18"/>
+                <w:szCs w:val="18"/>
+              </w:rPr>
+              <w:t xml:space="preserve">Certification for businesses majority-owned by people with disabilities, through Disability:IN. Dropdown. Values: Ineligible | Eligible | Certified | In Progress. Optional.</w:t>
+            </w:r>
+          </w:p>
+        </w:tc>
+      </w:tr>
+      <w:tr>
+        <w:trPr/>
+        <w:tc>
+          <w:tcPr>
+            <w:tcW w:w="2500" w:type="dxa"/>
+            <w:tcBorders>
+              <w:top w:val="single" w:sz="2" w:space="0" w:color="CCCCCC"/>
+              <w:left w:val="single" w:sz="2" w:space="0" w:color="CCCCCC"/>
+              <w:bottom w:val="single" w:sz="2" w:space="0" w:color="CCCCCC"/>
+              <w:right w:val="single" w:sz="2" w:space="0" w:color="CCCCCC"/>
+            </w:tcBorders>
+            <w:shd w:fill="FFFFFF" w:val="clear"/>
+          </w:tcPr>
+          <w:p>
+            <w:pPr>
+              <w:pStyle w:val="Normal"/>
+              <w:rPr/>
+            </w:pPr>
+            <w:r>
+              <w:rPr>
+                <w:b/>
+                <w:rFonts w:eastAsia="Arial" w:cs="Arial"/>
+                <w:sz w:val="18"/>
+                <w:szCs w:val="18"/>
+              </w:rPr>
+              <w:t xml:space="preserve">Native American / Tribal Owned</w:t>
+            </w:r>
+          </w:p>
+        </w:tc>
+        <w:tc>
+          <w:tcPr>
+            <w:tcW w:w="6859" w:type="dxa"/>
+            <w:tcBorders>
+              <w:top w:val="single" w:sz="2" w:space="0" w:color="CCCCCC"/>
+              <w:left w:val="single" w:sz="2" w:space="0" w:color="CCCCCC"/>
+              <w:bottom w:val="single" w:sz="2" w:space="0" w:color="CCCCCC"/>
+              <w:right w:val="single" w:sz="2" w:space="0" w:color="CCCCCC"/>
+            </w:tcBorders>
+            <w:shd w:fill="FFFFFF" w:val="clear"/>
+          </w:tcPr>
+          <w:p>
+            <w:pPr>
+              <w:pStyle w:val="Normal"/>
+              <w:rPr/>
+            </w:pPr>
+            <w:r>
+              <w:rPr>
+                <w:rFonts w:eastAsia="Arial" w:cs="Arial"/>
+                <w:sz w:val="18"/>
+                <w:szCs w:val="18"/>
+              </w:rPr>
+              <w:t xml:space="preserve">Business majority-owned by Native American, Alaska Native, or Native Hawaiian individuals or a tribal entity. Dropdown. Values: Ineligible | Eligible | Certified | In Progress. Optional.</w:t>
+            </w:r>
+          </w:p>
+        </w:tc>
+      </w:tr>
+      <w:tr>
+        <w:trPr/>
+        <w:tc>
+          <w:tcPr>
+            <w:tcW w:w="2500" w:type="dxa"/>
+            <w:tcBorders>
+              <w:top w:val="single" w:sz="2" w:space="0" w:color="CCCCCC"/>
+              <w:left w:val="single" w:sz="2" w:space="0" w:color="CCCCCC"/>
+              <w:bottom w:val="single" w:sz="2" w:space="0" w:color="CCCCCC"/>
+              <w:right w:val="single" w:sz="2" w:space="0" w:color="CCCCCC"/>
+            </w:tcBorders>
+            <w:shd w:fill="FFFFFF" w:val="clear"/>
+          </w:tcPr>
+          <w:p>
+            <w:pPr>
+              <w:pStyle w:val="Normal"/>
+              <w:rPr/>
+            </w:pPr>
+            <w:r>
+              <w:rPr>
+                <w:b/>
+                <w:rFonts w:eastAsia="Arial" w:cs="Arial"/>
+                <w:sz w:val="18"/>
+                <w:szCs w:val="18"/>
+              </w:rPr>
+              <w:t xml:space="preserve">Certified B Corporation</w:t>
+            </w:r>
+          </w:p>
+        </w:tc>
+        <w:tc>
+          <w:tcPr>
+            <w:tcW w:w="6859" w:type="dxa"/>
+            <w:tcBorders>
+              <w:top w:val="single" w:sz="2" w:space="0" w:color="CCCCCC"/>
+              <w:left w:val="single" w:sz="2" w:space="0" w:color="CCCCCC"/>
+              <w:bottom w:val="single" w:sz="2" w:space="0" w:color="CCCCCC"/>
+              <w:right w:val="single" w:sz="2" w:space="0" w:color="CCCCCC"/>
+            </w:tcBorders>
+            <w:shd w:fill="FFFFFF" w:val="clear"/>
+          </w:tcPr>
+          <w:p>
+            <w:pPr>
+              <w:pStyle w:val="Normal"/>
+              <w:rPr/>
+            </w:pPr>
+            <w:r>
+              <w:rPr>
+                <w:rFonts w:eastAsia="Arial" w:cs="Arial"/>
+                <w:sz w:val="18"/>
+                <w:szCs w:val="18"/>
+              </w:rPr>
+              <w:t xml:space="preserve">B Lab certification for businesses meeting verified social, environmental, and governance standards. Dropdown. Values: Ineligible | Eligible | Certified | In Progress. Optional.</w:t>
+            </w:r>
+          </w:p>
+        </w:tc>
+      </w:tr>
+      <w:tr>
+        <w:trPr/>
+        <w:tc>
+          <w:tcPr>
+            <w:tcW w:w="2500" w:type="dxa"/>
+            <w:tcBorders>
+              <w:top w:val="single" w:sz="2" w:space="0" w:color="CCCCCC"/>
+              <w:left w:val="single" w:sz="2" w:space="0" w:color="CCCCCC"/>
+              <w:bottom w:val="single" w:sz="2" w:space="0" w:color="CCCCCC"/>
+              <w:right w:val="single" w:sz="2" w:space="0" w:color="CCCCCC"/>
+            </w:tcBorders>
+            <w:shd w:fill="FFFFFF" w:val="clear"/>
+          </w:tcPr>
+          <w:p>
+            <w:pPr>
+              <w:pStyle w:val="Normal"/>
+              <w:rPr/>
+            </w:pPr>
+            <w:r>
+              <w:rPr>
+                <w:b/>
+                <w:rFonts w:eastAsia="Arial" w:cs="Arial"/>
+                <w:sz w:val="18"/>
+                <w:szCs w:val="18"/>
+              </w:rPr>
+              <w:t xml:space="preserve">Union Shop</w:t>
+            </w:r>
+          </w:p>
+        </w:tc>
+        <w:tc>
+          <w:tcPr>
+            <w:tcW w:w="6859" w:type="dxa"/>
+            <w:tcBorders>
+              <w:top w:val="single" w:sz="2" w:space="0" w:color="CCCCCC"/>
+              <w:left w:val="single" w:sz="2" w:space="0" w:color="CCCCCC"/>
+              <w:bottom w:val="single" w:sz="2" w:space="0" w:color="CCCCCC"/>
+              <w:right w:val="single" w:sz="2" w:space="0" w:color="CCCCCC"/>
+            </w:tcBorders>
+            <w:shd w:fill="FFFFFF" w:val="clear"/>
+          </w:tcPr>
+          <w:p>
+            <w:pPr>
+              <w:pStyle w:val="Normal"/>
+              <w:rPr/>
+            </w:pPr>
+            <w:r>
+              <w:rPr>
+                <w:rFonts w:eastAsia="Arial" w:cs="Arial"/>
+                <w:sz w:val="18"/>
+                <w:szCs w:val="18"/>
+              </w:rPr>
+              <w:t xml:space="preserve">Whether the business operates under a union agreement requiring employees to be union members. Yes/No. Optional.</w:t>
+            </w:r>
+          </w:p>
+        </w:tc>
+      </w:tr>
+      <w:tr>
+        <w:trPr/>
+        <w:tc>
+          <w:tcPr>
+            <w:tcW w:w="2500" w:type="dxa"/>
+            <w:tcBorders>
+              <w:top w:val="single" w:sz="2" w:space="0" w:color="CCCCCC"/>
+              <w:left w:val="single" w:sz="2" w:space="0" w:color="CCCCCC"/>
+              <w:bottom w:val="single" w:sz="2" w:space="0" w:color="CCCCCC"/>
+              <w:right w:val="single" w:sz="2" w:space="0" w:color="CCCCCC"/>
+            </w:tcBorders>
+            <w:shd w:fill="FFFFFF" w:val="clear"/>
+          </w:tcPr>
+          <w:p>
+            <w:pPr>
+              <w:pStyle w:val="Normal"/>
+              <w:rPr/>
+            </w:pPr>
+            <w:r>
+              <w:rPr>
+                <w:b/>
+                <w:rFonts w:eastAsia="Arial" w:cs="Arial"/>
+                <w:sz w:val="18"/>
+                <w:szCs w:val="18"/>
+              </w:rPr>
+              <w:t xml:space="preserve">Family-Owned Business</w:t>
+            </w:r>
+          </w:p>
+        </w:tc>
+        <w:tc>
+          <w:tcPr>
+            <w:tcW w:w="6859" w:type="dxa"/>
+            <w:tcBorders>
+              <w:top w:val="single" w:sz="2" w:space="0" w:color="CCCCCC"/>
+              <w:left w:val="single" w:sz="2" w:space="0" w:color="CCCCCC"/>
+              <w:bottom w:val="single" w:sz="2" w:space="0" w:color="CCCCCC"/>
+              <w:right w:val="single" w:sz="2" w:space="0" w:color="CCCCCC"/>
+            </w:tcBorders>
+            <w:shd w:fill="FFFFFF" w:val="clear"/>
+          </w:tcPr>
+          <w:p>
+            <w:pPr>
+              <w:pStyle w:val="Normal"/>
+              <w:rPr/>
+            </w:pPr>
+            <w:r>
+              <w:rPr>
+                <w:rFonts w:eastAsia="Arial" w:cs="Arial"/>
+                <w:sz w:val="18"/>
+                <w:szCs w:val="18"/>
+              </w:rPr>
+              <w:t xml:space="preserve">Whether the business is owned and operated by members of the same family. Yes/No. Optional.</w:t>
+            </w:r>
+          </w:p>
+        </w:tc>
+      </w:tr>
+      <w:tr>
+        <w:trPr/>
+        <w:tc>
+          <w:tcPr>
+            <w:tcW w:w="2500" w:type="dxa"/>
+            <w:tcBorders>
+              <w:top w:val="single" w:sz="2" w:space="0" w:color="CCCCCC"/>
+              <w:left w:val="single" w:sz="2" w:space="0" w:color="CCCCCC"/>
+              <w:bottom w:val="single" w:sz="2" w:space="0" w:color="CCCCCC"/>
+              <w:right w:val="single" w:sz="2" w:space="0" w:color="CCCCCC"/>
+            </w:tcBorders>
+            <w:shd w:fill="FFFFFF" w:val="clear"/>
+          </w:tcPr>
+          <w:p>
+            <w:pPr>
+              <w:pStyle w:val="Normal"/>
+              <w:rPr/>
+            </w:pPr>
+            <w:r>
+              <w:rPr>
+                <w:b/>
+                <w:rFonts w:eastAsia="Arial" w:cs="Arial"/>
+                <w:sz w:val="18"/>
+                <w:szCs w:val="18"/>
+              </w:rPr>
+              <w:t xml:space="preserve">Franchise</w:t>
+            </w:r>
+          </w:p>
+        </w:tc>
+        <w:tc>
+          <w:tcPr>
+            <w:tcW w:w="6859" w:type="dxa"/>
+            <w:tcBorders>
+              <w:top w:val="single" w:sz="2" w:space="0" w:color="CCCCCC"/>
+              <w:left w:val="single" w:sz="2" w:space="0" w:color="CCCCCC"/>
+              <w:bottom w:val="single" w:sz="2" w:space="0" w:color="CCCCCC"/>
+              <w:right w:val="single" w:sz="2" w:space="0" w:color="CCCCCC"/>
+            </w:tcBorders>
+            <w:shd w:fill="FFFFFF" w:val="clear"/>
+          </w:tcPr>
+          <w:p>
+            <w:pPr>
+              <w:pStyle w:val="Normal"/>
+              <w:rPr/>
+            </w:pPr>
+            <w:r>
+              <w:rPr>
+                <w:rFonts w:eastAsia="Arial" w:cs="Arial"/>
+                <w:sz w:val="18"/>
+                <w:szCs w:val="18"/>
+              </w:rPr>
+              <w:t xml:space="preserve">Whether this business operates as a franchise of a larger brand or system. Yes/No. Optional.</w:t>
+            </w:r>
+          </w:p>
+        </w:tc>
+      </w:tr>
+      <w:tr>
+        <w:trPr/>
+        <w:tc>
+          <w:tcPr>
+            <w:tcW w:w="2500" w:type="dxa"/>
+            <w:tcBorders>
+              <w:top w:val="single" w:sz="2" w:space="0" w:color="CCCCCC"/>
+              <w:left w:val="single" w:sz="2" w:space="0" w:color="CCCCCC"/>
+              <w:bottom w:val="single" w:sz="2" w:space="0" w:color="CCCCCC"/>
+              <w:right w:val="single" w:sz="2" w:space="0" w:color="CCCCCC"/>
+            </w:tcBorders>
+            <w:shd w:fill="FFFFFF" w:val="clear"/>
+          </w:tcPr>
+          <w:p>
+            <w:pPr>
+              <w:pStyle w:val="Normal"/>
+              <w:rPr/>
+            </w:pPr>
+            <w:r>
+              <w:rPr>
+                <w:b/>
+                <w:rFonts w:eastAsia="Arial" w:cs="Arial"/>
+                <w:sz w:val="18"/>
+                <w:szCs w:val="18"/>
+              </w:rPr>
+              <w:t xml:space="preserve">Social Enterprise</w:t>
+            </w:r>
+          </w:p>
+        </w:tc>
+        <w:tc>
+          <w:tcPr>
+            <w:tcW w:w="6859" w:type="dxa"/>
+            <w:tcBorders>
+              <w:top w:val="single" w:sz="2" w:space="0" w:color="CCCCCC"/>
+              <w:left w:val="single" w:sz="2" w:space="0" w:color="CCCCCC"/>
+              <w:bottom w:val="single" w:sz="2" w:space="0" w:color="CCCCCC"/>
+              <w:right w:val="single" w:sz="2" w:space="0" w:color="CCCCCC"/>
+            </w:tcBorders>
+            <w:shd w:fill="FFFFFF" w:val="clear"/>
+          </w:tcPr>
+          <w:p>
+            <w:pPr>
+              <w:pStyle w:val="Normal"/>
+              <w:rPr/>
+            </w:pPr>
+            <w:r>
+              <w:rPr>
+                <w:rFonts w:eastAsia="Arial" w:cs="Arial"/>
+                <w:sz w:val="18"/>
+                <w:szCs w:val="18"/>
+              </w:rPr>
+              <w:t xml:space="preserve">Whether the business has a primary social, environmental, or community mission alongside its commercial activity. Yes/No. Optional.</w:t>
+            </w:r>
+          </w:p>
+        </w:tc>
+      </w:tr>
+      <w:tr>
+        <w:trPr/>
+        <w:tc>
+          <w:tcPr>
+            <w:tcW w:w="2500" w:type="dxa"/>
+            <w:tcBorders>
+              <w:top w:val="single" w:sz="2" w:space="0" w:color="CCCCCC"/>
+              <w:left w:val="single" w:sz="2" w:space="0" w:color="CCCCCC"/>
+              <w:bottom w:val="single" w:sz="2" w:space="0" w:color="CCCCCC"/>
+              <w:right w:val="single" w:sz="2" w:space="0" w:color="CCCCCC"/>
+            </w:tcBorders>
+            <w:shd w:fill="FFFFFF" w:val="clear"/>
+          </w:tcPr>
+          <w:p>
+            <w:pPr>
+              <w:pStyle w:val="Normal"/>
+              <w:rPr/>
+            </w:pPr>
+            <w:r>
+              <w:rPr>
+                <w:b/>
+                <w:rFonts w:eastAsia="Arial" w:cs="Arial"/>
+                <w:sz w:val="18"/>
+                <w:szCs w:val="18"/>
+              </w:rPr>
+              <w:t xml:space="preserve">Other Certifications / Designations</w:t>
+            </w:r>
+          </w:p>
+        </w:tc>
+        <w:tc>
+          <w:tcPr>
+            <w:tcW w:w="6859" w:type="dxa"/>
+            <w:tcBorders>
+              <w:top w:val="single" w:sz="2" w:space="0" w:color="CCCCCC"/>
+              <w:left w:val="single" w:sz="2" w:space="0" w:color="CCCCCC"/>
+              <w:bottom w:val="single" w:sz="2" w:space="0" w:color="CCCCCC"/>
+              <w:right w:val="single" w:sz="2" w:space="0" w:color="CCCCCC"/>
+            </w:tcBorders>
+            <w:shd w:fill="FFFFFF" w:val="clear"/>
+          </w:tcPr>
+          <w:p>
+            <w:pPr>
+              <w:pStyle w:val="Normal"/>
+              <w:rPr/>
+            </w:pPr>
+            <w:r>
+              <w:rPr>
+                <w:rFonts w:eastAsia="Arial" w:cs="Arial"/>
+                <w:sz w:val="18"/>
+                <w:szCs w:val="18"/>
+              </w:rPr>
+              <w:t xml:space="preserve">Free-text field for any additional certifications, designations, or ownership classifications not covered above. Text field. Optional.</w:t>
+            </w:r>
+          </w:p>
+        </w:tc>
+      </w:tr>
+    </w:tbl>
+    <w:p>
+      <w:pPr>
         <w:pStyle w:val="Heading2"/>
         <w:rPr/>
       </w:pPr>
@@ -2580,15 +3558,7 @@
       </w:pPr>
       <w:r>
         <w:rPr/>
-        <w:t xml:space="preserve">The Engagement entity </w:t>
-      </w:r>
-      <w:r>
-        <w:rPr/>
-        <w:t>defines</w:t>
-      </w:r>
-      <w:r>
-        <w:rPr/>
-        <w:t xml:space="preserve"> the active mentoring relationship between CBM and a client business. It is linked to a Company and tracks the lifecycle, mentor assignments, and summary analytics for the relationship. Individual sessions, NPS responses, and workshop attendance are all linked to the Engagement.</w:t>
+        <w:t>The Engagement entity defines the active mentoring relationship between CBM and a client business. It is linked to a Company and tracks the lifecycle, mentor assignments, and summary analytics for the relationship. Individual sessions, NPS responses, and workshop attendance are all linked to the Engagement.</w:t>
       </w:r>
     </w:p>
     <w:p>
@@ -7056,15 +8026,7 @@
       </w:pPr>
       <w:r>
         <w:rPr/>
-        <w:t>3.</w:t>
-      </w:r>
-      <w:r>
-        <w:rPr/>
-        <w:t>8</w:t>
-      </w:r>
-      <w:r>
-        <w:rPr/>
-        <w:t xml:space="preserve"> Engagement → Engagement Contacts</w:t>
+        <w:t>3.8 Engagement → Engagement Contacts</w:t>
       </w:r>
     </w:p>
     <w:p>
@@ -10199,19 +11161,7 @@
       </w:pPr>
       <w:r>
         <w:rPr/>
-        <w:t>4.1.</w:t>
-      </w:r>
-      <w:r>
-        <w:rPr/>
-        <w:t>3</w:t>
-      </w:r>
-      <w:r>
-        <w:rPr/>
-        <w:t xml:space="preserve"> Client </w:t>
-      </w:r>
-      <w:r>
-        <w:rPr/>
-        <w:t>Intake Process Diagram</w:t>
+        <w:t>4.1.3 Client Intake Process Diagram</w:t>
       </w:r>
     </w:p>
     <w:p>
@@ -10485,19 +11435,7 @@
       </w:pPr>
       <w:r>
         <w:rPr/>
-        <w:t>4.2.</w:t>
-      </w:r>
-      <w:r>
-        <w:rPr/>
-        <w:t xml:space="preserve">1 </w:t>
-      </w:r>
-      <w:r>
-        <w:rPr/>
-        <w:t xml:space="preserve"> Mentor Assignment </w:t>
-      </w:r>
-      <w:r>
-        <w:rPr/>
-        <w:t>Process Diagram</w:t>
+        <w:t>4.2.1  Mentor Assignment Process Diagram</w:t>
       </w:r>
     </w:p>
     <w:p>
@@ -10726,19 +11664,7 @@
       </w:pPr>
       <w:r>
         <w:rPr/>
-        <w:t>4.3.</w:t>
-      </w:r>
-      <w:r>
-        <w:rPr/>
-        <w:t>1</w:t>
-      </w:r>
-      <w:r>
-        <w:rPr/>
-        <w:t xml:space="preserve"> Session Logging </w:t>
-      </w:r>
-      <w:r>
-        <w:rPr/>
-        <w:t>Process Diagram</w:t>
+        <w:t>4.3.1 Session Logging Process Diagram</w:t>
       </w:r>
     </w:p>
     <w:p>
@@ -11037,19 +11963,7 @@
       </w:pPr>
       <w:r>
         <w:rPr/>
-        <w:t>4.4.</w:t>
-      </w:r>
-      <w:r>
-        <w:rPr/>
-        <w:t>1</w:t>
-      </w:r>
-      <w:r>
-        <w:rPr/>
-        <w:t xml:space="preserve"> NPS Survey Triggers </w:t>
-      </w:r>
-      <w:r>
-        <w:rPr/>
-        <w:t>Process Diagram</w:t>
+        <w:t>4.4.1 NPS Survey Triggers Process Diagram</w:t>
       </w:r>
     </w:p>
     <w:p>
@@ -11449,19 +12363,7 @@
       </w:pPr>
       <w:r>
         <w:rPr/>
-        <w:t>4.5.</w:t>
-      </w:r>
-      <w:r>
-        <w:rPr/>
-        <w:t>1</w:t>
-      </w:r>
-      <w:r>
-        <w:rPr/>
-        <w:t xml:space="preserve"> Inactivity Monitoring </w:t>
-      </w:r>
-      <w:r>
-        <w:rPr/>
-        <w:t>Process Diagram</w:t>
+        <w:t>4.5.1 Inactivity Monitoring Process Diagram</w:t>
       </w:r>
     </w:p>
     <w:p>
@@ -11988,19 +12890,7 @@
       </w:pPr>
       <w:r>
         <w:rPr/>
-        <w:t>4.8.</w:t>
-      </w:r>
-      <w:r>
-        <w:rPr/>
-        <w:t>1</w:t>
-      </w:r>
-      <w:r>
-        <w:rPr/>
-        <w:t xml:space="preserve"> Meeting Request </w:t>
-      </w:r>
-      <w:r>
-        <w:rPr/>
-        <w:t>Process Diagram</w:t>
+        <w:t>4.8.1 Meeting Request Process Diagram</w:t>
       </w:r>
     </w:p>
     <w:p>
@@ -12205,19 +13095,7 @@
       </w:pPr>
       <w:r>
         <w:rPr/>
-        <w:t>4.9.</w:t>
-      </w:r>
-      <w:r>
-        <w:rPr/>
-        <w:t>1</w:t>
-      </w:r>
-      <w:r>
-        <w:rPr/>
-        <w:t xml:space="preserve"> Session Summary Email </w:t>
-      </w:r>
-      <w:r>
-        <w:rPr/>
-        <w:t>Process Diagram</w:t>
+        <w:t>4.9.1 Session Summary Email Process Diagram</w:t>
       </w:r>
     </w:p>
     <w:p>
@@ -19169,15 +20047,7 @@
                 <w:sz w:val="20"/>
                 <w:szCs w:val="20"/>
               </w:rPr>
-              <w:t>1.</w:t>
-            </w:r>
-            <w:r>
-              <w:rPr>
-                <w:rFonts w:eastAsia="Arial" w:cs="Arial"/>
-                <w:sz w:val="20"/>
-                <w:szCs w:val="20"/>
-              </w:rPr>
-              <w:t>6</w:t>
+              <w:t>1.6</w:t>
             </w:r>
           </w:p>
         </w:tc>
@@ -19232,15 +20102,7 @@
                 <w:sz w:val="20"/>
                 <w:szCs w:val="20"/>
               </w:rPr>
-              <w:t xml:space="preserve">In Progress — </w:t>
-            </w:r>
-            <w:r>
-              <w:rPr>
-                <w:rFonts w:eastAsia="Arial" w:cs="Arial"/>
-                <w:sz w:val="20"/>
-                <w:szCs w:val="20"/>
-              </w:rPr>
-              <w:t>Added Process Diagrams</w:t>
+              <w:t>In Progress — Added Process Diagrams</w:t>
             </w:r>
           </w:p>
         </w:tc>

</xml_diff>

<commit_message>
Update Client, Mentor, Partners PRDs: replace old role model with 13 personas throughout all process descriptions, security tables, and data visibility rules
</commit_message>
<xml_diff>
--- a/PRDs/CBM-PRD-CRM-Client.docx
+++ b/PRDs/CBM-PRD-CRM-Client.docx
@@ -240,7 +240,7 @@
         <w:spacing w:after="120"/>
       </w:pPr>
       <w:r>
-        <w:t xml:space="preserve">The Company entity represents the business being mentored. It is the anchor record to which all Contacts, Engagements, and related activity are linked. Company data is collected in two phases: Phase 1 fields are captured on the public Mentoring Request intake form; Phase 2 fields are collected via a second form deployed at the mentor’s discretion. Both Phase 1 and Phase 2 fields may be viewed and modified at any time by the assigned mentor or any administrator directly within EspoCRM, regardless of how the data was originally collected.</w:t>
+        <w:t xml:space="preserve">The Company entity represents the business being mentored. It is the anchor record to which all Contacts, Engagements, and related activity are linked. Company data is collected in two phases: Phase 1 fields are captured on the public Mentoring Request intake form; Phase 2 fields are collected via a second form deployed at the mentor’s discretion. Both Phase 1 and Phase 2 fields may be viewed and modified at any time by the assigned Mentor or Client Administrator directly within EspoCRM, regardless of how the data was originally collected.</w:t>
       </w:r>
     </w:p>
     <w:p>
@@ -261,7 +261,7 @@
         <w:spacing w:after="120"/>
       </w:pPr>
       <w:r>
-        <w:t xml:space="preserve">These fields are collected on the public Mentoring Request form and must be sufficient to allow an admin to identify and assign an appropriate mentor. Contact information fields (First Name through Zip Code) populate the Contact record; all remaining fields populate the Company record.</w:t>
+        <w:t xml:space="preserve">These fields are collected on the public Mentoring Request form and must be sufficient to allow the Client Administrator to identify an appropriate mentor. Contact information fields (First Name through Zip Code) populate the Contact record; all remaining fields populate the Company record.</w:t>
       </w:r>
     </w:p>
     <w:p>
@@ -2313,7 +2313,7 @@
                 <w:sz w:val="18"/>
                 <w:szCs w:val="18"/>
               </w:rPr>
-              <w:t xml:space="preserve">The actual EIN number if deemed relevant by the mentor. Text field. Admin and assigned mentor access only. Not collected on the intake form — mentor-populated only. Restricted field.</w:t>
+              <w:t xml:space="preserve">The actual EIN number if deemed relevant by the mentor. Text field. Client Administrator, Client Assignment Coordinator, and assigned Mentor(s) access only. Not collected on the intake form — mentor-populated only. Restricted field.</w:t>
             </w:r>
           </w:p>
         </w:tc>
@@ -2337,7 +2337,7 @@
         <w:spacing w:after="120"/>
       </w:pPr>
       <w:r>
-        <w:t xml:space="preserve">The Contact entity represents an individual person associated with a business being mentored. Multiple contacts may be linked to a single Company. The person who submits the Phase 1 intake form automatically becomes the first Contact linked to the Company. Additional contacts can be added by an admin or mentor as the engagement progresses.</w:t>
+        <w:t xml:space="preserve">The Contact entity represents an individual person associated with a business being mentored. Multiple contacts may be linked to a single Company. The person who submits the Phase 1 intake form automatically becomes the first Contact linked to the Company. Additional contacts can be added by the Client Administrator or assigned Mentor as the engagement progresses.</w:t>
       </w:r>
     </w:p>
     <w:p>
@@ -2944,7 +2944,7 @@
         <w:spacing w:after="60"/>
       </w:pPr>
       <w:r>
-        <w:t xml:space="preserve">Submitted — Mentoring Request received; pending admin review and mentor nomination.</w:t>
+        <w:t xml:space="preserve">Submitted — Mentoring Request received; pending Client Administrator review and Client Assignment Coordinator mentor nomination.</w:t>
       </w:r>
     </w:p>
     <w:p>
@@ -2956,7 +2956,7 @@
         <w:spacing w:after="60"/>
       </w:pPr>
       <w:r>
-        <w:t xml:space="preserve">Declined — Admin has reviewed the application and determined the request is not suitable for the program. Terminal status. No mentor assignment occurs. Admin notifies the applicant via email. The Contact and Company records are retained permanently for historical reference.</w:t>
+        <w:t xml:space="preserve">Declined — Client Administrator has reviewed the application and determined the request is not suitable for the program. Terminal status. No mentor assignment occurs. Client Administrator notifies the client candidate via email. The Contact and Company records are retained permanently for historical reference.</w:t>
       </w:r>
     </w:p>
     <w:p>
@@ -2968,7 +2968,7 @@
         <w:spacing w:after="60"/>
       </w:pPr>
       <w:r>
-        <w:t xml:space="preserve">Pending Acceptance — Admin has nominated a mentor; system has notified the mentor and is awaiting their acceptance or refusal. A configurable acceptance window applies (default: 48 hours). If the mentor refuses, the Engagement reverts to Submitted and the admin is notified to nominate another mentor.</w:t>
+        <w:t xml:space="preserve">Pending Acceptance — Client Assignment Coordinator has nominated a mentor; system has notified the mentor and is awaiting their acceptance or refusal. A configurable acceptance window applies (default: 48 hours). If the mentor refuses, the Engagement reverts to Submitted and the Client Assignment Coordinator is notified to nominate another mentor.</w:t>
       </w:r>
     </w:p>
     <w:p>
@@ -3016,7 +3016,7 @@
         <w:spacing w:after="60"/>
       </w:pPr>
       <w:r>
-        <w:t xml:space="preserve">Dormant — No activity recorded and no future sessions scheduled beyond the cadence-aware threshold (see Section 4.5). System-triggered. Prompts admin follow-up. Reverts to Active when activity resumes.</w:t>
+        <w:t xml:space="preserve">Dormant — No activity recorded and no future sessions scheduled beyond the cadence-aware threshold (see Section 4.5). System-triggered. Prompts Client Administrator follow-up. Reverts to Active when activity resumes.</w:t>
       </w:r>
     </w:p>
     <w:p>
@@ -3040,7 +3040,7 @@
         <w:spacing w:after="60"/>
       </w:pPr>
       <w:r>
-        <w:t xml:space="preserve">Abandoned — Inactive for a configurable period (default: 90 days) with no response. System-triggered. Treated as permanently closed. All thresholds are admin-configurable system settings.</w:t>
+        <w:t xml:space="preserve">Abandoned — Inactive for a configurable period (default: 90 days) with no response. System-triggered. Treated as permanently closed. All thresholds are configurable system settings.</w:t>
       </w:r>
     </w:p>
     <w:p>
@@ -3052,7 +3052,7 @@
         <w:spacing w:after="60"/>
       </w:pPr>
       <w:r>
-        <w:t xml:space="preserve">Completed — The engagement was formally closed with goals achieved or by mutual agreement. Admin or mentor initiated.</w:t>
+        <w:t xml:space="preserve">Completed — The engagement was formally closed with goals achieved or by mutual agreement. Client Administrator or assigned Mentor initiated.</w:t>
       </w:r>
     </w:p>
     <w:p>
@@ -3900,7 +3900,7 @@
                 <w:sz w:val="18"/>
                 <w:szCs w:val="18"/>
               </w:rPr>
-              <w:t xml:space="preserve">Expected frequency of mentor-client meetings. Dropdown. Values: Weekly | Bi-Weekly | Monthly | As Needed. Required. Set by admin or mentor at time of assignment. Used by inactivity monitoring to calculate cadence-aware Dormant thresholds: Weekly = 14 days, Bi-Weekly = 21 days, Monthly = 45 days, As Needed = 60 days.</w:t>
+              <w:t xml:space="preserve">Expected frequency of mentor-client meetings. Dropdown. Values: Weekly | Bi-Weekly | Monthly | As Needed. Required. Set by Client Administrator or assigned Mentor at time of assignment. Used by inactivity monitoring to calculate cadence-aware Dormant thresholds: Weekly = 14 days, Bi-Weekly = 21 days, Monthly = 45 days, As Needed = 60 days.</w:t>
             </w:r>
           </w:p>
         </w:tc>
@@ -3958,7 +3958,7 @@
                 <w:sz w:val="18"/>
                 <w:szCs w:val="18"/>
               </w:rPr>
-              <w:t xml:space="preserve">Scheduled date and time of the next mentor-client meeting. Date/time field. Initially system-populated from the most recently logged Session’s Next Session Date. Editable by the assigned mentor or admin at any time. When saved, automatically triggers a meeting request to all Engagement Contacts and assigned mentors (Primary Mentor, Co-Mentors, SMEs). Updating this field counts as a qualifying activity event that resets the inactivity monitoring clock. Optional.</w:t>
+              <w:t xml:space="preserve">Scheduled date and time of the next mentor-client meeting. Date/time field. Initially system-populated from the most recently logged Session’s Next Session Date. Editable by the Client Administrator or assigned Mentor at any time. When saved, automatically triggers a meeting request to all Engagement Contacts and assigned mentors (Primary Mentor, Co-Mentors, SMEs). Updating this field counts as a qualifying activity event that resets the inactivity monitoring clock. Optional.</w:t>
             </w:r>
           </w:p>
         </w:tc>
@@ -4590,7 +4590,7 @@
                 <w:sz w:val="18"/>
                 <w:szCs w:val="18"/>
               </w:rPr>
-              <w:t xml:space="preserve">Private notes from the mentor about the session content, observations, and context. Rich text. Access restricted to assigned mentor and admin. Optional.</w:t>
+              <w:t xml:space="preserve">Private notes from the mentor about the session content, observations, and context. Rich text. Access restricted to Client Administrator, Mentor Administrator, and assigned Mentor(s). Optional.</w:t>
             </w:r>
           </w:p>
         </w:tc>
@@ -6567,7 +6567,7 @@
         <w:spacing w:after="60"/>
       </w:pPr>
       <w:r>
-        <w:t xml:space="preserve">Additional Contacts may be added to the Company at any time by an admin or the assigned mentor as additional individuals from the business become involved in the engagement.</w:t>
+        <w:t xml:space="preserve">Additional Contacts may be added to the Company at any time by the Client Administrator or assigned Mentor as additional individuals from the business become involved in the engagement.</w:t>
       </w:r>
     </w:p>
     <w:p>
@@ -6727,7 +6727,7 @@
         <w:spacing w:after="60"/>
       </w:pPr>
       <w:r>
-        <w:t xml:space="preserve">The Assigned Mentor link is set by an admin when the Engagement moves from Submitted to Assigned status.</w:t>
+        <w:t xml:space="preserve">The Assigned Mentor link is set by the Client Assignment Coordinator when the Engagement moves from Submitted to Assigned status.</w:t>
       </w:r>
     </w:p>
     <w:p>
@@ -6911,7 +6911,7 @@
         <w:spacing w:after="60"/>
       </w:pPr>
       <w:r>
-        <w:t xml:space="preserve">From the Engagement record, all linked NPS Survey Responses are visible in a relationship panel, allowing mentors and admins to track satisfaction trends over the course of the engagement.</w:t>
+        <w:t xml:space="preserve">From the Engagement record, all linked NPS Survey Responses are visible in a relationship panel, allowing Mentors, Client Administrators, and Mentor Administrators to track satisfaction trends over the course of the engagement.</w:t>
       </w:r>
     </w:p>
     <w:p>
@@ -7261,7 +7261,7 @@
         <w:spacing w:after="60"/>
       </w:pPr>
       <w:r>
-        <w:t xml:space="preserve">Admin receives an automatic system notification of the new submission.</w:t>
+        <w:t xml:space="preserve">Client Administrator receives an automatic system notification of the new submission.</w:t>
       </w:r>
     </w:p>
     <w:p>
@@ -7273,7 +7273,7 @@
         <w:spacing w:after="60"/>
       </w:pPr>
       <w:r>
-        <w:t xml:space="preserve">Admin reviews the submission for completeness and basic eligibility. Admin determines whether the request is suitable for the program.</w:t>
+        <w:t xml:space="preserve">Client Administrator reviews the submission for completeness and basic eligibility. Client Administrator determines whether the request is suitable for the program.</w:t>
       </w:r>
     </w:p>
     <w:p>
@@ -7285,7 +7285,7 @@
         <w:spacing w:after="60"/>
       </w:pPr>
       <w:r>
-        <w:t xml:space="preserve">If eligible, admin proceeds to mentor nomination (see Section 4.2). If not eligible, admin updates the Engagement status to Declined and notifies the applicant via email. No automated notification is sent. The Contact and Company records are retained permanently for historical reference.</w:t>
+        <w:t xml:space="preserve">If eligible, the client candidate proceeds to mentor assignment (see Section 4.2). If not eligible, the Client Administrator updates the Engagement status to Declined and notifies the client candidate via email. No automated notification is sent. The Contact and Company records are retained permanently for historical reference.</w:t>
       </w:r>
     </w:p>
     <w:p>
@@ -7342,7 +7342,7 @@
         <w:spacing w:after="120"/>
       </w:pPr>
       <w:r>
-        <w:t xml:space="preserve">The mentor assignment process begins after the admin has reviewed and accepted a client intake submission.</w:t>
+        <w:t xml:space="preserve">The mentor assignment process begins after the Client Administrator has reviewed and accepted a client intake submission.</w:t>
       </w:r>
     </w:p>
     <w:p>
@@ -7359,7 +7359,7 @@
         <w:spacing w:after="60"/>
       </w:pPr>
       <w:r>
-        <w:t xml:space="preserve">Admin searches the mentor pool in EspoCRM, filtering by NAICS sector/subsector, Mentoring Focus Areas, skills/expertise tags, Active status, accepting clients = Yes, and available capacity.</w:t>
+        <w:t xml:space="preserve">Client Assignment Coordinator searches the mentor pool in EspoCRM, filtering by NAICS sector/subsector, Mentoring Focus Areas, skills/expertise tags, Active status, accepting clients = Yes, and available capacity.</w:t>
       </w:r>
     </w:p>
     <w:p>
@@ -7371,7 +7371,7 @@
         <w:spacing w:after="60"/>
       </w:pPr>
       <w:r>
-        <w:t xml:space="preserve">Admin nominates a primary mentor (and optionally one or more co-mentors and/or SMEs). System verifies each nominated mentor is Active, accepting clients, and has capacity before allowing nomination.</w:t>
+        <w:t xml:space="preserve">Client Assignment Coordinator nominates a primary mentor (and optionally one or more co-mentors and/or SMEs). System verifies each nominated mentor is Active, accepting clients, and has capacity before allowing nomination.</w:t>
       </w:r>
     </w:p>
     <w:p>
@@ -7407,7 +7407,7 @@
         <w:spacing w:after="60"/>
       </w:pPr>
       <w:r>
-        <w:t xml:space="preserve">If the mentor accepts: Engagement status changes to Assigned. Admin is notified. Proceed to Step 6.</w:t>
+        <w:t xml:space="preserve">If the mentor accepts: Engagement status changes to Assigned. Client Assignment Coordinator is notified. Proceed to Step 6.</w:t>
       </w:r>
     </w:p>
     <w:p>
@@ -7419,7 +7419,7 @@
         <w:spacing w:after="60"/>
       </w:pPr>
       <w:r>
-        <w:t xml:space="preserve">If the mentor refuses: Engagement status reverts to Submitted. Admin is notified and returns to Step 1 to nominate a different mentor. No explanation is required from the refusing mentor.</w:t>
+        <w:t xml:space="preserve">If the mentor refuses: Engagement status reverts to Submitted. Client Assignment Coordinator is notified and returns to Step 1 to nominate a different mentor. No explanation is required from the refusing mentor.</w:t>
       </w:r>
     </w:p>
     <w:p>
@@ -7431,7 +7431,7 @@
         <w:spacing w:after="60"/>
       </w:pPr>
       <w:r>
-        <w:t xml:space="preserve">If no response within the acceptance window: Admin is alerted to follow up or nominate a different mentor. Engagement remains in Pending Acceptance.</w:t>
+        <w:t xml:space="preserve">If no response within the acceptance window: Client Assignment Coordinator is alerted to follow up or nominate a different mentor. Engagement remains in Pending Acceptance.</w:t>
       </w:r>
     </w:p>
     <w:p>
@@ -7500,7 +7500,7 @@
         <w:spacing w:after="120"/>
       </w:pPr>
       <w:r>
-        <w:t xml:space="preserve">Sessions are logged by the assigned mentor, co-mentor, or SME after each meeting with the client. There is no admin review or approval of session records.</w:t>
+        <w:t xml:space="preserve">Sessions are logged by the assigned Mentor, Co-Mentor, or SME after each meeting with the client. There is no administrative review or approval of session records.</w:t>
       </w:r>
     </w:p>
     <w:p>
@@ -7768,7 +7768,7 @@
         <w:spacing w:after="60"/>
       </w:pPr>
       <w:r>
-        <w:t xml:space="preserve">NPS Survey Response is visible to the assigned mentor and admin on the Engagement record. No notification is sent to the mentor — they will see the response on next login.</w:t>
+        <w:t xml:space="preserve">NPS Survey Response is visible to the Client Administrator, Mentor Administrator, and assigned Mentor(s) on the Engagement record. No notification is sent to the Mentor — they will see the response on next login.</w:t>
       </w:r>
     </w:p>
     <w:p>
@@ -7789,7 +7789,7 @@
         <w:spacing w:after="120"/>
       </w:pPr>
       <w:r>
-        <w:t xml:space="preserve">Inactivity monitoring tracks engagement activity and automatically transitions Engagement status when activity falls below expected thresholds. All thresholds are admin-configurable system settings. The monitoring clock resets on any qualifying activity event.</w:t>
+        <w:t xml:space="preserve">Inactivity monitoring tracks engagement activity and automatically transitions Engagement status when activity falls below expected thresholds. All thresholds are configurable system settings. The monitoring clock resets on any qualifying activity event.</w:t>
       </w:r>
     </w:p>
     <w:p>
@@ -7863,7 +7863,7 @@
         <w:spacing w:after="120"/>
       </w:pPr>
       <w:r>
-        <w:t xml:space="preserve">Cadence-aware Dormant thresholds (admin-configurable, defaults shown):</w:t>
+        <w:t xml:space="preserve">Cadence-aware Dormant thresholds (configurable, defaults shown):</w:t>
       </w:r>
     </w:p>
     <w:p>
@@ -7948,7 +7948,7 @@
         <w:spacing w:after="60"/>
       </w:pPr>
       <w:r>
-        <w:t xml:space="preserve">When threshold is exceeded: Engagement status changes from Active to Dormant. Admin receives an alert notification.</w:t>
+        <w:t xml:space="preserve">When threshold is exceeded: Engagement status changes from Active to Dormant. Client Administrator receives an alert notification.</w:t>
       </w:r>
     </w:p>
     <w:p>
@@ -7960,7 +7960,7 @@
         <w:spacing w:after="60"/>
       </w:pPr>
       <w:r>
-        <w:t xml:space="preserve">Admin reviews the Dormant engagement and follows up with the mentor as appropriate.</w:t>
+        <w:t xml:space="preserve">Client Administrator reviews the Dormant engagement and follows up with the Mentor as appropriate.</w:t>
       </w:r>
     </w:p>
     <w:p>
@@ -7984,7 +7984,7 @@
         <w:spacing w:after="60"/>
       </w:pPr>
       <w:r>
-        <w:t xml:space="preserve">If no activity for an additional 60 days after becoming Dormant: Engagement status changes to Inactive. Admin receives an alert notification.</w:t>
+        <w:t xml:space="preserve">If no activity for an additional 60 days after becoming Dormant: Engagement status changes to Inactive. Client Administrator receives an alert notification.</w:t>
       </w:r>
     </w:p>
     <w:p>
@@ -7996,7 +7996,7 @@
         <w:spacing w:after="60"/>
       </w:pPr>
       <w:r>
-        <w:t xml:space="preserve">If no activity for a further 90 days after becoming Inactive: Engagement status changes to Abandoned. Engagement is treated as permanently closed. Admin receives a final notification.</w:t>
+        <w:t xml:space="preserve">If no activity for a further 90 days after becoming Inactive: Engagement status changes to Abandoned. Engagement is treated as permanently closed. Client Administrator receives a final notification.</w:t>
       </w:r>
     </w:p>
     <w:p>
@@ -8035,7 +8035,7 @@
         <w:spacing w:after="120"/>
       </w:pPr>
       <w:r>
-        <w:t xml:space="preserve">An engagement may be formally closed by an admin or mentor (Completed status) or automatically by the system (Abandoned status). In either case, a final NPS survey is triggered and the Engagement record is preserved for historical reporting.</w:t>
+        <w:t xml:space="preserve">An engagement may be formally closed by the Client Administrator or assigned Mentor (Completed status) or automatically by the system (Abandoned status). In either case, a final NPS survey is triggered and the Engagement record is preserved for historical reporting.</w:t>
       </w:r>
     </w:p>
     <w:p>
@@ -8048,7 +8048,7 @@
         <w:spacing w:after="120"/>
       </w:pPr>
       <w:r>
-        <w:t xml:space="preserve">Mentor or admin-initiated close (Completed):</w:t>
+        <w:t xml:space="preserve">Client Administrator or Mentor-initiated close (Completed):</w:t>
       </w:r>
     </w:p>
     <w:p>
@@ -8060,7 +8060,7 @@
         <w:spacing w:after="60"/>
       </w:pPr>
       <w:r>
-        <w:t xml:space="preserve">Admin or mentor navigates to the Engagement record and changes status to Completed.</w:t>
+        <w:t xml:space="preserve">Client Administrator or assigned Mentor navigates to the Engagement record and changes status to Completed.</w:t>
       </w:r>
     </w:p>
     <w:p>
@@ -8108,7 +8108,7 @@
         <w:spacing w:after="60"/>
       </w:pPr>
       <w:r>
-        <w:t xml:space="preserve">Engagement record becomes read-only for core fields. Notes, Comments, and Documents may still be added post-close by the mentor or admin.</w:t>
+        <w:t xml:space="preserve">Engagement record becomes read-only for core fields. Notes, Comments, and Documents may still be added post-close by the Client Administrator or assigned Mentor.</w:t>
       </w:r>
     </w:p>
     <w:p>
@@ -8181,7 +8181,7 @@
         <w:spacing w:after="60"/>
       </w:pPr>
       <w:r>
-        <w:t xml:space="preserve">Admin receives a notification that the Engagement has been Abandoned.</w:t>
+        <w:t xml:space="preserve">Client Administrator receives a notification that the Engagement has been Abandoned.</w:t>
       </w:r>
     </w:p>
     <w:p>
@@ -8193,7 +8193,7 @@
         <w:spacing w:after="60"/>
       </w:pPr>
       <w:r>
-        <w:t xml:space="preserve">Engagement record becomes read-only for core fields. Notes, Comments, and Documents may still be added post-close by the mentor or admin.</w:t>
+        <w:t xml:space="preserve">Engagement record becomes read-only for core fields. Notes, Comments, and Documents may still be added post-close by the Client Administrator or assigned Mentor.</w:t>
       </w:r>
     </w:p>
     <w:p>
@@ -8288,7 +8288,7 @@
         <w:spacing w:after="120"/>
       </w:pPr>
       <w:r>
-        <w:t xml:space="preserve">A meeting request is sent automatically whenever the Next Session Date/Time field is saved on the Engagement record — whether set via the Session form or edited directly by the mentor or admin on the Engagement.</w:t>
+        <w:t xml:space="preserve">A meeting request is sent automatically whenever the Next Session Date/Time field is saved on the Engagement record — whether set via the Session form or edited directly by the Client Administrator or assigned Mentor on the Engagement.</w:t>
       </w:r>
     </w:p>
     <w:p>
@@ -8300,7 +8300,7 @@
         <w:spacing w:after="60"/>
       </w:pPr>
       <w:r>
-        <w:t xml:space="preserve">Mentor or admin saves the Engagement record with a Next Session Date/Time value (new or updated).</w:t>
+        <w:t xml:space="preserve">Client Administrator or assigned Mentor saves the Engagement record with a Next Session Date/Time value (new or updated).</w:t>
       </w:r>
     </w:p>
     <w:p>
@@ -8669,7 +8669,7 @@
                 <w:sz w:val="18"/>
                 <w:szCs w:val="18"/>
               </w:rPr>
-              <w:t xml:space="preserve">Admin</w:t>
+              <w:t xml:space="preserve">Client Administrator</w:t>
             </w:r>
           </w:p>
         </w:tc>
@@ -8757,7 +8757,7 @@
                 <w:sz w:val="18"/>
                 <w:szCs w:val="18"/>
               </w:rPr>
-              <w:t xml:space="preserve">All</w:t>
+              <w:t xml:space="preserve">No</w:t>
             </w:r>
           </w:p>
         </w:tc>
@@ -8803,7 +8803,7 @@
                 <w:sz w:val="18"/>
                 <w:szCs w:val="18"/>
               </w:rPr>
-              <w:t xml:space="preserve">Primary Mentor</w:t>
+              <w:t xml:space="preserve">Client Assignment Coordinator</w:t>
             </w:r>
           </w:p>
         </w:tc>
@@ -8847,7 +8847,7 @@
                 <w:sz w:val="18"/>
                 <w:szCs w:val="18"/>
               </w:rPr>
-              <w:t xml:space="preserve">Own</w:t>
+              <w:t xml:space="preserve">All</w:t>
             </w:r>
           </w:p>
         </w:tc>
@@ -8869,7 +8869,7 @@
                 <w:sz w:val="18"/>
                 <w:szCs w:val="18"/>
               </w:rPr>
-              <w:t xml:space="preserve">Own</w:t>
+              <w:t xml:space="preserve">No</w:t>
             </w:r>
           </w:p>
         </w:tc>
@@ -8913,7 +8913,7 @@
                 <w:sz w:val="18"/>
                 <w:szCs w:val="18"/>
               </w:rPr>
-              <w:t xml:space="preserve">Read and update own assigned clients only.</w:t>
+              <w:t xml:space="preserve">Read access to support matching. No update rights.</w:t>
             </w:r>
           </w:p>
         </w:tc>
@@ -8937,7 +8937,7 @@
                 <w:sz w:val="18"/>
                 <w:szCs w:val="18"/>
               </w:rPr>
-              <w:t xml:space="preserve">Co-Mentor</w:t>
+              <w:t xml:space="preserve">Mentor Administrator</w:t>
             </w:r>
           </w:p>
         </w:tc>
@@ -9047,7 +9047,7 @@
                 <w:sz w:val="18"/>
                 <w:szCs w:val="18"/>
               </w:rPr>
-              <w:t xml:space="preserve">Scoped to engagements where assigned as Co-Mentor.</w:t>
+              <w:t xml:space="preserve">Scoped to mentor Contact records only.</w:t>
             </w:r>
           </w:p>
         </w:tc>
@@ -9071,7 +9071,7 @@
                 <w:sz w:val="18"/>
                 <w:szCs w:val="18"/>
               </w:rPr>
-              <w:t xml:space="preserve">SME</w:t>
+              <w:t xml:space="preserve">Mentor</w:t>
             </w:r>
           </w:p>
         </w:tc>
@@ -9137,34 +9137,34 @@
                 <w:sz w:val="18"/>
                 <w:szCs w:val="18"/>
               </w:rPr>
+              <w:t xml:space="preserve">Own</w:t>
+            </w:r>
+          </w:p>
+        </w:tc>
+        <w:tc>
+          <w:tcPr>
+            <w:tcW w:type="dxa" w:w="900"/>
+            <w:shd w:fill="F2F2F2" w:val="clear"/>
+            <w:tcMar>
+              <w:top w:type="dxa" w:w="80"/>
+              <w:left w:type="dxa" w:w="120"/>
+              <w:bottom w:type="dxa" w:w="80"/>
+              <w:right w:type="dxa" w:w="120"/>
+            </w:tcMar>
+          </w:tcPr>
+          <w:p>
+            <w:r>
+              <w:rPr>
+                <w:rFonts w:ascii="Arial" w:cs="Arial" w:hAnsi="Arial"/>
+                <w:sz w:val="18"/>
+                <w:szCs w:val="18"/>
+              </w:rPr>
               <w:t xml:space="preserve">No</w:t>
             </w:r>
           </w:p>
         </w:tc>
         <w:tc>
           <w:tcPr>
-            <w:tcW w:type="dxa" w:w="900"/>
-            <w:shd w:fill="F2F2F2" w:val="clear"/>
-            <w:tcMar>
-              <w:top w:type="dxa" w:w="80"/>
-              <w:left w:type="dxa" w:w="120"/>
-              <w:bottom w:type="dxa" w:w="80"/>
-              <w:right w:type="dxa" w:w="120"/>
-            </w:tcMar>
-          </w:tcPr>
-          <w:p>
-            <w:r>
-              <w:rPr>
-                <w:rFonts w:ascii="Arial" w:cs="Arial" w:hAnsi="Arial"/>
-                <w:sz w:val="18"/>
-                <w:szCs w:val="18"/>
-              </w:rPr>
-              <w:t xml:space="preserve">No</w:t>
-            </w:r>
-          </w:p>
-        </w:tc>
-        <w:tc>
-          <w:tcPr>
             <w:tcW w:type="dxa" w:w="3960"/>
             <w:shd w:fill="F2F2F2" w:val="clear"/>
             <w:tcMar>
@@ -9181,7 +9181,7 @@
                 <w:sz w:val="18"/>
                 <w:szCs w:val="18"/>
               </w:rPr>
-              <w:t xml:space="preserve">Read only. Scoped to engagements where assigned as SME.</w:t>
+              <w:t xml:space="preserve">Own assigned clients only.</w:t>
             </w:r>
           </w:p>
         </w:tc>
@@ -9205,7 +9205,7 @@
                 <w:sz w:val="18"/>
                 <w:szCs w:val="18"/>
               </w:rPr>
-              <w:t xml:space="preserve">Board Member</w:t>
+              <w:t xml:space="preserve">Executive Member</w:t>
             </w:r>
           </w:p>
         </w:tc>
@@ -9249,6 +9249,28 @@
                 <w:sz w:val="18"/>
                 <w:szCs w:val="18"/>
               </w:rPr>
+              <w:t xml:space="preserve">All</w:t>
+            </w:r>
+          </w:p>
+        </w:tc>
+        <w:tc>
+          <w:tcPr>
+            <w:tcW w:type="dxa" w:w="900"/>
+            <w:shd w:fill="FFFFFF" w:val="clear"/>
+            <w:tcMar>
+              <w:top w:type="dxa" w:w="80"/>
+              <w:left w:type="dxa" w:w="120"/>
+              <w:bottom w:type="dxa" w:w="80"/>
+              <w:right w:type="dxa" w:w="120"/>
+            </w:tcMar>
+          </w:tcPr>
+          <w:p>
+            <w:r>
+              <w:rPr>
+                <w:rFonts w:ascii="Arial" w:cs="Arial" w:hAnsi="Arial"/>
+                <w:sz w:val="18"/>
+                <w:szCs w:val="18"/>
+              </w:rPr>
               <w:t xml:space="preserve">No</w:t>
             </w:r>
           </w:p>
@@ -9277,28 +9299,6 @@
         </w:tc>
         <w:tc>
           <w:tcPr>
-            <w:tcW w:type="dxa" w:w="900"/>
-            <w:shd w:fill="FFFFFF" w:val="clear"/>
-            <w:tcMar>
-              <w:top w:type="dxa" w:w="80"/>
-              <w:left w:type="dxa" w:w="120"/>
-              <w:bottom w:type="dxa" w:w="80"/>
-              <w:right w:type="dxa" w:w="120"/>
-            </w:tcMar>
-          </w:tcPr>
-          <w:p>
-            <w:r>
-              <w:rPr>
-                <w:rFonts w:ascii="Arial" w:cs="Arial" w:hAnsi="Arial"/>
-                <w:sz w:val="18"/>
-                <w:szCs w:val="18"/>
-              </w:rPr>
-              <w:t xml:space="preserve">No</w:t>
-            </w:r>
-          </w:p>
-        </w:tc>
-        <w:tc>
-          <w:tcPr>
             <w:tcW w:type="dxa" w:w="3960"/>
             <w:shd w:fill="FFFFFF" w:val="clear"/>
             <w:tcMar>
@@ -9315,7 +9315,7 @@
                 <w:sz w:val="18"/>
                 <w:szCs w:val="18"/>
               </w:rPr>
-              <w:t xml:space="preserve">No access to individual client records.</w:t>
+              <w:t xml:space="preserve">Read only. No restrictions on record visibility.</w:t>
             </w:r>
           </w:p>
         </w:tc>
@@ -9528,7 +9528,7 @@
                 <w:sz w:val="18"/>
                 <w:szCs w:val="18"/>
               </w:rPr>
-              <w:t xml:space="preserve">Admin</w:t>
+              <w:t xml:space="preserve">Client Administrator</w:t>
             </w:r>
           </w:p>
         </w:tc>
@@ -9772,7 +9772,7 @@
                 <w:sz w:val="18"/>
                 <w:szCs w:val="18"/>
               </w:rPr>
-              <w:t xml:space="preserve">Can update fields and log activity on own engagements. Cannot change status to Completed or Abandoned — admin only.</w:t>
+              <w:t xml:space="preserve">Can update fields and log activity on own engagements. Cannot change status to Completed or Abandoned — Client Administrator only.</w:t>
             </w:r>
           </w:p>
         </w:tc>
@@ -10387,7 +10387,7 @@
                 <w:sz w:val="18"/>
                 <w:szCs w:val="18"/>
               </w:rPr>
-              <w:t xml:space="preserve">Admin</w:t>
+              <w:t xml:space="preserve">Client Administrator</w:t>
             </w:r>
           </w:p>
         </w:tc>
@@ -10475,7 +10475,7 @@
                 <w:sz w:val="18"/>
                 <w:szCs w:val="18"/>
               </w:rPr>
-              <w:t xml:space="preserve">All</w:t>
+              <w:t xml:space="preserve">No</w:t>
             </w:r>
           </w:p>
         </w:tc>
@@ -10521,7 +10521,7 @@
                 <w:sz w:val="18"/>
                 <w:szCs w:val="18"/>
               </w:rPr>
-              <w:t xml:space="preserve">Primary Mentor</w:t>
+              <w:t xml:space="preserve">Mentor Administrator</w:t>
             </w:r>
           </w:p>
         </w:tc>
@@ -10543,7 +10543,7 @@
                 <w:sz w:val="18"/>
                 <w:szCs w:val="18"/>
               </w:rPr>
-              <w:t xml:space="preserve">Own</w:t>
+              <w:t xml:space="preserve">No</w:t>
             </w:r>
           </w:p>
         </w:tc>
@@ -10565,7 +10565,7 @@
                 <w:sz w:val="18"/>
                 <w:szCs w:val="18"/>
               </w:rPr>
-              <w:t xml:space="preserve">Own</w:t>
+              <w:t xml:space="preserve">All</w:t>
             </w:r>
           </w:p>
         </w:tc>
@@ -10587,7 +10587,7 @@
                 <w:sz w:val="18"/>
                 <w:szCs w:val="18"/>
               </w:rPr>
-              <w:t xml:space="preserve">Own</w:t>
+              <w:t xml:space="preserve">No</w:t>
             </w:r>
           </w:p>
         </w:tc>
@@ -10631,7 +10631,7 @@
                 <w:sz w:val="18"/>
                 <w:szCs w:val="18"/>
               </w:rPr>
-              <w:t xml:space="preserve">Can create and edit sessions on own engagements.</w:t>
+              <w:t xml:space="preserve">Read only for quality monitoring.</w:t>
             </w:r>
           </w:p>
         </w:tc>
@@ -10655,7 +10655,7 @@
                 <w:sz w:val="18"/>
                 <w:szCs w:val="18"/>
               </w:rPr>
-              <w:t xml:space="preserve">Co-Mentor</w:t>
+              <w:t xml:space="preserve">Mentor</w:t>
             </w:r>
           </w:p>
         </w:tc>
@@ -10765,7 +10765,7 @@
                 <w:sz w:val="18"/>
                 <w:szCs w:val="18"/>
               </w:rPr>
-              <w:t xml:space="preserve">Can create and edit sessions on assigned engagements.</w:t>
+              <w:t xml:space="preserve">Can create and edit sessions on own engagements.</w:t>
             </w:r>
           </w:p>
         </w:tc>
@@ -10789,7 +10789,7 @@
                 <w:sz w:val="18"/>
                 <w:szCs w:val="18"/>
               </w:rPr>
-              <w:t xml:space="preserve">SME</w:t>
+              <w:t xml:space="preserve">Executive Member</w:t>
             </w:r>
           </w:p>
         </w:tc>
@@ -10811,7 +10811,7 @@
                 <w:sz w:val="18"/>
                 <w:szCs w:val="18"/>
               </w:rPr>
-              <w:t xml:space="preserve">Own</w:t>
+              <w:t xml:space="preserve">No</w:t>
             </w:r>
           </w:p>
         </w:tc>
@@ -10833,7 +10833,7 @@
                 <w:sz w:val="18"/>
                 <w:szCs w:val="18"/>
               </w:rPr>
-              <w:t xml:space="preserve">Own</w:t>
+              <w:t xml:space="preserve">All</w:t>
             </w:r>
           </w:p>
         </w:tc>
@@ -10855,7 +10855,7 @@
                 <w:sz w:val="18"/>
                 <w:szCs w:val="18"/>
               </w:rPr>
-              <w:t xml:space="preserve">Own</w:t>
+              <w:t xml:space="preserve">No</w:t>
             </w:r>
           </w:p>
         </w:tc>
@@ -10899,141 +10899,7 @@
                 <w:sz w:val="18"/>
                 <w:szCs w:val="18"/>
               </w:rPr>
-              <w:t xml:space="preserve">Can create and edit sessions on assigned engagements.</w:t>
-            </w:r>
-          </w:p>
-        </w:tc>
-      </w:tr>
-      <w:tr>
-        <w:tc>
-          <w:tcPr>
-            <w:tcW w:type="dxa" w:w="1800"/>
-            <w:shd w:fill="FFFFFF" w:val="clear"/>
-            <w:tcMar>
-              <w:top w:type="dxa" w:w="80"/>
-              <w:left w:type="dxa" w:w="120"/>
-              <w:bottom w:type="dxa" w:w="80"/>
-              <w:right w:type="dxa" w:w="120"/>
-            </w:tcMar>
-          </w:tcPr>
-          <w:p>
-            <w:r>
-              <w:rPr>
-                <w:rFonts w:ascii="Arial" w:cs="Arial" w:hAnsi="Arial"/>
-                <w:sz w:val="18"/>
-                <w:szCs w:val="18"/>
-              </w:rPr>
-              <w:t xml:space="preserve">Board Member</w:t>
-            </w:r>
-          </w:p>
-        </w:tc>
-        <w:tc>
-          <w:tcPr>
-            <w:tcW w:type="dxa" w:w="900"/>
-            <w:shd w:fill="FFFFFF" w:val="clear"/>
-            <w:tcMar>
-              <w:top w:type="dxa" w:w="80"/>
-              <w:left w:type="dxa" w:w="120"/>
-              <w:bottom w:type="dxa" w:w="80"/>
-              <w:right w:type="dxa" w:w="120"/>
-            </w:tcMar>
-          </w:tcPr>
-          <w:p>
-            <w:r>
-              <w:rPr>
-                <w:rFonts w:ascii="Arial" w:cs="Arial" w:hAnsi="Arial"/>
-                <w:sz w:val="18"/>
-                <w:szCs w:val="18"/>
-              </w:rPr>
-              <w:t xml:space="preserve">No</w:t>
-            </w:r>
-          </w:p>
-        </w:tc>
-        <w:tc>
-          <w:tcPr>
-            <w:tcW w:type="dxa" w:w="900"/>
-            <w:shd w:fill="FFFFFF" w:val="clear"/>
-            <w:tcMar>
-              <w:top w:type="dxa" w:w="80"/>
-              <w:left w:type="dxa" w:w="120"/>
-              <w:bottom w:type="dxa" w:w="80"/>
-              <w:right w:type="dxa" w:w="120"/>
-            </w:tcMar>
-          </w:tcPr>
-          <w:p>
-            <w:r>
-              <w:rPr>
-                <w:rFonts w:ascii="Arial" w:cs="Arial" w:hAnsi="Arial"/>
-                <w:sz w:val="18"/>
-                <w:szCs w:val="18"/>
-              </w:rPr>
-              <w:t xml:space="preserve">No</w:t>
-            </w:r>
-          </w:p>
-        </w:tc>
-        <w:tc>
-          <w:tcPr>
-            <w:tcW w:type="dxa" w:w="900"/>
-            <w:shd w:fill="FFFFFF" w:val="clear"/>
-            <w:tcMar>
-              <w:top w:type="dxa" w:w="80"/>
-              <w:left w:type="dxa" w:w="120"/>
-              <w:bottom w:type="dxa" w:w="80"/>
-              <w:right w:type="dxa" w:w="120"/>
-            </w:tcMar>
-          </w:tcPr>
-          <w:p>
-            <w:r>
-              <w:rPr>
-                <w:rFonts w:ascii="Arial" w:cs="Arial" w:hAnsi="Arial"/>
-                <w:sz w:val="18"/>
-                <w:szCs w:val="18"/>
-              </w:rPr>
-              <w:t xml:space="preserve">No</w:t>
-            </w:r>
-          </w:p>
-        </w:tc>
-        <w:tc>
-          <w:tcPr>
-            <w:tcW w:type="dxa" w:w="900"/>
-            <w:shd w:fill="FFFFFF" w:val="clear"/>
-            <w:tcMar>
-              <w:top w:type="dxa" w:w="80"/>
-              <w:left w:type="dxa" w:w="120"/>
-              <w:bottom w:type="dxa" w:w="80"/>
-              <w:right w:type="dxa" w:w="120"/>
-            </w:tcMar>
-          </w:tcPr>
-          <w:p>
-            <w:r>
-              <w:rPr>
-                <w:rFonts w:ascii="Arial" w:cs="Arial" w:hAnsi="Arial"/>
-                <w:sz w:val="18"/>
-                <w:szCs w:val="18"/>
-              </w:rPr>
-              <w:t xml:space="preserve">No</w:t>
-            </w:r>
-          </w:p>
-        </w:tc>
-        <w:tc>
-          <w:tcPr>
-            <w:tcW w:type="dxa" w:w="3960"/>
-            <w:shd w:fill="FFFFFF" w:val="clear"/>
-            <w:tcMar>
-              <w:top w:type="dxa" w:w="80"/>
-              <w:left w:type="dxa" w:w="120"/>
-              <w:bottom w:type="dxa" w:w="80"/>
-              <w:right w:type="dxa" w:w="120"/>
-            </w:tcMar>
-          </w:tcPr>
-          <w:p>
-            <w:r>
-              <w:rPr>
-                <w:rFonts w:ascii="Arial" w:cs="Arial" w:hAnsi="Arial"/>
-                <w:sz w:val="18"/>
-                <w:szCs w:val="18"/>
-              </w:rPr>
-              <w:t xml:space="preserve">No access.</w:t>
+              <w:t xml:space="preserve">Read only.</w:t>
             </w:r>
           </w:p>
         </w:tc>
@@ -11246,7 +11112,7 @@
                 <w:sz w:val="18"/>
                 <w:szCs w:val="18"/>
               </w:rPr>
-              <w:t xml:space="preserve">Admin</w:t>
+              <w:t xml:space="preserve">Client Administrator</w:t>
             </w:r>
           </w:p>
         </w:tc>
@@ -11334,7 +11200,7 @@
                 <w:sz w:val="18"/>
                 <w:szCs w:val="18"/>
               </w:rPr>
-              <w:t xml:space="preserve">All</w:t>
+              <w:t xml:space="preserve">No</w:t>
             </w:r>
           </w:p>
         </w:tc>
@@ -11380,7 +11246,7 @@
                 <w:sz w:val="18"/>
                 <w:szCs w:val="18"/>
               </w:rPr>
-              <w:t xml:space="preserve">Primary Mentor</w:t>
+              <w:t xml:space="preserve">Mentor Administrator</w:t>
             </w:r>
           </w:p>
         </w:tc>
@@ -11424,7 +11290,7 @@
                 <w:sz w:val="18"/>
                 <w:szCs w:val="18"/>
               </w:rPr>
-              <w:t xml:space="preserve">Own</w:t>
+              <w:t xml:space="preserve">All</w:t>
             </w:r>
           </w:p>
         </w:tc>
@@ -11490,7 +11356,7 @@
                 <w:sz w:val="18"/>
                 <w:szCs w:val="18"/>
               </w:rPr>
-              <w:t xml:space="preserve">Read only on own assigned engagements.</w:t>
+              <w:t xml:space="preserve">Read only for quality monitoring.</w:t>
             </w:r>
           </w:p>
         </w:tc>
@@ -11514,7 +11380,7 @@
                 <w:sz w:val="18"/>
                 <w:szCs w:val="18"/>
               </w:rPr>
-              <w:t xml:space="preserve">Co-Mentor</w:t>
+              <w:t xml:space="preserve">Mentor</w:t>
             </w:r>
           </w:p>
         </w:tc>
@@ -11624,7 +11490,7 @@
                 <w:sz w:val="18"/>
                 <w:szCs w:val="18"/>
               </w:rPr>
-              <w:t xml:space="preserve">Read only on assigned engagements.</w:t>
+              <w:t xml:space="preserve">Read only on own assigned engagements.</w:t>
             </w:r>
           </w:p>
         </w:tc>
@@ -11648,7 +11514,7 @@
                 <w:sz w:val="18"/>
                 <w:szCs w:val="18"/>
               </w:rPr>
-              <w:t xml:space="preserve">SME</w:t>
+              <w:t xml:space="preserve">Executive Member</w:t>
             </w:r>
           </w:p>
         </w:tc>
@@ -11692,7 +11558,7 @@
                 <w:sz w:val="18"/>
                 <w:szCs w:val="18"/>
               </w:rPr>
-              <w:t xml:space="preserve">Own</w:t>
+              <w:t xml:space="preserve">All</w:t>
             </w:r>
           </w:p>
         </w:tc>
@@ -11758,141 +11624,7 @@
                 <w:sz w:val="18"/>
                 <w:szCs w:val="18"/>
               </w:rPr>
-              <w:t xml:space="preserve">Read only on assigned engagements.</w:t>
-            </w:r>
-          </w:p>
-        </w:tc>
-      </w:tr>
-      <w:tr>
-        <w:tc>
-          <w:tcPr>
-            <w:tcW w:type="dxa" w:w="1800"/>
-            <w:shd w:fill="FFFFFF" w:val="clear"/>
-            <w:tcMar>
-              <w:top w:type="dxa" w:w="80"/>
-              <w:left w:type="dxa" w:w="120"/>
-              <w:bottom w:type="dxa" w:w="80"/>
-              <w:right w:type="dxa" w:w="120"/>
-            </w:tcMar>
-          </w:tcPr>
-          <w:p>
-            <w:r>
-              <w:rPr>
-                <w:rFonts w:ascii="Arial" w:cs="Arial" w:hAnsi="Arial"/>
-                <w:sz w:val="18"/>
-                <w:szCs w:val="18"/>
-              </w:rPr>
-              <w:t xml:space="preserve">Board Member</w:t>
-            </w:r>
-          </w:p>
-        </w:tc>
-        <w:tc>
-          <w:tcPr>
-            <w:tcW w:type="dxa" w:w="900"/>
-            <w:shd w:fill="FFFFFF" w:val="clear"/>
-            <w:tcMar>
-              <w:top w:type="dxa" w:w="80"/>
-              <w:left w:type="dxa" w:w="120"/>
-              <w:bottom w:type="dxa" w:w="80"/>
-              <w:right w:type="dxa" w:w="120"/>
-            </w:tcMar>
-          </w:tcPr>
-          <w:p>
-            <w:r>
-              <w:rPr>
-                <w:rFonts w:ascii="Arial" w:cs="Arial" w:hAnsi="Arial"/>
-                <w:sz w:val="18"/>
-                <w:szCs w:val="18"/>
-              </w:rPr>
-              <w:t xml:space="preserve">No</w:t>
-            </w:r>
-          </w:p>
-        </w:tc>
-        <w:tc>
-          <w:tcPr>
-            <w:tcW w:type="dxa" w:w="900"/>
-            <w:shd w:fill="FFFFFF" w:val="clear"/>
-            <w:tcMar>
-              <w:top w:type="dxa" w:w="80"/>
-              <w:left w:type="dxa" w:w="120"/>
-              <w:bottom w:type="dxa" w:w="80"/>
-              <w:right w:type="dxa" w:w="120"/>
-            </w:tcMar>
-          </w:tcPr>
-          <w:p>
-            <w:r>
-              <w:rPr>
-                <w:rFonts w:ascii="Arial" w:cs="Arial" w:hAnsi="Arial"/>
-                <w:sz w:val="18"/>
-                <w:szCs w:val="18"/>
-              </w:rPr>
-              <w:t xml:space="preserve">No</w:t>
-            </w:r>
-          </w:p>
-        </w:tc>
-        <w:tc>
-          <w:tcPr>
-            <w:tcW w:type="dxa" w:w="900"/>
-            <w:shd w:fill="FFFFFF" w:val="clear"/>
-            <w:tcMar>
-              <w:top w:type="dxa" w:w="80"/>
-              <w:left w:type="dxa" w:w="120"/>
-              <w:bottom w:type="dxa" w:w="80"/>
-              <w:right w:type="dxa" w:w="120"/>
-            </w:tcMar>
-          </w:tcPr>
-          <w:p>
-            <w:r>
-              <w:rPr>
-                <w:rFonts w:ascii="Arial" w:cs="Arial" w:hAnsi="Arial"/>
-                <w:sz w:val="18"/>
-                <w:szCs w:val="18"/>
-              </w:rPr>
-              <w:t xml:space="preserve">No</w:t>
-            </w:r>
-          </w:p>
-        </w:tc>
-        <w:tc>
-          <w:tcPr>
-            <w:tcW w:type="dxa" w:w="900"/>
-            <w:shd w:fill="FFFFFF" w:val="clear"/>
-            <w:tcMar>
-              <w:top w:type="dxa" w:w="80"/>
-              <w:left w:type="dxa" w:w="120"/>
-              <w:bottom w:type="dxa" w:w="80"/>
-              <w:right w:type="dxa" w:w="120"/>
-            </w:tcMar>
-          </w:tcPr>
-          <w:p>
-            <w:r>
-              <w:rPr>
-                <w:rFonts w:ascii="Arial" w:cs="Arial" w:hAnsi="Arial"/>
-                <w:sz w:val="18"/>
-                <w:szCs w:val="18"/>
-              </w:rPr>
-              <w:t xml:space="preserve">No</w:t>
-            </w:r>
-          </w:p>
-        </w:tc>
-        <w:tc>
-          <w:tcPr>
-            <w:tcW w:type="dxa" w:w="3960"/>
-            <w:shd w:fill="FFFFFF" w:val="clear"/>
-            <w:tcMar>
-              <w:top w:type="dxa" w:w="80"/>
-              <w:left w:type="dxa" w:w="120"/>
-              <w:bottom w:type="dxa" w:w="80"/>
-              <w:right w:type="dxa" w:w="120"/>
-            </w:tcMar>
-          </w:tcPr>
-          <w:p>
-            <w:r>
-              <w:rPr>
-                <w:rFonts w:ascii="Arial" w:cs="Arial" w:hAnsi="Arial"/>
-                <w:sz w:val="18"/>
-                <w:szCs w:val="18"/>
-              </w:rPr>
-              <w:t xml:space="preserve">No access to individual NPS records.</w:t>
+              <w:t xml:space="preserve">Read only.</w:t>
             </w:r>
           </w:p>
         </w:tc>
@@ -12105,7 +11837,7 @@
                 <w:sz w:val="18"/>
                 <w:szCs w:val="18"/>
               </w:rPr>
-              <w:t xml:space="preserve">Admin</w:t>
+              <w:t xml:space="preserve">Client Administrator</w:t>
             </w:r>
           </w:p>
         </w:tc>
@@ -12193,7 +11925,7 @@
                 <w:sz w:val="18"/>
                 <w:szCs w:val="18"/>
               </w:rPr>
-              <w:t xml:space="preserve">All</w:t>
+              <w:t xml:space="preserve">No</w:t>
             </w:r>
           </w:p>
         </w:tc>
@@ -12239,7 +11971,7 @@
                 <w:sz w:val="18"/>
                 <w:szCs w:val="18"/>
               </w:rPr>
-              <w:t xml:space="preserve">Primary Mentor</w:t>
+              <w:t xml:space="preserve">Mentor Administrator</w:t>
             </w:r>
           </w:p>
         </w:tc>
@@ -12261,7 +11993,7 @@
                 <w:sz w:val="18"/>
                 <w:szCs w:val="18"/>
               </w:rPr>
-              <w:t xml:space="preserve">Own</w:t>
+              <w:t xml:space="preserve">All</w:t>
             </w:r>
           </w:p>
         </w:tc>
@@ -12283,7 +12015,7 @@
                 <w:sz w:val="18"/>
                 <w:szCs w:val="18"/>
               </w:rPr>
-              <w:t xml:space="preserve">Own</w:t>
+              <w:t xml:space="preserve">All</w:t>
             </w:r>
           </w:p>
         </w:tc>
@@ -12305,7 +12037,7 @@
                 <w:sz w:val="18"/>
                 <w:szCs w:val="18"/>
               </w:rPr>
-              <w:t xml:space="preserve">Own</w:t>
+              <w:t xml:space="preserve">All</w:t>
             </w:r>
           </w:p>
         </w:tc>
@@ -12349,7 +12081,7 @@
                 <w:sz w:val="18"/>
                 <w:szCs w:val="18"/>
               </w:rPr>
-              <w:t xml:space="preserve">Can create notes and documents on own engagement records. Cannot see Internal Only records.</w:t>
+              <w:t xml:space="preserve">Can create notes and documents on mentor-linked records. Cannot see Internal Only records.</w:t>
             </w:r>
           </w:p>
         </w:tc>
@@ -12373,7 +12105,7 @@
                 <w:sz w:val="18"/>
                 <w:szCs w:val="18"/>
               </w:rPr>
-              <w:t xml:space="preserve">Co-Mentor</w:t>
+              <w:t xml:space="preserve">Mentor</w:t>
             </w:r>
           </w:p>
         </w:tc>
@@ -12483,7 +12215,7 @@
                 <w:sz w:val="18"/>
                 <w:szCs w:val="18"/>
               </w:rPr>
-              <w:t xml:space="preserve">Same as Primary Mentor, scoped to assigned engagements.</w:t>
+              <w:t xml:space="preserve">Can create notes and documents on own engagement records. Cannot see Internal Only records.</w:t>
             </w:r>
           </w:p>
         </w:tc>
@@ -12507,7 +12239,7 @@
                 <w:sz w:val="18"/>
                 <w:szCs w:val="18"/>
               </w:rPr>
-              <w:t xml:space="preserve">SME</w:t>
+              <w:t xml:space="preserve">Executive Member</w:t>
             </w:r>
           </w:p>
         </w:tc>
@@ -12529,7 +12261,7 @@
                 <w:sz w:val="18"/>
                 <w:szCs w:val="18"/>
               </w:rPr>
-              <w:t xml:space="preserve">Own</w:t>
+              <w:t xml:space="preserve">No</w:t>
             </w:r>
           </w:p>
         </w:tc>
@@ -12551,7 +12283,7 @@
                 <w:sz w:val="18"/>
                 <w:szCs w:val="18"/>
               </w:rPr>
-              <w:t xml:space="preserve">Own</w:t>
+              <w:t xml:space="preserve">All</w:t>
             </w:r>
           </w:p>
         </w:tc>
@@ -12573,7 +12305,7 @@
                 <w:sz w:val="18"/>
                 <w:szCs w:val="18"/>
               </w:rPr>
-              <w:t xml:space="preserve">Own</w:t>
+              <w:t xml:space="preserve">No</w:t>
             </w:r>
           </w:p>
         </w:tc>
@@ -12617,141 +12349,7 @@
                 <w:sz w:val="18"/>
                 <w:szCs w:val="18"/>
               </w:rPr>
-              <w:t xml:space="preserve">Same as Primary Mentor, scoped to assigned engagements.</w:t>
-            </w:r>
-          </w:p>
-        </w:tc>
-      </w:tr>
-      <w:tr>
-        <w:tc>
-          <w:tcPr>
-            <w:tcW w:type="dxa" w:w="1800"/>
-            <w:shd w:fill="FFFFFF" w:val="clear"/>
-            <w:tcMar>
-              <w:top w:type="dxa" w:w="80"/>
-              <w:left w:type="dxa" w:w="120"/>
-              <w:bottom w:type="dxa" w:w="80"/>
-              <w:right w:type="dxa" w:w="120"/>
-            </w:tcMar>
-          </w:tcPr>
-          <w:p>
-            <w:r>
-              <w:rPr>
-                <w:rFonts w:ascii="Arial" w:cs="Arial" w:hAnsi="Arial"/>
-                <w:sz w:val="18"/>
-                <w:szCs w:val="18"/>
-              </w:rPr>
-              <w:t xml:space="preserve">Board Member</w:t>
-            </w:r>
-          </w:p>
-        </w:tc>
-        <w:tc>
-          <w:tcPr>
-            <w:tcW w:type="dxa" w:w="900"/>
-            <w:shd w:fill="FFFFFF" w:val="clear"/>
-            <w:tcMar>
-              <w:top w:type="dxa" w:w="80"/>
-              <w:left w:type="dxa" w:w="120"/>
-              <w:bottom w:type="dxa" w:w="80"/>
-              <w:right w:type="dxa" w:w="120"/>
-            </w:tcMar>
-          </w:tcPr>
-          <w:p>
-            <w:r>
-              <w:rPr>
-                <w:rFonts w:ascii="Arial" w:cs="Arial" w:hAnsi="Arial"/>
-                <w:sz w:val="18"/>
-                <w:szCs w:val="18"/>
-              </w:rPr>
-              <w:t xml:space="preserve">No</w:t>
-            </w:r>
-          </w:p>
-        </w:tc>
-        <w:tc>
-          <w:tcPr>
-            <w:tcW w:type="dxa" w:w="900"/>
-            <w:shd w:fill="FFFFFF" w:val="clear"/>
-            <w:tcMar>
-              <w:top w:type="dxa" w:w="80"/>
-              <w:left w:type="dxa" w:w="120"/>
-              <w:bottom w:type="dxa" w:w="80"/>
-              <w:right w:type="dxa" w:w="120"/>
-            </w:tcMar>
-          </w:tcPr>
-          <w:p>
-            <w:r>
-              <w:rPr>
-                <w:rFonts w:ascii="Arial" w:cs="Arial" w:hAnsi="Arial"/>
-                <w:sz w:val="18"/>
-                <w:szCs w:val="18"/>
-              </w:rPr>
-              <w:t xml:space="preserve">No</w:t>
-            </w:r>
-          </w:p>
-        </w:tc>
-        <w:tc>
-          <w:tcPr>
-            <w:tcW w:type="dxa" w:w="900"/>
-            <w:shd w:fill="FFFFFF" w:val="clear"/>
-            <w:tcMar>
-              <w:top w:type="dxa" w:w="80"/>
-              <w:left w:type="dxa" w:w="120"/>
-              <w:bottom w:type="dxa" w:w="80"/>
-              <w:right w:type="dxa" w:w="120"/>
-            </w:tcMar>
-          </w:tcPr>
-          <w:p>
-            <w:r>
-              <w:rPr>
-                <w:rFonts w:ascii="Arial" w:cs="Arial" w:hAnsi="Arial"/>
-                <w:sz w:val="18"/>
-                <w:szCs w:val="18"/>
-              </w:rPr>
-              <w:t xml:space="preserve">No</w:t>
-            </w:r>
-          </w:p>
-        </w:tc>
-        <w:tc>
-          <w:tcPr>
-            <w:tcW w:type="dxa" w:w="900"/>
-            <w:shd w:fill="FFFFFF" w:val="clear"/>
-            <w:tcMar>
-              <w:top w:type="dxa" w:w="80"/>
-              <w:left w:type="dxa" w:w="120"/>
-              <w:bottom w:type="dxa" w:w="80"/>
-              <w:right w:type="dxa" w:w="120"/>
-            </w:tcMar>
-          </w:tcPr>
-          <w:p>
-            <w:r>
-              <w:rPr>
-                <w:rFonts w:ascii="Arial" w:cs="Arial" w:hAnsi="Arial"/>
-                <w:sz w:val="18"/>
-                <w:szCs w:val="18"/>
-              </w:rPr>
-              <w:t xml:space="preserve">No</w:t>
-            </w:r>
-          </w:p>
-        </w:tc>
-        <w:tc>
-          <w:tcPr>
-            <w:tcW w:type="dxa" w:w="3960"/>
-            <w:shd w:fill="FFFFFF" w:val="clear"/>
-            <w:tcMar>
-              <w:top w:type="dxa" w:w="80"/>
-              <w:left w:type="dxa" w:w="120"/>
-              <w:bottom w:type="dxa" w:w="80"/>
-              <w:right w:type="dxa" w:w="120"/>
-            </w:tcMar>
-          </w:tcPr>
-          <w:p>
-            <w:r>
-              <w:rPr>
-                <w:rFonts w:ascii="Arial" w:cs="Arial" w:hAnsi="Arial"/>
-                <w:sz w:val="18"/>
-                <w:szCs w:val="18"/>
-              </w:rPr>
-              <w:t xml:space="preserve">No access.</w:t>
+              <w:t xml:space="preserve">Read only. Cannot see Internal Only records.</w:t>
             </w:r>
           </w:p>
         </w:tc>
@@ -12964,7 +12562,7 @@
                 <w:sz w:val="18"/>
                 <w:szCs w:val="18"/>
               </w:rPr>
-              <w:t xml:space="preserve">Admin</w:t>
+              <w:t xml:space="preserve">Client Administrator</w:t>
             </w:r>
           </w:p>
         </w:tc>
@@ -13052,7 +12650,7 @@
                 <w:sz w:val="18"/>
                 <w:szCs w:val="18"/>
               </w:rPr>
-              <w:t xml:space="preserve">All</w:t>
+              <w:t xml:space="preserve">No</w:t>
             </w:r>
           </w:p>
         </w:tc>
@@ -13074,7 +12672,7 @@
                 <w:sz w:val="18"/>
                 <w:szCs w:val="18"/>
               </w:rPr>
-              <w:t xml:space="preserve">Full access including creating workshops.</w:t>
+              <w:t xml:space="preserve">Full access.</w:t>
             </w:r>
           </w:p>
         </w:tc>
@@ -13098,7 +12696,7 @@
                 <w:sz w:val="18"/>
                 <w:szCs w:val="18"/>
               </w:rPr>
-              <w:t xml:space="preserve">Primary Mentor</w:t>
+              <w:t xml:space="preserve">Content and Event Administrator</w:t>
             </w:r>
           </w:p>
         </w:tc>
@@ -13120,78 +12718,78 @@
                 <w:sz w:val="18"/>
                 <w:szCs w:val="18"/>
               </w:rPr>
+              <w:t xml:space="preserve">All</w:t>
+            </w:r>
+          </w:p>
+        </w:tc>
+        <w:tc>
+          <w:tcPr>
+            <w:tcW w:type="dxa" w:w="900"/>
+            <w:shd w:fill="F2F2F2" w:val="clear"/>
+            <w:tcMar>
+              <w:top w:type="dxa" w:w="80"/>
+              <w:left w:type="dxa" w:w="120"/>
+              <w:bottom w:type="dxa" w:w="80"/>
+              <w:right w:type="dxa" w:w="120"/>
+            </w:tcMar>
+          </w:tcPr>
+          <w:p>
+            <w:r>
+              <w:rPr>
+                <w:rFonts w:ascii="Arial" w:cs="Arial" w:hAnsi="Arial"/>
+                <w:sz w:val="18"/>
+                <w:szCs w:val="18"/>
+              </w:rPr>
+              <w:t xml:space="preserve">All</w:t>
+            </w:r>
+          </w:p>
+        </w:tc>
+        <w:tc>
+          <w:tcPr>
+            <w:tcW w:type="dxa" w:w="900"/>
+            <w:shd w:fill="F2F2F2" w:val="clear"/>
+            <w:tcMar>
+              <w:top w:type="dxa" w:w="80"/>
+              <w:left w:type="dxa" w:w="120"/>
+              <w:bottom w:type="dxa" w:w="80"/>
+              <w:right w:type="dxa" w:w="120"/>
+            </w:tcMar>
+          </w:tcPr>
+          <w:p>
+            <w:r>
+              <w:rPr>
+                <w:rFonts w:ascii="Arial" w:cs="Arial" w:hAnsi="Arial"/>
+                <w:sz w:val="18"/>
+                <w:szCs w:val="18"/>
+              </w:rPr>
+              <w:t xml:space="preserve">All</w:t>
+            </w:r>
+          </w:p>
+        </w:tc>
+        <w:tc>
+          <w:tcPr>
+            <w:tcW w:type="dxa" w:w="900"/>
+            <w:shd w:fill="F2F2F2" w:val="clear"/>
+            <w:tcMar>
+              <w:top w:type="dxa" w:w="80"/>
+              <w:left w:type="dxa" w:w="120"/>
+              <w:bottom w:type="dxa" w:w="80"/>
+              <w:right w:type="dxa" w:w="120"/>
+            </w:tcMar>
+          </w:tcPr>
+          <w:p>
+            <w:r>
+              <w:rPr>
+                <w:rFonts w:ascii="Arial" w:cs="Arial" w:hAnsi="Arial"/>
+                <w:sz w:val="18"/>
+                <w:szCs w:val="18"/>
+              </w:rPr>
               <w:t xml:space="preserve">No</w:t>
             </w:r>
           </w:p>
         </w:tc>
         <w:tc>
           <w:tcPr>
-            <w:tcW w:type="dxa" w:w="900"/>
-            <w:shd w:fill="F2F2F2" w:val="clear"/>
-            <w:tcMar>
-              <w:top w:type="dxa" w:w="80"/>
-              <w:left w:type="dxa" w:w="120"/>
-              <w:bottom w:type="dxa" w:w="80"/>
-              <w:right w:type="dxa" w:w="120"/>
-            </w:tcMar>
-          </w:tcPr>
-          <w:p>
-            <w:r>
-              <w:rPr>
-                <w:rFonts w:ascii="Arial" w:cs="Arial" w:hAnsi="Arial"/>
-                <w:sz w:val="18"/>
-                <w:szCs w:val="18"/>
-              </w:rPr>
-              <w:t xml:space="preserve">All</w:t>
-            </w:r>
-          </w:p>
-        </w:tc>
-        <w:tc>
-          <w:tcPr>
-            <w:tcW w:type="dxa" w:w="900"/>
-            <w:shd w:fill="F2F2F2" w:val="clear"/>
-            <w:tcMar>
-              <w:top w:type="dxa" w:w="80"/>
-              <w:left w:type="dxa" w:w="120"/>
-              <w:bottom w:type="dxa" w:w="80"/>
-              <w:right w:type="dxa" w:w="120"/>
-            </w:tcMar>
-          </w:tcPr>
-          <w:p>
-            <w:r>
-              <w:rPr>
-                <w:rFonts w:ascii="Arial" w:cs="Arial" w:hAnsi="Arial"/>
-                <w:sz w:val="18"/>
-                <w:szCs w:val="18"/>
-              </w:rPr>
-              <w:t xml:space="preserve">No</w:t>
-            </w:r>
-          </w:p>
-        </w:tc>
-        <w:tc>
-          <w:tcPr>
-            <w:tcW w:type="dxa" w:w="900"/>
-            <w:shd w:fill="F2F2F2" w:val="clear"/>
-            <w:tcMar>
-              <w:top w:type="dxa" w:w="80"/>
-              <w:left w:type="dxa" w:w="120"/>
-              <w:bottom w:type="dxa" w:w="80"/>
-              <w:right w:type="dxa" w:w="120"/>
-            </w:tcMar>
-          </w:tcPr>
-          <w:p>
-            <w:r>
-              <w:rPr>
-                <w:rFonts w:ascii="Arial" w:cs="Arial" w:hAnsi="Arial"/>
-                <w:sz w:val="18"/>
-                <w:szCs w:val="18"/>
-              </w:rPr>
-              <w:t xml:space="preserve">No</w:t>
-            </w:r>
-          </w:p>
-        </w:tc>
-        <w:tc>
-          <w:tcPr>
             <w:tcW w:type="dxa" w:w="3960"/>
             <w:shd w:fill="F2F2F2" w:val="clear"/>
             <w:tcMar>
@@ -13208,7 +12806,7 @@
                 <w:sz w:val="18"/>
                 <w:szCs w:val="18"/>
               </w:rPr>
-              <w:t xml:space="preserve">Read only on all workshops. Can view attendance for own clients.</w:t>
+              <w:t xml:space="preserve">Primary owner of workshop and event records.</w:t>
             </w:r>
           </w:p>
         </w:tc>
@@ -13232,7 +12830,7 @@
                 <w:sz w:val="18"/>
                 <w:szCs w:val="18"/>
               </w:rPr>
-              <w:t xml:space="preserve">Co-Mentor</w:t>
+              <w:t xml:space="preserve">Mentor</w:t>
             </w:r>
           </w:p>
         </w:tc>
@@ -13342,7 +12940,7 @@
                 <w:sz w:val="18"/>
                 <w:szCs w:val="18"/>
               </w:rPr>
-              <w:t xml:space="preserve">Read only on all workshops. Can view attendance for assigned clients.</w:t>
+              <w:t xml:space="preserve">Read only on all workshops. Can view attendance for own clients.</w:t>
             </w:r>
           </w:p>
         </w:tc>
@@ -13366,7 +12964,7 @@
                 <w:sz w:val="18"/>
                 <w:szCs w:val="18"/>
               </w:rPr>
-              <w:t xml:space="preserve">SME</w:t>
+              <w:t xml:space="preserve">Executive Member</w:t>
             </w:r>
           </w:p>
         </w:tc>
@@ -13477,140 +13075,6 @@
                 <w:szCs w:val="18"/>
               </w:rPr>
               <w:t xml:space="preserve">Read only.</w:t>
-            </w:r>
-          </w:p>
-        </w:tc>
-      </w:tr>
-      <w:tr>
-        <w:tc>
-          <w:tcPr>
-            <w:tcW w:type="dxa" w:w="1800"/>
-            <w:shd w:fill="FFFFFF" w:val="clear"/>
-            <w:tcMar>
-              <w:top w:type="dxa" w:w="80"/>
-              <w:left w:type="dxa" w:w="120"/>
-              <w:bottom w:type="dxa" w:w="80"/>
-              <w:right w:type="dxa" w:w="120"/>
-            </w:tcMar>
-          </w:tcPr>
-          <w:p>
-            <w:r>
-              <w:rPr>
-                <w:rFonts w:ascii="Arial" w:cs="Arial" w:hAnsi="Arial"/>
-                <w:sz w:val="18"/>
-                <w:szCs w:val="18"/>
-              </w:rPr>
-              <w:t xml:space="preserve">Board Member</w:t>
-            </w:r>
-          </w:p>
-        </w:tc>
-        <w:tc>
-          <w:tcPr>
-            <w:tcW w:type="dxa" w:w="900"/>
-            <w:shd w:fill="FFFFFF" w:val="clear"/>
-            <w:tcMar>
-              <w:top w:type="dxa" w:w="80"/>
-              <w:left w:type="dxa" w:w="120"/>
-              <w:bottom w:type="dxa" w:w="80"/>
-              <w:right w:type="dxa" w:w="120"/>
-            </w:tcMar>
-          </w:tcPr>
-          <w:p>
-            <w:r>
-              <w:rPr>
-                <w:rFonts w:ascii="Arial" w:cs="Arial" w:hAnsi="Arial"/>
-                <w:sz w:val="18"/>
-                <w:szCs w:val="18"/>
-              </w:rPr>
-              <w:t xml:space="preserve">No</w:t>
-            </w:r>
-          </w:p>
-        </w:tc>
-        <w:tc>
-          <w:tcPr>
-            <w:tcW w:type="dxa" w:w="900"/>
-            <w:shd w:fill="FFFFFF" w:val="clear"/>
-            <w:tcMar>
-              <w:top w:type="dxa" w:w="80"/>
-              <w:left w:type="dxa" w:w="120"/>
-              <w:bottom w:type="dxa" w:w="80"/>
-              <w:right w:type="dxa" w:w="120"/>
-            </w:tcMar>
-          </w:tcPr>
-          <w:p>
-            <w:r>
-              <w:rPr>
-                <w:rFonts w:ascii="Arial" w:cs="Arial" w:hAnsi="Arial"/>
-                <w:sz w:val="18"/>
-                <w:szCs w:val="18"/>
-              </w:rPr>
-              <w:t xml:space="preserve">No</w:t>
-            </w:r>
-          </w:p>
-        </w:tc>
-        <w:tc>
-          <w:tcPr>
-            <w:tcW w:type="dxa" w:w="900"/>
-            <w:shd w:fill="FFFFFF" w:val="clear"/>
-            <w:tcMar>
-              <w:top w:type="dxa" w:w="80"/>
-              <w:left w:type="dxa" w:w="120"/>
-              <w:bottom w:type="dxa" w:w="80"/>
-              <w:right w:type="dxa" w:w="120"/>
-            </w:tcMar>
-          </w:tcPr>
-          <w:p>
-            <w:r>
-              <w:rPr>
-                <w:rFonts w:ascii="Arial" w:cs="Arial" w:hAnsi="Arial"/>
-                <w:sz w:val="18"/>
-                <w:szCs w:val="18"/>
-              </w:rPr>
-              <w:t xml:space="preserve">No</w:t>
-            </w:r>
-          </w:p>
-        </w:tc>
-        <w:tc>
-          <w:tcPr>
-            <w:tcW w:type="dxa" w:w="900"/>
-            <w:shd w:fill="FFFFFF" w:val="clear"/>
-            <w:tcMar>
-              <w:top w:type="dxa" w:w="80"/>
-              <w:left w:type="dxa" w:w="120"/>
-              <w:bottom w:type="dxa" w:w="80"/>
-              <w:right w:type="dxa" w:w="120"/>
-            </w:tcMar>
-          </w:tcPr>
-          <w:p>
-            <w:r>
-              <w:rPr>
-                <w:rFonts w:ascii="Arial" w:cs="Arial" w:hAnsi="Arial"/>
-                <w:sz w:val="18"/>
-                <w:szCs w:val="18"/>
-              </w:rPr>
-              <w:t xml:space="preserve">No</w:t>
-            </w:r>
-          </w:p>
-        </w:tc>
-        <w:tc>
-          <w:tcPr>
-            <w:tcW w:type="dxa" w:w="3960"/>
-            <w:shd w:fill="FFFFFF" w:val="clear"/>
-            <w:tcMar>
-              <w:top w:type="dxa" w:w="80"/>
-              <w:left w:type="dxa" w:w="120"/>
-              <w:bottom w:type="dxa" w:w="80"/>
-              <w:right w:type="dxa" w:w="120"/>
-            </w:tcMar>
-          </w:tcPr>
-          <w:p>
-            <w:r>
-              <w:rPr>
-                <w:rFonts w:ascii="Arial" w:cs="Arial" w:hAnsi="Arial"/>
-                <w:sz w:val="18"/>
-                <w:szCs w:val="18"/>
-              </w:rPr>
-              <w:t xml:space="preserve">No access to individual records.</w:t>
             </w:r>
           </w:p>
         </w:tc>
@@ -13780,7 +13244,7 @@
                 <w:sz w:val="18"/>
                 <w:szCs w:val="18"/>
               </w:rPr>
-              <w:t xml:space="preserve">Admin and assigned Primary Mentor only</w:t>
+              <w:t xml:space="preserve">Client Administrator, Client Assignment Coordinator, and assigned Mentor(s)</w:t>
             </w:r>
           </w:p>
         </w:tc>
@@ -13802,7 +13266,7 @@
                 <w:sz w:val="18"/>
                 <w:szCs w:val="18"/>
               </w:rPr>
-              <w:t xml:space="preserve">Contains sensitive government-issued tax identification. Not relevant to Co-Mentor or SME roles. Mentor-populated only — not collected on intake form.</w:t>
+              <w:t xml:space="preserve">Contains sensitive government-issued tax identification. Not relevant to all personas. Mentor-populated only — not collected on intake form.</w:t>
             </w:r>
           </w:p>
         </w:tc>
@@ -13848,7 +13312,7 @@
                 <w:sz w:val="18"/>
                 <w:szCs w:val="18"/>
               </w:rPr>
-              <w:t xml:space="preserve">Admin only</w:t>
+              <w:t xml:space="preserve">Client Administrator only</w:t>
             </w:r>
           </w:p>
         </w:tc>
@@ -13870,7 +13334,7 @@
                 <w:sz w:val="18"/>
                 <w:szCs w:val="18"/>
               </w:rPr>
-              <w:t xml:space="preserve">Notes flagged as Internal Only are hidden from all mentor roles regardless of engagement assignment. Used for admin-level observations and escalation records.</w:t>
+              <w:t xml:space="preserve">Notes flagged as Internal Only are hidden from all roles except Client Administrator. Used for administrative observations and escalation records.</w:t>
             </w:r>
           </w:p>
         </w:tc>
@@ -13916,7 +13380,7 @@
                 <w:sz w:val="18"/>
                 <w:szCs w:val="18"/>
               </w:rPr>
-              <w:t xml:space="preserve">Admin only</w:t>
+              <w:t xml:space="preserve">Client Administrator only</w:t>
             </w:r>
           </w:p>
         </w:tc>
@@ -13992,7 +13456,12 @@
         <w:spacing w:after="60"/>
       </w:pPr>
       <w:r>
-        <w:t xml:space="preserve">Admin — Full visibility across all records of all entity types. No restrictions.</w:t>
+        <w:t xml:space="preserve">Client Administrator — Full visibility across all client domain records. No restrictions.
+Client Assignment Coordinator — Full visibility across Company, Contact, and Engagement records for matching purposes. No access to Session, NPS Survey Response, or mentor administrative records.
+Mentor Administrator — Visibility into mentor Contact records and Engagement and Session records linked to mentors for quality monitoring purposes. No access to client business data beyond what is needed.
+Mentor — Sees only Companies, Contacts, Engagements, Sessions, NPS Survey Responses, Notes, Documents, and Workshop Attendance records where they are assigned as Mentor, Co-Mentor, or SME on the linked Engagement.
+Executive Member — Full read visibility across all records of all entity types. No create, update, or delete access.
+Clients — No CRM access of any kind. All client-facing communication is conducted via email. Clients never log into EspoCRM.</w:t>
       </w:r>
     </w:p>
     <w:p>
@@ -14004,7 +13473,7 @@
         <w:spacing w:after="60"/>
       </w:pPr>
       <w:r>
-        <w:t xml:space="preserve">Primary Mentor — Sees only Companies, Contacts, Engagements, Sessions, NPS Survey Responses, Notes, Documents, and Workshop Attendance records where they are the assigned Primary Mentor on the linked Engagement.</w:t>
+        <w:t xml:space="preserve">Mentor — Sees only Companies, Contacts, Engagements, Sessions, NPS Survey Responses, Notes, Documents, and Workshop Attendance records where they are assigned as Mentor, Co-Mentor, or SME on the linked Engagement.</w:t>
       </w:r>
     </w:p>
     <w:p>
@@ -14016,7 +13485,7 @@
         <w:spacing w:after="60"/>
       </w:pPr>
       <w:r>
-        <w:t xml:space="preserve">Co-Mentor — Sees only records associated with Engagements where they are assigned as Co-Mentor. Visibility is scoped to the specific Engagement — not to the Company or Contact as a whole.</w:t>
+        <w:t xml:space="preserve"/>
       </w:r>
     </w:p>
     <w:p>
@@ -14028,7 +13497,7 @@
         <w:spacing w:after="60"/>
       </w:pPr>
       <w:r>
-        <w:t xml:space="preserve">SME — Sees only records associated with Engagements where they are assigned as SME. Same scoping as Co-Mentor.</w:t>
+        <w:t xml:space="preserve"/>
       </w:r>
     </w:p>
     <w:p>
@@ -14040,7 +13509,7 @@
         <w:spacing w:after="60"/>
       </w:pPr>
       <w:r>
-        <w:t xml:space="preserve">Board Member — No visibility into individual client records of any type. Access is limited to aggregate reporting dashboards and summary metrics only.</w:t>
+        <w:t xml:space="preserve"/>
       </w:r>
     </w:p>
     <w:p>
@@ -14064,7 +13533,7 @@
         <w:spacing w:after="60"/>
       </w:pPr>
       <w:r>
-        <w:t xml:space="preserve">Clients — No CRM access of any kind. All client-facing communication is conducted via email. Clients never log into EspoCRM.</w:t>
+        <w:t xml:space="preserve"/>
       </w:r>
     </w:p>
     <w:p>

</xml_diff>